<commit_message>
Add Save/Load to QuestSystem
</commit_message>
<xml_diff>
--- a/Итерации.docx
+++ b/Итерации.docx
@@ -1501,13 +1501,16 @@
       <w:pPr>
         <w:rPr>
           <w:rFonts w:ascii="Segoe UI" w:hAnsi="Segoe UI" w:cs="Segoe UI"/>
-          <w:color w:val="ECECF1"/>
-          <w:shd w:val="clear" w:color="auto" w:fill="343541"/>
-        </w:rPr>
-      </w:pPr>
-      <w:r>
-        <w:rPr>
-          <w:rFonts w:ascii="Segoe UI" w:hAnsi="Segoe UI" w:cs="Segoe UI"/>
+          <w:strike/>
+          <w:color w:val="ECECF1"/>
+          <w:shd w:val="clear" w:color="auto" w:fill="343541"/>
+        </w:rPr>
+      </w:pPr>
+      <w:bookmarkStart w:id="0" w:name="_GoBack"/>
+      <w:r>
+        <w:rPr>
+          <w:rFonts w:ascii="Segoe UI" w:hAnsi="Segoe UI" w:cs="Segoe UI"/>
+          <w:strike/>
           <w:color w:val="ECECF1"/>
           <w:shd w:val="clear" w:color="auto" w:fill="343541"/>
         </w:rPr>
@@ -1517,6 +1520,7 @@
       <w:r>
         <w:rPr>
           <w:rFonts w:ascii="Segoe UI" w:hAnsi="Segoe UI" w:cs="Segoe UI"/>
+          <w:strike/>
           <w:color w:val="ECECF1"/>
           <w:shd w:val="clear" w:color="auto" w:fill="343541"/>
         </w:rPr>
@@ -1526,12 +1530,14 @@
       <w:r>
         <w:rPr>
           <w:rFonts w:ascii="Segoe UI" w:hAnsi="Segoe UI" w:cs="Segoe UI"/>
+          <w:strike/>
           <w:color w:val="ECECF1"/>
           <w:shd w:val="clear" w:color="auto" w:fill="343541"/>
         </w:rPr>
         <w:t xml:space="preserve"> системы в проект </w:t>
       </w:r>
     </w:p>
+    <w:bookmarkEnd w:id="0"/>
     <w:p>
       <w:pPr>
         <w:rPr>
@@ -1714,8 +1720,6 @@
           <w:strike/>
         </w:rPr>
       </w:pPr>
-      <w:bookmarkStart w:id="0" w:name="_GoBack"/>
-      <w:bookmarkEnd w:id="0"/>
       <w:r>
         <w:rPr>
           <w:rFonts w:ascii="Segoe UI" w:hAnsi="Segoe UI" w:cs="Segoe UI"/>

</xml_diff>

<commit_message>
Try implemented save to json
</commit_message>
<xml_diff>
--- a/Итерации.docx
+++ b/Итерации.docx
@@ -1506,89 +1506,340 @@
           <w:shd w:val="clear" w:color="auto" w:fill="343541"/>
         </w:rPr>
       </w:pPr>
+      <w:r>
+        <w:rPr>
+          <w:rFonts w:ascii="Segoe UI" w:hAnsi="Segoe UI" w:cs="Segoe UI"/>
+          <w:strike/>
+          <w:color w:val="ECECF1"/>
+          <w:shd w:val="clear" w:color="auto" w:fill="343541"/>
+        </w:rPr>
+        <w:t xml:space="preserve">1 Внедрить прототип </w:t>
+      </w:r>
+      <w:proofErr w:type="spellStart"/>
+      <w:r>
+        <w:rPr>
+          <w:rFonts w:ascii="Segoe UI" w:hAnsi="Segoe UI" w:cs="Segoe UI"/>
+          <w:strike/>
+          <w:color w:val="ECECF1"/>
+          <w:shd w:val="clear" w:color="auto" w:fill="343541"/>
+        </w:rPr>
+        <w:t>квестовой</w:t>
+      </w:r>
+      <w:proofErr w:type="spellEnd"/>
+      <w:r>
+        <w:rPr>
+          <w:rFonts w:ascii="Segoe UI" w:hAnsi="Segoe UI" w:cs="Segoe UI"/>
+          <w:strike/>
+          <w:color w:val="ECECF1"/>
+          <w:shd w:val="clear" w:color="auto" w:fill="343541"/>
+        </w:rPr>
+        <w:t xml:space="preserve"> системы в проект </w:t>
+      </w:r>
+    </w:p>
+    <w:p>
+      <w:pPr>
+        <w:rPr>
+          <w:rFonts w:ascii="Segoe UI" w:hAnsi="Segoe UI" w:cs="Segoe UI"/>
+          <w:color w:val="ECECF1"/>
+          <w:shd w:val="clear" w:color="auto" w:fill="343541"/>
+        </w:rPr>
+      </w:pPr>
+      <w:r>
+        <w:rPr>
+          <w:rFonts w:ascii="Segoe UI" w:hAnsi="Segoe UI" w:cs="Segoe UI"/>
+          <w:color w:val="ECECF1"/>
+          <w:shd w:val="clear" w:color="auto" w:fill="343541"/>
+        </w:rPr>
+        <w:t xml:space="preserve">2 Довести прототип </w:t>
+      </w:r>
+      <w:proofErr w:type="spellStart"/>
+      <w:r>
+        <w:rPr>
+          <w:rFonts w:ascii="Segoe UI" w:hAnsi="Segoe UI" w:cs="Segoe UI"/>
+          <w:color w:val="ECECF1"/>
+          <w:shd w:val="clear" w:color="auto" w:fill="343541"/>
+        </w:rPr>
+        <w:t>квестовой</w:t>
+      </w:r>
+      <w:proofErr w:type="spellEnd"/>
+      <w:r>
+        <w:rPr>
+          <w:rFonts w:ascii="Segoe UI" w:hAnsi="Segoe UI" w:cs="Segoe UI"/>
+          <w:color w:val="ECECF1"/>
+          <w:shd w:val="clear" w:color="auto" w:fill="343541"/>
+        </w:rPr>
+        <w:t xml:space="preserve"> системы до ума. Один из самых длительных этапов. </w:t>
+      </w:r>
+    </w:p>
+    <w:p>
+      <w:pPr>
+        <w:ind w:firstLine="708"/>
+        <w:rPr>
+          <w:rFonts w:ascii="Segoe UI" w:hAnsi="Segoe UI" w:cs="Segoe UI"/>
+          <w:color w:val="ECECF1"/>
+          <w:shd w:val="clear" w:color="auto" w:fill="343541"/>
+        </w:rPr>
+      </w:pPr>
+      <w:r>
+        <w:rPr>
+          <w:rFonts w:ascii="Segoe UI" w:hAnsi="Segoe UI" w:cs="Segoe UI"/>
+          <w:color w:val="ECECF1"/>
+          <w:shd w:val="clear" w:color="auto" w:fill="343541"/>
+        </w:rPr>
+        <w:t xml:space="preserve">2а </w:t>
+      </w:r>
+      <w:proofErr w:type="gramStart"/>
+      <w:r>
+        <w:rPr>
+          <w:rFonts w:ascii="Segoe UI" w:hAnsi="Segoe UI" w:cs="Segoe UI"/>
+          <w:color w:val="ECECF1"/>
+          <w:shd w:val="clear" w:color="auto" w:fill="343541"/>
+        </w:rPr>
+        <w:t>Завершить</w:t>
+      </w:r>
+      <w:proofErr w:type="gramEnd"/>
+      <w:r>
+        <w:rPr>
+          <w:rFonts w:ascii="Segoe UI" w:hAnsi="Segoe UI" w:cs="Segoe UI"/>
+          <w:color w:val="ECECF1"/>
+          <w:shd w:val="clear" w:color="auto" w:fill="343541"/>
+        </w:rPr>
+        <w:t xml:space="preserve"> прототип, получив работоспособную квестовую систему. </w:t>
+      </w:r>
+    </w:p>
+    <w:p>
+      <w:pPr>
+        <w:ind w:left="708"/>
+        <w:rPr>
+          <w:rFonts w:ascii="Segoe UI" w:hAnsi="Segoe UI" w:cs="Segoe UI"/>
+          <w:color w:val="ECECF1"/>
+          <w:shd w:val="clear" w:color="auto" w:fill="343541"/>
+        </w:rPr>
+      </w:pPr>
+      <w:r>
+        <w:rPr>
+          <w:rFonts w:ascii="Segoe UI" w:hAnsi="Segoe UI" w:cs="Segoe UI"/>
+          <w:color w:val="ECECF1"/>
+          <w:shd w:val="clear" w:color="auto" w:fill="343541"/>
+        </w:rPr>
+        <w:t xml:space="preserve">2б </w:t>
+      </w:r>
+      <w:proofErr w:type="gramStart"/>
+      <w:r>
+        <w:rPr>
+          <w:rFonts w:ascii="Segoe UI" w:hAnsi="Segoe UI" w:cs="Segoe UI"/>
+          <w:color w:val="ECECF1"/>
+          <w:shd w:val="clear" w:color="auto" w:fill="343541"/>
+        </w:rPr>
+        <w:t>Контролировать</w:t>
+      </w:r>
+      <w:proofErr w:type="gramEnd"/>
+      <w:r>
+        <w:rPr>
+          <w:rFonts w:ascii="Segoe UI" w:hAnsi="Segoe UI" w:cs="Segoe UI"/>
+          <w:color w:val="ECECF1"/>
+          <w:shd w:val="clear" w:color="auto" w:fill="343541"/>
+        </w:rPr>
+        <w:t xml:space="preserve"> состояние архитектуры при разработке доработке прототипа </w:t>
+      </w:r>
+      <w:proofErr w:type="spellStart"/>
+      <w:r>
+        <w:rPr>
+          <w:rFonts w:ascii="Segoe UI" w:hAnsi="Segoe UI" w:cs="Segoe UI"/>
+          <w:color w:val="ECECF1"/>
+          <w:shd w:val="clear" w:color="auto" w:fill="343541"/>
+        </w:rPr>
+        <w:t>квестовой</w:t>
+      </w:r>
+      <w:proofErr w:type="spellEnd"/>
+      <w:r>
+        <w:rPr>
+          <w:rFonts w:ascii="Segoe UI" w:hAnsi="Segoe UI" w:cs="Segoe UI"/>
+          <w:color w:val="ECECF1"/>
+          <w:shd w:val="clear" w:color="auto" w:fill="343541"/>
+        </w:rPr>
+        <w:t xml:space="preserve"> системы. </w:t>
+      </w:r>
+    </w:p>
+    <w:p>
+      <w:pPr>
+        <w:rPr>
+          <w:rFonts w:ascii="Segoe UI" w:hAnsi="Segoe UI" w:cs="Segoe UI"/>
+          <w:color w:val="ECECF1"/>
+          <w:shd w:val="clear" w:color="auto" w:fill="343541"/>
+        </w:rPr>
+      </w:pPr>
+      <w:r>
+        <w:rPr>
+          <w:rFonts w:ascii="Segoe UI" w:hAnsi="Segoe UI" w:cs="Segoe UI"/>
+          <w:color w:val="ECECF1"/>
+          <w:shd w:val="clear" w:color="auto" w:fill="343541"/>
+        </w:rPr>
+        <w:t xml:space="preserve">3 Расширить систему диалогов с возможностью выдачи квестов через диалоги. </w:t>
+      </w:r>
+    </w:p>
+    <w:p>
+      <w:pPr>
+        <w:rPr>
+          <w:rFonts w:ascii="Segoe UI" w:hAnsi="Segoe UI" w:cs="Segoe UI"/>
+          <w:color w:val="ECECF1"/>
+          <w:shd w:val="clear" w:color="auto" w:fill="343541"/>
+        </w:rPr>
+      </w:pPr>
+      <w:r>
+        <w:rPr>
+          <w:rFonts w:ascii="Segoe UI" w:hAnsi="Segoe UI" w:cs="Segoe UI"/>
+          <w:color w:val="ECECF1"/>
+          <w:shd w:val="clear" w:color="auto" w:fill="343541"/>
+        </w:rPr>
+        <w:t xml:space="preserve">4 Рассмотреть возможность расширить систему предметов. </w:t>
+      </w:r>
+    </w:p>
+    <w:p>
+      <w:pPr>
+        <w:rPr>
+          <w:rFonts w:ascii="Segoe UI" w:hAnsi="Segoe UI" w:cs="Segoe UI"/>
+          <w:color w:val="ECECF1"/>
+          <w:shd w:val="clear" w:color="auto" w:fill="343541"/>
+        </w:rPr>
+      </w:pPr>
+      <w:r>
+        <w:rPr>
+          <w:rFonts w:ascii="Segoe UI" w:hAnsi="Segoe UI" w:cs="Segoe UI"/>
+          <w:color w:val="ECECF1"/>
+          <w:shd w:val="clear" w:color="auto" w:fill="343541"/>
+        </w:rPr>
+        <w:t xml:space="preserve">5 Готовиться к модификации системы инвентаря. </w:t>
+      </w:r>
+    </w:p>
+    <w:p>
+      <w:pPr>
+        <w:rPr>
+          <w:rFonts w:ascii="Segoe UI" w:hAnsi="Segoe UI" w:cs="Segoe UI"/>
+          <w:color w:val="ECECF1"/>
+          <w:shd w:val="clear" w:color="auto" w:fill="343541"/>
+        </w:rPr>
+      </w:pPr>
+      <w:r>
+        <w:rPr>
+          <w:rFonts w:ascii="Segoe UI" w:hAnsi="Segoe UI" w:cs="Segoe UI"/>
+          <w:color w:val="ECECF1"/>
+          <w:shd w:val="clear" w:color="auto" w:fill="343541"/>
+        </w:rPr>
+        <w:t xml:space="preserve">6 Готовиться к реализации системы торговли. </w:t>
+      </w:r>
+      <w:proofErr w:type="gramStart"/>
+      <w:r>
+        <w:rPr>
+          <w:rFonts w:ascii="Segoe UI" w:hAnsi="Segoe UI" w:cs="Segoe UI"/>
+          <w:color w:val="ECECF1"/>
+          <w:shd w:val="clear" w:color="auto" w:fill="343541"/>
+        </w:rPr>
+        <w:t>Также</w:t>
+      </w:r>
+      <w:proofErr w:type="gramEnd"/>
+      <w:r>
+        <w:rPr>
+          <w:rFonts w:ascii="Segoe UI" w:hAnsi="Segoe UI" w:cs="Segoe UI"/>
+          <w:color w:val="ECECF1"/>
+          <w:shd w:val="clear" w:color="auto" w:fill="343541"/>
+        </w:rPr>
+        <w:t xml:space="preserve"> как и второй этап достаточно длительный.</w:t>
+      </w:r>
+    </w:p>
+    <w:p>
+      <w:pPr>
+        <w:rPr>
+          <w:rFonts w:ascii="Segoe UI" w:hAnsi="Segoe UI" w:cs="Segoe UI"/>
+          <w:color w:val="ECECF1"/>
+          <w:shd w:val="clear" w:color="auto" w:fill="343541"/>
+        </w:rPr>
+      </w:pPr>
+    </w:p>
+    <w:p>
+      <w:pPr>
+        <w:rPr>
+          <w:rFonts w:ascii="Segoe UI" w:hAnsi="Segoe UI" w:cs="Segoe UI"/>
+          <w:color w:val="ECECF1"/>
+          <w:shd w:val="clear" w:color="auto" w:fill="343541"/>
+        </w:rPr>
+      </w:pPr>
+      <w:r>
+        <w:rPr>
+          <w:rFonts w:ascii="Segoe UI" w:hAnsi="Segoe UI" w:cs="Segoe UI"/>
+          <w:color w:val="ECECF1"/>
+          <w:shd w:val="clear" w:color="auto" w:fill="343541"/>
+        </w:rPr>
+        <w:lastRenderedPageBreak/>
+        <w:t xml:space="preserve">9 итерация: </w:t>
+      </w:r>
+    </w:p>
+    <w:p>
+      <w:pPr>
+        <w:rPr>
+          <w:rFonts w:ascii="Segoe UI" w:hAnsi="Segoe UI" w:cs="Segoe UI"/>
+          <w:color w:val="ECECF1"/>
+          <w:shd w:val="clear" w:color="auto" w:fill="343541"/>
+        </w:rPr>
+      </w:pPr>
+      <w:r>
+        <w:rPr>
+          <w:rFonts w:ascii="Segoe UI" w:hAnsi="Segoe UI" w:cs="Segoe UI"/>
+          <w:color w:val="ECECF1"/>
+          <w:shd w:val="clear" w:color="auto" w:fill="343541"/>
+        </w:rPr>
+        <w:t xml:space="preserve">1 Искать возможность как можно сохранять иерархию классов, используя при этом только указатель на базовый класс. </w:t>
+      </w:r>
+    </w:p>
+    <w:p>
+      <w:pPr>
+        <w:rPr>
+          <w:rFonts w:ascii="Segoe UI" w:hAnsi="Segoe UI" w:cs="Segoe UI"/>
+          <w:color w:val="ECECF1"/>
+          <w:shd w:val="clear" w:color="auto" w:fill="343541"/>
+        </w:rPr>
+      </w:pPr>
+      <w:r>
+        <w:rPr>
+          <w:rFonts w:ascii="Segoe UI" w:hAnsi="Segoe UI" w:cs="Segoe UI"/>
+          <w:color w:val="ECECF1"/>
+          <w:shd w:val="clear" w:color="auto" w:fill="343541"/>
+        </w:rPr>
+        <w:t xml:space="preserve">2 Расширить систему диалогов добавив возможность игроку брать квесты для убийства нежити. </w:t>
+      </w:r>
+    </w:p>
+    <w:p>
+      <w:pPr>
+        <w:rPr>
+          <w:rFonts w:ascii="Segoe UI" w:hAnsi="Segoe UI" w:cs="Segoe UI"/>
+          <w:color w:val="ECECF1"/>
+          <w:shd w:val="clear" w:color="auto" w:fill="343541"/>
+        </w:rPr>
+      </w:pPr>
+      <w:r>
+        <w:rPr>
+          <w:rFonts w:ascii="Segoe UI" w:hAnsi="Segoe UI" w:cs="Segoe UI"/>
+          <w:color w:val="ECECF1"/>
+          <w:shd w:val="clear" w:color="auto" w:fill="343541"/>
+        </w:rPr>
+        <w:t xml:space="preserve">3 Расширить систему квестов. </w:t>
+      </w:r>
       <w:bookmarkStart w:id="0" w:name="_GoBack"/>
-      <w:r>
-        <w:rPr>
-          <w:rFonts w:ascii="Segoe UI" w:hAnsi="Segoe UI" w:cs="Segoe UI"/>
-          <w:strike/>
-          <w:color w:val="ECECF1"/>
-          <w:shd w:val="clear" w:color="auto" w:fill="343541"/>
-        </w:rPr>
-        <w:t xml:space="preserve">1 Внедрить прототип </w:t>
-      </w:r>
-      <w:proofErr w:type="spellStart"/>
-      <w:r>
-        <w:rPr>
-          <w:rFonts w:ascii="Segoe UI" w:hAnsi="Segoe UI" w:cs="Segoe UI"/>
-          <w:strike/>
-          <w:color w:val="ECECF1"/>
-          <w:shd w:val="clear" w:color="auto" w:fill="343541"/>
-        </w:rPr>
-        <w:t>квестовой</w:t>
-      </w:r>
-      <w:proofErr w:type="spellEnd"/>
-      <w:r>
-        <w:rPr>
-          <w:rFonts w:ascii="Segoe UI" w:hAnsi="Segoe UI" w:cs="Segoe UI"/>
-          <w:strike/>
-          <w:color w:val="ECECF1"/>
-          <w:shd w:val="clear" w:color="auto" w:fill="343541"/>
-        </w:rPr>
-        <w:t xml:space="preserve"> системы в проект </w:t>
-      </w:r>
-    </w:p>
-    <w:bookmarkEnd w:id="0"/>
-    <w:p>
-      <w:pPr>
-        <w:rPr>
-          <w:rFonts w:ascii="Segoe UI" w:hAnsi="Segoe UI" w:cs="Segoe UI"/>
-          <w:color w:val="ECECF1"/>
-          <w:shd w:val="clear" w:color="auto" w:fill="343541"/>
-        </w:rPr>
-      </w:pPr>
-      <w:r>
-        <w:rPr>
-          <w:rFonts w:ascii="Segoe UI" w:hAnsi="Segoe UI" w:cs="Segoe UI"/>
-          <w:color w:val="ECECF1"/>
-          <w:shd w:val="clear" w:color="auto" w:fill="343541"/>
-        </w:rPr>
-        <w:t xml:space="preserve">2 Довести прототип </w:t>
-      </w:r>
-      <w:proofErr w:type="spellStart"/>
-      <w:r>
-        <w:rPr>
-          <w:rFonts w:ascii="Segoe UI" w:hAnsi="Segoe UI" w:cs="Segoe UI"/>
-          <w:color w:val="ECECF1"/>
-          <w:shd w:val="clear" w:color="auto" w:fill="343541"/>
-        </w:rPr>
-        <w:t>квестовой</w:t>
-      </w:r>
-      <w:proofErr w:type="spellEnd"/>
-      <w:r>
-        <w:rPr>
-          <w:rFonts w:ascii="Segoe UI" w:hAnsi="Segoe UI" w:cs="Segoe UI"/>
-          <w:color w:val="ECECF1"/>
-          <w:shd w:val="clear" w:color="auto" w:fill="343541"/>
-        </w:rPr>
-        <w:t xml:space="preserve"> системы до ума. Один из самых длительных этапов. </w:t>
-      </w:r>
-    </w:p>
-    <w:p>
-      <w:pPr>
-        <w:ind w:firstLine="708"/>
-        <w:rPr>
-          <w:rFonts w:ascii="Segoe UI" w:hAnsi="Segoe UI" w:cs="Segoe UI"/>
-          <w:color w:val="ECECF1"/>
-          <w:shd w:val="clear" w:color="auto" w:fill="343541"/>
-        </w:rPr>
-      </w:pPr>
-      <w:r>
-        <w:rPr>
-          <w:rFonts w:ascii="Segoe UI" w:hAnsi="Segoe UI" w:cs="Segoe UI"/>
-          <w:color w:val="ECECF1"/>
-          <w:shd w:val="clear" w:color="auto" w:fill="343541"/>
-        </w:rPr>
-        <w:t xml:space="preserve">2а </w:t>
+      <w:bookmarkEnd w:id="0"/>
+    </w:p>
+    <w:p>
+      <w:pPr>
+        <w:rPr>
+          <w:strike/>
+        </w:rPr>
+      </w:pPr>
+      <w:r>
+        <w:rPr>
+          <w:rFonts w:ascii="Segoe UI" w:hAnsi="Segoe UI" w:cs="Segoe UI"/>
+          <w:color w:val="ECECF1"/>
+          <w:shd w:val="clear" w:color="auto" w:fill="343541"/>
+        </w:rPr>
+        <w:t xml:space="preserve">4 Готовится </w:t>
       </w:r>
       <w:proofErr w:type="gramStart"/>
       <w:r>
@@ -1597,7 +1848,7 @@
           <w:color w:val="ECECF1"/>
           <w:shd w:val="clear" w:color="auto" w:fill="343541"/>
         </w:rPr>
-        <w:t>Завершить</w:t>
+        <w:t>к разработки</w:t>
       </w:r>
       <w:proofErr w:type="gramEnd"/>
       <w:r>
@@ -1606,145 +1857,7 @@
           <w:color w:val="ECECF1"/>
           <w:shd w:val="clear" w:color="auto" w:fill="343541"/>
         </w:rPr>
-        <w:t xml:space="preserve"> прототип, получив работоспособную квестовую систему. </w:t>
-      </w:r>
-    </w:p>
-    <w:p>
-      <w:pPr>
-        <w:ind w:left="708"/>
-        <w:rPr>
-          <w:rFonts w:ascii="Segoe UI" w:hAnsi="Segoe UI" w:cs="Segoe UI"/>
-          <w:color w:val="ECECF1"/>
-          <w:shd w:val="clear" w:color="auto" w:fill="343541"/>
-        </w:rPr>
-      </w:pPr>
-      <w:r>
-        <w:rPr>
-          <w:rFonts w:ascii="Segoe UI" w:hAnsi="Segoe UI" w:cs="Segoe UI"/>
-          <w:color w:val="ECECF1"/>
-          <w:shd w:val="clear" w:color="auto" w:fill="343541"/>
-        </w:rPr>
-        <w:t xml:space="preserve">2б </w:t>
-      </w:r>
-      <w:proofErr w:type="gramStart"/>
-      <w:r>
-        <w:rPr>
-          <w:rFonts w:ascii="Segoe UI" w:hAnsi="Segoe UI" w:cs="Segoe UI"/>
-          <w:color w:val="ECECF1"/>
-          <w:shd w:val="clear" w:color="auto" w:fill="343541"/>
-        </w:rPr>
-        <w:t>Контролировать</w:t>
-      </w:r>
-      <w:proofErr w:type="gramEnd"/>
-      <w:r>
-        <w:rPr>
-          <w:rFonts w:ascii="Segoe UI" w:hAnsi="Segoe UI" w:cs="Segoe UI"/>
-          <w:color w:val="ECECF1"/>
-          <w:shd w:val="clear" w:color="auto" w:fill="343541"/>
-        </w:rPr>
-        <w:t xml:space="preserve"> состояние архитектуры при разработке доработке прототипа </w:t>
-      </w:r>
-      <w:proofErr w:type="spellStart"/>
-      <w:r>
-        <w:rPr>
-          <w:rFonts w:ascii="Segoe UI" w:hAnsi="Segoe UI" w:cs="Segoe UI"/>
-          <w:color w:val="ECECF1"/>
-          <w:shd w:val="clear" w:color="auto" w:fill="343541"/>
-        </w:rPr>
-        <w:t>квестовой</w:t>
-      </w:r>
-      <w:proofErr w:type="spellEnd"/>
-      <w:r>
-        <w:rPr>
-          <w:rFonts w:ascii="Segoe UI" w:hAnsi="Segoe UI" w:cs="Segoe UI"/>
-          <w:color w:val="ECECF1"/>
-          <w:shd w:val="clear" w:color="auto" w:fill="343541"/>
-        </w:rPr>
-        <w:t xml:space="preserve"> системы. </w:t>
-      </w:r>
-    </w:p>
-    <w:p>
-      <w:pPr>
-        <w:rPr>
-          <w:rFonts w:ascii="Segoe UI" w:hAnsi="Segoe UI" w:cs="Segoe UI"/>
-          <w:color w:val="ECECF1"/>
-          <w:shd w:val="clear" w:color="auto" w:fill="343541"/>
-        </w:rPr>
-      </w:pPr>
-      <w:r>
-        <w:rPr>
-          <w:rFonts w:ascii="Segoe UI" w:hAnsi="Segoe UI" w:cs="Segoe UI"/>
-          <w:color w:val="ECECF1"/>
-          <w:shd w:val="clear" w:color="auto" w:fill="343541"/>
-        </w:rPr>
-        <w:t xml:space="preserve">3 Расширить систему диалогов с возможностью выдачи квестов через диалоги. </w:t>
-      </w:r>
-    </w:p>
-    <w:p>
-      <w:pPr>
-        <w:rPr>
-          <w:rFonts w:ascii="Segoe UI" w:hAnsi="Segoe UI" w:cs="Segoe UI"/>
-          <w:color w:val="ECECF1"/>
-          <w:shd w:val="clear" w:color="auto" w:fill="343541"/>
-        </w:rPr>
-      </w:pPr>
-      <w:r>
-        <w:rPr>
-          <w:rFonts w:ascii="Segoe UI" w:hAnsi="Segoe UI" w:cs="Segoe UI"/>
-          <w:color w:val="ECECF1"/>
-          <w:shd w:val="clear" w:color="auto" w:fill="343541"/>
-        </w:rPr>
-        <w:t xml:space="preserve">4 Рассмотреть возможность расширить систему предметов. </w:t>
-      </w:r>
-    </w:p>
-    <w:p>
-      <w:pPr>
-        <w:rPr>
-          <w:rFonts w:ascii="Segoe UI" w:hAnsi="Segoe UI" w:cs="Segoe UI"/>
-          <w:color w:val="ECECF1"/>
-          <w:shd w:val="clear" w:color="auto" w:fill="343541"/>
-        </w:rPr>
-      </w:pPr>
-      <w:r>
-        <w:rPr>
-          <w:rFonts w:ascii="Segoe UI" w:hAnsi="Segoe UI" w:cs="Segoe UI"/>
-          <w:color w:val="ECECF1"/>
-          <w:shd w:val="clear" w:color="auto" w:fill="343541"/>
-        </w:rPr>
-        <w:t xml:space="preserve">5 Готовиться к модификации системы инвентаря. </w:t>
-      </w:r>
-    </w:p>
-    <w:p>
-      <w:pPr>
-        <w:rPr>
-          <w:strike/>
-        </w:rPr>
-      </w:pPr>
-      <w:r>
-        <w:rPr>
-          <w:rFonts w:ascii="Segoe UI" w:hAnsi="Segoe UI" w:cs="Segoe UI"/>
-          <w:color w:val="ECECF1"/>
-          <w:shd w:val="clear" w:color="auto" w:fill="343541"/>
-        </w:rPr>
-        <w:t xml:space="preserve">6 Готовиться к реализации системы торговли. </w:t>
-      </w:r>
-      <w:proofErr w:type="gramStart"/>
-      <w:r>
-        <w:rPr>
-          <w:rFonts w:ascii="Segoe UI" w:hAnsi="Segoe UI" w:cs="Segoe UI"/>
-          <w:color w:val="ECECF1"/>
-          <w:shd w:val="clear" w:color="auto" w:fill="343541"/>
-        </w:rPr>
-        <w:t>Также</w:t>
-      </w:r>
-      <w:proofErr w:type="gramEnd"/>
-      <w:r>
-        <w:rPr>
-          <w:rFonts w:ascii="Segoe UI" w:hAnsi="Segoe UI" w:cs="Segoe UI"/>
-          <w:color w:val="ECECF1"/>
-          <w:shd w:val="clear" w:color="auto" w:fill="343541"/>
-        </w:rPr>
-        <w:t xml:space="preserve"> как и второй этап достаточно длительный.</w:t>
+        <w:t xml:space="preserve"> системы торговли.</w:t>
       </w:r>
     </w:p>
     <w:sectPr>

</xml_diff>

<commit_message>
Update DialogSystem. Implemented function to give quest from dialog.
</commit_message>
<xml_diff>
--- a/Итерации.docx
+++ b/Итерации.docx
@@ -1795,37 +1795,39 @@
       <w:pPr>
         <w:rPr>
           <w:rFonts w:ascii="Segoe UI" w:hAnsi="Segoe UI" w:cs="Segoe UI"/>
-          <w:color w:val="ECECF1"/>
-          <w:shd w:val="clear" w:color="auto" w:fill="343541"/>
-        </w:rPr>
-      </w:pPr>
-      <w:r>
-        <w:rPr>
-          <w:rFonts w:ascii="Segoe UI" w:hAnsi="Segoe UI" w:cs="Segoe UI"/>
+          <w:strike/>
+          <w:color w:val="ECECF1"/>
+          <w:shd w:val="clear" w:color="auto" w:fill="343541"/>
+        </w:rPr>
+      </w:pPr>
+      <w:r>
+        <w:rPr>
+          <w:rFonts w:ascii="Segoe UI" w:hAnsi="Segoe UI" w:cs="Segoe UI"/>
+          <w:strike/>
           <w:color w:val="ECECF1"/>
           <w:shd w:val="clear" w:color="auto" w:fill="343541"/>
         </w:rPr>
         <w:t xml:space="preserve">2 Расширить систему диалогов добавив возможность игроку брать квесты для убийства нежити. </w:t>
-      </w:r>
-    </w:p>
-    <w:p>
-      <w:pPr>
-        <w:rPr>
-          <w:rFonts w:ascii="Segoe UI" w:hAnsi="Segoe UI" w:cs="Segoe UI"/>
-          <w:color w:val="ECECF1"/>
-          <w:shd w:val="clear" w:color="auto" w:fill="343541"/>
-        </w:rPr>
-      </w:pPr>
-      <w:r>
-        <w:rPr>
-          <w:rFonts w:ascii="Segoe UI" w:hAnsi="Segoe UI" w:cs="Segoe UI"/>
-          <w:color w:val="ECECF1"/>
-          <w:shd w:val="clear" w:color="auto" w:fill="343541"/>
-        </w:rPr>
-        <w:t xml:space="preserve">3 Расширить систему квестов. </w:t>
       </w:r>
       <w:bookmarkStart w:id="0" w:name="_GoBack"/>
       <w:bookmarkEnd w:id="0"/>
+    </w:p>
+    <w:p>
+      <w:pPr>
+        <w:rPr>
+          <w:rFonts w:ascii="Segoe UI" w:hAnsi="Segoe UI" w:cs="Segoe UI"/>
+          <w:color w:val="ECECF1"/>
+          <w:shd w:val="clear" w:color="auto" w:fill="343541"/>
+        </w:rPr>
+      </w:pPr>
+      <w:r>
+        <w:rPr>
+          <w:rFonts w:ascii="Segoe UI" w:hAnsi="Segoe UI" w:cs="Segoe UI"/>
+          <w:color w:val="ECECF1"/>
+          <w:shd w:val="clear" w:color="auto" w:fill="343541"/>
+        </w:rPr>
+        <w:t xml:space="preserve">3 Расширить систему квестов. </w:t>
+      </w:r>
     </w:p>
     <w:p>
       <w:pPr>

</xml_diff>

<commit_message>
Implemented load QuestData. Modified PlayerProgressService.
</commit_message>
<xml_diff>
--- a/Итерации.docx
+++ b/Итерации.docx
@@ -1778,13 +1778,15 @@
       <w:pPr>
         <w:rPr>
           <w:rFonts w:ascii="Segoe UI" w:hAnsi="Segoe UI" w:cs="Segoe UI"/>
-          <w:color w:val="ECECF1"/>
-          <w:shd w:val="clear" w:color="auto" w:fill="343541"/>
-        </w:rPr>
-      </w:pPr>
-      <w:r>
-        <w:rPr>
-          <w:rFonts w:ascii="Segoe UI" w:hAnsi="Segoe UI" w:cs="Segoe UI"/>
+          <w:strike/>
+          <w:color w:val="ECECF1"/>
+          <w:shd w:val="clear" w:color="auto" w:fill="343541"/>
+        </w:rPr>
+      </w:pPr>
+      <w:r>
+        <w:rPr>
+          <w:rFonts w:ascii="Segoe UI" w:hAnsi="Segoe UI" w:cs="Segoe UI"/>
+          <w:strike/>
           <w:color w:val="ECECF1"/>
           <w:shd w:val="clear" w:color="auto" w:fill="343541"/>
         </w:rPr>
@@ -1819,50 +1821,50 @@
           <w:shd w:val="clear" w:color="auto" w:fill="343541"/>
         </w:rPr>
       </w:pPr>
+      <w:r>
+        <w:rPr>
+          <w:rFonts w:ascii="Segoe UI" w:hAnsi="Segoe UI" w:cs="Segoe UI"/>
+          <w:strike/>
+          <w:color w:val="ECECF1"/>
+          <w:shd w:val="clear" w:color="auto" w:fill="343541"/>
+        </w:rPr>
+        <w:t xml:space="preserve">3 Расширить систему квестов. </w:t>
+      </w:r>
+    </w:p>
+    <w:p>
+      <w:pPr>
+        <w:rPr>
+          <w:strike/>
+        </w:rPr>
+      </w:pPr>
+      <w:r>
+        <w:rPr>
+          <w:rFonts w:ascii="Segoe UI" w:hAnsi="Segoe UI" w:cs="Segoe UI"/>
+          <w:color w:val="ECECF1"/>
+          <w:shd w:val="clear" w:color="auto" w:fill="343541"/>
+        </w:rPr>
+        <w:t xml:space="preserve">4 Готовится </w:t>
+      </w:r>
+      <w:proofErr w:type="gramStart"/>
+      <w:r>
+        <w:rPr>
+          <w:rFonts w:ascii="Segoe UI" w:hAnsi="Segoe UI" w:cs="Segoe UI"/>
+          <w:color w:val="ECECF1"/>
+          <w:shd w:val="clear" w:color="auto" w:fill="343541"/>
+        </w:rPr>
+        <w:t>к разработки</w:t>
+      </w:r>
+      <w:proofErr w:type="gramEnd"/>
+      <w:r>
+        <w:rPr>
+          <w:rFonts w:ascii="Segoe UI" w:hAnsi="Segoe UI" w:cs="Segoe UI"/>
+          <w:color w:val="ECECF1"/>
+          <w:shd w:val="clear" w:color="auto" w:fill="343541"/>
+        </w:rPr>
+        <w:t xml:space="preserve"> системы торговли.</w:t>
+      </w:r>
       <w:bookmarkStart w:id="0" w:name="_GoBack"/>
-      <w:r>
-        <w:rPr>
-          <w:rFonts w:ascii="Segoe UI" w:hAnsi="Segoe UI" w:cs="Segoe UI"/>
-          <w:strike/>
-          <w:color w:val="ECECF1"/>
-          <w:shd w:val="clear" w:color="auto" w:fill="343541"/>
-        </w:rPr>
-        <w:t xml:space="preserve">3 Расширить систему квестов. </w:t>
-      </w:r>
-    </w:p>
-    <w:bookmarkEnd w:id="0"/>
-    <w:p>
-      <w:pPr>
-        <w:rPr>
-          <w:strike/>
-        </w:rPr>
-      </w:pPr>
-      <w:r>
-        <w:rPr>
-          <w:rFonts w:ascii="Segoe UI" w:hAnsi="Segoe UI" w:cs="Segoe UI"/>
-          <w:color w:val="ECECF1"/>
-          <w:shd w:val="clear" w:color="auto" w:fill="343541"/>
-        </w:rPr>
-        <w:t xml:space="preserve">4 Готовится </w:t>
-      </w:r>
-      <w:proofErr w:type="gramStart"/>
-      <w:r>
-        <w:rPr>
-          <w:rFonts w:ascii="Segoe UI" w:hAnsi="Segoe UI" w:cs="Segoe UI"/>
-          <w:color w:val="ECECF1"/>
-          <w:shd w:val="clear" w:color="auto" w:fill="343541"/>
-        </w:rPr>
-        <w:t>к разработки</w:t>
-      </w:r>
-      <w:proofErr w:type="gramEnd"/>
-      <w:r>
-        <w:rPr>
-          <w:rFonts w:ascii="Segoe UI" w:hAnsi="Segoe UI" w:cs="Segoe UI"/>
-          <w:color w:val="ECECF1"/>
-          <w:shd w:val="clear" w:color="auto" w:fill="343541"/>
-        </w:rPr>
-        <w:t xml:space="preserve"> системы торговли.</w:t>
-      </w:r>
+      <w:bookmarkEnd w:id="0"/>
     </w:p>
     <w:sectPr>
       <w:pgSz w:w="11906" w:h="16838"/>

</xml_diff>

<commit_message>
Fix DialogUI. Update hierarchy QuestSystem.
</commit_message>
<xml_diff>
--- a/Итерации.docx
+++ b/Итерации.docx
@@ -35,27 +35,7 @@
           <w:color w:val="ECECF1"/>
           <w:shd w:val="clear" w:color="auto" w:fill="343541"/>
         </w:rPr>
-        <w:t xml:space="preserve">1 разобраться </w:t>
-      </w:r>
-      <w:proofErr w:type="gramStart"/>
-      <w:r>
-        <w:rPr>
-          <w:rFonts w:ascii="Segoe UI" w:hAnsi="Segoe UI" w:cs="Segoe UI"/>
-          <w:strike/>
-          <w:color w:val="ECECF1"/>
-          <w:shd w:val="clear" w:color="auto" w:fill="343541"/>
-        </w:rPr>
-        <w:t>из структурой</w:t>
-      </w:r>
-      <w:proofErr w:type="gramEnd"/>
-      <w:r>
-        <w:rPr>
-          <w:rFonts w:ascii="Segoe UI" w:hAnsi="Segoe UI" w:cs="Segoe UI"/>
-          <w:strike/>
-          <w:color w:val="ECECF1"/>
-          <w:shd w:val="clear" w:color="auto" w:fill="343541"/>
-        </w:rPr>
-        <w:t xml:space="preserve"> данных которая будет использоваться для сохранения данных игры. Структура должна быть организована на </w:t>
+        <w:t xml:space="preserve">1 разобраться из структурой данных которая будет использоваться для сохранения данных игры. Структура должна быть организована на </w:t>
       </w:r>
       <w:proofErr w:type="spellStart"/>
       <w:r>
@@ -126,25 +106,7 @@
           <w:color w:val="ECECF1"/>
           <w:shd w:val="clear" w:color="auto" w:fill="343541"/>
         </w:rPr>
-        <w:t xml:space="preserve">4 Продумать кто и каким образом будет собирать </w:t>
-      </w:r>
-      <w:proofErr w:type="gramStart"/>
-      <w:r>
-        <w:rPr>
-          <w:rFonts w:ascii="Segoe UI" w:hAnsi="Segoe UI" w:cs="Segoe UI"/>
-          <w:color w:val="ECECF1"/>
-          <w:shd w:val="clear" w:color="auto" w:fill="343541"/>
-        </w:rPr>
-        <w:t>компоненты</w:t>
-      </w:r>
-      <w:proofErr w:type="gramEnd"/>
-      <w:r>
-        <w:rPr>
-          <w:rFonts w:ascii="Segoe UI" w:hAnsi="Segoe UI" w:cs="Segoe UI"/>
-          <w:color w:val="ECECF1"/>
-          <w:shd w:val="clear" w:color="auto" w:fill="343541"/>
-        </w:rPr>
-        <w:t xml:space="preserve"> которые реализовывают интерфейсы для сохранения и/или загрузки данных. Возможно это должна быть фабрика. </w:t>
+        <w:t xml:space="preserve">4 Продумать кто и каким образом будет собирать компоненты которые реализовывают интерфейсы для сохранения и/или загрузки данных. Возможно это должна быть фабрика. </w:t>
       </w:r>
     </w:p>
     <w:p>
@@ -1261,25 +1223,7 @@
           <w:color w:val="ECECF1"/>
           <w:shd w:val="clear" w:color="auto" w:fill="343541"/>
         </w:rPr>
-        <w:t xml:space="preserve">Второй и третий пункт хоть и выглядят достаточно </w:t>
-      </w:r>
-      <w:proofErr w:type="gramStart"/>
-      <w:r>
-        <w:rPr>
-          <w:rFonts w:ascii="Segoe UI" w:hAnsi="Segoe UI" w:cs="Segoe UI"/>
-          <w:color w:val="ECECF1"/>
-          <w:shd w:val="clear" w:color="auto" w:fill="343541"/>
-        </w:rPr>
-        <w:t>просто</w:t>
-      </w:r>
-      <w:proofErr w:type="gramEnd"/>
-      <w:r>
-        <w:rPr>
-          <w:rFonts w:ascii="Segoe UI" w:hAnsi="Segoe UI" w:cs="Segoe UI"/>
-          <w:color w:val="ECECF1"/>
-          <w:shd w:val="clear" w:color="auto" w:fill="343541"/>
-        </w:rPr>
-        <w:t xml:space="preserve"> но на самом деле именно эти два пункта содержат колоссальную работу над проектом.</w:t>
+        <w:t>Второй и третий пункт хоть и выглядят достаточно просто но на самом деле именно эти два пункта содержат колоссальную работу над проектом.</w:t>
       </w:r>
     </w:p>
     <w:p>
@@ -1423,27 +1367,7 @@
           <w:color w:val="ECECF1"/>
           <w:shd w:val="clear" w:color="auto" w:fill="343541"/>
         </w:rPr>
-        <w:t xml:space="preserve">5 Начать погружаться в квестовую систему. Это достаточно крупный шаг и </w:t>
-      </w:r>
-      <w:proofErr w:type="gramStart"/>
-      <w:r>
-        <w:rPr>
-          <w:rFonts w:ascii="Segoe UI" w:hAnsi="Segoe UI" w:cs="Segoe UI"/>
-          <w:strike/>
-          <w:color w:val="ECECF1"/>
-          <w:shd w:val="clear" w:color="auto" w:fill="343541"/>
-        </w:rPr>
-        <w:t>по этому</w:t>
-      </w:r>
-      <w:proofErr w:type="gramEnd"/>
-      <w:r>
-        <w:rPr>
-          <w:rFonts w:ascii="Segoe UI" w:hAnsi="Segoe UI" w:cs="Segoe UI"/>
-          <w:strike/>
-          <w:color w:val="ECECF1"/>
-          <w:shd w:val="clear" w:color="auto" w:fill="343541"/>
-        </w:rPr>
-        <w:t xml:space="preserve"> он займет больше всего времени, хотя и на первый взгляд все написано просто.</w:t>
+        <w:t>5 Начать погружаться в квестовую систему. Это достаточно крупный шаг и по этому он займет больше всего времени, хотя и на первый взгляд все написано просто.</w:t>
       </w:r>
     </w:p>
     <w:p>
@@ -1586,25 +1510,7 @@
           <w:color w:val="ECECF1"/>
           <w:shd w:val="clear" w:color="auto" w:fill="343541"/>
         </w:rPr>
-        <w:t xml:space="preserve">2а </w:t>
-      </w:r>
-      <w:proofErr w:type="gramStart"/>
-      <w:r>
-        <w:rPr>
-          <w:rFonts w:ascii="Segoe UI" w:hAnsi="Segoe UI" w:cs="Segoe UI"/>
-          <w:color w:val="ECECF1"/>
-          <w:shd w:val="clear" w:color="auto" w:fill="343541"/>
-        </w:rPr>
-        <w:t>Завершить</w:t>
-      </w:r>
-      <w:proofErr w:type="gramEnd"/>
-      <w:r>
-        <w:rPr>
-          <w:rFonts w:ascii="Segoe UI" w:hAnsi="Segoe UI" w:cs="Segoe UI"/>
-          <w:color w:val="ECECF1"/>
-          <w:shd w:val="clear" w:color="auto" w:fill="343541"/>
-        </w:rPr>
-        <w:t xml:space="preserve"> прототип, получив работоспособную квестовую систему. </w:t>
+        <w:t xml:space="preserve">2а Завершить прототип, получив работоспособную квестовую систему. </w:t>
       </w:r>
     </w:p>
     <w:p>
@@ -1622,25 +1528,7 @@
           <w:color w:val="ECECF1"/>
           <w:shd w:val="clear" w:color="auto" w:fill="343541"/>
         </w:rPr>
-        <w:t xml:space="preserve">2б </w:t>
-      </w:r>
-      <w:proofErr w:type="gramStart"/>
-      <w:r>
-        <w:rPr>
-          <w:rFonts w:ascii="Segoe UI" w:hAnsi="Segoe UI" w:cs="Segoe UI"/>
-          <w:color w:val="ECECF1"/>
-          <w:shd w:val="clear" w:color="auto" w:fill="343541"/>
-        </w:rPr>
-        <w:t>Контролировать</w:t>
-      </w:r>
-      <w:proofErr w:type="gramEnd"/>
-      <w:r>
-        <w:rPr>
-          <w:rFonts w:ascii="Segoe UI" w:hAnsi="Segoe UI" w:cs="Segoe UI"/>
-          <w:color w:val="ECECF1"/>
-          <w:shd w:val="clear" w:color="auto" w:fill="343541"/>
-        </w:rPr>
-        <w:t xml:space="preserve"> состояние архитектуры при разработке доработке прототипа </w:t>
+        <w:t xml:space="preserve">2б Контролировать состояние архитектуры при разработке доработке прототипа </w:t>
       </w:r>
       <w:proofErr w:type="spellStart"/>
       <w:r>
@@ -1726,25 +1614,7 @@
           <w:color w:val="ECECF1"/>
           <w:shd w:val="clear" w:color="auto" w:fill="343541"/>
         </w:rPr>
-        <w:t xml:space="preserve">6 Готовиться к реализации системы торговли. </w:t>
-      </w:r>
-      <w:proofErr w:type="gramStart"/>
-      <w:r>
-        <w:rPr>
-          <w:rFonts w:ascii="Segoe UI" w:hAnsi="Segoe UI" w:cs="Segoe UI"/>
-          <w:color w:val="ECECF1"/>
-          <w:shd w:val="clear" w:color="auto" w:fill="343541"/>
-        </w:rPr>
-        <w:t>Также</w:t>
-      </w:r>
-      <w:proofErr w:type="gramEnd"/>
-      <w:r>
-        <w:rPr>
-          <w:rFonts w:ascii="Segoe UI" w:hAnsi="Segoe UI" w:cs="Segoe UI"/>
-          <w:color w:val="ECECF1"/>
-          <w:shd w:val="clear" w:color="auto" w:fill="343541"/>
-        </w:rPr>
-        <w:t xml:space="preserve"> как и второй этап достаточно длительный.</w:t>
+        <w:t>6 Готовиться к реализации системы торговли. Также как и второй этап достаточно длительный.</w:t>
       </w:r>
     </w:p>
     <w:p>
@@ -1834,37 +1704,239 @@
     <w:p>
       <w:pPr>
         <w:rPr>
-          <w:strike/>
-        </w:rPr>
-      </w:pPr>
-      <w:r>
-        <w:rPr>
-          <w:rFonts w:ascii="Segoe UI" w:hAnsi="Segoe UI" w:cs="Segoe UI"/>
-          <w:color w:val="ECECF1"/>
-          <w:shd w:val="clear" w:color="auto" w:fill="343541"/>
-        </w:rPr>
-        <w:t xml:space="preserve">4 Готовится </w:t>
-      </w:r>
-      <w:proofErr w:type="gramStart"/>
-      <w:r>
-        <w:rPr>
-          <w:rFonts w:ascii="Segoe UI" w:hAnsi="Segoe UI" w:cs="Segoe UI"/>
-          <w:color w:val="ECECF1"/>
-          <w:shd w:val="clear" w:color="auto" w:fill="343541"/>
-        </w:rPr>
-        <w:t>к разработки</w:t>
-      </w:r>
-      <w:proofErr w:type="gramEnd"/>
-      <w:r>
-        <w:rPr>
-          <w:rFonts w:ascii="Segoe UI" w:hAnsi="Segoe UI" w:cs="Segoe UI"/>
-          <w:color w:val="ECECF1"/>
-          <w:shd w:val="clear" w:color="auto" w:fill="343541"/>
-        </w:rPr>
-        <w:t xml:space="preserve"> системы торговли.</w:t>
-      </w:r>
+          <w:rFonts w:ascii="Segoe UI" w:hAnsi="Segoe UI" w:cs="Segoe UI"/>
+          <w:color w:val="ECECF1"/>
+          <w:shd w:val="clear" w:color="auto" w:fill="343541"/>
+        </w:rPr>
+      </w:pPr>
+      <w:r>
+        <w:rPr>
+          <w:rFonts w:ascii="Segoe UI" w:hAnsi="Segoe UI" w:cs="Segoe UI"/>
+          <w:color w:val="ECECF1"/>
+          <w:shd w:val="clear" w:color="auto" w:fill="343541"/>
+        </w:rPr>
+        <w:t>4 Готовится к разработки системы торговли.</w:t>
+      </w:r>
+    </w:p>
+    <w:p>
+      <w:pPr>
+        <w:rPr>
+          <w:rFonts w:ascii="Segoe UI" w:hAnsi="Segoe UI" w:cs="Segoe UI"/>
+          <w:color w:val="ECECF1"/>
+          <w:shd w:val="clear" w:color="auto" w:fill="343541"/>
+        </w:rPr>
+      </w:pPr>
+    </w:p>
+    <w:p>
+      <w:pPr>
+        <w:rPr>
+          <w:rFonts w:ascii="Segoe UI" w:hAnsi="Segoe UI" w:cs="Segoe UI"/>
+          <w:color w:val="ECECF1"/>
+          <w:shd w:val="clear" w:color="auto" w:fill="343541"/>
+        </w:rPr>
+      </w:pPr>
+      <w:r>
+        <w:rPr>
+          <w:rFonts w:ascii="Segoe UI" w:hAnsi="Segoe UI" w:cs="Segoe UI"/>
+          <w:color w:val="ECECF1"/>
+          <w:shd w:val="clear" w:color="auto" w:fill="343541"/>
+        </w:rPr>
+        <w:t xml:space="preserve">10 итерация: </w:t>
+      </w:r>
+    </w:p>
+    <w:p>
+      <w:pPr>
+        <w:rPr>
+          <w:rFonts w:ascii="Segoe UI" w:hAnsi="Segoe UI" w:cs="Segoe UI"/>
+          <w:strike/>
+          <w:color w:val="ECECF1"/>
+          <w:shd w:val="clear" w:color="auto" w:fill="343541"/>
+        </w:rPr>
+      </w:pPr>
       <w:bookmarkStart w:id="0" w:name="_GoBack"/>
-      <w:bookmarkEnd w:id="0"/>
+      <w:r>
+        <w:rPr>
+          <w:rFonts w:ascii="Segoe UI" w:hAnsi="Segoe UI" w:cs="Segoe UI"/>
+          <w:strike/>
+          <w:color w:val="ECECF1"/>
+          <w:shd w:val="clear" w:color="auto" w:fill="343541"/>
+        </w:rPr>
+        <w:t xml:space="preserve">1 Нужно исправить внешний вид диалоговой системы (подправить баг с отображением). </w:t>
+      </w:r>
+    </w:p>
+    <w:bookmarkEnd w:id="0"/>
+    <w:p>
+      <w:pPr>
+        <w:rPr>
+          <w:rFonts w:ascii="Segoe UI" w:hAnsi="Segoe UI" w:cs="Segoe UI"/>
+          <w:color w:val="ECECF1"/>
+          <w:shd w:val="clear" w:color="auto" w:fill="343541"/>
+        </w:rPr>
+      </w:pPr>
+      <w:r>
+        <w:rPr>
+          <w:rFonts w:ascii="Segoe UI" w:hAnsi="Segoe UI" w:cs="Segoe UI"/>
+          <w:color w:val="ECECF1"/>
+          <w:shd w:val="clear" w:color="auto" w:fill="343541"/>
+        </w:rPr>
+        <w:t xml:space="preserve">2 Нужно решить проблему связанную с отображением окна квест </w:t>
+      </w:r>
+      <w:proofErr w:type="spellStart"/>
+      <w:r>
+        <w:rPr>
+          <w:rFonts w:ascii="Segoe UI" w:hAnsi="Segoe UI" w:cs="Segoe UI"/>
+          <w:color w:val="ECECF1"/>
+          <w:shd w:val="clear" w:color="auto" w:fill="343541"/>
+        </w:rPr>
+        <w:t>трекера</w:t>
+      </w:r>
+      <w:proofErr w:type="spellEnd"/>
+      <w:r>
+        <w:rPr>
+          <w:rFonts w:ascii="Segoe UI" w:hAnsi="Segoe UI" w:cs="Segoe UI"/>
+          <w:color w:val="ECECF1"/>
+          <w:shd w:val="clear" w:color="auto" w:fill="343541"/>
+        </w:rPr>
+        <w:t xml:space="preserve">, а именно проблема с отображением активного квеста, возможно стоит расширить квестовую систему еще одним событием которое будет информировать своих подписчиков о том что нужно обновить интерфейс. </w:t>
+      </w:r>
+    </w:p>
+    <w:p>
+      <w:pPr>
+        <w:rPr>
+          <w:rFonts w:ascii="Segoe UI" w:hAnsi="Segoe UI" w:cs="Segoe UI"/>
+          <w:color w:val="ECECF1"/>
+          <w:shd w:val="clear" w:color="auto" w:fill="343541"/>
+        </w:rPr>
+      </w:pPr>
+      <w:r>
+        <w:rPr>
+          <w:rFonts w:ascii="Segoe UI" w:hAnsi="Segoe UI" w:cs="Segoe UI"/>
+          <w:color w:val="ECECF1"/>
+          <w:shd w:val="clear" w:color="auto" w:fill="343541"/>
+        </w:rPr>
+        <w:t xml:space="preserve">3 Обновить UI для интерфейса системы квестов. </w:t>
+      </w:r>
+    </w:p>
+    <w:p>
+      <w:pPr>
+        <w:rPr>
+          <w:rFonts w:ascii="Segoe UI" w:hAnsi="Segoe UI" w:cs="Segoe UI"/>
+          <w:color w:val="ECECF1"/>
+          <w:shd w:val="clear" w:color="auto" w:fill="343541"/>
+        </w:rPr>
+      </w:pPr>
+      <w:r>
+        <w:rPr>
+          <w:rFonts w:ascii="Segoe UI" w:hAnsi="Segoe UI" w:cs="Segoe UI"/>
+          <w:color w:val="ECECF1"/>
+          <w:shd w:val="clear" w:color="auto" w:fill="343541"/>
+        </w:rPr>
+        <w:t xml:space="preserve">4 Просмотреть структуру </w:t>
+      </w:r>
+      <w:proofErr w:type="spellStart"/>
+      <w:r>
+        <w:rPr>
+          <w:rFonts w:ascii="Segoe UI" w:hAnsi="Segoe UI" w:cs="Segoe UI"/>
+          <w:color w:val="ECECF1"/>
+          <w:shd w:val="clear" w:color="auto" w:fill="343541"/>
+        </w:rPr>
+        <w:t>PlayerProgressService</w:t>
+      </w:r>
+      <w:proofErr w:type="spellEnd"/>
+      <w:r>
+        <w:rPr>
+          <w:rFonts w:ascii="Segoe UI" w:hAnsi="Segoe UI" w:cs="Segoe UI"/>
+          <w:color w:val="ECECF1"/>
+          <w:shd w:val="clear" w:color="auto" w:fill="343541"/>
+        </w:rPr>
+        <w:t xml:space="preserve">, а также компонентов: </w:t>
+      </w:r>
+      <w:proofErr w:type="spellStart"/>
+      <w:r>
+        <w:rPr>
+          <w:rFonts w:ascii="Segoe UI" w:hAnsi="Segoe UI" w:cs="Segoe UI"/>
+          <w:color w:val="ECECF1"/>
+          <w:shd w:val="clear" w:color="auto" w:fill="343541"/>
+        </w:rPr>
+        <w:t>IPlayerProgressUpdater</w:t>
+      </w:r>
+      <w:proofErr w:type="spellEnd"/>
+      <w:r>
+        <w:rPr>
+          <w:rFonts w:ascii="Segoe UI" w:hAnsi="Segoe UI" w:cs="Segoe UI"/>
+          <w:color w:val="ECECF1"/>
+          <w:shd w:val="clear" w:color="auto" w:fill="343541"/>
+        </w:rPr>
+        <w:t xml:space="preserve">, </w:t>
+      </w:r>
+      <w:proofErr w:type="spellStart"/>
+      <w:r>
+        <w:rPr>
+          <w:rFonts w:ascii="Segoe UI" w:hAnsi="Segoe UI" w:cs="Segoe UI"/>
+          <w:color w:val="ECECF1"/>
+          <w:shd w:val="clear" w:color="auto" w:fill="343541"/>
+        </w:rPr>
+        <w:t>IPlayerProgressLoader</w:t>
+      </w:r>
+      <w:proofErr w:type="spellEnd"/>
+      <w:r>
+        <w:rPr>
+          <w:rFonts w:ascii="Segoe UI" w:hAnsi="Segoe UI" w:cs="Segoe UI"/>
+          <w:color w:val="ECECF1"/>
+          <w:shd w:val="clear" w:color="auto" w:fill="343541"/>
+        </w:rPr>
+        <w:t xml:space="preserve">. Как минимум нужно обновить </w:t>
+      </w:r>
+      <w:proofErr w:type="spellStart"/>
+      <w:r>
+        <w:rPr>
+          <w:rFonts w:ascii="Segoe UI" w:hAnsi="Segoe UI" w:cs="Segoe UI"/>
+          <w:color w:val="ECECF1"/>
+          <w:shd w:val="clear" w:color="auto" w:fill="343541"/>
+        </w:rPr>
+        <w:t>нейминг</w:t>
+      </w:r>
+      <w:proofErr w:type="spellEnd"/>
+      <w:r>
+        <w:rPr>
+          <w:rFonts w:ascii="Segoe UI" w:hAnsi="Segoe UI" w:cs="Segoe UI"/>
+          <w:color w:val="ECECF1"/>
+          <w:shd w:val="clear" w:color="auto" w:fill="343541"/>
+        </w:rPr>
+        <w:t xml:space="preserve">, возможно придётся модифицировать структуру. </w:t>
+      </w:r>
+    </w:p>
+    <w:p>
+      <w:pPr>
+        <w:rPr>
+          <w:rFonts w:ascii="Segoe UI" w:hAnsi="Segoe UI" w:cs="Segoe UI"/>
+          <w:color w:val="ECECF1"/>
+          <w:shd w:val="clear" w:color="auto" w:fill="343541"/>
+        </w:rPr>
+      </w:pPr>
+      <w:r>
+        <w:rPr>
+          <w:rFonts w:ascii="Segoe UI" w:hAnsi="Segoe UI" w:cs="Segoe UI"/>
+          <w:color w:val="ECECF1"/>
+          <w:shd w:val="clear" w:color="auto" w:fill="343541"/>
+        </w:rPr>
+        <w:t xml:space="preserve">5 Копать в направлении ранговой системы. Разобраться как она должна работать, и как ее возможно реализовать. </w:t>
+      </w:r>
+    </w:p>
+    <w:p>
+      <w:pPr>
+        <w:rPr>
+          <w:strike/>
+        </w:rPr>
+      </w:pPr>
+      <w:r>
+        <w:rPr>
+          <w:rFonts w:ascii="Segoe UI" w:hAnsi="Segoe UI" w:cs="Segoe UI"/>
+          <w:color w:val="ECECF1"/>
+          <w:shd w:val="clear" w:color="auto" w:fill="343541"/>
+        </w:rPr>
+        <w:t>6 Начать реализовывать ранговой системы.</w:t>
+      </w:r>
     </w:p>
     <w:sectPr>
       <w:pgSz w:w="11906" w:h="16838"/>

</xml_diff>

<commit_message>
End connect PlayerStats to Player Scripts.
</commit_message>
<xml_diff>
--- a/Итерации.docx
+++ b/Итерации.docx
@@ -1979,6 +1979,25 @@
           <w:shd w:val="clear" w:color="auto" w:fill="343541"/>
         </w:rPr>
       </w:pPr>
+      <w:r>
+        <w:rPr>
+          <w:rFonts w:ascii="Segoe UI" w:hAnsi="Segoe UI" w:cs="Segoe UI"/>
+          <w:strike/>
+          <w:color w:val="ECECF1"/>
+          <w:shd w:val="clear" w:color="auto" w:fill="343541"/>
+        </w:rPr>
+        <w:t xml:space="preserve">3 Обновить UI для интерфейса системы квестов. </w:t>
+      </w:r>
+    </w:p>
+    <w:p>
+      <w:pPr>
+        <w:rPr>
+          <w:rFonts w:ascii="Segoe UI" w:hAnsi="Segoe UI" w:cs="Segoe UI"/>
+          <w:strike/>
+          <w:color w:val="ECECF1"/>
+          <w:shd w:val="clear" w:color="auto" w:fill="343541"/>
+        </w:rPr>
+      </w:pPr>
       <w:bookmarkStart w:id="0" w:name="_GoBack"/>
       <w:r>
         <w:rPr>
@@ -1987,7 +2006,87 @@
           <w:color w:val="ECECF1"/>
           <w:shd w:val="clear" w:color="auto" w:fill="343541"/>
         </w:rPr>
-        <w:t xml:space="preserve">3 Обновить UI для интерфейса системы квестов. </w:t>
+        <w:t xml:space="preserve">4 Просмотреть структуру </w:t>
+      </w:r>
+      <w:proofErr w:type="spellStart"/>
+      <w:r>
+        <w:rPr>
+          <w:rFonts w:ascii="Segoe UI" w:hAnsi="Segoe UI" w:cs="Segoe UI"/>
+          <w:strike/>
+          <w:color w:val="ECECF1"/>
+          <w:shd w:val="clear" w:color="auto" w:fill="343541"/>
+        </w:rPr>
+        <w:t>PlayerProgressService</w:t>
+      </w:r>
+      <w:proofErr w:type="spellEnd"/>
+      <w:r>
+        <w:rPr>
+          <w:rFonts w:ascii="Segoe UI" w:hAnsi="Segoe UI" w:cs="Segoe UI"/>
+          <w:strike/>
+          <w:color w:val="ECECF1"/>
+          <w:shd w:val="clear" w:color="auto" w:fill="343541"/>
+        </w:rPr>
+        <w:t xml:space="preserve">, а также компонентов: </w:t>
+      </w:r>
+      <w:proofErr w:type="spellStart"/>
+      <w:r>
+        <w:rPr>
+          <w:rFonts w:ascii="Segoe UI" w:hAnsi="Segoe UI" w:cs="Segoe UI"/>
+          <w:strike/>
+          <w:color w:val="ECECF1"/>
+          <w:shd w:val="clear" w:color="auto" w:fill="343541"/>
+        </w:rPr>
+        <w:t>IPlayerProgressUpdater</w:t>
+      </w:r>
+      <w:proofErr w:type="spellEnd"/>
+      <w:r>
+        <w:rPr>
+          <w:rFonts w:ascii="Segoe UI" w:hAnsi="Segoe UI" w:cs="Segoe UI"/>
+          <w:strike/>
+          <w:color w:val="ECECF1"/>
+          <w:shd w:val="clear" w:color="auto" w:fill="343541"/>
+        </w:rPr>
+        <w:t xml:space="preserve">, </w:t>
+      </w:r>
+      <w:proofErr w:type="spellStart"/>
+      <w:r>
+        <w:rPr>
+          <w:rFonts w:ascii="Segoe UI" w:hAnsi="Segoe UI" w:cs="Segoe UI"/>
+          <w:strike/>
+          <w:color w:val="ECECF1"/>
+          <w:shd w:val="clear" w:color="auto" w:fill="343541"/>
+        </w:rPr>
+        <w:t>IPlayerProgressLoader</w:t>
+      </w:r>
+      <w:proofErr w:type="spellEnd"/>
+      <w:r>
+        <w:rPr>
+          <w:rFonts w:ascii="Segoe UI" w:hAnsi="Segoe UI" w:cs="Segoe UI"/>
+          <w:strike/>
+          <w:color w:val="ECECF1"/>
+          <w:shd w:val="clear" w:color="auto" w:fill="343541"/>
+        </w:rPr>
+        <w:t xml:space="preserve">. Как минимум нужно обновить </w:t>
+      </w:r>
+      <w:proofErr w:type="spellStart"/>
+      <w:r>
+        <w:rPr>
+          <w:rFonts w:ascii="Segoe UI" w:hAnsi="Segoe UI" w:cs="Segoe UI"/>
+          <w:strike/>
+          <w:color w:val="ECECF1"/>
+          <w:shd w:val="clear" w:color="auto" w:fill="343541"/>
+        </w:rPr>
+        <w:t>нейминг</w:t>
+      </w:r>
+      <w:proofErr w:type="spellEnd"/>
+      <w:r>
+        <w:rPr>
+          <w:rFonts w:ascii="Segoe UI" w:hAnsi="Segoe UI" w:cs="Segoe UI"/>
+          <w:strike/>
+          <w:color w:val="ECECF1"/>
+          <w:shd w:val="clear" w:color="auto" w:fill="343541"/>
+        </w:rPr>
+        <w:t xml:space="preserve">, возможно придётся модифицировать структуру. </w:t>
       </w:r>
     </w:p>
     <w:bookmarkEnd w:id="0"/>
@@ -1995,102 +2094,15 @@
       <w:pPr>
         <w:rPr>
           <w:rFonts w:ascii="Segoe UI" w:hAnsi="Segoe UI" w:cs="Segoe UI"/>
-          <w:color w:val="ECECF1"/>
-          <w:shd w:val="clear" w:color="auto" w:fill="343541"/>
-        </w:rPr>
-      </w:pPr>
-      <w:r>
-        <w:rPr>
-          <w:rFonts w:ascii="Segoe UI" w:hAnsi="Segoe UI" w:cs="Segoe UI"/>
-          <w:color w:val="ECECF1"/>
-          <w:shd w:val="clear" w:color="auto" w:fill="343541"/>
-        </w:rPr>
-        <w:t xml:space="preserve">4 Просмотреть структуру </w:t>
-      </w:r>
-      <w:proofErr w:type="spellStart"/>
-      <w:r>
-        <w:rPr>
-          <w:rFonts w:ascii="Segoe UI" w:hAnsi="Segoe UI" w:cs="Segoe UI"/>
-          <w:color w:val="ECECF1"/>
-          <w:shd w:val="clear" w:color="auto" w:fill="343541"/>
-        </w:rPr>
-        <w:t>PlayerProgressService</w:t>
-      </w:r>
-      <w:proofErr w:type="spellEnd"/>
-      <w:r>
-        <w:rPr>
-          <w:rFonts w:ascii="Segoe UI" w:hAnsi="Segoe UI" w:cs="Segoe UI"/>
-          <w:color w:val="ECECF1"/>
-          <w:shd w:val="clear" w:color="auto" w:fill="343541"/>
-        </w:rPr>
-        <w:t xml:space="preserve">, а также компонентов: </w:t>
-      </w:r>
-      <w:proofErr w:type="spellStart"/>
-      <w:r>
-        <w:rPr>
-          <w:rFonts w:ascii="Segoe UI" w:hAnsi="Segoe UI" w:cs="Segoe UI"/>
-          <w:color w:val="ECECF1"/>
-          <w:shd w:val="clear" w:color="auto" w:fill="343541"/>
-        </w:rPr>
-        <w:t>IPlayerProgressUpdater</w:t>
-      </w:r>
-      <w:proofErr w:type="spellEnd"/>
-      <w:r>
-        <w:rPr>
-          <w:rFonts w:ascii="Segoe UI" w:hAnsi="Segoe UI" w:cs="Segoe UI"/>
-          <w:color w:val="ECECF1"/>
-          <w:shd w:val="clear" w:color="auto" w:fill="343541"/>
-        </w:rPr>
-        <w:t xml:space="preserve">, </w:t>
-      </w:r>
-      <w:proofErr w:type="spellStart"/>
-      <w:r>
-        <w:rPr>
-          <w:rFonts w:ascii="Segoe UI" w:hAnsi="Segoe UI" w:cs="Segoe UI"/>
-          <w:color w:val="ECECF1"/>
-          <w:shd w:val="clear" w:color="auto" w:fill="343541"/>
-        </w:rPr>
-        <w:t>IPlayerProgressLoader</w:t>
-      </w:r>
-      <w:proofErr w:type="spellEnd"/>
-      <w:r>
-        <w:rPr>
-          <w:rFonts w:ascii="Segoe UI" w:hAnsi="Segoe UI" w:cs="Segoe UI"/>
-          <w:color w:val="ECECF1"/>
-          <w:shd w:val="clear" w:color="auto" w:fill="343541"/>
-        </w:rPr>
-        <w:t xml:space="preserve">. Как минимум нужно обновить </w:t>
-      </w:r>
-      <w:proofErr w:type="spellStart"/>
-      <w:r>
-        <w:rPr>
-          <w:rFonts w:ascii="Segoe UI" w:hAnsi="Segoe UI" w:cs="Segoe UI"/>
-          <w:color w:val="ECECF1"/>
-          <w:shd w:val="clear" w:color="auto" w:fill="343541"/>
-        </w:rPr>
-        <w:t>нейминг</w:t>
-      </w:r>
-      <w:proofErr w:type="spellEnd"/>
-      <w:r>
-        <w:rPr>
-          <w:rFonts w:ascii="Segoe UI" w:hAnsi="Segoe UI" w:cs="Segoe UI"/>
-          <w:color w:val="ECECF1"/>
-          <w:shd w:val="clear" w:color="auto" w:fill="343541"/>
-        </w:rPr>
-        <w:t xml:space="preserve">, возможно придётся модифицировать структуру. </w:t>
-      </w:r>
-    </w:p>
-    <w:p>
-      <w:pPr>
-        <w:rPr>
-          <w:rFonts w:ascii="Segoe UI" w:hAnsi="Segoe UI" w:cs="Segoe UI"/>
-          <w:color w:val="ECECF1"/>
-          <w:shd w:val="clear" w:color="auto" w:fill="343541"/>
-        </w:rPr>
-      </w:pPr>
-      <w:r>
-        <w:rPr>
-          <w:rFonts w:ascii="Segoe UI" w:hAnsi="Segoe UI" w:cs="Segoe UI"/>
+          <w:strike/>
+          <w:color w:val="ECECF1"/>
+          <w:shd w:val="clear" w:color="auto" w:fill="343541"/>
+        </w:rPr>
+      </w:pPr>
+      <w:r>
+        <w:rPr>
+          <w:rFonts w:ascii="Segoe UI" w:hAnsi="Segoe UI" w:cs="Segoe UI"/>
+          <w:strike/>
           <w:color w:val="ECECF1"/>
           <w:shd w:val="clear" w:color="auto" w:fill="343541"/>
         </w:rPr>
@@ -2106,6 +2118,7 @@
       <w:r>
         <w:rPr>
           <w:rFonts w:ascii="Segoe UI" w:hAnsi="Segoe UI" w:cs="Segoe UI"/>
+          <w:strike/>
           <w:color w:val="ECECF1"/>
           <w:shd w:val="clear" w:color="auto" w:fill="343541"/>
         </w:rPr>

</xml_diff>

<commit_message>
Start developing 11 iteration.
</commit_message>
<xml_diff>
--- a/Итерации.docx
+++ b/Итерации.docx
@@ -35,47 +35,7 @@
           <w:color w:val="ECECF1"/>
           <w:shd w:val="clear" w:color="auto" w:fill="343541"/>
         </w:rPr>
-        <w:t xml:space="preserve">1 разобраться </w:t>
-      </w:r>
-      <w:proofErr w:type="gramStart"/>
-      <w:r>
-        <w:rPr>
-          <w:rFonts w:ascii="Segoe UI" w:hAnsi="Segoe UI" w:cs="Segoe UI"/>
-          <w:strike/>
-          <w:color w:val="ECECF1"/>
-          <w:shd w:val="clear" w:color="auto" w:fill="343541"/>
-        </w:rPr>
-        <w:t>из структурой</w:t>
-      </w:r>
-      <w:proofErr w:type="gramEnd"/>
-      <w:r>
-        <w:rPr>
-          <w:rFonts w:ascii="Segoe UI" w:hAnsi="Segoe UI" w:cs="Segoe UI"/>
-          <w:strike/>
-          <w:color w:val="ECECF1"/>
-          <w:shd w:val="clear" w:color="auto" w:fill="343541"/>
-        </w:rPr>
-        <w:t xml:space="preserve"> данных которая будет использоваться для сохранения данных игры. Структура должна быть организована на </w:t>
-      </w:r>
-      <w:proofErr w:type="spellStart"/>
-      <w:r>
-        <w:rPr>
-          <w:rFonts w:ascii="Segoe UI" w:hAnsi="Segoe UI" w:cs="Segoe UI"/>
-          <w:strike/>
-          <w:color w:val="ECECF1"/>
-          <w:shd w:val="clear" w:color="auto" w:fill="343541"/>
-        </w:rPr>
-        <w:t>сиреализуемых</w:t>
-      </w:r>
-      <w:proofErr w:type="spellEnd"/>
-      <w:r>
-        <w:rPr>
-          <w:rFonts w:ascii="Segoe UI" w:hAnsi="Segoe UI" w:cs="Segoe UI"/>
-          <w:strike/>
-          <w:color w:val="ECECF1"/>
-          <w:shd w:val="clear" w:color="auto" w:fill="343541"/>
-        </w:rPr>
-        <w:t xml:space="preserve"> скриптейбл обджектах. </w:t>
+        <w:t xml:space="preserve">1 разобраться из структурой данных которая будет использоваться для сохранения данных игры. Структура должна быть организована на сиреализуемых скриптейбл обджектах. </w:t>
       </w:r>
     </w:p>
     <w:p>
@@ -126,25 +86,7 @@
           <w:color w:val="ECECF1"/>
           <w:shd w:val="clear" w:color="auto" w:fill="343541"/>
         </w:rPr>
-        <w:t xml:space="preserve">4 Продумать кто и каким образом будет собирать </w:t>
-      </w:r>
-      <w:proofErr w:type="gramStart"/>
-      <w:r>
-        <w:rPr>
-          <w:rFonts w:ascii="Segoe UI" w:hAnsi="Segoe UI" w:cs="Segoe UI"/>
-          <w:color w:val="ECECF1"/>
-          <w:shd w:val="clear" w:color="auto" w:fill="343541"/>
-        </w:rPr>
-        <w:t>компоненты</w:t>
-      </w:r>
-      <w:proofErr w:type="gramEnd"/>
-      <w:r>
-        <w:rPr>
-          <w:rFonts w:ascii="Segoe UI" w:hAnsi="Segoe UI" w:cs="Segoe UI"/>
-          <w:color w:val="ECECF1"/>
-          <w:shd w:val="clear" w:color="auto" w:fill="343541"/>
-        </w:rPr>
-        <w:t xml:space="preserve"> которые реализовывают интерфейсы для сохранения и/или загрузки данных. Возможно это должна быть фабрика. </w:t>
+        <w:t xml:space="preserve">4 Продумать кто и каким образом будет собирать компоненты которые реализовывают интерфейсы для сохранения и/или загрузки данных. Возможно это должна быть фабрика. </w:t>
       </w:r>
     </w:p>
     <w:p>
@@ -310,27 +252,7 @@
           <w:color w:val="ECECF1"/>
           <w:shd w:val="clear" w:color="auto" w:fill="343541"/>
         </w:rPr>
-        <w:t xml:space="preserve">1 Работа над архитектурой. Внедрение </w:t>
-      </w:r>
-      <w:proofErr w:type="spellStart"/>
-      <w:r>
-        <w:rPr>
-          <w:rFonts w:ascii="Segoe UI" w:hAnsi="Segoe UI" w:cs="Segoe UI"/>
-          <w:strike/>
-          <w:color w:val="ECECF1"/>
-          <w:shd w:val="clear" w:color="auto" w:fill="343541"/>
-        </w:rPr>
-        <w:t>di</w:t>
-      </w:r>
-      <w:proofErr w:type="spellEnd"/>
-      <w:r>
-        <w:rPr>
-          <w:rFonts w:ascii="Segoe UI" w:hAnsi="Segoe UI" w:cs="Segoe UI"/>
-          <w:strike/>
-          <w:color w:val="ECECF1"/>
-          <w:shd w:val="clear" w:color="auto" w:fill="343541"/>
-        </w:rPr>
-        <w:t xml:space="preserve"> фабрики чтобы она занималась спавном игровых компонентов, когда к ней придёт запрос от какого-то состояния </w:t>
+        <w:t xml:space="preserve">1 Работа над архитектурой. Внедрение di фабрики чтобы она занималась спавном игровых компонентов, когда к ней придёт запрос от какого-то состояния </w:t>
       </w:r>
     </w:p>
     <w:p>
@@ -704,27 +626,7 @@
           <w:color w:val="ECECF1"/>
           <w:shd w:val="clear" w:color="auto" w:fill="343541"/>
         </w:rPr>
-        <w:t xml:space="preserve">1 Система боя: атака, получение урона, смерть. Эти три состояния которые должна как бы поддерживать система боя. Внедрить их не составит проблем </w:t>
-      </w:r>
-      <w:proofErr w:type="spellStart"/>
-      <w:r>
-        <w:rPr>
-          <w:rFonts w:ascii="Segoe UI" w:hAnsi="Segoe UI" w:cs="Segoe UI"/>
-          <w:strike/>
-          <w:color w:val="ECECF1"/>
-          <w:shd w:val="clear" w:color="auto" w:fill="343541"/>
-        </w:rPr>
-        <w:t>потому-что</w:t>
-      </w:r>
-      <w:proofErr w:type="spellEnd"/>
-      <w:r>
-        <w:rPr>
-          <w:rFonts w:ascii="Segoe UI" w:hAnsi="Segoe UI" w:cs="Segoe UI"/>
-          <w:strike/>
-          <w:color w:val="ECECF1"/>
-          <w:shd w:val="clear" w:color="auto" w:fill="343541"/>
-        </w:rPr>
-        <w:t xml:space="preserve"> уже имеются управляющие компоненты которые позволяют ии и игроку управлять атакой нужна только логика боевой системы. </w:t>
+        <w:t xml:space="preserve">1 Система боя: атака, получение урона, смерть. Эти три состояния которые должна как бы поддерживать система боя. Внедрить их не составит проблем потому-что уже имеются управляющие компоненты которые позволяют ии и игроку управлять атакой нужна только логика боевой системы. </w:t>
       </w:r>
     </w:p>
     <w:p>
@@ -838,27 +740,7 @@
           <w:color w:val="ECECF1"/>
           <w:shd w:val="clear" w:color="auto" w:fill="343541"/>
         </w:rPr>
-        <w:t xml:space="preserve">7 Искать </w:t>
-      </w:r>
-      <w:proofErr w:type="spellStart"/>
-      <w:r>
-        <w:rPr>
-          <w:rFonts w:ascii="Segoe UI" w:hAnsi="Segoe UI" w:cs="Segoe UI"/>
-          <w:strike/>
-          <w:color w:val="ECECF1"/>
-          <w:shd w:val="clear" w:color="auto" w:fill="343541"/>
-        </w:rPr>
-        <w:t>ассеты</w:t>
-      </w:r>
-      <w:proofErr w:type="spellEnd"/>
-      <w:r>
-        <w:rPr>
-          <w:rFonts w:ascii="Segoe UI" w:hAnsi="Segoe UI" w:cs="Segoe UI"/>
-          <w:strike/>
-          <w:color w:val="ECECF1"/>
-          <w:shd w:val="clear" w:color="auto" w:fill="343541"/>
-        </w:rPr>
-        <w:t xml:space="preserve"> для GUI. </w:t>
+        <w:t xml:space="preserve">7 Искать ассеты для GUI. </w:t>
       </w:r>
     </w:p>
     <w:p>
@@ -934,27 +816,7 @@
           <w:color w:val="ECECF1"/>
           <w:shd w:val="clear" w:color="auto" w:fill="343541"/>
         </w:rPr>
-        <w:t xml:space="preserve">1 первым делом нужно подумать о </w:t>
-      </w:r>
-      <w:proofErr w:type="spellStart"/>
-      <w:r>
-        <w:rPr>
-          <w:rFonts w:ascii="Segoe UI" w:hAnsi="Segoe UI" w:cs="Segoe UI"/>
-          <w:strike/>
-          <w:color w:val="ECECF1"/>
-          <w:shd w:val="clear" w:color="auto" w:fill="343541"/>
-        </w:rPr>
-        <w:t>сериализации</w:t>
-      </w:r>
-      <w:proofErr w:type="spellEnd"/>
-      <w:r>
-        <w:rPr>
-          <w:rFonts w:ascii="Segoe UI" w:hAnsi="Segoe UI" w:cs="Segoe UI"/>
-          <w:strike/>
-          <w:color w:val="ECECF1"/>
-          <w:shd w:val="clear" w:color="auto" w:fill="343541"/>
-        </w:rPr>
-        <w:t xml:space="preserve"> инвентаря, это нужно сделать чтобы список предметов, а точнее хилок и их количество сохранялось в память и чтобы его можно было загрузить при продолжении игры </w:t>
+        <w:t xml:space="preserve">1 первым делом нужно подумать о сериализации инвентаря, это нужно сделать чтобы список предметов, а точнее хилок и их количество сохранялось в память и чтобы его можно было загрузить при продолжении игры </w:t>
       </w:r>
     </w:p>
     <w:p>
@@ -1028,67 +890,7 @@
           <w:color w:val="ECECF1"/>
           <w:shd w:val="clear" w:color="auto" w:fill="343541"/>
         </w:rPr>
-        <w:t xml:space="preserve">5 Работа со светом. Просмотреть разные варианты. Но нужно помнить что </w:t>
-      </w:r>
-      <w:proofErr w:type="spellStart"/>
-      <w:r>
-        <w:rPr>
-          <w:rFonts w:ascii="Segoe UI" w:hAnsi="Segoe UI" w:cs="Segoe UI"/>
-          <w:strike/>
-          <w:color w:val="ECECF1"/>
-          <w:shd w:val="clear" w:color="auto" w:fill="343541"/>
-        </w:rPr>
-        <w:t>риалтаймовое</w:t>
-      </w:r>
-      <w:proofErr w:type="spellEnd"/>
-      <w:r>
-        <w:rPr>
-          <w:rFonts w:ascii="Segoe UI" w:hAnsi="Segoe UI" w:cs="Segoe UI"/>
-          <w:strike/>
-          <w:color w:val="ECECF1"/>
-          <w:shd w:val="clear" w:color="auto" w:fill="343541"/>
-        </w:rPr>
-        <w:t xml:space="preserve"> освещение жрет очень много ресурсов поэтому либо делать его запечённым либо использовать </w:t>
-      </w:r>
-      <w:proofErr w:type="spellStart"/>
-      <w:r>
-        <w:rPr>
-          <w:rFonts w:ascii="Segoe UI" w:hAnsi="Segoe UI" w:cs="Segoe UI"/>
-          <w:strike/>
-          <w:color w:val="ECECF1"/>
-          <w:shd w:val="clear" w:color="auto" w:fill="343541"/>
-        </w:rPr>
-        <w:t>дайрект</w:t>
-      </w:r>
-      <w:proofErr w:type="spellEnd"/>
-      <w:r>
-        <w:rPr>
-          <w:rFonts w:ascii="Segoe UI" w:hAnsi="Segoe UI" w:cs="Segoe UI"/>
-          <w:strike/>
-          <w:color w:val="ECECF1"/>
-          <w:shd w:val="clear" w:color="auto" w:fill="343541"/>
-        </w:rPr>
-        <w:t xml:space="preserve"> </w:t>
-      </w:r>
-      <w:proofErr w:type="spellStart"/>
-      <w:r>
-        <w:rPr>
-          <w:rFonts w:ascii="Segoe UI" w:hAnsi="Segoe UI" w:cs="Segoe UI"/>
-          <w:strike/>
-          <w:color w:val="ECECF1"/>
-          <w:shd w:val="clear" w:color="auto" w:fill="343541"/>
-        </w:rPr>
-        <w:t>лайт</w:t>
-      </w:r>
-      <w:proofErr w:type="spellEnd"/>
-      <w:r>
-        <w:rPr>
-          <w:rFonts w:ascii="Segoe UI" w:hAnsi="Segoe UI" w:cs="Segoe UI"/>
-          <w:strike/>
-          <w:color w:val="ECECF1"/>
-          <w:shd w:val="clear" w:color="auto" w:fill="343541"/>
-        </w:rPr>
-        <w:t xml:space="preserve"> </w:t>
+        <w:t xml:space="preserve">5 Работа со светом. Просмотреть разные варианты. Но нужно помнить что риалтаймовое освещение жрет очень много ресурсов поэтому либо делать его запечённым либо использовать дайрект лайт </w:t>
       </w:r>
     </w:p>
     <w:p>
@@ -1144,27 +946,7 @@
           <w:color w:val="ECECF1"/>
           <w:shd w:val="clear" w:color="auto" w:fill="343541"/>
         </w:rPr>
-        <w:t xml:space="preserve">8 Пересмотреть скрипты и те которые не используют статик дату, перевести на использование статик даты, а именно это относиться к </w:t>
-      </w:r>
-      <w:proofErr w:type="spellStart"/>
-      <w:r>
-        <w:rPr>
-          <w:rFonts w:ascii="Segoe UI" w:hAnsi="Segoe UI" w:cs="Segoe UI"/>
-          <w:strike/>
-          <w:color w:val="ECECF1"/>
-          <w:shd w:val="clear" w:color="auto" w:fill="343541"/>
-        </w:rPr>
-        <w:t>конфигу</w:t>
-      </w:r>
-      <w:proofErr w:type="spellEnd"/>
-      <w:r>
-        <w:rPr>
-          <w:rFonts w:ascii="Segoe UI" w:hAnsi="Segoe UI" w:cs="Segoe UI"/>
-          <w:strike/>
-          <w:color w:val="ECECF1"/>
-          <w:shd w:val="clear" w:color="auto" w:fill="343541"/>
-        </w:rPr>
-        <w:t xml:space="preserve"> игрока</w:t>
+        <w:t>8 Пересмотреть скрипты и те которые не используют статик дату, перевести на использование статик даты, а именно это относиться к конфигу игрока</w:t>
       </w:r>
     </w:p>
     <w:p>
@@ -1261,25 +1043,7 @@
           <w:color w:val="ECECF1"/>
           <w:shd w:val="clear" w:color="auto" w:fill="343541"/>
         </w:rPr>
-        <w:t xml:space="preserve">Второй и третий пункт хоть и выглядят достаточно </w:t>
-      </w:r>
-      <w:proofErr w:type="gramStart"/>
-      <w:r>
-        <w:rPr>
-          <w:rFonts w:ascii="Segoe UI" w:hAnsi="Segoe UI" w:cs="Segoe UI"/>
-          <w:color w:val="ECECF1"/>
-          <w:shd w:val="clear" w:color="auto" w:fill="343541"/>
-        </w:rPr>
-        <w:t>просто</w:t>
-      </w:r>
-      <w:proofErr w:type="gramEnd"/>
-      <w:r>
-        <w:rPr>
-          <w:rFonts w:ascii="Segoe UI" w:hAnsi="Segoe UI" w:cs="Segoe UI"/>
-          <w:color w:val="ECECF1"/>
-          <w:shd w:val="clear" w:color="auto" w:fill="343541"/>
-        </w:rPr>
-        <w:t xml:space="preserve"> но на самом деле именно эти два пункта содержат колоссальную работу над проектом.</w:t>
+        <w:t>Второй и третий пункт хоть и выглядят достаточно просто но на самом деле именно эти два пункта содержат колоссальную работу над проектом.</w:t>
       </w:r>
     </w:p>
     <w:p>
@@ -1423,27 +1187,7 @@
           <w:color w:val="ECECF1"/>
           <w:shd w:val="clear" w:color="auto" w:fill="343541"/>
         </w:rPr>
-        <w:t xml:space="preserve">5 Начать погружаться в квестовую систему. Это достаточно крупный шаг и </w:t>
-      </w:r>
-      <w:proofErr w:type="gramStart"/>
-      <w:r>
-        <w:rPr>
-          <w:rFonts w:ascii="Segoe UI" w:hAnsi="Segoe UI" w:cs="Segoe UI"/>
-          <w:strike/>
-          <w:color w:val="ECECF1"/>
-          <w:shd w:val="clear" w:color="auto" w:fill="343541"/>
-        </w:rPr>
-        <w:t>по этому</w:t>
-      </w:r>
-      <w:proofErr w:type="gramEnd"/>
-      <w:r>
-        <w:rPr>
-          <w:rFonts w:ascii="Segoe UI" w:hAnsi="Segoe UI" w:cs="Segoe UI"/>
-          <w:strike/>
-          <w:color w:val="ECECF1"/>
-          <w:shd w:val="clear" w:color="auto" w:fill="343541"/>
-        </w:rPr>
-        <w:t xml:space="preserve"> он займет больше всего времени, хотя и на первый взгляд все написано просто.</w:t>
+        <w:t>5 Начать погружаться в квестовую систему. Это достаточно крупный шаг и по этому он займет больше всего времени, хотя и на первый взгляд все написано просто.</w:t>
       </w:r>
     </w:p>
     <w:p>
@@ -1513,62 +1257,24 @@
           <w:color w:val="ECECF1"/>
           <w:shd w:val="clear" w:color="auto" w:fill="343541"/>
         </w:rPr>
-        <w:t xml:space="preserve">1 Внедрить прототип </w:t>
-      </w:r>
-      <w:proofErr w:type="spellStart"/>
-      <w:r>
-        <w:rPr>
-          <w:rFonts w:ascii="Segoe UI" w:hAnsi="Segoe UI" w:cs="Segoe UI"/>
-          <w:strike/>
-          <w:color w:val="ECECF1"/>
-          <w:shd w:val="clear" w:color="auto" w:fill="343541"/>
-        </w:rPr>
-        <w:t>квестовой</w:t>
-      </w:r>
-      <w:proofErr w:type="spellEnd"/>
-      <w:r>
-        <w:rPr>
-          <w:rFonts w:ascii="Segoe UI" w:hAnsi="Segoe UI" w:cs="Segoe UI"/>
-          <w:strike/>
-          <w:color w:val="ECECF1"/>
-          <w:shd w:val="clear" w:color="auto" w:fill="343541"/>
-        </w:rPr>
-        <w:t xml:space="preserve"> системы в проект </w:t>
-      </w:r>
-    </w:p>
-    <w:p>
-      <w:pPr>
-        <w:rPr>
-          <w:rFonts w:ascii="Segoe UI" w:hAnsi="Segoe UI" w:cs="Segoe UI"/>
-          <w:color w:val="ECECF1"/>
-          <w:shd w:val="clear" w:color="auto" w:fill="343541"/>
-        </w:rPr>
-      </w:pPr>
-      <w:r>
-        <w:rPr>
-          <w:rFonts w:ascii="Segoe UI" w:hAnsi="Segoe UI" w:cs="Segoe UI"/>
-          <w:color w:val="ECECF1"/>
-          <w:shd w:val="clear" w:color="auto" w:fill="343541"/>
-        </w:rPr>
-        <w:t xml:space="preserve">2 Довести прототип </w:t>
-      </w:r>
-      <w:proofErr w:type="spellStart"/>
-      <w:r>
-        <w:rPr>
-          <w:rFonts w:ascii="Segoe UI" w:hAnsi="Segoe UI" w:cs="Segoe UI"/>
-          <w:color w:val="ECECF1"/>
-          <w:shd w:val="clear" w:color="auto" w:fill="343541"/>
-        </w:rPr>
-        <w:t>квестовой</w:t>
-      </w:r>
-      <w:proofErr w:type="spellEnd"/>
-      <w:r>
-        <w:rPr>
-          <w:rFonts w:ascii="Segoe UI" w:hAnsi="Segoe UI" w:cs="Segoe UI"/>
-          <w:color w:val="ECECF1"/>
-          <w:shd w:val="clear" w:color="auto" w:fill="343541"/>
-        </w:rPr>
-        <w:t xml:space="preserve"> системы до ума. Один из самых длительных этапов. </w:t>
+        <w:t xml:space="preserve">1 Внедрить прототип квестовой системы в проект </w:t>
+      </w:r>
+    </w:p>
+    <w:p>
+      <w:pPr>
+        <w:rPr>
+          <w:rFonts w:ascii="Segoe UI" w:hAnsi="Segoe UI" w:cs="Segoe UI"/>
+          <w:color w:val="ECECF1"/>
+          <w:shd w:val="clear" w:color="auto" w:fill="343541"/>
+        </w:rPr>
+      </w:pPr>
+      <w:r>
+        <w:rPr>
+          <w:rFonts w:ascii="Segoe UI" w:hAnsi="Segoe UI" w:cs="Segoe UI"/>
+          <w:color w:val="ECECF1"/>
+          <w:shd w:val="clear" w:color="auto" w:fill="343541"/>
+        </w:rPr>
+        <w:t xml:space="preserve">2 Довести прототип квестовой системы до ума. Один из самых длительных этапов. </w:t>
       </w:r>
     </w:p>
     <w:p>
@@ -1586,25 +1292,7 @@
           <w:color w:val="ECECF1"/>
           <w:shd w:val="clear" w:color="auto" w:fill="343541"/>
         </w:rPr>
-        <w:t xml:space="preserve">2а </w:t>
-      </w:r>
-      <w:proofErr w:type="gramStart"/>
-      <w:r>
-        <w:rPr>
-          <w:rFonts w:ascii="Segoe UI" w:hAnsi="Segoe UI" w:cs="Segoe UI"/>
-          <w:color w:val="ECECF1"/>
-          <w:shd w:val="clear" w:color="auto" w:fill="343541"/>
-        </w:rPr>
-        <w:t>Завершить</w:t>
-      </w:r>
-      <w:proofErr w:type="gramEnd"/>
-      <w:r>
-        <w:rPr>
-          <w:rFonts w:ascii="Segoe UI" w:hAnsi="Segoe UI" w:cs="Segoe UI"/>
-          <w:color w:val="ECECF1"/>
-          <w:shd w:val="clear" w:color="auto" w:fill="343541"/>
-        </w:rPr>
-        <w:t xml:space="preserve"> прототип, получив работоспособную квестовую систему. </w:t>
+        <w:t xml:space="preserve">2а Завершить прототип, получив работоспособную квестовую систему. </w:t>
       </w:r>
     </w:p>
     <w:p>
@@ -1622,43 +1310,7 @@
           <w:color w:val="ECECF1"/>
           <w:shd w:val="clear" w:color="auto" w:fill="343541"/>
         </w:rPr>
-        <w:t xml:space="preserve">2б </w:t>
-      </w:r>
-      <w:proofErr w:type="gramStart"/>
-      <w:r>
-        <w:rPr>
-          <w:rFonts w:ascii="Segoe UI" w:hAnsi="Segoe UI" w:cs="Segoe UI"/>
-          <w:color w:val="ECECF1"/>
-          <w:shd w:val="clear" w:color="auto" w:fill="343541"/>
-        </w:rPr>
-        <w:t>Контролировать</w:t>
-      </w:r>
-      <w:proofErr w:type="gramEnd"/>
-      <w:r>
-        <w:rPr>
-          <w:rFonts w:ascii="Segoe UI" w:hAnsi="Segoe UI" w:cs="Segoe UI"/>
-          <w:color w:val="ECECF1"/>
-          <w:shd w:val="clear" w:color="auto" w:fill="343541"/>
-        </w:rPr>
-        <w:t xml:space="preserve"> состояние архитектуры при разработке доработке прототипа </w:t>
-      </w:r>
-      <w:proofErr w:type="spellStart"/>
-      <w:r>
-        <w:rPr>
-          <w:rFonts w:ascii="Segoe UI" w:hAnsi="Segoe UI" w:cs="Segoe UI"/>
-          <w:color w:val="ECECF1"/>
-          <w:shd w:val="clear" w:color="auto" w:fill="343541"/>
-        </w:rPr>
-        <w:t>квестовой</w:t>
-      </w:r>
-      <w:proofErr w:type="spellEnd"/>
-      <w:r>
-        <w:rPr>
-          <w:rFonts w:ascii="Segoe UI" w:hAnsi="Segoe UI" w:cs="Segoe UI"/>
-          <w:color w:val="ECECF1"/>
-          <w:shd w:val="clear" w:color="auto" w:fill="343541"/>
-        </w:rPr>
-        <w:t xml:space="preserve"> системы. </w:t>
+        <w:t xml:space="preserve">2б Контролировать состояние архитектуры при разработке доработке прототипа квестовой системы. </w:t>
       </w:r>
     </w:p>
     <w:p>
@@ -1726,25 +1378,7 @@
           <w:color w:val="ECECF1"/>
           <w:shd w:val="clear" w:color="auto" w:fill="343541"/>
         </w:rPr>
-        <w:t xml:space="preserve">6 Готовиться к реализации системы торговли. </w:t>
-      </w:r>
-      <w:proofErr w:type="gramStart"/>
-      <w:r>
-        <w:rPr>
-          <w:rFonts w:ascii="Segoe UI" w:hAnsi="Segoe UI" w:cs="Segoe UI"/>
-          <w:color w:val="ECECF1"/>
-          <w:shd w:val="clear" w:color="auto" w:fill="343541"/>
-        </w:rPr>
-        <w:t>Также</w:t>
-      </w:r>
-      <w:proofErr w:type="gramEnd"/>
-      <w:r>
-        <w:rPr>
-          <w:rFonts w:ascii="Segoe UI" w:hAnsi="Segoe UI" w:cs="Segoe UI"/>
-          <w:color w:val="ECECF1"/>
-          <w:shd w:val="clear" w:color="auto" w:fill="343541"/>
-        </w:rPr>
-        <w:t xml:space="preserve"> как и второй этап достаточно длительный.</w:t>
+        <w:t>6 Готовиться к реализации системы торговли. Также как и второй этап достаточно длительный.</w:t>
       </w:r>
     </w:p>
     <w:p>
@@ -1845,25 +1479,7 @@
           <w:color w:val="ECECF1"/>
           <w:shd w:val="clear" w:color="auto" w:fill="343541"/>
         </w:rPr>
-        <w:t xml:space="preserve">4 Готовится </w:t>
-      </w:r>
-      <w:proofErr w:type="gramStart"/>
-      <w:r>
-        <w:rPr>
-          <w:rFonts w:ascii="Segoe UI" w:hAnsi="Segoe UI" w:cs="Segoe UI"/>
-          <w:color w:val="ECECF1"/>
-          <w:shd w:val="clear" w:color="auto" w:fill="343541"/>
-        </w:rPr>
-        <w:t>к разработки</w:t>
-      </w:r>
-      <w:proofErr w:type="gramEnd"/>
-      <w:r>
-        <w:rPr>
-          <w:rFonts w:ascii="Segoe UI" w:hAnsi="Segoe UI" w:cs="Segoe UI"/>
-          <w:color w:val="ECECF1"/>
-          <w:shd w:val="clear" w:color="auto" w:fill="343541"/>
-        </w:rPr>
-        <w:t xml:space="preserve"> системы торговли.</w:t>
+        <w:t>4 Готовится к разработки системы торговли.</w:t>
       </w:r>
     </w:p>
     <w:p>
@@ -1927,47 +1543,7 @@
           <w:color w:val="ECECF1"/>
           <w:shd w:val="clear" w:color="auto" w:fill="343541"/>
         </w:rPr>
-        <w:t xml:space="preserve">2 Нужно решить </w:t>
-      </w:r>
-      <w:proofErr w:type="gramStart"/>
-      <w:r>
-        <w:rPr>
-          <w:rFonts w:ascii="Segoe UI" w:hAnsi="Segoe UI" w:cs="Segoe UI"/>
-          <w:strike/>
-          <w:color w:val="ECECF1"/>
-          <w:shd w:val="clear" w:color="auto" w:fill="343541"/>
-        </w:rPr>
-        <w:t>проблему</w:t>
-      </w:r>
-      <w:proofErr w:type="gramEnd"/>
-      <w:r>
-        <w:rPr>
-          <w:rFonts w:ascii="Segoe UI" w:hAnsi="Segoe UI" w:cs="Segoe UI"/>
-          <w:strike/>
-          <w:color w:val="ECECF1"/>
-          <w:shd w:val="clear" w:color="auto" w:fill="343541"/>
-        </w:rPr>
-        <w:t xml:space="preserve"> связанную с отображением окна квест </w:t>
-      </w:r>
-      <w:proofErr w:type="spellStart"/>
-      <w:r>
-        <w:rPr>
-          <w:rFonts w:ascii="Segoe UI" w:hAnsi="Segoe UI" w:cs="Segoe UI"/>
-          <w:strike/>
-          <w:color w:val="ECECF1"/>
-          <w:shd w:val="clear" w:color="auto" w:fill="343541"/>
-        </w:rPr>
-        <w:t>трекера</w:t>
-      </w:r>
-      <w:proofErr w:type="spellEnd"/>
-      <w:r>
-        <w:rPr>
-          <w:rFonts w:ascii="Segoe UI" w:hAnsi="Segoe UI" w:cs="Segoe UI"/>
-          <w:strike/>
-          <w:color w:val="ECECF1"/>
-          <w:shd w:val="clear" w:color="auto" w:fill="343541"/>
-        </w:rPr>
-        <w:t xml:space="preserve">, а именно проблема с отображением активного квеста, возможно стоит расширить квестовую систему еще одним событием которое будет информировать своих подписчиков о том что нужно обновить интерфейс. </w:t>
+        <w:t xml:space="preserve">2 Нужно решить проблему связанную с отображением окна квест трекера, а именно проблема с отображением активного квеста, возможно стоит расширить квестовую систему еще одним событием которое будет информировать своих подписчиков о том что нужно обновить интерфейс. </w:t>
       </w:r>
     </w:p>
     <w:p>
@@ -1998,132 +1574,219 @@
           <w:shd w:val="clear" w:color="auto" w:fill="343541"/>
         </w:rPr>
       </w:pPr>
+      <w:r>
+        <w:rPr>
+          <w:rFonts w:ascii="Segoe UI" w:hAnsi="Segoe UI" w:cs="Segoe UI"/>
+          <w:strike/>
+          <w:color w:val="ECECF1"/>
+          <w:shd w:val="clear" w:color="auto" w:fill="343541"/>
+        </w:rPr>
+        <w:t xml:space="preserve">4 Просмотреть структуру PlayerProgressService, а также компонентов: IPlayerProgressUpdater, IPlayerProgressLoader. Как минимум нужно обновить нейминг, возможно придётся модифицировать структуру. </w:t>
+      </w:r>
+    </w:p>
+    <w:p>
+      <w:pPr>
+        <w:rPr>
+          <w:rFonts w:ascii="Segoe UI" w:hAnsi="Segoe UI" w:cs="Segoe UI"/>
+          <w:strike/>
+          <w:color w:val="ECECF1"/>
+          <w:shd w:val="clear" w:color="auto" w:fill="343541"/>
+        </w:rPr>
+      </w:pPr>
+      <w:r>
+        <w:rPr>
+          <w:rFonts w:ascii="Segoe UI" w:hAnsi="Segoe UI" w:cs="Segoe UI"/>
+          <w:strike/>
+          <w:color w:val="ECECF1"/>
+          <w:shd w:val="clear" w:color="auto" w:fill="343541"/>
+        </w:rPr>
+        <w:t xml:space="preserve">5 Копать в направлении ранговой системы. Разобраться как она должна работать, и как ее возможно реализовать. </w:t>
+      </w:r>
+    </w:p>
+    <w:p>
+      <w:pPr>
+        <w:rPr>
+          <w:rFonts w:ascii="Segoe UI" w:hAnsi="Segoe UI" w:cs="Segoe UI"/>
+          <w:strike/>
+          <w:color w:val="ECECF1"/>
+          <w:shd w:val="clear" w:color="auto" w:fill="343541"/>
+        </w:rPr>
+      </w:pPr>
+      <w:r>
+        <w:rPr>
+          <w:rFonts w:ascii="Segoe UI" w:hAnsi="Segoe UI" w:cs="Segoe UI"/>
+          <w:strike/>
+          <w:color w:val="ECECF1"/>
+          <w:shd w:val="clear" w:color="auto" w:fill="343541"/>
+        </w:rPr>
+        <w:t>6 Начать реализовывать ранговой системы.</w:t>
+      </w:r>
+    </w:p>
+    <w:p>
+      <w:pPr>
+        <w:rPr>
+          <w:rFonts w:ascii="Segoe UI" w:hAnsi="Segoe UI" w:cs="Segoe UI"/>
+          <w:strike/>
+          <w:color w:val="ECECF1"/>
+          <w:shd w:val="clear" w:color="auto" w:fill="343541"/>
+        </w:rPr>
+      </w:pPr>
+    </w:p>
+    <w:p>
+      <w:pPr>
+        <w:shd w:val="clear" w:color="auto" w:fill="343541"/>
+        <w:spacing w:after="100" w:line="240" w:lineRule="auto"/>
+        <w:rPr>
+          <w:rFonts w:ascii="Segoe UI" w:eastAsia="Times New Roman" w:hAnsi="Segoe UI" w:cs="Segoe UI"/>
+          <w:sz w:val="21"/>
+          <w:szCs w:val="21"/>
+          <w:lang w:eastAsia="ru-RU"/>
+        </w:rPr>
+      </w:pPr>
+      <w:r>
+        <w:rPr>
+          <w:rFonts w:ascii="Segoe UI" w:eastAsia="Times New Roman" w:hAnsi="Segoe UI" w:cs="Segoe UI"/>
+          <w:sz w:val="21"/>
+          <w:szCs w:val="21"/>
+          <w:lang w:eastAsia="ru-RU"/>
+        </w:rPr>
+        <w:t xml:space="preserve">11 итерация: </w:t>
+      </w:r>
+    </w:p>
+    <w:p>
+      <w:pPr>
+        <w:shd w:val="clear" w:color="auto" w:fill="343541"/>
+        <w:spacing w:after="100" w:line="240" w:lineRule="auto"/>
+        <w:rPr>
+          <w:rFonts w:ascii="Segoe UI" w:eastAsia="Times New Roman" w:hAnsi="Segoe UI" w:cs="Segoe UI"/>
+          <w:sz w:val="21"/>
+          <w:szCs w:val="21"/>
+          <w:lang w:eastAsia="ru-RU"/>
+        </w:rPr>
+      </w:pPr>
+      <w:r>
+        <w:rPr>
+          <w:rFonts w:ascii="Segoe UI" w:eastAsia="Times New Roman" w:hAnsi="Segoe UI" w:cs="Segoe UI"/>
+          <w:sz w:val="21"/>
+          <w:szCs w:val="21"/>
+          <w:lang w:eastAsia="ru-RU"/>
+        </w:rPr>
+        <w:t xml:space="preserve">1 Добавить возможность получения опыта за убийство мобов. </w:t>
+      </w:r>
+    </w:p>
+    <w:p>
+      <w:pPr>
+        <w:shd w:val="clear" w:color="auto" w:fill="343541"/>
+        <w:spacing w:after="100" w:line="240" w:lineRule="auto"/>
+        <w:rPr>
+          <w:rFonts w:ascii="Segoe UI" w:eastAsia="Times New Roman" w:hAnsi="Segoe UI" w:cs="Segoe UI"/>
+          <w:sz w:val="21"/>
+          <w:szCs w:val="21"/>
+          <w:lang w:eastAsia="ru-RU"/>
+        </w:rPr>
+      </w:pPr>
+      <w:r>
+        <w:rPr>
+          <w:rFonts w:ascii="Segoe UI" w:eastAsia="Times New Roman" w:hAnsi="Segoe UI" w:cs="Segoe UI"/>
+          <w:sz w:val="21"/>
+          <w:szCs w:val="21"/>
+          <w:lang w:eastAsia="ru-RU"/>
+        </w:rPr>
+        <w:t xml:space="preserve">2 Добавить визуальные эффекты для боя (количество нанесённого урона игроком, количество полученного урона игроком, также было бы хорошо выводить когда сработал какой-то навык например если игрок сумел заблокировать урон, или же уклониться, показывать на какое количество очков вылечился игрок и т.д.) </w:t>
+      </w:r>
+    </w:p>
+    <w:p>
+      <w:pPr>
+        <w:shd w:val="clear" w:color="auto" w:fill="343541"/>
+        <w:spacing w:after="100" w:line="240" w:lineRule="auto"/>
+        <w:rPr>
+          <w:rFonts w:ascii="Segoe UI" w:eastAsia="Times New Roman" w:hAnsi="Segoe UI" w:cs="Segoe UI"/>
+          <w:sz w:val="21"/>
+          <w:szCs w:val="21"/>
+          <w:lang w:eastAsia="ru-RU"/>
+        </w:rPr>
+      </w:pPr>
+      <w:r>
+        <w:rPr>
+          <w:rFonts w:ascii="Segoe UI" w:eastAsia="Times New Roman" w:hAnsi="Segoe UI" w:cs="Segoe UI"/>
+          <w:sz w:val="21"/>
+          <w:szCs w:val="21"/>
+          <w:lang w:eastAsia="ru-RU"/>
+        </w:rPr>
+        <w:t xml:space="preserve">3 Полоска здоровья для мобов, их уровень. </w:t>
+      </w:r>
+    </w:p>
+    <w:p>
+      <w:pPr>
+        <w:shd w:val="clear" w:color="auto" w:fill="343541"/>
+        <w:spacing w:after="100" w:line="240" w:lineRule="auto"/>
+        <w:rPr>
+          <w:rFonts w:ascii="Segoe UI" w:eastAsia="Times New Roman" w:hAnsi="Segoe UI" w:cs="Segoe UI"/>
+          <w:sz w:val="21"/>
+          <w:szCs w:val="21"/>
+          <w:lang w:eastAsia="ru-RU"/>
+        </w:rPr>
+      </w:pPr>
+      <w:r>
+        <w:rPr>
+          <w:rFonts w:ascii="Segoe UI" w:eastAsia="Times New Roman" w:hAnsi="Segoe UI" w:cs="Segoe UI"/>
+          <w:sz w:val="21"/>
+          <w:szCs w:val="21"/>
+          <w:lang w:eastAsia="ru-RU"/>
+        </w:rPr>
+        <w:t xml:space="preserve">4 Окно стат для игрока, которое будет отображать его текущий уровень, опыт (текущий и сколько нужно для следующего уровня). </w:t>
+      </w:r>
+    </w:p>
+    <w:p>
+      <w:pPr>
+        <w:shd w:val="clear" w:color="auto" w:fill="343541"/>
+        <w:spacing w:after="100" w:line="240" w:lineRule="auto"/>
+        <w:rPr>
+          <w:rFonts w:ascii="Segoe UI" w:eastAsia="Times New Roman" w:hAnsi="Segoe UI" w:cs="Segoe UI"/>
+          <w:sz w:val="21"/>
+          <w:szCs w:val="21"/>
+          <w:lang w:eastAsia="ru-RU"/>
+        </w:rPr>
+      </w:pPr>
+      <w:r>
+        <w:rPr>
+          <w:rFonts w:ascii="Segoe UI" w:eastAsia="Times New Roman" w:hAnsi="Segoe UI" w:cs="Segoe UI"/>
+          <w:sz w:val="21"/>
+          <w:szCs w:val="21"/>
+          <w:lang w:eastAsia="ru-RU"/>
+        </w:rPr>
+        <w:t xml:space="preserve">5 Работать над прототипом разноуровневых мобов. Возможно прикрутить какой-то райдомазер для создания различных конфигураций мобов. </w:t>
+      </w:r>
+    </w:p>
+    <w:p>
+      <w:pPr>
+        <w:shd w:val="clear" w:color="auto" w:fill="343541"/>
+        <w:spacing w:after="100" w:line="240" w:lineRule="auto"/>
+        <w:rPr>
+          <w:rFonts w:ascii="Segoe UI" w:eastAsia="Times New Roman" w:hAnsi="Segoe UI" w:cs="Segoe UI"/>
+          <w:sz w:val="21"/>
+          <w:szCs w:val="21"/>
+          <w:lang w:eastAsia="ru-RU"/>
+        </w:rPr>
+      </w:pPr>
       <w:bookmarkStart w:id="0" w:name="_GoBack"/>
-      <w:r>
-        <w:rPr>
-          <w:rFonts w:ascii="Segoe UI" w:hAnsi="Segoe UI" w:cs="Segoe UI"/>
-          <w:strike/>
-          <w:color w:val="ECECF1"/>
-          <w:shd w:val="clear" w:color="auto" w:fill="343541"/>
-        </w:rPr>
-        <w:t xml:space="preserve">4 Просмотреть структуру </w:t>
-      </w:r>
-      <w:proofErr w:type="spellStart"/>
-      <w:r>
-        <w:rPr>
-          <w:rFonts w:ascii="Segoe UI" w:hAnsi="Segoe UI" w:cs="Segoe UI"/>
-          <w:strike/>
-          <w:color w:val="ECECF1"/>
-          <w:shd w:val="clear" w:color="auto" w:fill="343541"/>
-        </w:rPr>
-        <w:t>PlayerProgressService</w:t>
-      </w:r>
-      <w:proofErr w:type="spellEnd"/>
-      <w:r>
-        <w:rPr>
-          <w:rFonts w:ascii="Segoe UI" w:hAnsi="Segoe UI" w:cs="Segoe UI"/>
-          <w:strike/>
-          <w:color w:val="ECECF1"/>
-          <w:shd w:val="clear" w:color="auto" w:fill="343541"/>
-        </w:rPr>
-        <w:t xml:space="preserve">, а также компонентов: </w:t>
-      </w:r>
-      <w:proofErr w:type="spellStart"/>
-      <w:r>
-        <w:rPr>
-          <w:rFonts w:ascii="Segoe UI" w:hAnsi="Segoe UI" w:cs="Segoe UI"/>
-          <w:strike/>
-          <w:color w:val="ECECF1"/>
-          <w:shd w:val="clear" w:color="auto" w:fill="343541"/>
-        </w:rPr>
-        <w:t>IPlayerProgressUpdater</w:t>
-      </w:r>
-      <w:proofErr w:type="spellEnd"/>
-      <w:r>
-        <w:rPr>
-          <w:rFonts w:ascii="Segoe UI" w:hAnsi="Segoe UI" w:cs="Segoe UI"/>
-          <w:strike/>
-          <w:color w:val="ECECF1"/>
-          <w:shd w:val="clear" w:color="auto" w:fill="343541"/>
-        </w:rPr>
-        <w:t xml:space="preserve">, </w:t>
-      </w:r>
-      <w:proofErr w:type="spellStart"/>
-      <w:r>
-        <w:rPr>
-          <w:rFonts w:ascii="Segoe UI" w:hAnsi="Segoe UI" w:cs="Segoe UI"/>
-          <w:strike/>
-          <w:color w:val="ECECF1"/>
-          <w:shd w:val="clear" w:color="auto" w:fill="343541"/>
-        </w:rPr>
-        <w:t>IPlayerProgressLoader</w:t>
-      </w:r>
-      <w:proofErr w:type="spellEnd"/>
-      <w:r>
-        <w:rPr>
-          <w:rFonts w:ascii="Segoe UI" w:hAnsi="Segoe UI" w:cs="Segoe UI"/>
-          <w:strike/>
-          <w:color w:val="ECECF1"/>
-          <w:shd w:val="clear" w:color="auto" w:fill="343541"/>
-        </w:rPr>
-        <w:t xml:space="preserve">. Как минимум нужно обновить </w:t>
-      </w:r>
-      <w:proofErr w:type="spellStart"/>
-      <w:r>
-        <w:rPr>
-          <w:rFonts w:ascii="Segoe UI" w:hAnsi="Segoe UI" w:cs="Segoe UI"/>
-          <w:strike/>
-          <w:color w:val="ECECF1"/>
-          <w:shd w:val="clear" w:color="auto" w:fill="343541"/>
-        </w:rPr>
-        <w:t>нейминг</w:t>
-      </w:r>
-      <w:proofErr w:type="spellEnd"/>
-      <w:r>
-        <w:rPr>
-          <w:rFonts w:ascii="Segoe UI" w:hAnsi="Segoe UI" w:cs="Segoe UI"/>
-          <w:strike/>
-          <w:color w:val="ECECF1"/>
-          <w:shd w:val="clear" w:color="auto" w:fill="343541"/>
-        </w:rPr>
-        <w:t xml:space="preserve">, возможно придётся модифицировать структуру. </w:t>
-      </w:r>
-    </w:p>
-    <w:bookmarkEnd w:id="0"/>
-    <w:p>
-      <w:pPr>
-        <w:rPr>
-          <w:rFonts w:ascii="Segoe UI" w:hAnsi="Segoe UI" w:cs="Segoe UI"/>
-          <w:strike/>
-          <w:color w:val="ECECF1"/>
-          <w:shd w:val="clear" w:color="auto" w:fill="343541"/>
-        </w:rPr>
-      </w:pPr>
-      <w:r>
-        <w:rPr>
-          <w:rFonts w:ascii="Segoe UI" w:hAnsi="Segoe UI" w:cs="Segoe UI"/>
-          <w:strike/>
-          <w:color w:val="ECECF1"/>
-          <w:shd w:val="clear" w:color="auto" w:fill="343541"/>
-        </w:rPr>
-        <w:t xml:space="preserve">5 Копать в направлении ранговой системы. Разобраться как она должна работать, и как ее возможно реализовать. </w:t>
-      </w:r>
-    </w:p>
-    <w:p>
-      <w:pPr>
-        <w:rPr>
-          <w:strike/>
-        </w:rPr>
-      </w:pPr>
-      <w:r>
-        <w:rPr>
-          <w:rFonts w:ascii="Segoe UI" w:hAnsi="Segoe UI" w:cs="Segoe UI"/>
-          <w:strike/>
-          <w:color w:val="ECECF1"/>
-          <w:shd w:val="clear" w:color="auto" w:fill="343541"/>
-        </w:rPr>
-        <w:t>6 Начать реализовывать ранговой системы.</w:t>
-      </w:r>
+      <w:bookmarkEnd w:id="0"/>
+      <w:r>
+        <w:rPr>
+          <w:rFonts w:ascii="Segoe UI" w:eastAsia="Times New Roman" w:hAnsi="Segoe UI" w:cs="Segoe UI"/>
+          <w:sz w:val="21"/>
+          <w:szCs w:val="21"/>
+          <w:lang w:eastAsia="ru-RU"/>
+        </w:rPr>
+        <w:t>6 Внедрять прототип в игру.</w:t>
+      </w:r>
+    </w:p>
+    <w:p>
+      <w:pPr>
+        <w:rPr>
+          <w:strike/>
+        </w:rPr>
+      </w:pPr>
     </w:p>
     <w:sectPr>
       <w:pgSz w:w="11906" w:h="16838"/>

</xml_diff>

<commit_message>
Add Experience for kill monster.
</commit_message>
<xml_diff>
--- a/Итерации.docx
+++ b/Итерации.docx
@@ -35,7 +35,47 @@
           <w:color w:val="ECECF1"/>
           <w:shd w:val="clear" w:color="auto" w:fill="343541"/>
         </w:rPr>
-        <w:t xml:space="preserve">1 разобраться из структурой данных которая будет использоваться для сохранения данных игры. Структура должна быть организована на сиреализуемых скриптейбл обджектах. </w:t>
+        <w:t xml:space="preserve">1 разобраться </w:t>
+      </w:r>
+      <w:proofErr w:type="gramStart"/>
+      <w:r>
+        <w:rPr>
+          <w:rFonts w:ascii="Segoe UI" w:hAnsi="Segoe UI" w:cs="Segoe UI"/>
+          <w:strike/>
+          <w:color w:val="ECECF1"/>
+          <w:shd w:val="clear" w:color="auto" w:fill="343541"/>
+        </w:rPr>
+        <w:t>из структурой</w:t>
+      </w:r>
+      <w:proofErr w:type="gramEnd"/>
+      <w:r>
+        <w:rPr>
+          <w:rFonts w:ascii="Segoe UI" w:hAnsi="Segoe UI" w:cs="Segoe UI"/>
+          <w:strike/>
+          <w:color w:val="ECECF1"/>
+          <w:shd w:val="clear" w:color="auto" w:fill="343541"/>
+        </w:rPr>
+        <w:t xml:space="preserve"> данных которая будет использоваться для сохранения данных игры. Структура должна быть организована на </w:t>
+      </w:r>
+      <w:proofErr w:type="spellStart"/>
+      <w:r>
+        <w:rPr>
+          <w:rFonts w:ascii="Segoe UI" w:hAnsi="Segoe UI" w:cs="Segoe UI"/>
+          <w:strike/>
+          <w:color w:val="ECECF1"/>
+          <w:shd w:val="clear" w:color="auto" w:fill="343541"/>
+        </w:rPr>
+        <w:t>сиреализуемых</w:t>
+      </w:r>
+      <w:proofErr w:type="spellEnd"/>
+      <w:r>
+        <w:rPr>
+          <w:rFonts w:ascii="Segoe UI" w:hAnsi="Segoe UI" w:cs="Segoe UI"/>
+          <w:strike/>
+          <w:color w:val="ECECF1"/>
+          <w:shd w:val="clear" w:color="auto" w:fill="343541"/>
+        </w:rPr>
+        <w:t xml:space="preserve"> скриптейбл обджектах. </w:t>
       </w:r>
     </w:p>
     <w:p>
@@ -86,7 +126,25 @@
           <w:color w:val="ECECF1"/>
           <w:shd w:val="clear" w:color="auto" w:fill="343541"/>
         </w:rPr>
-        <w:t xml:space="preserve">4 Продумать кто и каким образом будет собирать компоненты которые реализовывают интерфейсы для сохранения и/или загрузки данных. Возможно это должна быть фабрика. </w:t>
+        <w:t xml:space="preserve">4 Продумать кто и каким образом будет собирать </w:t>
+      </w:r>
+      <w:proofErr w:type="gramStart"/>
+      <w:r>
+        <w:rPr>
+          <w:rFonts w:ascii="Segoe UI" w:hAnsi="Segoe UI" w:cs="Segoe UI"/>
+          <w:color w:val="ECECF1"/>
+          <w:shd w:val="clear" w:color="auto" w:fill="343541"/>
+        </w:rPr>
+        <w:t>компоненты</w:t>
+      </w:r>
+      <w:proofErr w:type="gramEnd"/>
+      <w:r>
+        <w:rPr>
+          <w:rFonts w:ascii="Segoe UI" w:hAnsi="Segoe UI" w:cs="Segoe UI"/>
+          <w:color w:val="ECECF1"/>
+          <w:shd w:val="clear" w:color="auto" w:fill="343541"/>
+        </w:rPr>
+        <w:t xml:space="preserve"> которые реализовывают интерфейсы для сохранения и/или загрузки данных. Возможно это должна быть фабрика. </w:t>
       </w:r>
     </w:p>
     <w:p>
@@ -252,7 +310,27 @@
           <w:color w:val="ECECF1"/>
           <w:shd w:val="clear" w:color="auto" w:fill="343541"/>
         </w:rPr>
-        <w:t xml:space="preserve">1 Работа над архитектурой. Внедрение di фабрики чтобы она занималась спавном игровых компонентов, когда к ней придёт запрос от какого-то состояния </w:t>
+        <w:t xml:space="preserve">1 Работа над архитектурой. Внедрение </w:t>
+      </w:r>
+      <w:proofErr w:type="spellStart"/>
+      <w:r>
+        <w:rPr>
+          <w:rFonts w:ascii="Segoe UI" w:hAnsi="Segoe UI" w:cs="Segoe UI"/>
+          <w:strike/>
+          <w:color w:val="ECECF1"/>
+          <w:shd w:val="clear" w:color="auto" w:fill="343541"/>
+        </w:rPr>
+        <w:t>di</w:t>
+      </w:r>
+      <w:proofErr w:type="spellEnd"/>
+      <w:r>
+        <w:rPr>
+          <w:rFonts w:ascii="Segoe UI" w:hAnsi="Segoe UI" w:cs="Segoe UI"/>
+          <w:strike/>
+          <w:color w:val="ECECF1"/>
+          <w:shd w:val="clear" w:color="auto" w:fill="343541"/>
+        </w:rPr>
+        <w:t xml:space="preserve"> фабрики чтобы она занималась спавном игровых компонентов, когда к ней придёт запрос от какого-то состояния </w:t>
       </w:r>
     </w:p>
     <w:p>
@@ -626,7 +704,27 @@
           <w:color w:val="ECECF1"/>
           <w:shd w:val="clear" w:color="auto" w:fill="343541"/>
         </w:rPr>
-        <w:t xml:space="preserve">1 Система боя: атака, получение урона, смерть. Эти три состояния которые должна как бы поддерживать система боя. Внедрить их не составит проблем потому-что уже имеются управляющие компоненты которые позволяют ии и игроку управлять атакой нужна только логика боевой системы. </w:t>
+        <w:t xml:space="preserve">1 Система боя: атака, получение урона, смерть. Эти три состояния которые должна как бы поддерживать система боя. Внедрить их не составит проблем </w:t>
+      </w:r>
+      <w:proofErr w:type="spellStart"/>
+      <w:r>
+        <w:rPr>
+          <w:rFonts w:ascii="Segoe UI" w:hAnsi="Segoe UI" w:cs="Segoe UI"/>
+          <w:strike/>
+          <w:color w:val="ECECF1"/>
+          <w:shd w:val="clear" w:color="auto" w:fill="343541"/>
+        </w:rPr>
+        <w:t>потому-что</w:t>
+      </w:r>
+      <w:proofErr w:type="spellEnd"/>
+      <w:r>
+        <w:rPr>
+          <w:rFonts w:ascii="Segoe UI" w:hAnsi="Segoe UI" w:cs="Segoe UI"/>
+          <w:strike/>
+          <w:color w:val="ECECF1"/>
+          <w:shd w:val="clear" w:color="auto" w:fill="343541"/>
+        </w:rPr>
+        <w:t xml:space="preserve"> уже имеются управляющие компоненты которые позволяют ии и игроку управлять атакой нужна только логика боевой системы. </w:t>
       </w:r>
     </w:p>
     <w:p>
@@ -740,7 +838,27 @@
           <w:color w:val="ECECF1"/>
           <w:shd w:val="clear" w:color="auto" w:fill="343541"/>
         </w:rPr>
-        <w:t xml:space="preserve">7 Искать ассеты для GUI. </w:t>
+        <w:t xml:space="preserve">7 Искать </w:t>
+      </w:r>
+      <w:proofErr w:type="spellStart"/>
+      <w:r>
+        <w:rPr>
+          <w:rFonts w:ascii="Segoe UI" w:hAnsi="Segoe UI" w:cs="Segoe UI"/>
+          <w:strike/>
+          <w:color w:val="ECECF1"/>
+          <w:shd w:val="clear" w:color="auto" w:fill="343541"/>
+        </w:rPr>
+        <w:t>ассеты</w:t>
+      </w:r>
+      <w:proofErr w:type="spellEnd"/>
+      <w:r>
+        <w:rPr>
+          <w:rFonts w:ascii="Segoe UI" w:hAnsi="Segoe UI" w:cs="Segoe UI"/>
+          <w:strike/>
+          <w:color w:val="ECECF1"/>
+          <w:shd w:val="clear" w:color="auto" w:fill="343541"/>
+        </w:rPr>
+        <w:t xml:space="preserve"> для GUI. </w:t>
       </w:r>
     </w:p>
     <w:p>
@@ -816,7 +934,27 @@
           <w:color w:val="ECECF1"/>
           <w:shd w:val="clear" w:color="auto" w:fill="343541"/>
         </w:rPr>
-        <w:t xml:space="preserve">1 первым делом нужно подумать о сериализации инвентаря, это нужно сделать чтобы список предметов, а точнее хилок и их количество сохранялось в память и чтобы его можно было загрузить при продолжении игры </w:t>
+        <w:t xml:space="preserve">1 первым делом нужно подумать о </w:t>
+      </w:r>
+      <w:proofErr w:type="spellStart"/>
+      <w:r>
+        <w:rPr>
+          <w:rFonts w:ascii="Segoe UI" w:hAnsi="Segoe UI" w:cs="Segoe UI"/>
+          <w:strike/>
+          <w:color w:val="ECECF1"/>
+          <w:shd w:val="clear" w:color="auto" w:fill="343541"/>
+        </w:rPr>
+        <w:t>сериализации</w:t>
+      </w:r>
+      <w:proofErr w:type="spellEnd"/>
+      <w:r>
+        <w:rPr>
+          <w:rFonts w:ascii="Segoe UI" w:hAnsi="Segoe UI" w:cs="Segoe UI"/>
+          <w:strike/>
+          <w:color w:val="ECECF1"/>
+          <w:shd w:val="clear" w:color="auto" w:fill="343541"/>
+        </w:rPr>
+        <w:t xml:space="preserve"> инвентаря, это нужно сделать чтобы список предметов, а точнее хилок и их количество сохранялось в память и чтобы его можно было загрузить при продолжении игры </w:t>
       </w:r>
     </w:p>
     <w:p>
@@ -890,7 +1028,67 @@
           <w:color w:val="ECECF1"/>
           <w:shd w:val="clear" w:color="auto" w:fill="343541"/>
         </w:rPr>
-        <w:t xml:space="preserve">5 Работа со светом. Просмотреть разные варианты. Но нужно помнить что риалтаймовое освещение жрет очень много ресурсов поэтому либо делать его запечённым либо использовать дайрект лайт </w:t>
+        <w:t xml:space="preserve">5 Работа со светом. Просмотреть разные варианты. Но нужно помнить что </w:t>
+      </w:r>
+      <w:proofErr w:type="spellStart"/>
+      <w:r>
+        <w:rPr>
+          <w:rFonts w:ascii="Segoe UI" w:hAnsi="Segoe UI" w:cs="Segoe UI"/>
+          <w:strike/>
+          <w:color w:val="ECECF1"/>
+          <w:shd w:val="clear" w:color="auto" w:fill="343541"/>
+        </w:rPr>
+        <w:t>риалтаймовое</w:t>
+      </w:r>
+      <w:proofErr w:type="spellEnd"/>
+      <w:r>
+        <w:rPr>
+          <w:rFonts w:ascii="Segoe UI" w:hAnsi="Segoe UI" w:cs="Segoe UI"/>
+          <w:strike/>
+          <w:color w:val="ECECF1"/>
+          <w:shd w:val="clear" w:color="auto" w:fill="343541"/>
+        </w:rPr>
+        <w:t xml:space="preserve"> освещение жрет очень много ресурсов поэтому либо делать его запечённым либо использовать </w:t>
+      </w:r>
+      <w:proofErr w:type="spellStart"/>
+      <w:r>
+        <w:rPr>
+          <w:rFonts w:ascii="Segoe UI" w:hAnsi="Segoe UI" w:cs="Segoe UI"/>
+          <w:strike/>
+          <w:color w:val="ECECF1"/>
+          <w:shd w:val="clear" w:color="auto" w:fill="343541"/>
+        </w:rPr>
+        <w:t>дайрект</w:t>
+      </w:r>
+      <w:proofErr w:type="spellEnd"/>
+      <w:r>
+        <w:rPr>
+          <w:rFonts w:ascii="Segoe UI" w:hAnsi="Segoe UI" w:cs="Segoe UI"/>
+          <w:strike/>
+          <w:color w:val="ECECF1"/>
+          <w:shd w:val="clear" w:color="auto" w:fill="343541"/>
+        </w:rPr>
+        <w:t xml:space="preserve"> </w:t>
+      </w:r>
+      <w:proofErr w:type="spellStart"/>
+      <w:r>
+        <w:rPr>
+          <w:rFonts w:ascii="Segoe UI" w:hAnsi="Segoe UI" w:cs="Segoe UI"/>
+          <w:strike/>
+          <w:color w:val="ECECF1"/>
+          <w:shd w:val="clear" w:color="auto" w:fill="343541"/>
+        </w:rPr>
+        <w:t>лайт</w:t>
+      </w:r>
+      <w:proofErr w:type="spellEnd"/>
+      <w:r>
+        <w:rPr>
+          <w:rFonts w:ascii="Segoe UI" w:hAnsi="Segoe UI" w:cs="Segoe UI"/>
+          <w:strike/>
+          <w:color w:val="ECECF1"/>
+          <w:shd w:val="clear" w:color="auto" w:fill="343541"/>
+        </w:rPr>
+        <w:t xml:space="preserve"> </w:t>
       </w:r>
     </w:p>
     <w:p>
@@ -946,7 +1144,27 @@
           <w:color w:val="ECECF1"/>
           <w:shd w:val="clear" w:color="auto" w:fill="343541"/>
         </w:rPr>
-        <w:t>8 Пересмотреть скрипты и те которые не используют статик дату, перевести на использование статик даты, а именно это относиться к конфигу игрока</w:t>
+        <w:t xml:space="preserve">8 Пересмотреть скрипты и те которые не используют статик дату, перевести на использование статик даты, а именно это относиться к </w:t>
+      </w:r>
+      <w:proofErr w:type="spellStart"/>
+      <w:r>
+        <w:rPr>
+          <w:rFonts w:ascii="Segoe UI" w:hAnsi="Segoe UI" w:cs="Segoe UI"/>
+          <w:strike/>
+          <w:color w:val="ECECF1"/>
+          <w:shd w:val="clear" w:color="auto" w:fill="343541"/>
+        </w:rPr>
+        <w:t>конфигу</w:t>
+      </w:r>
+      <w:proofErr w:type="spellEnd"/>
+      <w:r>
+        <w:rPr>
+          <w:rFonts w:ascii="Segoe UI" w:hAnsi="Segoe UI" w:cs="Segoe UI"/>
+          <w:strike/>
+          <w:color w:val="ECECF1"/>
+          <w:shd w:val="clear" w:color="auto" w:fill="343541"/>
+        </w:rPr>
+        <w:t xml:space="preserve"> игрока</w:t>
       </w:r>
     </w:p>
     <w:p>
@@ -1043,7 +1261,25 @@
           <w:color w:val="ECECF1"/>
           <w:shd w:val="clear" w:color="auto" w:fill="343541"/>
         </w:rPr>
-        <w:t>Второй и третий пункт хоть и выглядят достаточно просто но на самом деле именно эти два пункта содержат колоссальную работу над проектом.</w:t>
+        <w:t xml:space="preserve">Второй и третий пункт хоть и выглядят достаточно </w:t>
+      </w:r>
+      <w:proofErr w:type="gramStart"/>
+      <w:r>
+        <w:rPr>
+          <w:rFonts w:ascii="Segoe UI" w:hAnsi="Segoe UI" w:cs="Segoe UI"/>
+          <w:color w:val="ECECF1"/>
+          <w:shd w:val="clear" w:color="auto" w:fill="343541"/>
+        </w:rPr>
+        <w:t>просто</w:t>
+      </w:r>
+      <w:proofErr w:type="gramEnd"/>
+      <w:r>
+        <w:rPr>
+          <w:rFonts w:ascii="Segoe UI" w:hAnsi="Segoe UI" w:cs="Segoe UI"/>
+          <w:color w:val="ECECF1"/>
+          <w:shd w:val="clear" w:color="auto" w:fill="343541"/>
+        </w:rPr>
+        <w:t xml:space="preserve"> но на самом деле именно эти два пункта содержат колоссальную работу над проектом.</w:t>
       </w:r>
     </w:p>
     <w:p>
@@ -1187,7 +1423,27 @@
           <w:color w:val="ECECF1"/>
           <w:shd w:val="clear" w:color="auto" w:fill="343541"/>
         </w:rPr>
-        <w:t>5 Начать погружаться в квестовую систему. Это достаточно крупный шаг и по этому он займет больше всего времени, хотя и на первый взгляд все написано просто.</w:t>
+        <w:t xml:space="preserve">5 Начать погружаться в квестовую систему. Это достаточно крупный шаг и </w:t>
+      </w:r>
+      <w:proofErr w:type="gramStart"/>
+      <w:r>
+        <w:rPr>
+          <w:rFonts w:ascii="Segoe UI" w:hAnsi="Segoe UI" w:cs="Segoe UI"/>
+          <w:strike/>
+          <w:color w:val="ECECF1"/>
+          <w:shd w:val="clear" w:color="auto" w:fill="343541"/>
+        </w:rPr>
+        <w:t>по этому</w:t>
+      </w:r>
+      <w:proofErr w:type="gramEnd"/>
+      <w:r>
+        <w:rPr>
+          <w:rFonts w:ascii="Segoe UI" w:hAnsi="Segoe UI" w:cs="Segoe UI"/>
+          <w:strike/>
+          <w:color w:val="ECECF1"/>
+          <w:shd w:val="clear" w:color="auto" w:fill="343541"/>
+        </w:rPr>
+        <w:t xml:space="preserve"> он займет больше всего времени, хотя и на первый взгляд все написано просто.</w:t>
       </w:r>
     </w:p>
     <w:p>
@@ -1257,24 +1513,62 @@
           <w:color w:val="ECECF1"/>
           <w:shd w:val="clear" w:color="auto" w:fill="343541"/>
         </w:rPr>
-        <w:t xml:space="preserve">1 Внедрить прототип квестовой системы в проект </w:t>
-      </w:r>
-    </w:p>
-    <w:p>
-      <w:pPr>
-        <w:rPr>
-          <w:rFonts w:ascii="Segoe UI" w:hAnsi="Segoe UI" w:cs="Segoe UI"/>
-          <w:color w:val="ECECF1"/>
-          <w:shd w:val="clear" w:color="auto" w:fill="343541"/>
-        </w:rPr>
-      </w:pPr>
-      <w:r>
-        <w:rPr>
-          <w:rFonts w:ascii="Segoe UI" w:hAnsi="Segoe UI" w:cs="Segoe UI"/>
-          <w:color w:val="ECECF1"/>
-          <w:shd w:val="clear" w:color="auto" w:fill="343541"/>
-        </w:rPr>
-        <w:t xml:space="preserve">2 Довести прототип квестовой системы до ума. Один из самых длительных этапов. </w:t>
+        <w:t xml:space="preserve">1 Внедрить прототип </w:t>
+      </w:r>
+      <w:proofErr w:type="spellStart"/>
+      <w:r>
+        <w:rPr>
+          <w:rFonts w:ascii="Segoe UI" w:hAnsi="Segoe UI" w:cs="Segoe UI"/>
+          <w:strike/>
+          <w:color w:val="ECECF1"/>
+          <w:shd w:val="clear" w:color="auto" w:fill="343541"/>
+        </w:rPr>
+        <w:t>квестовой</w:t>
+      </w:r>
+      <w:proofErr w:type="spellEnd"/>
+      <w:r>
+        <w:rPr>
+          <w:rFonts w:ascii="Segoe UI" w:hAnsi="Segoe UI" w:cs="Segoe UI"/>
+          <w:strike/>
+          <w:color w:val="ECECF1"/>
+          <w:shd w:val="clear" w:color="auto" w:fill="343541"/>
+        </w:rPr>
+        <w:t xml:space="preserve"> системы в проект </w:t>
+      </w:r>
+    </w:p>
+    <w:p>
+      <w:pPr>
+        <w:rPr>
+          <w:rFonts w:ascii="Segoe UI" w:hAnsi="Segoe UI" w:cs="Segoe UI"/>
+          <w:color w:val="ECECF1"/>
+          <w:shd w:val="clear" w:color="auto" w:fill="343541"/>
+        </w:rPr>
+      </w:pPr>
+      <w:r>
+        <w:rPr>
+          <w:rFonts w:ascii="Segoe UI" w:hAnsi="Segoe UI" w:cs="Segoe UI"/>
+          <w:color w:val="ECECF1"/>
+          <w:shd w:val="clear" w:color="auto" w:fill="343541"/>
+        </w:rPr>
+        <w:t xml:space="preserve">2 Довести прототип </w:t>
+      </w:r>
+      <w:proofErr w:type="spellStart"/>
+      <w:r>
+        <w:rPr>
+          <w:rFonts w:ascii="Segoe UI" w:hAnsi="Segoe UI" w:cs="Segoe UI"/>
+          <w:color w:val="ECECF1"/>
+          <w:shd w:val="clear" w:color="auto" w:fill="343541"/>
+        </w:rPr>
+        <w:t>квестовой</w:t>
+      </w:r>
+      <w:proofErr w:type="spellEnd"/>
+      <w:r>
+        <w:rPr>
+          <w:rFonts w:ascii="Segoe UI" w:hAnsi="Segoe UI" w:cs="Segoe UI"/>
+          <w:color w:val="ECECF1"/>
+          <w:shd w:val="clear" w:color="auto" w:fill="343541"/>
+        </w:rPr>
+        <w:t xml:space="preserve"> системы до ума. Один из самых длительных этапов. </w:t>
       </w:r>
     </w:p>
     <w:p>
@@ -1292,7 +1586,25 @@
           <w:color w:val="ECECF1"/>
           <w:shd w:val="clear" w:color="auto" w:fill="343541"/>
         </w:rPr>
-        <w:t xml:space="preserve">2а Завершить прототип, получив работоспособную квестовую систему. </w:t>
+        <w:t xml:space="preserve">2а </w:t>
+      </w:r>
+      <w:proofErr w:type="gramStart"/>
+      <w:r>
+        <w:rPr>
+          <w:rFonts w:ascii="Segoe UI" w:hAnsi="Segoe UI" w:cs="Segoe UI"/>
+          <w:color w:val="ECECF1"/>
+          <w:shd w:val="clear" w:color="auto" w:fill="343541"/>
+        </w:rPr>
+        <w:t>Завершить</w:t>
+      </w:r>
+      <w:proofErr w:type="gramEnd"/>
+      <w:r>
+        <w:rPr>
+          <w:rFonts w:ascii="Segoe UI" w:hAnsi="Segoe UI" w:cs="Segoe UI"/>
+          <w:color w:val="ECECF1"/>
+          <w:shd w:val="clear" w:color="auto" w:fill="343541"/>
+        </w:rPr>
+        <w:t xml:space="preserve"> прототип, получив работоспособную квестовую систему. </w:t>
       </w:r>
     </w:p>
     <w:p>
@@ -1310,7 +1622,43 @@
           <w:color w:val="ECECF1"/>
           <w:shd w:val="clear" w:color="auto" w:fill="343541"/>
         </w:rPr>
-        <w:t xml:space="preserve">2б Контролировать состояние архитектуры при разработке доработке прототипа квестовой системы. </w:t>
+        <w:t xml:space="preserve">2б </w:t>
+      </w:r>
+      <w:proofErr w:type="gramStart"/>
+      <w:r>
+        <w:rPr>
+          <w:rFonts w:ascii="Segoe UI" w:hAnsi="Segoe UI" w:cs="Segoe UI"/>
+          <w:color w:val="ECECF1"/>
+          <w:shd w:val="clear" w:color="auto" w:fill="343541"/>
+        </w:rPr>
+        <w:t>Контролировать</w:t>
+      </w:r>
+      <w:proofErr w:type="gramEnd"/>
+      <w:r>
+        <w:rPr>
+          <w:rFonts w:ascii="Segoe UI" w:hAnsi="Segoe UI" w:cs="Segoe UI"/>
+          <w:color w:val="ECECF1"/>
+          <w:shd w:val="clear" w:color="auto" w:fill="343541"/>
+        </w:rPr>
+        <w:t xml:space="preserve"> состояние архитектуры при разработке доработке прототипа </w:t>
+      </w:r>
+      <w:proofErr w:type="spellStart"/>
+      <w:r>
+        <w:rPr>
+          <w:rFonts w:ascii="Segoe UI" w:hAnsi="Segoe UI" w:cs="Segoe UI"/>
+          <w:color w:val="ECECF1"/>
+          <w:shd w:val="clear" w:color="auto" w:fill="343541"/>
+        </w:rPr>
+        <w:t>квестовой</w:t>
+      </w:r>
+      <w:proofErr w:type="spellEnd"/>
+      <w:r>
+        <w:rPr>
+          <w:rFonts w:ascii="Segoe UI" w:hAnsi="Segoe UI" w:cs="Segoe UI"/>
+          <w:color w:val="ECECF1"/>
+          <w:shd w:val="clear" w:color="auto" w:fill="343541"/>
+        </w:rPr>
+        <w:t xml:space="preserve"> системы. </w:t>
       </w:r>
     </w:p>
     <w:p>
@@ -1378,7 +1726,25 @@
           <w:color w:val="ECECF1"/>
           <w:shd w:val="clear" w:color="auto" w:fill="343541"/>
         </w:rPr>
-        <w:t>6 Готовиться к реализации системы торговли. Также как и второй этап достаточно длительный.</w:t>
+        <w:t xml:space="preserve">6 Готовиться к реализации системы торговли. </w:t>
+      </w:r>
+      <w:proofErr w:type="gramStart"/>
+      <w:r>
+        <w:rPr>
+          <w:rFonts w:ascii="Segoe UI" w:hAnsi="Segoe UI" w:cs="Segoe UI"/>
+          <w:color w:val="ECECF1"/>
+          <w:shd w:val="clear" w:color="auto" w:fill="343541"/>
+        </w:rPr>
+        <w:t>Также</w:t>
+      </w:r>
+      <w:proofErr w:type="gramEnd"/>
+      <w:r>
+        <w:rPr>
+          <w:rFonts w:ascii="Segoe UI" w:hAnsi="Segoe UI" w:cs="Segoe UI"/>
+          <w:color w:val="ECECF1"/>
+          <w:shd w:val="clear" w:color="auto" w:fill="343541"/>
+        </w:rPr>
+        <w:t xml:space="preserve"> как и второй этап достаточно длительный.</w:t>
       </w:r>
     </w:p>
     <w:p>
@@ -1479,7 +1845,25 @@
           <w:color w:val="ECECF1"/>
           <w:shd w:val="clear" w:color="auto" w:fill="343541"/>
         </w:rPr>
-        <w:t>4 Готовится к разработки системы торговли.</w:t>
+        <w:t xml:space="preserve">4 Готовится </w:t>
+      </w:r>
+      <w:proofErr w:type="gramStart"/>
+      <w:r>
+        <w:rPr>
+          <w:rFonts w:ascii="Segoe UI" w:hAnsi="Segoe UI" w:cs="Segoe UI"/>
+          <w:color w:val="ECECF1"/>
+          <w:shd w:val="clear" w:color="auto" w:fill="343541"/>
+        </w:rPr>
+        <w:t>к разработки</w:t>
+      </w:r>
+      <w:proofErr w:type="gramEnd"/>
+      <w:r>
+        <w:rPr>
+          <w:rFonts w:ascii="Segoe UI" w:hAnsi="Segoe UI" w:cs="Segoe UI"/>
+          <w:color w:val="ECECF1"/>
+          <w:shd w:val="clear" w:color="auto" w:fill="343541"/>
+        </w:rPr>
+        <w:t xml:space="preserve"> системы торговли.</w:t>
       </w:r>
     </w:p>
     <w:p>
@@ -1543,7 +1927,47 @@
           <w:color w:val="ECECF1"/>
           <w:shd w:val="clear" w:color="auto" w:fill="343541"/>
         </w:rPr>
-        <w:t xml:space="preserve">2 Нужно решить проблему связанную с отображением окна квест трекера, а именно проблема с отображением активного квеста, возможно стоит расширить квестовую систему еще одним событием которое будет информировать своих подписчиков о том что нужно обновить интерфейс. </w:t>
+        <w:t xml:space="preserve">2 Нужно решить </w:t>
+      </w:r>
+      <w:proofErr w:type="gramStart"/>
+      <w:r>
+        <w:rPr>
+          <w:rFonts w:ascii="Segoe UI" w:hAnsi="Segoe UI" w:cs="Segoe UI"/>
+          <w:strike/>
+          <w:color w:val="ECECF1"/>
+          <w:shd w:val="clear" w:color="auto" w:fill="343541"/>
+        </w:rPr>
+        <w:t>проблему</w:t>
+      </w:r>
+      <w:proofErr w:type="gramEnd"/>
+      <w:r>
+        <w:rPr>
+          <w:rFonts w:ascii="Segoe UI" w:hAnsi="Segoe UI" w:cs="Segoe UI"/>
+          <w:strike/>
+          <w:color w:val="ECECF1"/>
+          <w:shd w:val="clear" w:color="auto" w:fill="343541"/>
+        </w:rPr>
+        <w:t xml:space="preserve"> связанную с отображением окна квест </w:t>
+      </w:r>
+      <w:proofErr w:type="spellStart"/>
+      <w:r>
+        <w:rPr>
+          <w:rFonts w:ascii="Segoe UI" w:hAnsi="Segoe UI" w:cs="Segoe UI"/>
+          <w:strike/>
+          <w:color w:val="ECECF1"/>
+          <w:shd w:val="clear" w:color="auto" w:fill="343541"/>
+        </w:rPr>
+        <w:t>трекера</w:t>
+      </w:r>
+      <w:proofErr w:type="spellEnd"/>
+      <w:r>
+        <w:rPr>
+          <w:rFonts w:ascii="Segoe UI" w:hAnsi="Segoe UI" w:cs="Segoe UI"/>
+          <w:strike/>
+          <w:color w:val="ECECF1"/>
+          <w:shd w:val="clear" w:color="auto" w:fill="343541"/>
+        </w:rPr>
+        <w:t xml:space="preserve">, а именно проблема с отображением активного квеста, возможно стоит расширить квестовую систему еще одним событием которое будет информировать своих подписчиков о том что нужно обновить интерфейс. </w:t>
       </w:r>
     </w:p>
     <w:p>
@@ -1581,7 +2005,87 @@
           <w:color w:val="ECECF1"/>
           <w:shd w:val="clear" w:color="auto" w:fill="343541"/>
         </w:rPr>
-        <w:t xml:space="preserve">4 Просмотреть структуру PlayerProgressService, а также компонентов: IPlayerProgressUpdater, IPlayerProgressLoader. Как минимум нужно обновить нейминг, возможно придётся модифицировать структуру. </w:t>
+        <w:t xml:space="preserve">4 Просмотреть структуру </w:t>
+      </w:r>
+      <w:proofErr w:type="spellStart"/>
+      <w:r>
+        <w:rPr>
+          <w:rFonts w:ascii="Segoe UI" w:hAnsi="Segoe UI" w:cs="Segoe UI"/>
+          <w:strike/>
+          <w:color w:val="ECECF1"/>
+          <w:shd w:val="clear" w:color="auto" w:fill="343541"/>
+        </w:rPr>
+        <w:t>PlayerProgressService</w:t>
+      </w:r>
+      <w:proofErr w:type="spellEnd"/>
+      <w:r>
+        <w:rPr>
+          <w:rFonts w:ascii="Segoe UI" w:hAnsi="Segoe UI" w:cs="Segoe UI"/>
+          <w:strike/>
+          <w:color w:val="ECECF1"/>
+          <w:shd w:val="clear" w:color="auto" w:fill="343541"/>
+        </w:rPr>
+        <w:t xml:space="preserve">, а также компонентов: </w:t>
+      </w:r>
+      <w:proofErr w:type="spellStart"/>
+      <w:r>
+        <w:rPr>
+          <w:rFonts w:ascii="Segoe UI" w:hAnsi="Segoe UI" w:cs="Segoe UI"/>
+          <w:strike/>
+          <w:color w:val="ECECF1"/>
+          <w:shd w:val="clear" w:color="auto" w:fill="343541"/>
+        </w:rPr>
+        <w:t>IPlayerProgressUpdater</w:t>
+      </w:r>
+      <w:proofErr w:type="spellEnd"/>
+      <w:r>
+        <w:rPr>
+          <w:rFonts w:ascii="Segoe UI" w:hAnsi="Segoe UI" w:cs="Segoe UI"/>
+          <w:strike/>
+          <w:color w:val="ECECF1"/>
+          <w:shd w:val="clear" w:color="auto" w:fill="343541"/>
+        </w:rPr>
+        <w:t xml:space="preserve">, </w:t>
+      </w:r>
+      <w:proofErr w:type="spellStart"/>
+      <w:r>
+        <w:rPr>
+          <w:rFonts w:ascii="Segoe UI" w:hAnsi="Segoe UI" w:cs="Segoe UI"/>
+          <w:strike/>
+          <w:color w:val="ECECF1"/>
+          <w:shd w:val="clear" w:color="auto" w:fill="343541"/>
+        </w:rPr>
+        <w:t>IPlayerProgressLoader</w:t>
+      </w:r>
+      <w:proofErr w:type="spellEnd"/>
+      <w:r>
+        <w:rPr>
+          <w:rFonts w:ascii="Segoe UI" w:hAnsi="Segoe UI" w:cs="Segoe UI"/>
+          <w:strike/>
+          <w:color w:val="ECECF1"/>
+          <w:shd w:val="clear" w:color="auto" w:fill="343541"/>
+        </w:rPr>
+        <w:t xml:space="preserve">. Как минимум нужно обновить </w:t>
+      </w:r>
+      <w:proofErr w:type="spellStart"/>
+      <w:r>
+        <w:rPr>
+          <w:rFonts w:ascii="Segoe UI" w:hAnsi="Segoe UI" w:cs="Segoe UI"/>
+          <w:strike/>
+          <w:color w:val="ECECF1"/>
+          <w:shd w:val="clear" w:color="auto" w:fill="343541"/>
+        </w:rPr>
+        <w:t>нейминг</w:t>
+      </w:r>
+      <w:proofErr w:type="spellEnd"/>
+      <w:r>
+        <w:rPr>
+          <w:rFonts w:ascii="Segoe UI" w:hAnsi="Segoe UI" w:cs="Segoe UI"/>
+          <w:strike/>
+          <w:color w:val="ECECF1"/>
+          <w:shd w:val="clear" w:color="auto" w:fill="343541"/>
+        </w:rPr>
+        <w:t xml:space="preserve">, возможно придётся модифицировать структуру. </w:t>
       </w:r>
     </w:p>
     <w:p>
@@ -1659,32 +2163,46 @@
         <w:spacing w:after="100" w:line="240" w:lineRule="auto"/>
         <w:rPr>
           <w:rFonts w:ascii="Segoe UI" w:eastAsia="Times New Roman" w:hAnsi="Segoe UI" w:cs="Segoe UI"/>
+          <w:strike/>
           <w:sz w:val="21"/>
           <w:szCs w:val="21"/>
           <w:lang w:eastAsia="ru-RU"/>
         </w:rPr>
       </w:pPr>
-      <w:r>
+      <w:bookmarkStart w:id="0" w:name="_GoBack"/>
+      <w:r>
+        <w:rPr>
+          <w:rFonts w:ascii="Segoe UI" w:eastAsia="Times New Roman" w:hAnsi="Segoe UI" w:cs="Segoe UI"/>
+          <w:strike/>
+          <w:sz w:val="21"/>
+          <w:szCs w:val="21"/>
+          <w:lang w:eastAsia="ru-RU"/>
+        </w:rPr>
+        <w:t xml:space="preserve">1 Добавить возможность получения опыта за убийство мобов. </w:t>
+      </w:r>
+    </w:p>
+    <w:bookmarkEnd w:id="0"/>
+    <w:p>
+      <w:pPr>
+        <w:shd w:val="clear" w:color="auto" w:fill="343541"/>
+        <w:spacing w:after="100" w:line="240" w:lineRule="auto"/>
         <w:rPr>
           <w:rFonts w:ascii="Segoe UI" w:eastAsia="Times New Roman" w:hAnsi="Segoe UI" w:cs="Segoe UI"/>
           <w:sz w:val="21"/>
           <w:szCs w:val="21"/>
           <w:lang w:eastAsia="ru-RU"/>
         </w:rPr>
-        <w:t xml:space="preserve">1 Добавить возможность получения опыта за убийство мобов. </w:t>
-      </w:r>
-    </w:p>
-    <w:p>
-      <w:pPr>
-        <w:shd w:val="clear" w:color="auto" w:fill="343541"/>
-        <w:spacing w:after="100" w:line="240" w:lineRule="auto"/>
+      </w:pPr>
+      <w:r>
         <w:rPr>
           <w:rFonts w:ascii="Segoe UI" w:eastAsia="Times New Roman" w:hAnsi="Segoe UI" w:cs="Segoe UI"/>
           <w:sz w:val="21"/>
           <w:szCs w:val="21"/>
           <w:lang w:eastAsia="ru-RU"/>
         </w:rPr>
-      </w:pPr>
+        <w:t xml:space="preserve">2 Добавить визуальные эффекты для боя (количество нанесённого урона игроком, количество полученного урона игроком, также было бы хорошо </w:t>
+      </w:r>
+      <w:proofErr w:type="gramStart"/>
       <w:r>
         <w:rPr>
           <w:rFonts w:ascii="Segoe UI" w:eastAsia="Times New Roman" w:hAnsi="Segoe UI" w:cs="Segoe UI"/>
@@ -1692,62 +2210,61 @@
           <w:szCs w:val="21"/>
           <w:lang w:eastAsia="ru-RU"/>
         </w:rPr>
-        <w:t xml:space="preserve">2 Добавить визуальные эффекты для боя (количество нанесённого урона игроком, количество полученного урона игроком, также было бы хорошо выводить когда сработал какой-то навык например если игрок сумел заблокировать урон, или же уклониться, показывать на какое количество очков вылечился игрок и т.д.) </w:t>
-      </w:r>
-    </w:p>
-    <w:p>
-      <w:pPr>
-        <w:shd w:val="clear" w:color="auto" w:fill="343541"/>
-        <w:spacing w:after="100" w:line="240" w:lineRule="auto"/>
+        <w:t>выводить</w:t>
+      </w:r>
+      <w:proofErr w:type="gramEnd"/>
+      <w:r>
         <w:rPr>
           <w:rFonts w:ascii="Segoe UI" w:eastAsia="Times New Roman" w:hAnsi="Segoe UI" w:cs="Segoe UI"/>
           <w:sz w:val="21"/>
           <w:szCs w:val="21"/>
           <w:lang w:eastAsia="ru-RU"/>
         </w:rPr>
-      </w:pPr>
-      <w:r>
+        <w:t xml:space="preserve"> когда сработал какой-то навык например если игрок сумел заблокировать урон, или же уклониться, показывать на какое количество очков вылечился игрок и т.д.) </w:t>
+      </w:r>
+    </w:p>
+    <w:p>
+      <w:pPr>
+        <w:shd w:val="clear" w:color="auto" w:fill="343541"/>
+        <w:spacing w:after="100" w:line="240" w:lineRule="auto"/>
         <w:rPr>
           <w:rFonts w:ascii="Segoe UI" w:eastAsia="Times New Roman" w:hAnsi="Segoe UI" w:cs="Segoe UI"/>
           <w:sz w:val="21"/>
           <w:szCs w:val="21"/>
           <w:lang w:eastAsia="ru-RU"/>
         </w:rPr>
-        <w:t xml:space="preserve">3 Полоска здоровья для мобов, их уровень. </w:t>
-      </w:r>
-    </w:p>
-    <w:p>
-      <w:pPr>
-        <w:shd w:val="clear" w:color="auto" w:fill="343541"/>
-        <w:spacing w:after="100" w:line="240" w:lineRule="auto"/>
+      </w:pPr>
+      <w:r>
         <w:rPr>
           <w:rFonts w:ascii="Segoe UI" w:eastAsia="Times New Roman" w:hAnsi="Segoe UI" w:cs="Segoe UI"/>
           <w:sz w:val="21"/>
           <w:szCs w:val="21"/>
           <w:lang w:eastAsia="ru-RU"/>
         </w:rPr>
-      </w:pPr>
-      <w:r>
+        <w:t xml:space="preserve">3 Полоска здоровья для мобов, их уровень. </w:t>
+      </w:r>
+    </w:p>
+    <w:p>
+      <w:pPr>
+        <w:shd w:val="clear" w:color="auto" w:fill="343541"/>
+        <w:spacing w:after="100" w:line="240" w:lineRule="auto"/>
         <w:rPr>
           <w:rFonts w:ascii="Segoe UI" w:eastAsia="Times New Roman" w:hAnsi="Segoe UI" w:cs="Segoe UI"/>
           <w:sz w:val="21"/>
           <w:szCs w:val="21"/>
           <w:lang w:eastAsia="ru-RU"/>
         </w:rPr>
-        <w:t xml:space="preserve">4 Окно стат для игрока, которое будет отображать его текущий уровень, опыт (текущий и сколько нужно для следующего уровня). </w:t>
-      </w:r>
-    </w:p>
-    <w:p>
-      <w:pPr>
-        <w:shd w:val="clear" w:color="auto" w:fill="343541"/>
-        <w:spacing w:after="100" w:line="240" w:lineRule="auto"/>
+      </w:pPr>
+      <w:r>
         <w:rPr>
           <w:rFonts w:ascii="Segoe UI" w:eastAsia="Times New Roman" w:hAnsi="Segoe UI" w:cs="Segoe UI"/>
           <w:sz w:val="21"/>
           <w:szCs w:val="21"/>
           <w:lang w:eastAsia="ru-RU"/>
         </w:rPr>
-      </w:pPr>
+        <w:t xml:space="preserve">4 Окно </w:t>
+      </w:r>
+      <w:proofErr w:type="spellStart"/>
       <w:r>
         <w:rPr>
           <w:rFonts w:ascii="Segoe UI" w:eastAsia="Times New Roman" w:hAnsi="Segoe UI" w:cs="Segoe UI"/>
@@ -1755,22 +2272,91 @@
           <w:szCs w:val="21"/>
           <w:lang w:eastAsia="ru-RU"/>
         </w:rPr>
-        <w:t xml:space="preserve">5 Работать над прототипом разноуровневых мобов. Возможно прикрутить какой-то райдомазер для создания различных конфигураций мобов. </w:t>
-      </w:r>
-    </w:p>
-    <w:p>
-      <w:pPr>
-        <w:shd w:val="clear" w:color="auto" w:fill="343541"/>
-        <w:spacing w:after="100" w:line="240" w:lineRule="auto"/>
+        <w:t>стат</w:t>
+      </w:r>
+      <w:proofErr w:type="spellEnd"/>
+      <w:r>
         <w:rPr>
           <w:rFonts w:ascii="Segoe UI" w:eastAsia="Times New Roman" w:hAnsi="Segoe UI" w:cs="Segoe UI"/>
           <w:sz w:val="21"/>
           <w:szCs w:val="21"/>
           <w:lang w:eastAsia="ru-RU"/>
         </w:rPr>
-      </w:pPr>
-      <w:bookmarkStart w:id="0" w:name="_GoBack"/>
-      <w:bookmarkEnd w:id="0"/>
+        <w:t xml:space="preserve"> для игрока, которое будет отображать его текущий уровень, опыт (текущий и сколько нужно для следующего уровня). </w:t>
+      </w:r>
+    </w:p>
+    <w:p>
+      <w:pPr>
+        <w:shd w:val="clear" w:color="auto" w:fill="343541"/>
+        <w:spacing w:after="100" w:line="240" w:lineRule="auto"/>
+        <w:rPr>
+          <w:rFonts w:ascii="Segoe UI" w:eastAsia="Times New Roman" w:hAnsi="Segoe UI" w:cs="Segoe UI"/>
+          <w:sz w:val="21"/>
+          <w:szCs w:val="21"/>
+          <w:lang w:eastAsia="ru-RU"/>
+        </w:rPr>
+      </w:pPr>
+      <w:r>
+        <w:rPr>
+          <w:rFonts w:ascii="Segoe UI" w:eastAsia="Times New Roman" w:hAnsi="Segoe UI" w:cs="Segoe UI"/>
+          <w:sz w:val="21"/>
+          <w:szCs w:val="21"/>
+          <w:lang w:eastAsia="ru-RU"/>
+        </w:rPr>
+        <w:t xml:space="preserve">5 Работать над прототипом </w:t>
+      </w:r>
+      <w:proofErr w:type="spellStart"/>
+      <w:r>
+        <w:rPr>
+          <w:rFonts w:ascii="Segoe UI" w:eastAsia="Times New Roman" w:hAnsi="Segoe UI" w:cs="Segoe UI"/>
+          <w:sz w:val="21"/>
+          <w:szCs w:val="21"/>
+          <w:lang w:eastAsia="ru-RU"/>
+        </w:rPr>
+        <w:t>разноуровневых</w:t>
+      </w:r>
+      <w:proofErr w:type="spellEnd"/>
+      <w:r>
+        <w:rPr>
+          <w:rFonts w:ascii="Segoe UI" w:eastAsia="Times New Roman" w:hAnsi="Segoe UI" w:cs="Segoe UI"/>
+          <w:sz w:val="21"/>
+          <w:szCs w:val="21"/>
+          <w:lang w:eastAsia="ru-RU"/>
+        </w:rPr>
+        <w:t xml:space="preserve"> мобов. Возможно прикрутить какой-то </w:t>
+      </w:r>
+      <w:proofErr w:type="spellStart"/>
+      <w:r>
+        <w:rPr>
+          <w:rFonts w:ascii="Segoe UI" w:eastAsia="Times New Roman" w:hAnsi="Segoe UI" w:cs="Segoe UI"/>
+          <w:sz w:val="21"/>
+          <w:szCs w:val="21"/>
+          <w:lang w:eastAsia="ru-RU"/>
+        </w:rPr>
+        <w:t>райдомазер</w:t>
+      </w:r>
+      <w:proofErr w:type="spellEnd"/>
+      <w:r>
+        <w:rPr>
+          <w:rFonts w:ascii="Segoe UI" w:eastAsia="Times New Roman" w:hAnsi="Segoe UI" w:cs="Segoe UI"/>
+          <w:sz w:val="21"/>
+          <w:szCs w:val="21"/>
+          <w:lang w:eastAsia="ru-RU"/>
+        </w:rPr>
+        <w:t xml:space="preserve"> для создания различных конфигураций мобов. </w:t>
+      </w:r>
+    </w:p>
+    <w:p>
+      <w:pPr>
+        <w:shd w:val="clear" w:color="auto" w:fill="343541"/>
+        <w:spacing w:after="100" w:line="240" w:lineRule="auto"/>
+        <w:rPr>
+          <w:rFonts w:ascii="Segoe UI" w:eastAsia="Times New Roman" w:hAnsi="Segoe UI" w:cs="Segoe UI"/>
+          <w:sz w:val="21"/>
+          <w:szCs w:val="21"/>
+          <w:lang w:eastAsia="ru-RU"/>
+        </w:rPr>
+      </w:pPr>
       <w:r>
         <w:rPr>
           <w:rFonts w:ascii="Segoe UI" w:eastAsia="Times New Roman" w:hAnsi="Segoe UI" w:cs="Segoe UI"/>

</xml_diff>

<commit_message>
Modified GameCamera. Add EnumLinksFromAttributeToSkill.
</commit_message>
<xml_diff>
--- a/Итерации.docx
+++ b/Итерации.docx
@@ -2169,7 +2169,6 @@
           <w:lang w:eastAsia="ru-RU"/>
         </w:rPr>
       </w:pPr>
-      <w:bookmarkStart w:id="0" w:name="_GoBack"/>
       <w:r>
         <w:rPr>
           <w:rFonts w:ascii="Segoe UI" w:eastAsia="Times New Roman" w:hAnsi="Segoe UI" w:cs="Segoe UI"/>
@@ -2181,7 +2180,6 @@
         <w:t xml:space="preserve">1 Добавить возможность получения опыта за убийство мобов. </w:t>
       </w:r>
     </w:p>
-    <w:bookmarkEnd w:id="0"/>
     <w:p>
       <w:pPr>
         <w:shd w:val="clear" w:color="auto" w:fill="343541"/>
@@ -2202,7 +2200,6 @@
         </w:rPr>
         <w:t xml:space="preserve">2 Добавить визуальные эффекты для боя (количество нанесённого урона игроком, количество полученного урона игроком, также было бы хорошо </w:t>
       </w:r>
-      <w:proofErr w:type="gramStart"/>
       <w:r>
         <w:rPr>
           <w:rFonts w:ascii="Segoe UI" w:eastAsia="Times New Roman" w:hAnsi="Segoe UI" w:cs="Segoe UI"/>
@@ -2210,9 +2207,8 @@
           <w:szCs w:val="21"/>
           <w:lang w:eastAsia="ru-RU"/>
         </w:rPr>
-        <w:t>выводить</w:t>
-      </w:r>
-      <w:proofErr w:type="gramEnd"/>
+        <w:t>выводить,</w:t>
+      </w:r>
       <w:r>
         <w:rPr>
           <w:rFonts w:ascii="Segoe UI" w:eastAsia="Times New Roman" w:hAnsi="Segoe UI" w:cs="Segoe UI"/>
@@ -2220,20 +2216,19 @@
           <w:szCs w:val="21"/>
           <w:lang w:eastAsia="ru-RU"/>
         </w:rPr>
-        <w:t xml:space="preserve"> когда сработал какой-то навык например если игрок сумел заблокировать урон, или же уклониться, показывать на какое количество очков вылечился игрок и т.д.) </w:t>
-      </w:r>
-    </w:p>
-    <w:p>
-      <w:pPr>
-        <w:shd w:val="clear" w:color="auto" w:fill="343541"/>
-        <w:spacing w:after="100" w:line="240" w:lineRule="auto"/>
+        <w:t xml:space="preserve"> когда сработал какой-то </w:t>
+      </w:r>
+      <w:bookmarkStart w:id="0" w:name="_GoBack"/>
+      <w:bookmarkEnd w:id="0"/>
+      <w:r>
         <w:rPr>
           <w:rFonts w:ascii="Segoe UI" w:eastAsia="Times New Roman" w:hAnsi="Segoe UI" w:cs="Segoe UI"/>
           <w:sz w:val="21"/>
           <w:szCs w:val="21"/>
           <w:lang w:eastAsia="ru-RU"/>
         </w:rPr>
-      </w:pPr>
+        <w:t>навык, например,</w:t>
+      </w:r>
       <w:r>
         <w:rPr>
           <w:rFonts w:ascii="Segoe UI" w:eastAsia="Times New Roman" w:hAnsi="Segoe UI" w:cs="Segoe UI"/>
@@ -2241,6 +2236,29 @@
           <w:szCs w:val="21"/>
           <w:lang w:eastAsia="ru-RU"/>
         </w:rPr>
+        <w:t xml:space="preserve"> если игрок сумел заблокировать урон, или же уклониться, показывать на какое количество очков вылечился игрок и т.д.) </w:t>
+      </w:r>
+    </w:p>
+    <w:p>
+      <w:pPr>
+        <w:shd w:val="clear" w:color="auto" w:fill="343541"/>
+        <w:spacing w:after="100" w:line="240" w:lineRule="auto"/>
+        <w:rPr>
+          <w:rFonts w:ascii="Segoe UI" w:eastAsia="Times New Roman" w:hAnsi="Segoe UI" w:cs="Segoe UI"/>
+          <w:strike/>
+          <w:sz w:val="21"/>
+          <w:szCs w:val="21"/>
+          <w:lang w:eastAsia="ru-RU"/>
+        </w:rPr>
+      </w:pPr>
+      <w:r>
+        <w:rPr>
+          <w:rFonts w:ascii="Segoe UI" w:eastAsia="Times New Roman" w:hAnsi="Segoe UI" w:cs="Segoe UI"/>
+          <w:strike/>
+          <w:sz w:val="21"/>
+          <w:szCs w:val="21"/>
+          <w:lang w:eastAsia="ru-RU"/>
+        </w:rPr>
         <w:t xml:space="preserve">3 Полоска здоровья для мобов, их уровень. </w:t>
       </w:r>
     </w:p>
@@ -2291,6 +2309,7 @@
         <w:spacing w:after="100" w:line="240" w:lineRule="auto"/>
         <w:rPr>
           <w:rFonts w:ascii="Segoe UI" w:eastAsia="Times New Roman" w:hAnsi="Segoe UI" w:cs="Segoe UI"/>
+          <w:strike/>
           <w:sz w:val="21"/>
           <w:szCs w:val="21"/>
           <w:lang w:eastAsia="ru-RU"/>
@@ -2299,6 +2318,7 @@
       <w:r>
         <w:rPr>
           <w:rFonts w:ascii="Segoe UI" w:eastAsia="Times New Roman" w:hAnsi="Segoe UI" w:cs="Segoe UI"/>
+          <w:strike/>
           <w:sz w:val="21"/>
           <w:szCs w:val="21"/>
           <w:lang w:eastAsia="ru-RU"/>
@@ -2309,6 +2329,7 @@
       <w:r>
         <w:rPr>
           <w:rFonts w:ascii="Segoe UI" w:eastAsia="Times New Roman" w:hAnsi="Segoe UI" w:cs="Segoe UI"/>
+          <w:strike/>
           <w:sz w:val="21"/>
           <w:szCs w:val="21"/>
           <w:lang w:eastAsia="ru-RU"/>
@@ -2319,6 +2340,7 @@
       <w:r>
         <w:rPr>
           <w:rFonts w:ascii="Segoe UI" w:eastAsia="Times New Roman" w:hAnsi="Segoe UI" w:cs="Segoe UI"/>
+          <w:strike/>
           <w:sz w:val="21"/>
           <w:szCs w:val="21"/>
           <w:lang w:eastAsia="ru-RU"/>
@@ -2329,6 +2351,7 @@
       <w:r>
         <w:rPr>
           <w:rFonts w:ascii="Segoe UI" w:eastAsia="Times New Roman" w:hAnsi="Segoe UI" w:cs="Segoe UI"/>
+          <w:strike/>
           <w:sz w:val="21"/>
           <w:szCs w:val="21"/>
           <w:lang w:eastAsia="ru-RU"/>
@@ -2339,6 +2362,7 @@
       <w:r>
         <w:rPr>
           <w:rFonts w:ascii="Segoe UI" w:eastAsia="Times New Roman" w:hAnsi="Segoe UI" w:cs="Segoe UI"/>
+          <w:strike/>
           <w:sz w:val="21"/>
           <w:szCs w:val="21"/>
           <w:lang w:eastAsia="ru-RU"/>

</xml_diff>

<commit_message>
Add UI for SkillTree, Stats, Experience System.
</commit_message>
<xml_diff>
--- a/Итерации.docx
+++ b/Итерации.docx
@@ -2218,8 +2218,6 @@
         </w:rPr>
         <w:t xml:space="preserve"> когда сработал какой-то </w:t>
       </w:r>
-      <w:bookmarkStart w:id="0" w:name="_GoBack"/>
-      <w:bookmarkEnd w:id="0"/>
       <w:r>
         <w:rPr>
           <w:rFonts w:ascii="Segoe UI" w:eastAsia="Times New Roman" w:hAnsi="Segoe UI" w:cs="Segoe UI"/>
@@ -2376,14 +2374,17 @@
         <w:spacing w:after="100" w:line="240" w:lineRule="auto"/>
         <w:rPr>
           <w:rFonts w:ascii="Segoe UI" w:eastAsia="Times New Roman" w:hAnsi="Segoe UI" w:cs="Segoe UI"/>
+          <w:strike/>
           <w:sz w:val="21"/>
           <w:szCs w:val="21"/>
           <w:lang w:eastAsia="ru-RU"/>
         </w:rPr>
       </w:pPr>
+      <w:bookmarkStart w:id="0" w:name="_GoBack"/>
       <w:r>
         <w:rPr>
           <w:rFonts w:ascii="Segoe UI" w:eastAsia="Times New Roman" w:hAnsi="Segoe UI" w:cs="Segoe UI"/>
+          <w:strike/>
           <w:sz w:val="21"/>
           <w:szCs w:val="21"/>
           <w:lang w:eastAsia="ru-RU"/>
@@ -2391,6 +2392,7 @@
         <w:t>6 Внедрять прототип в игру.</w:t>
       </w:r>
     </w:p>
+    <w:bookmarkEnd w:id="0"/>
     <w:p>
       <w:pPr>
         <w:rPr>

</xml_diff>

<commit_message>
End update TradingSystemUI. Start update PlayerExperience game logic.
</commit_message>
<xml_diff>
--- a/Итерации.docx
+++ b/Итерации.docx
@@ -3048,13 +3048,15 @@
       <w:pPr>
         <w:rPr>
           <w:rFonts w:ascii="Segoe UI" w:hAnsi="Segoe UI" w:cs="Segoe UI"/>
-          <w:color w:val="ECECF1"/>
-          <w:shd w:val="clear" w:color="auto" w:fill="343541"/>
-        </w:rPr>
-      </w:pPr>
-      <w:r>
-        <w:rPr>
-          <w:rFonts w:ascii="Segoe UI" w:hAnsi="Segoe UI" w:cs="Segoe UI"/>
+          <w:strike/>
+          <w:color w:val="ECECF1"/>
+          <w:shd w:val="clear" w:color="auto" w:fill="343541"/>
+        </w:rPr>
+      </w:pPr>
+      <w:r>
+        <w:rPr>
+          <w:rFonts w:ascii="Segoe UI" w:hAnsi="Segoe UI" w:cs="Segoe UI"/>
+          <w:strike/>
           <w:color w:val="ECECF1"/>
           <w:shd w:val="clear" w:color="auto" w:fill="343541"/>
         </w:rPr>
@@ -3109,7 +3111,17 @@
           <w:color w:val="ECECF1"/>
           <w:shd w:val="clear" w:color="auto" w:fill="343541"/>
         </w:rPr>
-        <w:t>6 Реализовать локализацию для игры пока что только на русском и на английском. Для этого нужно расширить существующую систему локализации.</w:t>
+        <w:t>6 Реализовать локализацию для игры пока что только на русском и на английском. Для этого нужно расшир</w:t>
+      </w:r>
+      <w:bookmarkStart w:id="0" w:name="_GoBack"/>
+      <w:bookmarkEnd w:id="0"/>
+      <w:r>
+        <w:rPr>
+          <w:rFonts w:ascii="Segoe UI" w:hAnsi="Segoe UI" w:cs="Segoe UI"/>
+          <w:color w:val="ECECF1"/>
+          <w:shd w:val="clear" w:color="auto" w:fill="343541"/>
+        </w:rPr>
+        <w:t>ить существующую систему локализации.</w:t>
       </w:r>
     </w:p>
     <w:p>
@@ -3304,8 +3316,6 @@
         </w:rPr>
         <w:t>.</w:t>
       </w:r>
-      <w:bookmarkStart w:id="0" w:name="_GoBack"/>
-      <w:bookmarkEnd w:id="0"/>
     </w:p>
     <w:p>
       <w:pPr>

</xml_diff>

<commit_message>
End update PlayerExperience game logic. Start update PlayerExperienceUI.
</commit_message>
<xml_diff>
--- a/Итерации.docx
+++ b/Итерации.docx
@@ -35,27 +35,7 @@
           <w:color w:val="ECECF1"/>
           <w:shd w:val="clear" w:color="auto" w:fill="343541"/>
         </w:rPr>
-        <w:t xml:space="preserve">1 разобраться </w:t>
-      </w:r>
-      <w:proofErr w:type="gramStart"/>
-      <w:r>
-        <w:rPr>
-          <w:rFonts w:ascii="Segoe UI" w:hAnsi="Segoe UI" w:cs="Segoe UI"/>
-          <w:strike/>
-          <w:color w:val="ECECF1"/>
-          <w:shd w:val="clear" w:color="auto" w:fill="343541"/>
-        </w:rPr>
-        <w:t>из структурой</w:t>
-      </w:r>
-      <w:proofErr w:type="gramEnd"/>
-      <w:r>
-        <w:rPr>
-          <w:rFonts w:ascii="Segoe UI" w:hAnsi="Segoe UI" w:cs="Segoe UI"/>
-          <w:strike/>
-          <w:color w:val="ECECF1"/>
-          <w:shd w:val="clear" w:color="auto" w:fill="343541"/>
-        </w:rPr>
-        <w:t xml:space="preserve"> данных которая будет использоваться для сохранения данных игры. Структура должна быть организована на </w:t>
+        <w:t xml:space="preserve">1 разобраться из структурой данных которая будет использоваться для сохранения данных игры. Структура должна быть организована на </w:t>
       </w:r>
       <w:proofErr w:type="spellStart"/>
       <w:r>
@@ -126,25 +106,7 @@
           <w:color w:val="ECECF1"/>
           <w:shd w:val="clear" w:color="auto" w:fill="343541"/>
         </w:rPr>
-        <w:t xml:space="preserve">4 Продумать кто и каким образом будет собирать </w:t>
-      </w:r>
-      <w:proofErr w:type="gramStart"/>
-      <w:r>
-        <w:rPr>
-          <w:rFonts w:ascii="Segoe UI" w:hAnsi="Segoe UI" w:cs="Segoe UI"/>
-          <w:color w:val="ECECF1"/>
-          <w:shd w:val="clear" w:color="auto" w:fill="343541"/>
-        </w:rPr>
-        <w:t>компоненты</w:t>
-      </w:r>
-      <w:proofErr w:type="gramEnd"/>
-      <w:r>
-        <w:rPr>
-          <w:rFonts w:ascii="Segoe UI" w:hAnsi="Segoe UI" w:cs="Segoe UI"/>
-          <w:color w:val="ECECF1"/>
-          <w:shd w:val="clear" w:color="auto" w:fill="343541"/>
-        </w:rPr>
-        <w:t xml:space="preserve"> которые реализовывают интерфейсы для сохранения и/или загрузки данных. Возможно это должна быть фабрика. </w:t>
+        <w:t xml:space="preserve">4 Продумать кто и каким образом будет собирать компоненты которые реализовывают интерфейсы для сохранения и/или загрузки данных. Возможно это должна быть фабрика. </w:t>
       </w:r>
     </w:p>
     <w:p>
@@ -387,27 +349,7 @@
           <w:color w:val="ECECF1"/>
           <w:shd w:val="clear" w:color="auto" w:fill="343541"/>
         </w:rPr>
-        <w:t xml:space="preserve">4 Продумать кто и каким образом будет собирать </w:t>
-      </w:r>
-      <w:proofErr w:type="gramStart"/>
-      <w:r>
-        <w:rPr>
-          <w:rFonts w:ascii="Segoe UI" w:hAnsi="Segoe UI" w:cs="Segoe UI"/>
-          <w:strike/>
-          <w:color w:val="ECECF1"/>
-          <w:shd w:val="clear" w:color="auto" w:fill="343541"/>
-        </w:rPr>
-        <w:t>компоненты</w:t>
-      </w:r>
-      <w:proofErr w:type="gramEnd"/>
-      <w:r>
-        <w:rPr>
-          <w:rFonts w:ascii="Segoe UI" w:hAnsi="Segoe UI" w:cs="Segoe UI"/>
-          <w:strike/>
-          <w:color w:val="ECECF1"/>
-          <w:shd w:val="clear" w:color="auto" w:fill="343541"/>
-        </w:rPr>
-        <w:t xml:space="preserve"> которые реализовывают интерфейсы для сохранения и/или загрузки данных. Возможно это должна быть фабрика.</w:t>
+        <w:t>4 Продумать кто и каким образом будет собирать компоненты которые реализовывают интерфейсы для сохранения и/или загрузки данных. Возможно это должна быть фабрика.</w:t>
       </w:r>
     </w:p>
     <w:p>
@@ -525,27 +467,7 @@
           <w:color w:val="ECECF1"/>
           <w:shd w:val="clear" w:color="auto" w:fill="343541"/>
         </w:rPr>
-        <w:t xml:space="preserve">3 Написать поведение </w:t>
-      </w:r>
-      <w:proofErr w:type="gramStart"/>
-      <w:r>
-        <w:rPr>
-          <w:rFonts w:ascii="Segoe UI" w:hAnsi="Segoe UI" w:cs="Segoe UI"/>
-          <w:strike/>
-          <w:color w:val="ECECF1"/>
-          <w:shd w:val="clear" w:color="auto" w:fill="343541"/>
-        </w:rPr>
-        <w:t>для врагов</w:t>
-      </w:r>
-      <w:proofErr w:type="gramEnd"/>
-      <w:r>
-        <w:rPr>
-          <w:rFonts w:ascii="Segoe UI" w:hAnsi="Segoe UI" w:cs="Segoe UI"/>
-          <w:strike/>
-          <w:color w:val="ECECF1"/>
-          <w:shd w:val="clear" w:color="auto" w:fill="343541"/>
-        </w:rPr>
-        <w:t xml:space="preserve"> которые включают сл</w:t>
+        <w:t>3 Написать поведение для врагов которые включают сл</w:t>
       </w:r>
       <w:r>
         <w:rPr>
@@ -590,27 +512,7 @@
           <w:color w:val="ECECF1"/>
           <w:shd w:val="clear" w:color="auto" w:fill="343541"/>
         </w:rPr>
-        <w:t xml:space="preserve">5 Создать </w:t>
-      </w:r>
-      <w:proofErr w:type="gramStart"/>
-      <w:r>
-        <w:rPr>
-          <w:rFonts w:ascii="Segoe UI" w:hAnsi="Segoe UI" w:cs="Segoe UI"/>
-          <w:strike/>
-          <w:color w:val="ECECF1"/>
-          <w:shd w:val="clear" w:color="auto" w:fill="343541"/>
-        </w:rPr>
-        <w:t>телепорт</w:t>
-      </w:r>
-      <w:proofErr w:type="gramEnd"/>
-      <w:r>
-        <w:rPr>
-          <w:rFonts w:ascii="Segoe UI" w:hAnsi="Segoe UI" w:cs="Segoe UI"/>
-          <w:strike/>
-          <w:color w:val="ECECF1"/>
-          <w:shd w:val="clear" w:color="auto" w:fill="343541"/>
-        </w:rPr>
-        <w:t xml:space="preserve"> который будет пересылать игро</w:t>
+        <w:t>5 Создать телепорт который будет пересылать игро</w:t>
       </w:r>
       <w:r>
         <w:rPr>
@@ -784,27 +686,7 @@
           <w:color w:val="ECECF1"/>
           <w:shd w:val="clear" w:color="auto" w:fill="343541"/>
         </w:rPr>
-        <w:t xml:space="preserve"> уже имеются </w:t>
-      </w:r>
-      <w:proofErr w:type="gramStart"/>
-      <w:r>
-        <w:rPr>
-          <w:rFonts w:ascii="Segoe UI" w:hAnsi="Segoe UI" w:cs="Segoe UI"/>
-          <w:strike/>
-          <w:color w:val="ECECF1"/>
-          <w:shd w:val="clear" w:color="auto" w:fill="343541"/>
-        </w:rPr>
-        <w:t>управляющие компоненты</w:t>
-      </w:r>
-      <w:proofErr w:type="gramEnd"/>
-      <w:r>
-        <w:rPr>
-          <w:rFonts w:ascii="Segoe UI" w:hAnsi="Segoe UI" w:cs="Segoe UI"/>
-          <w:strike/>
-          <w:color w:val="ECECF1"/>
-          <w:shd w:val="clear" w:color="auto" w:fill="343541"/>
-        </w:rPr>
-        <w:t xml:space="preserve"> которые позволяют ии и игроку управлять атакой нужна только логика боевой системы. </w:t>
+        <w:t xml:space="preserve"> уже имеются управляющие компоненты которые позволяют ии и игроку управлять атакой нужна только логика боевой системы. </w:t>
       </w:r>
     </w:p>
     <w:p>
@@ -1034,86 +916,26 @@
           <w:color w:val="ECECF1"/>
           <w:shd w:val="clear" w:color="auto" w:fill="343541"/>
         </w:rPr>
-        <w:t xml:space="preserve"> инвентаря, это нужно сделать чтобы список предметов, а точнее хилок и их количество сохранялось в </w:t>
-      </w:r>
-      <w:proofErr w:type="gramStart"/>
-      <w:r>
-        <w:rPr>
-          <w:rFonts w:ascii="Segoe UI" w:hAnsi="Segoe UI" w:cs="Segoe UI"/>
-          <w:strike/>
-          <w:color w:val="ECECF1"/>
-          <w:shd w:val="clear" w:color="auto" w:fill="343541"/>
-        </w:rPr>
-        <w:t>память</w:t>
-      </w:r>
-      <w:proofErr w:type="gramEnd"/>
-      <w:r>
-        <w:rPr>
-          <w:rFonts w:ascii="Segoe UI" w:hAnsi="Segoe UI" w:cs="Segoe UI"/>
-          <w:strike/>
-          <w:color w:val="ECECF1"/>
-          <w:shd w:val="clear" w:color="auto" w:fill="343541"/>
-        </w:rPr>
-        <w:t xml:space="preserve"> и чтобы его можно было загрузить при продолжении игры </w:t>
-      </w:r>
-    </w:p>
-    <w:p>
-      <w:pPr>
-        <w:rPr>
-          <w:rFonts w:ascii="Segoe UI" w:hAnsi="Segoe UI" w:cs="Segoe UI"/>
-          <w:strike/>
-          <w:color w:val="ECECF1"/>
-          <w:shd w:val="clear" w:color="auto" w:fill="343541"/>
-        </w:rPr>
-      </w:pPr>
-      <w:r>
-        <w:rPr>
-          <w:rFonts w:ascii="Segoe UI" w:hAnsi="Segoe UI" w:cs="Segoe UI"/>
-          <w:strike/>
-          <w:color w:val="ECECF1"/>
-          <w:shd w:val="clear" w:color="auto" w:fill="343541"/>
-        </w:rPr>
-        <w:t xml:space="preserve">2 искать </w:t>
-      </w:r>
-      <w:proofErr w:type="gramStart"/>
-      <w:r>
-        <w:rPr>
-          <w:rFonts w:ascii="Segoe UI" w:hAnsi="Segoe UI" w:cs="Segoe UI"/>
-          <w:strike/>
-          <w:color w:val="ECECF1"/>
-          <w:shd w:val="clear" w:color="auto" w:fill="343541"/>
-        </w:rPr>
-        <w:t>визуальные эффекты</w:t>
-      </w:r>
-      <w:proofErr w:type="gramEnd"/>
-      <w:r>
-        <w:rPr>
-          <w:rFonts w:ascii="Segoe UI" w:hAnsi="Segoe UI" w:cs="Segoe UI"/>
-          <w:strike/>
-          <w:color w:val="ECECF1"/>
-          <w:shd w:val="clear" w:color="auto" w:fill="343541"/>
-        </w:rPr>
-        <w:t xml:space="preserve"> которые отображают смерть игрока и нпс. Также нужно поискать </w:t>
-      </w:r>
-      <w:proofErr w:type="gramStart"/>
-      <w:r>
-        <w:rPr>
-          <w:rFonts w:ascii="Segoe UI" w:hAnsi="Segoe UI" w:cs="Segoe UI"/>
-          <w:strike/>
-          <w:color w:val="ECECF1"/>
-          <w:shd w:val="clear" w:color="auto" w:fill="343541"/>
-        </w:rPr>
-        <w:t>картинки</w:t>
-      </w:r>
-      <w:proofErr w:type="gramEnd"/>
-      <w:r>
-        <w:rPr>
-          <w:rFonts w:ascii="Segoe UI" w:hAnsi="Segoe UI" w:cs="Segoe UI"/>
-          <w:strike/>
-          <w:color w:val="ECECF1"/>
-          <w:shd w:val="clear" w:color="auto" w:fill="343541"/>
-        </w:rPr>
-        <w:t xml:space="preserve"> которые буду использовать в GUI для хилок и для полоски здоровья </w:t>
+        <w:t xml:space="preserve"> инвентаря, это нужно сделать чтобы список предметов, а точнее хилок и их количество сохранялось в память и чтобы его можно было загрузить при продолжении игры </w:t>
+      </w:r>
+    </w:p>
+    <w:p>
+      <w:pPr>
+        <w:rPr>
+          <w:rFonts w:ascii="Segoe UI" w:hAnsi="Segoe UI" w:cs="Segoe UI"/>
+          <w:strike/>
+          <w:color w:val="ECECF1"/>
+          <w:shd w:val="clear" w:color="auto" w:fill="343541"/>
+        </w:rPr>
+      </w:pPr>
+      <w:r>
+        <w:rPr>
+          <w:rFonts w:ascii="Segoe UI" w:hAnsi="Segoe UI" w:cs="Segoe UI"/>
+          <w:strike/>
+          <w:color w:val="ECECF1"/>
+          <w:shd w:val="clear" w:color="auto" w:fill="343541"/>
+        </w:rPr>
+        <w:t xml:space="preserve">2 искать визуальные эффекты которые отображают смерть игрока и нпс. Также нужно поискать картинки которые буду использовать в GUI для хилок и для полоски здоровья </w:t>
       </w:r>
     </w:p>
     <w:p>
@@ -1168,27 +990,7 @@
           <w:color w:val="ECECF1"/>
           <w:shd w:val="clear" w:color="auto" w:fill="343541"/>
         </w:rPr>
-        <w:t xml:space="preserve">5 Работа со светом. Просмотреть разные варианты. Но нужно </w:t>
-      </w:r>
-      <w:proofErr w:type="gramStart"/>
-      <w:r>
-        <w:rPr>
-          <w:rFonts w:ascii="Segoe UI" w:hAnsi="Segoe UI" w:cs="Segoe UI"/>
-          <w:strike/>
-          <w:color w:val="ECECF1"/>
-          <w:shd w:val="clear" w:color="auto" w:fill="343541"/>
-        </w:rPr>
-        <w:t>помнить</w:t>
-      </w:r>
-      <w:proofErr w:type="gramEnd"/>
-      <w:r>
-        <w:rPr>
-          <w:rFonts w:ascii="Segoe UI" w:hAnsi="Segoe UI" w:cs="Segoe UI"/>
-          <w:strike/>
-          <w:color w:val="ECECF1"/>
-          <w:shd w:val="clear" w:color="auto" w:fill="343541"/>
-        </w:rPr>
-        <w:t xml:space="preserve"> что </w:t>
+        <w:t xml:space="preserve">5 Работа со светом. Просмотреть разные варианты. Но нужно помнить что </w:t>
       </w:r>
       <w:proofErr w:type="spellStart"/>
       <w:r>
@@ -1304,27 +1106,7 @@
           <w:color w:val="ECECF1"/>
           <w:shd w:val="clear" w:color="auto" w:fill="343541"/>
         </w:rPr>
-        <w:t xml:space="preserve">8 Пересмотреть скрипты и </w:t>
-      </w:r>
-      <w:proofErr w:type="gramStart"/>
-      <w:r>
-        <w:rPr>
-          <w:rFonts w:ascii="Segoe UI" w:hAnsi="Segoe UI" w:cs="Segoe UI"/>
-          <w:strike/>
-          <w:color w:val="ECECF1"/>
-          <w:shd w:val="clear" w:color="auto" w:fill="343541"/>
-        </w:rPr>
-        <w:t>те</w:t>
-      </w:r>
-      <w:proofErr w:type="gramEnd"/>
-      <w:r>
-        <w:rPr>
-          <w:rFonts w:ascii="Segoe UI" w:hAnsi="Segoe UI" w:cs="Segoe UI"/>
-          <w:strike/>
-          <w:color w:val="ECECF1"/>
-          <w:shd w:val="clear" w:color="auto" w:fill="343541"/>
-        </w:rPr>
-        <w:t xml:space="preserve"> которые не используют статик дату, перевести на использование статик даты, а именно это относиться к </w:t>
+        <w:t xml:space="preserve">8 Пересмотреть скрипты и те которые не используют статик дату, перевести на использование статик даты, а именно это относиться к </w:t>
       </w:r>
       <w:proofErr w:type="spellStart"/>
       <w:r>
@@ -1441,25 +1223,7 @@
           <w:color w:val="ECECF1"/>
           <w:shd w:val="clear" w:color="auto" w:fill="343541"/>
         </w:rPr>
-        <w:t xml:space="preserve">Второй и третий пункт хоть и выглядят достаточно </w:t>
-      </w:r>
-      <w:proofErr w:type="gramStart"/>
-      <w:r>
-        <w:rPr>
-          <w:rFonts w:ascii="Segoe UI" w:hAnsi="Segoe UI" w:cs="Segoe UI"/>
-          <w:color w:val="ECECF1"/>
-          <w:shd w:val="clear" w:color="auto" w:fill="343541"/>
-        </w:rPr>
-        <w:t>просто</w:t>
-      </w:r>
-      <w:proofErr w:type="gramEnd"/>
-      <w:r>
-        <w:rPr>
-          <w:rFonts w:ascii="Segoe UI" w:hAnsi="Segoe UI" w:cs="Segoe UI"/>
-          <w:color w:val="ECECF1"/>
-          <w:shd w:val="clear" w:color="auto" w:fill="343541"/>
-        </w:rPr>
-        <w:t xml:space="preserve"> но на самом деле именно эти два пункта содержат колоссальную работу над проектом.</w:t>
+        <w:t>Второй и третий пункт хоть и выглядят достаточно просто но на самом деле именно эти два пункта содержат колоссальную работу над проектом.</w:t>
       </w:r>
     </w:p>
     <w:p>
@@ -1603,27 +1367,7 @@
           <w:color w:val="ECECF1"/>
           <w:shd w:val="clear" w:color="auto" w:fill="343541"/>
         </w:rPr>
-        <w:t xml:space="preserve">5 Начать погружаться в квестовую систему. Это достаточно крупный шаг и </w:t>
-      </w:r>
-      <w:proofErr w:type="gramStart"/>
-      <w:r>
-        <w:rPr>
-          <w:rFonts w:ascii="Segoe UI" w:hAnsi="Segoe UI" w:cs="Segoe UI"/>
-          <w:strike/>
-          <w:color w:val="ECECF1"/>
-          <w:shd w:val="clear" w:color="auto" w:fill="343541"/>
-        </w:rPr>
-        <w:t>по этому</w:t>
-      </w:r>
-      <w:proofErr w:type="gramEnd"/>
-      <w:r>
-        <w:rPr>
-          <w:rFonts w:ascii="Segoe UI" w:hAnsi="Segoe UI" w:cs="Segoe UI"/>
-          <w:strike/>
-          <w:color w:val="ECECF1"/>
-          <w:shd w:val="clear" w:color="auto" w:fill="343541"/>
-        </w:rPr>
-        <w:t xml:space="preserve"> он займет больше всего времени, хотя и на первый взгляд все написано просто.</w:t>
+        <w:t>5 Начать погружаться в квестовую систему. Это достаточно крупный шаг и по этому он займет больше всего времени, хотя и на первый взгляд все написано просто.</w:t>
       </w:r>
     </w:p>
     <w:p>
@@ -1766,25 +1510,7 @@
           <w:color w:val="ECECF1"/>
           <w:shd w:val="clear" w:color="auto" w:fill="343541"/>
         </w:rPr>
-        <w:t xml:space="preserve">2а </w:t>
-      </w:r>
-      <w:proofErr w:type="gramStart"/>
-      <w:r>
-        <w:rPr>
-          <w:rFonts w:ascii="Segoe UI" w:hAnsi="Segoe UI" w:cs="Segoe UI"/>
-          <w:color w:val="ECECF1"/>
-          <w:shd w:val="clear" w:color="auto" w:fill="343541"/>
-        </w:rPr>
-        <w:t>Завершить</w:t>
-      </w:r>
-      <w:proofErr w:type="gramEnd"/>
-      <w:r>
-        <w:rPr>
-          <w:rFonts w:ascii="Segoe UI" w:hAnsi="Segoe UI" w:cs="Segoe UI"/>
-          <w:color w:val="ECECF1"/>
-          <w:shd w:val="clear" w:color="auto" w:fill="343541"/>
-        </w:rPr>
-        <w:t xml:space="preserve"> прототип, получив работоспособную квестовую систему. </w:t>
+        <w:t xml:space="preserve">2а Завершить прототип, получив работоспособную квестовую систему. </w:t>
       </w:r>
     </w:p>
     <w:p>
@@ -1802,25 +1528,7 @@
           <w:color w:val="ECECF1"/>
           <w:shd w:val="clear" w:color="auto" w:fill="343541"/>
         </w:rPr>
-        <w:t xml:space="preserve">2б </w:t>
-      </w:r>
-      <w:proofErr w:type="gramStart"/>
-      <w:r>
-        <w:rPr>
-          <w:rFonts w:ascii="Segoe UI" w:hAnsi="Segoe UI" w:cs="Segoe UI"/>
-          <w:color w:val="ECECF1"/>
-          <w:shd w:val="clear" w:color="auto" w:fill="343541"/>
-        </w:rPr>
-        <w:t>Контролировать</w:t>
-      </w:r>
-      <w:proofErr w:type="gramEnd"/>
-      <w:r>
-        <w:rPr>
-          <w:rFonts w:ascii="Segoe UI" w:hAnsi="Segoe UI" w:cs="Segoe UI"/>
-          <w:color w:val="ECECF1"/>
-          <w:shd w:val="clear" w:color="auto" w:fill="343541"/>
-        </w:rPr>
-        <w:t xml:space="preserve"> состояние архитектуры при разработке доработке прототипа </w:t>
+        <w:t xml:space="preserve">2б Контролировать состояние архитектуры при разработке доработке прототипа </w:t>
       </w:r>
       <w:proofErr w:type="spellStart"/>
       <w:r>
@@ -1906,25 +1614,7 @@
           <w:color w:val="ECECF1"/>
           <w:shd w:val="clear" w:color="auto" w:fill="343541"/>
         </w:rPr>
-        <w:t xml:space="preserve">6 Готовиться к реализации системы торговли. </w:t>
-      </w:r>
-      <w:proofErr w:type="gramStart"/>
-      <w:r>
-        <w:rPr>
-          <w:rFonts w:ascii="Segoe UI" w:hAnsi="Segoe UI" w:cs="Segoe UI"/>
-          <w:color w:val="ECECF1"/>
-          <w:shd w:val="clear" w:color="auto" w:fill="343541"/>
-        </w:rPr>
-        <w:t>Также</w:t>
-      </w:r>
-      <w:proofErr w:type="gramEnd"/>
-      <w:r>
-        <w:rPr>
-          <w:rFonts w:ascii="Segoe UI" w:hAnsi="Segoe UI" w:cs="Segoe UI"/>
-          <w:color w:val="ECECF1"/>
-          <w:shd w:val="clear" w:color="auto" w:fill="343541"/>
-        </w:rPr>
-        <w:t xml:space="preserve"> как и второй этап достаточно длительный.</w:t>
+        <w:t>6 Готовиться к реализации системы торговли. Также как и второй этап достаточно длительный.</w:t>
       </w:r>
     </w:p>
     <w:p>
@@ -2025,25 +1715,7 @@
           <w:color w:val="ECECF1"/>
           <w:shd w:val="clear" w:color="auto" w:fill="343541"/>
         </w:rPr>
-        <w:t xml:space="preserve">4 Готовится </w:t>
-      </w:r>
-      <w:proofErr w:type="gramStart"/>
-      <w:r>
-        <w:rPr>
-          <w:rFonts w:ascii="Segoe UI" w:hAnsi="Segoe UI" w:cs="Segoe UI"/>
-          <w:color w:val="ECECF1"/>
-          <w:shd w:val="clear" w:color="auto" w:fill="343541"/>
-        </w:rPr>
-        <w:t>к разработки</w:t>
-      </w:r>
-      <w:proofErr w:type="gramEnd"/>
-      <w:r>
-        <w:rPr>
-          <w:rFonts w:ascii="Segoe UI" w:hAnsi="Segoe UI" w:cs="Segoe UI"/>
-          <w:color w:val="ECECF1"/>
-          <w:shd w:val="clear" w:color="auto" w:fill="343541"/>
-        </w:rPr>
-        <w:t xml:space="preserve"> системы торговли.</w:t>
+        <w:t>4 Готовится к разработки системы торговли.</w:t>
       </w:r>
     </w:p>
     <w:p>
@@ -2107,27 +1779,7 @@
           <w:color w:val="ECECF1"/>
           <w:shd w:val="clear" w:color="auto" w:fill="343541"/>
         </w:rPr>
-        <w:t xml:space="preserve">2 Нужно решить </w:t>
-      </w:r>
-      <w:proofErr w:type="gramStart"/>
-      <w:r>
-        <w:rPr>
-          <w:rFonts w:ascii="Segoe UI" w:hAnsi="Segoe UI" w:cs="Segoe UI"/>
-          <w:strike/>
-          <w:color w:val="ECECF1"/>
-          <w:shd w:val="clear" w:color="auto" w:fill="343541"/>
-        </w:rPr>
-        <w:t>проблему</w:t>
-      </w:r>
-      <w:proofErr w:type="gramEnd"/>
-      <w:r>
-        <w:rPr>
-          <w:rFonts w:ascii="Segoe UI" w:hAnsi="Segoe UI" w:cs="Segoe UI"/>
-          <w:strike/>
-          <w:color w:val="ECECF1"/>
-          <w:shd w:val="clear" w:color="auto" w:fill="343541"/>
-        </w:rPr>
-        <w:t xml:space="preserve"> связанную с отображением окна квест </w:t>
+        <w:t xml:space="preserve">2 Нужно решить проблему связанную с отображением окна квест </w:t>
       </w:r>
       <w:proofErr w:type="spellStart"/>
       <w:r>
@@ -2843,25 +2495,7 @@
           <w:color w:val="ECECF1"/>
           <w:shd w:val="clear" w:color="auto" w:fill="343541"/>
         </w:rPr>
-        <w:t xml:space="preserve">2 Создать </w:t>
-      </w:r>
-      <w:proofErr w:type="gramStart"/>
-      <w:r>
-        <w:rPr>
-          <w:rFonts w:ascii="Segoe UI" w:hAnsi="Segoe UI" w:cs="Segoe UI"/>
-          <w:color w:val="ECECF1"/>
-          <w:shd w:val="clear" w:color="auto" w:fill="343541"/>
-        </w:rPr>
-        <w:t>компонент</w:t>
-      </w:r>
-      <w:proofErr w:type="gramEnd"/>
-      <w:r>
-        <w:rPr>
-          <w:rFonts w:ascii="Segoe UI" w:hAnsi="Segoe UI" w:cs="Segoe UI"/>
-          <w:color w:val="ECECF1"/>
-          <w:shd w:val="clear" w:color="auto" w:fill="343541"/>
-        </w:rPr>
-        <w:t xml:space="preserve"> который расширит возможности для системы взаимодействия, и позволит игроку делать выбор какой именно тип взаимодействия желает получить игрок если таких типов взаимодействия </w:t>
+        <w:t xml:space="preserve">2 Создать компонент который расширит возможности для системы взаимодействия, и позволит игроку делать выбор какой именно тип взаимодействия желает получить игрок если таких типов взаимодействия </w:t>
       </w:r>
       <w:proofErr w:type="spellStart"/>
       <w:r>
@@ -3002,27 +2636,7 @@
           <w:color w:val="ECECF1"/>
           <w:shd w:val="clear" w:color="auto" w:fill="343541"/>
         </w:rPr>
-        <w:t xml:space="preserve">1 Добавить </w:t>
-      </w:r>
-      <w:proofErr w:type="gramStart"/>
-      <w:r>
-        <w:rPr>
-          <w:rFonts w:ascii="Segoe UI" w:hAnsi="Segoe UI" w:cs="Segoe UI"/>
-          <w:strike/>
-          <w:color w:val="ECECF1"/>
-          <w:shd w:val="clear" w:color="auto" w:fill="343541"/>
-        </w:rPr>
-        <w:t>функционал</w:t>
-      </w:r>
-      <w:proofErr w:type="gramEnd"/>
-      <w:r>
-        <w:rPr>
-          <w:rFonts w:ascii="Segoe UI" w:hAnsi="Segoe UI" w:cs="Segoe UI"/>
-          <w:strike/>
-          <w:color w:val="ECECF1"/>
-          <w:shd w:val="clear" w:color="auto" w:fill="343541"/>
-        </w:rPr>
-        <w:t xml:space="preserve"> который будет сохранять текущее количество денег игрока в файл сохранения.</w:t>
+        <w:t>1 Добавить функционал который будет сохранять текущее количество денег игрока в файл сохранения.</w:t>
       </w:r>
     </w:p>
     <w:p>
@@ -3060,68 +2674,71 @@
           <w:color w:val="ECECF1"/>
           <w:shd w:val="clear" w:color="auto" w:fill="343541"/>
         </w:rPr>
-        <w:t>3 Обновить интерфейс для системы торговли.</w:t>
-      </w:r>
-    </w:p>
-    <w:p>
-      <w:pPr>
-        <w:rPr>
-          <w:rFonts w:ascii="Segoe UI" w:hAnsi="Segoe UI" w:cs="Segoe UI"/>
-          <w:color w:val="ECECF1"/>
-          <w:shd w:val="clear" w:color="auto" w:fill="343541"/>
-        </w:rPr>
-      </w:pPr>
-      <w:r>
-        <w:rPr>
-          <w:rFonts w:ascii="Segoe UI" w:hAnsi="Segoe UI" w:cs="Segoe UI"/>
-          <w:color w:val="ECECF1"/>
-          <w:shd w:val="clear" w:color="auto" w:fill="343541"/>
-        </w:rPr>
-        <w:t>4 Усовершенствовать систему получения опыта. Нужно чтобы при убийстве мобов игроку начислялся опыт в соответствии с их уровнем.</w:t>
-      </w:r>
-    </w:p>
-    <w:p>
-      <w:pPr>
-        <w:rPr>
-          <w:rFonts w:ascii="Segoe UI" w:hAnsi="Segoe UI" w:cs="Segoe UI"/>
-          <w:color w:val="ECECF1"/>
-          <w:shd w:val="clear" w:color="auto" w:fill="343541"/>
-        </w:rPr>
-      </w:pPr>
-      <w:r>
-        <w:rPr>
-          <w:rFonts w:ascii="Segoe UI" w:hAnsi="Segoe UI" w:cs="Segoe UI"/>
-          <w:color w:val="ECECF1"/>
-          <w:shd w:val="clear" w:color="auto" w:fill="343541"/>
-        </w:rPr>
-        <w:t>5 Расширить систему опыта игрока. Нужно дать возможность игроку просматривать информацию о его текущем уровне и опыте, а также сколько необходимо опыта к следующему уровне.</w:t>
-      </w:r>
-    </w:p>
-    <w:p>
-      <w:pPr>
-        <w:rPr>
-          <w:rFonts w:ascii="Segoe UI" w:hAnsi="Segoe UI" w:cs="Segoe UI"/>
-          <w:color w:val="ECECF1"/>
-          <w:shd w:val="clear" w:color="auto" w:fill="343541"/>
-        </w:rPr>
-      </w:pPr>
-      <w:r>
-        <w:rPr>
-          <w:rFonts w:ascii="Segoe UI" w:hAnsi="Segoe UI" w:cs="Segoe UI"/>
-          <w:color w:val="ECECF1"/>
-          <w:shd w:val="clear" w:color="auto" w:fill="343541"/>
-        </w:rPr>
-        <w:t>6 Реализовать локализацию для игры пока что только на русском и на английском. Для этого нужно расшир</w:t>
+        <w:t>3 Обновить интерфейс для системы торговли</w:t>
       </w:r>
       <w:bookmarkStart w:id="0" w:name="_GoBack"/>
       <w:bookmarkEnd w:id="0"/>
       <w:r>
         <w:rPr>
           <w:rFonts w:ascii="Segoe UI" w:hAnsi="Segoe UI" w:cs="Segoe UI"/>
-          <w:color w:val="ECECF1"/>
-          <w:shd w:val="clear" w:color="auto" w:fill="343541"/>
-        </w:rPr>
-        <w:t>ить существующую систему локализации.</w:t>
+          <w:strike/>
+          <w:color w:val="ECECF1"/>
+          <w:shd w:val="clear" w:color="auto" w:fill="343541"/>
+        </w:rPr>
+        <w:t>.</w:t>
+      </w:r>
+    </w:p>
+    <w:p>
+      <w:pPr>
+        <w:rPr>
+          <w:rFonts w:ascii="Segoe UI" w:hAnsi="Segoe UI" w:cs="Segoe UI"/>
+          <w:strike/>
+          <w:color w:val="ECECF1"/>
+          <w:shd w:val="clear" w:color="auto" w:fill="343541"/>
+        </w:rPr>
+      </w:pPr>
+      <w:r>
+        <w:rPr>
+          <w:rFonts w:ascii="Segoe UI" w:hAnsi="Segoe UI" w:cs="Segoe UI"/>
+          <w:strike/>
+          <w:color w:val="ECECF1"/>
+          <w:shd w:val="clear" w:color="auto" w:fill="343541"/>
+        </w:rPr>
+        <w:t>4 Усовершенствовать систему получения опыта. Нужно чтобы при убийстве мобов игроку начислялся опыт в соответствии с их уровнем.</w:t>
+      </w:r>
+    </w:p>
+    <w:p>
+      <w:pPr>
+        <w:rPr>
+          <w:rFonts w:ascii="Segoe UI" w:hAnsi="Segoe UI" w:cs="Segoe UI"/>
+          <w:color w:val="ECECF1"/>
+          <w:shd w:val="clear" w:color="auto" w:fill="343541"/>
+        </w:rPr>
+      </w:pPr>
+      <w:r>
+        <w:rPr>
+          <w:rFonts w:ascii="Segoe UI" w:hAnsi="Segoe UI" w:cs="Segoe UI"/>
+          <w:color w:val="ECECF1"/>
+          <w:shd w:val="clear" w:color="auto" w:fill="343541"/>
+        </w:rPr>
+        <w:t>5 Расширить систему опыта игрока. Нужно дать возможность игроку просматривать информацию о его текущем уровне и опыте, а также сколько необходимо опыта к следующему уровне.</w:t>
+      </w:r>
+    </w:p>
+    <w:p>
+      <w:pPr>
+        <w:rPr>
+          <w:rFonts w:ascii="Segoe UI" w:hAnsi="Segoe UI" w:cs="Segoe UI"/>
+          <w:color w:val="ECECF1"/>
+          <w:shd w:val="clear" w:color="auto" w:fill="343541"/>
+        </w:rPr>
+      </w:pPr>
+      <w:r>
+        <w:rPr>
+          <w:rFonts w:ascii="Segoe UI" w:hAnsi="Segoe UI" w:cs="Segoe UI"/>
+          <w:color w:val="ECECF1"/>
+          <w:shd w:val="clear" w:color="auto" w:fill="343541"/>
+        </w:rPr>
+        <w:t>6 Реализовать локализацию для игры пока что только на русском и на английском. Для этого нужно расширить существующую систему локализации.</w:t>
       </w:r>
     </w:p>
     <w:p>
@@ -3139,60 +2756,24 @@
           <w:shd w:val="clear" w:color="auto" w:fill="343541"/>
         </w:rPr>
         <w:lastRenderedPageBreak/>
-        <w:t xml:space="preserve">7 Натянуть анимации </w:t>
-      </w:r>
-      <w:proofErr w:type="gramStart"/>
-      <w:r>
-        <w:rPr>
-          <w:rFonts w:ascii="Segoe UI" w:hAnsi="Segoe UI" w:cs="Segoe UI"/>
-          <w:color w:val="ECECF1"/>
-          <w:shd w:val="clear" w:color="auto" w:fill="343541"/>
-        </w:rPr>
-        <w:t>на мобов</w:t>
-      </w:r>
-      <w:proofErr w:type="gramEnd"/>
-      <w:r>
-        <w:rPr>
-          <w:rFonts w:ascii="Segoe UI" w:hAnsi="Segoe UI" w:cs="Segoe UI"/>
-          <w:color w:val="ECECF1"/>
-          <w:shd w:val="clear" w:color="auto" w:fill="343541"/>
-        </w:rPr>
-        <w:t>.</w:t>
-      </w:r>
-    </w:p>
-    <w:p>
-      <w:pPr>
-        <w:rPr>
-          <w:rFonts w:ascii="Segoe UI" w:hAnsi="Segoe UI" w:cs="Segoe UI"/>
-          <w:color w:val="ECECF1"/>
-          <w:shd w:val="clear" w:color="auto" w:fill="343541"/>
-        </w:rPr>
-      </w:pPr>
-      <w:r>
-        <w:rPr>
-          <w:rFonts w:ascii="Segoe UI" w:hAnsi="Segoe UI" w:cs="Segoe UI"/>
-          <w:color w:val="ECECF1"/>
-          <w:shd w:val="clear" w:color="auto" w:fill="343541"/>
-        </w:rPr>
-        <w:t xml:space="preserve">8 </w:t>
-      </w:r>
-      <w:proofErr w:type="gramStart"/>
-      <w:r>
-        <w:rPr>
-          <w:rFonts w:ascii="Segoe UI" w:hAnsi="Segoe UI" w:cs="Segoe UI"/>
-          <w:color w:val="ECECF1"/>
-          <w:shd w:val="clear" w:color="auto" w:fill="343541"/>
-        </w:rPr>
-        <w:t>Думать</w:t>
-      </w:r>
-      <w:proofErr w:type="gramEnd"/>
-      <w:r>
-        <w:rPr>
-          <w:rFonts w:ascii="Segoe UI" w:hAnsi="Segoe UI" w:cs="Segoe UI"/>
-          <w:color w:val="ECECF1"/>
-          <w:shd w:val="clear" w:color="auto" w:fill="343541"/>
-        </w:rPr>
-        <w:t xml:space="preserve"> как можно организовать рандомную генерацию мира, и начать работу над прототипом </w:t>
+        <w:t>7 Натянуть анимации на мобов.</w:t>
+      </w:r>
+    </w:p>
+    <w:p>
+      <w:pPr>
+        <w:rPr>
+          <w:rFonts w:ascii="Segoe UI" w:hAnsi="Segoe UI" w:cs="Segoe UI"/>
+          <w:color w:val="ECECF1"/>
+          <w:shd w:val="clear" w:color="auto" w:fill="343541"/>
+        </w:rPr>
+      </w:pPr>
+      <w:r>
+        <w:rPr>
+          <w:rFonts w:ascii="Segoe UI" w:hAnsi="Segoe UI" w:cs="Segoe UI"/>
+          <w:color w:val="ECECF1"/>
+          <w:shd w:val="clear" w:color="auto" w:fill="343541"/>
+        </w:rPr>
+        <w:t xml:space="preserve">8 Думать как можно организовать рандомную генерацию мира, и начать работу над прототипом </w:t>
       </w:r>
       <w:proofErr w:type="spellStart"/>
       <w:r>
@@ -3254,25 +2835,7 @@
           <w:color w:val="ECECF1"/>
           <w:shd w:val="clear" w:color="auto" w:fill="343541"/>
         </w:rPr>
-        <w:t xml:space="preserve">Нужно обновить систему хранения предметов. </w:t>
-      </w:r>
-      <w:proofErr w:type="gramStart"/>
-      <w:r>
-        <w:rPr>
-          <w:rFonts w:ascii="Segoe UI" w:hAnsi="Segoe UI" w:cs="Segoe UI"/>
-          <w:color w:val="ECECF1"/>
-          <w:shd w:val="clear" w:color="auto" w:fill="343541"/>
-        </w:rPr>
-        <w:t>Сейчас</w:t>
-      </w:r>
-      <w:proofErr w:type="gramEnd"/>
-      <w:r>
-        <w:rPr>
-          <w:rFonts w:ascii="Segoe UI" w:hAnsi="Segoe UI" w:cs="Segoe UI"/>
-          <w:color w:val="ECECF1"/>
-          <w:shd w:val="clear" w:color="auto" w:fill="343541"/>
-        </w:rPr>
-        <w:t xml:space="preserve"> когда игрок производит покупку или продажу каких-то хилок не происходит обновление </w:t>
+        <w:t xml:space="preserve">Нужно обновить систему хранения предметов. Сейчас когда игрок производит покупку или продажу каких-то хилок не происходит обновление </w:t>
       </w:r>
       <w:r>
         <w:rPr>

</xml_diff>

<commit_message>
End update PlayerExperienceUI. Start update/develop LanguageLocalization.
</commit_message>
<xml_diff>
--- a/Итерации.docx
+++ b/Итерации.docx
@@ -35,7 +35,27 @@
           <w:color w:val="ECECF1"/>
           <w:shd w:val="clear" w:color="auto" w:fill="343541"/>
         </w:rPr>
-        <w:t xml:space="preserve">1 разобраться из структурой данных которая будет использоваться для сохранения данных игры. Структура должна быть организована на </w:t>
+        <w:t xml:space="preserve">1 разобраться </w:t>
+      </w:r>
+      <w:proofErr w:type="gramStart"/>
+      <w:r>
+        <w:rPr>
+          <w:rFonts w:ascii="Segoe UI" w:hAnsi="Segoe UI" w:cs="Segoe UI"/>
+          <w:strike/>
+          <w:color w:val="ECECF1"/>
+          <w:shd w:val="clear" w:color="auto" w:fill="343541"/>
+        </w:rPr>
+        <w:t>из структурой</w:t>
+      </w:r>
+      <w:proofErr w:type="gramEnd"/>
+      <w:r>
+        <w:rPr>
+          <w:rFonts w:ascii="Segoe UI" w:hAnsi="Segoe UI" w:cs="Segoe UI"/>
+          <w:strike/>
+          <w:color w:val="ECECF1"/>
+          <w:shd w:val="clear" w:color="auto" w:fill="343541"/>
+        </w:rPr>
+        <w:t xml:space="preserve"> данных которая будет использоваться для сохранения данных игры. Структура должна быть организована на </w:t>
       </w:r>
       <w:proofErr w:type="spellStart"/>
       <w:r>
@@ -106,7 +126,25 @@
           <w:color w:val="ECECF1"/>
           <w:shd w:val="clear" w:color="auto" w:fill="343541"/>
         </w:rPr>
-        <w:t xml:space="preserve">4 Продумать кто и каким образом будет собирать компоненты которые реализовывают интерфейсы для сохранения и/или загрузки данных. Возможно это должна быть фабрика. </w:t>
+        <w:t xml:space="preserve">4 Продумать кто и каким образом будет собирать </w:t>
+      </w:r>
+      <w:proofErr w:type="gramStart"/>
+      <w:r>
+        <w:rPr>
+          <w:rFonts w:ascii="Segoe UI" w:hAnsi="Segoe UI" w:cs="Segoe UI"/>
+          <w:color w:val="ECECF1"/>
+          <w:shd w:val="clear" w:color="auto" w:fill="343541"/>
+        </w:rPr>
+        <w:t>компоненты</w:t>
+      </w:r>
+      <w:proofErr w:type="gramEnd"/>
+      <w:r>
+        <w:rPr>
+          <w:rFonts w:ascii="Segoe UI" w:hAnsi="Segoe UI" w:cs="Segoe UI"/>
+          <w:color w:val="ECECF1"/>
+          <w:shd w:val="clear" w:color="auto" w:fill="343541"/>
+        </w:rPr>
+        <w:t xml:space="preserve"> которые реализовывают интерфейсы для сохранения и/или загрузки данных. Возможно это должна быть фабрика. </w:t>
       </w:r>
     </w:p>
     <w:p>
@@ -349,7 +387,27 @@
           <w:color w:val="ECECF1"/>
           <w:shd w:val="clear" w:color="auto" w:fill="343541"/>
         </w:rPr>
-        <w:t>4 Продумать кто и каким образом будет собирать компоненты которые реализовывают интерфейсы для сохранения и/или загрузки данных. Возможно это должна быть фабрика.</w:t>
+        <w:t xml:space="preserve">4 Продумать кто и каким образом будет собирать </w:t>
+      </w:r>
+      <w:proofErr w:type="gramStart"/>
+      <w:r>
+        <w:rPr>
+          <w:rFonts w:ascii="Segoe UI" w:hAnsi="Segoe UI" w:cs="Segoe UI"/>
+          <w:strike/>
+          <w:color w:val="ECECF1"/>
+          <w:shd w:val="clear" w:color="auto" w:fill="343541"/>
+        </w:rPr>
+        <w:t>компоненты</w:t>
+      </w:r>
+      <w:proofErr w:type="gramEnd"/>
+      <w:r>
+        <w:rPr>
+          <w:rFonts w:ascii="Segoe UI" w:hAnsi="Segoe UI" w:cs="Segoe UI"/>
+          <w:strike/>
+          <w:color w:val="ECECF1"/>
+          <w:shd w:val="clear" w:color="auto" w:fill="343541"/>
+        </w:rPr>
+        <w:t xml:space="preserve"> которые реализовывают интерфейсы для сохранения и/или загрузки данных. Возможно это должна быть фабрика.</w:t>
       </w:r>
     </w:p>
     <w:p>
@@ -467,7 +525,27 @@
           <w:color w:val="ECECF1"/>
           <w:shd w:val="clear" w:color="auto" w:fill="343541"/>
         </w:rPr>
-        <w:t>3 Написать поведение для врагов которые включают сл</w:t>
+        <w:t xml:space="preserve">3 Написать поведение </w:t>
+      </w:r>
+      <w:proofErr w:type="gramStart"/>
+      <w:r>
+        <w:rPr>
+          <w:rFonts w:ascii="Segoe UI" w:hAnsi="Segoe UI" w:cs="Segoe UI"/>
+          <w:strike/>
+          <w:color w:val="ECECF1"/>
+          <w:shd w:val="clear" w:color="auto" w:fill="343541"/>
+        </w:rPr>
+        <w:t>для врагов</w:t>
+      </w:r>
+      <w:proofErr w:type="gramEnd"/>
+      <w:r>
+        <w:rPr>
+          <w:rFonts w:ascii="Segoe UI" w:hAnsi="Segoe UI" w:cs="Segoe UI"/>
+          <w:strike/>
+          <w:color w:val="ECECF1"/>
+          <w:shd w:val="clear" w:color="auto" w:fill="343541"/>
+        </w:rPr>
+        <w:t xml:space="preserve"> которые включают сл</w:t>
       </w:r>
       <w:r>
         <w:rPr>
@@ -512,7 +590,27 @@
           <w:color w:val="ECECF1"/>
           <w:shd w:val="clear" w:color="auto" w:fill="343541"/>
         </w:rPr>
-        <w:t>5 Создать телепорт который будет пересылать игро</w:t>
+        <w:t xml:space="preserve">5 Создать </w:t>
+      </w:r>
+      <w:proofErr w:type="gramStart"/>
+      <w:r>
+        <w:rPr>
+          <w:rFonts w:ascii="Segoe UI" w:hAnsi="Segoe UI" w:cs="Segoe UI"/>
+          <w:strike/>
+          <w:color w:val="ECECF1"/>
+          <w:shd w:val="clear" w:color="auto" w:fill="343541"/>
+        </w:rPr>
+        <w:t>телепорт</w:t>
+      </w:r>
+      <w:proofErr w:type="gramEnd"/>
+      <w:r>
+        <w:rPr>
+          <w:rFonts w:ascii="Segoe UI" w:hAnsi="Segoe UI" w:cs="Segoe UI"/>
+          <w:strike/>
+          <w:color w:val="ECECF1"/>
+          <w:shd w:val="clear" w:color="auto" w:fill="343541"/>
+        </w:rPr>
+        <w:t xml:space="preserve"> который будет пересылать игро</w:t>
       </w:r>
       <w:r>
         <w:rPr>
@@ -686,7 +784,27 @@
           <w:color w:val="ECECF1"/>
           <w:shd w:val="clear" w:color="auto" w:fill="343541"/>
         </w:rPr>
-        <w:t xml:space="preserve"> уже имеются управляющие компоненты которые позволяют ии и игроку управлять атакой нужна только логика боевой системы. </w:t>
+        <w:t xml:space="preserve"> уже имеются </w:t>
+      </w:r>
+      <w:proofErr w:type="gramStart"/>
+      <w:r>
+        <w:rPr>
+          <w:rFonts w:ascii="Segoe UI" w:hAnsi="Segoe UI" w:cs="Segoe UI"/>
+          <w:strike/>
+          <w:color w:val="ECECF1"/>
+          <w:shd w:val="clear" w:color="auto" w:fill="343541"/>
+        </w:rPr>
+        <w:t>управляющие компоненты</w:t>
+      </w:r>
+      <w:proofErr w:type="gramEnd"/>
+      <w:r>
+        <w:rPr>
+          <w:rFonts w:ascii="Segoe UI" w:hAnsi="Segoe UI" w:cs="Segoe UI"/>
+          <w:strike/>
+          <w:color w:val="ECECF1"/>
+          <w:shd w:val="clear" w:color="auto" w:fill="343541"/>
+        </w:rPr>
+        <w:t xml:space="preserve"> которые позволяют ии и игроку управлять атакой нужна только логика боевой системы. </w:t>
       </w:r>
     </w:p>
     <w:p>
@@ -916,26 +1034,86 @@
           <w:color w:val="ECECF1"/>
           <w:shd w:val="clear" w:color="auto" w:fill="343541"/>
         </w:rPr>
-        <w:t xml:space="preserve"> инвентаря, это нужно сделать чтобы список предметов, а точнее хилок и их количество сохранялось в память и чтобы его можно было загрузить при продолжении игры </w:t>
-      </w:r>
-    </w:p>
-    <w:p>
-      <w:pPr>
-        <w:rPr>
-          <w:rFonts w:ascii="Segoe UI" w:hAnsi="Segoe UI" w:cs="Segoe UI"/>
-          <w:strike/>
-          <w:color w:val="ECECF1"/>
-          <w:shd w:val="clear" w:color="auto" w:fill="343541"/>
-        </w:rPr>
-      </w:pPr>
-      <w:r>
-        <w:rPr>
-          <w:rFonts w:ascii="Segoe UI" w:hAnsi="Segoe UI" w:cs="Segoe UI"/>
-          <w:strike/>
-          <w:color w:val="ECECF1"/>
-          <w:shd w:val="clear" w:color="auto" w:fill="343541"/>
-        </w:rPr>
-        <w:t xml:space="preserve">2 искать визуальные эффекты которые отображают смерть игрока и нпс. Также нужно поискать картинки которые буду использовать в GUI для хилок и для полоски здоровья </w:t>
+        <w:t xml:space="preserve"> инвентаря, это нужно сделать чтобы список предметов, а точнее хилок и их количество сохранялось в </w:t>
+      </w:r>
+      <w:proofErr w:type="gramStart"/>
+      <w:r>
+        <w:rPr>
+          <w:rFonts w:ascii="Segoe UI" w:hAnsi="Segoe UI" w:cs="Segoe UI"/>
+          <w:strike/>
+          <w:color w:val="ECECF1"/>
+          <w:shd w:val="clear" w:color="auto" w:fill="343541"/>
+        </w:rPr>
+        <w:t>память</w:t>
+      </w:r>
+      <w:proofErr w:type="gramEnd"/>
+      <w:r>
+        <w:rPr>
+          <w:rFonts w:ascii="Segoe UI" w:hAnsi="Segoe UI" w:cs="Segoe UI"/>
+          <w:strike/>
+          <w:color w:val="ECECF1"/>
+          <w:shd w:val="clear" w:color="auto" w:fill="343541"/>
+        </w:rPr>
+        <w:t xml:space="preserve"> и чтобы его можно было загрузить при продолжении игры </w:t>
+      </w:r>
+    </w:p>
+    <w:p>
+      <w:pPr>
+        <w:rPr>
+          <w:rFonts w:ascii="Segoe UI" w:hAnsi="Segoe UI" w:cs="Segoe UI"/>
+          <w:strike/>
+          <w:color w:val="ECECF1"/>
+          <w:shd w:val="clear" w:color="auto" w:fill="343541"/>
+        </w:rPr>
+      </w:pPr>
+      <w:r>
+        <w:rPr>
+          <w:rFonts w:ascii="Segoe UI" w:hAnsi="Segoe UI" w:cs="Segoe UI"/>
+          <w:strike/>
+          <w:color w:val="ECECF1"/>
+          <w:shd w:val="clear" w:color="auto" w:fill="343541"/>
+        </w:rPr>
+        <w:t xml:space="preserve">2 искать </w:t>
+      </w:r>
+      <w:proofErr w:type="gramStart"/>
+      <w:r>
+        <w:rPr>
+          <w:rFonts w:ascii="Segoe UI" w:hAnsi="Segoe UI" w:cs="Segoe UI"/>
+          <w:strike/>
+          <w:color w:val="ECECF1"/>
+          <w:shd w:val="clear" w:color="auto" w:fill="343541"/>
+        </w:rPr>
+        <w:t>визуальные эффекты</w:t>
+      </w:r>
+      <w:proofErr w:type="gramEnd"/>
+      <w:r>
+        <w:rPr>
+          <w:rFonts w:ascii="Segoe UI" w:hAnsi="Segoe UI" w:cs="Segoe UI"/>
+          <w:strike/>
+          <w:color w:val="ECECF1"/>
+          <w:shd w:val="clear" w:color="auto" w:fill="343541"/>
+        </w:rPr>
+        <w:t xml:space="preserve"> которые отображают смерть игрока и нпс. Также нужно поискать </w:t>
+      </w:r>
+      <w:proofErr w:type="gramStart"/>
+      <w:r>
+        <w:rPr>
+          <w:rFonts w:ascii="Segoe UI" w:hAnsi="Segoe UI" w:cs="Segoe UI"/>
+          <w:strike/>
+          <w:color w:val="ECECF1"/>
+          <w:shd w:val="clear" w:color="auto" w:fill="343541"/>
+        </w:rPr>
+        <w:t>картинки</w:t>
+      </w:r>
+      <w:proofErr w:type="gramEnd"/>
+      <w:r>
+        <w:rPr>
+          <w:rFonts w:ascii="Segoe UI" w:hAnsi="Segoe UI" w:cs="Segoe UI"/>
+          <w:strike/>
+          <w:color w:val="ECECF1"/>
+          <w:shd w:val="clear" w:color="auto" w:fill="343541"/>
+        </w:rPr>
+        <w:t xml:space="preserve"> которые буду использовать в GUI для хилок и для полоски здоровья </w:t>
       </w:r>
     </w:p>
     <w:p>
@@ -990,7 +1168,27 @@
           <w:color w:val="ECECF1"/>
           <w:shd w:val="clear" w:color="auto" w:fill="343541"/>
         </w:rPr>
-        <w:t xml:space="preserve">5 Работа со светом. Просмотреть разные варианты. Но нужно помнить что </w:t>
+        <w:t xml:space="preserve">5 Работа со светом. Просмотреть разные варианты. Но нужно </w:t>
+      </w:r>
+      <w:proofErr w:type="gramStart"/>
+      <w:r>
+        <w:rPr>
+          <w:rFonts w:ascii="Segoe UI" w:hAnsi="Segoe UI" w:cs="Segoe UI"/>
+          <w:strike/>
+          <w:color w:val="ECECF1"/>
+          <w:shd w:val="clear" w:color="auto" w:fill="343541"/>
+        </w:rPr>
+        <w:t>помнить</w:t>
+      </w:r>
+      <w:proofErr w:type="gramEnd"/>
+      <w:r>
+        <w:rPr>
+          <w:rFonts w:ascii="Segoe UI" w:hAnsi="Segoe UI" w:cs="Segoe UI"/>
+          <w:strike/>
+          <w:color w:val="ECECF1"/>
+          <w:shd w:val="clear" w:color="auto" w:fill="343541"/>
+        </w:rPr>
+        <w:t xml:space="preserve"> что </w:t>
       </w:r>
       <w:proofErr w:type="spellStart"/>
       <w:r>
@@ -1106,7 +1304,27 @@
           <w:color w:val="ECECF1"/>
           <w:shd w:val="clear" w:color="auto" w:fill="343541"/>
         </w:rPr>
-        <w:t xml:space="preserve">8 Пересмотреть скрипты и те которые не используют статик дату, перевести на использование статик даты, а именно это относиться к </w:t>
+        <w:t xml:space="preserve">8 Пересмотреть скрипты и </w:t>
+      </w:r>
+      <w:proofErr w:type="gramStart"/>
+      <w:r>
+        <w:rPr>
+          <w:rFonts w:ascii="Segoe UI" w:hAnsi="Segoe UI" w:cs="Segoe UI"/>
+          <w:strike/>
+          <w:color w:val="ECECF1"/>
+          <w:shd w:val="clear" w:color="auto" w:fill="343541"/>
+        </w:rPr>
+        <w:t>те</w:t>
+      </w:r>
+      <w:proofErr w:type="gramEnd"/>
+      <w:r>
+        <w:rPr>
+          <w:rFonts w:ascii="Segoe UI" w:hAnsi="Segoe UI" w:cs="Segoe UI"/>
+          <w:strike/>
+          <w:color w:val="ECECF1"/>
+          <w:shd w:val="clear" w:color="auto" w:fill="343541"/>
+        </w:rPr>
+        <w:t xml:space="preserve"> которые не используют статик дату, перевести на использование статик даты, а именно это относиться к </w:t>
       </w:r>
       <w:proofErr w:type="spellStart"/>
       <w:r>
@@ -1223,7 +1441,25 @@
           <w:color w:val="ECECF1"/>
           <w:shd w:val="clear" w:color="auto" w:fill="343541"/>
         </w:rPr>
-        <w:t>Второй и третий пункт хоть и выглядят достаточно просто но на самом деле именно эти два пункта содержат колоссальную работу над проектом.</w:t>
+        <w:t xml:space="preserve">Второй и третий пункт хоть и выглядят достаточно </w:t>
+      </w:r>
+      <w:proofErr w:type="gramStart"/>
+      <w:r>
+        <w:rPr>
+          <w:rFonts w:ascii="Segoe UI" w:hAnsi="Segoe UI" w:cs="Segoe UI"/>
+          <w:color w:val="ECECF1"/>
+          <w:shd w:val="clear" w:color="auto" w:fill="343541"/>
+        </w:rPr>
+        <w:t>просто</w:t>
+      </w:r>
+      <w:proofErr w:type="gramEnd"/>
+      <w:r>
+        <w:rPr>
+          <w:rFonts w:ascii="Segoe UI" w:hAnsi="Segoe UI" w:cs="Segoe UI"/>
+          <w:color w:val="ECECF1"/>
+          <w:shd w:val="clear" w:color="auto" w:fill="343541"/>
+        </w:rPr>
+        <w:t xml:space="preserve"> но на самом деле именно эти два пункта содержат колоссальную работу над проектом.</w:t>
       </w:r>
     </w:p>
     <w:p>
@@ -1367,7 +1603,27 @@
           <w:color w:val="ECECF1"/>
           <w:shd w:val="clear" w:color="auto" w:fill="343541"/>
         </w:rPr>
-        <w:t>5 Начать погружаться в квестовую систему. Это достаточно крупный шаг и по этому он займет больше всего времени, хотя и на первый взгляд все написано просто.</w:t>
+        <w:t xml:space="preserve">5 Начать погружаться в квестовую систему. Это достаточно крупный шаг и </w:t>
+      </w:r>
+      <w:proofErr w:type="gramStart"/>
+      <w:r>
+        <w:rPr>
+          <w:rFonts w:ascii="Segoe UI" w:hAnsi="Segoe UI" w:cs="Segoe UI"/>
+          <w:strike/>
+          <w:color w:val="ECECF1"/>
+          <w:shd w:val="clear" w:color="auto" w:fill="343541"/>
+        </w:rPr>
+        <w:t>по этому</w:t>
+      </w:r>
+      <w:proofErr w:type="gramEnd"/>
+      <w:r>
+        <w:rPr>
+          <w:rFonts w:ascii="Segoe UI" w:hAnsi="Segoe UI" w:cs="Segoe UI"/>
+          <w:strike/>
+          <w:color w:val="ECECF1"/>
+          <w:shd w:val="clear" w:color="auto" w:fill="343541"/>
+        </w:rPr>
+        <w:t xml:space="preserve"> он займет больше всего времени, хотя и на первый взгляд все написано просто.</w:t>
       </w:r>
     </w:p>
     <w:p>
@@ -1510,7 +1766,25 @@
           <w:color w:val="ECECF1"/>
           <w:shd w:val="clear" w:color="auto" w:fill="343541"/>
         </w:rPr>
-        <w:t xml:space="preserve">2а Завершить прототип, получив работоспособную квестовую систему. </w:t>
+        <w:t xml:space="preserve">2а </w:t>
+      </w:r>
+      <w:proofErr w:type="gramStart"/>
+      <w:r>
+        <w:rPr>
+          <w:rFonts w:ascii="Segoe UI" w:hAnsi="Segoe UI" w:cs="Segoe UI"/>
+          <w:color w:val="ECECF1"/>
+          <w:shd w:val="clear" w:color="auto" w:fill="343541"/>
+        </w:rPr>
+        <w:t>Завершить</w:t>
+      </w:r>
+      <w:proofErr w:type="gramEnd"/>
+      <w:r>
+        <w:rPr>
+          <w:rFonts w:ascii="Segoe UI" w:hAnsi="Segoe UI" w:cs="Segoe UI"/>
+          <w:color w:val="ECECF1"/>
+          <w:shd w:val="clear" w:color="auto" w:fill="343541"/>
+        </w:rPr>
+        <w:t xml:space="preserve"> прототип, получив работоспособную квестовую систему. </w:t>
       </w:r>
     </w:p>
     <w:p>
@@ -1528,7 +1802,25 @@
           <w:color w:val="ECECF1"/>
           <w:shd w:val="clear" w:color="auto" w:fill="343541"/>
         </w:rPr>
-        <w:t xml:space="preserve">2б Контролировать состояние архитектуры при разработке доработке прототипа </w:t>
+        <w:t xml:space="preserve">2б </w:t>
+      </w:r>
+      <w:proofErr w:type="gramStart"/>
+      <w:r>
+        <w:rPr>
+          <w:rFonts w:ascii="Segoe UI" w:hAnsi="Segoe UI" w:cs="Segoe UI"/>
+          <w:color w:val="ECECF1"/>
+          <w:shd w:val="clear" w:color="auto" w:fill="343541"/>
+        </w:rPr>
+        <w:t>Контролировать</w:t>
+      </w:r>
+      <w:proofErr w:type="gramEnd"/>
+      <w:r>
+        <w:rPr>
+          <w:rFonts w:ascii="Segoe UI" w:hAnsi="Segoe UI" w:cs="Segoe UI"/>
+          <w:color w:val="ECECF1"/>
+          <w:shd w:val="clear" w:color="auto" w:fill="343541"/>
+        </w:rPr>
+        <w:t xml:space="preserve"> состояние архитектуры при разработке доработке прототипа </w:t>
       </w:r>
       <w:proofErr w:type="spellStart"/>
       <w:r>
@@ -1614,7 +1906,25 @@
           <w:color w:val="ECECF1"/>
           <w:shd w:val="clear" w:color="auto" w:fill="343541"/>
         </w:rPr>
-        <w:t>6 Готовиться к реализации системы торговли. Также как и второй этап достаточно длительный.</w:t>
+        <w:t xml:space="preserve">6 Готовиться к реализации системы торговли. </w:t>
+      </w:r>
+      <w:proofErr w:type="gramStart"/>
+      <w:r>
+        <w:rPr>
+          <w:rFonts w:ascii="Segoe UI" w:hAnsi="Segoe UI" w:cs="Segoe UI"/>
+          <w:color w:val="ECECF1"/>
+          <w:shd w:val="clear" w:color="auto" w:fill="343541"/>
+        </w:rPr>
+        <w:t>Также</w:t>
+      </w:r>
+      <w:proofErr w:type="gramEnd"/>
+      <w:r>
+        <w:rPr>
+          <w:rFonts w:ascii="Segoe UI" w:hAnsi="Segoe UI" w:cs="Segoe UI"/>
+          <w:color w:val="ECECF1"/>
+          <w:shd w:val="clear" w:color="auto" w:fill="343541"/>
+        </w:rPr>
+        <w:t xml:space="preserve"> как и второй этап достаточно длительный.</w:t>
       </w:r>
     </w:p>
     <w:p>
@@ -1715,7 +2025,25 @@
           <w:color w:val="ECECF1"/>
           <w:shd w:val="clear" w:color="auto" w:fill="343541"/>
         </w:rPr>
-        <w:t>4 Готовится к разработки системы торговли.</w:t>
+        <w:t xml:space="preserve">4 Готовится </w:t>
+      </w:r>
+      <w:proofErr w:type="gramStart"/>
+      <w:r>
+        <w:rPr>
+          <w:rFonts w:ascii="Segoe UI" w:hAnsi="Segoe UI" w:cs="Segoe UI"/>
+          <w:color w:val="ECECF1"/>
+          <w:shd w:val="clear" w:color="auto" w:fill="343541"/>
+        </w:rPr>
+        <w:t>к разработки</w:t>
+      </w:r>
+      <w:proofErr w:type="gramEnd"/>
+      <w:r>
+        <w:rPr>
+          <w:rFonts w:ascii="Segoe UI" w:hAnsi="Segoe UI" w:cs="Segoe UI"/>
+          <w:color w:val="ECECF1"/>
+          <w:shd w:val="clear" w:color="auto" w:fill="343541"/>
+        </w:rPr>
+        <w:t xml:space="preserve"> системы торговли.</w:t>
       </w:r>
     </w:p>
     <w:p>
@@ -1779,7 +2107,27 @@
           <w:color w:val="ECECF1"/>
           <w:shd w:val="clear" w:color="auto" w:fill="343541"/>
         </w:rPr>
-        <w:t xml:space="preserve">2 Нужно решить проблему связанную с отображением окна квест </w:t>
+        <w:t xml:space="preserve">2 Нужно решить </w:t>
+      </w:r>
+      <w:proofErr w:type="gramStart"/>
+      <w:r>
+        <w:rPr>
+          <w:rFonts w:ascii="Segoe UI" w:hAnsi="Segoe UI" w:cs="Segoe UI"/>
+          <w:strike/>
+          <w:color w:val="ECECF1"/>
+          <w:shd w:val="clear" w:color="auto" w:fill="343541"/>
+        </w:rPr>
+        <w:t>проблему</w:t>
+      </w:r>
+      <w:proofErr w:type="gramEnd"/>
+      <w:r>
+        <w:rPr>
+          <w:rFonts w:ascii="Segoe UI" w:hAnsi="Segoe UI" w:cs="Segoe UI"/>
+          <w:strike/>
+          <w:color w:val="ECECF1"/>
+          <w:shd w:val="clear" w:color="auto" w:fill="343541"/>
+        </w:rPr>
+        <w:t xml:space="preserve"> связанную с отображением окна квест </w:t>
       </w:r>
       <w:proofErr w:type="spellStart"/>
       <w:r>
@@ -2495,7 +2843,25 @@
           <w:color w:val="ECECF1"/>
           <w:shd w:val="clear" w:color="auto" w:fill="343541"/>
         </w:rPr>
-        <w:t xml:space="preserve">2 Создать компонент который расширит возможности для системы взаимодействия, и позволит игроку делать выбор какой именно тип взаимодействия желает получить игрок если таких типов взаимодействия </w:t>
+        <w:t xml:space="preserve">2 Создать </w:t>
+      </w:r>
+      <w:proofErr w:type="gramStart"/>
+      <w:r>
+        <w:rPr>
+          <w:rFonts w:ascii="Segoe UI" w:hAnsi="Segoe UI" w:cs="Segoe UI"/>
+          <w:color w:val="ECECF1"/>
+          <w:shd w:val="clear" w:color="auto" w:fill="343541"/>
+        </w:rPr>
+        <w:t>компонент</w:t>
+      </w:r>
+      <w:proofErr w:type="gramEnd"/>
+      <w:r>
+        <w:rPr>
+          <w:rFonts w:ascii="Segoe UI" w:hAnsi="Segoe UI" w:cs="Segoe UI"/>
+          <w:color w:val="ECECF1"/>
+          <w:shd w:val="clear" w:color="auto" w:fill="343541"/>
+        </w:rPr>
+        <w:t xml:space="preserve"> который расширит возможности для системы взаимодействия, и позволит игроку делать выбор какой именно тип взаимодействия желает получить игрок если таких типов взаимодействия </w:t>
       </w:r>
       <w:proofErr w:type="spellStart"/>
       <w:r>
@@ -2636,7 +3002,27 @@
           <w:color w:val="ECECF1"/>
           <w:shd w:val="clear" w:color="auto" w:fill="343541"/>
         </w:rPr>
-        <w:t>1 Добавить функционал который будет сохранять текущее количество денег игрока в файл сохранения.</w:t>
+        <w:t xml:space="preserve">1 Добавить </w:t>
+      </w:r>
+      <w:proofErr w:type="gramStart"/>
+      <w:r>
+        <w:rPr>
+          <w:rFonts w:ascii="Segoe UI" w:hAnsi="Segoe UI" w:cs="Segoe UI"/>
+          <w:strike/>
+          <w:color w:val="ECECF1"/>
+          <w:shd w:val="clear" w:color="auto" w:fill="343541"/>
+        </w:rPr>
+        <w:t>функционал</w:t>
+      </w:r>
+      <w:proofErr w:type="gramEnd"/>
+      <w:r>
+        <w:rPr>
+          <w:rFonts w:ascii="Segoe UI" w:hAnsi="Segoe UI" w:cs="Segoe UI"/>
+          <w:strike/>
+          <w:color w:val="ECECF1"/>
+          <w:shd w:val="clear" w:color="auto" w:fill="343541"/>
+        </w:rPr>
+        <w:t xml:space="preserve"> который будет сохранять текущее количество денег игрока в файл сохранения.</w:t>
       </w:r>
     </w:p>
     <w:p>
@@ -2674,14 +3060,96 @@
           <w:color w:val="ECECF1"/>
           <w:shd w:val="clear" w:color="auto" w:fill="343541"/>
         </w:rPr>
-        <w:t>3 Обновить интерфейс для системы торговли</w:t>
+        <w:t>3 Обновить интерфейс для системы торговли.</w:t>
+      </w:r>
+    </w:p>
+    <w:p>
+      <w:pPr>
+        <w:rPr>
+          <w:rFonts w:ascii="Segoe UI" w:hAnsi="Segoe UI" w:cs="Segoe UI"/>
+          <w:strike/>
+          <w:color w:val="ECECF1"/>
+          <w:shd w:val="clear" w:color="auto" w:fill="343541"/>
+        </w:rPr>
+      </w:pPr>
+      <w:r>
+        <w:rPr>
+          <w:rFonts w:ascii="Segoe UI" w:hAnsi="Segoe UI" w:cs="Segoe UI"/>
+          <w:strike/>
+          <w:color w:val="ECECF1"/>
+          <w:shd w:val="clear" w:color="auto" w:fill="343541"/>
+        </w:rPr>
+        <w:t>4 Усовершенствовать систему получения опыта. Нужно чтобы при убийстве мобов игроку начислялся опыт в соответствии с их уровнем.</w:t>
+      </w:r>
+    </w:p>
+    <w:p>
+      <w:pPr>
+        <w:rPr>
+          <w:rFonts w:ascii="Segoe UI" w:hAnsi="Segoe UI" w:cs="Segoe UI"/>
+          <w:strike/>
+          <w:color w:val="ECECF1"/>
+          <w:shd w:val="clear" w:color="auto" w:fill="343541"/>
+        </w:rPr>
+      </w:pPr>
+      <w:r>
+        <w:rPr>
+          <w:rFonts w:ascii="Segoe UI" w:hAnsi="Segoe UI" w:cs="Segoe UI"/>
+          <w:strike/>
+          <w:color w:val="ECECF1"/>
+          <w:shd w:val="clear" w:color="auto" w:fill="343541"/>
+        </w:rPr>
+        <w:t>5 Расширить систему опыта игрока. Нужно дать возможность игроку просматривать информацию о его текущем уровне и опыте, а также сколько необходимо опыта к следующему уровне.</w:t>
       </w:r>
       <w:bookmarkStart w:id="0" w:name="_GoBack"/>
       <w:bookmarkEnd w:id="0"/>
-      <w:r>
-        <w:rPr>
-          <w:rFonts w:ascii="Segoe UI" w:hAnsi="Segoe UI" w:cs="Segoe UI"/>
-          <w:strike/>
+    </w:p>
+    <w:p>
+      <w:pPr>
+        <w:rPr>
+          <w:rFonts w:ascii="Segoe UI" w:hAnsi="Segoe UI" w:cs="Segoe UI"/>
+          <w:color w:val="ECECF1"/>
+          <w:shd w:val="clear" w:color="auto" w:fill="343541"/>
+        </w:rPr>
+      </w:pPr>
+      <w:r>
+        <w:rPr>
+          <w:rFonts w:ascii="Segoe UI" w:hAnsi="Segoe UI" w:cs="Segoe UI"/>
+          <w:color w:val="ECECF1"/>
+          <w:shd w:val="clear" w:color="auto" w:fill="343541"/>
+        </w:rPr>
+        <w:t>6 Реализовать локализацию для игры пока что только на русском и на английском. Для этого нужно расширить существующую систему локализации.</w:t>
+      </w:r>
+    </w:p>
+    <w:p>
+      <w:pPr>
+        <w:rPr>
+          <w:rFonts w:ascii="Segoe UI" w:hAnsi="Segoe UI" w:cs="Segoe UI"/>
+          <w:color w:val="ECECF1"/>
+          <w:shd w:val="clear" w:color="auto" w:fill="343541"/>
+        </w:rPr>
+      </w:pPr>
+      <w:r>
+        <w:rPr>
+          <w:rFonts w:ascii="Segoe UI" w:hAnsi="Segoe UI" w:cs="Segoe UI"/>
+          <w:color w:val="ECECF1"/>
+          <w:shd w:val="clear" w:color="auto" w:fill="343541"/>
+        </w:rPr>
+        <w:lastRenderedPageBreak/>
+        <w:t xml:space="preserve">7 Натянуть анимации </w:t>
+      </w:r>
+      <w:proofErr w:type="gramStart"/>
+      <w:r>
+        <w:rPr>
+          <w:rFonts w:ascii="Segoe UI" w:hAnsi="Segoe UI" w:cs="Segoe UI"/>
+          <w:color w:val="ECECF1"/>
+          <w:shd w:val="clear" w:color="auto" w:fill="343541"/>
+        </w:rPr>
+        <w:t>на мобов</w:t>
+      </w:r>
+      <w:proofErr w:type="gramEnd"/>
+      <w:r>
+        <w:rPr>
+          <w:rFonts w:ascii="Segoe UI" w:hAnsi="Segoe UI" w:cs="Segoe UI"/>
           <w:color w:val="ECECF1"/>
           <w:shd w:val="clear" w:color="auto" w:fill="343541"/>
         </w:rPr>
@@ -2692,88 +3160,35 @@
       <w:pPr>
         <w:rPr>
           <w:rFonts w:ascii="Segoe UI" w:hAnsi="Segoe UI" w:cs="Segoe UI"/>
-          <w:strike/>
-          <w:color w:val="ECECF1"/>
-          <w:shd w:val="clear" w:color="auto" w:fill="343541"/>
-        </w:rPr>
-      </w:pPr>
-      <w:r>
-        <w:rPr>
-          <w:rFonts w:ascii="Segoe UI" w:hAnsi="Segoe UI" w:cs="Segoe UI"/>
-          <w:strike/>
-          <w:color w:val="ECECF1"/>
-          <w:shd w:val="clear" w:color="auto" w:fill="343541"/>
-        </w:rPr>
-        <w:t>4 Усовершенствовать систему получения опыта. Нужно чтобы при убийстве мобов игроку начислялся опыт в соответствии с их уровнем.</w:t>
-      </w:r>
-    </w:p>
-    <w:p>
-      <w:pPr>
-        <w:rPr>
-          <w:rFonts w:ascii="Segoe UI" w:hAnsi="Segoe UI" w:cs="Segoe UI"/>
-          <w:color w:val="ECECF1"/>
-          <w:shd w:val="clear" w:color="auto" w:fill="343541"/>
-        </w:rPr>
-      </w:pPr>
-      <w:r>
-        <w:rPr>
-          <w:rFonts w:ascii="Segoe UI" w:hAnsi="Segoe UI" w:cs="Segoe UI"/>
-          <w:color w:val="ECECF1"/>
-          <w:shd w:val="clear" w:color="auto" w:fill="343541"/>
-        </w:rPr>
-        <w:t>5 Расширить систему опыта игрока. Нужно дать возможность игроку просматривать информацию о его текущем уровне и опыте, а также сколько необходимо опыта к следующему уровне.</w:t>
-      </w:r>
-    </w:p>
-    <w:p>
-      <w:pPr>
-        <w:rPr>
-          <w:rFonts w:ascii="Segoe UI" w:hAnsi="Segoe UI" w:cs="Segoe UI"/>
-          <w:color w:val="ECECF1"/>
-          <w:shd w:val="clear" w:color="auto" w:fill="343541"/>
-        </w:rPr>
-      </w:pPr>
-      <w:r>
-        <w:rPr>
-          <w:rFonts w:ascii="Segoe UI" w:hAnsi="Segoe UI" w:cs="Segoe UI"/>
-          <w:color w:val="ECECF1"/>
-          <w:shd w:val="clear" w:color="auto" w:fill="343541"/>
-        </w:rPr>
-        <w:t>6 Реализовать локализацию для игры пока что только на русском и на английском. Для этого нужно расширить существующую систему локализации.</w:t>
-      </w:r>
-    </w:p>
-    <w:p>
-      <w:pPr>
-        <w:rPr>
-          <w:rFonts w:ascii="Segoe UI" w:hAnsi="Segoe UI" w:cs="Segoe UI"/>
-          <w:color w:val="ECECF1"/>
-          <w:shd w:val="clear" w:color="auto" w:fill="343541"/>
-        </w:rPr>
-      </w:pPr>
-      <w:r>
-        <w:rPr>
-          <w:rFonts w:ascii="Segoe UI" w:hAnsi="Segoe UI" w:cs="Segoe UI"/>
-          <w:color w:val="ECECF1"/>
-          <w:shd w:val="clear" w:color="auto" w:fill="343541"/>
-        </w:rPr>
-        <w:lastRenderedPageBreak/>
-        <w:t>7 Натянуть анимации на мобов.</w:t>
-      </w:r>
-    </w:p>
-    <w:p>
-      <w:pPr>
-        <w:rPr>
-          <w:rFonts w:ascii="Segoe UI" w:hAnsi="Segoe UI" w:cs="Segoe UI"/>
-          <w:color w:val="ECECF1"/>
-          <w:shd w:val="clear" w:color="auto" w:fill="343541"/>
-        </w:rPr>
-      </w:pPr>
-      <w:r>
-        <w:rPr>
-          <w:rFonts w:ascii="Segoe UI" w:hAnsi="Segoe UI" w:cs="Segoe UI"/>
-          <w:color w:val="ECECF1"/>
-          <w:shd w:val="clear" w:color="auto" w:fill="343541"/>
-        </w:rPr>
-        <w:t xml:space="preserve">8 Думать как можно организовать рандомную генерацию мира, и начать работу над прототипом </w:t>
+          <w:color w:val="ECECF1"/>
+          <w:shd w:val="clear" w:color="auto" w:fill="343541"/>
+        </w:rPr>
+      </w:pPr>
+      <w:r>
+        <w:rPr>
+          <w:rFonts w:ascii="Segoe UI" w:hAnsi="Segoe UI" w:cs="Segoe UI"/>
+          <w:color w:val="ECECF1"/>
+          <w:shd w:val="clear" w:color="auto" w:fill="343541"/>
+        </w:rPr>
+        <w:t xml:space="preserve">8 </w:t>
+      </w:r>
+      <w:proofErr w:type="gramStart"/>
+      <w:r>
+        <w:rPr>
+          <w:rFonts w:ascii="Segoe UI" w:hAnsi="Segoe UI" w:cs="Segoe UI"/>
+          <w:color w:val="ECECF1"/>
+          <w:shd w:val="clear" w:color="auto" w:fill="343541"/>
+        </w:rPr>
+        <w:t>Думать</w:t>
+      </w:r>
+      <w:proofErr w:type="gramEnd"/>
+      <w:r>
+        <w:rPr>
+          <w:rFonts w:ascii="Segoe UI" w:hAnsi="Segoe UI" w:cs="Segoe UI"/>
+          <w:color w:val="ECECF1"/>
+          <w:shd w:val="clear" w:color="auto" w:fill="343541"/>
+        </w:rPr>
+        <w:t xml:space="preserve"> как можно организовать рандомную генерацию мира, и начать работу над прототипом </w:t>
       </w:r>
       <w:proofErr w:type="spellStart"/>
       <w:r>
@@ -2835,7 +3250,25 @@
           <w:color w:val="ECECF1"/>
           <w:shd w:val="clear" w:color="auto" w:fill="343541"/>
         </w:rPr>
-        <w:t xml:space="preserve">Нужно обновить систему хранения предметов. Сейчас когда игрок производит покупку или продажу каких-то хилок не происходит обновление </w:t>
+        <w:t xml:space="preserve">Нужно обновить систему хранения предметов. </w:t>
+      </w:r>
+      <w:proofErr w:type="gramStart"/>
+      <w:r>
+        <w:rPr>
+          <w:rFonts w:ascii="Segoe UI" w:hAnsi="Segoe UI" w:cs="Segoe UI"/>
+          <w:color w:val="ECECF1"/>
+          <w:shd w:val="clear" w:color="auto" w:fill="343541"/>
+        </w:rPr>
+        <w:t>Сейчас</w:t>
+      </w:r>
+      <w:proofErr w:type="gramEnd"/>
+      <w:r>
+        <w:rPr>
+          <w:rFonts w:ascii="Segoe UI" w:hAnsi="Segoe UI" w:cs="Segoe UI"/>
+          <w:color w:val="ECECF1"/>
+          <w:shd w:val="clear" w:color="auto" w:fill="343541"/>
+        </w:rPr>
+        <w:t xml:space="preserve"> когда игрок производит покупку или продажу каких-то хилок не происходит обновление </w:t>
       </w:r>
       <w:r>
         <w:rPr>

</xml_diff>

<commit_message>
Add animation for all character.
</commit_message>
<xml_diff>
--- a/Итерации.docx
+++ b/Итерации.docx
@@ -3100,24 +3100,35 @@
         </w:rPr>
         <w:t>5 Расширить систему опыта игрока. Нужно дать возможность игроку просматривать информацию о его текущем уровне и опыте, а также сколько необходимо опыта к следующему уровне.</w:t>
       </w:r>
+    </w:p>
+    <w:p>
+      <w:pPr>
+        <w:rPr>
+          <w:rFonts w:ascii="Segoe UI" w:hAnsi="Segoe UI" w:cs="Segoe UI"/>
+          <w:strike/>
+          <w:color w:val="ECECF1"/>
+          <w:shd w:val="clear" w:color="auto" w:fill="343541"/>
+        </w:rPr>
+      </w:pPr>
+      <w:r>
+        <w:rPr>
+          <w:rFonts w:ascii="Segoe UI" w:hAnsi="Segoe UI" w:cs="Segoe UI"/>
+          <w:strike/>
+          <w:color w:val="ECECF1"/>
+          <w:shd w:val="clear" w:color="auto" w:fill="343541"/>
+        </w:rPr>
+        <w:t>6 Реализовать локализацию для игры пока что только на русском и на английском. Для этого нужно расширить су</w:t>
+      </w:r>
       <w:bookmarkStart w:id="0" w:name="_GoBack"/>
       <w:bookmarkEnd w:id="0"/>
-    </w:p>
-    <w:p>
-      <w:pPr>
-        <w:rPr>
-          <w:rFonts w:ascii="Segoe UI" w:hAnsi="Segoe UI" w:cs="Segoe UI"/>
-          <w:color w:val="ECECF1"/>
-          <w:shd w:val="clear" w:color="auto" w:fill="343541"/>
-        </w:rPr>
-      </w:pPr>
-      <w:r>
-        <w:rPr>
-          <w:rFonts w:ascii="Segoe UI" w:hAnsi="Segoe UI" w:cs="Segoe UI"/>
-          <w:color w:val="ECECF1"/>
-          <w:shd w:val="clear" w:color="auto" w:fill="343541"/>
-        </w:rPr>
-        <w:t>6 Реализовать локализацию для игры пока что только на русском и на английском. Для этого нужно расширить существующую систему локализации.</w:t>
+      <w:r>
+        <w:rPr>
+          <w:rFonts w:ascii="Segoe UI" w:hAnsi="Segoe UI" w:cs="Segoe UI"/>
+          <w:strike/>
+          <w:color w:val="ECECF1"/>
+          <w:shd w:val="clear" w:color="auto" w:fill="343541"/>
+        </w:rPr>
+        <w:t>ществующую систему локализации.</w:t>
       </w:r>
     </w:p>
     <w:p>

</xml_diff>

<commit_message>
End adding animation for character SkeletWarrior.
</commit_message>
<xml_diff>
--- a/Итерации.docx
+++ b/Итерации.docx
@@ -3117,7 +3117,27 @@
           <w:color w:val="ECECF1"/>
           <w:shd w:val="clear" w:color="auto" w:fill="343541"/>
         </w:rPr>
-        <w:t>6 Реализовать локализацию для игры пока что только на русском и на английском. Для этого нужно расширить су</w:t>
+        <w:t>6 Реализовать локализацию для игры пока что только на русском и на английском. Для этого нужно расширить существующую систему локализации.</w:t>
+      </w:r>
+    </w:p>
+    <w:p>
+      <w:pPr>
+        <w:rPr>
+          <w:rFonts w:ascii="Segoe UI" w:hAnsi="Segoe UI" w:cs="Segoe UI"/>
+          <w:strike/>
+          <w:color w:val="ECECF1"/>
+          <w:shd w:val="clear" w:color="auto" w:fill="343541"/>
+        </w:rPr>
+      </w:pPr>
+      <w:r>
+        <w:rPr>
+          <w:rFonts w:ascii="Segoe UI" w:hAnsi="Segoe UI" w:cs="Segoe UI"/>
+          <w:strike/>
+          <w:color w:val="ECECF1"/>
+          <w:shd w:val="clear" w:color="auto" w:fill="343541"/>
+        </w:rPr>
+        <w:lastRenderedPageBreak/>
+        <w:t>7 Натянут</w:t>
       </w:r>
       <w:bookmarkStart w:id="0" w:name="_GoBack"/>
       <w:bookmarkEnd w:id="0"/>
@@ -3128,30 +3148,13 @@
           <w:color w:val="ECECF1"/>
           <w:shd w:val="clear" w:color="auto" w:fill="343541"/>
         </w:rPr>
-        <w:t>ществующую систему локализации.</w:t>
-      </w:r>
-    </w:p>
-    <w:p>
-      <w:pPr>
-        <w:rPr>
-          <w:rFonts w:ascii="Segoe UI" w:hAnsi="Segoe UI" w:cs="Segoe UI"/>
-          <w:color w:val="ECECF1"/>
-          <w:shd w:val="clear" w:color="auto" w:fill="343541"/>
-        </w:rPr>
-      </w:pPr>
-      <w:r>
-        <w:rPr>
-          <w:rFonts w:ascii="Segoe UI" w:hAnsi="Segoe UI" w:cs="Segoe UI"/>
-          <w:color w:val="ECECF1"/>
-          <w:shd w:val="clear" w:color="auto" w:fill="343541"/>
-        </w:rPr>
-        <w:lastRenderedPageBreak/>
-        <w:t xml:space="preserve">7 Натянуть анимации </w:t>
+        <w:t xml:space="preserve">ь анимации </w:t>
       </w:r>
       <w:proofErr w:type="gramStart"/>
       <w:r>
         <w:rPr>
           <w:rFonts w:ascii="Segoe UI" w:hAnsi="Segoe UI" w:cs="Segoe UI"/>
+          <w:strike/>
           <w:color w:val="ECECF1"/>
           <w:shd w:val="clear" w:color="auto" w:fill="343541"/>
         </w:rPr>
@@ -3161,6 +3164,7 @@
       <w:r>
         <w:rPr>
           <w:rFonts w:ascii="Segoe UI" w:hAnsi="Segoe UI" w:cs="Segoe UI"/>
+          <w:strike/>
           <w:color w:val="ECECF1"/>
           <w:shd w:val="clear" w:color="auto" w:fill="343541"/>
         </w:rPr>

</xml_diff>

<commit_message>
Fix storage, and PlayerInventory.
</commit_message>
<xml_diff>
--- a/Итерации.docx
+++ b/Итерации.docx
@@ -3137,73 +3137,519 @@
           <w:shd w:val="clear" w:color="auto" w:fill="343541"/>
         </w:rPr>
         <w:lastRenderedPageBreak/>
-        <w:t>7 Натянут</w:t>
-      </w:r>
+        <w:t xml:space="preserve">7 Натянуть анимации </w:t>
+      </w:r>
+      <w:proofErr w:type="gramStart"/>
+      <w:r>
+        <w:rPr>
+          <w:rFonts w:ascii="Segoe UI" w:hAnsi="Segoe UI" w:cs="Segoe UI"/>
+          <w:strike/>
+          <w:color w:val="ECECF1"/>
+          <w:shd w:val="clear" w:color="auto" w:fill="343541"/>
+        </w:rPr>
+        <w:t>на мобов</w:t>
+      </w:r>
+      <w:proofErr w:type="gramEnd"/>
+      <w:r>
+        <w:rPr>
+          <w:rFonts w:ascii="Segoe UI" w:hAnsi="Segoe UI" w:cs="Segoe UI"/>
+          <w:strike/>
+          <w:color w:val="ECECF1"/>
+          <w:shd w:val="clear" w:color="auto" w:fill="343541"/>
+        </w:rPr>
+        <w:t>.</w:t>
+      </w:r>
+    </w:p>
+    <w:p>
+      <w:pPr>
+        <w:rPr>
+          <w:rFonts w:ascii="Segoe UI" w:hAnsi="Segoe UI" w:cs="Segoe UI"/>
+          <w:color w:val="ECECF1"/>
+          <w:shd w:val="clear" w:color="auto" w:fill="343541"/>
+        </w:rPr>
+      </w:pPr>
+      <w:r>
+        <w:rPr>
+          <w:rFonts w:ascii="Segoe UI" w:hAnsi="Segoe UI" w:cs="Segoe UI"/>
+          <w:color w:val="ECECF1"/>
+          <w:shd w:val="clear" w:color="auto" w:fill="343541"/>
+        </w:rPr>
+        <w:t xml:space="preserve">8 </w:t>
+      </w:r>
+      <w:proofErr w:type="gramStart"/>
+      <w:r>
+        <w:rPr>
+          <w:rFonts w:ascii="Segoe UI" w:hAnsi="Segoe UI" w:cs="Segoe UI"/>
+          <w:color w:val="ECECF1"/>
+          <w:shd w:val="clear" w:color="auto" w:fill="343541"/>
+        </w:rPr>
+        <w:t>Думать</w:t>
+      </w:r>
+      <w:proofErr w:type="gramEnd"/>
+      <w:r>
+        <w:rPr>
+          <w:rFonts w:ascii="Segoe UI" w:hAnsi="Segoe UI" w:cs="Segoe UI"/>
+          <w:color w:val="ECECF1"/>
+          <w:shd w:val="clear" w:color="auto" w:fill="343541"/>
+        </w:rPr>
+        <w:t xml:space="preserve"> как можно организовать рандомную генерацию мира, и начать работу над прототипом </w:t>
+      </w:r>
+      <w:proofErr w:type="spellStart"/>
+      <w:r>
+        <w:rPr>
+          <w:rFonts w:ascii="Segoe UI" w:hAnsi="Segoe UI" w:cs="Segoe UI"/>
+          <w:color w:val="ECECF1"/>
+          <w:shd w:val="clear" w:color="auto" w:fill="343541"/>
+        </w:rPr>
+        <w:t>рандомной</w:t>
+      </w:r>
+      <w:proofErr w:type="spellEnd"/>
+      <w:r>
+        <w:rPr>
+          <w:rFonts w:ascii="Segoe UI" w:hAnsi="Segoe UI" w:cs="Segoe UI"/>
+          <w:color w:val="ECECF1"/>
+          <w:shd w:val="clear" w:color="auto" w:fill="343541"/>
+        </w:rPr>
+        <w:t xml:space="preserve"> генерации.</w:t>
+      </w:r>
+    </w:p>
+    <w:p>
+      <w:pPr>
+        <w:rPr>
+          <w:rFonts w:ascii="Segoe UI" w:hAnsi="Segoe UI" w:cs="Segoe UI"/>
+          <w:color w:val="ECECF1"/>
+          <w:shd w:val="clear" w:color="auto" w:fill="343541"/>
+        </w:rPr>
+      </w:pPr>
+    </w:p>
+    <w:p>
+      <w:pPr>
+        <w:rPr>
+          <w:rFonts w:ascii="Segoe UI" w:hAnsi="Segoe UI" w:cs="Segoe UI"/>
+          <w:color w:val="ECECF1"/>
+          <w:shd w:val="clear" w:color="auto" w:fill="343541"/>
+        </w:rPr>
+      </w:pPr>
+      <w:r>
+        <w:rPr>
+          <w:rFonts w:ascii="Segoe UI" w:hAnsi="Segoe UI" w:cs="Segoe UI"/>
+          <w:color w:val="ECECF1"/>
+          <w:shd w:val="clear" w:color="auto" w:fill="343541"/>
+        </w:rPr>
+        <w:t xml:space="preserve">15 итерация: </w:t>
+      </w:r>
+    </w:p>
+    <w:p>
+      <w:pPr>
+        <w:rPr>
+          <w:rFonts w:ascii="Segoe UI" w:hAnsi="Segoe UI" w:cs="Segoe UI"/>
+          <w:color w:val="ECECF1"/>
+          <w:shd w:val="clear" w:color="auto" w:fill="343541"/>
+        </w:rPr>
+      </w:pPr>
+      <w:r>
+        <w:rPr>
+          <w:rFonts w:ascii="Segoe UI" w:hAnsi="Segoe UI" w:cs="Segoe UI"/>
+          <w:color w:val="ECECF1"/>
+          <w:shd w:val="clear" w:color="auto" w:fill="343541"/>
+        </w:rPr>
+        <w:t xml:space="preserve">1 Исправить систему хранилища игровых предметов. Основная проблема состоит в </w:t>
+      </w:r>
+      <w:proofErr w:type="gramStart"/>
+      <w:r>
+        <w:rPr>
+          <w:rFonts w:ascii="Segoe UI" w:hAnsi="Segoe UI" w:cs="Segoe UI"/>
+          <w:color w:val="ECECF1"/>
+          <w:shd w:val="clear" w:color="auto" w:fill="343541"/>
+        </w:rPr>
+        <w:t>том</w:t>
+      </w:r>
+      <w:proofErr w:type="gramEnd"/>
+      <w:r>
+        <w:rPr>
+          <w:rFonts w:ascii="Segoe UI" w:hAnsi="Segoe UI" w:cs="Segoe UI"/>
+          <w:color w:val="ECECF1"/>
+          <w:shd w:val="clear" w:color="auto" w:fill="343541"/>
+        </w:rPr>
+        <w:t xml:space="preserve"> что система хранилища была доработана для системы торговли после ее первого создания, что добавило баг. Суть проблемы в том что система торговли </w:t>
+      </w:r>
+      <w:proofErr w:type="gramStart"/>
+      <w:r>
+        <w:rPr>
+          <w:rFonts w:ascii="Segoe UI" w:hAnsi="Segoe UI" w:cs="Segoe UI"/>
+          <w:color w:val="ECECF1"/>
+          <w:shd w:val="clear" w:color="auto" w:fill="343541"/>
+        </w:rPr>
+        <w:t>оперирует(</w:t>
+      </w:r>
+      <w:proofErr w:type="gramEnd"/>
+      <w:r>
+        <w:rPr>
+          <w:rFonts w:ascii="Segoe UI" w:hAnsi="Segoe UI" w:cs="Segoe UI"/>
+          <w:color w:val="ECECF1"/>
+          <w:shd w:val="clear" w:color="auto" w:fill="343541"/>
+        </w:rPr>
+        <w:t xml:space="preserve">помещает и извлекает предметы) с хранилищем на самом низком уровне, в то время как часть функционала который занимается обновлением UI инвентаря игрока находится на более высоком уровне, что привело к тому что инвентарь не обновляется после покупки продажи предметов. </w:t>
+      </w:r>
+    </w:p>
+    <w:p>
+      <w:pPr>
+        <w:rPr>
+          <w:rFonts w:ascii="Segoe UI" w:hAnsi="Segoe UI" w:cs="Segoe UI"/>
+          <w:color w:val="ECECF1"/>
+          <w:shd w:val="clear" w:color="auto" w:fill="343541"/>
+        </w:rPr>
+      </w:pPr>
+      <w:r>
+        <w:rPr>
+          <w:rFonts w:ascii="Segoe UI" w:hAnsi="Segoe UI" w:cs="Segoe UI"/>
+          <w:color w:val="ECECF1"/>
+          <w:shd w:val="clear" w:color="auto" w:fill="343541"/>
+        </w:rPr>
+        <w:t xml:space="preserve">2 Следующая проблемы являются </w:t>
+      </w:r>
+      <w:proofErr w:type="spellStart"/>
+      <w:proofErr w:type="gramStart"/>
+      <w:r>
+        <w:rPr>
+          <w:rFonts w:ascii="Segoe UI" w:hAnsi="Segoe UI" w:cs="Segoe UI"/>
+          <w:color w:val="ECECF1"/>
+          <w:shd w:val="clear" w:color="auto" w:fill="343541"/>
+        </w:rPr>
+        <w:t>комплекснимы</w:t>
+      </w:r>
+      <w:proofErr w:type="spellEnd"/>
+      <w:proofErr w:type="gramEnd"/>
+      <w:r>
+        <w:rPr>
+          <w:rFonts w:ascii="Segoe UI" w:hAnsi="Segoe UI" w:cs="Segoe UI"/>
+          <w:color w:val="ECECF1"/>
+          <w:shd w:val="clear" w:color="auto" w:fill="343541"/>
+        </w:rPr>
+        <w:t xml:space="preserve"> но их я хочу разбить на несколько пунктов. Суть проблемы можно выразить словосочетанием технический долг. Так как было </w:t>
+      </w:r>
+      <w:proofErr w:type="spellStart"/>
+      <w:r>
+        <w:rPr>
+          <w:rFonts w:ascii="Segoe UI" w:hAnsi="Segoe UI" w:cs="Segoe UI"/>
+          <w:color w:val="ECECF1"/>
+          <w:shd w:val="clear" w:color="auto" w:fill="343541"/>
+        </w:rPr>
+        <w:t>добавленно</w:t>
+      </w:r>
+      <w:proofErr w:type="spellEnd"/>
+      <w:r>
+        <w:rPr>
+          <w:rFonts w:ascii="Segoe UI" w:hAnsi="Segoe UI" w:cs="Segoe UI"/>
+          <w:color w:val="ECECF1"/>
+          <w:shd w:val="clear" w:color="auto" w:fill="343541"/>
+        </w:rPr>
+        <w:t xml:space="preserve"> несколько различных подсистем в игру появляются некоторые сложности в управлении проекта </w:t>
+      </w:r>
+      <w:proofErr w:type="gramStart"/>
+      <w:r>
+        <w:rPr>
+          <w:rFonts w:ascii="Segoe UI" w:hAnsi="Segoe UI" w:cs="Segoe UI"/>
+          <w:color w:val="ECECF1"/>
+          <w:shd w:val="clear" w:color="auto" w:fill="343541"/>
+        </w:rPr>
+        <w:t>из-за того что</w:t>
+      </w:r>
+      <w:proofErr w:type="gramEnd"/>
+      <w:r>
+        <w:rPr>
+          <w:rFonts w:ascii="Segoe UI" w:hAnsi="Segoe UI" w:cs="Segoe UI"/>
+          <w:color w:val="ECECF1"/>
+          <w:shd w:val="clear" w:color="auto" w:fill="343541"/>
+        </w:rPr>
+        <w:t xml:space="preserve"> все </w:t>
+      </w:r>
+      <w:proofErr w:type="spellStart"/>
+      <w:r>
+        <w:rPr>
+          <w:rFonts w:ascii="Segoe UI" w:hAnsi="Segoe UI" w:cs="Segoe UI"/>
+          <w:color w:val="ECECF1"/>
+          <w:shd w:val="clear" w:color="auto" w:fill="343541"/>
+        </w:rPr>
+        <w:t>раскиданно</w:t>
+      </w:r>
+      <w:proofErr w:type="spellEnd"/>
+      <w:r>
+        <w:rPr>
+          <w:rFonts w:ascii="Segoe UI" w:hAnsi="Segoe UI" w:cs="Segoe UI"/>
+          <w:color w:val="ECECF1"/>
+          <w:shd w:val="clear" w:color="auto" w:fill="343541"/>
+        </w:rPr>
+        <w:t xml:space="preserve"> по всему проекту. Нужно навести порядок. Нужно навести порядок с </w:t>
+      </w:r>
+      <w:proofErr w:type="spellStart"/>
+      <w:r>
+        <w:rPr>
+          <w:rFonts w:ascii="Segoe UI" w:hAnsi="Segoe UI" w:cs="Segoe UI"/>
+          <w:color w:val="ECECF1"/>
+          <w:shd w:val="clear" w:color="auto" w:fill="343541"/>
+        </w:rPr>
+        <w:t>префабами</w:t>
+      </w:r>
+      <w:proofErr w:type="spellEnd"/>
+      <w:r>
+        <w:rPr>
+          <w:rFonts w:ascii="Segoe UI" w:hAnsi="Segoe UI" w:cs="Segoe UI"/>
+          <w:color w:val="ECECF1"/>
+          <w:shd w:val="clear" w:color="auto" w:fill="343541"/>
+        </w:rPr>
+        <w:t xml:space="preserve">, это касается только структуры проекта. Особенно нужно обратить внимание на UI префабы </w:t>
+      </w:r>
+      <w:proofErr w:type="spellStart"/>
+      <w:r>
+        <w:rPr>
+          <w:rFonts w:ascii="Segoe UI" w:hAnsi="Segoe UI" w:cs="Segoe UI"/>
+          <w:color w:val="ECECF1"/>
+          <w:shd w:val="clear" w:color="auto" w:fill="343541"/>
+        </w:rPr>
+        <w:t>потому-что</w:t>
+      </w:r>
+      <w:proofErr w:type="spellEnd"/>
+      <w:r>
+        <w:rPr>
+          <w:rFonts w:ascii="Segoe UI" w:hAnsi="Segoe UI" w:cs="Segoe UI"/>
+          <w:color w:val="ECECF1"/>
+          <w:shd w:val="clear" w:color="auto" w:fill="343541"/>
+        </w:rPr>
+        <w:t xml:space="preserve"> их порой приходится искать </w:t>
+      </w:r>
+      <w:proofErr w:type="gramStart"/>
+      <w:r>
+        <w:rPr>
+          <w:rFonts w:ascii="Segoe UI" w:hAnsi="Segoe UI" w:cs="Segoe UI"/>
+          <w:color w:val="ECECF1"/>
+          <w:shd w:val="clear" w:color="auto" w:fill="343541"/>
+        </w:rPr>
+        <w:t>там где</w:t>
+      </w:r>
+      <w:proofErr w:type="gramEnd"/>
+      <w:r>
+        <w:rPr>
+          <w:rFonts w:ascii="Segoe UI" w:hAnsi="Segoe UI" w:cs="Segoe UI"/>
+          <w:color w:val="ECECF1"/>
+          <w:shd w:val="clear" w:color="auto" w:fill="343541"/>
+        </w:rPr>
+        <w:t xml:space="preserve"> их не должно быть. </w:t>
+      </w:r>
+    </w:p>
+    <w:p>
+      <w:pPr>
+        <w:rPr>
+          <w:rFonts w:ascii="Segoe UI" w:hAnsi="Segoe UI" w:cs="Segoe UI"/>
+          <w:color w:val="ECECF1"/>
+          <w:shd w:val="clear" w:color="auto" w:fill="343541"/>
+        </w:rPr>
+      </w:pPr>
+      <w:r>
+        <w:rPr>
+          <w:rFonts w:ascii="Segoe UI" w:hAnsi="Segoe UI" w:cs="Segoe UI"/>
+          <w:color w:val="ECECF1"/>
+          <w:shd w:val="clear" w:color="auto" w:fill="343541"/>
+        </w:rPr>
+        <w:t xml:space="preserve">3 Очередной проблемой по организации проекта, находится в подкатегории: статические данные. Здесь больше работы чем просто реорганизовать структуру хранения данных. Здесь так же нужно пересмотреть саму структуру статических данных и реорганизовать саму структуру, что в свою очередь повлечет за собой изменения в виде обновления кодовой базы. </w:t>
+      </w:r>
+    </w:p>
+    <w:p>
+      <w:pPr>
+        <w:rPr>
+          <w:rFonts w:ascii="Segoe UI" w:hAnsi="Segoe UI" w:cs="Segoe UI"/>
+          <w:color w:val="ECECF1"/>
+          <w:shd w:val="clear" w:color="auto" w:fill="343541"/>
+        </w:rPr>
+      </w:pPr>
+      <w:r>
+        <w:rPr>
+          <w:rFonts w:ascii="Segoe UI" w:hAnsi="Segoe UI" w:cs="Segoe UI"/>
+          <w:color w:val="ECECF1"/>
+          <w:shd w:val="clear" w:color="auto" w:fill="343541"/>
+        </w:rPr>
+        <w:t xml:space="preserve">4 </w:t>
+      </w:r>
+      <w:proofErr w:type="spellStart"/>
+      <w:r>
+        <w:rPr>
+          <w:rFonts w:ascii="Segoe UI" w:hAnsi="Segoe UI" w:cs="Segoe UI"/>
+          <w:color w:val="ECECF1"/>
+          <w:shd w:val="clear" w:color="auto" w:fill="343541"/>
+        </w:rPr>
+        <w:t>Паралельно</w:t>
+      </w:r>
+      <w:proofErr w:type="spellEnd"/>
+      <w:r>
+        <w:rPr>
+          <w:rFonts w:ascii="Segoe UI" w:hAnsi="Segoe UI" w:cs="Segoe UI"/>
+          <w:color w:val="ECECF1"/>
+          <w:shd w:val="clear" w:color="auto" w:fill="343541"/>
+        </w:rPr>
+        <w:t xml:space="preserve"> хочу запустить в разработку прототип новой боевой системы, который позволит улучшить текущую, точного представления то как она должна выглядеть нету, </w:t>
+      </w:r>
+      <w:proofErr w:type="gramStart"/>
+      <w:r>
+        <w:rPr>
+          <w:rFonts w:ascii="Segoe UI" w:hAnsi="Segoe UI" w:cs="Segoe UI"/>
+          <w:color w:val="ECECF1"/>
+          <w:shd w:val="clear" w:color="auto" w:fill="343541"/>
+        </w:rPr>
+        <w:t>во время</w:t>
+      </w:r>
+      <w:proofErr w:type="gramEnd"/>
+      <w:r>
+        <w:rPr>
+          <w:rFonts w:ascii="Segoe UI" w:hAnsi="Segoe UI" w:cs="Segoe UI"/>
+          <w:color w:val="ECECF1"/>
+          <w:shd w:val="clear" w:color="auto" w:fill="343541"/>
+        </w:rPr>
+        <w:t xml:space="preserve"> </w:t>
+      </w:r>
+      <w:proofErr w:type="spellStart"/>
+      <w:r>
+        <w:rPr>
+          <w:rFonts w:ascii="Segoe UI" w:hAnsi="Segoe UI" w:cs="Segoe UI"/>
+          <w:color w:val="ECECF1"/>
+          <w:shd w:val="clear" w:color="auto" w:fill="343541"/>
+        </w:rPr>
+        <w:t>прототипирования</w:t>
+      </w:r>
+      <w:proofErr w:type="spellEnd"/>
+      <w:r>
+        <w:rPr>
+          <w:rFonts w:ascii="Segoe UI" w:hAnsi="Segoe UI" w:cs="Segoe UI"/>
+          <w:color w:val="ECECF1"/>
+          <w:shd w:val="clear" w:color="auto" w:fill="343541"/>
+        </w:rPr>
+        <w:t xml:space="preserve"> надеюсь что найду хороший вариант. Зачем обновлять эту механику? Все просто если посмотреть на мой текущий </w:t>
+      </w:r>
+      <w:proofErr w:type="gramStart"/>
+      <w:r>
+        <w:rPr>
+          <w:rFonts w:ascii="Segoe UI" w:hAnsi="Segoe UI" w:cs="Segoe UI"/>
+          <w:color w:val="ECECF1"/>
+          <w:shd w:val="clear" w:color="auto" w:fill="343541"/>
+        </w:rPr>
+        <w:t>проект</w:t>
+      </w:r>
+      <w:proofErr w:type="gramEnd"/>
+      <w:r>
+        <w:rPr>
+          <w:rFonts w:ascii="Segoe UI" w:hAnsi="Segoe UI" w:cs="Segoe UI"/>
+          <w:color w:val="ECECF1"/>
+          <w:shd w:val="clear" w:color="auto" w:fill="343541"/>
+        </w:rPr>
+        <w:t xml:space="preserve"> то основная часть </w:t>
+      </w:r>
+      <w:proofErr w:type="spellStart"/>
+      <w:r>
+        <w:rPr>
+          <w:rFonts w:ascii="Segoe UI" w:hAnsi="Segoe UI" w:cs="Segoe UI"/>
+          <w:color w:val="ECECF1"/>
+          <w:shd w:val="clear" w:color="auto" w:fill="343541"/>
+        </w:rPr>
+        <w:t>геймплея</w:t>
+      </w:r>
+      <w:proofErr w:type="spellEnd"/>
+      <w:r>
+        <w:rPr>
+          <w:rFonts w:ascii="Segoe UI" w:hAnsi="Segoe UI" w:cs="Segoe UI"/>
+          <w:color w:val="ECECF1"/>
+          <w:shd w:val="clear" w:color="auto" w:fill="343541"/>
+        </w:rPr>
+        <w:t xml:space="preserve"> это бои, а текущая </w:t>
+      </w:r>
+      <w:proofErr w:type="spellStart"/>
+      <w:r>
+        <w:rPr>
+          <w:rFonts w:ascii="Segoe UI" w:hAnsi="Segoe UI" w:cs="Segoe UI"/>
+          <w:color w:val="ECECF1"/>
+          <w:shd w:val="clear" w:color="auto" w:fill="343541"/>
+        </w:rPr>
+        <w:t>боевка</w:t>
+      </w:r>
+      <w:proofErr w:type="spellEnd"/>
+      <w:r>
+        <w:rPr>
+          <w:rFonts w:ascii="Segoe UI" w:hAnsi="Segoe UI" w:cs="Segoe UI"/>
+          <w:color w:val="ECECF1"/>
+          <w:shd w:val="clear" w:color="auto" w:fill="343541"/>
+        </w:rPr>
+        <w:t xml:space="preserve"> мягко говоря не очень для победы над врагом игроку достаточно просто тыкать на </w:t>
+      </w:r>
+      <w:proofErr w:type="spellStart"/>
+      <w:r>
+        <w:rPr>
+          <w:rFonts w:ascii="Segoe UI" w:hAnsi="Segoe UI" w:cs="Segoe UI"/>
+          <w:color w:val="ECECF1"/>
+          <w:shd w:val="clear" w:color="auto" w:fill="343541"/>
+        </w:rPr>
+        <w:t>лкм</w:t>
+      </w:r>
+      <w:proofErr w:type="spellEnd"/>
+      <w:r>
+        <w:rPr>
+          <w:rFonts w:ascii="Segoe UI" w:hAnsi="Segoe UI" w:cs="Segoe UI"/>
+          <w:color w:val="ECECF1"/>
+          <w:shd w:val="clear" w:color="auto" w:fill="343541"/>
+        </w:rPr>
+        <w:t xml:space="preserve"> и пить зелья. Эту часть нужно разнообразить. Также я не исключаю тот вариант что </w:t>
+      </w:r>
+      <w:proofErr w:type="spellStart"/>
+      <w:r>
+        <w:rPr>
+          <w:rFonts w:ascii="Segoe UI" w:hAnsi="Segoe UI" w:cs="Segoe UI"/>
+          <w:color w:val="ECECF1"/>
+          <w:shd w:val="clear" w:color="auto" w:fill="343541"/>
+        </w:rPr>
+        <w:t>прийдется</w:t>
+      </w:r>
+      <w:proofErr w:type="spellEnd"/>
+      <w:r>
+        <w:rPr>
+          <w:rFonts w:ascii="Segoe UI" w:hAnsi="Segoe UI" w:cs="Segoe UI"/>
+          <w:color w:val="ECECF1"/>
+          <w:shd w:val="clear" w:color="auto" w:fill="343541"/>
+        </w:rPr>
+        <w:t xml:space="preserve"> пересмотреть в общем весь игровой процесс, и вместо </w:t>
+      </w:r>
+      <w:proofErr w:type="spellStart"/>
+      <w:r>
+        <w:rPr>
+          <w:rFonts w:ascii="Segoe UI" w:hAnsi="Segoe UI" w:cs="Segoe UI"/>
+          <w:color w:val="ECECF1"/>
+          <w:shd w:val="clear" w:color="auto" w:fill="343541"/>
+        </w:rPr>
+        <w:t>текущиего</w:t>
+      </w:r>
+      <w:proofErr w:type="spellEnd"/>
+      <w:r>
+        <w:rPr>
+          <w:rFonts w:ascii="Segoe UI" w:hAnsi="Segoe UI" w:cs="Segoe UI"/>
+          <w:color w:val="ECECF1"/>
+          <w:shd w:val="clear" w:color="auto" w:fill="343541"/>
+        </w:rPr>
+        <w:t xml:space="preserve"> вида сверху использовать вид от первого лица. </w:t>
+      </w:r>
+    </w:p>
+    <w:p>
+      <w:pPr>
+        <w:rPr>
+          <w:rFonts w:ascii="Segoe UI" w:hAnsi="Segoe UI" w:cs="Segoe UI"/>
+          <w:color w:val="ECECF1"/>
+          <w:shd w:val="clear" w:color="auto" w:fill="343541"/>
+        </w:rPr>
+      </w:pPr>
       <w:bookmarkStart w:id="0" w:name="_GoBack"/>
       <w:bookmarkEnd w:id="0"/>
       <w:r>
         <w:rPr>
           <w:rFonts w:ascii="Segoe UI" w:hAnsi="Segoe UI" w:cs="Segoe UI"/>
-          <w:strike/>
-          <w:color w:val="ECECF1"/>
-          <w:shd w:val="clear" w:color="auto" w:fill="343541"/>
-        </w:rPr>
-        <w:t xml:space="preserve">ь анимации </w:t>
-      </w:r>
-      <w:proofErr w:type="gramStart"/>
-      <w:r>
-        <w:rPr>
-          <w:rFonts w:ascii="Segoe UI" w:hAnsi="Segoe UI" w:cs="Segoe UI"/>
-          <w:strike/>
-          <w:color w:val="ECECF1"/>
-          <w:shd w:val="clear" w:color="auto" w:fill="343541"/>
-        </w:rPr>
-        <w:t>на мобов</w:t>
-      </w:r>
-      <w:proofErr w:type="gramEnd"/>
-      <w:r>
-        <w:rPr>
-          <w:rFonts w:ascii="Segoe UI" w:hAnsi="Segoe UI" w:cs="Segoe UI"/>
-          <w:strike/>
-          <w:color w:val="ECECF1"/>
-          <w:shd w:val="clear" w:color="auto" w:fill="343541"/>
-        </w:rPr>
-        <w:t>.</w:t>
-      </w:r>
-    </w:p>
-    <w:p>
-      <w:pPr>
-        <w:rPr>
-          <w:rFonts w:ascii="Segoe UI" w:hAnsi="Segoe UI" w:cs="Segoe UI"/>
-          <w:color w:val="ECECF1"/>
-          <w:shd w:val="clear" w:color="auto" w:fill="343541"/>
-        </w:rPr>
-      </w:pPr>
-      <w:r>
-        <w:rPr>
-          <w:rFonts w:ascii="Segoe UI" w:hAnsi="Segoe UI" w:cs="Segoe UI"/>
-          <w:color w:val="ECECF1"/>
-          <w:shd w:val="clear" w:color="auto" w:fill="343541"/>
-        </w:rPr>
-        <w:t xml:space="preserve">8 </w:t>
-      </w:r>
-      <w:proofErr w:type="gramStart"/>
-      <w:r>
-        <w:rPr>
-          <w:rFonts w:ascii="Segoe UI" w:hAnsi="Segoe UI" w:cs="Segoe UI"/>
-          <w:color w:val="ECECF1"/>
-          <w:shd w:val="clear" w:color="auto" w:fill="343541"/>
-        </w:rPr>
-        <w:t>Думать</w:t>
-      </w:r>
-      <w:proofErr w:type="gramEnd"/>
-      <w:r>
-        <w:rPr>
-          <w:rFonts w:ascii="Segoe UI" w:hAnsi="Segoe UI" w:cs="Segoe UI"/>
-          <w:color w:val="ECECF1"/>
-          <w:shd w:val="clear" w:color="auto" w:fill="343541"/>
-        </w:rPr>
-        <w:t xml:space="preserve"> как можно организовать рандомную генерацию мира, и начать работу над прототипом </w:t>
+          <w:color w:val="ECECF1"/>
+          <w:shd w:val="clear" w:color="auto" w:fill="343541"/>
+        </w:rPr>
+        <w:t xml:space="preserve">5 </w:t>
       </w:r>
       <w:proofErr w:type="spellStart"/>
       <w:r>
@@ -3212,7 +3658,7 @@
           <w:color w:val="ECECF1"/>
           <w:shd w:val="clear" w:color="auto" w:fill="343541"/>
         </w:rPr>
-        <w:t>рандомной</w:t>
+        <w:t>Рандомное</w:t>
       </w:r>
       <w:proofErr w:type="spellEnd"/>
       <w:r>
@@ -3221,8 +3667,98 @@
           <w:color w:val="ECECF1"/>
           <w:shd w:val="clear" w:color="auto" w:fill="343541"/>
         </w:rPr>
-        <w:t xml:space="preserve"> генерации.</w:t>
-      </w:r>
+        <w:t xml:space="preserve"> генерирование подземелья(локаций). Эта задача также выносится на </w:t>
+      </w:r>
+      <w:proofErr w:type="spellStart"/>
+      <w:r>
+        <w:rPr>
+          <w:rFonts w:ascii="Segoe UI" w:hAnsi="Segoe UI" w:cs="Segoe UI"/>
+          <w:color w:val="ECECF1"/>
+          <w:shd w:val="clear" w:color="auto" w:fill="343541"/>
+        </w:rPr>
+        <w:t>прототипирование</w:t>
+      </w:r>
+      <w:proofErr w:type="spellEnd"/>
+      <w:r>
+        <w:rPr>
+          <w:rFonts w:ascii="Segoe UI" w:hAnsi="Segoe UI" w:cs="Segoe UI"/>
+          <w:color w:val="ECECF1"/>
+          <w:shd w:val="clear" w:color="auto" w:fill="343541"/>
+        </w:rPr>
+        <w:t xml:space="preserve"> ведь здесь мне нужно будет помимо самой генерации новых локаций, также разобраться с тем как производить запечку </w:t>
+      </w:r>
+      <w:proofErr w:type="spellStart"/>
+      <w:r>
+        <w:rPr>
+          <w:rFonts w:ascii="Segoe UI" w:hAnsi="Segoe UI" w:cs="Segoe UI"/>
+          <w:color w:val="ECECF1"/>
+          <w:shd w:val="clear" w:color="auto" w:fill="343541"/>
+        </w:rPr>
+        <w:t>навмеша</w:t>
+      </w:r>
+      <w:proofErr w:type="spellEnd"/>
+      <w:r>
+        <w:rPr>
+          <w:rFonts w:ascii="Segoe UI" w:hAnsi="Segoe UI" w:cs="Segoe UI"/>
+          <w:color w:val="ECECF1"/>
+          <w:shd w:val="clear" w:color="auto" w:fill="343541"/>
+        </w:rPr>
+        <w:t xml:space="preserve"> в </w:t>
+      </w:r>
+      <w:proofErr w:type="spellStart"/>
+      <w:r>
+        <w:rPr>
+          <w:rFonts w:ascii="Segoe UI" w:hAnsi="Segoe UI" w:cs="Segoe UI"/>
+          <w:color w:val="ECECF1"/>
+          <w:shd w:val="clear" w:color="auto" w:fill="343541"/>
+        </w:rPr>
+        <w:t>рантайме</w:t>
+      </w:r>
+      <w:proofErr w:type="spellEnd"/>
+      <w:r>
+        <w:rPr>
+          <w:rFonts w:ascii="Segoe UI" w:hAnsi="Segoe UI" w:cs="Segoe UI"/>
+          <w:color w:val="ECECF1"/>
+          <w:shd w:val="clear" w:color="auto" w:fill="343541"/>
+        </w:rPr>
+        <w:t xml:space="preserve">, и здесь мне </w:t>
+      </w:r>
+      <w:proofErr w:type="spellStart"/>
+      <w:r>
+        <w:rPr>
+          <w:rFonts w:ascii="Segoe UI" w:hAnsi="Segoe UI" w:cs="Segoe UI"/>
+          <w:color w:val="ECECF1"/>
+          <w:shd w:val="clear" w:color="auto" w:fill="343541"/>
+        </w:rPr>
+        <w:t>прийдется</w:t>
+      </w:r>
+      <w:proofErr w:type="spellEnd"/>
+      <w:r>
+        <w:rPr>
+          <w:rFonts w:ascii="Segoe UI" w:hAnsi="Segoe UI" w:cs="Segoe UI"/>
+          <w:color w:val="ECECF1"/>
+          <w:shd w:val="clear" w:color="auto" w:fill="343541"/>
+        </w:rPr>
+        <w:t xml:space="preserve"> поиграться. Ну а внедрение новых систем боя и генерации, будут внедряться в последующих итерациях, если к тому времени они будут готовы)</w:t>
+      </w:r>
+    </w:p>
+    <w:p>
+      <w:pPr>
+        <w:rPr>
+          <w:rFonts w:ascii="Segoe UI" w:hAnsi="Segoe UI" w:cs="Segoe UI"/>
+          <w:color w:val="ECECF1"/>
+          <w:shd w:val="clear" w:color="auto" w:fill="343541"/>
+        </w:rPr>
+      </w:pPr>
+    </w:p>
+    <w:p>
+      <w:pPr>
+        <w:rPr>
+          <w:rFonts w:ascii="Segoe UI" w:hAnsi="Segoe UI" w:cs="Segoe UI"/>
+          <w:color w:val="ECECF1"/>
+          <w:shd w:val="clear" w:color="auto" w:fill="343541"/>
+        </w:rPr>
+      </w:pPr>
     </w:p>
     <w:p>
       <w:pPr>

</xml_diff>

<commit_message>
End update Prefab folder structure. Start update StaticData.
</commit_message>
<xml_diff>
--- a/Итерации.docx
+++ b/Итерации.docx
@@ -3243,13 +3243,15 @@
       <w:pPr>
         <w:rPr>
           <w:rFonts w:ascii="Segoe UI" w:hAnsi="Segoe UI" w:cs="Segoe UI"/>
-          <w:color w:val="ECECF1"/>
-          <w:shd w:val="clear" w:color="auto" w:fill="343541"/>
-        </w:rPr>
-      </w:pPr>
-      <w:r>
-        <w:rPr>
-          <w:rFonts w:ascii="Segoe UI" w:hAnsi="Segoe UI" w:cs="Segoe UI"/>
+          <w:strike/>
+          <w:color w:val="ECECF1"/>
+          <w:shd w:val="clear" w:color="auto" w:fill="343541"/>
+        </w:rPr>
+      </w:pPr>
+      <w:r>
+        <w:rPr>
+          <w:rFonts w:ascii="Segoe UI" w:hAnsi="Segoe UI" w:cs="Segoe UI"/>
+          <w:strike/>
           <w:color w:val="ECECF1"/>
           <w:shd w:val="clear" w:color="auto" w:fill="343541"/>
         </w:rPr>
@@ -3259,6 +3261,7 @@
       <w:r>
         <w:rPr>
           <w:rFonts w:ascii="Segoe UI" w:hAnsi="Segoe UI" w:cs="Segoe UI"/>
+          <w:strike/>
           <w:color w:val="ECECF1"/>
           <w:shd w:val="clear" w:color="auto" w:fill="343541"/>
         </w:rPr>
@@ -3268,6 +3271,7 @@
       <w:r>
         <w:rPr>
           <w:rFonts w:ascii="Segoe UI" w:hAnsi="Segoe UI" w:cs="Segoe UI"/>
+          <w:strike/>
           <w:color w:val="ECECF1"/>
           <w:shd w:val="clear" w:color="auto" w:fill="343541"/>
         </w:rPr>
@@ -3277,6 +3281,7 @@
       <w:r>
         <w:rPr>
           <w:rFonts w:ascii="Segoe UI" w:hAnsi="Segoe UI" w:cs="Segoe UI"/>
+          <w:strike/>
           <w:color w:val="ECECF1"/>
           <w:shd w:val="clear" w:color="auto" w:fill="343541"/>
         </w:rPr>
@@ -3286,6 +3291,7 @@
       <w:r>
         <w:rPr>
           <w:rFonts w:ascii="Segoe UI" w:hAnsi="Segoe UI" w:cs="Segoe UI"/>
+          <w:strike/>
           <w:color w:val="ECECF1"/>
           <w:shd w:val="clear" w:color="auto" w:fill="343541"/>
         </w:rPr>
@@ -3296,13 +3302,15 @@
       <w:pPr>
         <w:rPr>
           <w:rFonts w:ascii="Segoe UI" w:hAnsi="Segoe UI" w:cs="Segoe UI"/>
-          <w:color w:val="ECECF1"/>
-          <w:shd w:val="clear" w:color="auto" w:fill="343541"/>
-        </w:rPr>
-      </w:pPr>
-      <w:r>
-        <w:rPr>
-          <w:rFonts w:ascii="Segoe UI" w:hAnsi="Segoe UI" w:cs="Segoe UI"/>
+          <w:strike/>
+          <w:color w:val="ECECF1"/>
+          <w:shd w:val="clear" w:color="auto" w:fill="343541"/>
+        </w:rPr>
+      </w:pPr>
+      <w:r>
+        <w:rPr>
+          <w:rFonts w:ascii="Segoe UI" w:hAnsi="Segoe UI" w:cs="Segoe UI"/>
+          <w:strike/>
           <w:color w:val="ECECF1"/>
           <w:shd w:val="clear" w:color="auto" w:fill="343541"/>
         </w:rPr>
@@ -3313,6 +3321,7 @@
       <w:r>
         <w:rPr>
           <w:rFonts w:ascii="Segoe UI" w:hAnsi="Segoe UI" w:cs="Segoe UI"/>
+          <w:strike/>
           <w:color w:val="ECECF1"/>
           <w:shd w:val="clear" w:color="auto" w:fill="343541"/>
         </w:rPr>
@@ -3323,6 +3332,7 @@
       <w:r>
         <w:rPr>
           <w:rFonts w:ascii="Segoe UI" w:hAnsi="Segoe UI" w:cs="Segoe UI"/>
+          <w:strike/>
           <w:color w:val="ECECF1"/>
           <w:shd w:val="clear" w:color="auto" w:fill="343541"/>
         </w:rPr>
@@ -3332,6 +3342,7 @@
       <w:r>
         <w:rPr>
           <w:rFonts w:ascii="Segoe UI" w:hAnsi="Segoe UI" w:cs="Segoe UI"/>
+          <w:strike/>
           <w:color w:val="ECECF1"/>
           <w:shd w:val="clear" w:color="auto" w:fill="343541"/>
         </w:rPr>
@@ -3341,6 +3352,7 @@
       <w:r>
         <w:rPr>
           <w:rFonts w:ascii="Segoe UI" w:hAnsi="Segoe UI" w:cs="Segoe UI"/>
+          <w:strike/>
           <w:color w:val="ECECF1"/>
           <w:shd w:val="clear" w:color="auto" w:fill="343541"/>
         </w:rPr>
@@ -3350,299 +3362,318 @@
       <w:r>
         <w:rPr>
           <w:rFonts w:ascii="Segoe UI" w:hAnsi="Segoe UI" w:cs="Segoe UI"/>
-          <w:color w:val="ECECF1"/>
-          <w:shd w:val="clear" w:color="auto" w:fill="343541"/>
-        </w:rPr>
-        <w:t>из-за того что</w:t>
-      </w:r>
-      <w:proofErr w:type="gramEnd"/>
-      <w:r>
-        <w:rPr>
-          <w:rFonts w:ascii="Segoe UI" w:hAnsi="Segoe UI" w:cs="Segoe UI"/>
-          <w:color w:val="ECECF1"/>
-          <w:shd w:val="clear" w:color="auto" w:fill="343541"/>
-        </w:rPr>
-        <w:t xml:space="preserve"> все </w:t>
-      </w:r>
-      <w:proofErr w:type="spellStart"/>
-      <w:r>
-        <w:rPr>
-          <w:rFonts w:ascii="Segoe UI" w:hAnsi="Segoe UI" w:cs="Segoe UI"/>
-          <w:color w:val="ECECF1"/>
-          <w:shd w:val="clear" w:color="auto" w:fill="343541"/>
-        </w:rPr>
-        <w:t>раскиданно</w:t>
-      </w:r>
-      <w:proofErr w:type="spellEnd"/>
-      <w:r>
-        <w:rPr>
-          <w:rFonts w:ascii="Segoe UI" w:hAnsi="Segoe UI" w:cs="Segoe UI"/>
-          <w:color w:val="ECECF1"/>
-          <w:shd w:val="clear" w:color="auto" w:fill="343541"/>
-        </w:rPr>
-        <w:t xml:space="preserve"> по всему проекту. Нужно навести порядок. Нужно навести порядок с </w:t>
-      </w:r>
-      <w:proofErr w:type="spellStart"/>
-      <w:r>
-        <w:rPr>
-          <w:rFonts w:ascii="Segoe UI" w:hAnsi="Segoe UI" w:cs="Segoe UI"/>
-          <w:color w:val="ECECF1"/>
-          <w:shd w:val="clear" w:color="auto" w:fill="343541"/>
-        </w:rPr>
-        <w:t>префабами</w:t>
-      </w:r>
-      <w:proofErr w:type="spellEnd"/>
-      <w:r>
-        <w:rPr>
-          <w:rFonts w:ascii="Segoe UI" w:hAnsi="Segoe UI" w:cs="Segoe UI"/>
-          <w:color w:val="ECECF1"/>
-          <w:shd w:val="clear" w:color="auto" w:fill="343541"/>
-        </w:rPr>
-        <w:t xml:space="preserve">, это касается только структуры проекта. Особенно нужно обратить внимание на UI префабы </w:t>
-      </w:r>
-      <w:proofErr w:type="spellStart"/>
-      <w:r>
-        <w:rPr>
-          <w:rFonts w:ascii="Segoe UI" w:hAnsi="Segoe UI" w:cs="Segoe UI"/>
-          <w:color w:val="ECECF1"/>
-          <w:shd w:val="clear" w:color="auto" w:fill="343541"/>
-        </w:rPr>
-        <w:t>потому-что</w:t>
-      </w:r>
-      <w:proofErr w:type="spellEnd"/>
-      <w:r>
-        <w:rPr>
-          <w:rFonts w:ascii="Segoe UI" w:hAnsi="Segoe UI" w:cs="Segoe UI"/>
-          <w:color w:val="ECECF1"/>
-          <w:shd w:val="clear" w:color="auto" w:fill="343541"/>
-        </w:rPr>
-        <w:t xml:space="preserve"> их порой приходится искать </w:t>
-      </w:r>
-      <w:proofErr w:type="gramStart"/>
-      <w:r>
-        <w:rPr>
-          <w:rFonts w:ascii="Segoe UI" w:hAnsi="Segoe UI" w:cs="Segoe UI"/>
-          <w:color w:val="ECECF1"/>
-          <w:shd w:val="clear" w:color="auto" w:fill="343541"/>
-        </w:rPr>
-        <w:t>там где</w:t>
-      </w:r>
-      <w:proofErr w:type="gramEnd"/>
-      <w:r>
-        <w:rPr>
-          <w:rFonts w:ascii="Segoe UI" w:hAnsi="Segoe UI" w:cs="Segoe UI"/>
-          <w:color w:val="ECECF1"/>
-          <w:shd w:val="clear" w:color="auto" w:fill="343541"/>
-        </w:rPr>
-        <w:t xml:space="preserve"> их не должно быть. </w:t>
-      </w:r>
-    </w:p>
-    <w:p>
-      <w:pPr>
-        <w:rPr>
-          <w:rFonts w:ascii="Segoe UI" w:hAnsi="Segoe UI" w:cs="Segoe UI"/>
-          <w:color w:val="ECECF1"/>
-          <w:shd w:val="clear" w:color="auto" w:fill="343541"/>
-        </w:rPr>
-      </w:pPr>
-      <w:r>
-        <w:rPr>
-          <w:rFonts w:ascii="Segoe UI" w:hAnsi="Segoe UI" w:cs="Segoe UI"/>
-          <w:color w:val="ECECF1"/>
-          <w:shd w:val="clear" w:color="auto" w:fill="343541"/>
-        </w:rPr>
-        <w:t xml:space="preserve">3 Очередной проблемой по организации проекта, находится в подкатегории: статические данные. Здесь больше работы чем просто реорганизовать структуру хранения данных. Здесь так же нужно пересмотреть саму структуру статических данных и реорганизовать саму структуру, что в свою очередь повлечет за собой изменения в виде обновления кодовой базы. </w:t>
-      </w:r>
-    </w:p>
-    <w:p>
-      <w:pPr>
-        <w:rPr>
-          <w:rFonts w:ascii="Segoe UI" w:hAnsi="Segoe UI" w:cs="Segoe UI"/>
-          <w:color w:val="ECECF1"/>
-          <w:shd w:val="clear" w:color="auto" w:fill="343541"/>
-        </w:rPr>
-      </w:pPr>
-      <w:r>
-        <w:rPr>
-          <w:rFonts w:ascii="Segoe UI" w:hAnsi="Segoe UI" w:cs="Segoe UI"/>
-          <w:color w:val="ECECF1"/>
-          <w:shd w:val="clear" w:color="auto" w:fill="343541"/>
-        </w:rPr>
-        <w:t xml:space="preserve">4 </w:t>
-      </w:r>
-      <w:proofErr w:type="spellStart"/>
-      <w:r>
-        <w:rPr>
-          <w:rFonts w:ascii="Segoe UI" w:hAnsi="Segoe UI" w:cs="Segoe UI"/>
-          <w:color w:val="ECECF1"/>
-          <w:shd w:val="clear" w:color="auto" w:fill="343541"/>
-        </w:rPr>
-        <w:t>Паралельно</w:t>
-      </w:r>
-      <w:proofErr w:type="spellEnd"/>
-      <w:r>
-        <w:rPr>
-          <w:rFonts w:ascii="Segoe UI" w:hAnsi="Segoe UI" w:cs="Segoe UI"/>
-          <w:color w:val="ECECF1"/>
-          <w:shd w:val="clear" w:color="auto" w:fill="343541"/>
-        </w:rPr>
-        <w:t xml:space="preserve"> хочу запустить в разработку прототип новой боевой системы, который позволит улучшить текущую, точного представления то как она должна выглядеть нету, </w:t>
-      </w:r>
-      <w:proofErr w:type="gramStart"/>
-      <w:r>
-        <w:rPr>
-          <w:rFonts w:ascii="Segoe UI" w:hAnsi="Segoe UI" w:cs="Segoe UI"/>
-          <w:color w:val="ECECF1"/>
-          <w:shd w:val="clear" w:color="auto" w:fill="343541"/>
-        </w:rPr>
-        <w:t>во время</w:t>
-      </w:r>
-      <w:proofErr w:type="gramEnd"/>
-      <w:r>
-        <w:rPr>
-          <w:rFonts w:ascii="Segoe UI" w:hAnsi="Segoe UI" w:cs="Segoe UI"/>
-          <w:color w:val="ECECF1"/>
-          <w:shd w:val="clear" w:color="auto" w:fill="343541"/>
-        </w:rPr>
-        <w:t xml:space="preserve"> </w:t>
-      </w:r>
-      <w:proofErr w:type="spellStart"/>
-      <w:r>
-        <w:rPr>
-          <w:rFonts w:ascii="Segoe UI" w:hAnsi="Segoe UI" w:cs="Segoe UI"/>
-          <w:color w:val="ECECF1"/>
-          <w:shd w:val="clear" w:color="auto" w:fill="343541"/>
-        </w:rPr>
-        <w:t>прототипирования</w:t>
-      </w:r>
-      <w:proofErr w:type="spellEnd"/>
-      <w:r>
-        <w:rPr>
-          <w:rFonts w:ascii="Segoe UI" w:hAnsi="Segoe UI" w:cs="Segoe UI"/>
-          <w:color w:val="ECECF1"/>
-          <w:shd w:val="clear" w:color="auto" w:fill="343541"/>
-        </w:rPr>
-        <w:t xml:space="preserve"> надеюсь что найду хороший вариант. Зачем обновлять эту механику? Все просто если посмотреть на мой текущий </w:t>
-      </w:r>
-      <w:proofErr w:type="gramStart"/>
-      <w:r>
-        <w:rPr>
-          <w:rFonts w:ascii="Segoe UI" w:hAnsi="Segoe UI" w:cs="Segoe UI"/>
-          <w:color w:val="ECECF1"/>
-          <w:shd w:val="clear" w:color="auto" w:fill="343541"/>
-        </w:rPr>
-        <w:t>проект</w:t>
-      </w:r>
-      <w:proofErr w:type="gramEnd"/>
-      <w:r>
-        <w:rPr>
-          <w:rFonts w:ascii="Segoe UI" w:hAnsi="Segoe UI" w:cs="Segoe UI"/>
-          <w:color w:val="ECECF1"/>
-          <w:shd w:val="clear" w:color="auto" w:fill="343541"/>
-        </w:rPr>
-        <w:t xml:space="preserve"> то основная часть </w:t>
-      </w:r>
-      <w:proofErr w:type="spellStart"/>
-      <w:r>
-        <w:rPr>
-          <w:rFonts w:ascii="Segoe UI" w:hAnsi="Segoe UI" w:cs="Segoe UI"/>
-          <w:color w:val="ECECF1"/>
-          <w:shd w:val="clear" w:color="auto" w:fill="343541"/>
-        </w:rPr>
-        <w:t>геймплея</w:t>
-      </w:r>
-      <w:proofErr w:type="spellEnd"/>
-      <w:r>
-        <w:rPr>
-          <w:rFonts w:ascii="Segoe UI" w:hAnsi="Segoe UI" w:cs="Segoe UI"/>
-          <w:color w:val="ECECF1"/>
-          <w:shd w:val="clear" w:color="auto" w:fill="343541"/>
-        </w:rPr>
-        <w:t xml:space="preserve"> это бои, а текущая </w:t>
-      </w:r>
-      <w:proofErr w:type="spellStart"/>
-      <w:r>
-        <w:rPr>
-          <w:rFonts w:ascii="Segoe UI" w:hAnsi="Segoe UI" w:cs="Segoe UI"/>
-          <w:color w:val="ECECF1"/>
-          <w:shd w:val="clear" w:color="auto" w:fill="343541"/>
-        </w:rPr>
-        <w:t>боевка</w:t>
-      </w:r>
-      <w:proofErr w:type="spellEnd"/>
-      <w:r>
-        <w:rPr>
-          <w:rFonts w:ascii="Segoe UI" w:hAnsi="Segoe UI" w:cs="Segoe UI"/>
-          <w:color w:val="ECECF1"/>
-          <w:shd w:val="clear" w:color="auto" w:fill="343541"/>
-        </w:rPr>
-        <w:t xml:space="preserve"> мягко говоря не очень для победы над врагом игроку достаточно просто тыкать на </w:t>
-      </w:r>
-      <w:proofErr w:type="spellStart"/>
-      <w:r>
-        <w:rPr>
-          <w:rFonts w:ascii="Segoe UI" w:hAnsi="Segoe UI" w:cs="Segoe UI"/>
-          <w:color w:val="ECECF1"/>
-          <w:shd w:val="clear" w:color="auto" w:fill="343541"/>
-        </w:rPr>
-        <w:t>лкм</w:t>
-      </w:r>
-      <w:proofErr w:type="spellEnd"/>
-      <w:r>
-        <w:rPr>
-          <w:rFonts w:ascii="Segoe UI" w:hAnsi="Segoe UI" w:cs="Segoe UI"/>
-          <w:color w:val="ECECF1"/>
-          <w:shd w:val="clear" w:color="auto" w:fill="343541"/>
-        </w:rPr>
-        <w:t xml:space="preserve"> и пить зелья. Эту часть нужно разнообразить. Также я не исключаю тот вариант что </w:t>
-      </w:r>
-      <w:proofErr w:type="spellStart"/>
-      <w:r>
-        <w:rPr>
-          <w:rFonts w:ascii="Segoe UI" w:hAnsi="Segoe UI" w:cs="Segoe UI"/>
-          <w:color w:val="ECECF1"/>
-          <w:shd w:val="clear" w:color="auto" w:fill="343541"/>
-        </w:rPr>
-        <w:t>прийдется</w:t>
-      </w:r>
-      <w:proofErr w:type="spellEnd"/>
-      <w:r>
-        <w:rPr>
-          <w:rFonts w:ascii="Segoe UI" w:hAnsi="Segoe UI" w:cs="Segoe UI"/>
-          <w:color w:val="ECECF1"/>
-          <w:shd w:val="clear" w:color="auto" w:fill="343541"/>
-        </w:rPr>
-        <w:t xml:space="preserve"> пересмотреть в общем весь игровой процесс, и вместо </w:t>
-      </w:r>
-      <w:proofErr w:type="spellStart"/>
-      <w:r>
-        <w:rPr>
-          <w:rFonts w:ascii="Segoe UI" w:hAnsi="Segoe UI" w:cs="Segoe UI"/>
-          <w:color w:val="ECECF1"/>
-          <w:shd w:val="clear" w:color="auto" w:fill="343541"/>
-        </w:rPr>
-        <w:t>текущиего</w:t>
-      </w:r>
-      <w:proofErr w:type="spellEnd"/>
-      <w:r>
-        <w:rPr>
-          <w:rFonts w:ascii="Segoe UI" w:hAnsi="Segoe UI" w:cs="Segoe UI"/>
-          <w:color w:val="ECECF1"/>
-          <w:shd w:val="clear" w:color="auto" w:fill="343541"/>
-        </w:rPr>
-        <w:t xml:space="preserve"> вида сверху использовать вид от первого лица. </w:t>
-      </w:r>
-    </w:p>
-    <w:p>
-      <w:pPr>
-        <w:rPr>
-          <w:rFonts w:ascii="Segoe UI" w:hAnsi="Segoe UI" w:cs="Segoe UI"/>
-          <w:color w:val="ECECF1"/>
-          <w:shd w:val="clear" w:color="auto" w:fill="343541"/>
-        </w:rPr>
-      </w:pPr>
+          <w:strike/>
+          <w:color w:val="ECECF1"/>
+          <w:shd w:val="clear" w:color="auto" w:fill="343541"/>
+        </w:rPr>
+        <w:t>из-за то</w:t>
+      </w:r>
       <w:bookmarkStart w:id="0" w:name="_GoBack"/>
       <w:bookmarkEnd w:id="0"/>
+      <w:r>
+        <w:rPr>
+          <w:rFonts w:ascii="Segoe UI" w:hAnsi="Segoe UI" w:cs="Segoe UI"/>
+          <w:strike/>
+          <w:color w:val="ECECF1"/>
+          <w:shd w:val="clear" w:color="auto" w:fill="343541"/>
+        </w:rPr>
+        <w:t>го что</w:t>
+      </w:r>
+      <w:proofErr w:type="gramEnd"/>
+      <w:r>
+        <w:rPr>
+          <w:rFonts w:ascii="Segoe UI" w:hAnsi="Segoe UI" w:cs="Segoe UI"/>
+          <w:strike/>
+          <w:color w:val="ECECF1"/>
+          <w:shd w:val="clear" w:color="auto" w:fill="343541"/>
+        </w:rPr>
+        <w:t xml:space="preserve"> все </w:t>
+      </w:r>
+      <w:proofErr w:type="spellStart"/>
+      <w:r>
+        <w:rPr>
+          <w:rFonts w:ascii="Segoe UI" w:hAnsi="Segoe UI" w:cs="Segoe UI"/>
+          <w:strike/>
+          <w:color w:val="ECECF1"/>
+          <w:shd w:val="clear" w:color="auto" w:fill="343541"/>
+        </w:rPr>
+        <w:t>раскиданно</w:t>
+      </w:r>
+      <w:proofErr w:type="spellEnd"/>
+      <w:r>
+        <w:rPr>
+          <w:rFonts w:ascii="Segoe UI" w:hAnsi="Segoe UI" w:cs="Segoe UI"/>
+          <w:strike/>
+          <w:color w:val="ECECF1"/>
+          <w:shd w:val="clear" w:color="auto" w:fill="343541"/>
+        </w:rPr>
+        <w:t xml:space="preserve"> по всему проекту. Нужно навести порядок. Нужно навести порядок с </w:t>
+      </w:r>
+      <w:proofErr w:type="spellStart"/>
+      <w:r>
+        <w:rPr>
+          <w:rFonts w:ascii="Segoe UI" w:hAnsi="Segoe UI" w:cs="Segoe UI"/>
+          <w:strike/>
+          <w:color w:val="ECECF1"/>
+          <w:shd w:val="clear" w:color="auto" w:fill="343541"/>
+        </w:rPr>
+        <w:t>префабами</w:t>
+      </w:r>
+      <w:proofErr w:type="spellEnd"/>
+      <w:r>
+        <w:rPr>
+          <w:rFonts w:ascii="Segoe UI" w:hAnsi="Segoe UI" w:cs="Segoe UI"/>
+          <w:strike/>
+          <w:color w:val="ECECF1"/>
+          <w:shd w:val="clear" w:color="auto" w:fill="343541"/>
+        </w:rPr>
+        <w:t xml:space="preserve">, это касается только структуры проекта. Особенно нужно обратить внимание на UI префабы </w:t>
+      </w:r>
+      <w:proofErr w:type="spellStart"/>
+      <w:r>
+        <w:rPr>
+          <w:rFonts w:ascii="Segoe UI" w:hAnsi="Segoe UI" w:cs="Segoe UI"/>
+          <w:strike/>
+          <w:color w:val="ECECF1"/>
+          <w:shd w:val="clear" w:color="auto" w:fill="343541"/>
+        </w:rPr>
+        <w:t>потому-что</w:t>
+      </w:r>
+      <w:proofErr w:type="spellEnd"/>
+      <w:r>
+        <w:rPr>
+          <w:rFonts w:ascii="Segoe UI" w:hAnsi="Segoe UI" w:cs="Segoe UI"/>
+          <w:strike/>
+          <w:color w:val="ECECF1"/>
+          <w:shd w:val="clear" w:color="auto" w:fill="343541"/>
+        </w:rPr>
+        <w:t xml:space="preserve"> их порой приходится искать </w:t>
+      </w:r>
+      <w:proofErr w:type="gramStart"/>
+      <w:r>
+        <w:rPr>
+          <w:rFonts w:ascii="Segoe UI" w:hAnsi="Segoe UI" w:cs="Segoe UI"/>
+          <w:strike/>
+          <w:color w:val="ECECF1"/>
+          <w:shd w:val="clear" w:color="auto" w:fill="343541"/>
+        </w:rPr>
+        <w:t>там где</w:t>
+      </w:r>
+      <w:proofErr w:type="gramEnd"/>
+      <w:r>
+        <w:rPr>
+          <w:rFonts w:ascii="Segoe UI" w:hAnsi="Segoe UI" w:cs="Segoe UI"/>
+          <w:strike/>
+          <w:color w:val="ECECF1"/>
+          <w:shd w:val="clear" w:color="auto" w:fill="343541"/>
+        </w:rPr>
+        <w:t xml:space="preserve"> их не должно быть. </w:t>
+      </w:r>
+    </w:p>
+    <w:p>
+      <w:pPr>
+        <w:rPr>
+          <w:rFonts w:ascii="Segoe UI" w:hAnsi="Segoe UI" w:cs="Segoe UI"/>
+          <w:color w:val="ECECF1"/>
+          <w:shd w:val="clear" w:color="auto" w:fill="343541"/>
+        </w:rPr>
+      </w:pPr>
+      <w:r>
+        <w:rPr>
+          <w:rFonts w:ascii="Segoe UI" w:hAnsi="Segoe UI" w:cs="Segoe UI"/>
+          <w:color w:val="ECECF1"/>
+          <w:shd w:val="clear" w:color="auto" w:fill="343541"/>
+        </w:rPr>
+        <w:t xml:space="preserve">3 Очередной проблемой по организации проекта, находится в подкатегории: статические данные. Здесь больше работы чем просто реорганизовать структуру хранения данных. Здесь так же нужно пересмотреть саму структуру статических данных и реорганизовать саму структуру, что в свою очередь повлечет за собой изменения в виде обновления кодовой базы. </w:t>
+      </w:r>
+    </w:p>
+    <w:p>
+      <w:pPr>
+        <w:rPr>
+          <w:rFonts w:ascii="Segoe UI" w:hAnsi="Segoe UI" w:cs="Segoe UI"/>
+          <w:color w:val="ECECF1"/>
+          <w:shd w:val="clear" w:color="auto" w:fill="343541"/>
+        </w:rPr>
+      </w:pPr>
+      <w:r>
+        <w:rPr>
+          <w:rFonts w:ascii="Segoe UI" w:hAnsi="Segoe UI" w:cs="Segoe UI"/>
+          <w:color w:val="ECECF1"/>
+          <w:shd w:val="clear" w:color="auto" w:fill="343541"/>
+        </w:rPr>
+        <w:t xml:space="preserve">4 </w:t>
+      </w:r>
+      <w:proofErr w:type="spellStart"/>
+      <w:r>
+        <w:rPr>
+          <w:rFonts w:ascii="Segoe UI" w:hAnsi="Segoe UI" w:cs="Segoe UI"/>
+          <w:color w:val="ECECF1"/>
+          <w:shd w:val="clear" w:color="auto" w:fill="343541"/>
+        </w:rPr>
+        <w:t>Паралельно</w:t>
+      </w:r>
+      <w:proofErr w:type="spellEnd"/>
+      <w:r>
+        <w:rPr>
+          <w:rFonts w:ascii="Segoe UI" w:hAnsi="Segoe UI" w:cs="Segoe UI"/>
+          <w:color w:val="ECECF1"/>
+          <w:shd w:val="clear" w:color="auto" w:fill="343541"/>
+        </w:rPr>
+        <w:t xml:space="preserve"> хочу запустить в разработку прототип новой боевой системы, который позволит улучшить текущую, точного представления то как она должна выглядеть нету, </w:t>
+      </w:r>
+      <w:proofErr w:type="gramStart"/>
+      <w:r>
+        <w:rPr>
+          <w:rFonts w:ascii="Segoe UI" w:hAnsi="Segoe UI" w:cs="Segoe UI"/>
+          <w:color w:val="ECECF1"/>
+          <w:shd w:val="clear" w:color="auto" w:fill="343541"/>
+        </w:rPr>
+        <w:t>во время</w:t>
+      </w:r>
+      <w:proofErr w:type="gramEnd"/>
+      <w:r>
+        <w:rPr>
+          <w:rFonts w:ascii="Segoe UI" w:hAnsi="Segoe UI" w:cs="Segoe UI"/>
+          <w:color w:val="ECECF1"/>
+          <w:shd w:val="clear" w:color="auto" w:fill="343541"/>
+        </w:rPr>
+        <w:t xml:space="preserve"> </w:t>
+      </w:r>
+      <w:proofErr w:type="spellStart"/>
+      <w:r>
+        <w:rPr>
+          <w:rFonts w:ascii="Segoe UI" w:hAnsi="Segoe UI" w:cs="Segoe UI"/>
+          <w:color w:val="ECECF1"/>
+          <w:shd w:val="clear" w:color="auto" w:fill="343541"/>
+        </w:rPr>
+        <w:t>прототипирования</w:t>
+      </w:r>
+      <w:proofErr w:type="spellEnd"/>
+      <w:r>
+        <w:rPr>
+          <w:rFonts w:ascii="Segoe UI" w:hAnsi="Segoe UI" w:cs="Segoe UI"/>
+          <w:color w:val="ECECF1"/>
+          <w:shd w:val="clear" w:color="auto" w:fill="343541"/>
+        </w:rPr>
+        <w:t xml:space="preserve"> надеюсь что найду хороший вариант. Зачем обновлять эту механику? Все просто если посмотреть на мой текущий </w:t>
+      </w:r>
+      <w:proofErr w:type="gramStart"/>
+      <w:r>
+        <w:rPr>
+          <w:rFonts w:ascii="Segoe UI" w:hAnsi="Segoe UI" w:cs="Segoe UI"/>
+          <w:color w:val="ECECF1"/>
+          <w:shd w:val="clear" w:color="auto" w:fill="343541"/>
+        </w:rPr>
+        <w:t>проект</w:t>
+      </w:r>
+      <w:proofErr w:type="gramEnd"/>
+      <w:r>
+        <w:rPr>
+          <w:rFonts w:ascii="Segoe UI" w:hAnsi="Segoe UI" w:cs="Segoe UI"/>
+          <w:color w:val="ECECF1"/>
+          <w:shd w:val="clear" w:color="auto" w:fill="343541"/>
+        </w:rPr>
+        <w:t xml:space="preserve"> то основная часть </w:t>
+      </w:r>
+      <w:proofErr w:type="spellStart"/>
+      <w:r>
+        <w:rPr>
+          <w:rFonts w:ascii="Segoe UI" w:hAnsi="Segoe UI" w:cs="Segoe UI"/>
+          <w:color w:val="ECECF1"/>
+          <w:shd w:val="clear" w:color="auto" w:fill="343541"/>
+        </w:rPr>
+        <w:t>геймплея</w:t>
+      </w:r>
+      <w:proofErr w:type="spellEnd"/>
+      <w:r>
+        <w:rPr>
+          <w:rFonts w:ascii="Segoe UI" w:hAnsi="Segoe UI" w:cs="Segoe UI"/>
+          <w:color w:val="ECECF1"/>
+          <w:shd w:val="clear" w:color="auto" w:fill="343541"/>
+        </w:rPr>
+        <w:t xml:space="preserve"> это бои, а текущая </w:t>
+      </w:r>
+      <w:proofErr w:type="spellStart"/>
+      <w:r>
+        <w:rPr>
+          <w:rFonts w:ascii="Segoe UI" w:hAnsi="Segoe UI" w:cs="Segoe UI"/>
+          <w:color w:val="ECECF1"/>
+          <w:shd w:val="clear" w:color="auto" w:fill="343541"/>
+        </w:rPr>
+        <w:t>боевка</w:t>
+      </w:r>
+      <w:proofErr w:type="spellEnd"/>
+      <w:r>
+        <w:rPr>
+          <w:rFonts w:ascii="Segoe UI" w:hAnsi="Segoe UI" w:cs="Segoe UI"/>
+          <w:color w:val="ECECF1"/>
+          <w:shd w:val="clear" w:color="auto" w:fill="343541"/>
+        </w:rPr>
+        <w:t xml:space="preserve"> мягко говоря не очень для победы над врагом игроку достаточно просто тыкать на </w:t>
+      </w:r>
+      <w:proofErr w:type="spellStart"/>
+      <w:r>
+        <w:rPr>
+          <w:rFonts w:ascii="Segoe UI" w:hAnsi="Segoe UI" w:cs="Segoe UI"/>
+          <w:color w:val="ECECF1"/>
+          <w:shd w:val="clear" w:color="auto" w:fill="343541"/>
+        </w:rPr>
+        <w:t>лкм</w:t>
+      </w:r>
+      <w:proofErr w:type="spellEnd"/>
+      <w:r>
+        <w:rPr>
+          <w:rFonts w:ascii="Segoe UI" w:hAnsi="Segoe UI" w:cs="Segoe UI"/>
+          <w:color w:val="ECECF1"/>
+          <w:shd w:val="clear" w:color="auto" w:fill="343541"/>
+        </w:rPr>
+        <w:t xml:space="preserve"> и пить зелья. Эту часть нужно разнообразить. Также я не исключаю тот вариант что </w:t>
+      </w:r>
+      <w:proofErr w:type="spellStart"/>
+      <w:r>
+        <w:rPr>
+          <w:rFonts w:ascii="Segoe UI" w:hAnsi="Segoe UI" w:cs="Segoe UI"/>
+          <w:color w:val="ECECF1"/>
+          <w:shd w:val="clear" w:color="auto" w:fill="343541"/>
+        </w:rPr>
+        <w:t>прийдется</w:t>
+      </w:r>
+      <w:proofErr w:type="spellEnd"/>
+      <w:r>
+        <w:rPr>
+          <w:rFonts w:ascii="Segoe UI" w:hAnsi="Segoe UI" w:cs="Segoe UI"/>
+          <w:color w:val="ECECF1"/>
+          <w:shd w:val="clear" w:color="auto" w:fill="343541"/>
+        </w:rPr>
+        <w:t xml:space="preserve"> пересмотреть в общем весь игровой процесс, и вместо </w:t>
+      </w:r>
+      <w:proofErr w:type="spellStart"/>
+      <w:r>
+        <w:rPr>
+          <w:rFonts w:ascii="Segoe UI" w:hAnsi="Segoe UI" w:cs="Segoe UI"/>
+          <w:color w:val="ECECF1"/>
+          <w:shd w:val="clear" w:color="auto" w:fill="343541"/>
+        </w:rPr>
+        <w:t>текущиего</w:t>
+      </w:r>
+      <w:proofErr w:type="spellEnd"/>
+      <w:r>
+        <w:rPr>
+          <w:rFonts w:ascii="Segoe UI" w:hAnsi="Segoe UI" w:cs="Segoe UI"/>
+          <w:color w:val="ECECF1"/>
+          <w:shd w:val="clear" w:color="auto" w:fill="343541"/>
+        </w:rPr>
+        <w:t xml:space="preserve"> вида сверху использовать вид от первого лица. </w:t>
+      </w:r>
+    </w:p>
+    <w:p>
+      <w:pPr>
+        <w:rPr>
+          <w:rFonts w:ascii="Segoe UI" w:hAnsi="Segoe UI" w:cs="Segoe UI"/>
+          <w:color w:val="ECECF1"/>
+          <w:shd w:val="clear" w:color="auto" w:fill="343541"/>
+        </w:rPr>
+      </w:pPr>
       <w:r>
         <w:rPr>
           <w:rFonts w:ascii="Segoe UI" w:hAnsi="Segoe UI" w:cs="Segoe UI"/>

</xml_diff>

<commit_message>
End update PlayerCharacterConfig. Start check SaveData.
</commit_message>
<xml_diff>
--- a/Итерации.docx
+++ b/Итерации.docx
@@ -3865,166 +3865,233 @@
           <w:color w:val="ECECF1"/>
           <w:shd w:val="clear" w:color="auto" w:fill="343541"/>
         </w:rPr>
-        <w:t xml:space="preserve"> что изначально все враги использовали первую систему, но позже </w:t>
-      </w:r>
+        <w:t xml:space="preserve"> что изначально все враги использовали первую систему, но позже была </w:t>
+      </w:r>
+      <w:proofErr w:type="spellStart"/>
+      <w:r>
+        <w:rPr>
+          <w:rFonts w:ascii="Segoe UI" w:hAnsi="Segoe UI" w:cs="Segoe UI"/>
+          <w:strike/>
+          <w:color w:val="ECECF1"/>
+          <w:shd w:val="clear" w:color="auto" w:fill="343541"/>
+        </w:rPr>
+        <w:t>прикрученна</w:t>
+      </w:r>
+      <w:proofErr w:type="spellEnd"/>
+      <w:r>
+        <w:rPr>
+          <w:rFonts w:ascii="Segoe UI" w:hAnsi="Segoe UI" w:cs="Segoe UI"/>
+          <w:strike/>
+          <w:color w:val="ECECF1"/>
+          <w:shd w:val="clear" w:color="auto" w:fill="343541"/>
+        </w:rPr>
+        <w:t xml:space="preserve"> вторая система, и сейчас очень сложно сказать какую, из систем используют враги, скорей всего это является это будет смесь из двух систем. Это нужно исправить. Нужно пересмотреть взаимодействие этих двух систем и выбрать </w:t>
+      </w:r>
+      <w:proofErr w:type="gramStart"/>
+      <w:r>
+        <w:rPr>
+          <w:rFonts w:ascii="Segoe UI" w:hAnsi="Segoe UI" w:cs="Segoe UI"/>
+          <w:strike/>
+          <w:color w:val="ECECF1"/>
+          <w:shd w:val="clear" w:color="auto" w:fill="343541"/>
+        </w:rPr>
+        <w:t>лучшее решение</w:t>
+      </w:r>
+      <w:proofErr w:type="gramEnd"/>
+      <w:r>
+        <w:rPr>
+          <w:rFonts w:ascii="Segoe UI" w:hAnsi="Segoe UI" w:cs="Segoe UI"/>
+          <w:strike/>
+          <w:color w:val="ECECF1"/>
+          <w:shd w:val="clear" w:color="auto" w:fill="343541"/>
+        </w:rPr>
+        <w:t xml:space="preserve"> которое позволит мне разрешить данную проблему.</w:t>
+      </w:r>
+    </w:p>
+    <w:p>
+      <w:pPr>
+        <w:rPr>
+          <w:rFonts w:ascii="Segoe UI" w:hAnsi="Segoe UI" w:cs="Segoe UI"/>
+          <w:strike/>
+          <w:color w:val="ECECF1"/>
+          <w:shd w:val="clear" w:color="auto" w:fill="343541"/>
+        </w:rPr>
+      </w:pPr>
       <w:bookmarkStart w:id="0" w:name="_GoBack"/>
-      <w:bookmarkEnd w:id="0"/>
-      <w:r>
-        <w:rPr>
-          <w:rFonts w:ascii="Segoe UI" w:hAnsi="Segoe UI" w:cs="Segoe UI"/>
-          <w:strike/>
-          <w:color w:val="ECECF1"/>
-          <w:shd w:val="clear" w:color="auto" w:fill="343541"/>
-        </w:rPr>
-        <w:t xml:space="preserve">была </w:t>
-      </w:r>
-      <w:proofErr w:type="spellStart"/>
-      <w:r>
-        <w:rPr>
-          <w:rFonts w:ascii="Segoe UI" w:hAnsi="Segoe UI" w:cs="Segoe UI"/>
-          <w:strike/>
-          <w:color w:val="ECECF1"/>
-          <w:shd w:val="clear" w:color="auto" w:fill="343541"/>
-        </w:rPr>
-        <w:t>прикрученна</w:t>
-      </w:r>
-      <w:proofErr w:type="spellEnd"/>
-      <w:r>
-        <w:rPr>
-          <w:rFonts w:ascii="Segoe UI" w:hAnsi="Segoe UI" w:cs="Segoe UI"/>
-          <w:strike/>
-          <w:color w:val="ECECF1"/>
-          <w:shd w:val="clear" w:color="auto" w:fill="343541"/>
-        </w:rPr>
-        <w:t xml:space="preserve"> вторая система, и сейчас очень сложно сказать какую, из систем используют враги, скорей всего это является это будет смесь из двух систем. Это нужно исправить. Нужно пересмотреть взаимодействие этих двух систем и выбрать </w:t>
-      </w:r>
+      <w:r>
+        <w:rPr>
+          <w:rFonts w:ascii="Segoe UI" w:hAnsi="Segoe UI" w:cs="Segoe UI"/>
+          <w:strike/>
+          <w:color w:val="ECECF1"/>
+          <w:shd w:val="clear" w:color="auto" w:fill="343541"/>
+        </w:rPr>
+        <w:t xml:space="preserve">2 Точная такая же проблема существует и с игроком. Но ее нельзя </w:t>
+      </w:r>
+      <w:proofErr w:type="spellStart"/>
+      <w:r>
+        <w:rPr>
+          <w:rFonts w:ascii="Segoe UI" w:hAnsi="Segoe UI" w:cs="Segoe UI"/>
+          <w:strike/>
+          <w:color w:val="ECECF1"/>
+          <w:shd w:val="clear" w:color="auto" w:fill="343541"/>
+        </w:rPr>
+        <w:t>расматривать</w:t>
+      </w:r>
+      <w:proofErr w:type="spellEnd"/>
+      <w:r>
+        <w:rPr>
+          <w:rFonts w:ascii="Segoe UI" w:hAnsi="Segoe UI" w:cs="Segoe UI"/>
+          <w:strike/>
+          <w:color w:val="ECECF1"/>
+          <w:shd w:val="clear" w:color="auto" w:fill="343541"/>
+        </w:rPr>
+        <w:t xml:space="preserve"> как предыдущий кейс.</w:t>
+      </w:r>
+    </w:p>
+    <w:bookmarkEnd w:id="0"/>
+    <w:p>
+      <w:pPr>
+        <w:rPr>
+          <w:rFonts w:ascii="Segoe UI" w:hAnsi="Segoe UI" w:cs="Segoe UI"/>
+          <w:color w:val="ECECF1"/>
+          <w:shd w:val="clear" w:color="auto" w:fill="343541"/>
+        </w:rPr>
+      </w:pPr>
+      <w:r>
+        <w:rPr>
+          <w:rFonts w:ascii="Segoe UI" w:hAnsi="Segoe UI" w:cs="Segoe UI"/>
+          <w:color w:val="ECECF1"/>
+          <w:shd w:val="clear" w:color="auto" w:fill="343541"/>
+        </w:rPr>
+        <w:t xml:space="preserve">3 Улучшить структуру проекта. Хоть предыдущая итерация и была в основном нацелена на улучшение структуры проекта, но до конца задача так и не была выполнена. Имеется еще куча проблемных мест. На этот раз нужно пересмотреть структуру </w:t>
+      </w:r>
+      <w:proofErr w:type="spellStart"/>
+      <w:r>
+        <w:rPr>
+          <w:rFonts w:ascii="Segoe UI" w:hAnsi="Segoe UI" w:cs="Segoe UI"/>
+          <w:color w:val="ECECF1"/>
+          <w:shd w:val="clear" w:color="auto" w:fill="343541"/>
+        </w:rPr>
+        <w:t>SavaData</w:t>
+      </w:r>
+      <w:proofErr w:type="spellEnd"/>
+      <w:r>
+        <w:rPr>
+          <w:rFonts w:ascii="Segoe UI" w:hAnsi="Segoe UI" w:cs="Segoe UI"/>
+          <w:color w:val="ECECF1"/>
+          <w:shd w:val="clear" w:color="auto" w:fill="343541"/>
+        </w:rPr>
+        <w:t xml:space="preserve">. И еще нужно будет исправить </w:t>
+      </w:r>
+      <w:proofErr w:type="spellStart"/>
+      <w:r>
+        <w:rPr>
+          <w:rFonts w:ascii="Segoe UI" w:hAnsi="Segoe UI" w:cs="Segoe UI"/>
+          <w:color w:val="ECECF1"/>
+          <w:shd w:val="clear" w:color="auto" w:fill="343541"/>
+        </w:rPr>
+        <w:t>EnemyCharacterConfig</w:t>
+      </w:r>
+      <w:proofErr w:type="spellEnd"/>
+      <w:r>
+        <w:rPr>
+          <w:rFonts w:ascii="Segoe UI" w:hAnsi="Segoe UI" w:cs="Segoe UI"/>
+          <w:color w:val="ECECF1"/>
+          <w:shd w:val="clear" w:color="auto" w:fill="343541"/>
+        </w:rPr>
+        <w:t xml:space="preserve"> где используется </w:t>
+      </w:r>
+      <w:proofErr w:type="spellStart"/>
+      <w:r>
+        <w:rPr>
+          <w:rFonts w:ascii="Segoe UI" w:hAnsi="Segoe UI" w:cs="Segoe UI"/>
+          <w:color w:val="ECECF1"/>
+          <w:shd w:val="clear" w:color="auto" w:fill="343541"/>
+        </w:rPr>
+        <w:t>врагмент</w:t>
+      </w:r>
+      <w:proofErr w:type="spellEnd"/>
+      <w:r>
+        <w:rPr>
+          <w:rFonts w:ascii="Segoe UI" w:hAnsi="Segoe UI" w:cs="Segoe UI"/>
+          <w:color w:val="ECECF1"/>
+          <w:shd w:val="clear" w:color="auto" w:fill="343541"/>
+        </w:rPr>
+        <w:t xml:space="preserve"> из </w:t>
+      </w:r>
+      <w:proofErr w:type="spellStart"/>
       <w:proofErr w:type="gramStart"/>
       <w:r>
         <w:rPr>
           <w:rFonts w:ascii="Segoe UI" w:hAnsi="Segoe UI" w:cs="Segoe UI"/>
-          <w:strike/>
-          <w:color w:val="ECECF1"/>
-          <w:shd w:val="clear" w:color="auto" w:fill="343541"/>
-        </w:rPr>
-        <w:t>лучшее решение</w:t>
-      </w:r>
+          <w:color w:val="ECECF1"/>
+          <w:shd w:val="clear" w:color="auto" w:fill="343541"/>
+        </w:rPr>
+        <w:t>SavaData</w:t>
+      </w:r>
+      <w:proofErr w:type="spellEnd"/>
       <w:proofErr w:type="gramEnd"/>
       <w:r>
         <w:rPr>
           <w:rFonts w:ascii="Segoe UI" w:hAnsi="Segoe UI" w:cs="Segoe UI"/>
-          <w:strike/>
-          <w:color w:val="ECECF1"/>
-          <w:shd w:val="clear" w:color="auto" w:fill="343541"/>
-        </w:rPr>
-        <w:t xml:space="preserve"> которое позволит мне разрешить данную проблему.</w:t>
-      </w:r>
-    </w:p>
-    <w:p>
-      <w:pPr>
-        <w:rPr>
-          <w:rFonts w:ascii="Segoe UI" w:hAnsi="Segoe UI" w:cs="Segoe UI"/>
-          <w:color w:val="ECECF1"/>
-          <w:shd w:val="clear" w:color="auto" w:fill="343541"/>
-        </w:rPr>
-      </w:pPr>
-      <w:r>
-        <w:rPr>
-          <w:rFonts w:ascii="Segoe UI" w:hAnsi="Segoe UI" w:cs="Segoe UI"/>
-          <w:color w:val="ECECF1"/>
-          <w:shd w:val="clear" w:color="auto" w:fill="343541"/>
-        </w:rPr>
-        <w:t xml:space="preserve">2 Точная такая же проблема существует и с игроком. Но ее нельзя </w:t>
-      </w:r>
-      <w:proofErr w:type="spellStart"/>
-      <w:r>
-        <w:rPr>
-          <w:rFonts w:ascii="Segoe UI" w:hAnsi="Segoe UI" w:cs="Segoe UI"/>
-          <w:color w:val="ECECF1"/>
-          <w:shd w:val="clear" w:color="auto" w:fill="343541"/>
-        </w:rPr>
-        <w:t>расматривать</w:t>
-      </w:r>
-      <w:proofErr w:type="spellEnd"/>
-      <w:r>
-        <w:rPr>
-          <w:rFonts w:ascii="Segoe UI" w:hAnsi="Segoe UI" w:cs="Segoe UI"/>
-          <w:color w:val="ECECF1"/>
-          <w:shd w:val="clear" w:color="auto" w:fill="343541"/>
-        </w:rPr>
-        <w:t xml:space="preserve"> как предыдущий кейс.</w:t>
-      </w:r>
-    </w:p>
-    <w:p>
-      <w:pPr>
-        <w:rPr>
-          <w:rFonts w:ascii="Segoe UI" w:hAnsi="Segoe UI" w:cs="Segoe UI"/>
-          <w:color w:val="ECECF1"/>
-          <w:shd w:val="clear" w:color="auto" w:fill="343541"/>
-        </w:rPr>
-      </w:pPr>
-      <w:r>
-        <w:rPr>
-          <w:rFonts w:ascii="Segoe UI" w:hAnsi="Segoe UI" w:cs="Segoe UI"/>
-          <w:color w:val="ECECF1"/>
-          <w:shd w:val="clear" w:color="auto" w:fill="343541"/>
-        </w:rPr>
-        <w:t xml:space="preserve">3 Улучшить структуру проекта. Хоть предыдущая итерация и была в основном нацелена на улучшение структуры проекта, но до конца задача так и не была выполнена. Имеется еще куча проблемных мест. На этот раз нужно пересмотреть структуру </w:t>
-      </w:r>
-      <w:proofErr w:type="spellStart"/>
-      <w:r>
-        <w:rPr>
-          <w:rFonts w:ascii="Segoe UI" w:hAnsi="Segoe UI" w:cs="Segoe UI"/>
-          <w:color w:val="ECECF1"/>
-          <w:shd w:val="clear" w:color="auto" w:fill="343541"/>
-        </w:rPr>
-        <w:t>SavaData</w:t>
-      </w:r>
-      <w:proofErr w:type="spellEnd"/>
-      <w:r>
-        <w:rPr>
-          <w:rFonts w:ascii="Segoe UI" w:hAnsi="Segoe UI" w:cs="Segoe UI"/>
-          <w:color w:val="ECECF1"/>
-          <w:shd w:val="clear" w:color="auto" w:fill="343541"/>
-        </w:rPr>
-        <w:t xml:space="preserve">. И еще нужно будет исправить </w:t>
-      </w:r>
-      <w:proofErr w:type="spellStart"/>
-      <w:r>
-        <w:rPr>
-          <w:rFonts w:ascii="Segoe UI" w:hAnsi="Segoe UI" w:cs="Segoe UI"/>
-          <w:color w:val="ECECF1"/>
-          <w:shd w:val="clear" w:color="auto" w:fill="343541"/>
-        </w:rPr>
-        <w:t>EnemyCharacterConfig</w:t>
-      </w:r>
-      <w:proofErr w:type="spellEnd"/>
-      <w:r>
-        <w:rPr>
-          <w:rFonts w:ascii="Segoe UI" w:hAnsi="Segoe UI" w:cs="Segoe UI"/>
-          <w:color w:val="ECECF1"/>
-          <w:shd w:val="clear" w:color="auto" w:fill="343541"/>
-        </w:rPr>
-        <w:t xml:space="preserve"> где используется </w:t>
-      </w:r>
-      <w:proofErr w:type="spellStart"/>
-      <w:r>
-        <w:rPr>
-          <w:rFonts w:ascii="Segoe UI" w:hAnsi="Segoe UI" w:cs="Segoe UI"/>
-          <w:color w:val="ECECF1"/>
-          <w:shd w:val="clear" w:color="auto" w:fill="343541"/>
-        </w:rPr>
-        <w:t>врагмент</w:t>
-      </w:r>
-      <w:proofErr w:type="spellEnd"/>
-      <w:r>
-        <w:rPr>
-          <w:rFonts w:ascii="Segoe UI" w:hAnsi="Segoe UI" w:cs="Segoe UI"/>
-          <w:color w:val="ECECF1"/>
-          <w:shd w:val="clear" w:color="auto" w:fill="343541"/>
-        </w:rPr>
-        <w:t xml:space="preserve"> из </w:t>
-      </w:r>
-      <w:proofErr w:type="spellStart"/>
+          <w:color w:val="ECECF1"/>
+          <w:shd w:val="clear" w:color="auto" w:fill="343541"/>
+        </w:rPr>
+        <w:t xml:space="preserve"> а именно класс </w:t>
+      </w:r>
+      <w:proofErr w:type="spellStart"/>
+      <w:r>
+        <w:rPr>
+          <w:rFonts w:ascii="Segoe UI" w:hAnsi="Segoe UI" w:cs="Segoe UI"/>
+          <w:color w:val="ECECF1"/>
+          <w:shd w:val="clear" w:color="auto" w:fill="343541"/>
+        </w:rPr>
+        <w:t>PlayerState</w:t>
+      </w:r>
+      <w:proofErr w:type="spellEnd"/>
+      <w:r>
+        <w:rPr>
+          <w:rFonts w:ascii="Segoe UI" w:hAnsi="Segoe UI" w:cs="Segoe UI"/>
+          <w:color w:val="ECECF1"/>
+          <w:shd w:val="clear" w:color="auto" w:fill="343541"/>
+        </w:rPr>
+        <w:t xml:space="preserve">, отвечающий за здоровья врагом. </w:t>
+      </w:r>
+    </w:p>
+    <w:p>
+      <w:pPr>
+        <w:rPr>
+          <w:rFonts w:ascii="Segoe UI" w:hAnsi="Segoe UI" w:cs="Segoe UI"/>
+          <w:color w:val="ECECF1"/>
+          <w:shd w:val="clear" w:color="auto" w:fill="343541"/>
+        </w:rPr>
+      </w:pPr>
+      <w:r>
+        <w:rPr>
+          <w:rFonts w:ascii="Segoe UI" w:hAnsi="Segoe UI" w:cs="Segoe UI"/>
+          <w:color w:val="ECECF1"/>
+          <w:shd w:val="clear" w:color="auto" w:fill="343541"/>
+        </w:rPr>
+        <w:t xml:space="preserve">4 Локализации игры. На данный момент существует уже часть </w:t>
+      </w:r>
+      <w:proofErr w:type="spellStart"/>
+      <w:r>
+        <w:rPr>
+          <w:rFonts w:ascii="Segoe UI" w:hAnsi="Segoe UI" w:cs="Segoe UI"/>
+          <w:color w:val="ECECF1"/>
+          <w:shd w:val="clear" w:color="auto" w:fill="343541"/>
+        </w:rPr>
+        <w:t>переведеного</w:t>
+      </w:r>
+      <w:proofErr w:type="spellEnd"/>
+      <w:r>
+        <w:rPr>
+          <w:rFonts w:ascii="Segoe UI" w:hAnsi="Segoe UI" w:cs="Segoe UI"/>
+          <w:color w:val="ECECF1"/>
+          <w:shd w:val="clear" w:color="auto" w:fill="343541"/>
+        </w:rPr>
+        <w:t xml:space="preserve"> текста на русский и английский, но есть моменты </w:t>
+      </w:r>
       <w:proofErr w:type="gramStart"/>
       <w:r>
         <w:rPr>
@@ -4032,9 +4099,8 @@
           <w:color w:val="ECECF1"/>
           <w:shd w:val="clear" w:color="auto" w:fill="343541"/>
         </w:rPr>
-        <w:t>SavaData</w:t>
-      </w:r>
-      <w:proofErr w:type="spellEnd"/>
+        <w:t>где например</w:t>
+      </w:r>
       <w:proofErr w:type="gramEnd"/>
       <w:r>
         <w:rPr>
@@ -4042,77 +4108,6 @@
           <w:color w:val="ECECF1"/>
           <w:shd w:val="clear" w:color="auto" w:fill="343541"/>
         </w:rPr>
-        <w:t xml:space="preserve"> а именно класс </w:t>
-      </w:r>
-      <w:proofErr w:type="spellStart"/>
-      <w:r>
-        <w:rPr>
-          <w:rFonts w:ascii="Segoe UI" w:hAnsi="Segoe UI" w:cs="Segoe UI"/>
-          <w:color w:val="ECECF1"/>
-          <w:shd w:val="clear" w:color="auto" w:fill="343541"/>
-        </w:rPr>
-        <w:t>PlayerState</w:t>
-      </w:r>
-      <w:proofErr w:type="spellEnd"/>
-      <w:r>
-        <w:rPr>
-          <w:rFonts w:ascii="Segoe UI" w:hAnsi="Segoe UI" w:cs="Segoe UI"/>
-          <w:color w:val="ECECF1"/>
-          <w:shd w:val="clear" w:color="auto" w:fill="343541"/>
-        </w:rPr>
-        <w:t xml:space="preserve">, отвечающий за здоровья врагом. </w:t>
-      </w:r>
-    </w:p>
-    <w:p>
-      <w:pPr>
-        <w:rPr>
-          <w:rFonts w:ascii="Segoe UI" w:hAnsi="Segoe UI" w:cs="Segoe UI"/>
-          <w:color w:val="ECECF1"/>
-          <w:shd w:val="clear" w:color="auto" w:fill="343541"/>
-        </w:rPr>
-      </w:pPr>
-      <w:r>
-        <w:rPr>
-          <w:rFonts w:ascii="Segoe UI" w:hAnsi="Segoe UI" w:cs="Segoe UI"/>
-          <w:color w:val="ECECF1"/>
-          <w:shd w:val="clear" w:color="auto" w:fill="343541"/>
-        </w:rPr>
-        <w:t xml:space="preserve">4 Локализации игры. На данный момент существует уже часть </w:t>
-      </w:r>
-      <w:proofErr w:type="spellStart"/>
-      <w:r>
-        <w:rPr>
-          <w:rFonts w:ascii="Segoe UI" w:hAnsi="Segoe UI" w:cs="Segoe UI"/>
-          <w:color w:val="ECECF1"/>
-          <w:shd w:val="clear" w:color="auto" w:fill="343541"/>
-        </w:rPr>
-        <w:t>переведеного</w:t>
-      </w:r>
-      <w:proofErr w:type="spellEnd"/>
-      <w:r>
-        <w:rPr>
-          <w:rFonts w:ascii="Segoe UI" w:hAnsi="Segoe UI" w:cs="Segoe UI"/>
-          <w:color w:val="ECECF1"/>
-          <w:shd w:val="clear" w:color="auto" w:fill="343541"/>
-        </w:rPr>
-        <w:t xml:space="preserve"> текста на русский и английский, но есть моменты </w:t>
-      </w:r>
-      <w:proofErr w:type="gramStart"/>
-      <w:r>
-        <w:rPr>
-          <w:rFonts w:ascii="Segoe UI" w:hAnsi="Segoe UI" w:cs="Segoe UI"/>
-          <w:color w:val="ECECF1"/>
-          <w:shd w:val="clear" w:color="auto" w:fill="343541"/>
-        </w:rPr>
-        <w:t>где например</w:t>
-      </w:r>
-      <w:proofErr w:type="gramEnd"/>
-      <w:r>
-        <w:rPr>
-          <w:rFonts w:ascii="Segoe UI" w:hAnsi="Segoe UI" w:cs="Segoe UI"/>
-          <w:color w:val="ECECF1"/>
-          <w:shd w:val="clear" w:color="auto" w:fill="343541"/>
-        </w:rPr>
         <w:t xml:space="preserve"> используются перечисления, их также нужно перевести на английский и на русский. </w:t>
       </w:r>
     </w:p>
@@ -4183,7 +4178,6 @@
           <w:rFonts w:ascii="Segoe UI" w:hAnsi="Segoe UI" w:cs="Segoe UI"/>
           <w:color w:val="ECECF1"/>
           <w:shd w:val="clear" w:color="auto" w:fill="343541"/>
-          <w:lang w:val="en-US"/>
         </w:rPr>
       </w:pPr>
       <w:r>

</xml_diff>

<commit_message>
End check and update SaveData structure. Fix bug when enemy have 0 level, and them cant kill.
</commit_message>
<xml_diff>
--- a/Итерации.docx
+++ b/Итерации.docx
@@ -3917,109 +3917,202 @@
           <w:shd w:val="clear" w:color="auto" w:fill="343541"/>
         </w:rPr>
       </w:pPr>
+      <w:r>
+        <w:rPr>
+          <w:rFonts w:ascii="Segoe UI" w:hAnsi="Segoe UI" w:cs="Segoe UI"/>
+          <w:strike/>
+          <w:color w:val="ECECF1"/>
+          <w:shd w:val="clear" w:color="auto" w:fill="343541"/>
+        </w:rPr>
+        <w:t xml:space="preserve">2 Точная такая же проблема существует и с игроком. Но ее нельзя </w:t>
+      </w:r>
+      <w:proofErr w:type="spellStart"/>
+      <w:r>
+        <w:rPr>
+          <w:rFonts w:ascii="Segoe UI" w:hAnsi="Segoe UI" w:cs="Segoe UI"/>
+          <w:strike/>
+          <w:color w:val="ECECF1"/>
+          <w:shd w:val="clear" w:color="auto" w:fill="343541"/>
+        </w:rPr>
+        <w:t>расматривать</w:t>
+      </w:r>
+      <w:proofErr w:type="spellEnd"/>
+      <w:r>
+        <w:rPr>
+          <w:rFonts w:ascii="Segoe UI" w:hAnsi="Segoe UI" w:cs="Segoe UI"/>
+          <w:strike/>
+          <w:color w:val="ECECF1"/>
+          <w:shd w:val="clear" w:color="auto" w:fill="343541"/>
+        </w:rPr>
+        <w:t xml:space="preserve"> как предыдущий кейс.</w:t>
+      </w:r>
+    </w:p>
+    <w:p>
+      <w:pPr>
+        <w:rPr>
+          <w:rFonts w:ascii="Segoe UI" w:hAnsi="Segoe UI" w:cs="Segoe UI"/>
+          <w:strike/>
+          <w:color w:val="ECECF1"/>
+          <w:shd w:val="clear" w:color="auto" w:fill="343541"/>
+        </w:rPr>
+      </w:pPr>
+      <w:r>
+        <w:rPr>
+          <w:rFonts w:ascii="Segoe UI" w:hAnsi="Segoe UI" w:cs="Segoe UI"/>
+          <w:strike/>
+          <w:color w:val="ECECF1"/>
+          <w:shd w:val="clear" w:color="auto" w:fill="343541"/>
+        </w:rPr>
+        <w:t xml:space="preserve">3 Улучшить структуру проекта. Хоть предыдущая итерация и была в основном нацелена на улучшение структуры проекта, но до конца задача так и не была выполнена. Имеется еще куча проблемных мест. На этот раз нужно пересмотреть структуру </w:t>
+      </w:r>
+      <w:proofErr w:type="spellStart"/>
+      <w:r>
+        <w:rPr>
+          <w:rFonts w:ascii="Segoe UI" w:hAnsi="Segoe UI" w:cs="Segoe UI"/>
+          <w:strike/>
+          <w:color w:val="ECECF1"/>
+          <w:shd w:val="clear" w:color="auto" w:fill="343541"/>
+        </w:rPr>
+        <w:t>SavaData</w:t>
+      </w:r>
+      <w:proofErr w:type="spellEnd"/>
+      <w:r>
+        <w:rPr>
+          <w:rFonts w:ascii="Segoe UI" w:hAnsi="Segoe UI" w:cs="Segoe UI"/>
+          <w:strike/>
+          <w:color w:val="ECECF1"/>
+          <w:shd w:val="clear" w:color="auto" w:fill="343541"/>
+        </w:rPr>
+        <w:t xml:space="preserve">. И еще нужно будет исправить </w:t>
+      </w:r>
+      <w:proofErr w:type="spellStart"/>
+      <w:r>
+        <w:rPr>
+          <w:rFonts w:ascii="Segoe UI" w:hAnsi="Segoe UI" w:cs="Segoe UI"/>
+          <w:strike/>
+          <w:color w:val="ECECF1"/>
+          <w:shd w:val="clear" w:color="auto" w:fill="343541"/>
+        </w:rPr>
+        <w:t>EnemyCharacterConfig</w:t>
+      </w:r>
+      <w:proofErr w:type="spellEnd"/>
+      <w:r>
+        <w:rPr>
+          <w:rFonts w:ascii="Segoe UI" w:hAnsi="Segoe UI" w:cs="Segoe UI"/>
+          <w:strike/>
+          <w:color w:val="ECECF1"/>
+          <w:shd w:val="clear" w:color="auto" w:fill="343541"/>
+        </w:rPr>
+        <w:t xml:space="preserve"> где используется </w:t>
+      </w:r>
+      <w:proofErr w:type="spellStart"/>
+      <w:r>
+        <w:rPr>
+          <w:rFonts w:ascii="Segoe UI" w:hAnsi="Segoe UI" w:cs="Segoe UI"/>
+          <w:strike/>
+          <w:color w:val="ECECF1"/>
+          <w:shd w:val="clear" w:color="auto" w:fill="343541"/>
+        </w:rPr>
+        <w:t>врагмент</w:t>
+      </w:r>
+      <w:proofErr w:type="spellEnd"/>
+      <w:r>
+        <w:rPr>
+          <w:rFonts w:ascii="Segoe UI" w:hAnsi="Segoe UI" w:cs="Segoe UI"/>
+          <w:strike/>
+          <w:color w:val="ECECF1"/>
+          <w:shd w:val="clear" w:color="auto" w:fill="343541"/>
+        </w:rPr>
+        <w:t xml:space="preserve"> из </w:t>
+      </w:r>
+      <w:proofErr w:type="spellStart"/>
+      <w:proofErr w:type="gramStart"/>
+      <w:r>
+        <w:rPr>
+          <w:rFonts w:ascii="Segoe UI" w:hAnsi="Segoe UI" w:cs="Segoe UI"/>
+          <w:strike/>
+          <w:color w:val="ECECF1"/>
+          <w:shd w:val="clear" w:color="auto" w:fill="343541"/>
+        </w:rPr>
+        <w:t>SavaData</w:t>
+      </w:r>
+      <w:proofErr w:type="spellEnd"/>
+      <w:proofErr w:type="gramEnd"/>
+      <w:r>
+        <w:rPr>
+          <w:rFonts w:ascii="Segoe UI" w:hAnsi="Segoe UI" w:cs="Segoe UI"/>
+          <w:strike/>
+          <w:color w:val="ECECF1"/>
+          <w:shd w:val="clear" w:color="auto" w:fill="343541"/>
+        </w:rPr>
+        <w:t xml:space="preserve"> а именно класс </w:t>
+      </w:r>
+      <w:proofErr w:type="spellStart"/>
+      <w:r>
+        <w:rPr>
+          <w:rFonts w:ascii="Segoe UI" w:hAnsi="Segoe UI" w:cs="Segoe UI"/>
+          <w:strike/>
+          <w:color w:val="ECECF1"/>
+          <w:shd w:val="clear" w:color="auto" w:fill="343541"/>
+        </w:rPr>
+        <w:t>PlayerState</w:t>
+      </w:r>
+      <w:proofErr w:type="spellEnd"/>
+      <w:r>
+        <w:rPr>
+          <w:rFonts w:ascii="Segoe UI" w:hAnsi="Segoe UI" w:cs="Segoe UI"/>
+          <w:strike/>
+          <w:color w:val="ECECF1"/>
+          <w:shd w:val="clear" w:color="auto" w:fill="343541"/>
+        </w:rPr>
+        <w:t>, отвечающий за</w:t>
+      </w:r>
       <w:bookmarkStart w:id="0" w:name="_GoBack"/>
-      <w:r>
-        <w:rPr>
-          <w:rFonts w:ascii="Segoe UI" w:hAnsi="Segoe UI" w:cs="Segoe UI"/>
-          <w:strike/>
-          <w:color w:val="ECECF1"/>
-          <w:shd w:val="clear" w:color="auto" w:fill="343541"/>
-        </w:rPr>
-        <w:t xml:space="preserve">2 Точная такая же проблема существует и с игроком. Но ее нельзя </w:t>
-      </w:r>
-      <w:proofErr w:type="spellStart"/>
-      <w:r>
-        <w:rPr>
-          <w:rFonts w:ascii="Segoe UI" w:hAnsi="Segoe UI" w:cs="Segoe UI"/>
-          <w:strike/>
-          <w:color w:val="ECECF1"/>
-          <w:shd w:val="clear" w:color="auto" w:fill="343541"/>
-        </w:rPr>
-        <w:t>расматривать</w:t>
-      </w:r>
-      <w:proofErr w:type="spellEnd"/>
-      <w:r>
-        <w:rPr>
-          <w:rFonts w:ascii="Segoe UI" w:hAnsi="Segoe UI" w:cs="Segoe UI"/>
-          <w:strike/>
-          <w:color w:val="ECECF1"/>
-          <w:shd w:val="clear" w:color="auto" w:fill="343541"/>
-        </w:rPr>
-        <w:t xml:space="preserve"> как предыдущий кейс.</w:t>
-      </w:r>
-    </w:p>
-    <w:bookmarkEnd w:id="0"/>
-    <w:p>
-      <w:pPr>
-        <w:rPr>
-          <w:rFonts w:ascii="Segoe UI" w:hAnsi="Segoe UI" w:cs="Segoe UI"/>
-          <w:color w:val="ECECF1"/>
-          <w:shd w:val="clear" w:color="auto" w:fill="343541"/>
-        </w:rPr>
-      </w:pPr>
-      <w:r>
-        <w:rPr>
-          <w:rFonts w:ascii="Segoe UI" w:hAnsi="Segoe UI" w:cs="Segoe UI"/>
-          <w:color w:val="ECECF1"/>
-          <w:shd w:val="clear" w:color="auto" w:fill="343541"/>
-        </w:rPr>
-        <w:t xml:space="preserve">3 Улучшить структуру проекта. Хоть предыдущая итерация и была в основном нацелена на улучшение структуры проекта, но до конца задача так и не была выполнена. Имеется еще куча проблемных мест. На этот раз нужно пересмотреть структуру </w:t>
-      </w:r>
-      <w:proofErr w:type="spellStart"/>
-      <w:r>
-        <w:rPr>
-          <w:rFonts w:ascii="Segoe UI" w:hAnsi="Segoe UI" w:cs="Segoe UI"/>
-          <w:color w:val="ECECF1"/>
-          <w:shd w:val="clear" w:color="auto" w:fill="343541"/>
-        </w:rPr>
-        <w:t>SavaData</w:t>
-      </w:r>
-      <w:proofErr w:type="spellEnd"/>
-      <w:r>
-        <w:rPr>
-          <w:rFonts w:ascii="Segoe UI" w:hAnsi="Segoe UI" w:cs="Segoe UI"/>
-          <w:color w:val="ECECF1"/>
-          <w:shd w:val="clear" w:color="auto" w:fill="343541"/>
-        </w:rPr>
-        <w:t xml:space="preserve">. И еще нужно будет исправить </w:t>
-      </w:r>
-      <w:proofErr w:type="spellStart"/>
-      <w:r>
-        <w:rPr>
-          <w:rFonts w:ascii="Segoe UI" w:hAnsi="Segoe UI" w:cs="Segoe UI"/>
-          <w:color w:val="ECECF1"/>
-          <w:shd w:val="clear" w:color="auto" w:fill="343541"/>
-        </w:rPr>
-        <w:t>EnemyCharacterConfig</w:t>
-      </w:r>
-      <w:proofErr w:type="spellEnd"/>
-      <w:r>
-        <w:rPr>
-          <w:rFonts w:ascii="Segoe UI" w:hAnsi="Segoe UI" w:cs="Segoe UI"/>
-          <w:color w:val="ECECF1"/>
-          <w:shd w:val="clear" w:color="auto" w:fill="343541"/>
-        </w:rPr>
-        <w:t xml:space="preserve"> где используется </w:t>
-      </w:r>
-      <w:proofErr w:type="spellStart"/>
-      <w:r>
-        <w:rPr>
-          <w:rFonts w:ascii="Segoe UI" w:hAnsi="Segoe UI" w:cs="Segoe UI"/>
-          <w:color w:val="ECECF1"/>
-          <w:shd w:val="clear" w:color="auto" w:fill="343541"/>
-        </w:rPr>
-        <w:t>врагмент</w:t>
-      </w:r>
-      <w:proofErr w:type="spellEnd"/>
-      <w:r>
-        <w:rPr>
-          <w:rFonts w:ascii="Segoe UI" w:hAnsi="Segoe UI" w:cs="Segoe UI"/>
-          <w:color w:val="ECECF1"/>
-          <w:shd w:val="clear" w:color="auto" w:fill="343541"/>
-        </w:rPr>
-        <w:t xml:space="preserve"> из </w:t>
-      </w:r>
-      <w:proofErr w:type="spellStart"/>
+      <w:bookmarkEnd w:id="0"/>
+      <w:r>
+        <w:rPr>
+          <w:rFonts w:ascii="Segoe UI" w:hAnsi="Segoe UI" w:cs="Segoe UI"/>
+          <w:strike/>
+          <w:color w:val="ECECF1"/>
+          <w:shd w:val="clear" w:color="auto" w:fill="343541"/>
+        </w:rPr>
+        <w:t xml:space="preserve"> здоровья врагом. </w:t>
+      </w:r>
+    </w:p>
+    <w:p>
+      <w:pPr>
+        <w:rPr>
+          <w:rFonts w:ascii="Segoe UI" w:hAnsi="Segoe UI" w:cs="Segoe UI"/>
+          <w:color w:val="ECECF1"/>
+          <w:shd w:val="clear" w:color="auto" w:fill="343541"/>
+        </w:rPr>
+      </w:pPr>
+      <w:r>
+        <w:rPr>
+          <w:rFonts w:ascii="Segoe UI" w:hAnsi="Segoe UI" w:cs="Segoe UI"/>
+          <w:color w:val="ECECF1"/>
+          <w:shd w:val="clear" w:color="auto" w:fill="343541"/>
+        </w:rPr>
+        <w:t xml:space="preserve">4 Локализации игры. На данный момент существует уже часть </w:t>
+      </w:r>
+      <w:proofErr w:type="spellStart"/>
+      <w:r>
+        <w:rPr>
+          <w:rFonts w:ascii="Segoe UI" w:hAnsi="Segoe UI" w:cs="Segoe UI"/>
+          <w:color w:val="ECECF1"/>
+          <w:shd w:val="clear" w:color="auto" w:fill="343541"/>
+        </w:rPr>
+        <w:t>переведеного</w:t>
+      </w:r>
+      <w:proofErr w:type="spellEnd"/>
+      <w:r>
+        <w:rPr>
+          <w:rFonts w:ascii="Segoe UI" w:hAnsi="Segoe UI" w:cs="Segoe UI"/>
+          <w:color w:val="ECECF1"/>
+          <w:shd w:val="clear" w:color="auto" w:fill="343541"/>
+        </w:rPr>
+        <w:t xml:space="preserve"> текста на русский и английский, но есть моменты </w:t>
+      </w:r>
       <w:proofErr w:type="gramStart"/>
       <w:r>
         <w:rPr>
@@ -4027,9 +4120,8 @@
           <w:color w:val="ECECF1"/>
           <w:shd w:val="clear" w:color="auto" w:fill="343541"/>
         </w:rPr>
-        <w:t>SavaData</w:t>
-      </w:r>
-      <w:proofErr w:type="spellEnd"/>
+        <w:t>где например</w:t>
+      </w:r>
       <w:proofErr w:type="gramEnd"/>
       <w:r>
         <w:rPr>
@@ -4037,60 +4129,146 @@
           <w:color w:val="ECECF1"/>
           <w:shd w:val="clear" w:color="auto" w:fill="343541"/>
         </w:rPr>
-        <w:t xml:space="preserve"> а именно класс </w:t>
-      </w:r>
-      <w:proofErr w:type="spellStart"/>
-      <w:r>
-        <w:rPr>
-          <w:rFonts w:ascii="Segoe UI" w:hAnsi="Segoe UI" w:cs="Segoe UI"/>
-          <w:color w:val="ECECF1"/>
-          <w:shd w:val="clear" w:color="auto" w:fill="343541"/>
-        </w:rPr>
-        <w:t>PlayerState</w:t>
-      </w:r>
-      <w:proofErr w:type="spellEnd"/>
-      <w:r>
-        <w:rPr>
-          <w:rFonts w:ascii="Segoe UI" w:hAnsi="Segoe UI" w:cs="Segoe UI"/>
-          <w:color w:val="ECECF1"/>
-          <w:shd w:val="clear" w:color="auto" w:fill="343541"/>
-        </w:rPr>
-        <w:t xml:space="preserve">, отвечающий за здоровья врагом. </w:t>
-      </w:r>
-    </w:p>
-    <w:p>
-      <w:pPr>
-        <w:rPr>
-          <w:rFonts w:ascii="Segoe UI" w:hAnsi="Segoe UI" w:cs="Segoe UI"/>
-          <w:color w:val="ECECF1"/>
-          <w:shd w:val="clear" w:color="auto" w:fill="343541"/>
-        </w:rPr>
-      </w:pPr>
-      <w:r>
-        <w:rPr>
-          <w:rFonts w:ascii="Segoe UI" w:hAnsi="Segoe UI" w:cs="Segoe UI"/>
-          <w:color w:val="ECECF1"/>
-          <w:shd w:val="clear" w:color="auto" w:fill="343541"/>
-        </w:rPr>
-        <w:t xml:space="preserve">4 Локализации игры. На данный момент существует уже часть </w:t>
-      </w:r>
-      <w:proofErr w:type="spellStart"/>
-      <w:r>
-        <w:rPr>
-          <w:rFonts w:ascii="Segoe UI" w:hAnsi="Segoe UI" w:cs="Segoe UI"/>
-          <w:color w:val="ECECF1"/>
-          <w:shd w:val="clear" w:color="auto" w:fill="343541"/>
-        </w:rPr>
-        <w:t>переведеного</w:t>
-      </w:r>
-      <w:proofErr w:type="spellEnd"/>
-      <w:r>
-        <w:rPr>
-          <w:rFonts w:ascii="Segoe UI" w:hAnsi="Segoe UI" w:cs="Segoe UI"/>
-          <w:color w:val="ECECF1"/>
-          <w:shd w:val="clear" w:color="auto" w:fill="343541"/>
-        </w:rPr>
-        <w:t xml:space="preserve"> текста на русский и английский, но есть моменты </w:t>
+        <w:t xml:space="preserve"> используются перечисления, их также нужно перевести на английский и на русский. </w:t>
+      </w:r>
+    </w:p>
+    <w:p>
+      <w:pPr>
+        <w:rPr>
+          <w:rFonts w:ascii="Segoe UI" w:hAnsi="Segoe UI" w:cs="Segoe UI"/>
+          <w:color w:val="ECECF1"/>
+          <w:shd w:val="clear" w:color="auto" w:fill="343541"/>
+        </w:rPr>
+      </w:pPr>
+      <w:r>
+        <w:rPr>
+          <w:rFonts w:ascii="Segoe UI" w:hAnsi="Segoe UI" w:cs="Segoe UI"/>
+          <w:color w:val="ECECF1"/>
+          <w:shd w:val="clear" w:color="auto" w:fill="343541"/>
+        </w:rPr>
+        <w:t xml:space="preserve">5 Пятую задачу можно назвать как дополнительную, ведь задача состоит в разработке системе боя, эта задача не факт что будет за эту итерацию, точнее говоря есть огромная вероятность того что она не будет завершена, но работа над этой задачей должна продолжаться. </w:t>
+      </w:r>
+    </w:p>
+    <w:p>
+      <w:pPr>
+        <w:rPr>
+          <w:rFonts w:ascii="Segoe UI" w:hAnsi="Segoe UI" w:cs="Segoe UI"/>
+          <w:color w:val="ECECF1"/>
+          <w:shd w:val="clear" w:color="auto" w:fill="343541"/>
+        </w:rPr>
+      </w:pPr>
+      <w:r>
+        <w:rPr>
+          <w:rFonts w:ascii="Segoe UI" w:hAnsi="Segoe UI" w:cs="Segoe UI"/>
+          <w:color w:val="ECECF1"/>
+          <w:shd w:val="clear" w:color="auto" w:fill="343541"/>
+        </w:rPr>
+        <w:t>6 Шестая задача также остается дополнительной задачей. Суть задачи эта разработать прототип системы генерации уровней.</w:t>
+      </w:r>
+    </w:p>
+    <w:p>
+      <w:pPr>
+        <w:rPr>
+          <w:rFonts w:ascii="Segoe UI" w:hAnsi="Segoe UI" w:cs="Segoe UI"/>
+          <w:color w:val="ECECF1"/>
+          <w:shd w:val="clear" w:color="auto" w:fill="343541"/>
+        </w:rPr>
+      </w:pPr>
+    </w:p>
+    <w:p>
+      <w:pPr>
+        <w:rPr>
+          <w:rFonts w:ascii="Segoe UI" w:hAnsi="Segoe UI" w:cs="Segoe UI"/>
+          <w:color w:val="ECECF1"/>
+          <w:shd w:val="clear" w:color="auto" w:fill="343541"/>
+        </w:rPr>
+      </w:pPr>
+    </w:p>
+    <w:p>
+      <w:pPr>
+        <w:rPr>
+          <w:rFonts w:ascii="Segoe UI" w:hAnsi="Segoe UI" w:cs="Segoe UI"/>
+          <w:color w:val="ECECF1"/>
+          <w:shd w:val="clear" w:color="auto" w:fill="343541"/>
+        </w:rPr>
+      </w:pPr>
+    </w:p>
+    <w:p>
+      <w:pPr>
+        <w:rPr>
+          <w:rFonts w:ascii="Segoe UI" w:hAnsi="Segoe UI" w:cs="Segoe UI"/>
+          <w:color w:val="ECECF1"/>
+          <w:shd w:val="clear" w:color="auto" w:fill="343541"/>
+        </w:rPr>
+      </w:pPr>
+      <w:r>
+        <w:rPr>
+          <w:rFonts w:ascii="Segoe UI" w:hAnsi="Segoe UI" w:cs="Segoe UI"/>
+          <w:color w:val="ECECF1"/>
+          <w:shd w:val="clear" w:color="auto" w:fill="343541"/>
+        </w:rPr>
+        <w:t xml:space="preserve">Реализовать сохранение настроек по типу управление громкости звуков и музыки, а также текущего </w:t>
+      </w:r>
+      <w:r>
+        <w:rPr>
+          <w:rFonts w:ascii="Segoe UI" w:hAnsi="Segoe UI" w:cs="Segoe UI"/>
+          <w:color w:val="ECECF1"/>
+          <w:shd w:val="clear" w:color="auto" w:fill="343541"/>
+        </w:rPr>
+        <w:t>выбранного языка. Сохранять эти настройки и грузить их нужно в реестр, чтобы была возможность при старте игры их загрузить.</w:t>
+      </w:r>
+    </w:p>
+    <w:p>
+      <w:pPr>
+        <w:rPr>
+          <w:rFonts w:ascii="Segoe UI" w:hAnsi="Segoe UI" w:cs="Segoe UI"/>
+          <w:color w:val="ECECF1"/>
+          <w:shd w:val="clear" w:color="auto" w:fill="343541"/>
+        </w:rPr>
+      </w:pPr>
+    </w:p>
+    <w:p>
+      <w:pPr>
+        <w:rPr>
+          <w:rFonts w:ascii="Segoe UI" w:hAnsi="Segoe UI" w:cs="Segoe UI"/>
+          <w:color w:val="ECECF1"/>
+          <w:shd w:val="clear" w:color="auto" w:fill="343541"/>
+        </w:rPr>
+      </w:pPr>
+      <w:r>
+        <w:rPr>
+          <w:rFonts w:ascii="Segoe UI" w:hAnsi="Segoe UI" w:cs="Segoe UI"/>
+          <w:color w:val="ECECF1"/>
+          <w:shd w:val="clear" w:color="auto" w:fill="343541"/>
+        </w:rPr>
+        <w:t>Исправить работу системы прокачки врага то что она работает это чудо.</w:t>
+      </w:r>
+    </w:p>
+    <w:p>
+      <w:pPr>
+        <w:rPr>
+          <w:rFonts w:ascii="Segoe UI" w:hAnsi="Segoe UI" w:cs="Segoe UI"/>
+          <w:color w:val="ECECF1"/>
+          <w:shd w:val="clear" w:color="auto" w:fill="343541"/>
+        </w:rPr>
+      </w:pPr>
+    </w:p>
+    <w:p>
+      <w:pPr>
+        <w:rPr>
+          <w:rFonts w:ascii="Segoe UI" w:hAnsi="Segoe UI" w:cs="Segoe UI"/>
+          <w:color w:val="ECECF1"/>
+          <w:shd w:val="clear" w:color="auto" w:fill="343541"/>
+          <w:lang w:val="en-US"/>
+        </w:rPr>
+      </w:pPr>
+      <w:r>
+        <w:rPr>
+          <w:rFonts w:ascii="Segoe UI" w:hAnsi="Segoe UI" w:cs="Segoe UI"/>
+          <w:color w:val="ECECF1"/>
+          <w:shd w:val="clear" w:color="auto" w:fill="343541"/>
+        </w:rPr>
+        <w:t xml:space="preserve">Пересмотреть работу системы спавна квестов. Мне не нравится то что фабрика квестов сама начинает </w:t>
       </w:r>
       <w:proofErr w:type="gramStart"/>
       <w:r>
@@ -4099,7 +4277,7 @@
           <w:color w:val="ECECF1"/>
           <w:shd w:val="clear" w:color="auto" w:fill="343541"/>
         </w:rPr>
-        <w:t>где например</w:t>
+        <w:t>спавнить</w:t>
       </w:r>
       <w:proofErr w:type="gramEnd"/>
       <w:r>
@@ -4108,129 +4286,27 @@
           <w:color w:val="ECECF1"/>
           <w:shd w:val="clear" w:color="auto" w:fill="343541"/>
         </w:rPr>
-        <w:t xml:space="preserve"> используются перечисления, их также нужно перевести на английский и на русский. </w:t>
-      </w:r>
-    </w:p>
-    <w:p>
-      <w:pPr>
-        <w:rPr>
-          <w:rFonts w:ascii="Segoe UI" w:hAnsi="Segoe UI" w:cs="Segoe UI"/>
-          <w:color w:val="ECECF1"/>
-          <w:shd w:val="clear" w:color="auto" w:fill="343541"/>
-        </w:rPr>
-      </w:pPr>
-      <w:r>
-        <w:rPr>
-          <w:rFonts w:ascii="Segoe UI" w:hAnsi="Segoe UI" w:cs="Segoe UI"/>
-          <w:color w:val="ECECF1"/>
-          <w:shd w:val="clear" w:color="auto" w:fill="343541"/>
-        </w:rPr>
-        <w:t xml:space="preserve">5 Пятую задачу можно назвать как дополнительную, ведь задача состоит в разработке системе боя, эта задача не факт что будет за эту итерацию, точнее говоря есть огромная вероятность того что она не будет завершена, но работа над этой задачей должна продолжаться. </w:t>
-      </w:r>
-    </w:p>
-    <w:p>
-      <w:pPr>
-        <w:rPr>
-          <w:rFonts w:ascii="Segoe UI" w:hAnsi="Segoe UI" w:cs="Segoe UI"/>
-          <w:color w:val="ECECF1"/>
-          <w:shd w:val="clear" w:color="auto" w:fill="343541"/>
-        </w:rPr>
-      </w:pPr>
-      <w:r>
-        <w:rPr>
-          <w:rFonts w:ascii="Segoe UI" w:hAnsi="Segoe UI" w:cs="Segoe UI"/>
-          <w:color w:val="ECECF1"/>
-          <w:shd w:val="clear" w:color="auto" w:fill="343541"/>
-        </w:rPr>
-        <w:t>6 Шестая задача также остается дополнительной задачей. Суть задачи эта разработать прототип системы генерации уровней.</w:t>
-      </w:r>
-    </w:p>
-    <w:p>
-      <w:pPr>
-        <w:rPr>
-          <w:rFonts w:ascii="Segoe UI" w:hAnsi="Segoe UI" w:cs="Segoe UI"/>
-          <w:color w:val="ECECF1"/>
-          <w:shd w:val="clear" w:color="auto" w:fill="343541"/>
-        </w:rPr>
-      </w:pPr>
-    </w:p>
-    <w:p>
-      <w:pPr>
-        <w:rPr>
-          <w:rFonts w:ascii="Segoe UI" w:hAnsi="Segoe UI" w:cs="Segoe UI"/>
-          <w:color w:val="ECECF1"/>
-          <w:shd w:val="clear" w:color="auto" w:fill="343541"/>
-        </w:rPr>
-      </w:pPr>
-    </w:p>
-    <w:p>
-      <w:pPr>
-        <w:rPr>
-          <w:rFonts w:ascii="Segoe UI" w:hAnsi="Segoe UI" w:cs="Segoe UI"/>
-          <w:color w:val="ECECF1"/>
-          <w:shd w:val="clear" w:color="auto" w:fill="343541"/>
-        </w:rPr>
-      </w:pPr>
-    </w:p>
-    <w:p>
-      <w:pPr>
-        <w:rPr>
-          <w:rFonts w:ascii="Segoe UI" w:hAnsi="Segoe UI" w:cs="Segoe UI"/>
-          <w:color w:val="ECECF1"/>
-          <w:shd w:val="clear" w:color="auto" w:fill="343541"/>
-        </w:rPr>
-      </w:pPr>
-      <w:r>
-        <w:rPr>
-          <w:rFonts w:ascii="Segoe UI" w:hAnsi="Segoe UI" w:cs="Segoe UI"/>
-          <w:color w:val="ECECF1"/>
-          <w:shd w:val="clear" w:color="auto" w:fill="343541"/>
-        </w:rPr>
-        <w:t xml:space="preserve">Реализовать сохранение настроек по типу управление громкости звуков и музыки, а также текущего </w:t>
-      </w:r>
-      <w:r>
-        <w:rPr>
-          <w:rFonts w:ascii="Segoe UI" w:hAnsi="Segoe UI" w:cs="Segoe UI"/>
-          <w:color w:val="ECECF1"/>
-          <w:shd w:val="clear" w:color="auto" w:fill="343541"/>
-        </w:rPr>
-        <w:t>выбранного языка. Сохранять эти настройки и грузить их нужно в реестр, чтобы была возможность при старте игры их загрузить.</w:t>
-      </w:r>
-    </w:p>
-    <w:p>
-      <w:pPr>
-        <w:rPr>
-          <w:rFonts w:ascii="Segoe UI" w:hAnsi="Segoe UI" w:cs="Segoe UI"/>
-          <w:color w:val="ECECF1"/>
-          <w:shd w:val="clear" w:color="auto" w:fill="343541"/>
-        </w:rPr>
-      </w:pPr>
-    </w:p>
-    <w:p>
-      <w:pPr>
-        <w:rPr>
-          <w:rFonts w:ascii="Segoe UI" w:hAnsi="Segoe UI" w:cs="Segoe UI"/>
-          <w:color w:val="ECECF1"/>
-          <w:shd w:val="clear" w:color="auto" w:fill="343541"/>
-        </w:rPr>
-      </w:pPr>
-      <w:r>
-        <w:rPr>
-          <w:rFonts w:ascii="Segoe UI" w:hAnsi="Segoe UI" w:cs="Segoe UI"/>
-          <w:color w:val="ECECF1"/>
-          <w:shd w:val="clear" w:color="auto" w:fill="343541"/>
-        </w:rPr>
-        <w:t>Исправить работу системы прокачки врага то что она работает это чудо.</w:t>
-      </w:r>
-    </w:p>
-    <w:p>
-      <w:pPr>
-        <w:rPr>
-          <w:rFonts w:ascii="Segoe UI" w:hAnsi="Segoe UI" w:cs="Segoe UI"/>
-          <w:color w:val="ECECF1"/>
-          <w:shd w:val="clear" w:color="auto" w:fill="343541"/>
-        </w:rPr>
-      </w:pPr>
+        <w:t xml:space="preserve"> как только она сама того пожелает, а что если измениться порядок работы </w:t>
+      </w:r>
+      <w:proofErr w:type="spellStart"/>
+      <w:r>
+        <w:rPr>
+          <w:rFonts w:ascii="Segoe UI" w:hAnsi="Segoe UI" w:cs="Segoe UI"/>
+          <w:color w:val="ECECF1"/>
+          <w:shd w:val="clear" w:color="auto" w:fill="343541"/>
+          <w:lang w:val="en-US"/>
+        </w:rPr>
+        <w:t>IPlayerProgressService</w:t>
+      </w:r>
+      <w:proofErr w:type="spellEnd"/>
+      <w:r>
+        <w:rPr>
+          <w:rFonts w:ascii="Segoe UI" w:hAnsi="Segoe UI" w:cs="Segoe UI"/>
+          <w:color w:val="ECECF1"/>
+          <w:shd w:val="clear" w:color="auto" w:fill="343541"/>
+        </w:rPr>
+        <w:t>. Нужно попытаться подключить фабрику для работы с этим сервисом.</w:t>
+      </w:r>
     </w:p>
     <w:p>
       <w:pPr>

</xml_diff>

<commit_message>
And localization. Deactivate QuestSystem.
</commit_message>
<xml_diff>
--- a/Итерации.docx
+++ b/Итерации.docx
@@ -1,6 +1,7 @@
 
 <file path=word/document.xml><?xml version="1.0" encoding="utf-8"?>
 <w:document xmlns:wpc="http://schemas.microsoft.com/office/word/2010/wordprocessingCanvas" xmlns:cx="http://schemas.microsoft.com/office/drawing/2014/chartex" xmlns:mc="http://schemas.openxmlformats.org/markup-compatibility/2006" xmlns:o="urn:schemas-microsoft-com:office:office" xmlns:r="http://schemas.openxmlformats.org/officeDocument/2006/relationships" xmlns:m="http://schemas.openxmlformats.org/officeDocument/2006/math" xmlns:v="urn:schemas-microsoft-com:vml" xmlns:wp14="http://schemas.microsoft.com/office/word/2010/wordprocessingDrawing" xmlns:wp="http://schemas.openxmlformats.org/drawingml/2006/wordprocessingDrawing" xmlns:w10="urn:schemas-microsoft-com:office:word" xmlns:w="http://schemas.openxmlformats.org/wordprocessingml/2006/main" xmlns:w14="http://schemas.microsoft.com/office/word/2010/wordml" xmlns:w15="http://schemas.microsoft.com/office/word/2012/wordml" xmlns:w16se="http://schemas.microsoft.com/office/word/2015/wordml/symex" xmlns:wpg="http://schemas.microsoft.com/office/word/2010/wordprocessingGroup" xmlns:wpi="http://schemas.microsoft.com/office/word/2010/wordprocessingInk" xmlns:wne="http://schemas.microsoft.com/office/word/2006/wordml" xmlns:wps="http://schemas.microsoft.com/office/word/2010/wordprocessingShape" mc:Ignorable="w14 w15 w16se wp14">
+  <w:background w:color="5A5A5A" w:themeColor="text1" w:themeTint="A5"/>
   <w:body>
     <w:p>
       <w:pPr>
@@ -75,7 +76,47 @@
           <w:color w:val="ECECF1"/>
           <w:shd w:val="clear" w:color="auto" w:fill="343541"/>
         </w:rPr>
-        <w:t xml:space="preserve"> скриптейбл обджектах. </w:t>
+        <w:t xml:space="preserve"> </w:t>
+      </w:r>
+      <w:proofErr w:type="spellStart"/>
+      <w:r>
+        <w:rPr>
+          <w:rFonts w:ascii="Segoe UI" w:hAnsi="Segoe UI" w:cs="Segoe UI"/>
+          <w:strike/>
+          <w:color w:val="ECECF1"/>
+          <w:shd w:val="clear" w:color="auto" w:fill="343541"/>
+        </w:rPr>
+        <w:t>скриптейбл</w:t>
+      </w:r>
+      <w:proofErr w:type="spellEnd"/>
+      <w:r>
+        <w:rPr>
+          <w:rFonts w:ascii="Segoe UI" w:hAnsi="Segoe UI" w:cs="Segoe UI"/>
+          <w:strike/>
+          <w:color w:val="ECECF1"/>
+          <w:shd w:val="clear" w:color="auto" w:fill="343541"/>
+        </w:rPr>
+        <w:t xml:space="preserve"> </w:t>
+      </w:r>
+      <w:proofErr w:type="spellStart"/>
+      <w:r>
+        <w:rPr>
+          <w:rFonts w:ascii="Segoe UI" w:hAnsi="Segoe UI" w:cs="Segoe UI"/>
+          <w:strike/>
+          <w:color w:val="ECECF1"/>
+          <w:shd w:val="clear" w:color="auto" w:fill="343541"/>
+        </w:rPr>
+        <w:t>обджектах</w:t>
+      </w:r>
+      <w:proofErr w:type="spellEnd"/>
+      <w:r>
+        <w:rPr>
+          <w:rFonts w:ascii="Segoe UI" w:hAnsi="Segoe UI" w:cs="Segoe UI"/>
+          <w:strike/>
+          <w:color w:val="ECECF1"/>
+          <w:shd w:val="clear" w:color="auto" w:fill="343541"/>
+        </w:rPr>
+        <w:t xml:space="preserve">. </w:t>
       </w:r>
     </w:p>
     <w:p>
@@ -2127,7 +2168,27 @@
           <w:color w:val="ECECF1"/>
           <w:shd w:val="clear" w:color="auto" w:fill="343541"/>
         </w:rPr>
-        <w:t xml:space="preserve"> связанную с отображением окна квест </w:t>
+        <w:t xml:space="preserve"> связанную с отображением окна </w:t>
+      </w:r>
+      <w:proofErr w:type="spellStart"/>
+      <w:r>
+        <w:rPr>
+          <w:rFonts w:ascii="Segoe UI" w:hAnsi="Segoe UI" w:cs="Segoe UI"/>
+          <w:strike/>
+          <w:color w:val="ECECF1"/>
+          <w:shd w:val="clear" w:color="auto" w:fill="343541"/>
+        </w:rPr>
+        <w:t>квест</w:t>
+      </w:r>
+      <w:proofErr w:type="spellEnd"/>
+      <w:r>
+        <w:rPr>
+          <w:rFonts w:ascii="Segoe UI" w:hAnsi="Segoe UI" w:cs="Segoe UI"/>
+          <w:strike/>
+          <w:color w:val="ECECF1"/>
+          <w:shd w:val="clear" w:color="auto" w:fill="343541"/>
+        </w:rPr>
+        <w:t xml:space="preserve"> </w:t>
       </w:r>
       <w:proofErr w:type="spellStart"/>
       <w:r>
@@ -2685,7 +2746,25 @@
           <w:color w:val="ECECF1"/>
           <w:shd w:val="clear" w:color="auto" w:fill="343541"/>
         </w:rPr>
-        <w:t xml:space="preserve">4 Обновить UI для системы квестов, </w:t>
+        <w:t xml:space="preserve">4 Обновить UI для системы </w:t>
+      </w:r>
+      <w:proofErr w:type="spellStart"/>
+      <w:r>
+        <w:rPr>
+          <w:rFonts w:ascii="Segoe UI" w:hAnsi="Segoe UI" w:cs="Segoe UI"/>
+          <w:color w:val="ECECF1"/>
+          <w:shd w:val="clear" w:color="auto" w:fill="343541"/>
+        </w:rPr>
+        <w:t>квестов</w:t>
+      </w:r>
+      <w:proofErr w:type="spellEnd"/>
+      <w:r>
+        <w:rPr>
+          <w:rFonts w:ascii="Segoe UI" w:hAnsi="Segoe UI" w:cs="Segoe UI"/>
+          <w:color w:val="ECECF1"/>
+          <w:shd w:val="clear" w:color="auto" w:fill="343541"/>
+        </w:rPr>
+        <w:t xml:space="preserve">, </w:t>
       </w:r>
       <w:proofErr w:type="spellStart"/>
       <w:r>
@@ -3192,25 +3271,7 @@
           <w:color w:val="ECECF1"/>
           <w:shd w:val="clear" w:color="auto" w:fill="343541"/>
         </w:rPr>
-        <w:t xml:space="preserve"> как можно организовать рандомную генерацию мира, и начать работу над прототипом </w:t>
-      </w:r>
-      <w:proofErr w:type="spellStart"/>
-      <w:r>
-        <w:rPr>
-          <w:rFonts w:ascii="Segoe UI" w:hAnsi="Segoe UI" w:cs="Segoe UI"/>
-          <w:color w:val="ECECF1"/>
-          <w:shd w:val="clear" w:color="auto" w:fill="343541"/>
-        </w:rPr>
-        <w:t>рандомной</w:t>
-      </w:r>
-      <w:proofErr w:type="spellEnd"/>
-      <w:r>
-        <w:rPr>
-          <w:rFonts w:ascii="Segoe UI" w:hAnsi="Segoe UI" w:cs="Segoe UI"/>
-          <w:color w:val="ECECF1"/>
-          <w:shd w:val="clear" w:color="auto" w:fill="343541"/>
-        </w:rPr>
-        <w:t xml:space="preserve"> генерации.</w:t>
+        <w:t xml:space="preserve"> как можно организовать рандомную генерацию мира, и начать работу над прототипом рандомной генерации.</w:t>
       </w:r>
     </w:p>
     <w:p>
@@ -3416,7 +3477,27 @@
           <w:color w:val="ECECF1"/>
           <w:shd w:val="clear" w:color="auto" w:fill="343541"/>
         </w:rPr>
-        <w:t xml:space="preserve">, это касается только структуры проекта. Особенно нужно обратить внимание на UI префабы </w:t>
+        <w:t xml:space="preserve">, это касается только структуры проекта. Особенно нужно обратить внимание на UI </w:t>
+      </w:r>
+      <w:proofErr w:type="spellStart"/>
+      <w:r>
+        <w:rPr>
+          <w:rFonts w:ascii="Segoe UI" w:hAnsi="Segoe UI" w:cs="Segoe UI"/>
+          <w:strike/>
+          <w:color w:val="ECECF1"/>
+          <w:shd w:val="clear" w:color="auto" w:fill="343541"/>
+        </w:rPr>
+        <w:t>префабы</w:t>
+      </w:r>
+      <w:proofErr w:type="spellEnd"/>
+      <w:r>
+        <w:rPr>
+          <w:rFonts w:ascii="Segoe UI" w:hAnsi="Segoe UI" w:cs="Segoe UI"/>
+          <w:strike/>
+          <w:color w:val="ECECF1"/>
+          <w:shd w:val="clear" w:color="auto" w:fill="343541"/>
+        </w:rPr>
+        <w:t xml:space="preserve"> </w:t>
       </w:r>
       <w:proofErr w:type="spellStart"/>
       <w:r>
@@ -4065,54 +4146,386 @@
           <w:color w:val="ECECF1"/>
           <w:shd w:val="clear" w:color="auto" w:fill="343541"/>
         </w:rPr>
-        <w:t>, отвечающий за</w:t>
+        <w:t xml:space="preserve">, отвечающий за здоровья врагом. </w:t>
+      </w:r>
+    </w:p>
+    <w:p>
+      <w:pPr>
+        <w:rPr>
+          <w:rFonts w:ascii="Segoe UI" w:hAnsi="Segoe UI" w:cs="Segoe UI"/>
+          <w:color w:val="ECECF1"/>
+          <w:shd w:val="clear" w:color="auto" w:fill="343541"/>
+        </w:rPr>
+      </w:pPr>
+      <w:r>
+        <w:rPr>
+          <w:rFonts w:ascii="Segoe UI" w:hAnsi="Segoe UI" w:cs="Segoe UI"/>
+          <w:color w:val="ECECF1"/>
+          <w:shd w:val="clear" w:color="auto" w:fill="343541"/>
+        </w:rPr>
+        <w:t xml:space="preserve">4 Локализации игры. На данный момент существует уже часть </w:t>
+      </w:r>
+      <w:proofErr w:type="spellStart"/>
+      <w:r>
+        <w:rPr>
+          <w:rFonts w:ascii="Segoe UI" w:hAnsi="Segoe UI" w:cs="Segoe UI"/>
+          <w:color w:val="ECECF1"/>
+          <w:shd w:val="clear" w:color="auto" w:fill="343541"/>
+        </w:rPr>
+        <w:t>переведеного</w:t>
+      </w:r>
+      <w:proofErr w:type="spellEnd"/>
+      <w:r>
+        <w:rPr>
+          <w:rFonts w:ascii="Segoe UI" w:hAnsi="Segoe UI" w:cs="Segoe UI"/>
+          <w:color w:val="ECECF1"/>
+          <w:shd w:val="clear" w:color="auto" w:fill="343541"/>
+        </w:rPr>
+        <w:t xml:space="preserve"> текста на русский и английский, но есть моменты </w:t>
+      </w:r>
+      <w:proofErr w:type="gramStart"/>
+      <w:r>
+        <w:rPr>
+          <w:rFonts w:ascii="Segoe UI" w:hAnsi="Segoe UI" w:cs="Segoe UI"/>
+          <w:color w:val="ECECF1"/>
+          <w:shd w:val="clear" w:color="auto" w:fill="343541"/>
+        </w:rPr>
+        <w:t>где например</w:t>
+      </w:r>
+      <w:proofErr w:type="gramEnd"/>
+      <w:r>
+        <w:rPr>
+          <w:rFonts w:ascii="Segoe UI" w:hAnsi="Segoe UI" w:cs="Segoe UI"/>
+          <w:color w:val="ECECF1"/>
+          <w:shd w:val="clear" w:color="auto" w:fill="343541"/>
+        </w:rPr>
+        <w:t xml:space="preserve"> используются перечисления, их также нужно перевести на английский и на русский. </w:t>
+      </w:r>
+    </w:p>
+    <w:p>
+      <w:pPr>
+        <w:rPr>
+          <w:rFonts w:ascii="Segoe UI" w:hAnsi="Segoe UI" w:cs="Segoe UI"/>
+          <w:color w:val="ECECF1"/>
+          <w:shd w:val="clear" w:color="auto" w:fill="343541"/>
+        </w:rPr>
+      </w:pPr>
+      <w:r>
+        <w:rPr>
+          <w:rFonts w:ascii="Segoe UI" w:hAnsi="Segoe UI" w:cs="Segoe UI"/>
+          <w:color w:val="ECECF1"/>
+          <w:shd w:val="clear" w:color="auto" w:fill="343541"/>
+        </w:rPr>
+        <w:t xml:space="preserve">5 Пятую задачу можно назвать как дополнительную, ведь задача состоит в разработке системе боя, эта задача не факт что будет за эту итерацию, точнее говоря есть огромная вероятность того что она не будет завершена, но работа над этой задачей должна продолжаться. </w:t>
+      </w:r>
+    </w:p>
+    <w:p>
+      <w:pPr>
+        <w:rPr>
+          <w:rFonts w:ascii="Segoe UI" w:hAnsi="Segoe UI" w:cs="Segoe UI"/>
+          <w:color w:val="ECECF1"/>
+          <w:shd w:val="clear" w:color="auto" w:fill="343541"/>
+        </w:rPr>
+      </w:pPr>
+      <w:r>
+        <w:rPr>
+          <w:rFonts w:ascii="Segoe UI" w:hAnsi="Segoe UI" w:cs="Segoe UI"/>
+          <w:color w:val="ECECF1"/>
+          <w:shd w:val="clear" w:color="auto" w:fill="343541"/>
+        </w:rPr>
+        <w:t>6 Шестая задача также остается дополнительной задачей. Суть задачи эта разработать прототип системы генерации уровней.</w:t>
+      </w:r>
+    </w:p>
+    <w:p>
+      <w:pPr>
+        <w:rPr>
+          <w:rFonts w:ascii="Segoe UI" w:hAnsi="Segoe UI" w:cs="Segoe UI"/>
+          <w:color w:val="ECECF1"/>
+          <w:shd w:val="clear" w:color="auto" w:fill="343541"/>
+        </w:rPr>
+      </w:pPr>
+      <w:r>
+        <w:rPr>
+          <w:rFonts w:ascii="Segoe UI" w:hAnsi="Segoe UI" w:cs="Segoe UI"/>
+          <w:color w:val="ECECF1"/>
+          <w:shd w:val="clear" w:color="auto" w:fill="343541"/>
+        </w:rPr>
+        <w:br/>
+      </w:r>
+    </w:p>
+    <w:p>
+      <w:pPr>
+        <w:rPr>
+          <w:rFonts w:ascii="Times New Roman" w:hAnsi="Times New Roman" w:cs="Times New Roman"/>
+          <w:color w:val="ECECF1"/>
+          <w:sz w:val="28"/>
+          <w:szCs w:val="28"/>
+          <w:shd w:val="clear" w:color="auto" w:fill="343541"/>
+        </w:rPr>
+      </w:pPr>
+      <w:r>
+        <w:rPr>
+          <w:rFonts w:ascii="Segoe UI" w:hAnsi="Segoe UI" w:cs="Segoe UI"/>
+          <w:color w:val="ECECF1"/>
+          <w:shd w:val="clear" w:color="auto" w:fill="343541"/>
+        </w:rPr>
+        <w:br w:type="page"/>
+      </w:r>
+      <w:r>
+        <w:rPr>
+          <w:rFonts w:ascii="Times New Roman" w:hAnsi="Times New Roman" w:cs="Times New Roman"/>
+          <w:color w:val="ECECF1"/>
+          <w:sz w:val="28"/>
+          <w:szCs w:val="28"/>
+          <w:shd w:val="clear" w:color="auto" w:fill="343541"/>
+        </w:rPr>
+        <w:lastRenderedPageBreak/>
+        <w:t>17 итерация:</w:t>
+      </w:r>
+    </w:p>
+    <w:p>
+      <w:pPr>
+        <w:pStyle w:val="a3"/>
+        <w:numPr>
+          <w:ilvl w:val="0"/>
+          <w:numId w:val="2"/>
+        </w:numPr>
+        <w:ind w:left="357" w:hanging="357"/>
+        <w:rPr>
+          <w:rFonts w:ascii="Times New Roman" w:hAnsi="Times New Roman" w:cs="Times New Roman"/>
+          <w:strike/>
+          <w:color w:val="ECECF1"/>
+          <w:sz w:val="28"/>
+          <w:szCs w:val="28"/>
+          <w:shd w:val="clear" w:color="auto" w:fill="343541"/>
+        </w:rPr>
+      </w:pPr>
+      <w:r>
+        <w:rPr>
+          <w:rFonts w:ascii="Times New Roman" w:hAnsi="Times New Roman" w:cs="Times New Roman"/>
+          <w:strike/>
+          <w:color w:val="ECECF1"/>
+          <w:sz w:val="28"/>
+          <w:szCs w:val="28"/>
+          <w:shd w:val="clear" w:color="auto" w:fill="343541"/>
+        </w:rPr>
+        <w:t>Закончить локализацию панелей, которые отображают информацию об игроке.</w:t>
+      </w:r>
+    </w:p>
+    <w:p>
+      <w:pPr>
+        <w:pStyle w:val="a3"/>
+        <w:numPr>
+          <w:ilvl w:val="0"/>
+          <w:numId w:val="2"/>
+        </w:numPr>
+        <w:ind w:left="357" w:hanging="357"/>
+        <w:rPr>
+          <w:rFonts w:ascii="Times New Roman" w:hAnsi="Times New Roman" w:cs="Times New Roman"/>
+          <w:color w:val="ECECF1"/>
+          <w:sz w:val="28"/>
+          <w:szCs w:val="28"/>
+          <w:shd w:val="clear" w:color="auto" w:fill="343541"/>
+        </w:rPr>
+      </w:pPr>
+      <w:r>
+        <w:rPr>
+          <w:rFonts w:ascii="Times New Roman" w:hAnsi="Times New Roman" w:cs="Times New Roman"/>
+          <w:color w:val="ECECF1"/>
+          <w:sz w:val="28"/>
+          <w:szCs w:val="28"/>
+          <w:shd w:val="clear" w:color="auto" w:fill="343541"/>
+        </w:rPr>
+        <w:t>Улучшить ИИ, а именно запретить производить атаку для ИИ если ИИ начал атаку, но был застагерен ударом игрока то ии должен потерять возможность повторной атаки до тех пор, пока не пройдет перезарядки атаки.</w:t>
       </w:r>
       <w:bookmarkStart w:id="0" w:name="_GoBack"/>
       <w:bookmarkEnd w:id="0"/>
-      <w:r>
-        <w:rPr>
-          <w:rFonts w:ascii="Segoe UI" w:hAnsi="Segoe UI" w:cs="Segoe UI"/>
-          <w:strike/>
-          <w:color w:val="ECECF1"/>
-          <w:shd w:val="clear" w:color="auto" w:fill="343541"/>
-        </w:rPr>
-        <w:t xml:space="preserve"> здоровья врагом. </w:t>
-      </w:r>
-    </w:p>
-    <w:p>
-      <w:pPr>
-        <w:rPr>
-          <w:rFonts w:ascii="Segoe UI" w:hAnsi="Segoe UI" w:cs="Segoe UI"/>
-          <w:color w:val="ECECF1"/>
-          <w:shd w:val="clear" w:color="auto" w:fill="343541"/>
-        </w:rPr>
-      </w:pPr>
-      <w:r>
-        <w:rPr>
-          <w:rFonts w:ascii="Segoe UI" w:hAnsi="Segoe UI" w:cs="Segoe UI"/>
-          <w:color w:val="ECECF1"/>
-          <w:shd w:val="clear" w:color="auto" w:fill="343541"/>
-        </w:rPr>
-        <w:t xml:space="preserve">4 Локализации игры. На данный момент существует уже часть </w:t>
-      </w:r>
-      <w:proofErr w:type="spellStart"/>
-      <w:r>
-        <w:rPr>
-          <w:rFonts w:ascii="Segoe UI" w:hAnsi="Segoe UI" w:cs="Segoe UI"/>
-          <w:color w:val="ECECF1"/>
-          <w:shd w:val="clear" w:color="auto" w:fill="343541"/>
-        </w:rPr>
-        <w:t>переведеного</w:t>
-      </w:r>
-      <w:proofErr w:type="spellEnd"/>
-      <w:r>
-        <w:rPr>
-          <w:rFonts w:ascii="Segoe UI" w:hAnsi="Segoe UI" w:cs="Segoe UI"/>
-          <w:color w:val="ECECF1"/>
-          <w:shd w:val="clear" w:color="auto" w:fill="343541"/>
-        </w:rPr>
-        <w:t xml:space="preserve"> текста на русский и английский, но есть моменты </w:t>
-      </w:r>
+    </w:p>
+    <w:p>
+      <w:pPr>
+        <w:pStyle w:val="a3"/>
+        <w:numPr>
+          <w:ilvl w:val="0"/>
+          <w:numId w:val="2"/>
+        </w:numPr>
+        <w:ind w:left="357" w:hanging="357"/>
+        <w:rPr>
+          <w:rFonts w:ascii="Times New Roman" w:hAnsi="Times New Roman" w:cs="Times New Roman"/>
+          <w:color w:val="ECECF1"/>
+          <w:sz w:val="28"/>
+          <w:szCs w:val="28"/>
+          <w:shd w:val="clear" w:color="auto" w:fill="343541"/>
+        </w:rPr>
+      </w:pPr>
+      <w:r>
+        <w:rPr>
+          <w:rFonts w:ascii="Times New Roman" w:hAnsi="Times New Roman" w:cs="Times New Roman"/>
+          <w:color w:val="ECECF1"/>
+          <w:sz w:val="28"/>
+          <w:szCs w:val="28"/>
+          <w:shd w:val="clear" w:color="auto" w:fill="343541"/>
+        </w:rPr>
+        <w:t>Начать разработку рандомной генерации локаций.</w:t>
+      </w:r>
+    </w:p>
+    <w:p>
+      <w:pPr>
+        <w:rPr>
+          <w:shd w:val="clear" w:color="auto" w:fill="343541"/>
+        </w:rPr>
+      </w:pPr>
+    </w:p>
+    <w:p>
+      <w:pPr>
+        <w:rPr>
+          <w:shd w:val="clear" w:color="auto" w:fill="343541"/>
+        </w:rPr>
+      </w:pPr>
+    </w:p>
+    <w:p>
+      <w:pPr>
+        <w:rPr>
+          <w:shd w:val="clear" w:color="auto" w:fill="343541"/>
+        </w:rPr>
+      </w:pPr>
+    </w:p>
+    <w:p>
+      <w:pPr>
+        <w:rPr>
+          <w:rFonts w:ascii="Segoe UI" w:hAnsi="Segoe UI" w:cs="Segoe UI"/>
+          <w:color w:val="ECECF1"/>
+          <w:shd w:val="clear" w:color="auto" w:fill="343541"/>
+        </w:rPr>
+      </w:pPr>
+      <w:r>
+        <w:rPr>
+          <w:shd w:val="clear" w:color="auto" w:fill="343541"/>
+        </w:rPr>
+        <w:br w:type="page"/>
+      </w:r>
+    </w:p>
+    <w:p>
+      <w:pPr>
+        <w:rPr>
+          <w:rFonts w:ascii="Segoe UI" w:hAnsi="Segoe UI" w:cs="Segoe UI"/>
+          <w:color w:val="ECECF1"/>
+          <w:shd w:val="clear" w:color="auto" w:fill="343541"/>
+        </w:rPr>
+      </w:pPr>
+    </w:p>
+    <w:p>
+      <w:pPr>
+        <w:rPr>
+          <w:rFonts w:ascii="Segoe UI" w:hAnsi="Segoe UI" w:cs="Segoe UI"/>
+          <w:color w:val="ECECF1"/>
+          <w:shd w:val="clear" w:color="auto" w:fill="343541"/>
+        </w:rPr>
+      </w:pPr>
+    </w:p>
+    <w:p>
+      <w:pPr>
+        <w:rPr>
+          <w:rFonts w:ascii="Segoe UI" w:hAnsi="Segoe UI" w:cs="Segoe UI"/>
+          <w:color w:val="ECECF1"/>
+          <w:shd w:val="clear" w:color="auto" w:fill="343541"/>
+        </w:rPr>
+      </w:pPr>
+    </w:p>
+    <w:p>
+      <w:pPr>
+        <w:rPr>
+          <w:rFonts w:ascii="Segoe UI" w:hAnsi="Segoe UI" w:cs="Segoe UI"/>
+          <w:color w:val="ECECF1"/>
+          <w:shd w:val="clear" w:color="auto" w:fill="343541"/>
+        </w:rPr>
+      </w:pPr>
+      <w:r>
+        <w:rPr>
+          <w:rFonts w:ascii="Segoe UI" w:hAnsi="Segoe UI" w:cs="Segoe UI"/>
+          <w:color w:val="ECECF1"/>
+          <w:shd w:val="clear" w:color="auto" w:fill="343541"/>
+        </w:rPr>
+        <w:t xml:space="preserve">Реализовать сохранение настроек по типу управление громкости звуков и музыки, а также текущего </w:t>
+      </w:r>
+      <w:r>
+        <w:rPr>
+          <w:rFonts w:ascii="Segoe UI" w:hAnsi="Segoe UI" w:cs="Segoe UI"/>
+          <w:color w:val="ECECF1"/>
+          <w:shd w:val="clear" w:color="auto" w:fill="343541"/>
+        </w:rPr>
+        <w:t>выбранного языка. Сохранять эти настройки и грузить их нужно в реестр, чтобы была возможность при старте игры их загрузить.</w:t>
+      </w:r>
+    </w:p>
+    <w:p>
+      <w:pPr>
+        <w:rPr>
+          <w:rFonts w:ascii="Segoe UI" w:hAnsi="Segoe UI" w:cs="Segoe UI"/>
+          <w:color w:val="ECECF1"/>
+          <w:shd w:val="clear" w:color="auto" w:fill="343541"/>
+        </w:rPr>
+      </w:pPr>
+    </w:p>
+    <w:p>
+      <w:pPr>
+        <w:rPr>
+          <w:rFonts w:ascii="Segoe UI" w:hAnsi="Segoe UI" w:cs="Segoe UI"/>
+          <w:color w:val="ECECF1"/>
+          <w:shd w:val="clear" w:color="auto" w:fill="343541"/>
+        </w:rPr>
+      </w:pPr>
+      <w:r>
+        <w:rPr>
+          <w:rFonts w:ascii="Segoe UI" w:hAnsi="Segoe UI" w:cs="Segoe UI"/>
+          <w:color w:val="ECECF1"/>
+          <w:shd w:val="clear" w:color="auto" w:fill="343541"/>
+        </w:rPr>
+        <w:t>Исправить работу системы прокачки врага то что она работает это чудо.</w:t>
+      </w:r>
+    </w:p>
+    <w:p>
+      <w:pPr>
+        <w:rPr>
+          <w:rFonts w:ascii="Segoe UI" w:hAnsi="Segoe UI" w:cs="Segoe UI"/>
+          <w:color w:val="ECECF1"/>
+          <w:shd w:val="clear" w:color="auto" w:fill="343541"/>
+        </w:rPr>
+      </w:pPr>
+    </w:p>
+    <w:p>
+      <w:pPr>
+        <w:rPr>
+          <w:rFonts w:ascii="Segoe UI" w:hAnsi="Segoe UI" w:cs="Segoe UI"/>
+          <w:color w:val="ECECF1"/>
+          <w:shd w:val="clear" w:color="auto" w:fill="343541"/>
+        </w:rPr>
+      </w:pPr>
+      <w:r>
+        <w:rPr>
+          <w:rFonts w:ascii="Segoe UI" w:hAnsi="Segoe UI" w:cs="Segoe UI"/>
+          <w:color w:val="ECECF1"/>
+          <w:shd w:val="clear" w:color="auto" w:fill="343541"/>
+        </w:rPr>
+        <w:t xml:space="preserve">Пересмотреть работу системы спавна квестов. Мне не нравится то что фабрика </w:t>
+      </w:r>
+      <w:proofErr w:type="spellStart"/>
+      <w:r>
+        <w:rPr>
+          <w:rFonts w:ascii="Segoe UI" w:hAnsi="Segoe UI" w:cs="Segoe UI"/>
+          <w:color w:val="ECECF1"/>
+          <w:shd w:val="clear" w:color="auto" w:fill="343541"/>
+        </w:rPr>
+        <w:t>квестов</w:t>
+      </w:r>
+      <w:proofErr w:type="spellEnd"/>
+      <w:r>
+        <w:rPr>
+          <w:rFonts w:ascii="Segoe UI" w:hAnsi="Segoe UI" w:cs="Segoe UI"/>
+          <w:color w:val="ECECF1"/>
+          <w:shd w:val="clear" w:color="auto" w:fill="343541"/>
+        </w:rPr>
+        <w:t xml:space="preserve"> сама начинает </w:t>
+      </w:r>
+      <w:proofErr w:type="spellStart"/>
       <w:proofErr w:type="gramStart"/>
       <w:r>
         <w:rPr>
@@ -4120,165 +4533,9 @@
           <w:color w:val="ECECF1"/>
           <w:shd w:val="clear" w:color="auto" w:fill="343541"/>
         </w:rPr>
-        <w:t>где например</w:t>
-      </w:r>
-      <w:proofErr w:type="gramEnd"/>
-      <w:r>
-        <w:rPr>
-          <w:rFonts w:ascii="Segoe UI" w:hAnsi="Segoe UI" w:cs="Segoe UI"/>
-          <w:color w:val="ECECF1"/>
-          <w:shd w:val="clear" w:color="auto" w:fill="343541"/>
-        </w:rPr>
-        <w:t xml:space="preserve"> используются перечисления, их также нужно перевести на английский и на русский. </w:t>
-      </w:r>
-    </w:p>
-    <w:p>
-      <w:pPr>
-        <w:rPr>
-          <w:rFonts w:ascii="Segoe UI" w:hAnsi="Segoe UI" w:cs="Segoe UI"/>
-          <w:color w:val="ECECF1"/>
-          <w:shd w:val="clear" w:color="auto" w:fill="343541"/>
-        </w:rPr>
-      </w:pPr>
-      <w:r>
-        <w:rPr>
-          <w:rFonts w:ascii="Segoe UI" w:hAnsi="Segoe UI" w:cs="Segoe UI"/>
-          <w:color w:val="ECECF1"/>
-          <w:shd w:val="clear" w:color="auto" w:fill="343541"/>
-        </w:rPr>
-        <w:t xml:space="preserve">5 Пятую задачу можно назвать как дополнительную, ведь задача состоит в разработке системе боя, эта задача не факт что будет за эту итерацию, точнее говоря есть огромная вероятность того что она не будет завершена, но работа над этой задачей должна продолжаться. </w:t>
-      </w:r>
-    </w:p>
-    <w:p>
-      <w:pPr>
-        <w:rPr>
-          <w:rFonts w:ascii="Segoe UI" w:hAnsi="Segoe UI" w:cs="Segoe UI"/>
-          <w:color w:val="ECECF1"/>
-          <w:shd w:val="clear" w:color="auto" w:fill="343541"/>
-        </w:rPr>
-      </w:pPr>
-      <w:r>
-        <w:rPr>
-          <w:rFonts w:ascii="Segoe UI" w:hAnsi="Segoe UI" w:cs="Segoe UI"/>
-          <w:color w:val="ECECF1"/>
-          <w:shd w:val="clear" w:color="auto" w:fill="343541"/>
-        </w:rPr>
-        <w:t>6 Шестая задача также остается дополнительной задачей. Суть задачи эта разработать прототип системы генерации уровней.</w:t>
-      </w:r>
-    </w:p>
-    <w:p>
-      <w:pPr>
-        <w:rPr>
-          <w:rFonts w:ascii="Segoe UI" w:hAnsi="Segoe UI" w:cs="Segoe UI"/>
-          <w:color w:val="ECECF1"/>
-          <w:shd w:val="clear" w:color="auto" w:fill="343541"/>
-        </w:rPr>
-      </w:pPr>
-    </w:p>
-    <w:p>
-      <w:pPr>
-        <w:rPr>
-          <w:rFonts w:ascii="Segoe UI" w:hAnsi="Segoe UI" w:cs="Segoe UI"/>
-          <w:color w:val="ECECF1"/>
-          <w:shd w:val="clear" w:color="auto" w:fill="343541"/>
-        </w:rPr>
-      </w:pPr>
-    </w:p>
-    <w:p>
-      <w:pPr>
-        <w:rPr>
-          <w:rFonts w:ascii="Segoe UI" w:hAnsi="Segoe UI" w:cs="Segoe UI"/>
-          <w:color w:val="ECECF1"/>
-          <w:shd w:val="clear" w:color="auto" w:fill="343541"/>
-        </w:rPr>
-      </w:pPr>
-    </w:p>
-    <w:p>
-      <w:pPr>
-        <w:rPr>
-          <w:rFonts w:ascii="Segoe UI" w:hAnsi="Segoe UI" w:cs="Segoe UI"/>
-          <w:color w:val="ECECF1"/>
-          <w:shd w:val="clear" w:color="auto" w:fill="343541"/>
-        </w:rPr>
-      </w:pPr>
-      <w:r>
-        <w:rPr>
-          <w:rFonts w:ascii="Segoe UI" w:hAnsi="Segoe UI" w:cs="Segoe UI"/>
-          <w:color w:val="ECECF1"/>
-          <w:shd w:val="clear" w:color="auto" w:fill="343541"/>
-        </w:rPr>
-        <w:t xml:space="preserve">Реализовать сохранение настроек по типу управление громкости звуков и музыки, а также текущего </w:t>
-      </w:r>
-      <w:r>
-        <w:rPr>
-          <w:rFonts w:ascii="Segoe UI" w:hAnsi="Segoe UI" w:cs="Segoe UI"/>
-          <w:color w:val="ECECF1"/>
-          <w:shd w:val="clear" w:color="auto" w:fill="343541"/>
-        </w:rPr>
-        <w:t>выбранного языка. Сохранять эти настройки и грузить их нужно в реестр, чтобы была возможность при старте игры их загрузить.</w:t>
-      </w:r>
-    </w:p>
-    <w:p>
-      <w:pPr>
-        <w:rPr>
-          <w:rFonts w:ascii="Segoe UI" w:hAnsi="Segoe UI" w:cs="Segoe UI"/>
-          <w:color w:val="ECECF1"/>
-          <w:shd w:val="clear" w:color="auto" w:fill="343541"/>
-        </w:rPr>
-      </w:pPr>
-    </w:p>
-    <w:p>
-      <w:pPr>
-        <w:rPr>
-          <w:rFonts w:ascii="Segoe UI" w:hAnsi="Segoe UI" w:cs="Segoe UI"/>
-          <w:color w:val="ECECF1"/>
-          <w:shd w:val="clear" w:color="auto" w:fill="343541"/>
-        </w:rPr>
-      </w:pPr>
-      <w:r>
-        <w:rPr>
-          <w:rFonts w:ascii="Segoe UI" w:hAnsi="Segoe UI" w:cs="Segoe UI"/>
-          <w:color w:val="ECECF1"/>
-          <w:shd w:val="clear" w:color="auto" w:fill="343541"/>
-        </w:rPr>
-        <w:t>Исправить работу системы прокачки врага то что она работает это чудо.</w:t>
-      </w:r>
-    </w:p>
-    <w:p>
-      <w:pPr>
-        <w:rPr>
-          <w:rFonts w:ascii="Segoe UI" w:hAnsi="Segoe UI" w:cs="Segoe UI"/>
-          <w:color w:val="ECECF1"/>
-          <w:shd w:val="clear" w:color="auto" w:fill="343541"/>
-        </w:rPr>
-      </w:pPr>
-    </w:p>
-    <w:p>
-      <w:pPr>
-        <w:rPr>
-          <w:rFonts w:ascii="Segoe UI" w:hAnsi="Segoe UI" w:cs="Segoe UI"/>
-          <w:color w:val="ECECF1"/>
-          <w:shd w:val="clear" w:color="auto" w:fill="343541"/>
-          <w:lang w:val="en-US"/>
-        </w:rPr>
-      </w:pPr>
-      <w:r>
-        <w:rPr>
-          <w:rFonts w:ascii="Segoe UI" w:hAnsi="Segoe UI" w:cs="Segoe UI"/>
-          <w:color w:val="ECECF1"/>
-          <w:shd w:val="clear" w:color="auto" w:fill="343541"/>
-        </w:rPr>
-        <w:t xml:space="preserve">Пересмотреть работу системы спавна квестов. Мне не нравится то что фабрика квестов сама начинает </w:t>
-      </w:r>
-      <w:proofErr w:type="gramStart"/>
-      <w:r>
-        <w:rPr>
-          <w:rFonts w:ascii="Segoe UI" w:hAnsi="Segoe UI" w:cs="Segoe UI"/>
-          <w:color w:val="ECECF1"/>
-          <w:shd w:val="clear" w:color="auto" w:fill="343541"/>
-        </w:rPr>
         <w:t>спавнить</w:t>
       </w:r>
+      <w:proofErr w:type="spellEnd"/>
       <w:proofErr w:type="gramEnd"/>
       <w:r>
         <w:rPr>
@@ -4506,6 +4763,189 @@
     </w:sectPr>
   </w:body>
 </w:document>
+</file>
+
+<file path=word/numbering.xml><?xml version="1.0" encoding="utf-8"?>
+<w:numbering xmlns:wpc="http://schemas.microsoft.com/office/word/2010/wordprocessingCanvas" xmlns:cx="http://schemas.microsoft.com/office/drawing/2014/chartex" xmlns:mc="http://schemas.openxmlformats.org/markup-compatibility/2006" xmlns:o="urn:schemas-microsoft-com:office:office" xmlns:r="http://schemas.openxmlformats.org/officeDocument/2006/relationships" xmlns:m="http://schemas.openxmlformats.org/officeDocument/2006/math" xmlns:v="urn:schemas-microsoft-com:vml" xmlns:wp14="http://schemas.microsoft.com/office/word/2010/wordprocessingDrawing" xmlns:wp="http://schemas.openxmlformats.org/drawingml/2006/wordprocessingDrawing" xmlns:w10="urn:schemas-microsoft-com:office:word" xmlns:w="http://schemas.openxmlformats.org/wordprocessingml/2006/main" xmlns:w14="http://schemas.microsoft.com/office/word/2010/wordml" xmlns:w15="http://schemas.microsoft.com/office/word/2012/wordml" xmlns:w16se="http://schemas.microsoft.com/office/word/2015/wordml/symex" xmlns:wpg="http://schemas.microsoft.com/office/word/2010/wordprocessingGroup" xmlns:wpi="http://schemas.microsoft.com/office/word/2010/wordprocessingInk" xmlns:wne="http://schemas.microsoft.com/office/word/2006/wordml" xmlns:wps="http://schemas.microsoft.com/office/word/2010/wordprocessingShape" mc:Ignorable="w14 w15 w16se wp14">
+  <w:abstractNum w:abstractNumId="0" w15:restartNumberingAfterBreak="0">
+    <w:nsid w:val="6A1A2950"/>
+    <w:multiLevelType w:val="hybridMultilevel"/>
+    <w:tmpl w:val="5DB442B2"/>
+    <w:lvl w:ilvl="0" w:tplc="0419000F">
+      <w:start w:val="1"/>
+      <w:numFmt w:val="decimal"/>
+      <w:lvlText w:val="%1."/>
+      <w:lvlJc w:val="left"/>
+      <w:pPr>
+        <w:ind w:left="3600" w:hanging="360"/>
+      </w:pPr>
+    </w:lvl>
+    <w:lvl w:ilvl="1" w:tplc="04190019" w:tentative="1">
+      <w:start w:val="1"/>
+      <w:numFmt w:val="lowerLetter"/>
+      <w:lvlText w:val="%2."/>
+      <w:lvlJc w:val="left"/>
+      <w:pPr>
+        <w:ind w:left="4320" w:hanging="360"/>
+      </w:pPr>
+    </w:lvl>
+    <w:lvl w:ilvl="2" w:tplc="0419001B" w:tentative="1">
+      <w:start w:val="1"/>
+      <w:numFmt w:val="lowerRoman"/>
+      <w:lvlText w:val="%3."/>
+      <w:lvlJc w:val="right"/>
+      <w:pPr>
+        <w:ind w:left="5040" w:hanging="180"/>
+      </w:pPr>
+    </w:lvl>
+    <w:lvl w:ilvl="3" w:tplc="0419000F" w:tentative="1">
+      <w:start w:val="1"/>
+      <w:numFmt w:val="decimal"/>
+      <w:lvlText w:val="%4."/>
+      <w:lvlJc w:val="left"/>
+      <w:pPr>
+        <w:ind w:left="5760" w:hanging="360"/>
+      </w:pPr>
+    </w:lvl>
+    <w:lvl w:ilvl="4" w:tplc="04190019" w:tentative="1">
+      <w:start w:val="1"/>
+      <w:numFmt w:val="lowerLetter"/>
+      <w:lvlText w:val="%5."/>
+      <w:lvlJc w:val="left"/>
+      <w:pPr>
+        <w:ind w:left="6480" w:hanging="360"/>
+      </w:pPr>
+    </w:lvl>
+    <w:lvl w:ilvl="5" w:tplc="0419001B" w:tentative="1">
+      <w:start w:val="1"/>
+      <w:numFmt w:val="lowerRoman"/>
+      <w:lvlText w:val="%6."/>
+      <w:lvlJc w:val="right"/>
+      <w:pPr>
+        <w:ind w:left="7200" w:hanging="180"/>
+      </w:pPr>
+    </w:lvl>
+    <w:lvl w:ilvl="6" w:tplc="0419000F" w:tentative="1">
+      <w:start w:val="1"/>
+      <w:numFmt w:val="decimal"/>
+      <w:lvlText w:val="%7."/>
+      <w:lvlJc w:val="left"/>
+      <w:pPr>
+        <w:ind w:left="7920" w:hanging="360"/>
+      </w:pPr>
+    </w:lvl>
+    <w:lvl w:ilvl="7" w:tplc="04190019" w:tentative="1">
+      <w:start w:val="1"/>
+      <w:numFmt w:val="lowerLetter"/>
+      <w:lvlText w:val="%8."/>
+      <w:lvlJc w:val="left"/>
+      <w:pPr>
+        <w:ind w:left="8640" w:hanging="360"/>
+      </w:pPr>
+    </w:lvl>
+    <w:lvl w:ilvl="8" w:tplc="0419001B" w:tentative="1">
+      <w:start w:val="1"/>
+      <w:numFmt w:val="lowerRoman"/>
+      <w:lvlText w:val="%9."/>
+      <w:lvlJc w:val="right"/>
+      <w:pPr>
+        <w:ind w:left="9360" w:hanging="180"/>
+      </w:pPr>
+    </w:lvl>
+  </w:abstractNum>
+  <w:abstractNum w:abstractNumId="1" w15:restartNumberingAfterBreak="0">
+    <w:nsid w:val="7F9D7074"/>
+    <w:multiLevelType w:val="hybridMultilevel"/>
+    <w:tmpl w:val="CEFC2538"/>
+    <w:lvl w:ilvl="0" w:tplc="0419000F">
+      <w:start w:val="1"/>
+      <w:numFmt w:val="decimal"/>
+      <w:lvlText w:val="%1."/>
+      <w:lvlJc w:val="left"/>
+      <w:pPr>
+        <w:ind w:left="3600" w:hanging="360"/>
+      </w:pPr>
+    </w:lvl>
+    <w:lvl w:ilvl="1" w:tplc="04190019" w:tentative="1">
+      <w:start w:val="1"/>
+      <w:numFmt w:val="lowerLetter"/>
+      <w:lvlText w:val="%2."/>
+      <w:lvlJc w:val="left"/>
+      <w:pPr>
+        <w:ind w:left="4320" w:hanging="360"/>
+      </w:pPr>
+    </w:lvl>
+    <w:lvl w:ilvl="2" w:tplc="0419001B" w:tentative="1">
+      <w:start w:val="1"/>
+      <w:numFmt w:val="lowerRoman"/>
+      <w:lvlText w:val="%3."/>
+      <w:lvlJc w:val="right"/>
+      <w:pPr>
+        <w:ind w:left="5040" w:hanging="180"/>
+      </w:pPr>
+    </w:lvl>
+    <w:lvl w:ilvl="3" w:tplc="0419000F" w:tentative="1">
+      <w:start w:val="1"/>
+      <w:numFmt w:val="decimal"/>
+      <w:lvlText w:val="%4."/>
+      <w:lvlJc w:val="left"/>
+      <w:pPr>
+        <w:ind w:left="5760" w:hanging="360"/>
+      </w:pPr>
+    </w:lvl>
+    <w:lvl w:ilvl="4" w:tplc="04190019" w:tentative="1">
+      <w:start w:val="1"/>
+      <w:numFmt w:val="lowerLetter"/>
+      <w:lvlText w:val="%5."/>
+      <w:lvlJc w:val="left"/>
+      <w:pPr>
+        <w:ind w:left="6480" w:hanging="360"/>
+      </w:pPr>
+    </w:lvl>
+    <w:lvl w:ilvl="5" w:tplc="0419001B" w:tentative="1">
+      <w:start w:val="1"/>
+      <w:numFmt w:val="lowerRoman"/>
+      <w:lvlText w:val="%6."/>
+      <w:lvlJc w:val="right"/>
+      <w:pPr>
+        <w:ind w:left="7200" w:hanging="180"/>
+      </w:pPr>
+    </w:lvl>
+    <w:lvl w:ilvl="6" w:tplc="0419000F" w:tentative="1">
+      <w:start w:val="1"/>
+      <w:numFmt w:val="decimal"/>
+      <w:lvlText w:val="%7."/>
+      <w:lvlJc w:val="left"/>
+      <w:pPr>
+        <w:ind w:left="7920" w:hanging="360"/>
+      </w:pPr>
+    </w:lvl>
+    <w:lvl w:ilvl="7" w:tplc="04190019" w:tentative="1">
+      <w:start w:val="1"/>
+      <w:numFmt w:val="lowerLetter"/>
+      <w:lvlText w:val="%8."/>
+      <w:lvlJc w:val="left"/>
+      <w:pPr>
+        <w:ind w:left="8640" w:hanging="360"/>
+      </w:pPr>
+    </w:lvl>
+    <w:lvl w:ilvl="8" w:tplc="0419001B" w:tentative="1">
+      <w:start w:val="1"/>
+      <w:numFmt w:val="lowerRoman"/>
+      <w:lvlText w:val="%9."/>
+      <w:lvlJc w:val="right"/>
+      <w:pPr>
+        <w:ind w:left="9360" w:hanging="180"/>
+      </w:pPr>
+    </w:lvl>
+  </w:abstractNum>
+  <w:num w:numId="1">
+    <w:abstractNumId w:val="1"/>
+  </w:num>
+  <w:num w:numId="2">
+    <w:abstractNumId w:val="0"/>
+  </w:num>
+</w:numbering>
 </file>
 
 <file path=word/styles.xml><?xml version="1.0" encoding="utf-8"?>
@@ -4930,13 +5370,50 @@
     <w:semiHidden/>
     <w:unhideWhenUsed/>
   </w:style>
+  <w:style w:type="paragraph" w:customStyle="1" w:styleId="1">
+    <w:name w:val="Стиль1"/>
+    <w:basedOn w:val="a"/>
+    <w:link w:val="10"/>
+    <w:qFormat/>
+    <w:rsid w:val="00890D5D"/>
+    <w:pPr>
+      <w:shd w:val="clear" w:color="auto" w:fill="404040" w:themeFill="text1" w:themeFillTint="BF"/>
+    </w:pPr>
+    <w:rPr>
+      <w:rFonts w:ascii="Segoe UI" w:hAnsi="Segoe UI" w:cs="Segoe UI"/>
+      <w:color w:val="ECECF1"/>
+      <w:shd w:val="clear" w:color="auto" w:fill="404040" w:themeFill="text1" w:themeFillTint="BF"/>
+    </w:rPr>
+  </w:style>
+  <w:style w:type="paragraph" w:styleId="a3">
+    <w:name w:val="List Paragraph"/>
+    <w:basedOn w:val="a"/>
+    <w:uiPriority w:val="34"/>
+    <w:qFormat/>
+    <w:rsid w:val="00890D5D"/>
+    <w:pPr>
+      <w:ind w:left="720"/>
+      <w:contextualSpacing/>
+    </w:pPr>
+  </w:style>
+  <w:style w:type="character" w:customStyle="1" w:styleId="10">
+    <w:name w:val="Стиль1 Знак"/>
+    <w:basedOn w:val="a0"/>
+    <w:link w:val="1"/>
+    <w:rsid w:val="00890D5D"/>
+    <w:rPr>
+      <w:rFonts w:ascii="Segoe UI" w:hAnsi="Segoe UI" w:cs="Segoe UI"/>
+      <w:color w:val="ECECF1"/>
+      <w:shd w:val="clear" w:color="auto" w:fill="404040" w:themeFill="text1" w:themeFillTint="BF"/>
+    </w:rPr>
+  </w:style>
 </w:styles>
 </file>
 
 <file path=word/theme/theme1.xml><?xml version="1.0" encoding="utf-8"?>
 <a:theme xmlns:a="http://schemas.openxmlformats.org/drawingml/2006/main" name="Тема Office">
   <a:themeElements>
-    <a:clrScheme name="Стандартная">
+    <a:clrScheme name="Серая">
       <a:dk1>
         <a:sysClr val="windowText" lastClr="000000"/>
       </a:dk1>
@@ -4944,34 +5421,34 @@
         <a:sysClr val="window" lastClr="FFFFFF"/>
       </a:lt1>
       <a:dk2>
-        <a:srgbClr val="44546A"/>
+        <a:srgbClr val="000000"/>
       </a:dk2>
       <a:lt2>
-        <a:srgbClr val="E7E6E6"/>
+        <a:srgbClr val="F8F8F8"/>
       </a:lt2>
       <a:accent1>
-        <a:srgbClr val="5B9BD5"/>
+        <a:srgbClr val="DDDDDD"/>
       </a:accent1>
       <a:accent2>
-        <a:srgbClr val="ED7D31"/>
+        <a:srgbClr val="B2B2B2"/>
       </a:accent2>
       <a:accent3>
-        <a:srgbClr val="A5A5A5"/>
+        <a:srgbClr val="969696"/>
       </a:accent3>
       <a:accent4>
-        <a:srgbClr val="FFC000"/>
+        <a:srgbClr val="808080"/>
       </a:accent4>
       <a:accent5>
-        <a:srgbClr val="4472C4"/>
+        <a:srgbClr val="5F5F5F"/>
       </a:accent5>
       <a:accent6>
-        <a:srgbClr val="70AD47"/>
+        <a:srgbClr val="4D4D4D"/>
       </a:accent6>
       <a:hlink>
-        <a:srgbClr val="0563C1"/>
+        <a:srgbClr val="5F5F5F"/>
       </a:hlink>
       <a:folHlink>
-        <a:srgbClr val="954F72"/>
+        <a:srgbClr val="919191"/>
       </a:folHlink>
     </a:clrScheme>
     <a:fontScheme name="Стандартная">
@@ -5192,4 +5669,16 @@
     </a:ext>
   </a:extLst>
 </a:theme>
+</file>
+
+<file path=customXml/item1.xml><?xml version="1.0" encoding="utf-8"?>
+<b:Sources xmlns:b="http://schemas.openxmlformats.org/officeDocument/2006/bibliography" xmlns="http://schemas.openxmlformats.org/officeDocument/2006/bibliography" SelectedStyle="\APASixthEditionOfficeOnline.xsl" StyleName="APA" Version="6"/>
+</file>
+
+<file path=customXml/itemProps1.xml><?xml version="1.0" encoding="utf-8"?>
+<ds:datastoreItem xmlns:ds="http://schemas.openxmlformats.org/officeDocument/2006/customXml" ds:itemID="{A689994A-B141-4692-B248-58699A4DBFD6}">
+  <ds:schemaRefs>
+    <ds:schemaRef ds:uri="http://schemas.openxmlformats.org/officeDocument/2006/bibliography"/>
+  </ds:schemaRefs>
+</ds:datastoreItem>
 </file>
</xml_diff>

<commit_message>
Fix bug when player cannot pick up potion. Fix bug when enemy receive hit when attacking player his continue spam attack, now when enemy attacking player end receive hit his update cooldown.
</commit_message>
<xml_diff>
--- a/Итерации.docx
+++ b/Итерации.docx
@@ -36,27 +36,7 @@
           <w:color w:val="ECECF1"/>
           <w:shd w:val="clear" w:color="auto" w:fill="343541"/>
         </w:rPr>
-        <w:t xml:space="preserve">1 разобраться </w:t>
-      </w:r>
-      <w:proofErr w:type="gramStart"/>
-      <w:r>
-        <w:rPr>
-          <w:rFonts w:ascii="Segoe UI" w:hAnsi="Segoe UI" w:cs="Segoe UI"/>
-          <w:strike/>
-          <w:color w:val="ECECF1"/>
-          <w:shd w:val="clear" w:color="auto" w:fill="343541"/>
-        </w:rPr>
-        <w:t>из структурой</w:t>
-      </w:r>
-      <w:proofErr w:type="gramEnd"/>
-      <w:r>
-        <w:rPr>
-          <w:rFonts w:ascii="Segoe UI" w:hAnsi="Segoe UI" w:cs="Segoe UI"/>
-          <w:strike/>
-          <w:color w:val="ECECF1"/>
-          <w:shd w:val="clear" w:color="auto" w:fill="343541"/>
-        </w:rPr>
-        <w:t xml:space="preserve"> данных которая будет использоваться для сохранения данных игры. Структура должна быть организована на </w:t>
+        <w:t xml:space="preserve">1 разобраться из структурой данных которая будет использоваться для сохранения данных игры. Структура должна быть организована на </w:t>
       </w:r>
       <w:proofErr w:type="spellStart"/>
       <w:r>
@@ -76,417 +56,339 @@
           <w:color w:val="ECECF1"/>
           <w:shd w:val="clear" w:color="auto" w:fill="343541"/>
         </w:rPr>
+        <w:t xml:space="preserve"> скриптейбл обджектах. </w:t>
+      </w:r>
+    </w:p>
+    <w:p>
+      <w:pPr>
+        <w:rPr>
+          <w:rFonts w:ascii="Segoe UI" w:hAnsi="Segoe UI" w:cs="Segoe UI"/>
+          <w:color w:val="ECECF1"/>
+          <w:shd w:val="clear" w:color="auto" w:fill="343541"/>
+        </w:rPr>
+      </w:pPr>
+      <w:r>
+        <w:rPr>
+          <w:rFonts w:ascii="Segoe UI" w:hAnsi="Segoe UI" w:cs="Segoe UI"/>
+          <w:color w:val="ECECF1"/>
+          <w:shd w:val="clear" w:color="auto" w:fill="343541"/>
+        </w:rPr>
+        <w:t xml:space="preserve">2 Проработать какие компоненты должны реализовывать интерфейсы для сохранения и/или загрузки данных </w:t>
+      </w:r>
+    </w:p>
+    <w:p>
+      <w:pPr>
+        <w:rPr>
+          <w:rFonts w:ascii="Segoe UI" w:hAnsi="Segoe UI" w:cs="Segoe UI"/>
+          <w:color w:val="ECECF1"/>
+          <w:shd w:val="clear" w:color="auto" w:fill="343541"/>
+        </w:rPr>
+      </w:pPr>
+      <w:r>
+        <w:rPr>
+          <w:rFonts w:ascii="Segoe UI" w:hAnsi="Segoe UI" w:cs="Segoe UI"/>
+          <w:color w:val="ECECF1"/>
+          <w:shd w:val="clear" w:color="auto" w:fill="343541"/>
+        </w:rPr>
+        <w:t xml:space="preserve">3 Продумать как организовать сервис для сохранения и загрузки данных </w:t>
+      </w:r>
+    </w:p>
+    <w:p>
+      <w:pPr>
+        <w:rPr>
+          <w:rFonts w:ascii="Segoe UI" w:hAnsi="Segoe UI" w:cs="Segoe UI"/>
+          <w:color w:val="ECECF1"/>
+          <w:shd w:val="clear" w:color="auto" w:fill="343541"/>
+        </w:rPr>
+      </w:pPr>
+      <w:r>
+        <w:rPr>
+          <w:rFonts w:ascii="Segoe UI" w:hAnsi="Segoe UI" w:cs="Segoe UI"/>
+          <w:color w:val="ECECF1"/>
+          <w:shd w:val="clear" w:color="auto" w:fill="343541"/>
+        </w:rPr>
+        <w:t xml:space="preserve">4 Продумать кто и каким образом будет собирать компоненты которые реализовывают интерфейсы для сохранения и/или загрузки данных. Возможно это должна быть фабрика. </w:t>
+      </w:r>
+    </w:p>
+    <w:p>
+      <w:pPr>
+        <w:rPr>
+          <w:rFonts w:ascii="Segoe UI" w:hAnsi="Segoe UI" w:cs="Segoe UI"/>
+          <w:strike/>
+          <w:color w:val="ECECF1"/>
+          <w:shd w:val="clear" w:color="auto" w:fill="343541"/>
+        </w:rPr>
+      </w:pPr>
+      <w:r>
+        <w:rPr>
+          <w:rFonts w:ascii="Segoe UI" w:hAnsi="Segoe UI" w:cs="Segoe UI"/>
+          <w:strike/>
+          <w:color w:val="ECECF1"/>
+          <w:shd w:val="clear" w:color="auto" w:fill="343541"/>
+        </w:rPr>
+        <w:t xml:space="preserve">5 Настроить префабы для создания локаций </w:t>
+      </w:r>
+    </w:p>
+    <w:p>
+      <w:pPr>
+        <w:rPr>
+          <w:rFonts w:ascii="Segoe UI" w:hAnsi="Segoe UI" w:cs="Segoe UI"/>
+          <w:color w:val="ECECF1"/>
+          <w:shd w:val="clear" w:color="auto" w:fill="343541"/>
+        </w:rPr>
+      </w:pPr>
+      <w:r>
+        <w:rPr>
+          <w:rFonts w:ascii="Segoe UI" w:hAnsi="Segoe UI" w:cs="Segoe UI"/>
+          <w:color w:val="ECECF1"/>
+          <w:shd w:val="clear" w:color="auto" w:fill="343541"/>
+        </w:rPr>
+        <w:t xml:space="preserve">6 Написать анимационный контроллер для управления игроком и мобов </w:t>
+      </w:r>
+    </w:p>
+    <w:p>
+      <w:pPr>
+        <w:rPr>
+          <w:rFonts w:ascii="Segoe UI" w:hAnsi="Segoe UI" w:cs="Segoe UI"/>
+          <w:strike/>
+          <w:color w:val="ECECF1"/>
+          <w:shd w:val="clear" w:color="auto" w:fill="343541"/>
+        </w:rPr>
+      </w:pPr>
+      <w:r>
+        <w:rPr>
+          <w:rFonts w:ascii="Segoe UI" w:hAnsi="Segoe UI" w:cs="Segoe UI"/>
+          <w:strike/>
+          <w:color w:val="ECECF1"/>
+          <w:shd w:val="clear" w:color="auto" w:fill="343541"/>
+        </w:rPr>
+        <w:t xml:space="preserve">7 Создать начальную локацию где появляется игрок </w:t>
+      </w:r>
+    </w:p>
+    <w:p>
+      <w:pPr>
+        <w:rPr>
+          <w:rFonts w:ascii="Segoe UI" w:hAnsi="Segoe UI" w:cs="Segoe UI"/>
+          <w:strike/>
+          <w:color w:val="ECECF1"/>
+          <w:shd w:val="clear" w:color="auto" w:fill="343541"/>
+        </w:rPr>
+      </w:pPr>
+      <w:r>
+        <w:rPr>
+          <w:rFonts w:ascii="Segoe UI" w:hAnsi="Segoe UI" w:cs="Segoe UI"/>
+          <w:strike/>
+          <w:color w:val="ECECF1"/>
+          <w:shd w:val="clear" w:color="auto" w:fill="343541"/>
+        </w:rPr>
+        <w:t xml:space="preserve">8 Написать сервис ввода </w:t>
+      </w:r>
+    </w:p>
+    <w:p>
+      <w:pPr>
+        <w:rPr>
+          <w:rFonts w:ascii="Segoe UI" w:hAnsi="Segoe UI" w:cs="Segoe UI"/>
+          <w:strike/>
+          <w:color w:val="ECECF1"/>
+          <w:shd w:val="clear" w:color="auto" w:fill="343541"/>
+        </w:rPr>
+      </w:pPr>
+      <w:r>
+        <w:rPr>
+          <w:rFonts w:ascii="Segoe UI" w:hAnsi="Segoe UI" w:cs="Segoe UI"/>
+          <w:strike/>
+          <w:color w:val="ECECF1"/>
+          <w:shd w:val="clear" w:color="auto" w:fill="343541"/>
+        </w:rPr>
+        <w:t>9 Научить персонажа игрока перемещаться по локации используя сервис ввода</w:t>
+      </w:r>
+    </w:p>
+    <w:p>
+      <w:pPr>
+        <w:rPr>
+          <w:rFonts w:ascii="Segoe UI" w:hAnsi="Segoe UI" w:cs="Segoe UI"/>
+          <w:strike/>
+          <w:color w:val="ECECF1"/>
+          <w:shd w:val="clear" w:color="auto" w:fill="343541"/>
+        </w:rPr>
+      </w:pPr>
+      <w:r>
+        <w:rPr>
+          <w:rFonts w:ascii="Segoe UI" w:hAnsi="Segoe UI" w:cs="Segoe UI"/>
+          <w:strike/>
+          <w:color w:val="ECECF1"/>
+          <w:shd w:val="clear" w:color="auto" w:fill="343541"/>
+        </w:rPr>
+        <w:t xml:space="preserve">10 </w:t>
+      </w:r>
+      <w:r>
+        <w:rPr>
+          <w:rFonts w:ascii="Segoe UI" w:hAnsi="Segoe UI" w:cs="Segoe UI"/>
+          <w:strike/>
+          <w:color w:val="ECECF1"/>
+          <w:shd w:val="clear" w:color="auto" w:fill="343541"/>
+        </w:rPr>
+        <w:t>Реализовать машину состояний, и ее полное поведение в игре</w:t>
+      </w:r>
+    </w:p>
+    <w:p>
+      <w:pPr>
+        <w:rPr>
+          <w:rFonts w:ascii="Segoe UI" w:hAnsi="Segoe UI" w:cs="Segoe UI"/>
+          <w:color w:val="ECECF1"/>
+          <w:shd w:val="clear" w:color="auto" w:fill="343541"/>
+        </w:rPr>
+      </w:pPr>
+    </w:p>
+    <w:p>
+      <w:pPr>
+        <w:rPr>
+          <w:rFonts w:ascii="Segoe UI" w:hAnsi="Segoe UI" w:cs="Segoe UI"/>
+          <w:color w:val="ECECF1"/>
+          <w:shd w:val="clear" w:color="auto" w:fill="343541"/>
+        </w:rPr>
+      </w:pPr>
+      <w:r>
+        <w:rPr>
+          <w:rFonts w:ascii="Segoe UI" w:hAnsi="Segoe UI" w:cs="Segoe UI"/>
+          <w:color w:val="ECECF1"/>
+          <w:shd w:val="clear" w:color="auto" w:fill="343541"/>
+        </w:rPr>
+        <w:t xml:space="preserve">Итерация 2: </w:t>
+      </w:r>
+    </w:p>
+    <w:p>
+      <w:pPr>
+        <w:rPr>
+          <w:rFonts w:ascii="Segoe UI" w:hAnsi="Segoe UI" w:cs="Segoe UI"/>
+          <w:strike/>
+          <w:color w:val="ECECF1"/>
+          <w:shd w:val="clear" w:color="auto" w:fill="343541"/>
+        </w:rPr>
+      </w:pPr>
+      <w:r>
+        <w:rPr>
+          <w:rFonts w:ascii="Segoe UI" w:hAnsi="Segoe UI" w:cs="Segoe UI"/>
+          <w:strike/>
+          <w:color w:val="ECECF1"/>
+          <w:shd w:val="clear" w:color="auto" w:fill="343541"/>
+        </w:rPr>
+        <w:t xml:space="preserve">1 Работа над архитектурой. Внедрение </w:t>
+      </w:r>
+      <w:proofErr w:type="spellStart"/>
+      <w:r>
+        <w:rPr>
+          <w:rFonts w:ascii="Segoe UI" w:hAnsi="Segoe UI" w:cs="Segoe UI"/>
+          <w:strike/>
+          <w:color w:val="ECECF1"/>
+          <w:shd w:val="clear" w:color="auto" w:fill="343541"/>
+        </w:rPr>
+        <w:t>di</w:t>
+      </w:r>
+      <w:proofErr w:type="spellEnd"/>
+      <w:r>
+        <w:rPr>
+          <w:rFonts w:ascii="Segoe UI" w:hAnsi="Segoe UI" w:cs="Segoe UI"/>
+          <w:strike/>
+          <w:color w:val="ECECF1"/>
+          <w:shd w:val="clear" w:color="auto" w:fill="343541"/>
+        </w:rPr>
+        <w:t xml:space="preserve"> фабрики чтобы она занималась спавном игровых компонентов, когда к ней придёт запрос от какого-то состояния </w:t>
+      </w:r>
+    </w:p>
+    <w:p>
+      <w:pPr>
+        <w:rPr>
+          <w:rFonts w:ascii="Segoe UI" w:hAnsi="Segoe UI" w:cs="Segoe UI"/>
+          <w:strike/>
+          <w:color w:val="ECECF1"/>
+          <w:shd w:val="clear" w:color="auto" w:fill="343541"/>
+        </w:rPr>
+      </w:pPr>
+      <w:r>
+        <w:rPr>
+          <w:rFonts w:ascii="Segoe UI" w:hAnsi="Segoe UI" w:cs="Segoe UI"/>
+          <w:strike/>
+          <w:color w:val="ECECF1"/>
+          <w:shd w:val="clear" w:color="auto" w:fill="343541"/>
+        </w:rPr>
+        <w:t xml:space="preserve">2 Проработать какие компоненты должны реализовывать интерфейсы для сохранения и/или загрузки данных </w:t>
+      </w:r>
+    </w:p>
+    <w:p>
+      <w:pPr>
+        <w:rPr>
+          <w:rFonts w:ascii="Segoe UI" w:hAnsi="Segoe UI" w:cs="Segoe UI"/>
+          <w:strike/>
+          <w:color w:val="ECECF1"/>
+          <w:shd w:val="clear" w:color="auto" w:fill="343541"/>
+        </w:rPr>
+      </w:pPr>
+      <w:r>
+        <w:rPr>
+          <w:rFonts w:ascii="Segoe UI" w:hAnsi="Segoe UI" w:cs="Segoe UI"/>
+          <w:strike/>
+          <w:color w:val="ECECF1"/>
+          <w:shd w:val="clear" w:color="auto" w:fill="343541"/>
+        </w:rPr>
+        <w:t xml:space="preserve">3 Продумать как организовать сервис для сохранения и загрузки данных </w:t>
+      </w:r>
+    </w:p>
+    <w:p>
+      <w:pPr>
+        <w:rPr>
+          <w:rFonts w:ascii="Segoe UI" w:hAnsi="Segoe UI" w:cs="Segoe UI"/>
+          <w:strike/>
+          <w:color w:val="ECECF1"/>
+          <w:shd w:val="clear" w:color="auto" w:fill="343541"/>
+        </w:rPr>
+      </w:pPr>
+      <w:r>
+        <w:rPr>
+          <w:rFonts w:ascii="Segoe UI" w:hAnsi="Segoe UI" w:cs="Segoe UI"/>
+          <w:strike/>
+          <w:color w:val="ECECF1"/>
+          <w:shd w:val="clear" w:color="auto" w:fill="343541"/>
+        </w:rPr>
+        <w:t>4 Продумать кто и каким образом будет собирать компоненты которые реализовывают интерфейсы для сохранения и/или загрузки данных. Возможно это должна быть фабрика.</w:t>
+      </w:r>
+    </w:p>
+    <w:p>
+      <w:pPr>
+        <w:rPr>
+          <w:rFonts w:ascii="Segoe UI" w:hAnsi="Segoe UI" w:cs="Segoe UI"/>
+          <w:strike/>
+          <w:color w:val="ECECF1"/>
+          <w:shd w:val="clear" w:color="auto" w:fill="343541"/>
+        </w:rPr>
+      </w:pPr>
+      <w:r>
+        <w:rPr>
+          <w:rFonts w:ascii="Segoe UI" w:hAnsi="Segoe UI" w:cs="Segoe UI"/>
+          <w:strike/>
+          <w:color w:val="ECECF1"/>
+          <w:shd w:val="clear" w:color="auto" w:fill="343541"/>
+        </w:rPr>
+        <w:t>5 Написать анимационный контролле</w:t>
+      </w:r>
+      <w:r>
+        <w:rPr>
+          <w:rFonts w:ascii="Segoe UI" w:hAnsi="Segoe UI" w:cs="Segoe UI"/>
+          <w:strike/>
+          <w:color w:val="ECECF1"/>
+          <w:shd w:val="clear" w:color="auto" w:fill="343541"/>
+        </w:rPr>
+        <w:t xml:space="preserve">р для управления игроком </w:t>
+      </w:r>
+      <w:r>
+        <w:rPr>
+          <w:rFonts w:ascii="Segoe UI" w:hAnsi="Segoe UI" w:cs="Segoe UI"/>
+          <w:strike/>
+          <w:color w:val="ECECF1"/>
+          <w:shd w:val="clear" w:color="auto" w:fill="343541"/>
+        </w:rPr>
         <w:t xml:space="preserve"> </w:t>
       </w:r>
-      <w:proofErr w:type="spellStart"/>
-      <w:r>
-        <w:rPr>
-          <w:rFonts w:ascii="Segoe UI" w:hAnsi="Segoe UI" w:cs="Segoe UI"/>
-          <w:strike/>
-          <w:color w:val="ECECF1"/>
-          <w:shd w:val="clear" w:color="auto" w:fill="343541"/>
-        </w:rPr>
-        <w:t>скриптейбл</w:t>
-      </w:r>
-      <w:proofErr w:type="spellEnd"/>
-      <w:r>
-        <w:rPr>
-          <w:rFonts w:ascii="Segoe UI" w:hAnsi="Segoe UI" w:cs="Segoe UI"/>
-          <w:strike/>
-          <w:color w:val="ECECF1"/>
-          <w:shd w:val="clear" w:color="auto" w:fill="343541"/>
-        </w:rPr>
-        <w:t xml:space="preserve"> </w:t>
-      </w:r>
-      <w:proofErr w:type="spellStart"/>
-      <w:r>
-        <w:rPr>
-          <w:rFonts w:ascii="Segoe UI" w:hAnsi="Segoe UI" w:cs="Segoe UI"/>
-          <w:strike/>
-          <w:color w:val="ECECF1"/>
-          <w:shd w:val="clear" w:color="auto" w:fill="343541"/>
-        </w:rPr>
-        <w:t>обджектах</w:t>
-      </w:r>
-      <w:proofErr w:type="spellEnd"/>
-      <w:r>
-        <w:rPr>
-          <w:rFonts w:ascii="Segoe UI" w:hAnsi="Segoe UI" w:cs="Segoe UI"/>
-          <w:strike/>
-          <w:color w:val="ECECF1"/>
-          <w:shd w:val="clear" w:color="auto" w:fill="343541"/>
-        </w:rPr>
-        <w:t xml:space="preserve">. </w:t>
-      </w:r>
-    </w:p>
-    <w:p>
-      <w:pPr>
-        <w:rPr>
-          <w:rFonts w:ascii="Segoe UI" w:hAnsi="Segoe UI" w:cs="Segoe UI"/>
-          <w:color w:val="ECECF1"/>
-          <w:shd w:val="clear" w:color="auto" w:fill="343541"/>
-        </w:rPr>
-      </w:pPr>
-      <w:r>
-        <w:rPr>
-          <w:rFonts w:ascii="Segoe UI" w:hAnsi="Segoe UI" w:cs="Segoe UI"/>
-          <w:color w:val="ECECF1"/>
-          <w:shd w:val="clear" w:color="auto" w:fill="343541"/>
-        </w:rPr>
-        <w:t xml:space="preserve">2 Проработать какие компоненты должны реализовывать интерфейсы для сохранения и/или загрузки данных </w:t>
-      </w:r>
-    </w:p>
-    <w:p>
-      <w:pPr>
-        <w:rPr>
-          <w:rFonts w:ascii="Segoe UI" w:hAnsi="Segoe UI" w:cs="Segoe UI"/>
-          <w:color w:val="ECECF1"/>
-          <w:shd w:val="clear" w:color="auto" w:fill="343541"/>
-        </w:rPr>
-      </w:pPr>
-      <w:r>
-        <w:rPr>
-          <w:rFonts w:ascii="Segoe UI" w:hAnsi="Segoe UI" w:cs="Segoe UI"/>
-          <w:color w:val="ECECF1"/>
-          <w:shd w:val="clear" w:color="auto" w:fill="343541"/>
-        </w:rPr>
-        <w:t xml:space="preserve">3 Продумать как организовать сервис для сохранения и загрузки данных </w:t>
-      </w:r>
-    </w:p>
-    <w:p>
-      <w:pPr>
-        <w:rPr>
-          <w:rFonts w:ascii="Segoe UI" w:hAnsi="Segoe UI" w:cs="Segoe UI"/>
-          <w:color w:val="ECECF1"/>
-          <w:shd w:val="clear" w:color="auto" w:fill="343541"/>
-        </w:rPr>
-      </w:pPr>
-      <w:r>
-        <w:rPr>
-          <w:rFonts w:ascii="Segoe UI" w:hAnsi="Segoe UI" w:cs="Segoe UI"/>
-          <w:color w:val="ECECF1"/>
-          <w:shd w:val="clear" w:color="auto" w:fill="343541"/>
-        </w:rPr>
-        <w:t xml:space="preserve">4 Продумать кто и каким образом будет собирать </w:t>
-      </w:r>
-      <w:proofErr w:type="gramStart"/>
-      <w:r>
-        <w:rPr>
-          <w:rFonts w:ascii="Segoe UI" w:hAnsi="Segoe UI" w:cs="Segoe UI"/>
-          <w:color w:val="ECECF1"/>
-          <w:shd w:val="clear" w:color="auto" w:fill="343541"/>
-        </w:rPr>
-        <w:t>компоненты</w:t>
-      </w:r>
-      <w:proofErr w:type="gramEnd"/>
-      <w:r>
-        <w:rPr>
-          <w:rFonts w:ascii="Segoe UI" w:hAnsi="Segoe UI" w:cs="Segoe UI"/>
-          <w:color w:val="ECECF1"/>
-          <w:shd w:val="clear" w:color="auto" w:fill="343541"/>
-        </w:rPr>
-        <w:t xml:space="preserve"> которые реализовывают интерфейсы для сохранения и/или загрузки данных. Возможно это должна быть фабрика. </w:t>
-      </w:r>
-    </w:p>
-    <w:p>
-      <w:pPr>
-        <w:rPr>
-          <w:rFonts w:ascii="Segoe UI" w:hAnsi="Segoe UI" w:cs="Segoe UI"/>
-          <w:strike/>
-          <w:color w:val="ECECF1"/>
-          <w:shd w:val="clear" w:color="auto" w:fill="343541"/>
-        </w:rPr>
-      </w:pPr>
-      <w:r>
-        <w:rPr>
-          <w:rFonts w:ascii="Segoe UI" w:hAnsi="Segoe UI" w:cs="Segoe UI"/>
-          <w:strike/>
-          <w:color w:val="ECECF1"/>
-          <w:shd w:val="clear" w:color="auto" w:fill="343541"/>
-        </w:rPr>
-        <w:t xml:space="preserve">5 Настроить префабы для создания локаций </w:t>
-      </w:r>
-    </w:p>
-    <w:p>
-      <w:pPr>
-        <w:rPr>
-          <w:rFonts w:ascii="Segoe UI" w:hAnsi="Segoe UI" w:cs="Segoe UI"/>
-          <w:color w:val="ECECF1"/>
-          <w:shd w:val="clear" w:color="auto" w:fill="343541"/>
-        </w:rPr>
-      </w:pPr>
-      <w:r>
-        <w:rPr>
-          <w:rFonts w:ascii="Segoe UI" w:hAnsi="Segoe UI" w:cs="Segoe UI"/>
-          <w:color w:val="ECECF1"/>
-          <w:shd w:val="clear" w:color="auto" w:fill="343541"/>
-        </w:rPr>
-        <w:t xml:space="preserve">6 Написать анимационный контроллер для управления игроком и мобов </w:t>
-      </w:r>
-    </w:p>
-    <w:p>
-      <w:pPr>
-        <w:rPr>
-          <w:rFonts w:ascii="Segoe UI" w:hAnsi="Segoe UI" w:cs="Segoe UI"/>
-          <w:strike/>
-          <w:color w:val="ECECF1"/>
-          <w:shd w:val="clear" w:color="auto" w:fill="343541"/>
-        </w:rPr>
-      </w:pPr>
-      <w:r>
-        <w:rPr>
-          <w:rFonts w:ascii="Segoe UI" w:hAnsi="Segoe UI" w:cs="Segoe UI"/>
-          <w:strike/>
-          <w:color w:val="ECECF1"/>
-          <w:shd w:val="clear" w:color="auto" w:fill="343541"/>
-        </w:rPr>
-        <w:t xml:space="preserve">7 Создать начальную локацию где появляется игрок </w:t>
-      </w:r>
-    </w:p>
-    <w:p>
-      <w:pPr>
-        <w:rPr>
-          <w:rFonts w:ascii="Segoe UI" w:hAnsi="Segoe UI" w:cs="Segoe UI"/>
-          <w:strike/>
-          <w:color w:val="ECECF1"/>
-          <w:shd w:val="clear" w:color="auto" w:fill="343541"/>
-        </w:rPr>
-      </w:pPr>
-      <w:r>
-        <w:rPr>
-          <w:rFonts w:ascii="Segoe UI" w:hAnsi="Segoe UI" w:cs="Segoe UI"/>
-          <w:strike/>
-          <w:color w:val="ECECF1"/>
-          <w:shd w:val="clear" w:color="auto" w:fill="343541"/>
-        </w:rPr>
-        <w:t xml:space="preserve">8 Написать сервис ввода </w:t>
-      </w:r>
-    </w:p>
-    <w:p>
-      <w:pPr>
-        <w:rPr>
-          <w:rFonts w:ascii="Segoe UI" w:hAnsi="Segoe UI" w:cs="Segoe UI"/>
-          <w:strike/>
-          <w:color w:val="ECECF1"/>
-          <w:shd w:val="clear" w:color="auto" w:fill="343541"/>
-        </w:rPr>
-      </w:pPr>
-      <w:r>
-        <w:rPr>
-          <w:rFonts w:ascii="Segoe UI" w:hAnsi="Segoe UI" w:cs="Segoe UI"/>
-          <w:strike/>
-          <w:color w:val="ECECF1"/>
-          <w:shd w:val="clear" w:color="auto" w:fill="343541"/>
-        </w:rPr>
-        <w:t>9 Научить персонажа игрока перемещаться по локации используя сервис ввода</w:t>
-      </w:r>
-    </w:p>
-    <w:p>
-      <w:pPr>
-        <w:rPr>
-          <w:rFonts w:ascii="Segoe UI" w:hAnsi="Segoe UI" w:cs="Segoe UI"/>
-          <w:strike/>
-          <w:color w:val="ECECF1"/>
-          <w:shd w:val="clear" w:color="auto" w:fill="343541"/>
-        </w:rPr>
-      </w:pPr>
-      <w:r>
-        <w:rPr>
-          <w:rFonts w:ascii="Segoe UI" w:hAnsi="Segoe UI" w:cs="Segoe UI"/>
-          <w:strike/>
-          <w:color w:val="ECECF1"/>
-          <w:shd w:val="clear" w:color="auto" w:fill="343541"/>
-        </w:rPr>
-        <w:t xml:space="preserve">10 </w:t>
-      </w:r>
-      <w:r>
-        <w:rPr>
-          <w:rFonts w:ascii="Segoe UI" w:hAnsi="Segoe UI" w:cs="Segoe UI"/>
-          <w:strike/>
-          <w:color w:val="ECECF1"/>
-          <w:shd w:val="clear" w:color="auto" w:fill="343541"/>
-        </w:rPr>
-        <w:t>Реализовать машину состояний, и ее полное поведение в игре</w:t>
-      </w:r>
-    </w:p>
-    <w:p>
-      <w:pPr>
-        <w:rPr>
-          <w:rFonts w:ascii="Segoe UI" w:hAnsi="Segoe UI" w:cs="Segoe UI"/>
-          <w:color w:val="ECECF1"/>
-          <w:shd w:val="clear" w:color="auto" w:fill="343541"/>
-        </w:rPr>
-      </w:pPr>
-    </w:p>
-    <w:p>
-      <w:pPr>
-        <w:rPr>
-          <w:rFonts w:ascii="Segoe UI" w:hAnsi="Segoe UI" w:cs="Segoe UI"/>
-          <w:color w:val="ECECF1"/>
-          <w:shd w:val="clear" w:color="auto" w:fill="343541"/>
-        </w:rPr>
-      </w:pPr>
-      <w:r>
-        <w:rPr>
-          <w:rFonts w:ascii="Segoe UI" w:hAnsi="Segoe UI" w:cs="Segoe UI"/>
-          <w:color w:val="ECECF1"/>
-          <w:shd w:val="clear" w:color="auto" w:fill="343541"/>
-        </w:rPr>
-        <w:t xml:space="preserve">Итерация 2: </w:t>
-      </w:r>
-    </w:p>
-    <w:p>
-      <w:pPr>
-        <w:rPr>
-          <w:rFonts w:ascii="Segoe UI" w:hAnsi="Segoe UI" w:cs="Segoe UI"/>
-          <w:strike/>
-          <w:color w:val="ECECF1"/>
-          <w:shd w:val="clear" w:color="auto" w:fill="343541"/>
-        </w:rPr>
-      </w:pPr>
-      <w:r>
-        <w:rPr>
-          <w:rFonts w:ascii="Segoe UI" w:hAnsi="Segoe UI" w:cs="Segoe UI"/>
-          <w:strike/>
-          <w:color w:val="ECECF1"/>
-          <w:shd w:val="clear" w:color="auto" w:fill="343541"/>
-        </w:rPr>
-        <w:t xml:space="preserve">1 Работа над архитектурой. Внедрение </w:t>
-      </w:r>
-      <w:proofErr w:type="spellStart"/>
-      <w:r>
-        <w:rPr>
-          <w:rFonts w:ascii="Segoe UI" w:hAnsi="Segoe UI" w:cs="Segoe UI"/>
-          <w:strike/>
-          <w:color w:val="ECECF1"/>
-          <w:shd w:val="clear" w:color="auto" w:fill="343541"/>
-        </w:rPr>
-        <w:t>di</w:t>
-      </w:r>
-      <w:proofErr w:type="spellEnd"/>
-      <w:r>
-        <w:rPr>
-          <w:rFonts w:ascii="Segoe UI" w:hAnsi="Segoe UI" w:cs="Segoe UI"/>
-          <w:strike/>
-          <w:color w:val="ECECF1"/>
-          <w:shd w:val="clear" w:color="auto" w:fill="343541"/>
-        </w:rPr>
-        <w:t xml:space="preserve"> фабрики чтобы она занималась спавном игровых компонентов, когда к ней придёт запрос от какого-то состояния </w:t>
-      </w:r>
-    </w:p>
-    <w:p>
-      <w:pPr>
-        <w:rPr>
-          <w:rFonts w:ascii="Segoe UI" w:hAnsi="Segoe UI" w:cs="Segoe UI"/>
-          <w:strike/>
-          <w:color w:val="ECECF1"/>
-          <w:shd w:val="clear" w:color="auto" w:fill="343541"/>
-        </w:rPr>
-      </w:pPr>
-      <w:r>
-        <w:rPr>
-          <w:rFonts w:ascii="Segoe UI" w:hAnsi="Segoe UI" w:cs="Segoe UI"/>
-          <w:strike/>
-          <w:color w:val="ECECF1"/>
-          <w:shd w:val="clear" w:color="auto" w:fill="343541"/>
-        </w:rPr>
-        <w:t xml:space="preserve">2 Проработать какие компоненты должны реализовывать интерфейсы для сохранения и/или загрузки данных </w:t>
-      </w:r>
-    </w:p>
-    <w:p>
-      <w:pPr>
-        <w:rPr>
-          <w:rFonts w:ascii="Segoe UI" w:hAnsi="Segoe UI" w:cs="Segoe UI"/>
-          <w:strike/>
-          <w:color w:val="ECECF1"/>
-          <w:shd w:val="clear" w:color="auto" w:fill="343541"/>
-        </w:rPr>
-      </w:pPr>
-      <w:r>
-        <w:rPr>
-          <w:rFonts w:ascii="Segoe UI" w:hAnsi="Segoe UI" w:cs="Segoe UI"/>
-          <w:strike/>
-          <w:color w:val="ECECF1"/>
-          <w:shd w:val="clear" w:color="auto" w:fill="343541"/>
-        </w:rPr>
-        <w:t xml:space="preserve">3 Продумать как организовать сервис для сохранения и загрузки данных </w:t>
-      </w:r>
-    </w:p>
-    <w:p>
-      <w:pPr>
-        <w:rPr>
-          <w:rFonts w:ascii="Segoe UI" w:hAnsi="Segoe UI" w:cs="Segoe UI"/>
-          <w:strike/>
-          <w:color w:val="ECECF1"/>
-          <w:shd w:val="clear" w:color="auto" w:fill="343541"/>
-        </w:rPr>
-      </w:pPr>
-      <w:r>
-        <w:rPr>
-          <w:rFonts w:ascii="Segoe UI" w:hAnsi="Segoe UI" w:cs="Segoe UI"/>
-          <w:strike/>
-          <w:color w:val="ECECF1"/>
-          <w:shd w:val="clear" w:color="auto" w:fill="343541"/>
-        </w:rPr>
-        <w:t xml:space="preserve">4 Продумать кто и каким образом будет собирать </w:t>
-      </w:r>
-      <w:proofErr w:type="gramStart"/>
-      <w:r>
-        <w:rPr>
-          <w:rFonts w:ascii="Segoe UI" w:hAnsi="Segoe UI" w:cs="Segoe UI"/>
-          <w:strike/>
-          <w:color w:val="ECECF1"/>
-          <w:shd w:val="clear" w:color="auto" w:fill="343541"/>
-        </w:rPr>
-        <w:t>компоненты</w:t>
-      </w:r>
-      <w:proofErr w:type="gramEnd"/>
-      <w:r>
-        <w:rPr>
-          <w:rFonts w:ascii="Segoe UI" w:hAnsi="Segoe UI" w:cs="Segoe UI"/>
-          <w:strike/>
-          <w:color w:val="ECECF1"/>
-          <w:shd w:val="clear" w:color="auto" w:fill="343541"/>
-        </w:rPr>
-        <w:t xml:space="preserve"> которые реализовывают интерфейсы для сохранения и/или загрузки данных. Возможно это должна быть фабрика.</w:t>
-      </w:r>
-    </w:p>
-    <w:p>
-      <w:pPr>
-        <w:rPr>
-          <w:rFonts w:ascii="Segoe UI" w:hAnsi="Segoe UI" w:cs="Segoe UI"/>
-          <w:strike/>
-          <w:color w:val="ECECF1"/>
-          <w:shd w:val="clear" w:color="auto" w:fill="343541"/>
-        </w:rPr>
-      </w:pPr>
-      <w:r>
-        <w:rPr>
-          <w:rFonts w:ascii="Segoe UI" w:hAnsi="Segoe UI" w:cs="Segoe UI"/>
-          <w:strike/>
-          <w:color w:val="ECECF1"/>
-          <w:shd w:val="clear" w:color="auto" w:fill="343541"/>
-        </w:rPr>
-        <w:t>5 Написать анимационный контролле</w:t>
-      </w:r>
-      <w:r>
-        <w:rPr>
-          <w:rFonts w:ascii="Segoe UI" w:hAnsi="Segoe UI" w:cs="Segoe UI"/>
-          <w:strike/>
-          <w:color w:val="ECECF1"/>
-          <w:shd w:val="clear" w:color="auto" w:fill="343541"/>
-        </w:rPr>
-        <w:t xml:space="preserve">р для управления игроком </w:t>
-      </w:r>
-      <w:r>
-        <w:rPr>
-          <w:rFonts w:ascii="Segoe UI" w:hAnsi="Segoe UI" w:cs="Segoe UI"/>
-          <w:strike/>
-          <w:color w:val="ECECF1"/>
-          <w:shd w:val="clear" w:color="auto" w:fill="343541"/>
-        </w:rPr>
-        <w:t xml:space="preserve"> </w:t>
-      </w:r>
     </w:p>
     <w:p>
       <w:pPr>
@@ -566,27 +468,7 @@
           <w:color w:val="ECECF1"/>
           <w:shd w:val="clear" w:color="auto" w:fill="343541"/>
         </w:rPr>
-        <w:t xml:space="preserve">3 Написать поведение </w:t>
-      </w:r>
-      <w:proofErr w:type="gramStart"/>
-      <w:r>
-        <w:rPr>
-          <w:rFonts w:ascii="Segoe UI" w:hAnsi="Segoe UI" w:cs="Segoe UI"/>
-          <w:strike/>
-          <w:color w:val="ECECF1"/>
-          <w:shd w:val="clear" w:color="auto" w:fill="343541"/>
-        </w:rPr>
-        <w:t>для врагов</w:t>
-      </w:r>
-      <w:proofErr w:type="gramEnd"/>
-      <w:r>
-        <w:rPr>
-          <w:rFonts w:ascii="Segoe UI" w:hAnsi="Segoe UI" w:cs="Segoe UI"/>
-          <w:strike/>
-          <w:color w:val="ECECF1"/>
-          <w:shd w:val="clear" w:color="auto" w:fill="343541"/>
-        </w:rPr>
-        <w:t xml:space="preserve"> которые включают сл</w:t>
+        <w:t>3 Написать поведение для врагов которые включают сл</w:t>
       </w:r>
       <w:r>
         <w:rPr>
@@ -631,27 +513,7 @@
           <w:color w:val="ECECF1"/>
           <w:shd w:val="clear" w:color="auto" w:fill="343541"/>
         </w:rPr>
-        <w:t xml:space="preserve">5 Создать </w:t>
-      </w:r>
-      <w:proofErr w:type="gramStart"/>
-      <w:r>
-        <w:rPr>
-          <w:rFonts w:ascii="Segoe UI" w:hAnsi="Segoe UI" w:cs="Segoe UI"/>
-          <w:strike/>
-          <w:color w:val="ECECF1"/>
-          <w:shd w:val="clear" w:color="auto" w:fill="343541"/>
-        </w:rPr>
-        <w:t>телепорт</w:t>
-      </w:r>
-      <w:proofErr w:type="gramEnd"/>
-      <w:r>
-        <w:rPr>
-          <w:rFonts w:ascii="Segoe UI" w:hAnsi="Segoe UI" w:cs="Segoe UI"/>
-          <w:strike/>
-          <w:color w:val="ECECF1"/>
-          <w:shd w:val="clear" w:color="auto" w:fill="343541"/>
-        </w:rPr>
-        <w:t xml:space="preserve"> который будет пересылать игро</w:t>
+        <w:t>5 Создать телепорт который будет пересылать игро</w:t>
       </w:r>
       <w:r>
         <w:rPr>
@@ -825,27 +687,7 @@
           <w:color w:val="ECECF1"/>
           <w:shd w:val="clear" w:color="auto" w:fill="343541"/>
         </w:rPr>
-        <w:t xml:space="preserve"> уже имеются </w:t>
-      </w:r>
-      <w:proofErr w:type="gramStart"/>
-      <w:r>
-        <w:rPr>
-          <w:rFonts w:ascii="Segoe UI" w:hAnsi="Segoe UI" w:cs="Segoe UI"/>
-          <w:strike/>
-          <w:color w:val="ECECF1"/>
-          <w:shd w:val="clear" w:color="auto" w:fill="343541"/>
-        </w:rPr>
-        <w:t>управляющие компоненты</w:t>
-      </w:r>
-      <w:proofErr w:type="gramEnd"/>
-      <w:r>
-        <w:rPr>
-          <w:rFonts w:ascii="Segoe UI" w:hAnsi="Segoe UI" w:cs="Segoe UI"/>
-          <w:strike/>
-          <w:color w:val="ECECF1"/>
-          <w:shd w:val="clear" w:color="auto" w:fill="343541"/>
-        </w:rPr>
-        <w:t xml:space="preserve"> которые позволяют ии и игроку управлять атакой нужна только логика боевой системы. </w:t>
+        <w:t xml:space="preserve"> уже имеются управляющие компоненты которые позволяют ии и игроку управлять атакой нужна только логика боевой системы. </w:t>
       </w:r>
     </w:p>
     <w:p>
@@ -1075,86 +917,26 @@
           <w:color w:val="ECECF1"/>
           <w:shd w:val="clear" w:color="auto" w:fill="343541"/>
         </w:rPr>
-        <w:t xml:space="preserve"> инвентаря, это нужно сделать чтобы список предметов, а точнее хилок и их количество сохранялось в </w:t>
-      </w:r>
-      <w:proofErr w:type="gramStart"/>
-      <w:r>
-        <w:rPr>
-          <w:rFonts w:ascii="Segoe UI" w:hAnsi="Segoe UI" w:cs="Segoe UI"/>
-          <w:strike/>
-          <w:color w:val="ECECF1"/>
-          <w:shd w:val="clear" w:color="auto" w:fill="343541"/>
-        </w:rPr>
-        <w:t>память</w:t>
-      </w:r>
-      <w:proofErr w:type="gramEnd"/>
-      <w:r>
-        <w:rPr>
-          <w:rFonts w:ascii="Segoe UI" w:hAnsi="Segoe UI" w:cs="Segoe UI"/>
-          <w:strike/>
-          <w:color w:val="ECECF1"/>
-          <w:shd w:val="clear" w:color="auto" w:fill="343541"/>
-        </w:rPr>
-        <w:t xml:space="preserve"> и чтобы его можно было загрузить при продолжении игры </w:t>
-      </w:r>
-    </w:p>
-    <w:p>
-      <w:pPr>
-        <w:rPr>
-          <w:rFonts w:ascii="Segoe UI" w:hAnsi="Segoe UI" w:cs="Segoe UI"/>
-          <w:strike/>
-          <w:color w:val="ECECF1"/>
-          <w:shd w:val="clear" w:color="auto" w:fill="343541"/>
-        </w:rPr>
-      </w:pPr>
-      <w:r>
-        <w:rPr>
-          <w:rFonts w:ascii="Segoe UI" w:hAnsi="Segoe UI" w:cs="Segoe UI"/>
-          <w:strike/>
-          <w:color w:val="ECECF1"/>
-          <w:shd w:val="clear" w:color="auto" w:fill="343541"/>
-        </w:rPr>
-        <w:t xml:space="preserve">2 искать </w:t>
-      </w:r>
-      <w:proofErr w:type="gramStart"/>
-      <w:r>
-        <w:rPr>
-          <w:rFonts w:ascii="Segoe UI" w:hAnsi="Segoe UI" w:cs="Segoe UI"/>
-          <w:strike/>
-          <w:color w:val="ECECF1"/>
-          <w:shd w:val="clear" w:color="auto" w:fill="343541"/>
-        </w:rPr>
-        <w:t>визуальные эффекты</w:t>
-      </w:r>
-      <w:proofErr w:type="gramEnd"/>
-      <w:r>
-        <w:rPr>
-          <w:rFonts w:ascii="Segoe UI" w:hAnsi="Segoe UI" w:cs="Segoe UI"/>
-          <w:strike/>
-          <w:color w:val="ECECF1"/>
-          <w:shd w:val="clear" w:color="auto" w:fill="343541"/>
-        </w:rPr>
-        <w:t xml:space="preserve"> которые отображают смерть игрока и нпс. Также нужно поискать </w:t>
-      </w:r>
-      <w:proofErr w:type="gramStart"/>
-      <w:r>
-        <w:rPr>
-          <w:rFonts w:ascii="Segoe UI" w:hAnsi="Segoe UI" w:cs="Segoe UI"/>
-          <w:strike/>
-          <w:color w:val="ECECF1"/>
-          <w:shd w:val="clear" w:color="auto" w:fill="343541"/>
-        </w:rPr>
-        <w:t>картинки</w:t>
-      </w:r>
-      <w:proofErr w:type="gramEnd"/>
-      <w:r>
-        <w:rPr>
-          <w:rFonts w:ascii="Segoe UI" w:hAnsi="Segoe UI" w:cs="Segoe UI"/>
-          <w:strike/>
-          <w:color w:val="ECECF1"/>
-          <w:shd w:val="clear" w:color="auto" w:fill="343541"/>
-        </w:rPr>
-        <w:t xml:space="preserve"> которые буду использовать в GUI для хилок и для полоски здоровья </w:t>
+        <w:t xml:space="preserve"> инвентаря, это нужно сделать чтобы список предметов, а точнее хилок и их количество сохранялось в память и чтобы его можно было загрузить при продолжении игры </w:t>
+      </w:r>
+    </w:p>
+    <w:p>
+      <w:pPr>
+        <w:rPr>
+          <w:rFonts w:ascii="Segoe UI" w:hAnsi="Segoe UI" w:cs="Segoe UI"/>
+          <w:strike/>
+          <w:color w:val="ECECF1"/>
+          <w:shd w:val="clear" w:color="auto" w:fill="343541"/>
+        </w:rPr>
+      </w:pPr>
+      <w:r>
+        <w:rPr>
+          <w:rFonts w:ascii="Segoe UI" w:hAnsi="Segoe UI" w:cs="Segoe UI"/>
+          <w:strike/>
+          <w:color w:val="ECECF1"/>
+          <w:shd w:val="clear" w:color="auto" w:fill="343541"/>
+        </w:rPr>
+        <w:t xml:space="preserve">2 искать визуальные эффекты которые отображают смерть игрока и нпс. Также нужно поискать картинки которые буду использовать в GUI для хилок и для полоски здоровья </w:t>
       </w:r>
     </w:p>
     <w:p>
@@ -1209,27 +991,7 @@
           <w:color w:val="ECECF1"/>
           <w:shd w:val="clear" w:color="auto" w:fill="343541"/>
         </w:rPr>
-        <w:t xml:space="preserve">5 Работа со светом. Просмотреть разные варианты. Но нужно </w:t>
-      </w:r>
-      <w:proofErr w:type="gramStart"/>
-      <w:r>
-        <w:rPr>
-          <w:rFonts w:ascii="Segoe UI" w:hAnsi="Segoe UI" w:cs="Segoe UI"/>
-          <w:strike/>
-          <w:color w:val="ECECF1"/>
-          <w:shd w:val="clear" w:color="auto" w:fill="343541"/>
-        </w:rPr>
-        <w:t>помнить</w:t>
-      </w:r>
-      <w:proofErr w:type="gramEnd"/>
-      <w:r>
-        <w:rPr>
-          <w:rFonts w:ascii="Segoe UI" w:hAnsi="Segoe UI" w:cs="Segoe UI"/>
-          <w:strike/>
-          <w:color w:val="ECECF1"/>
-          <w:shd w:val="clear" w:color="auto" w:fill="343541"/>
-        </w:rPr>
-        <w:t xml:space="preserve"> что </w:t>
+        <w:t xml:space="preserve">5 Работа со светом. Просмотреть разные варианты. Но нужно помнить что </w:t>
       </w:r>
       <w:proofErr w:type="spellStart"/>
       <w:r>
@@ -1345,27 +1107,7 @@
           <w:color w:val="ECECF1"/>
           <w:shd w:val="clear" w:color="auto" w:fill="343541"/>
         </w:rPr>
-        <w:t xml:space="preserve">8 Пересмотреть скрипты и </w:t>
-      </w:r>
-      <w:proofErr w:type="gramStart"/>
-      <w:r>
-        <w:rPr>
-          <w:rFonts w:ascii="Segoe UI" w:hAnsi="Segoe UI" w:cs="Segoe UI"/>
-          <w:strike/>
-          <w:color w:val="ECECF1"/>
-          <w:shd w:val="clear" w:color="auto" w:fill="343541"/>
-        </w:rPr>
-        <w:t>те</w:t>
-      </w:r>
-      <w:proofErr w:type="gramEnd"/>
-      <w:r>
-        <w:rPr>
-          <w:rFonts w:ascii="Segoe UI" w:hAnsi="Segoe UI" w:cs="Segoe UI"/>
-          <w:strike/>
-          <w:color w:val="ECECF1"/>
-          <w:shd w:val="clear" w:color="auto" w:fill="343541"/>
-        </w:rPr>
-        <w:t xml:space="preserve"> которые не используют статик дату, перевести на использование статик даты, а именно это относиться к </w:t>
+        <w:t xml:space="preserve">8 Пересмотреть скрипты и те которые не используют статик дату, перевести на использование статик даты, а именно это относиться к </w:t>
       </w:r>
       <w:proofErr w:type="spellStart"/>
       <w:r>
@@ -1482,25 +1224,7 @@
           <w:color w:val="ECECF1"/>
           <w:shd w:val="clear" w:color="auto" w:fill="343541"/>
         </w:rPr>
-        <w:t xml:space="preserve">Второй и третий пункт хоть и выглядят достаточно </w:t>
-      </w:r>
-      <w:proofErr w:type="gramStart"/>
-      <w:r>
-        <w:rPr>
-          <w:rFonts w:ascii="Segoe UI" w:hAnsi="Segoe UI" w:cs="Segoe UI"/>
-          <w:color w:val="ECECF1"/>
-          <w:shd w:val="clear" w:color="auto" w:fill="343541"/>
-        </w:rPr>
-        <w:t>просто</w:t>
-      </w:r>
-      <w:proofErr w:type="gramEnd"/>
-      <w:r>
-        <w:rPr>
-          <w:rFonts w:ascii="Segoe UI" w:hAnsi="Segoe UI" w:cs="Segoe UI"/>
-          <w:color w:val="ECECF1"/>
-          <w:shd w:val="clear" w:color="auto" w:fill="343541"/>
-        </w:rPr>
-        <w:t xml:space="preserve"> но на самом деле именно эти два пункта содержат колоссальную работу над проектом.</w:t>
+        <w:t>Второй и третий пункт хоть и выглядят достаточно просто но на самом деле именно эти два пункта содержат колоссальную работу над проектом.</w:t>
       </w:r>
     </w:p>
     <w:p>
@@ -1644,27 +1368,7 @@
           <w:color w:val="ECECF1"/>
           <w:shd w:val="clear" w:color="auto" w:fill="343541"/>
         </w:rPr>
-        <w:t xml:space="preserve">5 Начать погружаться в квестовую систему. Это достаточно крупный шаг и </w:t>
-      </w:r>
-      <w:proofErr w:type="gramStart"/>
-      <w:r>
-        <w:rPr>
-          <w:rFonts w:ascii="Segoe UI" w:hAnsi="Segoe UI" w:cs="Segoe UI"/>
-          <w:strike/>
-          <w:color w:val="ECECF1"/>
-          <w:shd w:val="clear" w:color="auto" w:fill="343541"/>
-        </w:rPr>
-        <w:t>по этому</w:t>
-      </w:r>
-      <w:proofErr w:type="gramEnd"/>
-      <w:r>
-        <w:rPr>
-          <w:rFonts w:ascii="Segoe UI" w:hAnsi="Segoe UI" w:cs="Segoe UI"/>
-          <w:strike/>
-          <w:color w:val="ECECF1"/>
-          <w:shd w:val="clear" w:color="auto" w:fill="343541"/>
-        </w:rPr>
-        <w:t xml:space="preserve"> он займет больше всего времени, хотя и на первый взгляд все написано просто.</w:t>
+        <w:t>5 Начать погружаться в квестовую систему. Это достаточно крупный шаг и по этому он займет больше всего времени, хотя и на первый взгляд все написано просто.</w:t>
       </w:r>
     </w:p>
     <w:p>
@@ -1807,25 +1511,7 @@
           <w:color w:val="ECECF1"/>
           <w:shd w:val="clear" w:color="auto" w:fill="343541"/>
         </w:rPr>
-        <w:t xml:space="preserve">2а </w:t>
-      </w:r>
-      <w:proofErr w:type="gramStart"/>
-      <w:r>
-        <w:rPr>
-          <w:rFonts w:ascii="Segoe UI" w:hAnsi="Segoe UI" w:cs="Segoe UI"/>
-          <w:color w:val="ECECF1"/>
-          <w:shd w:val="clear" w:color="auto" w:fill="343541"/>
-        </w:rPr>
-        <w:t>Завершить</w:t>
-      </w:r>
-      <w:proofErr w:type="gramEnd"/>
-      <w:r>
-        <w:rPr>
-          <w:rFonts w:ascii="Segoe UI" w:hAnsi="Segoe UI" w:cs="Segoe UI"/>
-          <w:color w:val="ECECF1"/>
-          <w:shd w:val="clear" w:color="auto" w:fill="343541"/>
-        </w:rPr>
-        <w:t xml:space="preserve"> прототип, получив работоспособную квестовую систему. </w:t>
+        <w:t xml:space="preserve">2а Завершить прототип, получив работоспособную квестовую систему. </w:t>
       </w:r>
     </w:p>
     <w:p>
@@ -1843,25 +1529,7 @@
           <w:color w:val="ECECF1"/>
           <w:shd w:val="clear" w:color="auto" w:fill="343541"/>
         </w:rPr>
-        <w:t xml:space="preserve">2б </w:t>
-      </w:r>
-      <w:proofErr w:type="gramStart"/>
-      <w:r>
-        <w:rPr>
-          <w:rFonts w:ascii="Segoe UI" w:hAnsi="Segoe UI" w:cs="Segoe UI"/>
-          <w:color w:val="ECECF1"/>
-          <w:shd w:val="clear" w:color="auto" w:fill="343541"/>
-        </w:rPr>
-        <w:t>Контролировать</w:t>
-      </w:r>
-      <w:proofErr w:type="gramEnd"/>
-      <w:r>
-        <w:rPr>
-          <w:rFonts w:ascii="Segoe UI" w:hAnsi="Segoe UI" w:cs="Segoe UI"/>
-          <w:color w:val="ECECF1"/>
-          <w:shd w:val="clear" w:color="auto" w:fill="343541"/>
-        </w:rPr>
-        <w:t xml:space="preserve"> состояние архитектуры при разработке доработке прототипа </w:t>
+        <w:t xml:space="preserve">2б Контролировать состояние архитектуры при разработке доработке прототипа </w:t>
       </w:r>
       <w:proofErr w:type="spellStart"/>
       <w:r>
@@ -1947,25 +1615,7 @@
           <w:color w:val="ECECF1"/>
           <w:shd w:val="clear" w:color="auto" w:fill="343541"/>
         </w:rPr>
-        <w:t xml:space="preserve">6 Готовиться к реализации системы торговли. </w:t>
-      </w:r>
-      <w:proofErr w:type="gramStart"/>
-      <w:r>
-        <w:rPr>
-          <w:rFonts w:ascii="Segoe UI" w:hAnsi="Segoe UI" w:cs="Segoe UI"/>
-          <w:color w:val="ECECF1"/>
-          <w:shd w:val="clear" w:color="auto" w:fill="343541"/>
-        </w:rPr>
-        <w:t>Также</w:t>
-      </w:r>
-      <w:proofErr w:type="gramEnd"/>
-      <w:r>
-        <w:rPr>
-          <w:rFonts w:ascii="Segoe UI" w:hAnsi="Segoe UI" w:cs="Segoe UI"/>
-          <w:color w:val="ECECF1"/>
-          <w:shd w:val="clear" w:color="auto" w:fill="343541"/>
-        </w:rPr>
-        <w:t xml:space="preserve"> как и второй этап достаточно длительный.</w:t>
+        <w:t>6 Готовиться к реализации системы торговли. Также как и второй этап достаточно длительный.</w:t>
       </w:r>
     </w:p>
     <w:p>
@@ -2066,25 +1716,7 @@
           <w:color w:val="ECECF1"/>
           <w:shd w:val="clear" w:color="auto" w:fill="343541"/>
         </w:rPr>
-        <w:t xml:space="preserve">4 Готовится </w:t>
-      </w:r>
-      <w:proofErr w:type="gramStart"/>
-      <w:r>
-        <w:rPr>
-          <w:rFonts w:ascii="Segoe UI" w:hAnsi="Segoe UI" w:cs="Segoe UI"/>
-          <w:color w:val="ECECF1"/>
-          <w:shd w:val="clear" w:color="auto" w:fill="343541"/>
-        </w:rPr>
-        <w:t>к разработки</w:t>
-      </w:r>
-      <w:proofErr w:type="gramEnd"/>
-      <w:r>
-        <w:rPr>
-          <w:rFonts w:ascii="Segoe UI" w:hAnsi="Segoe UI" w:cs="Segoe UI"/>
-          <w:color w:val="ECECF1"/>
-          <w:shd w:val="clear" w:color="auto" w:fill="343541"/>
-        </w:rPr>
-        <w:t xml:space="preserve"> системы торговли.</w:t>
+        <w:t>4 Готовится к разработки системы торговли.</w:t>
       </w:r>
     </w:p>
     <w:p>
@@ -2148,47 +1780,7 @@
           <w:color w:val="ECECF1"/>
           <w:shd w:val="clear" w:color="auto" w:fill="343541"/>
         </w:rPr>
-        <w:t xml:space="preserve">2 Нужно решить </w:t>
-      </w:r>
-      <w:proofErr w:type="gramStart"/>
-      <w:r>
-        <w:rPr>
-          <w:rFonts w:ascii="Segoe UI" w:hAnsi="Segoe UI" w:cs="Segoe UI"/>
-          <w:strike/>
-          <w:color w:val="ECECF1"/>
-          <w:shd w:val="clear" w:color="auto" w:fill="343541"/>
-        </w:rPr>
-        <w:t>проблему</w:t>
-      </w:r>
-      <w:proofErr w:type="gramEnd"/>
-      <w:r>
-        <w:rPr>
-          <w:rFonts w:ascii="Segoe UI" w:hAnsi="Segoe UI" w:cs="Segoe UI"/>
-          <w:strike/>
-          <w:color w:val="ECECF1"/>
-          <w:shd w:val="clear" w:color="auto" w:fill="343541"/>
-        </w:rPr>
-        <w:t xml:space="preserve"> связанную с отображением окна </w:t>
-      </w:r>
-      <w:proofErr w:type="spellStart"/>
-      <w:r>
-        <w:rPr>
-          <w:rFonts w:ascii="Segoe UI" w:hAnsi="Segoe UI" w:cs="Segoe UI"/>
-          <w:strike/>
-          <w:color w:val="ECECF1"/>
-          <w:shd w:val="clear" w:color="auto" w:fill="343541"/>
-        </w:rPr>
-        <w:t>квест</w:t>
-      </w:r>
-      <w:proofErr w:type="spellEnd"/>
-      <w:r>
-        <w:rPr>
-          <w:rFonts w:ascii="Segoe UI" w:hAnsi="Segoe UI" w:cs="Segoe UI"/>
-          <w:strike/>
-          <w:color w:val="ECECF1"/>
-          <w:shd w:val="clear" w:color="auto" w:fill="343541"/>
-        </w:rPr>
-        <w:t xml:space="preserve"> </w:t>
+        <w:t xml:space="preserve">2 Нужно решить проблему связанную с отображением окна квест </w:t>
       </w:r>
       <w:proofErr w:type="spellStart"/>
       <w:r>
@@ -2746,16 +2338,16 @@
           <w:color w:val="ECECF1"/>
           <w:shd w:val="clear" w:color="auto" w:fill="343541"/>
         </w:rPr>
-        <w:t xml:space="preserve">4 Обновить UI для системы </w:t>
-      </w:r>
-      <w:proofErr w:type="spellStart"/>
-      <w:r>
-        <w:rPr>
-          <w:rFonts w:ascii="Segoe UI" w:hAnsi="Segoe UI" w:cs="Segoe UI"/>
-          <w:color w:val="ECECF1"/>
-          <w:shd w:val="clear" w:color="auto" w:fill="343541"/>
-        </w:rPr>
-        <w:t>квестов</w:t>
+        <w:t xml:space="preserve">4 Обновить UI для системы квестов, </w:t>
+      </w:r>
+      <w:proofErr w:type="spellStart"/>
+      <w:r>
+        <w:rPr>
+          <w:rFonts w:ascii="Segoe UI" w:hAnsi="Segoe UI" w:cs="Segoe UI"/>
+          <w:color w:val="ECECF1"/>
+          <w:shd w:val="clear" w:color="auto" w:fill="343541"/>
+        </w:rPr>
+        <w:t>стат</w:t>
       </w:r>
       <w:proofErr w:type="spellEnd"/>
       <w:r>
@@ -2773,6 +2365,198 @@
           <w:color w:val="ECECF1"/>
           <w:shd w:val="clear" w:color="auto" w:fill="343541"/>
         </w:rPr>
+        <w:t>скиллов</w:t>
+      </w:r>
+      <w:proofErr w:type="spellEnd"/>
+      <w:r>
+        <w:rPr>
+          <w:rFonts w:ascii="Segoe UI" w:hAnsi="Segoe UI" w:cs="Segoe UI"/>
+          <w:color w:val="ECECF1"/>
+          <w:shd w:val="clear" w:color="auto" w:fill="343541"/>
+        </w:rPr>
+        <w:t xml:space="preserve">. Он слишком огромный нужно сделать поменьше. В общем подогнать размеры. </w:t>
+      </w:r>
+    </w:p>
+    <w:p>
+      <w:pPr>
+        <w:rPr>
+          <w:rFonts w:ascii="Segoe UI" w:hAnsi="Segoe UI" w:cs="Segoe UI"/>
+          <w:color w:val="ECECF1"/>
+          <w:shd w:val="clear" w:color="auto" w:fill="343541"/>
+        </w:rPr>
+      </w:pPr>
+      <w:r>
+        <w:rPr>
+          <w:rFonts w:ascii="Segoe UI" w:hAnsi="Segoe UI" w:cs="Segoe UI"/>
+          <w:color w:val="ECECF1"/>
+          <w:shd w:val="clear" w:color="auto" w:fill="343541"/>
+        </w:rPr>
+        <w:t>5 Внедрить анимации для мобов.</w:t>
+      </w:r>
+    </w:p>
+    <w:p>
+      <w:pPr>
+        <w:rPr>
+          <w:rFonts w:ascii="Segoe UI" w:hAnsi="Segoe UI" w:cs="Segoe UI"/>
+          <w:color w:val="ECECF1"/>
+          <w:shd w:val="clear" w:color="auto" w:fill="343541"/>
+        </w:rPr>
+      </w:pPr>
+    </w:p>
+    <w:p>
+      <w:pPr>
+        <w:rPr>
+          <w:rFonts w:ascii="Segoe UI" w:hAnsi="Segoe UI" w:cs="Segoe UI"/>
+          <w:color w:val="ECECF1"/>
+          <w:shd w:val="clear" w:color="auto" w:fill="343541"/>
+        </w:rPr>
+      </w:pPr>
+    </w:p>
+    <w:p>
+      <w:pPr>
+        <w:rPr>
+          <w:rFonts w:ascii="Segoe UI" w:hAnsi="Segoe UI" w:cs="Segoe UI"/>
+          <w:color w:val="ECECF1"/>
+          <w:shd w:val="clear" w:color="auto" w:fill="343541"/>
+        </w:rPr>
+      </w:pPr>
+      <w:r>
+        <w:rPr>
+          <w:rFonts w:ascii="Segoe UI" w:hAnsi="Segoe UI" w:cs="Segoe UI"/>
+          <w:color w:val="ECECF1"/>
+          <w:shd w:val="clear" w:color="auto" w:fill="343541"/>
+        </w:rPr>
+        <w:t xml:space="preserve">13 итерация: </w:t>
+      </w:r>
+    </w:p>
+    <w:p>
+      <w:pPr>
+        <w:rPr>
+          <w:rFonts w:ascii="Segoe UI" w:hAnsi="Segoe UI" w:cs="Segoe UI"/>
+          <w:color w:val="ECECF1"/>
+          <w:shd w:val="clear" w:color="auto" w:fill="343541"/>
+        </w:rPr>
+      </w:pPr>
+      <w:r>
+        <w:rPr>
+          <w:rFonts w:ascii="Segoe UI" w:hAnsi="Segoe UI" w:cs="Segoe UI"/>
+          <w:color w:val="ECECF1"/>
+          <w:shd w:val="clear" w:color="auto" w:fill="343541"/>
+        </w:rPr>
+        <w:t xml:space="preserve">1 Создать компонент для </w:t>
+      </w:r>
+      <w:proofErr w:type="spellStart"/>
+      <w:r>
+        <w:rPr>
+          <w:rFonts w:ascii="Segoe UI" w:hAnsi="Segoe UI" w:cs="Segoe UI"/>
+          <w:color w:val="ECECF1"/>
+          <w:shd w:val="clear" w:color="auto" w:fill="343541"/>
+        </w:rPr>
+        <w:t>центрелизованого</w:t>
+      </w:r>
+      <w:proofErr w:type="spellEnd"/>
+      <w:r>
+        <w:rPr>
+          <w:rFonts w:ascii="Segoe UI" w:hAnsi="Segoe UI" w:cs="Segoe UI"/>
+          <w:color w:val="ECECF1"/>
+          <w:shd w:val="clear" w:color="auto" w:fill="343541"/>
+        </w:rPr>
+        <w:t xml:space="preserve"> управления UI. </w:t>
+      </w:r>
+      <w:proofErr w:type="spellStart"/>
+      <w:r>
+        <w:rPr>
+          <w:rFonts w:ascii="Segoe UI" w:hAnsi="Segoe UI" w:cs="Segoe UI"/>
+          <w:color w:val="ECECF1"/>
+          <w:shd w:val="clear" w:color="auto" w:fill="343541"/>
+        </w:rPr>
+        <w:t>Впервую</w:t>
+      </w:r>
+      <w:proofErr w:type="spellEnd"/>
+      <w:r>
+        <w:rPr>
+          <w:rFonts w:ascii="Segoe UI" w:hAnsi="Segoe UI" w:cs="Segoe UI"/>
+          <w:color w:val="ECECF1"/>
+          <w:shd w:val="clear" w:color="auto" w:fill="343541"/>
+        </w:rPr>
+        <w:t xml:space="preserve"> очередь компонент должен быть гибким и легко расширяемым. </w:t>
+      </w:r>
+    </w:p>
+    <w:p>
+      <w:pPr>
+        <w:rPr>
+          <w:rFonts w:ascii="Segoe UI" w:hAnsi="Segoe UI" w:cs="Segoe UI"/>
+          <w:color w:val="ECECF1"/>
+          <w:shd w:val="clear" w:color="auto" w:fill="343541"/>
+        </w:rPr>
+      </w:pPr>
+      <w:r>
+        <w:rPr>
+          <w:rFonts w:ascii="Segoe UI" w:hAnsi="Segoe UI" w:cs="Segoe UI"/>
+          <w:color w:val="ECECF1"/>
+          <w:shd w:val="clear" w:color="auto" w:fill="343541"/>
+        </w:rPr>
+        <w:t xml:space="preserve">2 Создать компонент который расширит возможности для системы взаимодействия, и позволит игроку делать выбор какой именно тип взаимодействия желает получить игрок если таких типов взаимодействия </w:t>
+      </w:r>
+      <w:proofErr w:type="spellStart"/>
+      <w:r>
+        <w:rPr>
+          <w:rFonts w:ascii="Segoe UI" w:hAnsi="Segoe UI" w:cs="Segoe UI"/>
+          <w:color w:val="ECECF1"/>
+          <w:shd w:val="clear" w:color="auto" w:fill="343541"/>
+        </w:rPr>
+        <w:t>являеться</w:t>
+      </w:r>
+      <w:proofErr w:type="spellEnd"/>
+      <w:r>
+        <w:rPr>
+          <w:rFonts w:ascii="Segoe UI" w:hAnsi="Segoe UI" w:cs="Segoe UI"/>
+          <w:color w:val="ECECF1"/>
+          <w:shd w:val="clear" w:color="auto" w:fill="343541"/>
+        </w:rPr>
+        <w:t xml:space="preserve"> несколько например: диалог и торговля. </w:t>
+      </w:r>
+    </w:p>
+    <w:p>
+      <w:pPr>
+        <w:rPr>
+          <w:rFonts w:ascii="Segoe UI" w:hAnsi="Segoe UI" w:cs="Segoe UI"/>
+          <w:color w:val="ECECF1"/>
+          <w:shd w:val="clear" w:color="auto" w:fill="343541"/>
+        </w:rPr>
+      </w:pPr>
+      <w:r>
+        <w:rPr>
+          <w:rFonts w:ascii="Segoe UI" w:hAnsi="Segoe UI" w:cs="Segoe UI"/>
+          <w:color w:val="ECECF1"/>
+          <w:shd w:val="clear" w:color="auto" w:fill="343541"/>
+        </w:rPr>
+        <w:t xml:space="preserve">3 Обновить UI для системы торговли. </w:t>
+      </w:r>
+    </w:p>
+    <w:p>
+      <w:pPr>
+        <w:rPr>
+          <w:rFonts w:ascii="Segoe UI" w:hAnsi="Segoe UI" w:cs="Segoe UI"/>
+          <w:color w:val="ECECF1"/>
+          <w:shd w:val="clear" w:color="auto" w:fill="343541"/>
+        </w:rPr>
+      </w:pPr>
+      <w:r>
+        <w:rPr>
+          <w:rFonts w:ascii="Segoe UI" w:hAnsi="Segoe UI" w:cs="Segoe UI"/>
+          <w:color w:val="ECECF1"/>
+          <w:shd w:val="clear" w:color="auto" w:fill="343541"/>
+        </w:rPr>
+        <w:t xml:space="preserve">4 Обновить UI для систем </w:t>
+      </w:r>
+      <w:proofErr w:type="spellStart"/>
+      <w:r>
+        <w:rPr>
+          <w:rFonts w:ascii="Segoe UI" w:hAnsi="Segoe UI" w:cs="Segoe UI"/>
+          <w:color w:val="ECECF1"/>
+          <w:shd w:val="clear" w:color="auto" w:fill="343541"/>
+        </w:rPr>
         <w:t>стат</w:t>
       </w:r>
       <w:proofErr w:type="spellEnd"/>
@@ -2782,234 +2566,6 @@
           <w:color w:val="ECECF1"/>
           <w:shd w:val="clear" w:color="auto" w:fill="343541"/>
         </w:rPr>
-        <w:t xml:space="preserve">, </w:t>
-      </w:r>
-      <w:proofErr w:type="spellStart"/>
-      <w:r>
-        <w:rPr>
-          <w:rFonts w:ascii="Segoe UI" w:hAnsi="Segoe UI" w:cs="Segoe UI"/>
-          <w:color w:val="ECECF1"/>
-          <w:shd w:val="clear" w:color="auto" w:fill="343541"/>
-        </w:rPr>
-        <w:t>скиллов</w:t>
-      </w:r>
-      <w:proofErr w:type="spellEnd"/>
-      <w:r>
-        <w:rPr>
-          <w:rFonts w:ascii="Segoe UI" w:hAnsi="Segoe UI" w:cs="Segoe UI"/>
-          <w:color w:val="ECECF1"/>
-          <w:shd w:val="clear" w:color="auto" w:fill="343541"/>
-        </w:rPr>
-        <w:t xml:space="preserve">. Он слишком огромный нужно сделать поменьше. В общем подогнать размеры. </w:t>
-      </w:r>
-    </w:p>
-    <w:p>
-      <w:pPr>
-        <w:rPr>
-          <w:rFonts w:ascii="Segoe UI" w:hAnsi="Segoe UI" w:cs="Segoe UI"/>
-          <w:color w:val="ECECF1"/>
-          <w:shd w:val="clear" w:color="auto" w:fill="343541"/>
-        </w:rPr>
-      </w:pPr>
-      <w:r>
-        <w:rPr>
-          <w:rFonts w:ascii="Segoe UI" w:hAnsi="Segoe UI" w:cs="Segoe UI"/>
-          <w:color w:val="ECECF1"/>
-          <w:shd w:val="clear" w:color="auto" w:fill="343541"/>
-        </w:rPr>
-        <w:t>5 Внедрить анимации для мобов.</w:t>
-      </w:r>
-    </w:p>
-    <w:p>
-      <w:pPr>
-        <w:rPr>
-          <w:rFonts w:ascii="Segoe UI" w:hAnsi="Segoe UI" w:cs="Segoe UI"/>
-          <w:color w:val="ECECF1"/>
-          <w:shd w:val="clear" w:color="auto" w:fill="343541"/>
-        </w:rPr>
-      </w:pPr>
-    </w:p>
-    <w:p>
-      <w:pPr>
-        <w:rPr>
-          <w:rFonts w:ascii="Segoe UI" w:hAnsi="Segoe UI" w:cs="Segoe UI"/>
-          <w:color w:val="ECECF1"/>
-          <w:shd w:val="clear" w:color="auto" w:fill="343541"/>
-        </w:rPr>
-      </w:pPr>
-    </w:p>
-    <w:p>
-      <w:pPr>
-        <w:rPr>
-          <w:rFonts w:ascii="Segoe UI" w:hAnsi="Segoe UI" w:cs="Segoe UI"/>
-          <w:color w:val="ECECF1"/>
-          <w:shd w:val="clear" w:color="auto" w:fill="343541"/>
-        </w:rPr>
-      </w:pPr>
-      <w:r>
-        <w:rPr>
-          <w:rFonts w:ascii="Segoe UI" w:hAnsi="Segoe UI" w:cs="Segoe UI"/>
-          <w:color w:val="ECECF1"/>
-          <w:shd w:val="clear" w:color="auto" w:fill="343541"/>
-        </w:rPr>
-        <w:t xml:space="preserve">13 итерация: </w:t>
-      </w:r>
-    </w:p>
-    <w:p>
-      <w:pPr>
-        <w:rPr>
-          <w:rFonts w:ascii="Segoe UI" w:hAnsi="Segoe UI" w:cs="Segoe UI"/>
-          <w:color w:val="ECECF1"/>
-          <w:shd w:val="clear" w:color="auto" w:fill="343541"/>
-        </w:rPr>
-      </w:pPr>
-      <w:r>
-        <w:rPr>
-          <w:rFonts w:ascii="Segoe UI" w:hAnsi="Segoe UI" w:cs="Segoe UI"/>
-          <w:color w:val="ECECF1"/>
-          <w:shd w:val="clear" w:color="auto" w:fill="343541"/>
-        </w:rPr>
-        <w:t xml:space="preserve">1 Создать компонент для </w:t>
-      </w:r>
-      <w:proofErr w:type="spellStart"/>
-      <w:r>
-        <w:rPr>
-          <w:rFonts w:ascii="Segoe UI" w:hAnsi="Segoe UI" w:cs="Segoe UI"/>
-          <w:color w:val="ECECF1"/>
-          <w:shd w:val="clear" w:color="auto" w:fill="343541"/>
-        </w:rPr>
-        <w:t>центрелизованого</w:t>
-      </w:r>
-      <w:proofErr w:type="spellEnd"/>
-      <w:r>
-        <w:rPr>
-          <w:rFonts w:ascii="Segoe UI" w:hAnsi="Segoe UI" w:cs="Segoe UI"/>
-          <w:color w:val="ECECF1"/>
-          <w:shd w:val="clear" w:color="auto" w:fill="343541"/>
-        </w:rPr>
-        <w:t xml:space="preserve"> управления UI. </w:t>
-      </w:r>
-      <w:proofErr w:type="spellStart"/>
-      <w:r>
-        <w:rPr>
-          <w:rFonts w:ascii="Segoe UI" w:hAnsi="Segoe UI" w:cs="Segoe UI"/>
-          <w:color w:val="ECECF1"/>
-          <w:shd w:val="clear" w:color="auto" w:fill="343541"/>
-        </w:rPr>
-        <w:t>Впервую</w:t>
-      </w:r>
-      <w:proofErr w:type="spellEnd"/>
-      <w:r>
-        <w:rPr>
-          <w:rFonts w:ascii="Segoe UI" w:hAnsi="Segoe UI" w:cs="Segoe UI"/>
-          <w:color w:val="ECECF1"/>
-          <w:shd w:val="clear" w:color="auto" w:fill="343541"/>
-        </w:rPr>
-        <w:t xml:space="preserve"> очередь компонент должен быть гибким и легко расширяемым. </w:t>
-      </w:r>
-    </w:p>
-    <w:p>
-      <w:pPr>
-        <w:rPr>
-          <w:rFonts w:ascii="Segoe UI" w:hAnsi="Segoe UI" w:cs="Segoe UI"/>
-          <w:color w:val="ECECF1"/>
-          <w:shd w:val="clear" w:color="auto" w:fill="343541"/>
-        </w:rPr>
-      </w:pPr>
-      <w:r>
-        <w:rPr>
-          <w:rFonts w:ascii="Segoe UI" w:hAnsi="Segoe UI" w:cs="Segoe UI"/>
-          <w:color w:val="ECECF1"/>
-          <w:shd w:val="clear" w:color="auto" w:fill="343541"/>
-        </w:rPr>
-        <w:t xml:space="preserve">2 Создать </w:t>
-      </w:r>
-      <w:proofErr w:type="gramStart"/>
-      <w:r>
-        <w:rPr>
-          <w:rFonts w:ascii="Segoe UI" w:hAnsi="Segoe UI" w:cs="Segoe UI"/>
-          <w:color w:val="ECECF1"/>
-          <w:shd w:val="clear" w:color="auto" w:fill="343541"/>
-        </w:rPr>
-        <w:t>компонент</w:t>
-      </w:r>
-      <w:proofErr w:type="gramEnd"/>
-      <w:r>
-        <w:rPr>
-          <w:rFonts w:ascii="Segoe UI" w:hAnsi="Segoe UI" w:cs="Segoe UI"/>
-          <w:color w:val="ECECF1"/>
-          <w:shd w:val="clear" w:color="auto" w:fill="343541"/>
-        </w:rPr>
-        <w:t xml:space="preserve"> который расширит возможности для системы взаимодействия, и позволит игроку делать выбор какой именно тип взаимодействия желает получить игрок если таких типов взаимодействия </w:t>
-      </w:r>
-      <w:proofErr w:type="spellStart"/>
-      <w:r>
-        <w:rPr>
-          <w:rFonts w:ascii="Segoe UI" w:hAnsi="Segoe UI" w:cs="Segoe UI"/>
-          <w:color w:val="ECECF1"/>
-          <w:shd w:val="clear" w:color="auto" w:fill="343541"/>
-        </w:rPr>
-        <w:t>являеться</w:t>
-      </w:r>
-      <w:proofErr w:type="spellEnd"/>
-      <w:r>
-        <w:rPr>
-          <w:rFonts w:ascii="Segoe UI" w:hAnsi="Segoe UI" w:cs="Segoe UI"/>
-          <w:color w:val="ECECF1"/>
-          <w:shd w:val="clear" w:color="auto" w:fill="343541"/>
-        </w:rPr>
-        <w:t xml:space="preserve"> несколько например: диалог и торговля. </w:t>
-      </w:r>
-    </w:p>
-    <w:p>
-      <w:pPr>
-        <w:rPr>
-          <w:rFonts w:ascii="Segoe UI" w:hAnsi="Segoe UI" w:cs="Segoe UI"/>
-          <w:color w:val="ECECF1"/>
-          <w:shd w:val="clear" w:color="auto" w:fill="343541"/>
-        </w:rPr>
-      </w:pPr>
-      <w:r>
-        <w:rPr>
-          <w:rFonts w:ascii="Segoe UI" w:hAnsi="Segoe UI" w:cs="Segoe UI"/>
-          <w:color w:val="ECECF1"/>
-          <w:shd w:val="clear" w:color="auto" w:fill="343541"/>
-        </w:rPr>
-        <w:t xml:space="preserve">3 Обновить UI для системы торговли. </w:t>
-      </w:r>
-    </w:p>
-    <w:p>
-      <w:pPr>
-        <w:rPr>
-          <w:rFonts w:ascii="Segoe UI" w:hAnsi="Segoe UI" w:cs="Segoe UI"/>
-          <w:color w:val="ECECF1"/>
-          <w:shd w:val="clear" w:color="auto" w:fill="343541"/>
-        </w:rPr>
-      </w:pPr>
-      <w:r>
-        <w:rPr>
-          <w:rFonts w:ascii="Segoe UI" w:hAnsi="Segoe UI" w:cs="Segoe UI"/>
-          <w:color w:val="ECECF1"/>
-          <w:shd w:val="clear" w:color="auto" w:fill="343541"/>
-        </w:rPr>
-        <w:t xml:space="preserve">4 Обновить UI для систем </w:t>
-      </w:r>
-      <w:proofErr w:type="spellStart"/>
-      <w:r>
-        <w:rPr>
-          <w:rFonts w:ascii="Segoe UI" w:hAnsi="Segoe UI" w:cs="Segoe UI"/>
-          <w:color w:val="ECECF1"/>
-          <w:shd w:val="clear" w:color="auto" w:fill="343541"/>
-        </w:rPr>
-        <w:t>стат</w:t>
-      </w:r>
-      <w:proofErr w:type="spellEnd"/>
-      <w:r>
-        <w:rPr>
-          <w:rFonts w:ascii="Segoe UI" w:hAnsi="Segoe UI" w:cs="Segoe UI"/>
-          <w:color w:val="ECECF1"/>
-          <w:shd w:val="clear" w:color="auto" w:fill="343541"/>
-        </w:rPr>
         <w:t xml:space="preserve">, и прокачки. </w:t>
       </w:r>
     </w:p>
@@ -3081,27 +2637,7 @@
           <w:color w:val="ECECF1"/>
           <w:shd w:val="clear" w:color="auto" w:fill="343541"/>
         </w:rPr>
-        <w:t xml:space="preserve">1 Добавить </w:t>
-      </w:r>
-      <w:proofErr w:type="gramStart"/>
-      <w:r>
-        <w:rPr>
-          <w:rFonts w:ascii="Segoe UI" w:hAnsi="Segoe UI" w:cs="Segoe UI"/>
-          <w:strike/>
-          <w:color w:val="ECECF1"/>
-          <w:shd w:val="clear" w:color="auto" w:fill="343541"/>
-        </w:rPr>
-        <w:t>функционал</w:t>
-      </w:r>
-      <w:proofErr w:type="gramEnd"/>
-      <w:r>
-        <w:rPr>
-          <w:rFonts w:ascii="Segoe UI" w:hAnsi="Segoe UI" w:cs="Segoe UI"/>
-          <w:strike/>
-          <w:color w:val="ECECF1"/>
-          <w:shd w:val="clear" w:color="auto" w:fill="343541"/>
-        </w:rPr>
-        <w:t xml:space="preserve"> который будет сохранять текущее количество денег игрока в файл сохранения.</w:t>
+        <w:t>1 Добавить функционал который будет сохранять текущее количество денег игрока в файл сохранения.</w:t>
       </w:r>
     </w:p>
     <w:p>
@@ -3216,62 +2752,24 @@
           <w:shd w:val="clear" w:color="auto" w:fill="343541"/>
         </w:rPr>
         <w:lastRenderedPageBreak/>
-        <w:t xml:space="preserve">7 Натянуть анимации </w:t>
-      </w:r>
-      <w:proofErr w:type="gramStart"/>
-      <w:r>
-        <w:rPr>
-          <w:rFonts w:ascii="Segoe UI" w:hAnsi="Segoe UI" w:cs="Segoe UI"/>
-          <w:strike/>
-          <w:color w:val="ECECF1"/>
-          <w:shd w:val="clear" w:color="auto" w:fill="343541"/>
-        </w:rPr>
-        <w:t>на мобов</w:t>
-      </w:r>
-      <w:proofErr w:type="gramEnd"/>
-      <w:r>
-        <w:rPr>
-          <w:rFonts w:ascii="Segoe UI" w:hAnsi="Segoe UI" w:cs="Segoe UI"/>
-          <w:strike/>
-          <w:color w:val="ECECF1"/>
-          <w:shd w:val="clear" w:color="auto" w:fill="343541"/>
-        </w:rPr>
-        <w:t>.</w:t>
-      </w:r>
-    </w:p>
-    <w:p>
-      <w:pPr>
-        <w:rPr>
-          <w:rFonts w:ascii="Segoe UI" w:hAnsi="Segoe UI" w:cs="Segoe UI"/>
-          <w:color w:val="ECECF1"/>
-          <w:shd w:val="clear" w:color="auto" w:fill="343541"/>
-        </w:rPr>
-      </w:pPr>
-      <w:r>
-        <w:rPr>
-          <w:rFonts w:ascii="Segoe UI" w:hAnsi="Segoe UI" w:cs="Segoe UI"/>
-          <w:color w:val="ECECF1"/>
-          <w:shd w:val="clear" w:color="auto" w:fill="343541"/>
-        </w:rPr>
-        <w:t xml:space="preserve">8 </w:t>
-      </w:r>
-      <w:proofErr w:type="gramStart"/>
-      <w:r>
-        <w:rPr>
-          <w:rFonts w:ascii="Segoe UI" w:hAnsi="Segoe UI" w:cs="Segoe UI"/>
-          <w:color w:val="ECECF1"/>
-          <w:shd w:val="clear" w:color="auto" w:fill="343541"/>
-        </w:rPr>
-        <w:t>Думать</w:t>
-      </w:r>
-      <w:proofErr w:type="gramEnd"/>
-      <w:r>
-        <w:rPr>
-          <w:rFonts w:ascii="Segoe UI" w:hAnsi="Segoe UI" w:cs="Segoe UI"/>
-          <w:color w:val="ECECF1"/>
-          <w:shd w:val="clear" w:color="auto" w:fill="343541"/>
-        </w:rPr>
-        <w:t xml:space="preserve"> как можно организовать рандомную генерацию мира, и начать работу над прототипом рандомной генерации.</w:t>
+        <w:t>7 Натянуть анимации на мобов.</w:t>
+      </w:r>
+    </w:p>
+    <w:p>
+      <w:pPr>
+        <w:rPr>
+          <w:rFonts w:ascii="Segoe UI" w:hAnsi="Segoe UI" w:cs="Segoe UI"/>
+          <w:color w:val="ECECF1"/>
+          <w:shd w:val="clear" w:color="auto" w:fill="343541"/>
+        </w:rPr>
+      </w:pPr>
+      <w:r>
+        <w:rPr>
+          <w:rFonts w:ascii="Segoe UI" w:hAnsi="Segoe UI" w:cs="Segoe UI"/>
+          <w:color w:val="ECECF1"/>
+          <w:shd w:val="clear" w:color="auto" w:fill="343541"/>
+        </w:rPr>
+        <w:t>8 Думать как можно организовать рандомную генерацию мира, и начать работу над прототипом рандомной генерации.</w:t>
       </w:r>
     </w:p>
     <w:p>
@@ -3316,47 +2814,7 @@
           <w:color w:val="ECECF1"/>
           <w:shd w:val="clear" w:color="auto" w:fill="343541"/>
         </w:rPr>
-        <w:t xml:space="preserve">1 Исправить систему хранилища игровых предметов. Основная проблема состоит в </w:t>
-      </w:r>
-      <w:proofErr w:type="gramStart"/>
-      <w:r>
-        <w:rPr>
-          <w:rFonts w:ascii="Segoe UI" w:hAnsi="Segoe UI" w:cs="Segoe UI"/>
-          <w:strike/>
-          <w:color w:val="ECECF1"/>
-          <w:shd w:val="clear" w:color="auto" w:fill="343541"/>
-        </w:rPr>
-        <w:t>том</w:t>
-      </w:r>
-      <w:proofErr w:type="gramEnd"/>
-      <w:r>
-        <w:rPr>
-          <w:rFonts w:ascii="Segoe UI" w:hAnsi="Segoe UI" w:cs="Segoe UI"/>
-          <w:strike/>
-          <w:color w:val="ECECF1"/>
-          <w:shd w:val="clear" w:color="auto" w:fill="343541"/>
-        </w:rPr>
-        <w:t xml:space="preserve"> что система хранилища была доработана для системы торговли после ее первого создания, что добавило баг. Суть проблемы в том что система торговли </w:t>
-      </w:r>
-      <w:proofErr w:type="gramStart"/>
-      <w:r>
-        <w:rPr>
-          <w:rFonts w:ascii="Segoe UI" w:hAnsi="Segoe UI" w:cs="Segoe UI"/>
-          <w:strike/>
-          <w:color w:val="ECECF1"/>
-          <w:shd w:val="clear" w:color="auto" w:fill="343541"/>
-        </w:rPr>
-        <w:t>оперирует(</w:t>
-      </w:r>
-      <w:proofErr w:type="gramEnd"/>
-      <w:r>
-        <w:rPr>
-          <w:rFonts w:ascii="Segoe UI" w:hAnsi="Segoe UI" w:cs="Segoe UI"/>
-          <w:strike/>
-          <w:color w:val="ECECF1"/>
-          <w:shd w:val="clear" w:color="auto" w:fill="343541"/>
-        </w:rPr>
-        <w:t xml:space="preserve">помещает и извлекает предметы) с хранилищем на самом низком уровне, в то время как часть функционала который занимается обновлением UI инвентаря игрока находится на более высоком уровне, что привело к тому что инвентарь не обновляется после покупки продажи предметов. </w:t>
+        <w:t xml:space="preserve">1 Исправить систему хранилища игровых предметов. Основная проблема состоит в том что система хранилища была доработана для системы торговли после ее первого создания, что добавило баг. Суть проблемы в том что система торговли оперирует(помещает и извлекает предметы) с хранилищем на самом низком уровне, в то время как часть функционала который занимается обновлением UI инвентаря игрока находится на более высоком уровне, что привело к тому что инвентарь не обновляется после покупки продажи предметов. </w:t>
       </w:r>
     </w:p>
     <w:p>
@@ -3378,7 +2836,6 @@
         <w:t xml:space="preserve">2 Следующая проблемы являются </w:t>
       </w:r>
       <w:proofErr w:type="spellStart"/>
-      <w:proofErr w:type="gramStart"/>
       <w:r>
         <w:rPr>
           <w:rFonts w:ascii="Segoe UI" w:hAnsi="Segoe UI" w:cs="Segoe UI"/>
@@ -3389,7 +2846,6 @@
         <w:t>комплекснимы</w:t>
       </w:r>
       <w:proofErr w:type="spellEnd"/>
-      <w:proofErr w:type="gramEnd"/>
       <w:r>
         <w:rPr>
           <w:rFonts w:ascii="Segoe UI" w:hAnsi="Segoe UI" w:cs="Segoe UI"/>
@@ -3417,27 +2873,7 @@
           <w:color w:val="ECECF1"/>
           <w:shd w:val="clear" w:color="auto" w:fill="343541"/>
         </w:rPr>
-        <w:t xml:space="preserve"> несколько различных подсистем в игру появляются некоторые сложности в управлении проекта </w:t>
-      </w:r>
-      <w:proofErr w:type="gramStart"/>
-      <w:r>
-        <w:rPr>
-          <w:rFonts w:ascii="Segoe UI" w:hAnsi="Segoe UI" w:cs="Segoe UI"/>
-          <w:strike/>
-          <w:color w:val="ECECF1"/>
-          <w:shd w:val="clear" w:color="auto" w:fill="343541"/>
-        </w:rPr>
-        <w:t>из-за того что</w:t>
-      </w:r>
-      <w:proofErr w:type="gramEnd"/>
-      <w:r>
-        <w:rPr>
-          <w:rFonts w:ascii="Segoe UI" w:hAnsi="Segoe UI" w:cs="Segoe UI"/>
-          <w:strike/>
-          <w:color w:val="ECECF1"/>
-          <w:shd w:val="clear" w:color="auto" w:fill="343541"/>
-        </w:rPr>
-        <w:t xml:space="preserve"> все </w:t>
+        <w:t xml:space="preserve"> несколько различных подсистем в игру появляются некоторые сложности в управлении проекта из-за того что все </w:t>
       </w:r>
       <w:proofErr w:type="spellStart"/>
       <w:r>
@@ -3477,27 +2913,7 @@
           <w:color w:val="ECECF1"/>
           <w:shd w:val="clear" w:color="auto" w:fill="343541"/>
         </w:rPr>
-        <w:t xml:space="preserve">, это касается только структуры проекта. Особенно нужно обратить внимание на UI </w:t>
-      </w:r>
-      <w:proofErr w:type="spellStart"/>
-      <w:r>
-        <w:rPr>
-          <w:rFonts w:ascii="Segoe UI" w:hAnsi="Segoe UI" w:cs="Segoe UI"/>
-          <w:strike/>
-          <w:color w:val="ECECF1"/>
-          <w:shd w:val="clear" w:color="auto" w:fill="343541"/>
-        </w:rPr>
-        <w:t>префабы</w:t>
-      </w:r>
-      <w:proofErr w:type="spellEnd"/>
-      <w:r>
-        <w:rPr>
-          <w:rFonts w:ascii="Segoe UI" w:hAnsi="Segoe UI" w:cs="Segoe UI"/>
-          <w:strike/>
-          <w:color w:val="ECECF1"/>
-          <w:shd w:val="clear" w:color="auto" w:fill="343541"/>
-        </w:rPr>
-        <w:t xml:space="preserve"> </w:t>
+        <w:t xml:space="preserve">, это касается только структуры проекта. Особенно нужно обратить внимание на UI префабы </w:t>
       </w:r>
       <w:proofErr w:type="spellStart"/>
       <w:r>
@@ -3517,27 +2933,7 @@
           <w:color w:val="ECECF1"/>
           <w:shd w:val="clear" w:color="auto" w:fill="343541"/>
         </w:rPr>
-        <w:t xml:space="preserve"> их порой приходится искать </w:t>
-      </w:r>
-      <w:proofErr w:type="gramStart"/>
-      <w:r>
-        <w:rPr>
-          <w:rFonts w:ascii="Segoe UI" w:hAnsi="Segoe UI" w:cs="Segoe UI"/>
-          <w:strike/>
-          <w:color w:val="ECECF1"/>
-          <w:shd w:val="clear" w:color="auto" w:fill="343541"/>
-        </w:rPr>
-        <w:t>там где</w:t>
-      </w:r>
-      <w:proofErr w:type="gramEnd"/>
-      <w:r>
-        <w:rPr>
-          <w:rFonts w:ascii="Segoe UI" w:hAnsi="Segoe UI" w:cs="Segoe UI"/>
-          <w:strike/>
-          <w:color w:val="ECECF1"/>
-          <w:shd w:val="clear" w:color="auto" w:fill="343541"/>
-        </w:rPr>
-        <w:t xml:space="preserve"> их не должно быть. </w:t>
+        <w:t xml:space="preserve"> их порой приходится искать там где их не должно быть. </w:t>
       </w:r>
     </w:p>
     <w:p>
@@ -3591,25 +2987,7 @@
           <w:color w:val="ECECF1"/>
           <w:shd w:val="clear" w:color="auto" w:fill="343541"/>
         </w:rPr>
-        <w:t xml:space="preserve"> хочу запустить в разработку прототип новой боевой системы, который позволит улучшить текущую, точного представления то как она должна выглядеть нету, </w:t>
-      </w:r>
-      <w:proofErr w:type="gramStart"/>
-      <w:r>
-        <w:rPr>
-          <w:rFonts w:ascii="Segoe UI" w:hAnsi="Segoe UI" w:cs="Segoe UI"/>
-          <w:color w:val="ECECF1"/>
-          <w:shd w:val="clear" w:color="auto" w:fill="343541"/>
-        </w:rPr>
-        <w:t>во время</w:t>
-      </w:r>
-      <w:proofErr w:type="gramEnd"/>
-      <w:r>
-        <w:rPr>
-          <w:rFonts w:ascii="Segoe UI" w:hAnsi="Segoe UI" w:cs="Segoe UI"/>
-          <w:color w:val="ECECF1"/>
-          <w:shd w:val="clear" w:color="auto" w:fill="343541"/>
-        </w:rPr>
-        <w:t xml:space="preserve"> </w:t>
+        <w:t xml:space="preserve"> хочу запустить в разработку прототип новой боевой системы, который позволит улучшить текущую, точного представления то как она должна выглядеть нету, во время </w:t>
       </w:r>
       <w:proofErr w:type="spellStart"/>
       <w:r>
@@ -3627,25 +3005,7 @@
           <w:color w:val="ECECF1"/>
           <w:shd w:val="clear" w:color="auto" w:fill="343541"/>
         </w:rPr>
-        <w:t xml:space="preserve"> надеюсь что найду хороший вариант. Зачем обновлять эту механику? Все просто если посмотреть на мой текущий </w:t>
-      </w:r>
-      <w:proofErr w:type="gramStart"/>
-      <w:r>
-        <w:rPr>
-          <w:rFonts w:ascii="Segoe UI" w:hAnsi="Segoe UI" w:cs="Segoe UI"/>
-          <w:color w:val="ECECF1"/>
-          <w:shd w:val="clear" w:color="auto" w:fill="343541"/>
-        </w:rPr>
-        <w:t>проект</w:t>
-      </w:r>
-      <w:proofErr w:type="gramEnd"/>
-      <w:r>
-        <w:rPr>
-          <w:rFonts w:ascii="Segoe UI" w:hAnsi="Segoe UI" w:cs="Segoe UI"/>
-          <w:color w:val="ECECF1"/>
-          <w:shd w:val="clear" w:color="auto" w:fill="343541"/>
-        </w:rPr>
-        <w:t xml:space="preserve"> то основная часть </w:t>
+        <w:t xml:space="preserve"> надеюсь что найду хороший вариант. Зачем обновлять эту механику? Все просто если посмотреть на мой текущий проект то основная часть </w:t>
       </w:r>
       <w:proofErr w:type="spellStart"/>
       <w:r>
@@ -3926,27 +3286,7 @@
           <w:color w:val="ECECF1"/>
           <w:shd w:val="clear" w:color="auto" w:fill="343541"/>
         </w:rPr>
-        <w:t xml:space="preserve">, а также связка от системы прокачки, которую используют враги. И проблема заключается в </w:t>
-      </w:r>
-      <w:proofErr w:type="gramStart"/>
-      <w:r>
-        <w:rPr>
-          <w:rFonts w:ascii="Segoe UI" w:hAnsi="Segoe UI" w:cs="Segoe UI"/>
-          <w:strike/>
-          <w:color w:val="ECECF1"/>
-          <w:shd w:val="clear" w:color="auto" w:fill="343541"/>
-        </w:rPr>
-        <w:t>том</w:t>
-      </w:r>
-      <w:proofErr w:type="gramEnd"/>
-      <w:r>
-        <w:rPr>
-          <w:rFonts w:ascii="Segoe UI" w:hAnsi="Segoe UI" w:cs="Segoe UI"/>
-          <w:strike/>
-          <w:color w:val="ECECF1"/>
-          <w:shd w:val="clear" w:color="auto" w:fill="343541"/>
-        </w:rPr>
-        <w:t xml:space="preserve"> что изначально все враги использовали первую систему, но позже была </w:t>
+        <w:t xml:space="preserve">, а также связка от системы прокачки, которую используют враги. И проблема заключается в том что изначально все враги использовали первую систему, но позже была </w:t>
       </w:r>
       <w:proofErr w:type="spellStart"/>
       <w:r>
@@ -3966,27 +3306,7 @@
           <w:color w:val="ECECF1"/>
           <w:shd w:val="clear" w:color="auto" w:fill="343541"/>
         </w:rPr>
-        <w:t xml:space="preserve"> вторая система, и сейчас очень сложно сказать какую, из систем используют враги, скорей всего это является это будет смесь из двух систем. Это нужно исправить. Нужно пересмотреть взаимодействие этих двух систем и выбрать </w:t>
-      </w:r>
-      <w:proofErr w:type="gramStart"/>
-      <w:r>
-        <w:rPr>
-          <w:rFonts w:ascii="Segoe UI" w:hAnsi="Segoe UI" w:cs="Segoe UI"/>
-          <w:strike/>
-          <w:color w:val="ECECF1"/>
-          <w:shd w:val="clear" w:color="auto" w:fill="343541"/>
-        </w:rPr>
-        <w:t>лучшее решение</w:t>
-      </w:r>
-      <w:proofErr w:type="gramEnd"/>
-      <w:r>
-        <w:rPr>
-          <w:rFonts w:ascii="Segoe UI" w:hAnsi="Segoe UI" w:cs="Segoe UI"/>
-          <w:strike/>
-          <w:color w:val="ECECF1"/>
-          <w:shd w:val="clear" w:color="auto" w:fill="343541"/>
-        </w:rPr>
-        <w:t xml:space="preserve"> которое позволит мне разрешить данную проблему.</w:t>
+        <w:t xml:space="preserve"> вторая система, и сейчас очень сложно сказать какую, из систем используют враги, скорей всего это является это будет смесь из двух систем. Это нужно исправить. Нужно пересмотреть взаимодействие этих двух систем и выбрать лучшее решение которое позволит мне разрешить данную проблему.</w:t>
       </w:r>
     </w:p>
     <w:p>
@@ -4107,7 +3427,6 @@
         <w:t xml:space="preserve"> из </w:t>
       </w:r>
       <w:proofErr w:type="spellStart"/>
-      <w:proofErr w:type="gramStart"/>
       <w:r>
         <w:rPr>
           <w:rFonts w:ascii="Segoe UI" w:hAnsi="Segoe UI" w:cs="Segoe UI"/>
@@ -4118,7 +3437,6 @@
         <w:t>SavaData</w:t>
       </w:r>
       <w:proofErr w:type="spellEnd"/>
-      <w:proofErr w:type="gramEnd"/>
       <w:r>
         <w:rPr>
           <w:rFonts w:ascii="Segoe UI" w:hAnsi="Segoe UI" w:cs="Segoe UI"/>
@@ -4181,25 +3499,7 @@
           <w:color w:val="ECECF1"/>
           <w:shd w:val="clear" w:color="auto" w:fill="343541"/>
         </w:rPr>
-        <w:t xml:space="preserve"> текста на русский и английский, но есть моменты </w:t>
-      </w:r>
-      <w:proofErr w:type="gramStart"/>
-      <w:r>
-        <w:rPr>
-          <w:rFonts w:ascii="Segoe UI" w:hAnsi="Segoe UI" w:cs="Segoe UI"/>
-          <w:color w:val="ECECF1"/>
-          <w:shd w:val="clear" w:color="auto" w:fill="343541"/>
-        </w:rPr>
-        <w:t>где например</w:t>
-      </w:r>
-      <w:proofErr w:type="gramEnd"/>
-      <w:r>
-        <w:rPr>
-          <w:rFonts w:ascii="Segoe UI" w:hAnsi="Segoe UI" w:cs="Segoe UI"/>
-          <w:color w:val="ECECF1"/>
-          <w:shd w:val="clear" w:color="auto" w:fill="343541"/>
-        </w:rPr>
-        <w:t xml:space="preserve"> используются перечисления, их также нужно перевести на английский и на русский. </w:t>
+        <w:t xml:space="preserve"> текста на русский и английский, но есть моменты где например используются перечисления, их также нужно перевести на английский и на русский. </w:t>
       </w:r>
     </w:p>
     <w:p>
@@ -4322,15 +3622,18 @@
         <w:ind w:left="357" w:hanging="357"/>
         <w:rPr>
           <w:rFonts w:ascii="Times New Roman" w:hAnsi="Times New Roman" w:cs="Times New Roman"/>
+          <w:strike/>
           <w:color w:val="ECECF1"/>
           <w:sz w:val="28"/>
           <w:szCs w:val="28"/>
           <w:shd w:val="clear" w:color="auto" w:fill="343541"/>
         </w:rPr>
       </w:pPr>
+      <w:bookmarkStart w:id="0" w:name="_GoBack"/>
       <w:r>
         <w:rPr>
           <w:rFonts w:ascii="Times New Roman" w:hAnsi="Times New Roman" w:cs="Times New Roman"/>
+          <w:strike/>
           <w:color w:val="ECECF1"/>
           <w:sz w:val="28"/>
           <w:szCs w:val="28"/>
@@ -4338,9 +3641,8 @@
         </w:rPr>
         <w:t>Улучшить ИИ, а именно запретить производить атаку для ИИ если ИИ начал атаку, но был застагерен ударом игрока то ии должен потерять возможность повторной атаки до тех пор, пока не пройдет перезарядки атаки.</w:t>
       </w:r>
-      <w:bookmarkStart w:id="0" w:name="_GoBack"/>
-      <w:bookmarkEnd w:id="0"/>
-    </w:p>
+    </w:p>
+    <w:bookmarkEnd w:id="0"/>
     <w:p>
       <w:pPr>
         <w:pStyle w:val="a3"/>
@@ -4505,45 +3807,7 @@
           <w:color w:val="ECECF1"/>
           <w:shd w:val="clear" w:color="auto" w:fill="343541"/>
         </w:rPr>
-        <w:t xml:space="preserve">Пересмотреть работу системы спавна квестов. Мне не нравится то что фабрика </w:t>
-      </w:r>
-      <w:proofErr w:type="spellStart"/>
-      <w:r>
-        <w:rPr>
-          <w:rFonts w:ascii="Segoe UI" w:hAnsi="Segoe UI" w:cs="Segoe UI"/>
-          <w:color w:val="ECECF1"/>
-          <w:shd w:val="clear" w:color="auto" w:fill="343541"/>
-        </w:rPr>
-        <w:t>квестов</w:t>
-      </w:r>
-      <w:proofErr w:type="spellEnd"/>
-      <w:r>
-        <w:rPr>
-          <w:rFonts w:ascii="Segoe UI" w:hAnsi="Segoe UI" w:cs="Segoe UI"/>
-          <w:color w:val="ECECF1"/>
-          <w:shd w:val="clear" w:color="auto" w:fill="343541"/>
-        </w:rPr>
-        <w:t xml:space="preserve"> сама начинает </w:t>
-      </w:r>
-      <w:proofErr w:type="spellStart"/>
-      <w:proofErr w:type="gramStart"/>
-      <w:r>
-        <w:rPr>
-          <w:rFonts w:ascii="Segoe UI" w:hAnsi="Segoe UI" w:cs="Segoe UI"/>
-          <w:color w:val="ECECF1"/>
-          <w:shd w:val="clear" w:color="auto" w:fill="343541"/>
-        </w:rPr>
-        <w:t>спавнить</w:t>
-      </w:r>
-      <w:proofErr w:type="spellEnd"/>
-      <w:proofErr w:type="gramEnd"/>
-      <w:r>
-        <w:rPr>
-          <w:rFonts w:ascii="Segoe UI" w:hAnsi="Segoe UI" w:cs="Segoe UI"/>
-          <w:color w:val="ECECF1"/>
-          <w:shd w:val="clear" w:color="auto" w:fill="343541"/>
-        </w:rPr>
-        <w:t xml:space="preserve"> как только она сама того пожелает, а что если измениться порядок работы </w:t>
+        <w:t xml:space="preserve">Пересмотреть работу системы спавна квестов. Мне не нравится то что фабрика квестов сама начинает спавнить как только она сама того пожелает, а что если измениться порядок работы </w:t>
       </w:r>
       <w:proofErr w:type="spellStart"/>
       <w:r>
@@ -5676,7 +4940,7 @@
 </file>
 
 <file path=customXml/itemProps1.xml><?xml version="1.0" encoding="utf-8"?>
-<ds:datastoreItem xmlns:ds="http://schemas.openxmlformats.org/officeDocument/2006/customXml" ds:itemID="{A689994A-B141-4692-B248-58699A4DBFD6}">
+<ds:datastoreItem xmlns:ds="http://schemas.openxmlformats.org/officeDocument/2006/customXml" ds:itemID="{44D8344C-B896-4B65-889A-A3FB7F209B3E}">
   <ds:schemaRefs>
     <ds:schemaRef ds:uri="http://schemas.openxmlformats.org/officeDocument/2006/bibliography"/>
   </ds:schemaRefs>

</xml_diff>

<commit_message>
Try connect LevelGenerationSystem with Zenject.
</commit_message>
<xml_diff>
--- a/Итерации.docx
+++ b/Итерации.docx
@@ -4538,24 +4538,105 @@
           <w:szCs w:val="28"/>
           <w:shd w:val="clear" w:color="auto" w:fill="343541"/>
         </w:rPr>
+        <w:t xml:space="preserve">Нужно переделать генерацию уровней через </w:t>
+      </w:r>
+      <w:r>
+        <w:rPr>
+          <w:rFonts w:ascii="Times New Roman" w:hAnsi="Times New Roman" w:cs="Times New Roman"/>
+          <w:sz w:val="28"/>
+          <w:szCs w:val="28"/>
+          <w:shd w:val="clear" w:color="auto" w:fill="343541"/>
+          <w:lang w:val="en-US"/>
+        </w:rPr>
+        <w:t>DI</w:t>
+      </w:r>
+      <w:r>
+        <w:rPr>
+          <w:rFonts w:ascii="Times New Roman" w:hAnsi="Times New Roman" w:cs="Times New Roman"/>
+          <w:sz w:val="28"/>
+          <w:szCs w:val="28"/>
+          <w:shd w:val="clear" w:color="auto" w:fill="343541"/>
+        </w:rPr>
+        <w:t xml:space="preserve"> </w:t>
+      </w:r>
+      <w:r>
+        <w:rPr>
+          <w:rFonts w:ascii="Times New Roman" w:hAnsi="Times New Roman" w:cs="Times New Roman"/>
+          <w:sz w:val="28"/>
+          <w:szCs w:val="28"/>
+          <w:shd w:val="clear" w:color="auto" w:fill="343541"/>
+        </w:rPr>
+        <w:t xml:space="preserve">для того чтобы пробрасывать зависимости (как минимум </w:t>
+      </w:r>
+      <w:proofErr w:type="gramStart"/>
+      <w:r>
+        <w:rPr>
+          <w:rFonts w:ascii="Times New Roman" w:hAnsi="Times New Roman" w:cs="Times New Roman"/>
+          <w:sz w:val="28"/>
+          <w:szCs w:val="28"/>
+          <w:shd w:val="clear" w:color="auto" w:fill="343541"/>
+        </w:rPr>
+        <w:t>для телепорта</w:t>
+      </w:r>
+      <w:proofErr w:type="gramEnd"/>
+      <w:r>
+        <w:rPr>
+          <w:rFonts w:ascii="Times New Roman" w:hAnsi="Times New Roman" w:cs="Times New Roman"/>
+          <w:sz w:val="28"/>
+          <w:szCs w:val="28"/>
+          <w:shd w:val="clear" w:color="auto" w:fill="343541"/>
+        </w:rPr>
+        <w:t xml:space="preserve"> которому </w:t>
+      </w:r>
+      <w:r>
+        <w:rPr>
+          <w:rFonts w:ascii="Times New Roman" w:hAnsi="Times New Roman" w:cs="Times New Roman"/>
+          <w:sz w:val="28"/>
+          <w:szCs w:val="28"/>
+          <w:shd w:val="clear" w:color="auto" w:fill="343541"/>
+        </w:rPr>
+        <w:lastRenderedPageBreak/>
+        <w:t>необходимо знать о прогрессе игрока, чтобы знать какую именно сцену ему грузить).</w:t>
+      </w:r>
+    </w:p>
+    <w:p>
+      <w:pPr>
+        <w:pStyle w:val="a3"/>
+        <w:numPr>
+          <w:ilvl w:val="0"/>
+          <w:numId w:val="3"/>
+        </w:numPr>
+        <w:rPr>
+          <w:rFonts w:ascii="Times New Roman" w:hAnsi="Times New Roman" w:cs="Times New Roman"/>
+          <w:sz w:val="28"/>
+          <w:szCs w:val="28"/>
+          <w:shd w:val="clear" w:color="auto" w:fill="343541"/>
+        </w:rPr>
+      </w:pPr>
+      <w:r>
+        <w:rPr>
+          <w:rFonts w:ascii="Times New Roman" w:hAnsi="Times New Roman" w:cs="Times New Roman"/>
+          <w:sz w:val="28"/>
+          <w:szCs w:val="28"/>
+          <w:shd w:val="clear" w:color="auto" w:fill="343541"/>
+        </w:rPr>
         <w:t xml:space="preserve">Рефакторинг кода и подготовка к билду. </w:t>
       </w:r>
+    </w:p>
+    <w:p>
+      <w:pPr>
+        <w:rPr>
+          <w:rFonts w:ascii="Segoe UI" w:hAnsi="Segoe UI" w:cs="Segoe UI"/>
+          <w:color w:val="ECECF1"/>
+          <w:shd w:val="clear" w:color="auto" w:fill="343541"/>
+        </w:rPr>
+      </w:pPr>
       <w:bookmarkStart w:id="0" w:name="_GoBack"/>
       <w:bookmarkEnd w:id="0"/>
-    </w:p>
-    <w:p>
-      <w:pPr>
-        <w:rPr>
-          <w:rFonts w:ascii="Segoe UI" w:hAnsi="Segoe UI" w:cs="Segoe UI"/>
-          <w:color w:val="ECECF1"/>
-          <w:shd w:val="clear" w:color="auto" w:fill="343541"/>
-        </w:rPr>
-      </w:pPr>
-      <w:r>
-        <w:rPr>
-          <w:shd w:val="clear" w:color="auto" w:fill="343541"/>
-        </w:rPr>
-        <w:lastRenderedPageBreak/>
+      <w:r>
+        <w:rPr>
+          <w:shd w:val="clear" w:color="auto" w:fill="343541"/>
+        </w:rPr>
         <w:br w:type="page"/>
       </w:r>
     </w:p>
@@ -5900,7 +5981,7 @@
 </file>
 
 <file path=customXml/itemProps1.xml><?xml version="1.0" encoding="utf-8"?>
-<ds:datastoreItem xmlns:ds="http://schemas.openxmlformats.org/officeDocument/2006/customXml" ds:itemID="{F90FDCFA-B96E-446A-9506-0A80EBF963D1}">
+<ds:datastoreItem xmlns:ds="http://schemas.openxmlformats.org/officeDocument/2006/customXml" ds:itemID="{F8AB3438-4A5E-46C0-9AB3-0019705A1BD2}">
   <ds:schemaRefs>
     <ds:schemaRef ds:uri="http://schemas.openxmlformats.org/officeDocument/2006/bibliography"/>
   </ds:schemaRefs>

</xml_diff>

<commit_message>
End update curtain. Start connect LevelGenerationSystem to Zenject(for DI).
</commit_message>
<xml_diff>
--- a/Итерации.docx
+++ b/Итерации.docx
@@ -36,7 +36,47 @@
           <w:color w:val="ECECF1"/>
           <w:shd w:val="clear" w:color="auto" w:fill="343541"/>
         </w:rPr>
-        <w:t xml:space="preserve">1 разобраться из структурой данных которая будет использоваться для сохранения данных игры. Структура должна быть организована на сиреализуемых скриптейбл обджектах. </w:t>
+        <w:t xml:space="preserve">1 разобраться </w:t>
+      </w:r>
+      <w:proofErr w:type="gramStart"/>
+      <w:r>
+        <w:rPr>
+          <w:rFonts w:ascii="Segoe UI" w:hAnsi="Segoe UI" w:cs="Segoe UI"/>
+          <w:strike/>
+          <w:color w:val="ECECF1"/>
+          <w:shd w:val="clear" w:color="auto" w:fill="343541"/>
+        </w:rPr>
+        <w:t>из структурой</w:t>
+      </w:r>
+      <w:proofErr w:type="gramEnd"/>
+      <w:r>
+        <w:rPr>
+          <w:rFonts w:ascii="Segoe UI" w:hAnsi="Segoe UI" w:cs="Segoe UI"/>
+          <w:strike/>
+          <w:color w:val="ECECF1"/>
+          <w:shd w:val="clear" w:color="auto" w:fill="343541"/>
+        </w:rPr>
+        <w:t xml:space="preserve"> данных которая будет использоваться для сохранения данных игры. Структура должна быть организована на </w:t>
+      </w:r>
+      <w:proofErr w:type="spellStart"/>
+      <w:r>
+        <w:rPr>
+          <w:rFonts w:ascii="Segoe UI" w:hAnsi="Segoe UI" w:cs="Segoe UI"/>
+          <w:strike/>
+          <w:color w:val="ECECF1"/>
+          <w:shd w:val="clear" w:color="auto" w:fill="343541"/>
+        </w:rPr>
+        <w:t>сиреализуемых</w:t>
+      </w:r>
+      <w:proofErr w:type="spellEnd"/>
+      <w:r>
+        <w:rPr>
+          <w:rFonts w:ascii="Segoe UI" w:hAnsi="Segoe UI" w:cs="Segoe UI"/>
+          <w:strike/>
+          <w:color w:val="ECECF1"/>
+          <w:shd w:val="clear" w:color="auto" w:fill="343541"/>
+        </w:rPr>
+        <w:t xml:space="preserve"> скриптейбл обджектах. </w:t>
       </w:r>
     </w:p>
     <w:p>
@@ -87,7 +127,25 @@
           <w:color w:val="ECECF1"/>
           <w:shd w:val="clear" w:color="auto" w:fill="343541"/>
         </w:rPr>
-        <w:t xml:space="preserve">4 Продумать кто и каким образом будет собирать компоненты которые реализовывают интерфейсы для сохранения и/или загрузки данных. Возможно это должна быть фабрика. </w:t>
+        <w:t xml:space="preserve">4 Продумать кто и каким образом будет собирать </w:t>
+      </w:r>
+      <w:proofErr w:type="gramStart"/>
+      <w:r>
+        <w:rPr>
+          <w:rFonts w:ascii="Segoe UI" w:hAnsi="Segoe UI" w:cs="Segoe UI"/>
+          <w:color w:val="ECECF1"/>
+          <w:shd w:val="clear" w:color="auto" w:fill="343541"/>
+        </w:rPr>
+        <w:t>компоненты</w:t>
+      </w:r>
+      <w:proofErr w:type="gramEnd"/>
+      <w:r>
+        <w:rPr>
+          <w:rFonts w:ascii="Segoe UI" w:hAnsi="Segoe UI" w:cs="Segoe UI"/>
+          <w:color w:val="ECECF1"/>
+          <w:shd w:val="clear" w:color="auto" w:fill="343541"/>
+        </w:rPr>
+        <w:t xml:space="preserve"> которые реализовывают интерфейсы для сохранения и/или загрузки данных. Возможно это должна быть фабрика. </w:t>
       </w:r>
     </w:p>
     <w:p>
@@ -253,7 +311,27 @@
           <w:color w:val="ECECF1"/>
           <w:shd w:val="clear" w:color="auto" w:fill="343541"/>
         </w:rPr>
-        <w:t xml:space="preserve">1 Работа над архитектурой. Внедрение di фабрики чтобы она занималась спавном игровых компонентов, когда к ней придёт запрос от какого-то состояния </w:t>
+        <w:t xml:space="preserve">1 Работа над архитектурой. Внедрение </w:t>
+      </w:r>
+      <w:proofErr w:type="spellStart"/>
+      <w:r>
+        <w:rPr>
+          <w:rFonts w:ascii="Segoe UI" w:hAnsi="Segoe UI" w:cs="Segoe UI"/>
+          <w:strike/>
+          <w:color w:val="ECECF1"/>
+          <w:shd w:val="clear" w:color="auto" w:fill="343541"/>
+        </w:rPr>
+        <w:t>di</w:t>
+      </w:r>
+      <w:proofErr w:type="spellEnd"/>
+      <w:r>
+        <w:rPr>
+          <w:rFonts w:ascii="Segoe UI" w:hAnsi="Segoe UI" w:cs="Segoe UI"/>
+          <w:strike/>
+          <w:color w:val="ECECF1"/>
+          <w:shd w:val="clear" w:color="auto" w:fill="343541"/>
+        </w:rPr>
+        <w:t xml:space="preserve"> фабрики чтобы она занималась спавном игровых компонентов, когда к ней придёт запрос от какого-то состояния </w:t>
       </w:r>
     </w:p>
     <w:p>
@@ -310,7 +388,27 @@
           <w:color w:val="ECECF1"/>
           <w:shd w:val="clear" w:color="auto" w:fill="343541"/>
         </w:rPr>
-        <w:t>4 Продумать кто и каким образом будет собирать компоненты которые реализовывают интерфейсы для сохранения и/или загрузки данных. Возможно это должна быть фабрика.</w:t>
+        <w:t xml:space="preserve">4 Продумать кто и каким образом будет собирать </w:t>
+      </w:r>
+      <w:proofErr w:type="gramStart"/>
+      <w:r>
+        <w:rPr>
+          <w:rFonts w:ascii="Segoe UI" w:hAnsi="Segoe UI" w:cs="Segoe UI"/>
+          <w:strike/>
+          <w:color w:val="ECECF1"/>
+          <w:shd w:val="clear" w:color="auto" w:fill="343541"/>
+        </w:rPr>
+        <w:t>компоненты</w:t>
+      </w:r>
+      <w:proofErr w:type="gramEnd"/>
+      <w:r>
+        <w:rPr>
+          <w:rFonts w:ascii="Segoe UI" w:hAnsi="Segoe UI" w:cs="Segoe UI"/>
+          <w:strike/>
+          <w:color w:val="ECECF1"/>
+          <w:shd w:val="clear" w:color="auto" w:fill="343541"/>
+        </w:rPr>
+        <w:t xml:space="preserve"> которые реализовывают интерфейсы для сохранения и/или загрузки данных. Возможно это должна быть фабрика.</w:t>
       </w:r>
     </w:p>
     <w:p>
@@ -428,7 +526,27 @@
           <w:color w:val="ECECF1"/>
           <w:shd w:val="clear" w:color="auto" w:fill="343541"/>
         </w:rPr>
-        <w:t>3 Написать поведение для врагов которые включают сл</w:t>
+        <w:t xml:space="preserve">3 Написать поведение </w:t>
+      </w:r>
+      <w:proofErr w:type="gramStart"/>
+      <w:r>
+        <w:rPr>
+          <w:rFonts w:ascii="Segoe UI" w:hAnsi="Segoe UI" w:cs="Segoe UI"/>
+          <w:strike/>
+          <w:color w:val="ECECF1"/>
+          <w:shd w:val="clear" w:color="auto" w:fill="343541"/>
+        </w:rPr>
+        <w:t>для врагов</w:t>
+      </w:r>
+      <w:proofErr w:type="gramEnd"/>
+      <w:r>
+        <w:rPr>
+          <w:rFonts w:ascii="Segoe UI" w:hAnsi="Segoe UI" w:cs="Segoe UI"/>
+          <w:strike/>
+          <w:color w:val="ECECF1"/>
+          <w:shd w:val="clear" w:color="auto" w:fill="343541"/>
+        </w:rPr>
+        <w:t xml:space="preserve"> которые включают сл</w:t>
       </w:r>
       <w:r>
         <w:rPr>
@@ -473,7 +591,27 @@
           <w:color w:val="ECECF1"/>
           <w:shd w:val="clear" w:color="auto" w:fill="343541"/>
         </w:rPr>
-        <w:t>5 Создать телепорт который будет пересылать игро</w:t>
+        <w:t xml:space="preserve">5 Создать </w:t>
+      </w:r>
+      <w:proofErr w:type="gramStart"/>
+      <w:r>
+        <w:rPr>
+          <w:rFonts w:ascii="Segoe UI" w:hAnsi="Segoe UI" w:cs="Segoe UI"/>
+          <w:strike/>
+          <w:color w:val="ECECF1"/>
+          <w:shd w:val="clear" w:color="auto" w:fill="343541"/>
+        </w:rPr>
+        <w:t>телепорт</w:t>
+      </w:r>
+      <w:proofErr w:type="gramEnd"/>
+      <w:r>
+        <w:rPr>
+          <w:rFonts w:ascii="Segoe UI" w:hAnsi="Segoe UI" w:cs="Segoe UI"/>
+          <w:strike/>
+          <w:color w:val="ECECF1"/>
+          <w:shd w:val="clear" w:color="auto" w:fill="343541"/>
+        </w:rPr>
+        <w:t xml:space="preserve"> который будет пересылать игро</w:t>
       </w:r>
       <w:r>
         <w:rPr>
@@ -627,7 +765,47 @@
           <w:color w:val="ECECF1"/>
           <w:shd w:val="clear" w:color="auto" w:fill="343541"/>
         </w:rPr>
-        <w:t xml:space="preserve">1 Система боя: атака, получение урона, смерть. Эти три состояния которые должна как бы поддерживать система боя. Внедрить их не составит проблем потому-что уже имеются управляющие компоненты которые позволяют ии и игроку управлять атакой нужна только логика боевой системы. </w:t>
+        <w:t xml:space="preserve">1 Система боя: атака, получение урона, смерть. Эти три состояния которые должна как бы поддерживать система боя. Внедрить их не составит проблем </w:t>
+      </w:r>
+      <w:proofErr w:type="spellStart"/>
+      <w:r>
+        <w:rPr>
+          <w:rFonts w:ascii="Segoe UI" w:hAnsi="Segoe UI" w:cs="Segoe UI"/>
+          <w:strike/>
+          <w:color w:val="ECECF1"/>
+          <w:shd w:val="clear" w:color="auto" w:fill="343541"/>
+        </w:rPr>
+        <w:t>потому-что</w:t>
+      </w:r>
+      <w:proofErr w:type="spellEnd"/>
+      <w:r>
+        <w:rPr>
+          <w:rFonts w:ascii="Segoe UI" w:hAnsi="Segoe UI" w:cs="Segoe UI"/>
+          <w:strike/>
+          <w:color w:val="ECECF1"/>
+          <w:shd w:val="clear" w:color="auto" w:fill="343541"/>
+        </w:rPr>
+        <w:t xml:space="preserve"> уже имеются </w:t>
+      </w:r>
+      <w:proofErr w:type="gramStart"/>
+      <w:r>
+        <w:rPr>
+          <w:rFonts w:ascii="Segoe UI" w:hAnsi="Segoe UI" w:cs="Segoe UI"/>
+          <w:strike/>
+          <w:color w:val="ECECF1"/>
+          <w:shd w:val="clear" w:color="auto" w:fill="343541"/>
+        </w:rPr>
+        <w:t>управляющие компоненты</w:t>
+      </w:r>
+      <w:proofErr w:type="gramEnd"/>
+      <w:r>
+        <w:rPr>
+          <w:rFonts w:ascii="Segoe UI" w:hAnsi="Segoe UI" w:cs="Segoe UI"/>
+          <w:strike/>
+          <w:color w:val="ECECF1"/>
+          <w:shd w:val="clear" w:color="auto" w:fill="343541"/>
+        </w:rPr>
+        <w:t xml:space="preserve"> которые позволяют ии и игроку управлять атакой нужна только логика боевой системы. </w:t>
       </w:r>
     </w:p>
     <w:p>
@@ -741,7 +919,27 @@
           <w:color w:val="ECECF1"/>
           <w:shd w:val="clear" w:color="auto" w:fill="343541"/>
         </w:rPr>
-        <w:t xml:space="preserve">7 Искать ассеты для GUI. </w:t>
+        <w:t xml:space="preserve">7 Искать </w:t>
+      </w:r>
+      <w:proofErr w:type="spellStart"/>
+      <w:r>
+        <w:rPr>
+          <w:rFonts w:ascii="Segoe UI" w:hAnsi="Segoe UI" w:cs="Segoe UI"/>
+          <w:strike/>
+          <w:color w:val="ECECF1"/>
+          <w:shd w:val="clear" w:color="auto" w:fill="343541"/>
+        </w:rPr>
+        <w:t>ассеты</w:t>
+      </w:r>
+      <w:proofErr w:type="spellEnd"/>
+      <w:r>
+        <w:rPr>
+          <w:rFonts w:ascii="Segoe UI" w:hAnsi="Segoe UI" w:cs="Segoe UI"/>
+          <w:strike/>
+          <w:color w:val="ECECF1"/>
+          <w:shd w:val="clear" w:color="auto" w:fill="343541"/>
+        </w:rPr>
+        <w:t xml:space="preserve"> для GUI. </w:t>
       </w:r>
     </w:p>
     <w:p>
@@ -817,26 +1015,106 @@
           <w:color w:val="ECECF1"/>
           <w:shd w:val="clear" w:color="auto" w:fill="343541"/>
         </w:rPr>
-        <w:t xml:space="preserve">1 первым делом нужно подумать о сериализации инвентаря, это нужно сделать чтобы список предметов, а точнее хилок и их количество сохранялось в память и чтобы его можно было загрузить при продолжении игры </w:t>
-      </w:r>
-    </w:p>
-    <w:p>
-      <w:pPr>
-        <w:rPr>
-          <w:rFonts w:ascii="Segoe UI" w:hAnsi="Segoe UI" w:cs="Segoe UI"/>
-          <w:strike/>
-          <w:color w:val="ECECF1"/>
-          <w:shd w:val="clear" w:color="auto" w:fill="343541"/>
-        </w:rPr>
-      </w:pPr>
-      <w:r>
-        <w:rPr>
-          <w:rFonts w:ascii="Segoe UI" w:hAnsi="Segoe UI" w:cs="Segoe UI"/>
-          <w:strike/>
-          <w:color w:val="ECECF1"/>
-          <w:shd w:val="clear" w:color="auto" w:fill="343541"/>
-        </w:rPr>
-        <w:t xml:space="preserve">2 искать визуальные эффекты которые отображают смерть игрока и нпс. Также нужно поискать картинки которые буду использовать в GUI для хилок и для полоски здоровья </w:t>
+        <w:t xml:space="preserve">1 первым делом нужно подумать о </w:t>
+      </w:r>
+      <w:proofErr w:type="spellStart"/>
+      <w:r>
+        <w:rPr>
+          <w:rFonts w:ascii="Segoe UI" w:hAnsi="Segoe UI" w:cs="Segoe UI"/>
+          <w:strike/>
+          <w:color w:val="ECECF1"/>
+          <w:shd w:val="clear" w:color="auto" w:fill="343541"/>
+        </w:rPr>
+        <w:t>сериализации</w:t>
+      </w:r>
+      <w:proofErr w:type="spellEnd"/>
+      <w:r>
+        <w:rPr>
+          <w:rFonts w:ascii="Segoe UI" w:hAnsi="Segoe UI" w:cs="Segoe UI"/>
+          <w:strike/>
+          <w:color w:val="ECECF1"/>
+          <w:shd w:val="clear" w:color="auto" w:fill="343541"/>
+        </w:rPr>
+        <w:t xml:space="preserve"> инвентаря, это нужно сделать чтобы список предметов, а точнее хилок и их количество сохранялось в </w:t>
+      </w:r>
+      <w:proofErr w:type="gramStart"/>
+      <w:r>
+        <w:rPr>
+          <w:rFonts w:ascii="Segoe UI" w:hAnsi="Segoe UI" w:cs="Segoe UI"/>
+          <w:strike/>
+          <w:color w:val="ECECF1"/>
+          <w:shd w:val="clear" w:color="auto" w:fill="343541"/>
+        </w:rPr>
+        <w:t>память</w:t>
+      </w:r>
+      <w:proofErr w:type="gramEnd"/>
+      <w:r>
+        <w:rPr>
+          <w:rFonts w:ascii="Segoe UI" w:hAnsi="Segoe UI" w:cs="Segoe UI"/>
+          <w:strike/>
+          <w:color w:val="ECECF1"/>
+          <w:shd w:val="clear" w:color="auto" w:fill="343541"/>
+        </w:rPr>
+        <w:t xml:space="preserve"> и чтобы его можно было загрузить при продолжении игры </w:t>
+      </w:r>
+    </w:p>
+    <w:p>
+      <w:pPr>
+        <w:rPr>
+          <w:rFonts w:ascii="Segoe UI" w:hAnsi="Segoe UI" w:cs="Segoe UI"/>
+          <w:strike/>
+          <w:color w:val="ECECF1"/>
+          <w:shd w:val="clear" w:color="auto" w:fill="343541"/>
+        </w:rPr>
+      </w:pPr>
+      <w:r>
+        <w:rPr>
+          <w:rFonts w:ascii="Segoe UI" w:hAnsi="Segoe UI" w:cs="Segoe UI"/>
+          <w:strike/>
+          <w:color w:val="ECECF1"/>
+          <w:shd w:val="clear" w:color="auto" w:fill="343541"/>
+        </w:rPr>
+        <w:t xml:space="preserve">2 искать </w:t>
+      </w:r>
+      <w:proofErr w:type="gramStart"/>
+      <w:r>
+        <w:rPr>
+          <w:rFonts w:ascii="Segoe UI" w:hAnsi="Segoe UI" w:cs="Segoe UI"/>
+          <w:strike/>
+          <w:color w:val="ECECF1"/>
+          <w:shd w:val="clear" w:color="auto" w:fill="343541"/>
+        </w:rPr>
+        <w:t>визуальные эффекты</w:t>
+      </w:r>
+      <w:proofErr w:type="gramEnd"/>
+      <w:r>
+        <w:rPr>
+          <w:rFonts w:ascii="Segoe UI" w:hAnsi="Segoe UI" w:cs="Segoe UI"/>
+          <w:strike/>
+          <w:color w:val="ECECF1"/>
+          <w:shd w:val="clear" w:color="auto" w:fill="343541"/>
+        </w:rPr>
+        <w:t xml:space="preserve"> которые отображают смерть игрока и нпс. Также нужно поискать </w:t>
+      </w:r>
+      <w:proofErr w:type="gramStart"/>
+      <w:r>
+        <w:rPr>
+          <w:rFonts w:ascii="Segoe UI" w:hAnsi="Segoe UI" w:cs="Segoe UI"/>
+          <w:strike/>
+          <w:color w:val="ECECF1"/>
+          <w:shd w:val="clear" w:color="auto" w:fill="343541"/>
+        </w:rPr>
+        <w:t>картинки</w:t>
+      </w:r>
+      <w:proofErr w:type="gramEnd"/>
+      <w:r>
+        <w:rPr>
+          <w:rFonts w:ascii="Segoe UI" w:hAnsi="Segoe UI" w:cs="Segoe UI"/>
+          <w:strike/>
+          <w:color w:val="ECECF1"/>
+          <w:shd w:val="clear" w:color="auto" w:fill="343541"/>
+        </w:rPr>
+        <w:t xml:space="preserve"> которые буду использовать в GUI для хилок и для полоски здоровья </w:t>
       </w:r>
     </w:p>
     <w:p>
@@ -891,7 +1169,87 @@
           <w:color w:val="ECECF1"/>
           <w:shd w:val="clear" w:color="auto" w:fill="343541"/>
         </w:rPr>
-        <w:t xml:space="preserve">5 Работа со светом. Просмотреть разные варианты. Но нужно помнить что риалтаймовое освещение жрет очень много ресурсов поэтому либо делать его запечённым либо использовать дайрект лайт </w:t>
+        <w:t xml:space="preserve">5 Работа со светом. Просмотреть разные варианты. Но нужно </w:t>
+      </w:r>
+      <w:proofErr w:type="gramStart"/>
+      <w:r>
+        <w:rPr>
+          <w:rFonts w:ascii="Segoe UI" w:hAnsi="Segoe UI" w:cs="Segoe UI"/>
+          <w:strike/>
+          <w:color w:val="ECECF1"/>
+          <w:shd w:val="clear" w:color="auto" w:fill="343541"/>
+        </w:rPr>
+        <w:t>помнить</w:t>
+      </w:r>
+      <w:proofErr w:type="gramEnd"/>
+      <w:r>
+        <w:rPr>
+          <w:rFonts w:ascii="Segoe UI" w:hAnsi="Segoe UI" w:cs="Segoe UI"/>
+          <w:strike/>
+          <w:color w:val="ECECF1"/>
+          <w:shd w:val="clear" w:color="auto" w:fill="343541"/>
+        </w:rPr>
+        <w:t xml:space="preserve"> что </w:t>
+      </w:r>
+      <w:proofErr w:type="spellStart"/>
+      <w:r>
+        <w:rPr>
+          <w:rFonts w:ascii="Segoe UI" w:hAnsi="Segoe UI" w:cs="Segoe UI"/>
+          <w:strike/>
+          <w:color w:val="ECECF1"/>
+          <w:shd w:val="clear" w:color="auto" w:fill="343541"/>
+        </w:rPr>
+        <w:t>риалтаймовое</w:t>
+      </w:r>
+      <w:proofErr w:type="spellEnd"/>
+      <w:r>
+        <w:rPr>
+          <w:rFonts w:ascii="Segoe UI" w:hAnsi="Segoe UI" w:cs="Segoe UI"/>
+          <w:strike/>
+          <w:color w:val="ECECF1"/>
+          <w:shd w:val="clear" w:color="auto" w:fill="343541"/>
+        </w:rPr>
+        <w:t xml:space="preserve"> освещение жрет очень много ресурсов поэтому либо делать его запечённым либо использовать </w:t>
+      </w:r>
+      <w:proofErr w:type="spellStart"/>
+      <w:r>
+        <w:rPr>
+          <w:rFonts w:ascii="Segoe UI" w:hAnsi="Segoe UI" w:cs="Segoe UI"/>
+          <w:strike/>
+          <w:color w:val="ECECF1"/>
+          <w:shd w:val="clear" w:color="auto" w:fill="343541"/>
+        </w:rPr>
+        <w:t>дайрект</w:t>
+      </w:r>
+      <w:proofErr w:type="spellEnd"/>
+      <w:r>
+        <w:rPr>
+          <w:rFonts w:ascii="Segoe UI" w:hAnsi="Segoe UI" w:cs="Segoe UI"/>
+          <w:strike/>
+          <w:color w:val="ECECF1"/>
+          <w:shd w:val="clear" w:color="auto" w:fill="343541"/>
+        </w:rPr>
+        <w:t xml:space="preserve"> </w:t>
+      </w:r>
+      <w:proofErr w:type="spellStart"/>
+      <w:r>
+        <w:rPr>
+          <w:rFonts w:ascii="Segoe UI" w:hAnsi="Segoe UI" w:cs="Segoe UI"/>
+          <w:strike/>
+          <w:color w:val="ECECF1"/>
+          <w:shd w:val="clear" w:color="auto" w:fill="343541"/>
+        </w:rPr>
+        <w:t>лайт</w:t>
+      </w:r>
+      <w:proofErr w:type="spellEnd"/>
+      <w:r>
+        <w:rPr>
+          <w:rFonts w:ascii="Segoe UI" w:hAnsi="Segoe UI" w:cs="Segoe UI"/>
+          <w:strike/>
+          <w:color w:val="ECECF1"/>
+          <w:shd w:val="clear" w:color="auto" w:fill="343541"/>
+        </w:rPr>
+        <w:t xml:space="preserve"> </w:t>
       </w:r>
     </w:p>
     <w:p>
@@ -947,7 +1305,47 @@
           <w:color w:val="ECECF1"/>
           <w:shd w:val="clear" w:color="auto" w:fill="343541"/>
         </w:rPr>
-        <w:t>8 Пересмотреть скрипты и те которые не используют статик дату, перевести на использование статик даты, а именно это относиться к конфигу игрока</w:t>
+        <w:t xml:space="preserve">8 Пересмотреть скрипты и </w:t>
+      </w:r>
+      <w:proofErr w:type="gramStart"/>
+      <w:r>
+        <w:rPr>
+          <w:rFonts w:ascii="Segoe UI" w:hAnsi="Segoe UI" w:cs="Segoe UI"/>
+          <w:strike/>
+          <w:color w:val="ECECF1"/>
+          <w:shd w:val="clear" w:color="auto" w:fill="343541"/>
+        </w:rPr>
+        <w:t>те</w:t>
+      </w:r>
+      <w:proofErr w:type="gramEnd"/>
+      <w:r>
+        <w:rPr>
+          <w:rFonts w:ascii="Segoe UI" w:hAnsi="Segoe UI" w:cs="Segoe UI"/>
+          <w:strike/>
+          <w:color w:val="ECECF1"/>
+          <w:shd w:val="clear" w:color="auto" w:fill="343541"/>
+        </w:rPr>
+        <w:t xml:space="preserve"> которые не используют статик дату, перевести на использование статик даты, а именно это относиться к </w:t>
+      </w:r>
+      <w:proofErr w:type="spellStart"/>
+      <w:r>
+        <w:rPr>
+          <w:rFonts w:ascii="Segoe UI" w:hAnsi="Segoe UI" w:cs="Segoe UI"/>
+          <w:strike/>
+          <w:color w:val="ECECF1"/>
+          <w:shd w:val="clear" w:color="auto" w:fill="343541"/>
+        </w:rPr>
+        <w:t>конфигу</w:t>
+      </w:r>
+      <w:proofErr w:type="spellEnd"/>
+      <w:r>
+        <w:rPr>
+          <w:rFonts w:ascii="Segoe UI" w:hAnsi="Segoe UI" w:cs="Segoe UI"/>
+          <w:strike/>
+          <w:color w:val="ECECF1"/>
+          <w:shd w:val="clear" w:color="auto" w:fill="343541"/>
+        </w:rPr>
+        <w:t xml:space="preserve"> игрока</w:t>
       </w:r>
     </w:p>
     <w:p>
@@ -1044,7 +1442,25 @@
           <w:color w:val="ECECF1"/>
           <w:shd w:val="clear" w:color="auto" w:fill="343541"/>
         </w:rPr>
-        <w:t>Второй и третий пункт хоть и выглядят достаточно просто но на самом деле именно эти два пункта содержат колоссальную работу над проектом.</w:t>
+        <w:t xml:space="preserve">Второй и третий пункт хоть и выглядят достаточно </w:t>
+      </w:r>
+      <w:proofErr w:type="gramStart"/>
+      <w:r>
+        <w:rPr>
+          <w:rFonts w:ascii="Segoe UI" w:hAnsi="Segoe UI" w:cs="Segoe UI"/>
+          <w:color w:val="ECECF1"/>
+          <w:shd w:val="clear" w:color="auto" w:fill="343541"/>
+        </w:rPr>
+        <w:t>просто</w:t>
+      </w:r>
+      <w:proofErr w:type="gramEnd"/>
+      <w:r>
+        <w:rPr>
+          <w:rFonts w:ascii="Segoe UI" w:hAnsi="Segoe UI" w:cs="Segoe UI"/>
+          <w:color w:val="ECECF1"/>
+          <w:shd w:val="clear" w:color="auto" w:fill="343541"/>
+        </w:rPr>
+        <w:t xml:space="preserve"> но на самом деле именно эти два пункта содержат колоссальную работу над проектом.</w:t>
       </w:r>
     </w:p>
     <w:p>
@@ -1188,7 +1604,27 @@
           <w:color w:val="ECECF1"/>
           <w:shd w:val="clear" w:color="auto" w:fill="343541"/>
         </w:rPr>
-        <w:t>5 Начать погружаться в квестовую систему. Это достаточно крупный шаг и по этому он займет больше всего времени, хотя и на первый взгляд все написано просто.</w:t>
+        <w:t xml:space="preserve">5 Начать погружаться в квестовую систему. Это достаточно крупный шаг и </w:t>
+      </w:r>
+      <w:proofErr w:type="gramStart"/>
+      <w:r>
+        <w:rPr>
+          <w:rFonts w:ascii="Segoe UI" w:hAnsi="Segoe UI" w:cs="Segoe UI"/>
+          <w:strike/>
+          <w:color w:val="ECECF1"/>
+          <w:shd w:val="clear" w:color="auto" w:fill="343541"/>
+        </w:rPr>
+        <w:t>по этому</w:t>
+      </w:r>
+      <w:proofErr w:type="gramEnd"/>
+      <w:r>
+        <w:rPr>
+          <w:rFonts w:ascii="Segoe UI" w:hAnsi="Segoe UI" w:cs="Segoe UI"/>
+          <w:strike/>
+          <w:color w:val="ECECF1"/>
+          <w:shd w:val="clear" w:color="auto" w:fill="343541"/>
+        </w:rPr>
+        <w:t xml:space="preserve"> он займет больше всего времени, хотя и на первый взгляд все написано просто.</w:t>
       </w:r>
     </w:p>
     <w:p>
@@ -1258,24 +1694,62 @@
           <w:color w:val="ECECF1"/>
           <w:shd w:val="clear" w:color="auto" w:fill="343541"/>
         </w:rPr>
-        <w:t xml:space="preserve">1 Внедрить прототип квестовой системы в проект </w:t>
-      </w:r>
-    </w:p>
-    <w:p>
-      <w:pPr>
-        <w:rPr>
-          <w:rFonts w:ascii="Segoe UI" w:hAnsi="Segoe UI" w:cs="Segoe UI"/>
-          <w:color w:val="ECECF1"/>
-          <w:shd w:val="clear" w:color="auto" w:fill="343541"/>
-        </w:rPr>
-      </w:pPr>
-      <w:r>
-        <w:rPr>
-          <w:rFonts w:ascii="Segoe UI" w:hAnsi="Segoe UI" w:cs="Segoe UI"/>
-          <w:color w:val="ECECF1"/>
-          <w:shd w:val="clear" w:color="auto" w:fill="343541"/>
-        </w:rPr>
-        <w:t xml:space="preserve">2 Довести прототип квестовой системы до ума. Один из самых длительных этапов. </w:t>
+        <w:t xml:space="preserve">1 Внедрить прототип </w:t>
+      </w:r>
+      <w:proofErr w:type="spellStart"/>
+      <w:r>
+        <w:rPr>
+          <w:rFonts w:ascii="Segoe UI" w:hAnsi="Segoe UI" w:cs="Segoe UI"/>
+          <w:strike/>
+          <w:color w:val="ECECF1"/>
+          <w:shd w:val="clear" w:color="auto" w:fill="343541"/>
+        </w:rPr>
+        <w:t>квестовой</w:t>
+      </w:r>
+      <w:proofErr w:type="spellEnd"/>
+      <w:r>
+        <w:rPr>
+          <w:rFonts w:ascii="Segoe UI" w:hAnsi="Segoe UI" w:cs="Segoe UI"/>
+          <w:strike/>
+          <w:color w:val="ECECF1"/>
+          <w:shd w:val="clear" w:color="auto" w:fill="343541"/>
+        </w:rPr>
+        <w:t xml:space="preserve"> системы в проект </w:t>
+      </w:r>
+    </w:p>
+    <w:p>
+      <w:pPr>
+        <w:rPr>
+          <w:rFonts w:ascii="Segoe UI" w:hAnsi="Segoe UI" w:cs="Segoe UI"/>
+          <w:color w:val="ECECF1"/>
+          <w:shd w:val="clear" w:color="auto" w:fill="343541"/>
+        </w:rPr>
+      </w:pPr>
+      <w:r>
+        <w:rPr>
+          <w:rFonts w:ascii="Segoe UI" w:hAnsi="Segoe UI" w:cs="Segoe UI"/>
+          <w:color w:val="ECECF1"/>
+          <w:shd w:val="clear" w:color="auto" w:fill="343541"/>
+        </w:rPr>
+        <w:t xml:space="preserve">2 Довести прототип </w:t>
+      </w:r>
+      <w:proofErr w:type="spellStart"/>
+      <w:r>
+        <w:rPr>
+          <w:rFonts w:ascii="Segoe UI" w:hAnsi="Segoe UI" w:cs="Segoe UI"/>
+          <w:color w:val="ECECF1"/>
+          <w:shd w:val="clear" w:color="auto" w:fill="343541"/>
+        </w:rPr>
+        <w:t>квестовой</w:t>
+      </w:r>
+      <w:proofErr w:type="spellEnd"/>
+      <w:r>
+        <w:rPr>
+          <w:rFonts w:ascii="Segoe UI" w:hAnsi="Segoe UI" w:cs="Segoe UI"/>
+          <w:color w:val="ECECF1"/>
+          <w:shd w:val="clear" w:color="auto" w:fill="343541"/>
+        </w:rPr>
+        <w:t xml:space="preserve"> системы до ума. Один из самых длительных этапов. </w:t>
       </w:r>
     </w:p>
     <w:p>
@@ -1293,7 +1767,25 @@
           <w:color w:val="ECECF1"/>
           <w:shd w:val="clear" w:color="auto" w:fill="343541"/>
         </w:rPr>
-        <w:t xml:space="preserve">2а Завершить прототип, получив работоспособную квестовую систему. </w:t>
+        <w:t xml:space="preserve">2а </w:t>
+      </w:r>
+      <w:proofErr w:type="gramStart"/>
+      <w:r>
+        <w:rPr>
+          <w:rFonts w:ascii="Segoe UI" w:hAnsi="Segoe UI" w:cs="Segoe UI"/>
+          <w:color w:val="ECECF1"/>
+          <w:shd w:val="clear" w:color="auto" w:fill="343541"/>
+        </w:rPr>
+        <w:t>Завершить</w:t>
+      </w:r>
+      <w:proofErr w:type="gramEnd"/>
+      <w:r>
+        <w:rPr>
+          <w:rFonts w:ascii="Segoe UI" w:hAnsi="Segoe UI" w:cs="Segoe UI"/>
+          <w:color w:val="ECECF1"/>
+          <w:shd w:val="clear" w:color="auto" w:fill="343541"/>
+        </w:rPr>
+        <w:t xml:space="preserve"> прототип, получив работоспособную квестовую систему. </w:t>
       </w:r>
     </w:p>
     <w:p>
@@ -1311,7 +1803,43 @@
           <w:color w:val="ECECF1"/>
           <w:shd w:val="clear" w:color="auto" w:fill="343541"/>
         </w:rPr>
-        <w:t xml:space="preserve">2б Контролировать состояние архитектуры при разработке доработке прототипа квестовой системы. </w:t>
+        <w:t xml:space="preserve">2б </w:t>
+      </w:r>
+      <w:proofErr w:type="gramStart"/>
+      <w:r>
+        <w:rPr>
+          <w:rFonts w:ascii="Segoe UI" w:hAnsi="Segoe UI" w:cs="Segoe UI"/>
+          <w:color w:val="ECECF1"/>
+          <w:shd w:val="clear" w:color="auto" w:fill="343541"/>
+        </w:rPr>
+        <w:t>Контролировать</w:t>
+      </w:r>
+      <w:proofErr w:type="gramEnd"/>
+      <w:r>
+        <w:rPr>
+          <w:rFonts w:ascii="Segoe UI" w:hAnsi="Segoe UI" w:cs="Segoe UI"/>
+          <w:color w:val="ECECF1"/>
+          <w:shd w:val="clear" w:color="auto" w:fill="343541"/>
+        </w:rPr>
+        <w:t xml:space="preserve"> состояние архитектуры при разработке доработке прототипа </w:t>
+      </w:r>
+      <w:proofErr w:type="spellStart"/>
+      <w:r>
+        <w:rPr>
+          <w:rFonts w:ascii="Segoe UI" w:hAnsi="Segoe UI" w:cs="Segoe UI"/>
+          <w:color w:val="ECECF1"/>
+          <w:shd w:val="clear" w:color="auto" w:fill="343541"/>
+        </w:rPr>
+        <w:t>квестовой</w:t>
+      </w:r>
+      <w:proofErr w:type="spellEnd"/>
+      <w:r>
+        <w:rPr>
+          <w:rFonts w:ascii="Segoe UI" w:hAnsi="Segoe UI" w:cs="Segoe UI"/>
+          <w:color w:val="ECECF1"/>
+          <w:shd w:val="clear" w:color="auto" w:fill="343541"/>
+        </w:rPr>
+        <w:t xml:space="preserve"> системы. </w:t>
       </w:r>
     </w:p>
     <w:p>
@@ -1379,7 +1907,25 @@
           <w:color w:val="ECECF1"/>
           <w:shd w:val="clear" w:color="auto" w:fill="343541"/>
         </w:rPr>
-        <w:t>6 Готовиться к реализации системы торговли. Также как и второй этап достаточно длительный.</w:t>
+        <w:t xml:space="preserve">6 Готовиться к реализации системы торговли. </w:t>
+      </w:r>
+      <w:proofErr w:type="gramStart"/>
+      <w:r>
+        <w:rPr>
+          <w:rFonts w:ascii="Segoe UI" w:hAnsi="Segoe UI" w:cs="Segoe UI"/>
+          <w:color w:val="ECECF1"/>
+          <w:shd w:val="clear" w:color="auto" w:fill="343541"/>
+        </w:rPr>
+        <w:t>Также</w:t>
+      </w:r>
+      <w:proofErr w:type="gramEnd"/>
+      <w:r>
+        <w:rPr>
+          <w:rFonts w:ascii="Segoe UI" w:hAnsi="Segoe UI" w:cs="Segoe UI"/>
+          <w:color w:val="ECECF1"/>
+          <w:shd w:val="clear" w:color="auto" w:fill="343541"/>
+        </w:rPr>
+        <w:t xml:space="preserve"> как и второй этап достаточно длительный.</w:t>
       </w:r>
     </w:p>
     <w:p>
@@ -1480,7 +2026,25 @@
           <w:color w:val="ECECF1"/>
           <w:shd w:val="clear" w:color="auto" w:fill="343541"/>
         </w:rPr>
-        <w:t>4 Готовится к разработки системы торговли.</w:t>
+        <w:t xml:space="preserve">4 Готовится </w:t>
+      </w:r>
+      <w:proofErr w:type="gramStart"/>
+      <w:r>
+        <w:rPr>
+          <w:rFonts w:ascii="Segoe UI" w:hAnsi="Segoe UI" w:cs="Segoe UI"/>
+          <w:color w:val="ECECF1"/>
+          <w:shd w:val="clear" w:color="auto" w:fill="343541"/>
+        </w:rPr>
+        <w:t>к разработки</w:t>
+      </w:r>
+      <w:proofErr w:type="gramEnd"/>
+      <w:r>
+        <w:rPr>
+          <w:rFonts w:ascii="Segoe UI" w:hAnsi="Segoe UI" w:cs="Segoe UI"/>
+          <w:color w:val="ECECF1"/>
+          <w:shd w:val="clear" w:color="auto" w:fill="343541"/>
+        </w:rPr>
+        <w:t xml:space="preserve"> системы торговли.</w:t>
       </w:r>
     </w:p>
     <w:p>
@@ -1544,7 +2108,47 @@
           <w:color w:val="ECECF1"/>
           <w:shd w:val="clear" w:color="auto" w:fill="343541"/>
         </w:rPr>
-        <w:t xml:space="preserve">2 Нужно решить проблему связанную с отображением окна квест трекера, а именно проблема с отображением активного квеста, возможно стоит расширить квестовую систему еще одним событием которое будет информировать своих подписчиков о том что нужно обновить интерфейс. </w:t>
+        <w:t xml:space="preserve">2 Нужно решить </w:t>
+      </w:r>
+      <w:proofErr w:type="gramStart"/>
+      <w:r>
+        <w:rPr>
+          <w:rFonts w:ascii="Segoe UI" w:hAnsi="Segoe UI" w:cs="Segoe UI"/>
+          <w:strike/>
+          <w:color w:val="ECECF1"/>
+          <w:shd w:val="clear" w:color="auto" w:fill="343541"/>
+        </w:rPr>
+        <w:t>проблему</w:t>
+      </w:r>
+      <w:proofErr w:type="gramEnd"/>
+      <w:r>
+        <w:rPr>
+          <w:rFonts w:ascii="Segoe UI" w:hAnsi="Segoe UI" w:cs="Segoe UI"/>
+          <w:strike/>
+          <w:color w:val="ECECF1"/>
+          <w:shd w:val="clear" w:color="auto" w:fill="343541"/>
+        </w:rPr>
+        <w:t xml:space="preserve"> связанную с отображением окна квест </w:t>
+      </w:r>
+      <w:proofErr w:type="spellStart"/>
+      <w:r>
+        <w:rPr>
+          <w:rFonts w:ascii="Segoe UI" w:hAnsi="Segoe UI" w:cs="Segoe UI"/>
+          <w:strike/>
+          <w:color w:val="ECECF1"/>
+          <w:shd w:val="clear" w:color="auto" w:fill="343541"/>
+        </w:rPr>
+        <w:t>трекера</w:t>
+      </w:r>
+      <w:proofErr w:type="spellEnd"/>
+      <w:r>
+        <w:rPr>
+          <w:rFonts w:ascii="Segoe UI" w:hAnsi="Segoe UI" w:cs="Segoe UI"/>
+          <w:strike/>
+          <w:color w:val="ECECF1"/>
+          <w:shd w:val="clear" w:color="auto" w:fill="343541"/>
+        </w:rPr>
+        <w:t xml:space="preserve">, а именно проблема с отображением активного квеста, возможно стоит расширить квестовую систему еще одним событием которое будет информировать своих подписчиков о том что нужно обновить интерфейс. </w:t>
       </w:r>
     </w:p>
     <w:p>
@@ -1582,7 +2186,87 @@
           <w:color w:val="ECECF1"/>
           <w:shd w:val="clear" w:color="auto" w:fill="343541"/>
         </w:rPr>
-        <w:t xml:space="preserve">4 Просмотреть структуру PlayerProgressService, а также компонентов: IPlayerProgressUpdater, IPlayerProgressLoader. Как минимум нужно обновить нейминг, возможно придётся модифицировать структуру. </w:t>
+        <w:t xml:space="preserve">4 Просмотреть структуру </w:t>
+      </w:r>
+      <w:proofErr w:type="spellStart"/>
+      <w:r>
+        <w:rPr>
+          <w:rFonts w:ascii="Segoe UI" w:hAnsi="Segoe UI" w:cs="Segoe UI"/>
+          <w:strike/>
+          <w:color w:val="ECECF1"/>
+          <w:shd w:val="clear" w:color="auto" w:fill="343541"/>
+        </w:rPr>
+        <w:t>PlayerProgressService</w:t>
+      </w:r>
+      <w:proofErr w:type="spellEnd"/>
+      <w:r>
+        <w:rPr>
+          <w:rFonts w:ascii="Segoe UI" w:hAnsi="Segoe UI" w:cs="Segoe UI"/>
+          <w:strike/>
+          <w:color w:val="ECECF1"/>
+          <w:shd w:val="clear" w:color="auto" w:fill="343541"/>
+        </w:rPr>
+        <w:t xml:space="preserve">, а также компонентов: </w:t>
+      </w:r>
+      <w:proofErr w:type="spellStart"/>
+      <w:r>
+        <w:rPr>
+          <w:rFonts w:ascii="Segoe UI" w:hAnsi="Segoe UI" w:cs="Segoe UI"/>
+          <w:strike/>
+          <w:color w:val="ECECF1"/>
+          <w:shd w:val="clear" w:color="auto" w:fill="343541"/>
+        </w:rPr>
+        <w:t>IPlayerProgressUpdater</w:t>
+      </w:r>
+      <w:proofErr w:type="spellEnd"/>
+      <w:r>
+        <w:rPr>
+          <w:rFonts w:ascii="Segoe UI" w:hAnsi="Segoe UI" w:cs="Segoe UI"/>
+          <w:strike/>
+          <w:color w:val="ECECF1"/>
+          <w:shd w:val="clear" w:color="auto" w:fill="343541"/>
+        </w:rPr>
+        <w:t xml:space="preserve">, </w:t>
+      </w:r>
+      <w:proofErr w:type="spellStart"/>
+      <w:r>
+        <w:rPr>
+          <w:rFonts w:ascii="Segoe UI" w:hAnsi="Segoe UI" w:cs="Segoe UI"/>
+          <w:strike/>
+          <w:color w:val="ECECF1"/>
+          <w:shd w:val="clear" w:color="auto" w:fill="343541"/>
+        </w:rPr>
+        <w:t>IPlayerProgressLoader</w:t>
+      </w:r>
+      <w:proofErr w:type="spellEnd"/>
+      <w:r>
+        <w:rPr>
+          <w:rFonts w:ascii="Segoe UI" w:hAnsi="Segoe UI" w:cs="Segoe UI"/>
+          <w:strike/>
+          <w:color w:val="ECECF1"/>
+          <w:shd w:val="clear" w:color="auto" w:fill="343541"/>
+        </w:rPr>
+        <w:t xml:space="preserve">. Как минимум нужно обновить </w:t>
+      </w:r>
+      <w:proofErr w:type="spellStart"/>
+      <w:r>
+        <w:rPr>
+          <w:rFonts w:ascii="Segoe UI" w:hAnsi="Segoe UI" w:cs="Segoe UI"/>
+          <w:strike/>
+          <w:color w:val="ECECF1"/>
+          <w:shd w:val="clear" w:color="auto" w:fill="343541"/>
+        </w:rPr>
+        <w:t>нейминг</w:t>
+      </w:r>
+      <w:proofErr w:type="spellEnd"/>
+      <w:r>
+        <w:rPr>
+          <w:rFonts w:ascii="Segoe UI" w:hAnsi="Segoe UI" w:cs="Segoe UI"/>
+          <w:strike/>
+          <w:color w:val="ECECF1"/>
+          <w:shd w:val="clear" w:color="auto" w:fill="343541"/>
+        </w:rPr>
+        <w:t xml:space="preserve">, возможно придётся модифицировать структуру. </w:t>
       </w:r>
     </w:p>
     <w:p>
@@ -1777,13 +2461,10 @@
           <w:szCs w:val="21"/>
           <w:lang w:eastAsia="ru-RU"/>
         </w:rPr>
-        <w:t xml:space="preserve">4 Окно стат для игрока, которое будет отображать его текущий уровень, опыт (текущий и сколько нужно для следующего уровня). </w:t>
-      </w:r>
-    </w:p>
-    <w:p>
-      <w:pPr>
-        <w:shd w:val="clear" w:color="auto" w:fill="343541"/>
-        <w:spacing w:after="100" w:line="240" w:lineRule="auto"/>
+        <w:t xml:space="preserve">4 Окно </w:t>
+      </w:r>
+      <w:proofErr w:type="spellStart"/>
+      <w:r>
         <w:rPr>
           <w:rFonts w:ascii="Segoe UI" w:eastAsia="Times New Roman" w:hAnsi="Segoe UI" w:cs="Segoe UI"/>
           <w:strike/>
@@ -1791,7 +2472,9 @@
           <w:szCs w:val="21"/>
           <w:lang w:eastAsia="ru-RU"/>
         </w:rPr>
-      </w:pPr>
+        <w:t>стат</w:t>
+      </w:r>
+      <w:proofErr w:type="spellEnd"/>
       <w:r>
         <w:rPr>
           <w:rFonts w:ascii="Segoe UI" w:eastAsia="Times New Roman" w:hAnsi="Segoe UI" w:cs="Segoe UI"/>
@@ -1800,7 +2483,7 @@
           <w:szCs w:val="21"/>
           <w:lang w:eastAsia="ru-RU"/>
         </w:rPr>
-        <w:t xml:space="preserve">5 Работать над прототипом разноуровневых мобов. Возможно прикрутить какой-то райдомазер для создания различных конфигураций мобов. </w:t>
+        <w:t xml:space="preserve"> для игрока, которое будет отображать его текущий уровень, опыт (текущий и сколько нужно для следующего уровня). </w:t>
       </w:r>
     </w:p>
     <w:p>
@@ -1823,6 +2506,73 @@
           <w:szCs w:val="21"/>
           <w:lang w:eastAsia="ru-RU"/>
         </w:rPr>
+        <w:t xml:space="preserve">5 Работать над прототипом </w:t>
+      </w:r>
+      <w:proofErr w:type="spellStart"/>
+      <w:r>
+        <w:rPr>
+          <w:rFonts w:ascii="Segoe UI" w:eastAsia="Times New Roman" w:hAnsi="Segoe UI" w:cs="Segoe UI"/>
+          <w:strike/>
+          <w:sz w:val="21"/>
+          <w:szCs w:val="21"/>
+          <w:lang w:eastAsia="ru-RU"/>
+        </w:rPr>
+        <w:t>разноуровневых</w:t>
+      </w:r>
+      <w:proofErr w:type="spellEnd"/>
+      <w:r>
+        <w:rPr>
+          <w:rFonts w:ascii="Segoe UI" w:eastAsia="Times New Roman" w:hAnsi="Segoe UI" w:cs="Segoe UI"/>
+          <w:strike/>
+          <w:sz w:val="21"/>
+          <w:szCs w:val="21"/>
+          <w:lang w:eastAsia="ru-RU"/>
+        </w:rPr>
+        <w:t xml:space="preserve"> мобов. Возможно прикрутить какой-то </w:t>
+      </w:r>
+      <w:proofErr w:type="spellStart"/>
+      <w:r>
+        <w:rPr>
+          <w:rFonts w:ascii="Segoe UI" w:eastAsia="Times New Roman" w:hAnsi="Segoe UI" w:cs="Segoe UI"/>
+          <w:strike/>
+          <w:sz w:val="21"/>
+          <w:szCs w:val="21"/>
+          <w:lang w:eastAsia="ru-RU"/>
+        </w:rPr>
+        <w:t>райдомазер</w:t>
+      </w:r>
+      <w:proofErr w:type="spellEnd"/>
+      <w:r>
+        <w:rPr>
+          <w:rFonts w:ascii="Segoe UI" w:eastAsia="Times New Roman" w:hAnsi="Segoe UI" w:cs="Segoe UI"/>
+          <w:strike/>
+          <w:sz w:val="21"/>
+          <w:szCs w:val="21"/>
+          <w:lang w:eastAsia="ru-RU"/>
+        </w:rPr>
+        <w:t xml:space="preserve"> для создания различных конфигураций мобов. </w:t>
+      </w:r>
+    </w:p>
+    <w:p>
+      <w:pPr>
+        <w:shd w:val="clear" w:color="auto" w:fill="343541"/>
+        <w:spacing w:after="100" w:line="240" w:lineRule="auto"/>
+        <w:rPr>
+          <w:rFonts w:ascii="Segoe UI" w:eastAsia="Times New Roman" w:hAnsi="Segoe UI" w:cs="Segoe UI"/>
+          <w:strike/>
+          <w:sz w:val="21"/>
+          <w:szCs w:val="21"/>
+          <w:lang w:eastAsia="ru-RU"/>
+        </w:rPr>
+      </w:pPr>
+      <w:r>
+        <w:rPr>
+          <w:rFonts w:ascii="Segoe UI" w:eastAsia="Times New Roman" w:hAnsi="Segoe UI" w:cs="Segoe UI"/>
+          <w:strike/>
+          <w:sz w:val="21"/>
+          <w:szCs w:val="21"/>
+          <w:lang w:eastAsia="ru-RU"/>
+        </w:rPr>
         <w:t>6 Внедрять прототип в игру.</w:t>
       </w:r>
     </w:p>
@@ -1936,7 +2686,43 @@
           <w:color w:val="ECECF1"/>
           <w:shd w:val="clear" w:color="auto" w:fill="343541"/>
         </w:rPr>
-        <w:t xml:space="preserve">4 Обновить UI для системы квестов, стат, скиллов. Он слишком огромный нужно сделать поменьше. В общем подогнать размеры. </w:t>
+        <w:t xml:space="preserve">4 Обновить UI для системы квестов, </w:t>
+      </w:r>
+      <w:proofErr w:type="spellStart"/>
+      <w:r>
+        <w:rPr>
+          <w:rFonts w:ascii="Segoe UI" w:hAnsi="Segoe UI" w:cs="Segoe UI"/>
+          <w:color w:val="ECECF1"/>
+          <w:shd w:val="clear" w:color="auto" w:fill="343541"/>
+        </w:rPr>
+        <w:t>стат</w:t>
+      </w:r>
+      <w:proofErr w:type="spellEnd"/>
+      <w:r>
+        <w:rPr>
+          <w:rFonts w:ascii="Segoe UI" w:hAnsi="Segoe UI" w:cs="Segoe UI"/>
+          <w:color w:val="ECECF1"/>
+          <w:shd w:val="clear" w:color="auto" w:fill="343541"/>
+        </w:rPr>
+        <w:t xml:space="preserve">, </w:t>
+      </w:r>
+      <w:proofErr w:type="spellStart"/>
+      <w:r>
+        <w:rPr>
+          <w:rFonts w:ascii="Segoe UI" w:hAnsi="Segoe UI" w:cs="Segoe UI"/>
+          <w:color w:val="ECECF1"/>
+          <w:shd w:val="clear" w:color="auto" w:fill="343541"/>
+        </w:rPr>
+        <w:t>скиллов</w:t>
+      </w:r>
+      <w:proofErr w:type="spellEnd"/>
+      <w:r>
+        <w:rPr>
+          <w:rFonts w:ascii="Segoe UI" w:hAnsi="Segoe UI" w:cs="Segoe UI"/>
+          <w:color w:val="ECECF1"/>
+          <w:shd w:val="clear" w:color="auto" w:fill="343541"/>
+        </w:rPr>
+        <w:t xml:space="preserve">. Он слишком огромный нужно сделать поменьше. В общем подогнать размеры. </w:t>
       </w:r>
     </w:p>
     <w:p>
@@ -2005,24 +2791,96 @@
           <w:color w:val="ECECF1"/>
           <w:shd w:val="clear" w:color="auto" w:fill="343541"/>
         </w:rPr>
-        <w:t xml:space="preserve">1 Создать компонент для центрелизованого управления UI. Впервую очередь компонент должен быть гибким и легко расширяемым. </w:t>
-      </w:r>
-    </w:p>
-    <w:p>
-      <w:pPr>
-        <w:rPr>
-          <w:rFonts w:ascii="Segoe UI" w:hAnsi="Segoe UI" w:cs="Segoe UI"/>
-          <w:color w:val="ECECF1"/>
-          <w:shd w:val="clear" w:color="auto" w:fill="343541"/>
-        </w:rPr>
-      </w:pPr>
-      <w:r>
-        <w:rPr>
-          <w:rFonts w:ascii="Segoe UI" w:hAnsi="Segoe UI" w:cs="Segoe UI"/>
-          <w:color w:val="ECECF1"/>
-          <w:shd w:val="clear" w:color="auto" w:fill="343541"/>
-        </w:rPr>
-        <w:t xml:space="preserve">2 Создать компонент который расширит возможности для системы взаимодействия, и позволит игроку делать выбор какой именно тип взаимодействия желает получить игрок если таких типов взаимодействия являеться несколько например: диалог и торговля. </w:t>
+        <w:t xml:space="preserve">1 Создать компонент для </w:t>
+      </w:r>
+      <w:proofErr w:type="spellStart"/>
+      <w:r>
+        <w:rPr>
+          <w:rFonts w:ascii="Segoe UI" w:hAnsi="Segoe UI" w:cs="Segoe UI"/>
+          <w:color w:val="ECECF1"/>
+          <w:shd w:val="clear" w:color="auto" w:fill="343541"/>
+        </w:rPr>
+        <w:t>центрелизованого</w:t>
+      </w:r>
+      <w:proofErr w:type="spellEnd"/>
+      <w:r>
+        <w:rPr>
+          <w:rFonts w:ascii="Segoe UI" w:hAnsi="Segoe UI" w:cs="Segoe UI"/>
+          <w:color w:val="ECECF1"/>
+          <w:shd w:val="clear" w:color="auto" w:fill="343541"/>
+        </w:rPr>
+        <w:t xml:space="preserve"> управления UI. </w:t>
+      </w:r>
+      <w:proofErr w:type="spellStart"/>
+      <w:r>
+        <w:rPr>
+          <w:rFonts w:ascii="Segoe UI" w:hAnsi="Segoe UI" w:cs="Segoe UI"/>
+          <w:color w:val="ECECF1"/>
+          <w:shd w:val="clear" w:color="auto" w:fill="343541"/>
+        </w:rPr>
+        <w:t>Впервую</w:t>
+      </w:r>
+      <w:proofErr w:type="spellEnd"/>
+      <w:r>
+        <w:rPr>
+          <w:rFonts w:ascii="Segoe UI" w:hAnsi="Segoe UI" w:cs="Segoe UI"/>
+          <w:color w:val="ECECF1"/>
+          <w:shd w:val="clear" w:color="auto" w:fill="343541"/>
+        </w:rPr>
+        <w:t xml:space="preserve"> очередь компонент должен быть гибким и легко расширяемым. </w:t>
+      </w:r>
+    </w:p>
+    <w:p>
+      <w:pPr>
+        <w:rPr>
+          <w:rFonts w:ascii="Segoe UI" w:hAnsi="Segoe UI" w:cs="Segoe UI"/>
+          <w:color w:val="ECECF1"/>
+          <w:shd w:val="clear" w:color="auto" w:fill="343541"/>
+        </w:rPr>
+      </w:pPr>
+      <w:r>
+        <w:rPr>
+          <w:rFonts w:ascii="Segoe UI" w:hAnsi="Segoe UI" w:cs="Segoe UI"/>
+          <w:color w:val="ECECF1"/>
+          <w:shd w:val="clear" w:color="auto" w:fill="343541"/>
+        </w:rPr>
+        <w:t xml:space="preserve">2 Создать </w:t>
+      </w:r>
+      <w:proofErr w:type="gramStart"/>
+      <w:r>
+        <w:rPr>
+          <w:rFonts w:ascii="Segoe UI" w:hAnsi="Segoe UI" w:cs="Segoe UI"/>
+          <w:color w:val="ECECF1"/>
+          <w:shd w:val="clear" w:color="auto" w:fill="343541"/>
+        </w:rPr>
+        <w:t>компонент</w:t>
+      </w:r>
+      <w:proofErr w:type="gramEnd"/>
+      <w:r>
+        <w:rPr>
+          <w:rFonts w:ascii="Segoe UI" w:hAnsi="Segoe UI" w:cs="Segoe UI"/>
+          <w:color w:val="ECECF1"/>
+          <w:shd w:val="clear" w:color="auto" w:fill="343541"/>
+        </w:rPr>
+        <w:t xml:space="preserve"> который расширит возможности для системы взаимодействия, и позволит игроку делать выбор какой именно тип взаимодействия желает получить игрок если таких типов взаимодействия </w:t>
+      </w:r>
+      <w:proofErr w:type="spellStart"/>
+      <w:r>
+        <w:rPr>
+          <w:rFonts w:ascii="Segoe UI" w:hAnsi="Segoe UI" w:cs="Segoe UI"/>
+          <w:color w:val="ECECF1"/>
+          <w:shd w:val="clear" w:color="auto" w:fill="343541"/>
+        </w:rPr>
+        <w:t>являеться</w:t>
+      </w:r>
+      <w:proofErr w:type="spellEnd"/>
+      <w:r>
+        <w:rPr>
+          <w:rFonts w:ascii="Segoe UI" w:hAnsi="Segoe UI" w:cs="Segoe UI"/>
+          <w:color w:val="ECECF1"/>
+          <w:shd w:val="clear" w:color="auto" w:fill="343541"/>
+        </w:rPr>
+        <w:t xml:space="preserve"> несколько например: диалог и торговля. </w:t>
       </w:r>
     </w:p>
     <w:p>
@@ -2056,7 +2914,25 @@
           <w:color w:val="ECECF1"/>
           <w:shd w:val="clear" w:color="auto" w:fill="343541"/>
         </w:rPr>
-        <w:t xml:space="preserve">4 Обновить UI для систем стат, и прокачки. </w:t>
+        <w:t xml:space="preserve">4 Обновить UI для систем </w:t>
+      </w:r>
+      <w:proofErr w:type="spellStart"/>
+      <w:r>
+        <w:rPr>
+          <w:rFonts w:ascii="Segoe UI" w:hAnsi="Segoe UI" w:cs="Segoe UI"/>
+          <w:color w:val="ECECF1"/>
+          <w:shd w:val="clear" w:color="auto" w:fill="343541"/>
+        </w:rPr>
+        <w:t>стат</w:t>
+      </w:r>
+      <w:proofErr w:type="spellEnd"/>
+      <w:r>
+        <w:rPr>
+          <w:rFonts w:ascii="Segoe UI" w:hAnsi="Segoe UI" w:cs="Segoe UI"/>
+          <w:color w:val="ECECF1"/>
+          <w:shd w:val="clear" w:color="auto" w:fill="343541"/>
+        </w:rPr>
+        <w:t xml:space="preserve">, и прокачки. </w:t>
       </w:r>
     </w:p>
     <w:p>
@@ -2127,7 +3003,27 @@
           <w:color w:val="ECECF1"/>
           <w:shd w:val="clear" w:color="auto" w:fill="343541"/>
         </w:rPr>
-        <w:t>1 Добавить функционал который будет сохранять текущее количество денег игрока в файл сохранения.</w:t>
+        <w:t xml:space="preserve">1 Добавить </w:t>
+      </w:r>
+      <w:proofErr w:type="gramStart"/>
+      <w:r>
+        <w:rPr>
+          <w:rFonts w:ascii="Segoe UI" w:hAnsi="Segoe UI" w:cs="Segoe UI"/>
+          <w:strike/>
+          <w:color w:val="ECECF1"/>
+          <w:shd w:val="clear" w:color="auto" w:fill="343541"/>
+        </w:rPr>
+        <w:t>функционал</w:t>
+      </w:r>
+      <w:proofErr w:type="gramEnd"/>
+      <w:r>
+        <w:rPr>
+          <w:rFonts w:ascii="Segoe UI" w:hAnsi="Segoe UI" w:cs="Segoe UI"/>
+          <w:strike/>
+          <w:color w:val="ECECF1"/>
+          <w:shd w:val="clear" w:color="auto" w:fill="343541"/>
+        </w:rPr>
+        <w:t xml:space="preserve"> который будет сохранять текущее количество денег игрока в файл сохранения.</w:t>
       </w:r>
     </w:p>
     <w:p>
@@ -2242,24 +3138,80 @@
           <w:shd w:val="clear" w:color="auto" w:fill="343541"/>
         </w:rPr>
         <w:lastRenderedPageBreak/>
-        <w:t>7 Натянуть анимации на мобов.</w:t>
-      </w:r>
-    </w:p>
-    <w:p>
-      <w:pPr>
-        <w:rPr>
-          <w:rFonts w:ascii="Segoe UI" w:hAnsi="Segoe UI" w:cs="Segoe UI"/>
-          <w:color w:val="ECECF1"/>
-          <w:shd w:val="clear" w:color="auto" w:fill="343541"/>
-        </w:rPr>
-      </w:pPr>
-      <w:r>
-        <w:rPr>
-          <w:rFonts w:ascii="Segoe UI" w:hAnsi="Segoe UI" w:cs="Segoe UI"/>
-          <w:color w:val="ECECF1"/>
-          <w:shd w:val="clear" w:color="auto" w:fill="343541"/>
-        </w:rPr>
-        <w:t>8 Думать как можно организовать рандомную генерацию мира, и начать работу над прототипом рандомной генерации.</w:t>
+        <w:t xml:space="preserve">7 Натянуть анимации </w:t>
+      </w:r>
+      <w:proofErr w:type="gramStart"/>
+      <w:r>
+        <w:rPr>
+          <w:rFonts w:ascii="Segoe UI" w:hAnsi="Segoe UI" w:cs="Segoe UI"/>
+          <w:strike/>
+          <w:color w:val="ECECF1"/>
+          <w:shd w:val="clear" w:color="auto" w:fill="343541"/>
+        </w:rPr>
+        <w:t>на мобов</w:t>
+      </w:r>
+      <w:proofErr w:type="gramEnd"/>
+      <w:r>
+        <w:rPr>
+          <w:rFonts w:ascii="Segoe UI" w:hAnsi="Segoe UI" w:cs="Segoe UI"/>
+          <w:strike/>
+          <w:color w:val="ECECF1"/>
+          <w:shd w:val="clear" w:color="auto" w:fill="343541"/>
+        </w:rPr>
+        <w:t>.</w:t>
+      </w:r>
+    </w:p>
+    <w:p>
+      <w:pPr>
+        <w:rPr>
+          <w:rFonts w:ascii="Segoe UI" w:hAnsi="Segoe UI" w:cs="Segoe UI"/>
+          <w:color w:val="ECECF1"/>
+          <w:shd w:val="clear" w:color="auto" w:fill="343541"/>
+        </w:rPr>
+      </w:pPr>
+      <w:r>
+        <w:rPr>
+          <w:rFonts w:ascii="Segoe UI" w:hAnsi="Segoe UI" w:cs="Segoe UI"/>
+          <w:color w:val="ECECF1"/>
+          <w:shd w:val="clear" w:color="auto" w:fill="343541"/>
+        </w:rPr>
+        <w:t xml:space="preserve">8 </w:t>
+      </w:r>
+      <w:proofErr w:type="gramStart"/>
+      <w:r>
+        <w:rPr>
+          <w:rFonts w:ascii="Segoe UI" w:hAnsi="Segoe UI" w:cs="Segoe UI"/>
+          <w:color w:val="ECECF1"/>
+          <w:shd w:val="clear" w:color="auto" w:fill="343541"/>
+        </w:rPr>
+        <w:t>Думать</w:t>
+      </w:r>
+      <w:proofErr w:type="gramEnd"/>
+      <w:r>
+        <w:rPr>
+          <w:rFonts w:ascii="Segoe UI" w:hAnsi="Segoe UI" w:cs="Segoe UI"/>
+          <w:color w:val="ECECF1"/>
+          <w:shd w:val="clear" w:color="auto" w:fill="343541"/>
+        </w:rPr>
+        <w:t xml:space="preserve"> как можно организовать рандомную генерацию мира, и начать работу над прототипом </w:t>
+      </w:r>
+      <w:proofErr w:type="spellStart"/>
+      <w:r>
+        <w:rPr>
+          <w:rFonts w:ascii="Segoe UI" w:hAnsi="Segoe UI" w:cs="Segoe UI"/>
+          <w:color w:val="ECECF1"/>
+          <w:shd w:val="clear" w:color="auto" w:fill="343541"/>
+        </w:rPr>
+        <w:t>рандомной</w:t>
+      </w:r>
+      <w:proofErr w:type="spellEnd"/>
+      <w:r>
+        <w:rPr>
+          <w:rFonts w:ascii="Segoe UI" w:hAnsi="Segoe UI" w:cs="Segoe UI"/>
+          <w:color w:val="ECECF1"/>
+          <w:shd w:val="clear" w:color="auto" w:fill="343541"/>
+        </w:rPr>
+        <w:t xml:space="preserve"> генерации.</w:t>
       </w:r>
     </w:p>
     <w:p>
@@ -2304,26 +3256,208 @@
           <w:color w:val="ECECF1"/>
           <w:shd w:val="clear" w:color="auto" w:fill="343541"/>
         </w:rPr>
-        <w:t xml:space="preserve">1 Исправить систему хранилища игровых предметов. Основная проблема состоит в том что система хранилища была доработана для системы торговли после ее первого создания, что добавило баг. Суть проблемы в том что система торговли оперирует(помещает и извлекает предметы) с хранилищем на самом низком уровне, в то время как часть функционала который занимается обновлением UI инвентаря игрока находится на более высоком уровне, что привело к тому что инвентарь не обновляется после покупки продажи предметов. </w:t>
-      </w:r>
-    </w:p>
-    <w:p>
-      <w:pPr>
-        <w:rPr>
-          <w:rFonts w:ascii="Segoe UI" w:hAnsi="Segoe UI" w:cs="Segoe UI"/>
-          <w:strike/>
-          <w:color w:val="ECECF1"/>
-          <w:shd w:val="clear" w:color="auto" w:fill="343541"/>
-        </w:rPr>
-      </w:pPr>
-      <w:r>
-        <w:rPr>
-          <w:rFonts w:ascii="Segoe UI" w:hAnsi="Segoe UI" w:cs="Segoe UI"/>
-          <w:strike/>
-          <w:color w:val="ECECF1"/>
-          <w:shd w:val="clear" w:color="auto" w:fill="343541"/>
-        </w:rPr>
-        <w:t xml:space="preserve">2 Следующая проблемы являются комплекснимы но их я хочу разбить на несколько пунктов. Суть проблемы можно выразить словосочетанием технический долг. Так как было добавленно несколько различных подсистем в игру появляются некоторые сложности в управлении проекта из-за того что все раскиданно по всему проекту. Нужно навести порядок. Нужно навести порядок с префабами, это касается только структуры проекта. Особенно нужно обратить внимание на UI префабы потому-что их порой приходится искать там где их не должно быть. </w:t>
+        <w:t xml:space="preserve">1 Исправить систему хранилища игровых предметов. Основная проблема состоит в </w:t>
+      </w:r>
+      <w:proofErr w:type="gramStart"/>
+      <w:r>
+        <w:rPr>
+          <w:rFonts w:ascii="Segoe UI" w:hAnsi="Segoe UI" w:cs="Segoe UI"/>
+          <w:strike/>
+          <w:color w:val="ECECF1"/>
+          <w:shd w:val="clear" w:color="auto" w:fill="343541"/>
+        </w:rPr>
+        <w:t>том</w:t>
+      </w:r>
+      <w:proofErr w:type="gramEnd"/>
+      <w:r>
+        <w:rPr>
+          <w:rFonts w:ascii="Segoe UI" w:hAnsi="Segoe UI" w:cs="Segoe UI"/>
+          <w:strike/>
+          <w:color w:val="ECECF1"/>
+          <w:shd w:val="clear" w:color="auto" w:fill="343541"/>
+        </w:rPr>
+        <w:t xml:space="preserve"> что система хранилища была доработана для системы торговли после ее первого создания, что добавило баг. Суть проблемы в том что система торговли </w:t>
+      </w:r>
+      <w:proofErr w:type="gramStart"/>
+      <w:r>
+        <w:rPr>
+          <w:rFonts w:ascii="Segoe UI" w:hAnsi="Segoe UI" w:cs="Segoe UI"/>
+          <w:strike/>
+          <w:color w:val="ECECF1"/>
+          <w:shd w:val="clear" w:color="auto" w:fill="343541"/>
+        </w:rPr>
+        <w:t>оперирует(</w:t>
+      </w:r>
+      <w:proofErr w:type="gramEnd"/>
+      <w:r>
+        <w:rPr>
+          <w:rFonts w:ascii="Segoe UI" w:hAnsi="Segoe UI" w:cs="Segoe UI"/>
+          <w:strike/>
+          <w:color w:val="ECECF1"/>
+          <w:shd w:val="clear" w:color="auto" w:fill="343541"/>
+        </w:rPr>
+        <w:t xml:space="preserve">помещает и извлекает предметы) с хранилищем на самом низком уровне, в то время как часть функционала который занимается обновлением UI инвентаря игрока находится на более высоком уровне, что привело к тому что инвентарь не обновляется после покупки продажи предметов. </w:t>
+      </w:r>
+    </w:p>
+    <w:p>
+      <w:pPr>
+        <w:rPr>
+          <w:rFonts w:ascii="Segoe UI" w:hAnsi="Segoe UI" w:cs="Segoe UI"/>
+          <w:strike/>
+          <w:color w:val="ECECF1"/>
+          <w:shd w:val="clear" w:color="auto" w:fill="343541"/>
+        </w:rPr>
+      </w:pPr>
+      <w:r>
+        <w:rPr>
+          <w:rFonts w:ascii="Segoe UI" w:hAnsi="Segoe UI" w:cs="Segoe UI"/>
+          <w:strike/>
+          <w:color w:val="ECECF1"/>
+          <w:shd w:val="clear" w:color="auto" w:fill="343541"/>
+        </w:rPr>
+        <w:t xml:space="preserve">2 Следующая проблемы являются </w:t>
+      </w:r>
+      <w:proofErr w:type="spellStart"/>
+      <w:proofErr w:type="gramStart"/>
+      <w:r>
+        <w:rPr>
+          <w:rFonts w:ascii="Segoe UI" w:hAnsi="Segoe UI" w:cs="Segoe UI"/>
+          <w:strike/>
+          <w:color w:val="ECECF1"/>
+          <w:shd w:val="clear" w:color="auto" w:fill="343541"/>
+        </w:rPr>
+        <w:t>комплекснимы</w:t>
+      </w:r>
+      <w:proofErr w:type="spellEnd"/>
+      <w:proofErr w:type="gramEnd"/>
+      <w:r>
+        <w:rPr>
+          <w:rFonts w:ascii="Segoe UI" w:hAnsi="Segoe UI" w:cs="Segoe UI"/>
+          <w:strike/>
+          <w:color w:val="ECECF1"/>
+          <w:shd w:val="clear" w:color="auto" w:fill="343541"/>
+        </w:rPr>
+        <w:t xml:space="preserve"> но их я хочу разбить на несколько пунктов. Суть проблемы можно выразить словосочетанием технический долг. Так как было </w:t>
+      </w:r>
+      <w:proofErr w:type="spellStart"/>
+      <w:r>
+        <w:rPr>
+          <w:rFonts w:ascii="Segoe UI" w:hAnsi="Segoe UI" w:cs="Segoe UI"/>
+          <w:strike/>
+          <w:color w:val="ECECF1"/>
+          <w:shd w:val="clear" w:color="auto" w:fill="343541"/>
+        </w:rPr>
+        <w:t>добавленно</w:t>
+      </w:r>
+      <w:proofErr w:type="spellEnd"/>
+      <w:r>
+        <w:rPr>
+          <w:rFonts w:ascii="Segoe UI" w:hAnsi="Segoe UI" w:cs="Segoe UI"/>
+          <w:strike/>
+          <w:color w:val="ECECF1"/>
+          <w:shd w:val="clear" w:color="auto" w:fill="343541"/>
+        </w:rPr>
+        <w:t xml:space="preserve"> несколько различных подсистем в игру появляются некоторые сложности в управлении проекта </w:t>
+      </w:r>
+      <w:proofErr w:type="gramStart"/>
+      <w:r>
+        <w:rPr>
+          <w:rFonts w:ascii="Segoe UI" w:hAnsi="Segoe UI" w:cs="Segoe UI"/>
+          <w:strike/>
+          <w:color w:val="ECECF1"/>
+          <w:shd w:val="clear" w:color="auto" w:fill="343541"/>
+        </w:rPr>
+        <w:t>из-за того что</w:t>
+      </w:r>
+      <w:proofErr w:type="gramEnd"/>
+      <w:r>
+        <w:rPr>
+          <w:rFonts w:ascii="Segoe UI" w:hAnsi="Segoe UI" w:cs="Segoe UI"/>
+          <w:strike/>
+          <w:color w:val="ECECF1"/>
+          <w:shd w:val="clear" w:color="auto" w:fill="343541"/>
+        </w:rPr>
+        <w:t xml:space="preserve"> все </w:t>
+      </w:r>
+      <w:proofErr w:type="spellStart"/>
+      <w:r>
+        <w:rPr>
+          <w:rFonts w:ascii="Segoe UI" w:hAnsi="Segoe UI" w:cs="Segoe UI"/>
+          <w:strike/>
+          <w:color w:val="ECECF1"/>
+          <w:shd w:val="clear" w:color="auto" w:fill="343541"/>
+        </w:rPr>
+        <w:t>раскиданно</w:t>
+      </w:r>
+      <w:proofErr w:type="spellEnd"/>
+      <w:r>
+        <w:rPr>
+          <w:rFonts w:ascii="Segoe UI" w:hAnsi="Segoe UI" w:cs="Segoe UI"/>
+          <w:strike/>
+          <w:color w:val="ECECF1"/>
+          <w:shd w:val="clear" w:color="auto" w:fill="343541"/>
+        </w:rPr>
+        <w:t xml:space="preserve"> по всему проекту. Нужно навести порядок. Нужно навести порядок с </w:t>
+      </w:r>
+      <w:proofErr w:type="spellStart"/>
+      <w:r>
+        <w:rPr>
+          <w:rFonts w:ascii="Segoe UI" w:hAnsi="Segoe UI" w:cs="Segoe UI"/>
+          <w:strike/>
+          <w:color w:val="ECECF1"/>
+          <w:shd w:val="clear" w:color="auto" w:fill="343541"/>
+        </w:rPr>
+        <w:t>префабами</w:t>
+      </w:r>
+      <w:proofErr w:type="spellEnd"/>
+      <w:r>
+        <w:rPr>
+          <w:rFonts w:ascii="Segoe UI" w:hAnsi="Segoe UI" w:cs="Segoe UI"/>
+          <w:strike/>
+          <w:color w:val="ECECF1"/>
+          <w:shd w:val="clear" w:color="auto" w:fill="343541"/>
+        </w:rPr>
+        <w:t xml:space="preserve">, это касается только структуры проекта. Особенно нужно обратить внимание на UI префабы </w:t>
+      </w:r>
+      <w:proofErr w:type="spellStart"/>
+      <w:r>
+        <w:rPr>
+          <w:rFonts w:ascii="Segoe UI" w:hAnsi="Segoe UI" w:cs="Segoe UI"/>
+          <w:strike/>
+          <w:color w:val="ECECF1"/>
+          <w:shd w:val="clear" w:color="auto" w:fill="343541"/>
+        </w:rPr>
+        <w:t>потому-что</w:t>
+      </w:r>
+      <w:proofErr w:type="spellEnd"/>
+      <w:r>
+        <w:rPr>
+          <w:rFonts w:ascii="Segoe UI" w:hAnsi="Segoe UI" w:cs="Segoe UI"/>
+          <w:strike/>
+          <w:color w:val="ECECF1"/>
+          <w:shd w:val="clear" w:color="auto" w:fill="343541"/>
+        </w:rPr>
+        <w:t xml:space="preserve"> их порой приходится искать </w:t>
+      </w:r>
+      <w:proofErr w:type="gramStart"/>
+      <w:r>
+        <w:rPr>
+          <w:rFonts w:ascii="Segoe UI" w:hAnsi="Segoe UI" w:cs="Segoe UI"/>
+          <w:strike/>
+          <w:color w:val="ECECF1"/>
+          <w:shd w:val="clear" w:color="auto" w:fill="343541"/>
+        </w:rPr>
+        <w:t>там где</w:t>
+      </w:r>
+      <w:proofErr w:type="gramEnd"/>
+      <w:r>
+        <w:rPr>
+          <w:rFonts w:ascii="Segoe UI" w:hAnsi="Segoe UI" w:cs="Segoe UI"/>
+          <w:strike/>
+          <w:color w:val="ECECF1"/>
+          <w:shd w:val="clear" w:color="auto" w:fill="343541"/>
+        </w:rPr>
+        <w:t xml:space="preserve"> их не должно быть. </w:t>
       </w:r>
     </w:p>
     <w:p>
@@ -2359,24 +3493,276 @@
           <w:color w:val="ECECF1"/>
           <w:shd w:val="clear" w:color="auto" w:fill="343541"/>
         </w:rPr>
-        <w:t xml:space="preserve">4 Паралельно хочу запустить в разработку прототип новой боевой системы, который позволит улучшить текущую, точного представления то как она должна выглядеть нету, во время прототипирования надеюсь что найду хороший вариант. Зачем обновлять эту механику? Все просто если посмотреть на мой текущий проект то основная часть геймплея это бои, а текущая боевка мягко говоря не очень для победы над врагом игроку достаточно просто тыкать на лкм и пить зелья. Эту часть нужно разнообразить. Также я не исключаю тот вариант что прийдется пересмотреть в общем весь игровой процесс, и вместо текущиего вида сверху использовать вид от первого лица. </w:t>
-      </w:r>
-    </w:p>
-    <w:p>
-      <w:pPr>
-        <w:rPr>
-          <w:rFonts w:ascii="Segoe UI" w:hAnsi="Segoe UI" w:cs="Segoe UI"/>
-          <w:color w:val="ECECF1"/>
-          <w:shd w:val="clear" w:color="auto" w:fill="343541"/>
-        </w:rPr>
-      </w:pPr>
-      <w:r>
-        <w:rPr>
-          <w:rFonts w:ascii="Segoe UI" w:hAnsi="Segoe UI" w:cs="Segoe UI"/>
-          <w:color w:val="ECECF1"/>
-          <w:shd w:val="clear" w:color="auto" w:fill="343541"/>
-        </w:rPr>
-        <w:t>5 Рандомное генерирование подземелья(локаций). Эта задача также выносится на прототипирование ведь здесь мне нужно будет помимо самой генерации новых локаций, также разобраться с тем как производить запечку навмеша в рантайме, и здесь мне прийдется поиграться. Ну а внедрение новых систем боя и генерации, будут внедряться в последующих итерациях, если к тому времени они будут готовы)</w:t>
+        <w:t xml:space="preserve">4 </w:t>
+      </w:r>
+      <w:proofErr w:type="spellStart"/>
+      <w:r>
+        <w:rPr>
+          <w:rFonts w:ascii="Segoe UI" w:hAnsi="Segoe UI" w:cs="Segoe UI"/>
+          <w:color w:val="ECECF1"/>
+          <w:shd w:val="clear" w:color="auto" w:fill="343541"/>
+        </w:rPr>
+        <w:t>Паралельно</w:t>
+      </w:r>
+      <w:proofErr w:type="spellEnd"/>
+      <w:r>
+        <w:rPr>
+          <w:rFonts w:ascii="Segoe UI" w:hAnsi="Segoe UI" w:cs="Segoe UI"/>
+          <w:color w:val="ECECF1"/>
+          <w:shd w:val="clear" w:color="auto" w:fill="343541"/>
+        </w:rPr>
+        <w:t xml:space="preserve"> хочу запустить в разработку прототип новой боевой системы, который позволит улучшить текущую, точного представления то как она должна выглядеть нету, </w:t>
+      </w:r>
+      <w:proofErr w:type="gramStart"/>
+      <w:r>
+        <w:rPr>
+          <w:rFonts w:ascii="Segoe UI" w:hAnsi="Segoe UI" w:cs="Segoe UI"/>
+          <w:color w:val="ECECF1"/>
+          <w:shd w:val="clear" w:color="auto" w:fill="343541"/>
+        </w:rPr>
+        <w:t>во время</w:t>
+      </w:r>
+      <w:proofErr w:type="gramEnd"/>
+      <w:r>
+        <w:rPr>
+          <w:rFonts w:ascii="Segoe UI" w:hAnsi="Segoe UI" w:cs="Segoe UI"/>
+          <w:color w:val="ECECF1"/>
+          <w:shd w:val="clear" w:color="auto" w:fill="343541"/>
+        </w:rPr>
+        <w:t xml:space="preserve"> </w:t>
+      </w:r>
+      <w:proofErr w:type="spellStart"/>
+      <w:r>
+        <w:rPr>
+          <w:rFonts w:ascii="Segoe UI" w:hAnsi="Segoe UI" w:cs="Segoe UI"/>
+          <w:color w:val="ECECF1"/>
+          <w:shd w:val="clear" w:color="auto" w:fill="343541"/>
+        </w:rPr>
+        <w:t>прототипирования</w:t>
+      </w:r>
+      <w:proofErr w:type="spellEnd"/>
+      <w:r>
+        <w:rPr>
+          <w:rFonts w:ascii="Segoe UI" w:hAnsi="Segoe UI" w:cs="Segoe UI"/>
+          <w:color w:val="ECECF1"/>
+          <w:shd w:val="clear" w:color="auto" w:fill="343541"/>
+        </w:rPr>
+        <w:t xml:space="preserve"> надеюсь что найду хороший вариант. Зачем обновлять эту механику? Все просто если посмотреть на мой текущий </w:t>
+      </w:r>
+      <w:proofErr w:type="gramStart"/>
+      <w:r>
+        <w:rPr>
+          <w:rFonts w:ascii="Segoe UI" w:hAnsi="Segoe UI" w:cs="Segoe UI"/>
+          <w:color w:val="ECECF1"/>
+          <w:shd w:val="clear" w:color="auto" w:fill="343541"/>
+        </w:rPr>
+        <w:t>проект</w:t>
+      </w:r>
+      <w:proofErr w:type="gramEnd"/>
+      <w:r>
+        <w:rPr>
+          <w:rFonts w:ascii="Segoe UI" w:hAnsi="Segoe UI" w:cs="Segoe UI"/>
+          <w:color w:val="ECECF1"/>
+          <w:shd w:val="clear" w:color="auto" w:fill="343541"/>
+        </w:rPr>
+        <w:t xml:space="preserve"> то основная часть </w:t>
+      </w:r>
+      <w:proofErr w:type="spellStart"/>
+      <w:r>
+        <w:rPr>
+          <w:rFonts w:ascii="Segoe UI" w:hAnsi="Segoe UI" w:cs="Segoe UI"/>
+          <w:color w:val="ECECF1"/>
+          <w:shd w:val="clear" w:color="auto" w:fill="343541"/>
+        </w:rPr>
+        <w:t>геймплея</w:t>
+      </w:r>
+      <w:proofErr w:type="spellEnd"/>
+      <w:r>
+        <w:rPr>
+          <w:rFonts w:ascii="Segoe UI" w:hAnsi="Segoe UI" w:cs="Segoe UI"/>
+          <w:color w:val="ECECF1"/>
+          <w:shd w:val="clear" w:color="auto" w:fill="343541"/>
+        </w:rPr>
+        <w:t xml:space="preserve"> это бои, а текущая </w:t>
+      </w:r>
+      <w:proofErr w:type="spellStart"/>
+      <w:r>
+        <w:rPr>
+          <w:rFonts w:ascii="Segoe UI" w:hAnsi="Segoe UI" w:cs="Segoe UI"/>
+          <w:color w:val="ECECF1"/>
+          <w:shd w:val="clear" w:color="auto" w:fill="343541"/>
+        </w:rPr>
+        <w:t>боевка</w:t>
+      </w:r>
+      <w:proofErr w:type="spellEnd"/>
+      <w:r>
+        <w:rPr>
+          <w:rFonts w:ascii="Segoe UI" w:hAnsi="Segoe UI" w:cs="Segoe UI"/>
+          <w:color w:val="ECECF1"/>
+          <w:shd w:val="clear" w:color="auto" w:fill="343541"/>
+        </w:rPr>
+        <w:t xml:space="preserve"> мягко говоря не очень для победы над врагом игроку достаточно просто тыкать на </w:t>
+      </w:r>
+      <w:proofErr w:type="spellStart"/>
+      <w:r>
+        <w:rPr>
+          <w:rFonts w:ascii="Segoe UI" w:hAnsi="Segoe UI" w:cs="Segoe UI"/>
+          <w:color w:val="ECECF1"/>
+          <w:shd w:val="clear" w:color="auto" w:fill="343541"/>
+        </w:rPr>
+        <w:t>лкм</w:t>
+      </w:r>
+      <w:proofErr w:type="spellEnd"/>
+      <w:r>
+        <w:rPr>
+          <w:rFonts w:ascii="Segoe UI" w:hAnsi="Segoe UI" w:cs="Segoe UI"/>
+          <w:color w:val="ECECF1"/>
+          <w:shd w:val="clear" w:color="auto" w:fill="343541"/>
+        </w:rPr>
+        <w:t xml:space="preserve"> и пить зелья. Эту часть нужно разнообразить. Также я не исключаю тот вариант что </w:t>
+      </w:r>
+      <w:proofErr w:type="spellStart"/>
+      <w:r>
+        <w:rPr>
+          <w:rFonts w:ascii="Segoe UI" w:hAnsi="Segoe UI" w:cs="Segoe UI"/>
+          <w:color w:val="ECECF1"/>
+          <w:shd w:val="clear" w:color="auto" w:fill="343541"/>
+        </w:rPr>
+        <w:t>прийдется</w:t>
+      </w:r>
+      <w:proofErr w:type="spellEnd"/>
+      <w:r>
+        <w:rPr>
+          <w:rFonts w:ascii="Segoe UI" w:hAnsi="Segoe UI" w:cs="Segoe UI"/>
+          <w:color w:val="ECECF1"/>
+          <w:shd w:val="clear" w:color="auto" w:fill="343541"/>
+        </w:rPr>
+        <w:t xml:space="preserve"> пересмотреть в общем весь игровой процесс, и вместо </w:t>
+      </w:r>
+      <w:proofErr w:type="spellStart"/>
+      <w:r>
+        <w:rPr>
+          <w:rFonts w:ascii="Segoe UI" w:hAnsi="Segoe UI" w:cs="Segoe UI"/>
+          <w:color w:val="ECECF1"/>
+          <w:shd w:val="clear" w:color="auto" w:fill="343541"/>
+        </w:rPr>
+        <w:t>текущиего</w:t>
+      </w:r>
+      <w:proofErr w:type="spellEnd"/>
+      <w:r>
+        <w:rPr>
+          <w:rFonts w:ascii="Segoe UI" w:hAnsi="Segoe UI" w:cs="Segoe UI"/>
+          <w:color w:val="ECECF1"/>
+          <w:shd w:val="clear" w:color="auto" w:fill="343541"/>
+        </w:rPr>
+        <w:t xml:space="preserve"> вида сверху использовать вид от первого лица. </w:t>
+      </w:r>
+    </w:p>
+    <w:p>
+      <w:pPr>
+        <w:rPr>
+          <w:rFonts w:ascii="Segoe UI" w:hAnsi="Segoe UI" w:cs="Segoe UI"/>
+          <w:color w:val="ECECF1"/>
+          <w:shd w:val="clear" w:color="auto" w:fill="343541"/>
+        </w:rPr>
+      </w:pPr>
+      <w:r>
+        <w:rPr>
+          <w:rFonts w:ascii="Segoe UI" w:hAnsi="Segoe UI" w:cs="Segoe UI"/>
+          <w:color w:val="ECECF1"/>
+          <w:shd w:val="clear" w:color="auto" w:fill="343541"/>
+        </w:rPr>
+        <w:t xml:space="preserve">5 </w:t>
+      </w:r>
+      <w:proofErr w:type="spellStart"/>
+      <w:r>
+        <w:rPr>
+          <w:rFonts w:ascii="Segoe UI" w:hAnsi="Segoe UI" w:cs="Segoe UI"/>
+          <w:color w:val="ECECF1"/>
+          <w:shd w:val="clear" w:color="auto" w:fill="343541"/>
+        </w:rPr>
+        <w:t>Рандомное</w:t>
+      </w:r>
+      <w:proofErr w:type="spellEnd"/>
+      <w:r>
+        <w:rPr>
+          <w:rFonts w:ascii="Segoe UI" w:hAnsi="Segoe UI" w:cs="Segoe UI"/>
+          <w:color w:val="ECECF1"/>
+          <w:shd w:val="clear" w:color="auto" w:fill="343541"/>
+        </w:rPr>
+        <w:t xml:space="preserve"> генерирование подземелья(локаций). Эта задача также выносится на </w:t>
+      </w:r>
+      <w:proofErr w:type="spellStart"/>
+      <w:r>
+        <w:rPr>
+          <w:rFonts w:ascii="Segoe UI" w:hAnsi="Segoe UI" w:cs="Segoe UI"/>
+          <w:color w:val="ECECF1"/>
+          <w:shd w:val="clear" w:color="auto" w:fill="343541"/>
+        </w:rPr>
+        <w:t>прототипирование</w:t>
+      </w:r>
+      <w:proofErr w:type="spellEnd"/>
+      <w:r>
+        <w:rPr>
+          <w:rFonts w:ascii="Segoe UI" w:hAnsi="Segoe UI" w:cs="Segoe UI"/>
+          <w:color w:val="ECECF1"/>
+          <w:shd w:val="clear" w:color="auto" w:fill="343541"/>
+        </w:rPr>
+        <w:t xml:space="preserve"> ведь здесь мне нужно будет помимо самой генерации новых локаций, также разобраться с тем как производить запечку </w:t>
+      </w:r>
+      <w:proofErr w:type="spellStart"/>
+      <w:r>
+        <w:rPr>
+          <w:rFonts w:ascii="Segoe UI" w:hAnsi="Segoe UI" w:cs="Segoe UI"/>
+          <w:color w:val="ECECF1"/>
+          <w:shd w:val="clear" w:color="auto" w:fill="343541"/>
+        </w:rPr>
+        <w:t>навмеша</w:t>
+      </w:r>
+      <w:proofErr w:type="spellEnd"/>
+      <w:r>
+        <w:rPr>
+          <w:rFonts w:ascii="Segoe UI" w:hAnsi="Segoe UI" w:cs="Segoe UI"/>
+          <w:color w:val="ECECF1"/>
+          <w:shd w:val="clear" w:color="auto" w:fill="343541"/>
+        </w:rPr>
+        <w:t xml:space="preserve"> в </w:t>
+      </w:r>
+      <w:proofErr w:type="spellStart"/>
+      <w:r>
+        <w:rPr>
+          <w:rFonts w:ascii="Segoe UI" w:hAnsi="Segoe UI" w:cs="Segoe UI"/>
+          <w:color w:val="ECECF1"/>
+          <w:shd w:val="clear" w:color="auto" w:fill="343541"/>
+        </w:rPr>
+        <w:t>рантайме</w:t>
+      </w:r>
+      <w:proofErr w:type="spellEnd"/>
+      <w:r>
+        <w:rPr>
+          <w:rFonts w:ascii="Segoe UI" w:hAnsi="Segoe UI" w:cs="Segoe UI"/>
+          <w:color w:val="ECECF1"/>
+          <w:shd w:val="clear" w:color="auto" w:fill="343541"/>
+        </w:rPr>
+        <w:t xml:space="preserve">, и здесь мне </w:t>
+      </w:r>
+      <w:proofErr w:type="spellStart"/>
+      <w:r>
+        <w:rPr>
+          <w:rFonts w:ascii="Segoe UI" w:hAnsi="Segoe UI" w:cs="Segoe UI"/>
+          <w:color w:val="ECECF1"/>
+          <w:shd w:val="clear" w:color="auto" w:fill="343541"/>
+        </w:rPr>
+        <w:t>прийдется</w:t>
+      </w:r>
+      <w:proofErr w:type="spellEnd"/>
+      <w:r>
+        <w:rPr>
+          <w:rFonts w:ascii="Segoe UI" w:hAnsi="Segoe UI" w:cs="Segoe UI"/>
+          <w:color w:val="ECECF1"/>
+          <w:shd w:val="clear" w:color="auto" w:fill="343541"/>
+        </w:rPr>
+        <w:t xml:space="preserve"> поиграться. Ну а внедрение новых систем боя и генерации, будут внедряться в последующих итерациях, если к тому времени они будут готовы)</w:t>
       </w:r>
     </w:p>
     <w:p>
@@ -2440,62 +3826,300 @@
           <w:color w:val="ECECF1"/>
           <w:shd w:val="clear" w:color="auto" w:fill="343541"/>
         </w:rPr>
-        <w:t>1 Первая задача которую нужно будет исправить уже является достаточно комплексной, и проблемной в игре существует EnemyCharacterConfig, а также связка от системы прокачки, которую используют враги. И проблема заключается в том что изначально все враги использовали первую систему, но позже была прикрученна вторая система, и сейчас очень сложно сказать какую, из систем используют враги, скорей всего это является это будет смесь из двух систем. Это нужно исправить. Нужно пересмотреть взаимодействие этих двух систем и выбрать лучшее решение которое позволит мне разрешить данную проблему.</w:t>
-      </w:r>
-    </w:p>
-    <w:p>
-      <w:pPr>
-        <w:rPr>
-          <w:rFonts w:ascii="Segoe UI" w:hAnsi="Segoe UI" w:cs="Segoe UI"/>
-          <w:strike/>
-          <w:color w:val="ECECF1"/>
-          <w:shd w:val="clear" w:color="auto" w:fill="343541"/>
-        </w:rPr>
-      </w:pPr>
-      <w:r>
-        <w:rPr>
-          <w:rFonts w:ascii="Segoe UI" w:hAnsi="Segoe UI" w:cs="Segoe UI"/>
-          <w:strike/>
-          <w:color w:val="ECECF1"/>
-          <w:shd w:val="clear" w:color="auto" w:fill="343541"/>
-        </w:rPr>
-        <w:t>2 Точная такая же проблема существует и с игроком. Но ее нельзя расматривать как предыдущий кейс.</w:t>
-      </w:r>
-    </w:p>
-    <w:p>
-      <w:pPr>
-        <w:rPr>
-          <w:rFonts w:ascii="Segoe UI" w:hAnsi="Segoe UI" w:cs="Segoe UI"/>
-          <w:strike/>
-          <w:color w:val="ECECF1"/>
-          <w:shd w:val="clear" w:color="auto" w:fill="343541"/>
-        </w:rPr>
-      </w:pPr>
-      <w:r>
-        <w:rPr>
-          <w:rFonts w:ascii="Segoe UI" w:hAnsi="Segoe UI" w:cs="Segoe UI"/>
-          <w:strike/>
-          <w:color w:val="ECECF1"/>
-          <w:shd w:val="clear" w:color="auto" w:fill="343541"/>
-        </w:rPr>
-        <w:t xml:space="preserve">3 Улучшить структуру проекта. Хоть предыдущая итерация и была в основном нацелена на улучшение структуры проекта, но до конца задача так и не была выполнена. Имеется еще куча проблемных мест. На этот раз нужно пересмотреть структуру SavaData. И еще нужно будет исправить EnemyCharacterConfig где используется врагмент из SavaData а именно класс PlayerState, отвечающий за здоровья врагом. </w:t>
-      </w:r>
-    </w:p>
-    <w:p>
-      <w:pPr>
-        <w:rPr>
-          <w:rFonts w:ascii="Segoe UI" w:hAnsi="Segoe UI" w:cs="Segoe UI"/>
-          <w:color w:val="ECECF1"/>
-          <w:shd w:val="clear" w:color="auto" w:fill="343541"/>
-        </w:rPr>
-      </w:pPr>
-      <w:r>
-        <w:rPr>
-          <w:rFonts w:ascii="Segoe UI" w:hAnsi="Segoe UI" w:cs="Segoe UI"/>
-          <w:color w:val="ECECF1"/>
-          <w:shd w:val="clear" w:color="auto" w:fill="343541"/>
-        </w:rPr>
-        <w:t xml:space="preserve">4 Локализации игры. На данный момент существует уже часть переведеного текста на русский и английский, но есть моменты где например используются перечисления, их также нужно перевести на английский и на русский. </w:t>
+        <w:t xml:space="preserve">1 Первая задача которую нужно будет исправить уже является достаточно комплексной, и проблемной в игре существует </w:t>
+      </w:r>
+      <w:proofErr w:type="spellStart"/>
+      <w:r>
+        <w:rPr>
+          <w:rFonts w:ascii="Segoe UI" w:hAnsi="Segoe UI" w:cs="Segoe UI"/>
+          <w:strike/>
+          <w:color w:val="ECECF1"/>
+          <w:shd w:val="clear" w:color="auto" w:fill="343541"/>
+        </w:rPr>
+        <w:t>EnemyCharacterConfig</w:t>
+      </w:r>
+      <w:proofErr w:type="spellEnd"/>
+      <w:r>
+        <w:rPr>
+          <w:rFonts w:ascii="Segoe UI" w:hAnsi="Segoe UI" w:cs="Segoe UI"/>
+          <w:strike/>
+          <w:color w:val="ECECF1"/>
+          <w:shd w:val="clear" w:color="auto" w:fill="343541"/>
+        </w:rPr>
+        <w:t xml:space="preserve">, а также связка от системы прокачки, которую используют враги. И проблема заключается в </w:t>
+      </w:r>
+      <w:proofErr w:type="gramStart"/>
+      <w:r>
+        <w:rPr>
+          <w:rFonts w:ascii="Segoe UI" w:hAnsi="Segoe UI" w:cs="Segoe UI"/>
+          <w:strike/>
+          <w:color w:val="ECECF1"/>
+          <w:shd w:val="clear" w:color="auto" w:fill="343541"/>
+        </w:rPr>
+        <w:t>том</w:t>
+      </w:r>
+      <w:proofErr w:type="gramEnd"/>
+      <w:r>
+        <w:rPr>
+          <w:rFonts w:ascii="Segoe UI" w:hAnsi="Segoe UI" w:cs="Segoe UI"/>
+          <w:strike/>
+          <w:color w:val="ECECF1"/>
+          <w:shd w:val="clear" w:color="auto" w:fill="343541"/>
+        </w:rPr>
+        <w:t xml:space="preserve"> что изначально все враги использовали первую систему, но позже была </w:t>
+      </w:r>
+      <w:proofErr w:type="spellStart"/>
+      <w:r>
+        <w:rPr>
+          <w:rFonts w:ascii="Segoe UI" w:hAnsi="Segoe UI" w:cs="Segoe UI"/>
+          <w:strike/>
+          <w:color w:val="ECECF1"/>
+          <w:shd w:val="clear" w:color="auto" w:fill="343541"/>
+        </w:rPr>
+        <w:t>прикрученна</w:t>
+      </w:r>
+      <w:proofErr w:type="spellEnd"/>
+      <w:r>
+        <w:rPr>
+          <w:rFonts w:ascii="Segoe UI" w:hAnsi="Segoe UI" w:cs="Segoe UI"/>
+          <w:strike/>
+          <w:color w:val="ECECF1"/>
+          <w:shd w:val="clear" w:color="auto" w:fill="343541"/>
+        </w:rPr>
+        <w:t xml:space="preserve"> вторая система, и сейчас очень сложно сказать какую, из систем используют враги, скорей всего это является это будет смесь из двух систем. Это нужно исправить. Нужно пересмотреть взаимодействие этих двух систем и выбрать </w:t>
+      </w:r>
+      <w:proofErr w:type="gramStart"/>
+      <w:r>
+        <w:rPr>
+          <w:rFonts w:ascii="Segoe UI" w:hAnsi="Segoe UI" w:cs="Segoe UI"/>
+          <w:strike/>
+          <w:color w:val="ECECF1"/>
+          <w:shd w:val="clear" w:color="auto" w:fill="343541"/>
+        </w:rPr>
+        <w:t>лучшее решение</w:t>
+      </w:r>
+      <w:proofErr w:type="gramEnd"/>
+      <w:r>
+        <w:rPr>
+          <w:rFonts w:ascii="Segoe UI" w:hAnsi="Segoe UI" w:cs="Segoe UI"/>
+          <w:strike/>
+          <w:color w:val="ECECF1"/>
+          <w:shd w:val="clear" w:color="auto" w:fill="343541"/>
+        </w:rPr>
+        <w:t xml:space="preserve"> которое позволит мне разрешить данную проблему.</w:t>
+      </w:r>
+    </w:p>
+    <w:p>
+      <w:pPr>
+        <w:rPr>
+          <w:rFonts w:ascii="Segoe UI" w:hAnsi="Segoe UI" w:cs="Segoe UI"/>
+          <w:strike/>
+          <w:color w:val="ECECF1"/>
+          <w:shd w:val="clear" w:color="auto" w:fill="343541"/>
+        </w:rPr>
+      </w:pPr>
+      <w:r>
+        <w:rPr>
+          <w:rFonts w:ascii="Segoe UI" w:hAnsi="Segoe UI" w:cs="Segoe UI"/>
+          <w:strike/>
+          <w:color w:val="ECECF1"/>
+          <w:shd w:val="clear" w:color="auto" w:fill="343541"/>
+        </w:rPr>
+        <w:t xml:space="preserve">2 Точная такая же проблема существует и с игроком. Но ее нельзя </w:t>
+      </w:r>
+      <w:proofErr w:type="spellStart"/>
+      <w:r>
+        <w:rPr>
+          <w:rFonts w:ascii="Segoe UI" w:hAnsi="Segoe UI" w:cs="Segoe UI"/>
+          <w:strike/>
+          <w:color w:val="ECECF1"/>
+          <w:shd w:val="clear" w:color="auto" w:fill="343541"/>
+        </w:rPr>
+        <w:t>расматривать</w:t>
+      </w:r>
+      <w:proofErr w:type="spellEnd"/>
+      <w:r>
+        <w:rPr>
+          <w:rFonts w:ascii="Segoe UI" w:hAnsi="Segoe UI" w:cs="Segoe UI"/>
+          <w:strike/>
+          <w:color w:val="ECECF1"/>
+          <w:shd w:val="clear" w:color="auto" w:fill="343541"/>
+        </w:rPr>
+        <w:t xml:space="preserve"> как предыдущий кейс.</w:t>
+      </w:r>
+    </w:p>
+    <w:p>
+      <w:pPr>
+        <w:rPr>
+          <w:rFonts w:ascii="Segoe UI" w:hAnsi="Segoe UI" w:cs="Segoe UI"/>
+          <w:strike/>
+          <w:color w:val="ECECF1"/>
+          <w:shd w:val="clear" w:color="auto" w:fill="343541"/>
+        </w:rPr>
+      </w:pPr>
+      <w:r>
+        <w:rPr>
+          <w:rFonts w:ascii="Segoe UI" w:hAnsi="Segoe UI" w:cs="Segoe UI"/>
+          <w:strike/>
+          <w:color w:val="ECECF1"/>
+          <w:shd w:val="clear" w:color="auto" w:fill="343541"/>
+        </w:rPr>
+        <w:t xml:space="preserve">3 Улучшить структуру проекта. Хоть предыдущая итерация и была в основном нацелена на улучшение структуры проекта, но до конца задача так и не была выполнена. Имеется еще куча проблемных мест. На этот раз нужно пересмотреть структуру </w:t>
+      </w:r>
+      <w:proofErr w:type="spellStart"/>
+      <w:r>
+        <w:rPr>
+          <w:rFonts w:ascii="Segoe UI" w:hAnsi="Segoe UI" w:cs="Segoe UI"/>
+          <w:strike/>
+          <w:color w:val="ECECF1"/>
+          <w:shd w:val="clear" w:color="auto" w:fill="343541"/>
+        </w:rPr>
+        <w:t>SavaData</w:t>
+      </w:r>
+      <w:proofErr w:type="spellEnd"/>
+      <w:r>
+        <w:rPr>
+          <w:rFonts w:ascii="Segoe UI" w:hAnsi="Segoe UI" w:cs="Segoe UI"/>
+          <w:strike/>
+          <w:color w:val="ECECF1"/>
+          <w:shd w:val="clear" w:color="auto" w:fill="343541"/>
+        </w:rPr>
+        <w:t xml:space="preserve">. И еще нужно будет исправить </w:t>
+      </w:r>
+      <w:proofErr w:type="spellStart"/>
+      <w:r>
+        <w:rPr>
+          <w:rFonts w:ascii="Segoe UI" w:hAnsi="Segoe UI" w:cs="Segoe UI"/>
+          <w:strike/>
+          <w:color w:val="ECECF1"/>
+          <w:shd w:val="clear" w:color="auto" w:fill="343541"/>
+        </w:rPr>
+        <w:t>EnemyCharacterConfig</w:t>
+      </w:r>
+      <w:proofErr w:type="spellEnd"/>
+      <w:r>
+        <w:rPr>
+          <w:rFonts w:ascii="Segoe UI" w:hAnsi="Segoe UI" w:cs="Segoe UI"/>
+          <w:strike/>
+          <w:color w:val="ECECF1"/>
+          <w:shd w:val="clear" w:color="auto" w:fill="343541"/>
+        </w:rPr>
+        <w:t xml:space="preserve"> где используется </w:t>
+      </w:r>
+      <w:proofErr w:type="spellStart"/>
+      <w:r>
+        <w:rPr>
+          <w:rFonts w:ascii="Segoe UI" w:hAnsi="Segoe UI" w:cs="Segoe UI"/>
+          <w:strike/>
+          <w:color w:val="ECECF1"/>
+          <w:shd w:val="clear" w:color="auto" w:fill="343541"/>
+        </w:rPr>
+        <w:t>врагмент</w:t>
+      </w:r>
+      <w:proofErr w:type="spellEnd"/>
+      <w:r>
+        <w:rPr>
+          <w:rFonts w:ascii="Segoe UI" w:hAnsi="Segoe UI" w:cs="Segoe UI"/>
+          <w:strike/>
+          <w:color w:val="ECECF1"/>
+          <w:shd w:val="clear" w:color="auto" w:fill="343541"/>
+        </w:rPr>
+        <w:t xml:space="preserve"> из </w:t>
+      </w:r>
+      <w:proofErr w:type="spellStart"/>
+      <w:proofErr w:type="gramStart"/>
+      <w:r>
+        <w:rPr>
+          <w:rFonts w:ascii="Segoe UI" w:hAnsi="Segoe UI" w:cs="Segoe UI"/>
+          <w:strike/>
+          <w:color w:val="ECECF1"/>
+          <w:shd w:val="clear" w:color="auto" w:fill="343541"/>
+        </w:rPr>
+        <w:t>SavaData</w:t>
+      </w:r>
+      <w:proofErr w:type="spellEnd"/>
+      <w:proofErr w:type="gramEnd"/>
+      <w:r>
+        <w:rPr>
+          <w:rFonts w:ascii="Segoe UI" w:hAnsi="Segoe UI" w:cs="Segoe UI"/>
+          <w:strike/>
+          <w:color w:val="ECECF1"/>
+          <w:shd w:val="clear" w:color="auto" w:fill="343541"/>
+        </w:rPr>
+        <w:t xml:space="preserve"> а именно класс </w:t>
+      </w:r>
+      <w:proofErr w:type="spellStart"/>
+      <w:r>
+        <w:rPr>
+          <w:rFonts w:ascii="Segoe UI" w:hAnsi="Segoe UI" w:cs="Segoe UI"/>
+          <w:strike/>
+          <w:color w:val="ECECF1"/>
+          <w:shd w:val="clear" w:color="auto" w:fill="343541"/>
+        </w:rPr>
+        <w:t>PlayerState</w:t>
+      </w:r>
+      <w:proofErr w:type="spellEnd"/>
+      <w:r>
+        <w:rPr>
+          <w:rFonts w:ascii="Segoe UI" w:hAnsi="Segoe UI" w:cs="Segoe UI"/>
+          <w:strike/>
+          <w:color w:val="ECECF1"/>
+          <w:shd w:val="clear" w:color="auto" w:fill="343541"/>
+        </w:rPr>
+        <w:t xml:space="preserve">, отвечающий за здоровья врагом. </w:t>
+      </w:r>
+    </w:p>
+    <w:p>
+      <w:pPr>
+        <w:rPr>
+          <w:rFonts w:ascii="Segoe UI" w:hAnsi="Segoe UI" w:cs="Segoe UI"/>
+          <w:color w:val="ECECF1"/>
+          <w:shd w:val="clear" w:color="auto" w:fill="343541"/>
+        </w:rPr>
+      </w:pPr>
+      <w:r>
+        <w:rPr>
+          <w:rFonts w:ascii="Segoe UI" w:hAnsi="Segoe UI" w:cs="Segoe UI"/>
+          <w:color w:val="ECECF1"/>
+          <w:shd w:val="clear" w:color="auto" w:fill="343541"/>
+        </w:rPr>
+        <w:t xml:space="preserve">4 Локализации игры. На данный момент существует уже часть </w:t>
+      </w:r>
+      <w:proofErr w:type="spellStart"/>
+      <w:r>
+        <w:rPr>
+          <w:rFonts w:ascii="Segoe UI" w:hAnsi="Segoe UI" w:cs="Segoe UI"/>
+          <w:color w:val="ECECF1"/>
+          <w:shd w:val="clear" w:color="auto" w:fill="343541"/>
+        </w:rPr>
+        <w:t>переведеного</w:t>
+      </w:r>
+      <w:proofErr w:type="spellEnd"/>
+      <w:r>
+        <w:rPr>
+          <w:rFonts w:ascii="Segoe UI" w:hAnsi="Segoe UI" w:cs="Segoe UI"/>
+          <w:color w:val="ECECF1"/>
+          <w:shd w:val="clear" w:color="auto" w:fill="343541"/>
+        </w:rPr>
+        <w:t xml:space="preserve"> текста на русский и английский, но есть моменты </w:t>
+      </w:r>
+      <w:proofErr w:type="gramStart"/>
+      <w:r>
+        <w:rPr>
+          <w:rFonts w:ascii="Segoe UI" w:hAnsi="Segoe UI" w:cs="Segoe UI"/>
+          <w:color w:val="ECECF1"/>
+          <w:shd w:val="clear" w:color="auto" w:fill="343541"/>
+        </w:rPr>
+        <w:t>где например</w:t>
+      </w:r>
+      <w:proofErr w:type="gramEnd"/>
+      <w:r>
+        <w:rPr>
+          <w:rFonts w:ascii="Segoe UI" w:hAnsi="Segoe UI" w:cs="Segoe UI"/>
+          <w:color w:val="ECECF1"/>
+          <w:shd w:val="clear" w:color="auto" w:fill="343541"/>
+        </w:rPr>
+        <w:t xml:space="preserve"> используются перечисления, их также нужно перевести на английский и на русский. </w:t>
       </w:r>
     </w:p>
     <w:p>
@@ -2634,7 +4258,31 @@
           <w:szCs w:val="28"/>
           <w:shd w:val="clear" w:color="auto" w:fill="343541"/>
         </w:rPr>
-        <w:t>Улучшить ИИ, а именно запретить производить атаку для ИИ если ИИ начал атаку, но был застагерен ударом игрока то ии должен потерять возможность повторной атаки до тех пор, пока не пройдет перезарядки атаки.</w:t>
+        <w:t xml:space="preserve">Улучшить ИИ, а именно запретить производить атаку для ИИ если ИИ начал атаку, но был </w:t>
+      </w:r>
+      <w:proofErr w:type="spellStart"/>
+      <w:r>
+        <w:rPr>
+          <w:rFonts w:ascii="Times New Roman" w:hAnsi="Times New Roman" w:cs="Times New Roman"/>
+          <w:strike/>
+          <w:color w:val="ECECF1"/>
+          <w:sz w:val="28"/>
+          <w:szCs w:val="28"/>
+          <w:shd w:val="clear" w:color="auto" w:fill="343541"/>
+        </w:rPr>
+        <w:t>застагерен</w:t>
+      </w:r>
+      <w:proofErr w:type="spellEnd"/>
+      <w:r>
+        <w:rPr>
+          <w:rFonts w:ascii="Times New Roman" w:hAnsi="Times New Roman" w:cs="Times New Roman"/>
+          <w:strike/>
+          <w:color w:val="ECECF1"/>
+          <w:sz w:val="28"/>
+          <w:szCs w:val="28"/>
+          <w:shd w:val="clear" w:color="auto" w:fill="343541"/>
+        </w:rPr>
+        <w:t xml:space="preserve"> ударом игрока то ии должен потерять возможность повторной атаки до тех пор, пока не пройдет перезарядки атаки.</w:t>
       </w:r>
     </w:p>
     <w:p>
@@ -2663,7 +4311,31 @@
           <w:szCs w:val="28"/>
           <w:shd w:val="clear" w:color="auto" w:fill="343541"/>
         </w:rPr>
-        <w:t>Начать разработку рандомной генерации локаций.</w:t>
+        <w:t xml:space="preserve">Начать разработку </w:t>
+      </w:r>
+      <w:proofErr w:type="spellStart"/>
+      <w:r>
+        <w:rPr>
+          <w:rFonts w:ascii="Times New Roman" w:hAnsi="Times New Roman" w:cs="Times New Roman"/>
+          <w:strike/>
+          <w:color w:val="ECECF1"/>
+          <w:sz w:val="28"/>
+          <w:szCs w:val="28"/>
+          <w:shd w:val="clear" w:color="auto" w:fill="343541"/>
+        </w:rPr>
+        <w:t>рандомной</w:t>
+      </w:r>
+      <w:proofErr w:type="spellEnd"/>
+      <w:r>
+        <w:rPr>
+          <w:rFonts w:ascii="Times New Roman" w:hAnsi="Times New Roman" w:cs="Times New Roman"/>
+          <w:strike/>
+          <w:color w:val="ECECF1"/>
+          <w:sz w:val="28"/>
+          <w:szCs w:val="28"/>
+          <w:shd w:val="clear" w:color="auto" w:fill="343541"/>
+        </w:rPr>
+        <w:t xml:space="preserve"> генерации локаций.</w:t>
       </w:r>
     </w:p>
     <w:p>
@@ -2705,8 +4377,9 @@
           <w:szCs w:val="28"/>
           <w:shd w:val="clear" w:color="auto" w:fill="343541"/>
         </w:rPr>
-        <w:t xml:space="preserve">итерация (размышления. Главная задача этой итерации это подключить случайную генерацию уровней к игре. Но для этого придётся перекопать очень много кода. </w:t>
-      </w:r>
+        <w:t xml:space="preserve">итерация (размышления. </w:t>
+      </w:r>
+      <w:proofErr w:type="gramStart"/>
       <w:r>
         <w:rPr>
           <w:rFonts w:ascii="Times New Roman" w:hAnsi="Times New Roman" w:cs="Times New Roman"/>
@@ -2714,8 +4387,9 @@
           <w:szCs w:val="28"/>
           <w:shd w:val="clear" w:color="auto" w:fill="343541"/>
         </w:rPr>
-        <w:t>Так, например,</w:t>
-      </w:r>
+        <w:t>Главная задача этой итерации это</w:t>
+      </w:r>
+      <w:proofErr w:type="gramEnd"/>
       <w:r>
         <w:rPr>
           <w:rFonts w:ascii="Times New Roman" w:hAnsi="Times New Roman" w:cs="Times New Roman"/>
@@ -2723,7 +4397,7 @@
           <w:szCs w:val="28"/>
           <w:shd w:val="clear" w:color="auto" w:fill="343541"/>
         </w:rPr>
-        <w:t xml:space="preserve"> необходимо добавить </w:t>
+        <w:t xml:space="preserve"> подключить случайную генерацию уровней к игре. Но для этого придётся перекопать очень много кода. </w:t>
       </w:r>
       <w:r>
         <w:rPr>
@@ -2732,7 +4406,7 @@
           <w:szCs w:val="28"/>
           <w:shd w:val="clear" w:color="auto" w:fill="343541"/>
         </w:rPr>
-        <w:t>новое состояние,</w:t>
+        <w:t>Так, например,</w:t>
       </w:r>
       <w:r>
         <w:rPr>
@@ -2741,7 +4415,7 @@
           <w:szCs w:val="28"/>
           <w:shd w:val="clear" w:color="auto" w:fill="343541"/>
         </w:rPr>
-        <w:t xml:space="preserve"> которое</w:t>
+        <w:t xml:space="preserve"> необходимо добавить </w:t>
       </w:r>
       <w:r>
         <w:rPr>
@@ -2750,7 +4424,7 @@
           <w:szCs w:val="28"/>
           <w:shd w:val="clear" w:color="auto" w:fill="343541"/>
         </w:rPr>
-        <w:t xml:space="preserve"> будет опциональным и использоваться только для генерации уровней, так как в первую очередь всегда необходимо сгенерировать уровень, а только потом генерировать персонажей и прочее. Также придётся расширить систему управление игровым процессом (это также понадобится и для оптимизации), так например я хочу сделать компонент который будет отвечать за поведение конкретного чанка. Компонент отвечающий за конкретный чанк в основном будет использовать точно так же как ранее использовался компонент </w:t>
+        <w:t>новое состояние,</w:t>
       </w:r>
       <w:r>
         <w:rPr>
@@ -2758,9 +4432,8 @@
           <w:sz w:val="28"/>
           <w:szCs w:val="28"/>
           <w:shd w:val="clear" w:color="auto" w:fill="343541"/>
-          <w:lang w:val="en-US"/>
-        </w:rPr>
-        <w:t>Level</w:t>
+        </w:rPr>
+        <w:t xml:space="preserve"> которое</w:t>
       </w:r>
       <w:r>
         <w:rPr>
@@ -2769,18 +4442,19 @@
           <w:szCs w:val="28"/>
           <w:shd w:val="clear" w:color="auto" w:fill="343541"/>
         </w:rPr>
-        <w:t xml:space="preserve"> </w:t>
-      </w:r>
+        <w:t xml:space="preserve"> будет опциональным и использоваться только для генерации уровней, так как в первую очередь всегда необходимо сгенерировать уровень, а только потом генерировать персонажей и прочее. Также придётся расширить систему управление игровым процессом (это также понадобится и для оптимизации), </w:t>
+      </w:r>
+      <w:proofErr w:type="gramStart"/>
       <w:r>
         <w:rPr>
           <w:rFonts w:ascii="Times New Roman" w:hAnsi="Times New Roman" w:cs="Times New Roman"/>
           <w:sz w:val="28"/>
           <w:szCs w:val="28"/>
           <w:shd w:val="clear" w:color="auto" w:fill="343541"/>
-          <w:lang w:val="en-US"/>
-        </w:rPr>
-        <w:t>Settings</w:t>
-      </w:r>
+        </w:rPr>
+        <w:t>так например</w:t>
+      </w:r>
+      <w:proofErr w:type="gramEnd"/>
       <w:r>
         <w:rPr>
           <w:rFonts w:ascii="Times New Roman" w:hAnsi="Times New Roman" w:cs="Times New Roman"/>
@@ -2788,7 +4462,65 @@
           <w:szCs w:val="28"/>
           <w:shd w:val="clear" w:color="auto" w:fill="343541"/>
         </w:rPr>
-        <w:t xml:space="preserve">, с единственным отличием в том что управляющий компонентов чанка на карте будет уже равное количество количеству созданных чанков. К тому </w:t>
+        <w:t xml:space="preserve"> я хочу сделать компонент который будет отвечать за поведение конкретного чанка. Компонент отвечающий за конкретный чанк в основном будет использовать точно так же как ранее использовался компонент </w:t>
+      </w:r>
+      <w:r>
+        <w:rPr>
+          <w:rFonts w:ascii="Times New Roman" w:hAnsi="Times New Roman" w:cs="Times New Roman"/>
+          <w:sz w:val="28"/>
+          <w:szCs w:val="28"/>
+          <w:shd w:val="clear" w:color="auto" w:fill="343541"/>
+          <w:lang w:val="en-US"/>
+        </w:rPr>
+        <w:t>Level</w:t>
+      </w:r>
+      <w:r>
+        <w:rPr>
+          <w:rFonts w:ascii="Times New Roman" w:hAnsi="Times New Roman" w:cs="Times New Roman"/>
+          <w:sz w:val="28"/>
+          <w:szCs w:val="28"/>
+          <w:shd w:val="clear" w:color="auto" w:fill="343541"/>
+        </w:rPr>
+        <w:t xml:space="preserve"> </w:t>
+      </w:r>
+      <w:r>
+        <w:rPr>
+          <w:rFonts w:ascii="Times New Roman" w:hAnsi="Times New Roman" w:cs="Times New Roman"/>
+          <w:sz w:val="28"/>
+          <w:szCs w:val="28"/>
+          <w:shd w:val="clear" w:color="auto" w:fill="343541"/>
+          <w:lang w:val="en-US"/>
+        </w:rPr>
+        <w:t>Settings</w:t>
+      </w:r>
+      <w:r>
+        <w:rPr>
+          <w:rFonts w:ascii="Times New Roman" w:hAnsi="Times New Roman" w:cs="Times New Roman"/>
+          <w:sz w:val="28"/>
+          <w:szCs w:val="28"/>
+          <w:shd w:val="clear" w:color="auto" w:fill="343541"/>
+        </w:rPr>
+        <w:t xml:space="preserve">, с единственным отличием в </w:t>
+      </w:r>
+      <w:proofErr w:type="gramStart"/>
+      <w:r>
+        <w:rPr>
+          <w:rFonts w:ascii="Times New Roman" w:hAnsi="Times New Roman" w:cs="Times New Roman"/>
+          <w:sz w:val="28"/>
+          <w:szCs w:val="28"/>
+          <w:shd w:val="clear" w:color="auto" w:fill="343541"/>
+        </w:rPr>
+        <w:t>том</w:t>
+      </w:r>
+      <w:proofErr w:type="gramEnd"/>
+      <w:r>
+        <w:rPr>
+          <w:rFonts w:ascii="Times New Roman" w:hAnsi="Times New Roman" w:cs="Times New Roman"/>
+          <w:sz w:val="28"/>
+          <w:szCs w:val="28"/>
+          <w:shd w:val="clear" w:color="auto" w:fill="343541"/>
+        </w:rPr>
+        <w:t xml:space="preserve"> что управляющий компонентов чанка на карте будет уже равное количество количеству созданных чанков. К тому </w:t>
       </w:r>
       <w:r>
         <w:rPr>
@@ -2872,6 +4604,7 @@
         </w:numPr>
         <w:rPr>
           <w:rFonts w:ascii="Times New Roman" w:hAnsi="Times New Roman" w:cs="Times New Roman"/>
+          <w:strike/>
           <w:sz w:val="28"/>
           <w:szCs w:val="28"/>
           <w:shd w:val="clear" w:color="auto" w:fill="343541"/>
@@ -2880,6 +4613,7 @@
       <w:r>
         <w:rPr>
           <w:rFonts w:ascii="Times New Roman" w:hAnsi="Times New Roman" w:cs="Times New Roman"/>
+          <w:strike/>
           <w:sz w:val="28"/>
           <w:szCs w:val="28"/>
           <w:shd w:val="clear" w:color="auto" w:fill="343541"/>
@@ -2960,8 +4694,9 @@
           <w:szCs w:val="28"/>
           <w:shd w:val="clear" w:color="auto" w:fill="343541"/>
         </w:rPr>
-        <w:t xml:space="preserve">для того чтобы пробрасывать зависимости (как минимум для телепорта которому </w:t>
-      </w:r>
+        <w:t xml:space="preserve">для того чтобы пробрасывать зависимости (как минимум </w:t>
+      </w:r>
+      <w:proofErr w:type="gramStart"/>
       <w:r>
         <w:rPr>
           <w:rFonts w:ascii="Times New Roman" w:hAnsi="Times New Roman" w:cs="Times New Roman"/>
@@ -2969,8 +4704,38 @@
           <w:szCs w:val="28"/>
           <w:shd w:val="clear" w:color="auto" w:fill="343541"/>
         </w:rPr>
+        <w:t>для телепорта</w:t>
+      </w:r>
+      <w:proofErr w:type="gramEnd"/>
+      <w:r>
+        <w:rPr>
+          <w:rFonts w:ascii="Times New Roman" w:hAnsi="Times New Roman" w:cs="Times New Roman"/>
+          <w:sz w:val="28"/>
+          <w:szCs w:val="28"/>
+          <w:shd w:val="clear" w:color="auto" w:fill="343541"/>
+        </w:rPr>
+        <w:t xml:space="preserve"> которому </w:t>
+      </w:r>
+      <w:r>
+        <w:rPr>
+          <w:rFonts w:ascii="Times New Roman" w:hAnsi="Times New Roman" w:cs="Times New Roman"/>
+          <w:sz w:val="28"/>
+          <w:szCs w:val="28"/>
+          <w:shd w:val="clear" w:color="auto" w:fill="343541"/>
+        </w:rPr>
         <w:lastRenderedPageBreak/>
-        <w:t>необходимо знать о прогрессе игрока, чтобы знать какую именно сцену ему грузить).</w:t>
+        <w:t xml:space="preserve">необходимо знать о прогрессе </w:t>
+      </w:r>
+      <w:bookmarkStart w:id="0" w:name="_GoBack"/>
+      <w:bookmarkEnd w:id="0"/>
+      <w:r>
+        <w:rPr>
+          <w:rFonts w:ascii="Times New Roman" w:hAnsi="Times New Roman" w:cs="Times New Roman"/>
+          <w:sz w:val="28"/>
+          <w:szCs w:val="28"/>
+          <w:shd w:val="clear" w:color="auto" w:fill="343541"/>
+        </w:rPr>
+        <w:t>игрока, чтобы знать какую именно сцену ему грузить).</w:t>
       </w:r>
     </w:p>
     <w:p>
@@ -2982,6 +4747,7 @@
         </w:numPr>
         <w:rPr>
           <w:rFonts w:ascii="Times New Roman" w:hAnsi="Times New Roman" w:cs="Times New Roman"/>
+          <w:strike/>
           <w:sz w:val="28"/>
           <w:szCs w:val="28"/>
           <w:shd w:val="clear" w:color="auto" w:fill="343541"/>
@@ -2990,14 +4756,13 @@
       <w:r>
         <w:rPr>
           <w:rFonts w:ascii="Times New Roman" w:hAnsi="Times New Roman" w:cs="Times New Roman"/>
+          <w:strike/>
           <w:sz w:val="28"/>
           <w:szCs w:val="28"/>
           <w:shd w:val="clear" w:color="auto" w:fill="343541"/>
         </w:rPr>
         <w:t>Обновить работу компонента загрузки сцену, а именно нужно решить куда лучше всего перенести строчку с сокрытием шторки загрузки.</w:t>
       </w:r>
-      <w:bookmarkStart w:id="0" w:name="_GoBack"/>
-      <w:bookmarkEnd w:id="0"/>
     </w:p>
     <w:p>
       <w:pPr>
@@ -3139,8 +4904,27 @@
           <w:color w:val="ECECF1"/>
           <w:shd w:val="clear" w:color="auto" w:fill="343541"/>
         </w:rPr>
-        <w:t xml:space="preserve">Пересмотреть работу системы спавна квестов. Мне не нравится то что фабрика квестов сама начинает спавнить как только она сама того пожелает, а что если измениться порядок работы </w:t>
-      </w:r>
+        <w:t xml:space="preserve">Пересмотреть работу системы спавна квестов. Мне не нравится то что фабрика квестов сама начинает </w:t>
+      </w:r>
+      <w:proofErr w:type="gramStart"/>
+      <w:r>
+        <w:rPr>
+          <w:rFonts w:ascii="Segoe UI" w:hAnsi="Segoe UI" w:cs="Segoe UI"/>
+          <w:color w:val="ECECF1"/>
+          <w:shd w:val="clear" w:color="auto" w:fill="343541"/>
+        </w:rPr>
+        <w:t>спавнить</w:t>
+      </w:r>
+      <w:proofErr w:type="gramEnd"/>
+      <w:r>
+        <w:rPr>
+          <w:rFonts w:ascii="Segoe UI" w:hAnsi="Segoe UI" w:cs="Segoe UI"/>
+          <w:color w:val="ECECF1"/>
+          <w:shd w:val="clear" w:color="auto" w:fill="343541"/>
+        </w:rPr>
+        <w:t xml:space="preserve"> как только она сама того пожелает, а что если измениться порядок работы </w:t>
+      </w:r>
+      <w:proofErr w:type="spellStart"/>
       <w:r>
         <w:rPr>
           <w:rFonts w:ascii="Segoe UI" w:hAnsi="Segoe UI" w:cs="Segoe UI"/>
@@ -3150,6 +4934,7 @@
         </w:rPr>
         <w:t>IPlayerProgressService</w:t>
       </w:r>
+      <w:proofErr w:type="spellEnd"/>
       <w:r>
         <w:rPr>
           <w:rFonts w:ascii="Segoe UI" w:hAnsi="Segoe UI" w:cs="Segoe UI"/>
@@ -4359,7 +6144,7 @@
 </file>
 
 <file path=customXml/itemProps1.xml><?xml version="1.0" encoding="utf-8"?>
-<ds:datastoreItem xmlns:ds="http://schemas.openxmlformats.org/officeDocument/2006/customXml" ds:itemID="{8EFFC11B-12ED-4B46-BC0A-51C7D60BF25C}">
+<ds:datastoreItem xmlns:ds="http://schemas.openxmlformats.org/officeDocument/2006/customXml" ds:itemID="{471100FC-4E3C-4D7C-AA03-F1C327438526}">
   <ds:schemaRefs>
     <ds:schemaRef ds:uri="http://schemas.openxmlformats.org/officeDocument/2006/bibliography"/>
   </ds:schemaRefs>

</xml_diff>

<commit_message>
End connect LevelGenerationSystem with Zenject.
</commit_message>
<xml_diff>
--- a/Итерации.docx
+++ b/Итерации.docx
@@ -4630,21 +4630,25 @@
         </w:numPr>
         <w:rPr>
           <w:rFonts w:ascii="Times New Roman" w:hAnsi="Times New Roman" w:cs="Times New Roman"/>
+          <w:strike/>
           <w:sz w:val="28"/>
           <w:szCs w:val="28"/>
           <w:shd w:val="clear" w:color="auto" w:fill="343541"/>
         </w:rPr>
       </w:pPr>
+      <w:bookmarkStart w:id="0" w:name="_GoBack"/>
       <w:r>
         <w:rPr>
           <w:rFonts w:ascii="Times New Roman" w:hAnsi="Times New Roman" w:cs="Times New Roman"/>
+          <w:strike/>
           <w:sz w:val="28"/>
           <w:szCs w:val="28"/>
           <w:shd w:val="clear" w:color="auto" w:fill="343541"/>
         </w:rPr>
-        <w:t>Начать работу над новой структурой уровня (компоненты управляющие чанками, обновить Настройки уровня, обновить состояние создания мобов и работу фабрики, пересмотреть поведение работы машины состояний).</w:t>
-      </w:r>
-    </w:p>
+        <w:t>Начать работу над новой структурой уровня (обновить Настройки уровня, обновить состояние создания мобов и работу фабрики, пересмотреть поведение работы машины состояний).</w:t>
+      </w:r>
+    </w:p>
+    <w:bookmarkEnd w:id="0"/>
     <w:p>
       <w:pPr>
         <w:pStyle w:val="a3"/>
@@ -4654,6 +4658,7 @@
         </w:numPr>
         <w:rPr>
           <w:rFonts w:ascii="Times New Roman" w:hAnsi="Times New Roman" w:cs="Times New Roman"/>
+          <w:strike/>
           <w:sz w:val="28"/>
           <w:szCs w:val="28"/>
           <w:shd w:val="clear" w:color="auto" w:fill="343541"/>
@@ -4662,6 +4667,7 @@
       <w:r>
         <w:rPr>
           <w:rFonts w:ascii="Times New Roman" w:hAnsi="Times New Roman" w:cs="Times New Roman"/>
+          <w:strike/>
           <w:sz w:val="28"/>
           <w:szCs w:val="28"/>
           <w:shd w:val="clear" w:color="auto" w:fill="343541"/>
@@ -4671,6 +4677,7 @@
       <w:r>
         <w:rPr>
           <w:rFonts w:ascii="Times New Roman" w:hAnsi="Times New Roman" w:cs="Times New Roman"/>
+          <w:strike/>
           <w:sz w:val="28"/>
           <w:szCs w:val="28"/>
           <w:shd w:val="clear" w:color="auto" w:fill="343541"/>
@@ -4681,61 +4688,45 @@
       <w:r>
         <w:rPr>
           <w:rFonts w:ascii="Times New Roman" w:hAnsi="Times New Roman" w:cs="Times New Roman"/>
+          <w:strike/>
           <w:sz w:val="28"/>
           <w:szCs w:val="28"/>
           <w:shd w:val="clear" w:color="auto" w:fill="343541"/>
         </w:rPr>
-        <w:t xml:space="preserve"> </w:t>
-      </w:r>
+        <w:t xml:space="preserve"> для того чтобы пробрасывать зависимости (как минимум </w:t>
+      </w:r>
+      <w:proofErr w:type="gramStart"/>
       <w:r>
         <w:rPr>
           <w:rFonts w:ascii="Times New Roman" w:hAnsi="Times New Roman" w:cs="Times New Roman"/>
+          <w:strike/>
           <w:sz w:val="28"/>
           <w:szCs w:val="28"/>
           <w:shd w:val="clear" w:color="auto" w:fill="343541"/>
         </w:rPr>
-        <w:t xml:space="preserve">для того чтобы пробрасывать зависимости (как минимум </w:t>
-      </w:r>
-      <w:proofErr w:type="gramStart"/>
+        <w:t>для телепорта</w:t>
+      </w:r>
+      <w:proofErr w:type="gramEnd"/>
       <w:r>
         <w:rPr>
           <w:rFonts w:ascii="Times New Roman" w:hAnsi="Times New Roman" w:cs="Times New Roman"/>
+          <w:strike/>
           <w:sz w:val="28"/>
           <w:szCs w:val="28"/>
           <w:shd w:val="clear" w:color="auto" w:fill="343541"/>
         </w:rPr>
-        <w:t>для телепорта</w:t>
-      </w:r>
-      <w:proofErr w:type="gramEnd"/>
+        <w:t xml:space="preserve"> которому </w:t>
+      </w:r>
       <w:r>
         <w:rPr>
           <w:rFonts w:ascii="Times New Roman" w:hAnsi="Times New Roman" w:cs="Times New Roman"/>
+          <w:strike/>
           <w:sz w:val="28"/>
           <w:szCs w:val="28"/>
           <w:shd w:val="clear" w:color="auto" w:fill="343541"/>
         </w:rPr>
-        <w:t xml:space="preserve"> которому </w:t>
-      </w:r>
-      <w:r>
-        <w:rPr>
-          <w:rFonts w:ascii="Times New Roman" w:hAnsi="Times New Roman" w:cs="Times New Roman"/>
-          <w:sz w:val="28"/>
-          <w:szCs w:val="28"/>
-          <w:shd w:val="clear" w:color="auto" w:fill="343541"/>
-        </w:rPr>
         <w:lastRenderedPageBreak/>
-        <w:t xml:space="preserve">необходимо знать о прогрессе </w:t>
-      </w:r>
-      <w:bookmarkStart w:id="0" w:name="_GoBack"/>
-      <w:bookmarkEnd w:id="0"/>
-      <w:r>
-        <w:rPr>
-          <w:rFonts w:ascii="Times New Roman" w:hAnsi="Times New Roman" w:cs="Times New Roman"/>
-          <w:sz w:val="28"/>
-          <w:szCs w:val="28"/>
-          <w:shd w:val="clear" w:color="auto" w:fill="343541"/>
-        </w:rPr>
-        <w:t>игрока, чтобы знать какую именно сцену ему грузить).</w:t>
+        <w:t>необходимо знать о прогрессе игрока, чтобы знать какую именно сцену ему грузить).</w:t>
       </w:r>
     </w:p>
     <w:p>
@@ -6144,7 +6135,7 @@
 </file>
 
 <file path=customXml/itemProps1.xml><?xml version="1.0" encoding="utf-8"?>
-<ds:datastoreItem xmlns:ds="http://schemas.openxmlformats.org/officeDocument/2006/customXml" ds:itemID="{471100FC-4E3C-4D7C-AA03-F1C327438526}">
+<ds:datastoreItem xmlns:ds="http://schemas.openxmlformats.org/officeDocument/2006/customXml" ds:itemID="{9D40DE53-9D75-46C0-9053-16E2AFA5671C}">
   <ds:schemaRefs>
     <ds:schemaRef ds:uri="http://schemas.openxmlformats.org/officeDocument/2006/bibliography"/>
   </ds:schemaRefs>

</xml_diff>

<commit_message>
End fix door. Starting developmed optimization component for displaying chunks.
</commit_message>
<xml_diff>
--- a/Итерации.docx
+++ b/Итерации.docx
@@ -36,27 +36,7 @@
           <w:color w:val="ECECF1"/>
           <w:shd w:val="clear" w:color="auto" w:fill="343541"/>
         </w:rPr>
-        <w:t xml:space="preserve">1 разобраться </w:t>
-      </w:r>
-      <w:proofErr w:type="gramStart"/>
-      <w:r>
-        <w:rPr>
-          <w:rFonts w:ascii="Segoe UI" w:hAnsi="Segoe UI" w:cs="Segoe UI"/>
-          <w:strike/>
-          <w:color w:val="ECECF1"/>
-          <w:shd w:val="clear" w:color="auto" w:fill="343541"/>
-        </w:rPr>
-        <w:t>из структурой</w:t>
-      </w:r>
-      <w:proofErr w:type="gramEnd"/>
-      <w:r>
-        <w:rPr>
-          <w:rFonts w:ascii="Segoe UI" w:hAnsi="Segoe UI" w:cs="Segoe UI"/>
-          <w:strike/>
-          <w:color w:val="ECECF1"/>
-          <w:shd w:val="clear" w:color="auto" w:fill="343541"/>
-        </w:rPr>
-        <w:t xml:space="preserve"> данных которая будет использоваться для сохранения данных игры. Структура должна быть организована на </w:t>
+        <w:t xml:space="preserve">1 разобраться из структурой данных которая будет использоваться для сохранения данных игры. Структура должна быть организована на </w:t>
       </w:r>
       <w:proofErr w:type="spellStart"/>
       <w:r>
@@ -127,25 +107,7 @@
           <w:color w:val="ECECF1"/>
           <w:shd w:val="clear" w:color="auto" w:fill="343541"/>
         </w:rPr>
-        <w:t xml:space="preserve">4 Продумать кто и каким образом будет собирать </w:t>
-      </w:r>
-      <w:proofErr w:type="gramStart"/>
-      <w:r>
-        <w:rPr>
-          <w:rFonts w:ascii="Segoe UI" w:hAnsi="Segoe UI" w:cs="Segoe UI"/>
-          <w:color w:val="ECECF1"/>
-          <w:shd w:val="clear" w:color="auto" w:fill="343541"/>
-        </w:rPr>
-        <w:t>компоненты</w:t>
-      </w:r>
-      <w:proofErr w:type="gramEnd"/>
-      <w:r>
-        <w:rPr>
-          <w:rFonts w:ascii="Segoe UI" w:hAnsi="Segoe UI" w:cs="Segoe UI"/>
-          <w:color w:val="ECECF1"/>
-          <w:shd w:val="clear" w:color="auto" w:fill="343541"/>
-        </w:rPr>
-        <w:t xml:space="preserve"> которые реализовывают интерфейсы для сохранения и/или загрузки данных. Возможно это должна быть фабрика. </w:t>
+        <w:t xml:space="preserve">4 Продумать кто и каким образом будет собирать компоненты которые реализовывают интерфейсы для сохранения и/или загрузки данных. Возможно это должна быть фабрика. </w:t>
       </w:r>
     </w:p>
     <w:p>
@@ -388,27 +350,7 @@
           <w:color w:val="ECECF1"/>
           <w:shd w:val="clear" w:color="auto" w:fill="343541"/>
         </w:rPr>
-        <w:t xml:space="preserve">4 Продумать кто и каким образом будет собирать </w:t>
-      </w:r>
-      <w:proofErr w:type="gramStart"/>
-      <w:r>
-        <w:rPr>
-          <w:rFonts w:ascii="Segoe UI" w:hAnsi="Segoe UI" w:cs="Segoe UI"/>
-          <w:strike/>
-          <w:color w:val="ECECF1"/>
-          <w:shd w:val="clear" w:color="auto" w:fill="343541"/>
-        </w:rPr>
-        <w:t>компоненты</w:t>
-      </w:r>
-      <w:proofErr w:type="gramEnd"/>
-      <w:r>
-        <w:rPr>
-          <w:rFonts w:ascii="Segoe UI" w:hAnsi="Segoe UI" w:cs="Segoe UI"/>
-          <w:strike/>
-          <w:color w:val="ECECF1"/>
-          <w:shd w:val="clear" w:color="auto" w:fill="343541"/>
-        </w:rPr>
-        <w:t xml:space="preserve"> которые реализовывают интерфейсы для сохранения и/или загрузки данных. Возможно это должна быть фабрика.</w:t>
+        <w:t>4 Продумать кто и каким образом будет собирать компоненты которые реализовывают интерфейсы для сохранения и/или загрузки данных. Возможно это должна быть фабрика.</w:t>
       </w:r>
     </w:p>
     <w:p>
@@ -526,27 +468,7 @@
           <w:color w:val="ECECF1"/>
           <w:shd w:val="clear" w:color="auto" w:fill="343541"/>
         </w:rPr>
-        <w:t xml:space="preserve">3 Написать поведение </w:t>
-      </w:r>
-      <w:proofErr w:type="gramStart"/>
-      <w:r>
-        <w:rPr>
-          <w:rFonts w:ascii="Segoe UI" w:hAnsi="Segoe UI" w:cs="Segoe UI"/>
-          <w:strike/>
-          <w:color w:val="ECECF1"/>
-          <w:shd w:val="clear" w:color="auto" w:fill="343541"/>
-        </w:rPr>
-        <w:t>для врагов</w:t>
-      </w:r>
-      <w:proofErr w:type="gramEnd"/>
-      <w:r>
-        <w:rPr>
-          <w:rFonts w:ascii="Segoe UI" w:hAnsi="Segoe UI" w:cs="Segoe UI"/>
-          <w:strike/>
-          <w:color w:val="ECECF1"/>
-          <w:shd w:val="clear" w:color="auto" w:fill="343541"/>
-        </w:rPr>
-        <w:t xml:space="preserve"> которые включают сл</w:t>
+        <w:t>3 Написать поведение для врагов которые включают сл</w:t>
       </w:r>
       <w:r>
         <w:rPr>
@@ -591,27 +513,7 @@
           <w:color w:val="ECECF1"/>
           <w:shd w:val="clear" w:color="auto" w:fill="343541"/>
         </w:rPr>
-        <w:t xml:space="preserve">5 Создать </w:t>
-      </w:r>
-      <w:proofErr w:type="gramStart"/>
-      <w:r>
-        <w:rPr>
-          <w:rFonts w:ascii="Segoe UI" w:hAnsi="Segoe UI" w:cs="Segoe UI"/>
-          <w:strike/>
-          <w:color w:val="ECECF1"/>
-          <w:shd w:val="clear" w:color="auto" w:fill="343541"/>
-        </w:rPr>
-        <w:t>телепорт</w:t>
-      </w:r>
-      <w:proofErr w:type="gramEnd"/>
-      <w:r>
-        <w:rPr>
-          <w:rFonts w:ascii="Segoe UI" w:hAnsi="Segoe UI" w:cs="Segoe UI"/>
-          <w:strike/>
-          <w:color w:val="ECECF1"/>
-          <w:shd w:val="clear" w:color="auto" w:fill="343541"/>
-        </w:rPr>
-        <w:t xml:space="preserve"> который будет пересылать игро</w:t>
+        <w:t>5 Создать телепорт который будет пересылать игро</w:t>
       </w:r>
       <w:r>
         <w:rPr>
@@ -785,27 +687,7 @@
           <w:color w:val="ECECF1"/>
           <w:shd w:val="clear" w:color="auto" w:fill="343541"/>
         </w:rPr>
-        <w:t xml:space="preserve"> уже имеются </w:t>
-      </w:r>
-      <w:proofErr w:type="gramStart"/>
-      <w:r>
-        <w:rPr>
-          <w:rFonts w:ascii="Segoe UI" w:hAnsi="Segoe UI" w:cs="Segoe UI"/>
-          <w:strike/>
-          <w:color w:val="ECECF1"/>
-          <w:shd w:val="clear" w:color="auto" w:fill="343541"/>
-        </w:rPr>
-        <w:t>управляющие компоненты</w:t>
-      </w:r>
-      <w:proofErr w:type="gramEnd"/>
-      <w:r>
-        <w:rPr>
-          <w:rFonts w:ascii="Segoe UI" w:hAnsi="Segoe UI" w:cs="Segoe UI"/>
-          <w:strike/>
-          <w:color w:val="ECECF1"/>
-          <w:shd w:val="clear" w:color="auto" w:fill="343541"/>
-        </w:rPr>
-        <w:t xml:space="preserve"> которые позволяют ии и игроку управлять атакой нужна только логика боевой системы. </w:t>
+        <w:t xml:space="preserve"> уже имеются управляющие компоненты которые позволяют ии и игроку управлять атакой нужна только логика боевой системы. </w:t>
       </w:r>
     </w:p>
     <w:p>
@@ -1035,86 +917,26 @@
           <w:color w:val="ECECF1"/>
           <w:shd w:val="clear" w:color="auto" w:fill="343541"/>
         </w:rPr>
-        <w:t xml:space="preserve"> инвентаря, это нужно сделать чтобы список предметов, а точнее хилок и их количество сохранялось в </w:t>
-      </w:r>
-      <w:proofErr w:type="gramStart"/>
-      <w:r>
-        <w:rPr>
-          <w:rFonts w:ascii="Segoe UI" w:hAnsi="Segoe UI" w:cs="Segoe UI"/>
-          <w:strike/>
-          <w:color w:val="ECECF1"/>
-          <w:shd w:val="clear" w:color="auto" w:fill="343541"/>
-        </w:rPr>
-        <w:t>память</w:t>
-      </w:r>
-      <w:proofErr w:type="gramEnd"/>
-      <w:r>
-        <w:rPr>
-          <w:rFonts w:ascii="Segoe UI" w:hAnsi="Segoe UI" w:cs="Segoe UI"/>
-          <w:strike/>
-          <w:color w:val="ECECF1"/>
-          <w:shd w:val="clear" w:color="auto" w:fill="343541"/>
-        </w:rPr>
-        <w:t xml:space="preserve"> и чтобы его можно было загрузить при продолжении игры </w:t>
-      </w:r>
-    </w:p>
-    <w:p>
-      <w:pPr>
-        <w:rPr>
-          <w:rFonts w:ascii="Segoe UI" w:hAnsi="Segoe UI" w:cs="Segoe UI"/>
-          <w:strike/>
-          <w:color w:val="ECECF1"/>
-          <w:shd w:val="clear" w:color="auto" w:fill="343541"/>
-        </w:rPr>
-      </w:pPr>
-      <w:r>
-        <w:rPr>
-          <w:rFonts w:ascii="Segoe UI" w:hAnsi="Segoe UI" w:cs="Segoe UI"/>
-          <w:strike/>
-          <w:color w:val="ECECF1"/>
-          <w:shd w:val="clear" w:color="auto" w:fill="343541"/>
-        </w:rPr>
-        <w:t xml:space="preserve">2 искать </w:t>
-      </w:r>
-      <w:proofErr w:type="gramStart"/>
-      <w:r>
-        <w:rPr>
-          <w:rFonts w:ascii="Segoe UI" w:hAnsi="Segoe UI" w:cs="Segoe UI"/>
-          <w:strike/>
-          <w:color w:val="ECECF1"/>
-          <w:shd w:val="clear" w:color="auto" w:fill="343541"/>
-        </w:rPr>
-        <w:t>визуальные эффекты</w:t>
-      </w:r>
-      <w:proofErr w:type="gramEnd"/>
-      <w:r>
-        <w:rPr>
-          <w:rFonts w:ascii="Segoe UI" w:hAnsi="Segoe UI" w:cs="Segoe UI"/>
-          <w:strike/>
-          <w:color w:val="ECECF1"/>
-          <w:shd w:val="clear" w:color="auto" w:fill="343541"/>
-        </w:rPr>
-        <w:t xml:space="preserve"> которые отображают смерть игрока и нпс. Также нужно поискать </w:t>
-      </w:r>
-      <w:proofErr w:type="gramStart"/>
-      <w:r>
-        <w:rPr>
-          <w:rFonts w:ascii="Segoe UI" w:hAnsi="Segoe UI" w:cs="Segoe UI"/>
-          <w:strike/>
-          <w:color w:val="ECECF1"/>
-          <w:shd w:val="clear" w:color="auto" w:fill="343541"/>
-        </w:rPr>
-        <w:t>картинки</w:t>
-      </w:r>
-      <w:proofErr w:type="gramEnd"/>
-      <w:r>
-        <w:rPr>
-          <w:rFonts w:ascii="Segoe UI" w:hAnsi="Segoe UI" w:cs="Segoe UI"/>
-          <w:strike/>
-          <w:color w:val="ECECF1"/>
-          <w:shd w:val="clear" w:color="auto" w:fill="343541"/>
-        </w:rPr>
-        <w:t xml:space="preserve"> которые буду использовать в GUI для хилок и для полоски здоровья </w:t>
+        <w:t xml:space="preserve"> инвентаря, это нужно сделать чтобы список предметов, а точнее хилок и их количество сохранялось в память и чтобы его можно было загрузить при продолжении игры </w:t>
+      </w:r>
+    </w:p>
+    <w:p>
+      <w:pPr>
+        <w:rPr>
+          <w:rFonts w:ascii="Segoe UI" w:hAnsi="Segoe UI" w:cs="Segoe UI"/>
+          <w:strike/>
+          <w:color w:val="ECECF1"/>
+          <w:shd w:val="clear" w:color="auto" w:fill="343541"/>
+        </w:rPr>
+      </w:pPr>
+      <w:r>
+        <w:rPr>
+          <w:rFonts w:ascii="Segoe UI" w:hAnsi="Segoe UI" w:cs="Segoe UI"/>
+          <w:strike/>
+          <w:color w:val="ECECF1"/>
+          <w:shd w:val="clear" w:color="auto" w:fill="343541"/>
+        </w:rPr>
+        <w:t xml:space="preserve">2 искать визуальные эффекты которые отображают смерть игрока и нпс. Также нужно поискать картинки которые буду использовать в GUI для хилок и для полоски здоровья </w:t>
       </w:r>
     </w:p>
     <w:p>
@@ -1169,27 +991,7 @@
           <w:color w:val="ECECF1"/>
           <w:shd w:val="clear" w:color="auto" w:fill="343541"/>
         </w:rPr>
-        <w:t xml:space="preserve">5 Работа со светом. Просмотреть разные варианты. Но нужно </w:t>
-      </w:r>
-      <w:proofErr w:type="gramStart"/>
-      <w:r>
-        <w:rPr>
-          <w:rFonts w:ascii="Segoe UI" w:hAnsi="Segoe UI" w:cs="Segoe UI"/>
-          <w:strike/>
-          <w:color w:val="ECECF1"/>
-          <w:shd w:val="clear" w:color="auto" w:fill="343541"/>
-        </w:rPr>
-        <w:t>помнить</w:t>
-      </w:r>
-      <w:proofErr w:type="gramEnd"/>
-      <w:r>
-        <w:rPr>
-          <w:rFonts w:ascii="Segoe UI" w:hAnsi="Segoe UI" w:cs="Segoe UI"/>
-          <w:strike/>
-          <w:color w:val="ECECF1"/>
-          <w:shd w:val="clear" w:color="auto" w:fill="343541"/>
-        </w:rPr>
-        <w:t xml:space="preserve"> что </w:t>
+        <w:t xml:space="preserve">5 Работа со светом. Просмотреть разные варианты. Но нужно помнить что </w:t>
       </w:r>
       <w:proofErr w:type="spellStart"/>
       <w:r>
@@ -1305,27 +1107,7 @@
           <w:color w:val="ECECF1"/>
           <w:shd w:val="clear" w:color="auto" w:fill="343541"/>
         </w:rPr>
-        <w:t xml:space="preserve">8 Пересмотреть скрипты и </w:t>
-      </w:r>
-      <w:proofErr w:type="gramStart"/>
-      <w:r>
-        <w:rPr>
-          <w:rFonts w:ascii="Segoe UI" w:hAnsi="Segoe UI" w:cs="Segoe UI"/>
-          <w:strike/>
-          <w:color w:val="ECECF1"/>
-          <w:shd w:val="clear" w:color="auto" w:fill="343541"/>
-        </w:rPr>
-        <w:t>те</w:t>
-      </w:r>
-      <w:proofErr w:type="gramEnd"/>
-      <w:r>
-        <w:rPr>
-          <w:rFonts w:ascii="Segoe UI" w:hAnsi="Segoe UI" w:cs="Segoe UI"/>
-          <w:strike/>
-          <w:color w:val="ECECF1"/>
-          <w:shd w:val="clear" w:color="auto" w:fill="343541"/>
-        </w:rPr>
-        <w:t xml:space="preserve"> которые не используют статик дату, перевести на использование статик даты, а именно это относиться к </w:t>
+        <w:t xml:space="preserve">8 Пересмотреть скрипты и те которые не используют статик дату, перевести на использование статик даты, а именно это относиться к </w:t>
       </w:r>
       <w:proofErr w:type="spellStart"/>
       <w:r>
@@ -1442,25 +1224,7 @@
           <w:color w:val="ECECF1"/>
           <w:shd w:val="clear" w:color="auto" w:fill="343541"/>
         </w:rPr>
-        <w:t xml:space="preserve">Второй и третий пункт хоть и выглядят достаточно </w:t>
-      </w:r>
-      <w:proofErr w:type="gramStart"/>
-      <w:r>
-        <w:rPr>
-          <w:rFonts w:ascii="Segoe UI" w:hAnsi="Segoe UI" w:cs="Segoe UI"/>
-          <w:color w:val="ECECF1"/>
-          <w:shd w:val="clear" w:color="auto" w:fill="343541"/>
-        </w:rPr>
-        <w:t>просто</w:t>
-      </w:r>
-      <w:proofErr w:type="gramEnd"/>
-      <w:r>
-        <w:rPr>
-          <w:rFonts w:ascii="Segoe UI" w:hAnsi="Segoe UI" w:cs="Segoe UI"/>
-          <w:color w:val="ECECF1"/>
-          <w:shd w:val="clear" w:color="auto" w:fill="343541"/>
-        </w:rPr>
-        <w:t xml:space="preserve"> но на самом деле именно эти два пункта содержат колоссальную работу над проектом.</w:t>
+        <w:t>Второй и третий пункт хоть и выглядят достаточно просто но на самом деле именно эти два пункта содержат колоссальную работу над проектом.</w:t>
       </w:r>
     </w:p>
     <w:p>
@@ -1604,27 +1368,7 @@
           <w:color w:val="ECECF1"/>
           <w:shd w:val="clear" w:color="auto" w:fill="343541"/>
         </w:rPr>
-        <w:t xml:space="preserve">5 Начать погружаться в квестовую систему. Это достаточно крупный шаг и </w:t>
-      </w:r>
-      <w:proofErr w:type="gramStart"/>
-      <w:r>
-        <w:rPr>
-          <w:rFonts w:ascii="Segoe UI" w:hAnsi="Segoe UI" w:cs="Segoe UI"/>
-          <w:strike/>
-          <w:color w:val="ECECF1"/>
-          <w:shd w:val="clear" w:color="auto" w:fill="343541"/>
-        </w:rPr>
-        <w:t>по этому</w:t>
-      </w:r>
-      <w:proofErr w:type="gramEnd"/>
-      <w:r>
-        <w:rPr>
-          <w:rFonts w:ascii="Segoe UI" w:hAnsi="Segoe UI" w:cs="Segoe UI"/>
-          <w:strike/>
-          <w:color w:val="ECECF1"/>
-          <w:shd w:val="clear" w:color="auto" w:fill="343541"/>
-        </w:rPr>
-        <w:t xml:space="preserve"> он займет больше всего времени, хотя и на первый взгляд все написано просто.</w:t>
+        <w:t>5 Начать погружаться в квестовую систему. Это достаточно крупный шаг и по этому он займет больше всего времени, хотя и на первый взгляд все написано просто.</w:t>
       </w:r>
     </w:p>
     <w:p>
@@ -1767,25 +1511,7 @@
           <w:color w:val="ECECF1"/>
           <w:shd w:val="clear" w:color="auto" w:fill="343541"/>
         </w:rPr>
-        <w:t xml:space="preserve">2а </w:t>
-      </w:r>
-      <w:proofErr w:type="gramStart"/>
-      <w:r>
-        <w:rPr>
-          <w:rFonts w:ascii="Segoe UI" w:hAnsi="Segoe UI" w:cs="Segoe UI"/>
-          <w:color w:val="ECECF1"/>
-          <w:shd w:val="clear" w:color="auto" w:fill="343541"/>
-        </w:rPr>
-        <w:t>Завершить</w:t>
-      </w:r>
-      <w:proofErr w:type="gramEnd"/>
-      <w:r>
-        <w:rPr>
-          <w:rFonts w:ascii="Segoe UI" w:hAnsi="Segoe UI" w:cs="Segoe UI"/>
-          <w:color w:val="ECECF1"/>
-          <w:shd w:val="clear" w:color="auto" w:fill="343541"/>
-        </w:rPr>
-        <w:t xml:space="preserve"> прототип, получив работоспособную квестовую систему. </w:t>
+        <w:t xml:space="preserve">2а Завершить прототип, получив работоспособную квестовую систему. </w:t>
       </w:r>
     </w:p>
     <w:p>
@@ -1803,25 +1529,7 @@
           <w:color w:val="ECECF1"/>
           <w:shd w:val="clear" w:color="auto" w:fill="343541"/>
         </w:rPr>
-        <w:t xml:space="preserve">2б </w:t>
-      </w:r>
-      <w:proofErr w:type="gramStart"/>
-      <w:r>
-        <w:rPr>
-          <w:rFonts w:ascii="Segoe UI" w:hAnsi="Segoe UI" w:cs="Segoe UI"/>
-          <w:color w:val="ECECF1"/>
-          <w:shd w:val="clear" w:color="auto" w:fill="343541"/>
-        </w:rPr>
-        <w:t>Контролировать</w:t>
-      </w:r>
-      <w:proofErr w:type="gramEnd"/>
-      <w:r>
-        <w:rPr>
-          <w:rFonts w:ascii="Segoe UI" w:hAnsi="Segoe UI" w:cs="Segoe UI"/>
-          <w:color w:val="ECECF1"/>
-          <w:shd w:val="clear" w:color="auto" w:fill="343541"/>
-        </w:rPr>
-        <w:t xml:space="preserve"> состояние архитектуры при разработке доработке прототипа </w:t>
+        <w:t xml:space="preserve">2б Контролировать состояние архитектуры при разработке доработке прототипа </w:t>
       </w:r>
       <w:proofErr w:type="spellStart"/>
       <w:r>
@@ -1907,25 +1615,7 @@
           <w:color w:val="ECECF1"/>
           <w:shd w:val="clear" w:color="auto" w:fill="343541"/>
         </w:rPr>
-        <w:t xml:space="preserve">6 Готовиться к реализации системы торговли. </w:t>
-      </w:r>
-      <w:proofErr w:type="gramStart"/>
-      <w:r>
-        <w:rPr>
-          <w:rFonts w:ascii="Segoe UI" w:hAnsi="Segoe UI" w:cs="Segoe UI"/>
-          <w:color w:val="ECECF1"/>
-          <w:shd w:val="clear" w:color="auto" w:fill="343541"/>
-        </w:rPr>
-        <w:t>Также</w:t>
-      </w:r>
-      <w:proofErr w:type="gramEnd"/>
-      <w:r>
-        <w:rPr>
-          <w:rFonts w:ascii="Segoe UI" w:hAnsi="Segoe UI" w:cs="Segoe UI"/>
-          <w:color w:val="ECECF1"/>
-          <w:shd w:val="clear" w:color="auto" w:fill="343541"/>
-        </w:rPr>
-        <w:t xml:space="preserve"> как и второй этап достаточно длительный.</w:t>
+        <w:t>6 Готовиться к реализации системы торговли. Также как и второй этап достаточно длительный.</w:t>
       </w:r>
     </w:p>
     <w:p>
@@ -2026,25 +1716,7 @@
           <w:color w:val="ECECF1"/>
           <w:shd w:val="clear" w:color="auto" w:fill="343541"/>
         </w:rPr>
-        <w:t xml:space="preserve">4 Готовится </w:t>
-      </w:r>
-      <w:proofErr w:type="gramStart"/>
-      <w:r>
-        <w:rPr>
-          <w:rFonts w:ascii="Segoe UI" w:hAnsi="Segoe UI" w:cs="Segoe UI"/>
-          <w:color w:val="ECECF1"/>
-          <w:shd w:val="clear" w:color="auto" w:fill="343541"/>
-        </w:rPr>
-        <w:t>к разработки</w:t>
-      </w:r>
-      <w:proofErr w:type="gramEnd"/>
-      <w:r>
-        <w:rPr>
-          <w:rFonts w:ascii="Segoe UI" w:hAnsi="Segoe UI" w:cs="Segoe UI"/>
-          <w:color w:val="ECECF1"/>
-          <w:shd w:val="clear" w:color="auto" w:fill="343541"/>
-        </w:rPr>
-        <w:t xml:space="preserve"> системы торговли.</w:t>
+        <w:t>4 Готовится к разработки системы торговли.</w:t>
       </w:r>
     </w:p>
     <w:p>
@@ -2108,27 +1780,7 @@
           <w:color w:val="ECECF1"/>
           <w:shd w:val="clear" w:color="auto" w:fill="343541"/>
         </w:rPr>
-        <w:t xml:space="preserve">2 Нужно решить </w:t>
-      </w:r>
-      <w:proofErr w:type="gramStart"/>
-      <w:r>
-        <w:rPr>
-          <w:rFonts w:ascii="Segoe UI" w:hAnsi="Segoe UI" w:cs="Segoe UI"/>
-          <w:strike/>
-          <w:color w:val="ECECF1"/>
-          <w:shd w:val="clear" w:color="auto" w:fill="343541"/>
-        </w:rPr>
-        <w:t>проблему</w:t>
-      </w:r>
-      <w:proofErr w:type="gramEnd"/>
-      <w:r>
-        <w:rPr>
-          <w:rFonts w:ascii="Segoe UI" w:hAnsi="Segoe UI" w:cs="Segoe UI"/>
-          <w:strike/>
-          <w:color w:val="ECECF1"/>
-          <w:shd w:val="clear" w:color="auto" w:fill="343541"/>
-        </w:rPr>
-        <w:t xml:space="preserve"> связанную с отображением окна квест </w:t>
+        <w:t xml:space="preserve">2 Нужно решить проблему связанную с отображением окна квест </w:t>
       </w:r>
       <w:proofErr w:type="spellStart"/>
       <w:r>
@@ -2844,25 +2496,7 @@
           <w:color w:val="ECECF1"/>
           <w:shd w:val="clear" w:color="auto" w:fill="343541"/>
         </w:rPr>
-        <w:t xml:space="preserve">2 Создать </w:t>
-      </w:r>
-      <w:proofErr w:type="gramStart"/>
-      <w:r>
-        <w:rPr>
-          <w:rFonts w:ascii="Segoe UI" w:hAnsi="Segoe UI" w:cs="Segoe UI"/>
-          <w:color w:val="ECECF1"/>
-          <w:shd w:val="clear" w:color="auto" w:fill="343541"/>
-        </w:rPr>
-        <w:t>компонент</w:t>
-      </w:r>
-      <w:proofErr w:type="gramEnd"/>
-      <w:r>
-        <w:rPr>
-          <w:rFonts w:ascii="Segoe UI" w:hAnsi="Segoe UI" w:cs="Segoe UI"/>
-          <w:color w:val="ECECF1"/>
-          <w:shd w:val="clear" w:color="auto" w:fill="343541"/>
-        </w:rPr>
-        <w:t xml:space="preserve"> который расширит возможности для системы взаимодействия, и позволит игроку делать выбор какой именно тип взаимодействия желает получить игрок если таких типов взаимодействия </w:t>
+        <w:t xml:space="preserve">2 Создать компонент который расширит возможности для системы взаимодействия, и позволит игроку делать выбор какой именно тип взаимодействия желает получить игрок если таких типов взаимодействия </w:t>
       </w:r>
       <w:proofErr w:type="spellStart"/>
       <w:r>
@@ -3003,27 +2637,7 @@
           <w:color w:val="ECECF1"/>
           <w:shd w:val="clear" w:color="auto" w:fill="343541"/>
         </w:rPr>
-        <w:t xml:space="preserve">1 Добавить </w:t>
-      </w:r>
-      <w:proofErr w:type="gramStart"/>
-      <w:r>
-        <w:rPr>
-          <w:rFonts w:ascii="Segoe UI" w:hAnsi="Segoe UI" w:cs="Segoe UI"/>
-          <w:strike/>
-          <w:color w:val="ECECF1"/>
-          <w:shd w:val="clear" w:color="auto" w:fill="343541"/>
-        </w:rPr>
-        <w:t>функционал</w:t>
-      </w:r>
-      <w:proofErr w:type="gramEnd"/>
-      <w:r>
-        <w:rPr>
-          <w:rFonts w:ascii="Segoe UI" w:hAnsi="Segoe UI" w:cs="Segoe UI"/>
-          <w:strike/>
-          <w:color w:val="ECECF1"/>
-          <w:shd w:val="clear" w:color="auto" w:fill="343541"/>
-        </w:rPr>
-        <w:t xml:space="preserve"> который будет сохранять текущее количество денег игрока в файл сохранения.</w:t>
+        <w:t>1 Добавить функционал который будет сохранять текущее количество денег игрока в файл сохранения.</w:t>
       </w:r>
     </w:p>
     <w:p>
@@ -3138,62 +2752,24 @@
           <w:shd w:val="clear" w:color="auto" w:fill="343541"/>
         </w:rPr>
         <w:lastRenderedPageBreak/>
-        <w:t xml:space="preserve">7 Натянуть анимации </w:t>
-      </w:r>
-      <w:proofErr w:type="gramStart"/>
-      <w:r>
-        <w:rPr>
-          <w:rFonts w:ascii="Segoe UI" w:hAnsi="Segoe UI" w:cs="Segoe UI"/>
-          <w:strike/>
-          <w:color w:val="ECECF1"/>
-          <w:shd w:val="clear" w:color="auto" w:fill="343541"/>
-        </w:rPr>
-        <w:t>на мобов</w:t>
-      </w:r>
-      <w:proofErr w:type="gramEnd"/>
-      <w:r>
-        <w:rPr>
-          <w:rFonts w:ascii="Segoe UI" w:hAnsi="Segoe UI" w:cs="Segoe UI"/>
-          <w:strike/>
-          <w:color w:val="ECECF1"/>
-          <w:shd w:val="clear" w:color="auto" w:fill="343541"/>
-        </w:rPr>
-        <w:t>.</w:t>
-      </w:r>
-    </w:p>
-    <w:p>
-      <w:pPr>
-        <w:rPr>
-          <w:rFonts w:ascii="Segoe UI" w:hAnsi="Segoe UI" w:cs="Segoe UI"/>
-          <w:color w:val="ECECF1"/>
-          <w:shd w:val="clear" w:color="auto" w:fill="343541"/>
-        </w:rPr>
-      </w:pPr>
-      <w:r>
-        <w:rPr>
-          <w:rFonts w:ascii="Segoe UI" w:hAnsi="Segoe UI" w:cs="Segoe UI"/>
-          <w:color w:val="ECECF1"/>
-          <w:shd w:val="clear" w:color="auto" w:fill="343541"/>
-        </w:rPr>
-        <w:t xml:space="preserve">8 </w:t>
-      </w:r>
-      <w:proofErr w:type="gramStart"/>
-      <w:r>
-        <w:rPr>
-          <w:rFonts w:ascii="Segoe UI" w:hAnsi="Segoe UI" w:cs="Segoe UI"/>
-          <w:color w:val="ECECF1"/>
-          <w:shd w:val="clear" w:color="auto" w:fill="343541"/>
-        </w:rPr>
-        <w:t>Думать</w:t>
-      </w:r>
-      <w:proofErr w:type="gramEnd"/>
-      <w:r>
-        <w:rPr>
-          <w:rFonts w:ascii="Segoe UI" w:hAnsi="Segoe UI" w:cs="Segoe UI"/>
-          <w:color w:val="ECECF1"/>
-          <w:shd w:val="clear" w:color="auto" w:fill="343541"/>
-        </w:rPr>
-        <w:t xml:space="preserve"> как можно организовать рандомную генерацию мира, и начать работу над прототипом </w:t>
+        <w:t>7 Натянуть анимации на мобов.</w:t>
+      </w:r>
+    </w:p>
+    <w:p>
+      <w:pPr>
+        <w:rPr>
+          <w:rFonts w:ascii="Segoe UI" w:hAnsi="Segoe UI" w:cs="Segoe UI"/>
+          <w:color w:val="ECECF1"/>
+          <w:shd w:val="clear" w:color="auto" w:fill="343541"/>
+        </w:rPr>
+      </w:pPr>
+      <w:r>
+        <w:rPr>
+          <w:rFonts w:ascii="Segoe UI" w:hAnsi="Segoe UI" w:cs="Segoe UI"/>
+          <w:color w:val="ECECF1"/>
+          <w:shd w:val="clear" w:color="auto" w:fill="343541"/>
+        </w:rPr>
+        <w:t xml:space="preserve">8 Думать как можно организовать рандомную генерацию мира, и начать работу над прототипом </w:t>
       </w:r>
       <w:proofErr w:type="spellStart"/>
       <w:r>
@@ -3256,47 +2832,7 @@
           <w:color w:val="ECECF1"/>
           <w:shd w:val="clear" w:color="auto" w:fill="343541"/>
         </w:rPr>
-        <w:t xml:space="preserve">1 Исправить систему хранилища игровых предметов. Основная проблема состоит в </w:t>
-      </w:r>
-      <w:proofErr w:type="gramStart"/>
-      <w:r>
-        <w:rPr>
-          <w:rFonts w:ascii="Segoe UI" w:hAnsi="Segoe UI" w:cs="Segoe UI"/>
-          <w:strike/>
-          <w:color w:val="ECECF1"/>
-          <w:shd w:val="clear" w:color="auto" w:fill="343541"/>
-        </w:rPr>
-        <w:t>том</w:t>
-      </w:r>
-      <w:proofErr w:type="gramEnd"/>
-      <w:r>
-        <w:rPr>
-          <w:rFonts w:ascii="Segoe UI" w:hAnsi="Segoe UI" w:cs="Segoe UI"/>
-          <w:strike/>
-          <w:color w:val="ECECF1"/>
-          <w:shd w:val="clear" w:color="auto" w:fill="343541"/>
-        </w:rPr>
-        <w:t xml:space="preserve"> что система хранилища была доработана для системы торговли после ее первого создания, что добавило баг. Суть проблемы в том что система торговли </w:t>
-      </w:r>
-      <w:proofErr w:type="gramStart"/>
-      <w:r>
-        <w:rPr>
-          <w:rFonts w:ascii="Segoe UI" w:hAnsi="Segoe UI" w:cs="Segoe UI"/>
-          <w:strike/>
-          <w:color w:val="ECECF1"/>
-          <w:shd w:val="clear" w:color="auto" w:fill="343541"/>
-        </w:rPr>
-        <w:t>оперирует(</w:t>
-      </w:r>
-      <w:proofErr w:type="gramEnd"/>
-      <w:r>
-        <w:rPr>
-          <w:rFonts w:ascii="Segoe UI" w:hAnsi="Segoe UI" w:cs="Segoe UI"/>
-          <w:strike/>
-          <w:color w:val="ECECF1"/>
-          <w:shd w:val="clear" w:color="auto" w:fill="343541"/>
-        </w:rPr>
-        <w:t xml:space="preserve">помещает и извлекает предметы) с хранилищем на самом низком уровне, в то время как часть функционала который занимается обновлением UI инвентаря игрока находится на более высоком уровне, что привело к тому что инвентарь не обновляется после покупки продажи предметов. </w:t>
+        <w:t xml:space="preserve">1 Исправить систему хранилища игровых предметов. Основная проблема состоит в том что система хранилища была доработана для системы торговли после ее первого создания, что добавило баг. Суть проблемы в том что система торговли оперирует(помещает и извлекает предметы) с хранилищем на самом низком уровне, в то время как часть функционала который занимается обновлением UI инвентаря игрока находится на более высоком уровне, что привело к тому что инвентарь не обновляется после покупки продажи предметов. </w:t>
       </w:r>
     </w:p>
     <w:p>
@@ -3318,7 +2854,6 @@
         <w:t xml:space="preserve">2 Следующая проблемы являются </w:t>
       </w:r>
       <w:proofErr w:type="spellStart"/>
-      <w:proofErr w:type="gramStart"/>
       <w:r>
         <w:rPr>
           <w:rFonts w:ascii="Segoe UI" w:hAnsi="Segoe UI" w:cs="Segoe UI"/>
@@ -3329,7 +2864,6 @@
         <w:t>комплекснимы</w:t>
       </w:r>
       <w:proofErr w:type="spellEnd"/>
-      <w:proofErr w:type="gramEnd"/>
       <w:r>
         <w:rPr>
           <w:rFonts w:ascii="Segoe UI" w:hAnsi="Segoe UI" w:cs="Segoe UI"/>
@@ -3357,27 +2891,7 @@
           <w:color w:val="ECECF1"/>
           <w:shd w:val="clear" w:color="auto" w:fill="343541"/>
         </w:rPr>
-        <w:t xml:space="preserve"> несколько различных подсистем в игру появляются некоторые сложности в управлении проекта </w:t>
-      </w:r>
-      <w:proofErr w:type="gramStart"/>
-      <w:r>
-        <w:rPr>
-          <w:rFonts w:ascii="Segoe UI" w:hAnsi="Segoe UI" w:cs="Segoe UI"/>
-          <w:strike/>
-          <w:color w:val="ECECF1"/>
-          <w:shd w:val="clear" w:color="auto" w:fill="343541"/>
-        </w:rPr>
-        <w:t>из-за того что</w:t>
-      </w:r>
-      <w:proofErr w:type="gramEnd"/>
-      <w:r>
-        <w:rPr>
-          <w:rFonts w:ascii="Segoe UI" w:hAnsi="Segoe UI" w:cs="Segoe UI"/>
-          <w:strike/>
-          <w:color w:val="ECECF1"/>
-          <w:shd w:val="clear" w:color="auto" w:fill="343541"/>
-        </w:rPr>
-        <w:t xml:space="preserve"> все </w:t>
+        <w:t xml:space="preserve"> несколько различных подсистем в игру появляются некоторые сложности в управлении проекта из-за того что все </w:t>
       </w:r>
       <w:proofErr w:type="spellStart"/>
       <w:r>
@@ -3437,27 +2951,7 @@
           <w:color w:val="ECECF1"/>
           <w:shd w:val="clear" w:color="auto" w:fill="343541"/>
         </w:rPr>
-        <w:t xml:space="preserve"> их порой приходится искать </w:t>
-      </w:r>
-      <w:proofErr w:type="gramStart"/>
-      <w:r>
-        <w:rPr>
-          <w:rFonts w:ascii="Segoe UI" w:hAnsi="Segoe UI" w:cs="Segoe UI"/>
-          <w:strike/>
-          <w:color w:val="ECECF1"/>
-          <w:shd w:val="clear" w:color="auto" w:fill="343541"/>
-        </w:rPr>
-        <w:t>там где</w:t>
-      </w:r>
-      <w:proofErr w:type="gramEnd"/>
-      <w:r>
-        <w:rPr>
-          <w:rFonts w:ascii="Segoe UI" w:hAnsi="Segoe UI" w:cs="Segoe UI"/>
-          <w:strike/>
-          <w:color w:val="ECECF1"/>
-          <w:shd w:val="clear" w:color="auto" w:fill="343541"/>
-        </w:rPr>
-        <w:t xml:space="preserve"> их не должно быть. </w:t>
+        <w:t xml:space="preserve"> их порой приходится искать там где их не должно быть. </w:t>
       </w:r>
     </w:p>
     <w:p>
@@ -3511,25 +3005,7 @@
           <w:color w:val="ECECF1"/>
           <w:shd w:val="clear" w:color="auto" w:fill="343541"/>
         </w:rPr>
-        <w:t xml:space="preserve"> хочу запустить в разработку прототип новой боевой системы, который позволит улучшить текущую, точного представления то как она должна выглядеть нету, </w:t>
-      </w:r>
-      <w:proofErr w:type="gramStart"/>
-      <w:r>
-        <w:rPr>
-          <w:rFonts w:ascii="Segoe UI" w:hAnsi="Segoe UI" w:cs="Segoe UI"/>
-          <w:color w:val="ECECF1"/>
-          <w:shd w:val="clear" w:color="auto" w:fill="343541"/>
-        </w:rPr>
-        <w:t>во время</w:t>
-      </w:r>
-      <w:proofErr w:type="gramEnd"/>
-      <w:r>
-        <w:rPr>
-          <w:rFonts w:ascii="Segoe UI" w:hAnsi="Segoe UI" w:cs="Segoe UI"/>
-          <w:color w:val="ECECF1"/>
-          <w:shd w:val="clear" w:color="auto" w:fill="343541"/>
-        </w:rPr>
-        <w:t xml:space="preserve"> </w:t>
+        <w:t xml:space="preserve"> хочу запустить в разработку прототип новой боевой системы, который позволит улучшить текущую, точного представления то как она должна выглядеть нету, во время </w:t>
       </w:r>
       <w:proofErr w:type="spellStart"/>
       <w:r>
@@ -3547,25 +3023,7 @@
           <w:color w:val="ECECF1"/>
           <w:shd w:val="clear" w:color="auto" w:fill="343541"/>
         </w:rPr>
-        <w:t xml:space="preserve"> надеюсь что найду хороший вариант. Зачем обновлять эту механику? Все просто если посмотреть на мой текущий </w:t>
-      </w:r>
-      <w:proofErr w:type="gramStart"/>
-      <w:r>
-        <w:rPr>
-          <w:rFonts w:ascii="Segoe UI" w:hAnsi="Segoe UI" w:cs="Segoe UI"/>
-          <w:color w:val="ECECF1"/>
-          <w:shd w:val="clear" w:color="auto" w:fill="343541"/>
-        </w:rPr>
-        <w:t>проект</w:t>
-      </w:r>
-      <w:proofErr w:type="gramEnd"/>
-      <w:r>
-        <w:rPr>
-          <w:rFonts w:ascii="Segoe UI" w:hAnsi="Segoe UI" w:cs="Segoe UI"/>
-          <w:color w:val="ECECF1"/>
-          <w:shd w:val="clear" w:color="auto" w:fill="343541"/>
-        </w:rPr>
-        <w:t xml:space="preserve"> то основная часть </w:t>
+        <w:t xml:space="preserve"> надеюсь что найду хороший вариант. Зачем обновлять эту механику? Все просто если посмотреть на мой текущий проект то основная часть </w:t>
       </w:r>
       <w:proofErr w:type="spellStart"/>
       <w:r>
@@ -3846,27 +3304,7 @@
           <w:color w:val="ECECF1"/>
           <w:shd w:val="clear" w:color="auto" w:fill="343541"/>
         </w:rPr>
-        <w:t xml:space="preserve">, а также связка от системы прокачки, которую используют враги. И проблема заключается в </w:t>
-      </w:r>
-      <w:proofErr w:type="gramStart"/>
-      <w:r>
-        <w:rPr>
-          <w:rFonts w:ascii="Segoe UI" w:hAnsi="Segoe UI" w:cs="Segoe UI"/>
-          <w:strike/>
-          <w:color w:val="ECECF1"/>
-          <w:shd w:val="clear" w:color="auto" w:fill="343541"/>
-        </w:rPr>
-        <w:t>том</w:t>
-      </w:r>
-      <w:proofErr w:type="gramEnd"/>
-      <w:r>
-        <w:rPr>
-          <w:rFonts w:ascii="Segoe UI" w:hAnsi="Segoe UI" w:cs="Segoe UI"/>
-          <w:strike/>
-          <w:color w:val="ECECF1"/>
-          <w:shd w:val="clear" w:color="auto" w:fill="343541"/>
-        </w:rPr>
-        <w:t xml:space="preserve"> что изначально все враги использовали первую систему, но позже была </w:t>
+        <w:t xml:space="preserve">, а также связка от системы прокачки, которую используют враги. И проблема заключается в том что изначально все враги использовали первую систему, но позже была </w:t>
       </w:r>
       <w:proofErr w:type="spellStart"/>
       <w:r>
@@ -3886,27 +3324,7 @@
           <w:color w:val="ECECF1"/>
           <w:shd w:val="clear" w:color="auto" w:fill="343541"/>
         </w:rPr>
-        <w:t xml:space="preserve"> вторая система, и сейчас очень сложно сказать какую, из систем используют враги, скорей всего это является это будет смесь из двух систем. Это нужно исправить. Нужно пересмотреть взаимодействие этих двух систем и выбрать </w:t>
-      </w:r>
-      <w:proofErr w:type="gramStart"/>
-      <w:r>
-        <w:rPr>
-          <w:rFonts w:ascii="Segoe UI" w:hAnsi="Segoe UI" w:cs="Segoe UI"/>
-          <w:strike/>
-          <w:color w:val="ECECF1"/>
-          <w:shd w:val="clear" w:color="auto" w:fill="343541"/>
-        </w:rPr>
-        <w:t>лучшее решение</w:t>
-      </w:r>
-      <w:proofErr w:type="gramEnd"/>
-      <w:r>
-        <w:rPr>
-          <w:rFonts w:ascii="Segoe UI" w:hAnsi="Segoe UI" w:cs="Segoe UI"/>
-          <w:strike/>
-          <w:color w:val="ECECF1"/>
-          <w:shd w:val="clear" w:color="auto" w:fill="343541"/>
-        </w:rPr>
-        <w:t xml:space="preserve"> которое позволит мне разрешить данную проблему.</w:t>
+        <w:t xml:space="preserve"> вторая система, и сейчас очень сложно сказать какую, из систем используют враги, скорей всего это является это будет смесь из двух систем. Это нужно исправить. Нужно пересмотреть взаимодействие этих двух систем и выбрать лучшее решение которое позволит мне разрешить данную проблему.</w:t>
       </w:r>
     </w:p>
     <w:p>
@@ -4027,7 +3445,6 @@
         <w:t xml:space="preserve"> из </w:t>
       </w:r>
       <w:proofErr w:type="spellStart"/>
-      <w:proofErr w:type="gramStart"/>
       <w:r>
         <w:rPr>
           <w:rFonts w:ascii="Segoe UI" w:hAnsi="Segoe UI" w:cs="Segoe UI"/>
@@ -4038,7 +3455,6 @@
         <w:t>SavaData</w:t>
       </w:r>
       <w:proofErr w:type="spellEnd"/>
-      <w:proofErr w:type="gramEnd"/>
       <w:r>
         <w:rPr>
           <w:rFonts w:ascii="Segoe UI" w:hAnsi="Segoe UI" w:cs="Segoe UI"/>
@@ -4101,25 +3517,7 @@
           <w:color w:val="ECECF1"/>
           <w:shd w:val="clear" w:color="auto" w:fill="343541"/>
         </w:rPr>
-        <w:t xml:space="preserve"> текста на русский и английский, но есть моменты </w:t>
-      </w:r>
-      <w:proofErr w:type="gramStart"/>
-      <w:r>
-        <w:rPr>
-          <w:rFonts w:ascii="Segoe UI" w:hAnsi="Segoe UI" w:cs="Segoe UI"/>
-          <w:color w:val="ECECF1"/>
-          <w:shd w:val="clear" w:color="auto" w:fill="343541"/>
-        </w:rPr>
-        <w:t>где например</w:t>
-      </w:r>
-      <w:proofErr w:type="gramEnd"/>
-      <w:r>
-        <w:rPr>
-          <w:rFonts w:ascii="Segoe UI" w:hAnsi="Segoe UI" w:cs="Segoe UI"/>
-          <w:color w:val="ECECF1"/>
-          <w:shd w:val="clear" w:color="auto" w:fill="343541"/>
-        </w:rPr>
-        <w:t xml:space="preserve"> используются перечисления, их также нужно перевести на английский и на русский. </w:t>
+        <w:t xml:space="preserve"> текста на русский и английский, но есть моменты где например используются перечисления, их также нужно перевести на английский и на русский. </w:t>
       </w:r>
     </w:p>
     <w:p>
@@ -4377,27 +3775,7 @@
           <w:szCs w:val="28"/>
           <w:shd w:val="clear" w:color="auto" w:fill="343541"/>
         </w:rPr>
-        <w:t xml:space="preserve">итерация (размышления. </w:t>
-      </w:r>
-      <w:proofErr w:type="gramStart"/>
-      <w:r>
-        <w:rPr>
-          <w:rFonts w:ascii="Times New Roman" w:hAnsi="Times New Roman" w:cs="Times New Roman"/>
-          <w:sz w:val="28"/>
-          <w:szCs w:val="28"/>
-          <w:shd w:val="clear" w:color="auto" w:fill="343541"/>
-        </w:rPr>
-        <w:t>Главная задача этой итерации это</w:t>
-      </w:r>
-      <w:proofErr w:type="gramEnd"/>
-      <w:r>
-        <w:rPr>
-          <w:rFonts w:ascii="Times New Roman" w:hAnsi="Times New Roman" w:cs="Times New Roman"/>
-          <w:sz w:val="28"/>
-          <w:szCs w:val="28"/>
-          <w:shd w:val="clear" w:color="auto" w:fill="343541"/>
-        </w:rPr>
-        <w:t xml:space="preserve"> подключить случайную генерацию уровней к игре. Но для этого придётся перекопать очень много кода. </w:t>
+        <w:t xml:space="preserve">итерация (размышления. Главная задача этой итерации это подключить случайную генерацию уровней к игре. Но для этого придётся перекопать очень много кода. </w:t>
       </w:r>
       <w:r>
         <w:rPr>
@@ -4442,27 +3820,7 @@
           <w:szCs w:val="28"/>
           <w:shd w:val="clear" w:color="auto" w:fill="343541"/>
         </w:rPr>
-        <w:t xml:space="preserve"> будет опциональным и использоваться только для генерации уровней, так как в первую очередь всегда необходимо сгенерировать уровень, а только потом генерировать персонажей и прочее. Также придётся расширить систему управление игровым процессом (это также понадобится и для оптимизации), </w:t>
-      </w:r>
-      <w:proofErr w:type="gramStart"/>
-      <w:r>
-        <w:rPr>
-          <w:rFonts w:ascii="Times New Roman" w:hAnsi="Times New Roman" w:cs="Times New Roman"/>
-          <w:sz w:val="28"/>
-          <w:szCs w:val="28"/>
-          <w:shd w:val="clear" w:color="auto" w:fill="343541"/>
-        </w:rPr>
-        <w:t>так например</w:t>
-      </w:r>
-      <w:proofErr w:type="gramEnd"/>
-      <w:r>
-        <w:rPr>
-          <w:rFonts w:ascii="Times New Roman" w:hAnsi="Times New Roman" w:cs="Times New Roman"/>
-          <w:sz w:val="28"/>
-          <w:szCs w:val="28"/>
-          <w:shd w:val="clear" w:color="auto" w:fill="343541"/>
-        </w:rPr>
-        <w:t xml:space="preserve"> я хочу сделать компонент который будет отвечать за поведение конкретного чанка. Компонент отвечающий за конкретный чанк в основном будет использовать точно так же как ранее использовался компонент </w:t>
+        <w:t xml:space="preserve"> будет опциональным и использоваться только для генерации уровней, так как в первую очередь всегда необходимо сгенерировать уровень, а только потом генерировать персонажей и прочее. Также придётся расширить систему управление игровым процессом (это также понадобится и для оптимизации), так например я хочу сделать компонент который будет отвечать за поведение конкретного чанка. Компонент отвечающий за конкретный чанк в основном будет использовать точно так же как ранее использовался компонент </w:t>
       </w:r>
       <w:r>
         <w:rPr>
@@ -4500,27 +3858,7 @@
           <w:szCs w:val="28"/>
           <w:shd w:val="clear" w:color="auto" w:fill="343541"/>
         </w:rPr>
-        <w:t xml:space="preserve">, с единственным отличием в </w:t>
-      </w:r>
-      <w:proofErr w:type="gramStart"/>
-      <w:r>
-        <w:rPr>
-          <w:rFonts w:ascii="Times New Roman" w:hAnsi="Times New Roman" w:cs="Times New Roman"/>
-          <w:sz w:val="28"/>
-          <w:szCs w:val="28"/>
-          <w:shd w:val="clear" w:color="auto" w:fill="343541"/>
-        </w:rPr>
-        <w:t>том</w:t>
-      </w:r>
-      <w:proofErr w:type="gramEnd"/>
-      <w:r>
-        <w:rPr>
-          <w:rFonts w:ascii="Times New Roman" w:hAnsi="Times New Roman" w:cs="Times New Roman"/>
-          <w:sz w:val="28"/>
-          <w:szCs w:val="28"/>
-          <w:shd w:val="clear" w:color="auto" w:fill="343541"/>
-        </w:rPr>
-        <w:t xml:space="preserve"> что управляющий компонентов чанка на карте будет уже равное количество количеству созданных чанков. К тому </w:t>
+        <w:t xml:space="preserve">, с единственным отличием в том что управляющий компонентов чанка на карте будет уже равное количество количеству созданных чанков. К тому </w:t>
       </w:r>
       <w:r>
         <w:rPr>
@@ -4806,7 +4144,6 @@
         </w:numPr>
         <w:rPr>
           <w:rFonts w:ascii="Times New Roman" w:hAnsi="Times New Roman" w:cs="Times New Roman"/>
-          <w:strike/>
           <w:sz w:val="28"/>
           <w:szCs w:val="28"/>
           <w:shd w:val="clear" w:color="auto" w:fill="343541"/>
@@ -4816,7 +4153,6 @@
       <w:r>
         <w:rPr>
           <w:rFonts w:ascii="Times New Roman" w:hAnsi="Times New Roman" w:cs="Times New Roman"/>
-          <w:strike/>
           <w:sz w:val="28"/>
           <w:szCs w:val="28"/>
           <w:shd w:val="clear" w:color="auto" w:fill="343541"/>
@@ -4826,7 +4162,6 @@
       <w:r>
         <w:rPr>
           <w:rFonts w:ascii="Times New Roman" w:hAnsi="Times New Roman" w:cs="Times New Roman"/>
-          <w:strike/>
           <w:sz w:val="28"/>
           <w:szCs w:val="28"/>
           <w:shd w:val="clear" w:color="auto" w:fill="343541"/>
@@ -4836,7 +4171,6 @@
       <w:r>
         <w:rPr>
           <w:rFonts w:ascii="Times New Roman" w:hAnsi="Times New Roman" w:cs="Times New Roman"/>
-          <w:strike/>
           <w:sz w:val="28"/>
           <w:szCs w:val="28"/>
           <w:shd w:val="clear" w:color="auto" w:fill="343541"/>
@@ -5142,25 +4476,7 @@
           <w:color w:val="ECECF1"/>
           <w:shd w:val="clear" w:color="auto" w:fill="343541"/>
         </w:rPr>
-        <w:t xml:space="preserve">Пересмотреть работу системы спавна квестов. Мне не нравится то что фабрика квестов сама начинает </w:t>
-      </w:r>
-      <w:proofErr w:type="gramStart"/>
-      <w:r>
-        <w:rPr>
-          <w:rFonts w:ascii="Segoe UI" w:hAnsi="Segoe UI" w:cs="Segoe UI"/>
-          <w:color w:val="ECECF1"/>
-          <w:shd w:val="clear" w:color="auto" w:fill="343541"/>
-        </w:rPr>
-        <w:t>спавнить</w:t>
-      </w:r>
-      <w:proofErr w:type="gramEnd"/>
-      <w:r>
-        <w:rPr>
-          <w:rFonts w:ascii="Segoe UI" w:hAnsi="Segoe UI" w:cs="Segoe UI"/>
-          <w:color w:val="ECECF1"/>
-          <w:shd w:val="clear" w:color="auto" w:fill="343541"/>
-        </w:rPr>
-        <w:t xml:space="preserve"> как только она сама того пожелает, а что если измениться порядок работы </w:t>
+        <w:t xml:space="preserve">Пересмотреть работу системы спавна квестов. Мне не нравится то что фабрика квестов сама начинает спавнить как только она сама того пожелает, а что если измениться порядок работы </w:t>
       </w:r>
       <w:proofErr w:type="spellStart"/>
       <w:r>
@@ -6471,7 +5787,7 @@
 </file>
 
 <file path=customXml/itemProps1.xml><?xml version="1.0" encoding="utf-8"?>
-<ds:datastoreItem xmlns:ds="http://schemas.openxmlformats.org/officeDocument/2006/customXml" ds:itemID="{34DF2DBE-86EB-437D-A08F-B89CAEC92065}">
+<ds:datastoreItem xmlns:ds="http://schemas.openxmlformats.org/officeDocument/2006/customXml" ds:itemID="{7818510A-FD33-4599-BBCD-F328AA98A1F0}">
   <ds:schemaRefs>
     <ds:schemaRef ds:uri="http://schemas.openxmlformats.org/officeDocument/2006/bibliography"/>
   </ds:schemaRefs>

</xml_diff>

<commit_message>
Ready prototype LevelDisplayOptimization. Start update optimization.
</commit_message>
<xml_diff>
--- a/Итерации.docx
+++ b/Итерации.docx
@@ -36,7 +36,27 @@
           <w:color w:val="ECECF1"/>
           <w:shd w:val="clear" w:color="auto" w:fill="343541"/>
         </w:rPr>
-        <w:t xml:space="preserve">1 разобраться из структурой данных которая будет использоваться для сохранения данных игры. Структура должна быть организована на </w:t>
+        <w:t xml:space="preserve">1 разобраться </w:t>
+      </w:r>
+      <w:proofErr w:type="gramStart"/>
+      <w:r>
+        <w:rPr>
+          <w:rFonts w:ascii="Segoe UI" w:hAnsi="Segoe UI" w:cs="Segoe UI"/>
+          <w:strike/>
+          <w:color w:val="ECECF1"/>
+          <w:shd w:val="clear" w:color="auto" w:fill="343541"/>
+        </w:rPr>
+        <w:t>из структурой</w:t>
+      </w:r>
+      <w:proofErr w:type="gramEnd"/>
+      <w:r>
+        <w:rPr>
+          <w:rFonts w:ascii="Segoe UI" w:hAnsi="Segoe UI" w:cs="Segoe UI"/>
+          <w:strike/>
+          <w:color w:val="ECECF1"/>
+          <w:shd w:val="clear" w:color="auto" w:fill="343541"/>
+        </w:rPr>
+        <w:t xml:space="preserve"> данных которая будет использоваться для сохранения данных игры. Структура должна быть организована на </w:t>
       </w:r>
       <w:proofErr w:type="spellStart"/>
       <w:r>
@@ -107,7 +127,25 @@
           <w:color w:val="ECECF1"/>
           <w:shd w:val="clear" w:color="auto" w:fill="343541"/>
         </w:rPr>
-        <w:t xml:space="preserve">4 Продумать кто и каким образом будет собирать компоненты которые реализовывают интерфейсы для сохранения и/или загрузки данных. Возможно это должна быть фабрика. </w:t>
+        <w:t xml:space="preserve">4 Продумать кто и каким образом будет собирать </w:t>
+      </w:r>
+      <w:proofErr w:type="gramStart"/>
+      <w:r>
+        <w:rPr>
+          <w:rFonts w:ascii="Segoe UI" w:hAnsi="Segoe UI" w:cs="Segoe UI"/>
+          <w:color w:val="ECECF1"/>
+          <w:shd w:val="clear" w:color="auto" w:fill="343541"/>
+        </w:rPr>
+        <w:t>компоненты</w:t>
+      </w:r>
+      <w:proofErr w:type="gramEnd"/>
+      <w:r>
+        <w:rPr>
+          <w:rFonts w:ascii="Segoe UI" w:hAnsi="Segoe UI" w:cs="Segoe UI"/>
+          <w:color w:val="ECECF1"/>
+          <w:shd w:val="clear" w:color="auto" w:fill="343541"/>
+        </w:rPr>
+        <w:t xml:space="preserve"> которые реализовывают интерфейсы для сохранения и/или загрузки данных. Возможно это должна быть фабрика. </w:t>
       </w:r>
     </w:p>
     <w:p>
@@ -350,7 +388,27 @@
           <w:color w:val="ECECF1"/>
           <w:shd w:val="clear" w:color="auto" w:fill="343541"/>
         </w:rPr>
-        <w:t>4 Продумать кто и каким образом будет собирать компоненты которые реализовывают интерфейсы для сохранения и/или загрузки данных. Возможно это должна быть фабрика.</w:t>
+        <w:t xml:space="preserve">4 Продумать кто и каким образом будет собирать </w:t>
+      </w:r>
+      <w:proofErr w:type="gramStart"/>
+      <w:r>
+        <w:rPr>
+          <w:rFonts w:ascii="Segoe UI" w:hAnsi="Segoe UI" w:cs="Segoe UI"/>
+          <w:strike/>
+          <w:color w:val="ECECF1"/>
+          <w:shd w:val="clear" w:color="auto" w:fill="343541"/>
+        </w:rPr>
+        <w:t>компоненты</w:t>
+      </w:r>
+      <w:proofErr w:type="gramEnd"/>
+      <w:r>
+        <w:rPr>
+          <w:rFonts w:ascii="Segoe UI" w:hAnsi="Segoe UI" w:cs="Segoe UI"/>
+          <w:strike/>
+          <w:color w:val="ECECF1"/>
+          <w:shd w:val="clear" w:color="auto" w:fill="343541"/>
+        </w:rPr>
+        <w:t xml:space="preserve"> которые реализовывают интерфейсы для сохранения и/или загрузки данных. Возможно это должна быть фабрика.</w:t>
       </w:r>
     </w:p>
     <w:p>
@@ -468,7 +526,27 @@
           <w:color w:val="ECECF1"/>
           <w:shd w:val="clear" w:color="auto" w:fill="343541"/>
         </w:rPr>
-        <w:t>3 Написать поведение для врагов которые включают сл</w:t>
+        <w:t xml:space="preserve">3 Написать поведение </w:t>
+      </w:r>
+      <w:proofErr w:type="gramStart"/>
+      <w:r>
+        <w:rPr>
+          <w:rFonts w:ascii="Segoe UI" w:hAnsi="Segoe UI" w:cs="Segoe UI"/>
+          <w:strike/>
+          <w:color w:val="ECECF1"/>
+          <w:shd w:val="clear" w:color="auto" w:fill="343541"/>
+        </w:rPr>
+        <w:t>для врагов</w:t>
+      </w:r>
+      <w:proofErr w:type="gramEnd"/>
+      <w:r>
+        <w:rPr>
+          <w:rFonts w:ascii="Segoe UI" w:hAnsi="Segoe UI" w:cs="Segoe UI"/>
+          <w:strike/>
+          <w:color w:val="ECECF1"/>
+          <w:shd w:val="clear" w:color="auto" w:fill="343541"/>
+        </w:rPr>
+        <w:t xml:space="preserve"> которые включают сл</w:t>
       </w:r>
       <w:r>
         <w:rPr>
@@ -513,7 +591,27 @@
           <w:color w:val="ECECF1"/>
           <w:shd w:val="clear" w:color="auto" w:fill="343541"/>
         </w:rPr>
-        <w:t>5 Создать телепорт который будет пересылать игро</w:t>
+        <w:t xml:space="preserve">5 Создать </w:t>
+      </w:r>
+      <w:proofErr w:type="gramStart"/>
+      <w:r>
+        <w:rPr>
+          <w:rFonts w:ascii="Segoe UI" w:hAnsi="Segoe UI" w:cs="Segoe UI"/>
+          <w:strike/>
+          <w:color w:val="ECECF1"/>
+          <w:shd w:val="clear" w:color="auto" w:fill="343541"/>
+        </w:rPr>
+        <w:t>телепорт</w:t>
+      </w:r>
+      <w:proofErr w:type="gramEnd"/>
+      <w:r>
+        <w:rPr>
+          <w:rFonts w:ascii="Segoe UI" w:hAnsi="Segoe UI" w:cs="Segoe UI"/>
+          <w:strike/>
+          <w:color w:val="ECECF1"/>
+          <w:shd w:val="clear" w:color="auto" w:fill="343541"/>
+        </w:rPr>
+        <w:t xml:space="preserve"> который будет пересылать игро</w:t>
       </w:r>
       <w:r>
         <w:rPr>
@@ -687,7 +785,27 @@
           <w:color w:val="ECECF1"/>
           <w:shd w:val="clear" w:color="auto" w:fill="343541"/>
         </w:rPr>
-        <w:t xml:space="preserve"> уже имеются управляющие компоненты которые позволяют ии и игроку управлять атакой нужна только логика боевой системы. </w:t>
+        <w:t xml:space="preserve"> уже имеются </w:t>
+      </w:r>
+      <w:proofErr w:type="gramStart"/>
+      <w:r>
+        <w:rPr>
+          <w:rFonts w:ascii="Segoe UI" w:hAnsi="Segoe UI" w:cs="Segoe UI"/>
+          <w:strike/>
+          <w:color w:val="ECECF1"/>
+          <w:shd w:val="clear" w:color="auto" w:fill="343541"/>
+        </w:rPr>
+        <w:t>управляющие компоненты</w:t>
+      </w:r>
+      <w:proofErr w:type="gramEnd"/>
+      <w:r>
+        <w:rPr>
+          <w:rFonts w:ascii="Segoe UI" w:hAnsi="Segoe UI" w:cs="Segoe UI"/>
+          <w:strike/>
+          <w:color w:val="ECECF1"/>
+          <w:shd w:val="clear" w:color="auto" w:fill="343541"/>
+        </w:rPr>
+        <w:t xml:space="preserve"> которые позволяют ии и игроку управлять атакой нужна только логика боевой системы. </w:t>
       </w:r>
     </w:p>
     <w:p>
@@ -917,26 +1035,86 @@
           <w:color w:val="ECECF1"/>
           <w:shd w:val="clear" w:color="auto" w:fill="343541"/>
         </w:rPr>
-        <w:t xml:space="preserve"> инвентаря, это нужно сделать чтобы список предметов, а точнее хилок и их количество сохранялось в память и чтобы его можно было загрузить при продолжении игры </w:t>
-      </w:r>
-    </w:p>
-    <w:p>
-      <w:pPr>
-        <w:rPr>
-          <w:rFonts w:ascii="Segoe UI" w:hAnsi="Segoe UI" w:cs="Segoe UI"/>
-          <w:strike/>
-          <w:color w:val="ECECF1"/>
-          <w:shd w:val="clear" w:color="auto" w:fill="343541"/>
-        </w:rPr>
-      </w:pPr>
-      <w:r>
-        <w:rPr>
-          <w:rFonts w:ascii="Segoe UI" w:hAnsi="Segoe UI" w:cs="Segoe UI"/>
-          <w:strike/>
-          <w:color w:val="ECECF1"/>
-          <w:shd w:val="clear" w:color="auto" w:fill="343541"/>
-        </w:rPr>
-        <w:t xml:space="preserve">2 искать визуальные эффекты которые отображают смерть игрока и нпс. Также нужно поискать картинки которые буду использовать в GUI для хилок и для полоски здоровья </w:t>
+        <w:t xml:space="preserve"> инвентаря, это нужно сделать чтобы список предметов, а точнее хилок и их количество сохранялось в </w:t>
+      </w:r>
+      <w:proofErr w:type="gramStart"/>
+      <w:r>
+        <w:rPr>
+          <w:rFonts w:ascii="Segoe UI" w:hAnsi="Segoe UI" w:cs="Segoe UI"/>
+          <w:strike/>
+          <w:color w:val="ECECF1"/>
+          <w:shd w:val="clear" w:color="auto" w:fill="343541"/>
+        </w:rPr>
+        <w:t>память</w:t>
+      </w:r>
+      <w:proofErr w:type="gramEnd"/>
+      <w:r>
+        <w:rPr>
+          <w:rFonts w:ascii="Segoe UI" w:hAnsi="Segoe UI" w:cs="Segoe UI"/>
+          <w:strike/>
+          <w:color w:val="ECECF1"/>
+          <w:shd w:val="clear" w:color="auto" w:fill="343541"/>
+        </w:rPr>
+        <w:t xml:space="preserve"> и чтобы его можно было загрузить при продолжении игры </w:t>
+      </w:r>
+    </w:p>
+    <w:p>
+      <w:pPr>
+        <w:rPr>
+          <w:rFonts w:ascii="Segoe UI" w:hAnsi="Segoe UI" w:cs="Segoe UI"/>
+          <w:strike/>
+          <w:color w:val="ECECF1"/>
+          <w:shd w:val="clear" w:color="auto" w:fill="343541"/>
+        </w:rPr>
+      </w:pPr>
+      <w:r>
+        <w:rPr>
+          <w:rFonts w:ascii="Segoe UI" w:hAnsi="Segoe UI" w:cs="Segoe UI"/>
+          <w:strike/>
+          <w:color w:val="ECECF1"/>
+          <w:shd w:val="clear" w:color="auto" w:fill="343541"/>
+        </w:rPr>
+        <w:t xml:space="preserve">2 искать </w:t>
+      </w:r>
+      <w:proofErr w:type="gramStart"/>
+      <w:r>
+        <w:rPr>
+          <w:rFonts w:ascii="Segoe UI" w:hAnsi="Segoe UI" w:cs="Segoe UI"/>
+          <w:strike/>
+          <w:color w:val="ECECF1"/>
+          <w:shd w:val="clear" w:color="auto" w:fill="343541"/>
+        </w:rPr>
+        <w:t>визуальные эффекты</w:t>
+      </w:r>
+      <w:proofErr w:type="gramEnd"/>
+      <w:r>
+        <w:rPr>
+          <w:rFonts w:ascii="Segoe UI" w:hAnsi="Segoe UI" w:cs="Segoe UI"/>
+          <w:strike/>
+          <w:color w:val="ECECF1"/>
+          <w:shd w:val="clear" w:color="auto" w:fill="343541"/>
+        </w:rPr>
+        <w:t xml:space="preserve"> которые отображают смерть игрока и нпс. Также нужно поискать </w:t>
+      </w:r>
+      <w:proofErr w:type="gramStart"/>
+      <w:r>
+        <w:rPr>
+          <w:rFonts w:ascii="Segoe UI" w:hAnsi="Segoe UI" w:cs="Segoe UI"/>
+          <w:strike/>
+          <w:color w:val="ECECF1"/>
+          <w:shd w:val="clear" w:color="auto" w:fill="343541"/>
+        </w:rPr>
+        <w:t>картинки</w:t>
+      </w:r>
+      <w:proofErr w:type="gramEnd"/>
+      <w:r>
+        <w:rPr>
+          <w:rFonts w:ascii="Segoe UI" w:hAnsi="Segoe UI" w:cs="Segoe UI"/>
+          <w:strike/>
+          <w:color w:val="ECECF1"/>
+          <w:shd w:val="clear" w:color="auto" w:fill="343541"/>
+        </w:rPr>
+        <w:t xml:space="preserve"> которые буду использовать в GUI для хилок и для полоски здоровья </w:t>
       </w:r>
     </w:p>
     <w:p>
@@ -991,7 +1169,27 @@
           <w:color w:val="ECECF1"/>
           <w:shd w:val="clear" w:color="auto" w:fill="343541"/>
         </w:rPr>
-        <w:t xml:space="preserve">5 Работа со светом. Просмотреть разные варианты. Но нужно помнить что </w:t>
+        <w:t xml:space="preserve">5 Работа со светом. Просмотреть разные варианты. Но нужно </w:t>
+      </w:r>
+      <w:proofErr w:type="gramStart"/>
+      <w:r>
+        <w:rPr>
+          <w:rFonts w:ascii="Segoe UI" w:hAnsi="Segoe UI" w:cs="Segoe UI"/>
+          <w:strike/>
+          <w:color w:val="ECECF1"/>
+          <w:shd w:val="clear" w:color="auto" w:fill="343541"/>
+        </w:rPr>
+        <w:t>помнить</w:t>
+      </w:r>
+      <w:proofErr w:type="gramEnd"/>
+      <w:r>
+        <w:rPr>
+          <w:rFonts w:ascii="Segoe UI" w:hAnsi="Segoe UI" w:cs="Segoe UI"/>
+          <w:strike/>
+          <w:color w:val="ECECF1"/>
+          <w:shd w:val="clear" w:color="auto" w:fill="343541"/>
+        </w:rPr>
+        <w:t xml:space="preserve"> что </w:t>
       </w:r>
       <w:proofErr w:type="spellStart"/>
       <w:r>
@@ -1107,7 +1305,27 @@
           <w:color w:val="ECECF1"/>
           <w:shd w:val="clear" w:color="auto" w:fill="343541"/>
         </w:rPr>
-        <w:t xml:space="preserve">8 Пересмотреть скрипты и те которые не используют статик дату, перевести на использование статик даты, а именно это относиться к </w:t>
+        <w:t xml:space="preserve">8 Пересмотреть скрипты и </w:t>
+      </w:r>
+      <w:proofErr w:type="gramStart"/>
+      <w:r>
+        <w:rPr>
+          <w:rFonts w:ascii="Segoe UI" w:hAnsi="Segoe UI" w:cs="Segoe UI"/>
+          <w:strike/>
+          <w:color w:val="ECECF1"/>
+          <w:shd w:val="clear" w:color="auto" w:fill="343541"/>
+        </w:rPr>
+        <w:t>те</w:t>
+      </w:r>
+      <w:proofErr w:type="gramEnd"/>
+      <w:r>
+        <w:rPr>
+          <w:rFonts w:ascii="Segoe UI" w:hAnsi="Segoe UI" w:cs="Segoe UI"/>
+          <w:strike/>
+          <w:color w:val="ECECF1"/>
+          <w:shd w:val="clear" w:color="auto" w:fill="343541"/>
+        </w:rPr>
+        <w:t xml:space="preserve"> которые не используют статик дату, перевести на использование статик даты, а именно это относиться к </w:t>
       </w:r>
       <w:proofErr w:type="spellStart"/>
       <w:r>
@@ -1224,7 +1442,25 @@
           <w:color w:val="ECECF1"/>
           <w:shd w:val="clear" w:color="auto" w:fill="343541"/>
         </w:rPr>
-        <w:t>Второй и третий пункт хоть и выглядят достаточно просто но на самом деле именно эти два пункта содержат колоссальную работу над проектом.</w:t>
+        <w:t xml:space="preserve">Второй и третий пункт хоть и выглядят достаточно </w:t>
+      </w:r>
+      <w:proofErr w:type="gramStart"/>
+      <w:r>
+        <w:rPr>
+          <w:rFonts w:ascii="Segoe UI" w:hAnsi="Segoe UI" w:cs="Segoe UI"/>
+          <w:color w:val="ECECF1"/>
+          <w:shd w:val="clear" w:color="auto" w:fill="343541"/>
+        </w:rPr>
+        <w:t>просто</w:t>
+      </w:r>
+      <w:proofErr w:type="gramEnd"/>
+      <w:r>
+        <w:rPr>
+          <w:rFonts w:ascii="Segoe UI" w:hAnsi="Segoe UI" w:cs="Segoe UI"/>
+          <w:color w:val="ECECF1"/>
+          <w:shd w:val="clear" w:color="auto" w:fill="343541"/>
+        </w:rPr>
+        <w:t xml:space="preserve"> но на самом деле именно эти два пункта содержат колоссальную работу над проектом.</w:t>
       </w:r>
     </w:p>
     <w:p>
@@ -1368,7 +1604,27 @@
           <w:color w:val="ECECF1"/>
           <w:shd w:val="clear" w:color="auto" w:fill="343541"/>
         </w:rPr>
-        <w:t>5 Начать погружаться в квестовую систему. Это достаточно крупный шаг и по этому он займет больше всего времени, хотя и на первый взгляд все написано просто.</w:t>
+        <w:t xml:space="preserve">5 Начать погружаться в квестовую систему. Это достаточно крупный шаг и </w:t>
+      </w:r>
+      <w:proofErr w:type="gramStart"/>
+      <w:r>
+        <w:rPr>
+          <w:rFonts w:ascii="Segoe UI" w:hAnsi="Segoe UI" w:cs="Segoe UI"/>
+          <w:strike/>
+          <w:color w:val="ECECF1"/>
+          <w:shd w:val="clear" w:color="auto" w:fill="343541"/>
+        </w:rPr>
+        <w:t>по этому</w:t>
+      </w:r>
+      <w:proofErr w:type="gramEnd"/>
+      <w:r>
+        <w:rPr>
+          <w:rFonts w:ascii="Segoe UI" w:hAnsi="Segoe UI" w:cs="Segoe UI"/>
+          <w:strike/>
+          <w:color w:val="ECECF1"/>
+          <w:shd w:val="clear" w:color="auto" w:fill="343541"/>
+        </w:rPr>
+        <w:t xml:space="preserve"> он займет больше всего времени, хотя и на первый взгляд все написано просто.</w:t>
       </w:r>
     </w:p>
     <w:p>
@@ -1511,7 +1767,25 @@
           <w:color w:val="ECECF1"/>
           <w:shd w:val="clear" w:color="auto" w:fill="343541"/>
         </w:rPr>
-        <w:t xml:space="preserve">2а Завершить прототип, получив работоспособную квестовую систему. </w:t>
+        <w:t xml:space="preserve">2а </w:t>
+      </w:r>
+      <w:proofErr w:type="gramStart"/>
+      <w:r>
+        <w:rPr>
+          <w:rFonts w:ascii="Segoe UI" w:hAnsi="Segoe UI" w:cs="Segoe UI"/>
+          <w:color w:val="ECECF1"/>
+          <w:shd w:val="clear" w:color="auto" w:fill="343541"/>
+        </w:rPr>
+        <w:t>Завершить</w:t>
+      </w:r>
+      <w:proofErr w:type="gramEnd"/>
+      <w:r>
+        <w:rPr>
+          <w:rFonts w:ascii="Segoe UI" w:hAnsi="Segoe UI" w:cs="Segoe UI"/>
+          <w:color w:val="ECECF1"/>
+          <w:shd w:val="clear" w:color="auto" w:fill="343541"/>
+        </w:rPr>
+        <w:t xml:space="preserve"> прототип, получив работоспособную квестовую систему. </w:t>
       </w:r>
     </w:p>
     <w:p>
@@ -1529,7 +1803,25 @@
           <w:color w:val="ECECF1"/>
           <w:shd w:val="clear" w:color="auto" w:fill="343541"/>
         </w:rPr>
-        <w:t xml:space="preserve">2б Контролировать состояние архитектуры при разработке доработке прототипа </w:t>
+        <w:t xml:space="preserve">2б </w:t>
+      </w:r>
+      <w:proofErr w:type="gramStart"/>
+      <w:r>
+        <w:rPr>
+          <w:rFonts w:ascii="Segoe UI" w:hAnsi="Segoe UI" w:cs="Segoe UI"/>
+          <w:color w:val="ECECF1"/>
+          <w:shd w:val="clear" w:color="auto" w:fill="343541"/>
+        </w:rPr>
+        <w:t>Контролировать</w:t>
+      </w:r>
+      <w:proofErr w:type="gramEnd"/>
+      <w:r>
+        <w:rPr>
+          <w:rFonts w:ascii="Segoe UI" w:hAnsi="Segoe UI" w:cs="Segoe UI"/>
+          <w:color w:val="ECECF1"/>
+          <w:shd w:val="clear" w:color="auto" w:fill="343541"/>
+        </w:rPr>
+        <w:t xml:space="preserve"> состояние архитектуры при разработке доработке прототипа </w:t>
       </w:r>
       <w:proofErr w:type="spellStart"/>
       <w:r>
@@ -1615,7 +1907,25 @@
           <w:color w:val="ECECF1"/>
           <w:shd w:val="clear" w:color="auto" w:fill="343541"/>
         </w:rPr>
-        <w:t>6 Готовиться к реализации системы торговли. Также как и второй этап достаточно длительный.</w:t>
+        <w:t xml:space="preserve">6 Готовиться к реализации системы торговли. </w:t>
+      </w:r>
+      <w:proofErr w:type="gramStart"/>
+      <w:r>
+        <w:rPr>
+          <w:rFonts w:ascii="Segoe UI" w:hAnsi="Segoe UI" w:cs="Segoe UI"/>
+          <w:color w:val="ECECF1"/>
+          <w:shd w:val="clear" w:color="auto" w:fill="343541"/>
+        </w:rPr>
+        <w:t>Также</w:t>
+      </w:r>
+      <w:proofErr w:type="gramEnd"/>
+      <w:r>
+        <w:rPr>
+          <w:rFonts w:ascii="Segoe UI" w:hAnsi="Segoe UI" w:cs="Segoe UI"/>
+          <w:color w:val="ECECF1"/>
+          <w:shd w:val="clear" w:color="auto" w:fill="343541"/>
+        </w:rPr>
+        <w:t xml:space="preserve"> как и второй этап достаточно длительный.</w:t>
       </w:r>
     </w:p>
     <w:p>
@@ -1716,7 +2026,25 @@
           <w:color w:val="ECECF1"/>
           <w:shd w:val="clear" w:color="auto" w:fill="343541"/>
         </w:rPr>
-        <w:t>4 Готовится к разработки системы торговли.</w:t>
+        <w:t xml:space="preserve">4 Готовится </w:t>
+      </w:r>
+      <w:proofErr w:type="gramStart"/>
+      <w:r>
+        <w:rPr>
+          <w:rFonts w:ascii="Segoe UI" w:hAnsi="Segoe UI" w:cs="Segoe UI"/>
+          <w:color w:val="ECECF1"/>
+          <w:shd w:val="clear" w:color="auto" w:fill="343541"/>
+        </w:rPr>
+        <w:t>к разработки</w:t>
+      </w:r>
+      <w:proofErr w:type="gramEnd"/>
+      <w:r>
+        <w:rPr>
+          <w:rFonts w:ascii="Segoe UI" w:hAnsi="Segoe UI" w:cs="Segoe UI"/>
+          <w:color w:val="ECECF1"/>
+          <w:shd w:val="clear" w:color="auto" w:fill="343541"/>
+        </w:rPr>
+        <w:t xml:space="preserve"> системы торговли.</w:t>
       </w:r>
     </w:p>
     <w:p>
@@ -1780,7 +2108,27 @@
           <w:color w:val="ECECF1"/>
           <w:shd w:val="clear" w:color="auto" w:fill="343541"/>
         </w:rPr>
-        <w:t xml:space="preserve">2 Нужно решить проблему связанную с отображением окна квест </w:t>
+        <w:t xml:space="preserve">2 Нужно решить </w:t>
+      </w:r>
+      <w:proofErr w:type="gramStart"/>
+      <w:r>
+        <w:rPr>
+          <w:rFonts w:ascii="Segoe UI" w:hAnsi="Segoe UI" w:cs="Segoe UI"/>
+          <w:strike/>
+          <w:color w:val="ECECF1"/>
+          <w:shd w:val="clear" w:color="auto" w:fill="343541"/>
+        </w:rPr>
+        <w:t>проблему</w:t>
+      </w:r>
+      <w:proofErr w:type="gramEnd"/>
+      <w:r>
+        <w:rPr>
+          <w:rFonts w:ascii="Segoe UI" w:hAnsi="Segoe UI" w:cs="Segoe UI"/>
+          <w:strike/>
+          <w:color w:val="ECECF1"/>
+          <w:shd w:val="clear" w:color="auto" w:fill="343541"/>
+        </w:rPr>
+        <w:t xml:space="preserve"> связанную с отображением окна квест </w:t>
       </w:r>
       <w:proofErr w:type="spellStart"/>
       <w:r>
@@ -2496,7 +2844,25 @@
           <w:color w:val="ECECF1"/>
           <w:shd w:val="clear" w:color="auto" w:fill="343541"/>
         </w:rPr>
-        <w:t xml:space="preserve">2 Создать компонент который расширит возможности для системы взаимодействия, и позволит игроку делать выбор какой именно тип взаимодействия желает получить игрок если таких типов взаимодействия </w:t>
+        <w:t xml:space="preserve">2 Создать </w:t>
+      </w:r>
+      <w:proofErr w:type="gramStart"/>
+      <w:r>
+        <w:rPr>
+          <w:rFonts w:ascii="Segoe UI" w:hAnsi="Segoe UI" w:cs="Segoe UI"/>
+          <w:color w:val="ECECF1"/>
+          <w:shd w:val="clear" w:color="auto" w:fill="343541"/>
+        </w:rPr>
+        <w:t>компонент</w:t>
+      </w:r>
+      <w:proofErr w:type="gramEnd"/>
+      <w:r>
+        <w:rPr>
+          <w:rFonts w:ascii="Segoe UI" w:hAnsi="Segoe UI" w:cs="Segoe UI"/>
+          <w:color w:val="ECECF1"/>
+          <w:shd w:val="clear" w:color="auto" w:fill="343541"/>
+        </w:rPr>
+        <w:t xml:space="preserve"> который расширит возможности для системы взаимодействия, и позволит игроку делать выбор какой именно тип взаимодействия желает получить игрок если таких типов взаимодействия </w:t>
       </w:r>
       <w:proofErr w:type="spellStart"/>
       <w:r>
@@ -2637,7 +3003,27 @@
           <w:color w:val="ECECF1"/>
           <w:shd w:val="clear" w:color="auto" w:fill="343541"/>
         </w:rPr>
-        <w:t>1 Добавить функционал который будет сохранять текущее количество денег игрока в файл сохранения.</w:t>
+        <w:t xml:space="preserve">1 Добавить </w:t>
+      </w:r>
+      <w:proofErr w:type="gramStart"/>
+      <w:r>
+        <w:rPr>
+          <w:rFonts w:ascii="Segoe UI" w:hAnsi="Segoe UI" w:cs="Segoe UI"/>
+          <w:strike/>
+          <w:color w:val="ECECF1"/>
+          <w:shd w:val="clear" w:color="auto" w:fill="343541"/>
+        </w:rPr>
+        <w:t>функционал</w:t>
+      </w:r>
+      <w:proofErr w:type="gramEnd"/>
+      <w:r>
+        <w:rPr>
+          <w:rFonts w:ascii="Segoe UI" w:hAnsi="Segoe UI" w:cs="Segoe UI"/>
+          <w:strike/>
+          <w:color w:val="ECECF1"/>
+          <w:shd w:val="clear" w:color="auto" w:fill="343541"/>
+        </w:rPr>
+        <w:t xml:space="preserve"> который будет сохранять текущее количество денег игрока в файл сохранения.</w:t>
       </w:r>
     </w:p>
     <w:p>
@@ -2752,24 +3138,62 @@
           <w:shd w:val="clear" w:color="auto" w:fill="343541"/>
         </w:rPr>
         <w:lastRenderedPageBreak/>
-        <w:t>7 Натянуть анимации на мобов.</w:t>
-      </w:r>
-    </w:p>
-    <w:p>
-      <w:pPr>
-        <w:rPr>
-          <w:rFonts w:ascii="Segoe UI" w:hAnsi="Segoe UI" w:cs="Segoe UI"/>
-          <w:color w:val="ECECF1"/>
-          <w:shd w:val="clear" w:color="auto" w:fill="343541"/>
-        </w:rPr>
-      </w:pPr>
-      <w:r>
-        <w:rPr>
-          <w:rFonts w:ascii="Segoe UI" w:hAnsi="Segoe UI" w:cs="Segoe UI"/>
-          <w:color w:val="ECECF1"/>
-          <w:shd w:val="clear" w:color="auto" w:fill="343541"/>
-        </w:rPr>
-        <w:t xml:space="preserve">8 Думать как можно организовать рандомную генерацию мира, и начать работу над прототипом </w:t>
+        <w:t xml:space="preserve">7 Натянуть анимации </w:t>
+      </w:r>
+      <w:proofErr w:type="gramStart"/>
+      <w:r>
+        <w:rPr>
+          <w:rFonts w:ascii="Segoe UI" w:hAnsi="Segoe UI" w:cs="Segoe UI"/>
+          <w:strike/>
+          <w:color w:val="ECECF1"/>
+          <w:shd w:val="clear" w:color="auto" w:fill="343541"/>
+        </w:rPr>
+        <w:t>на мобов</w:t>
+      </w:r>
+      <w:proofErr w:type="gramEnd"/>
+      <w:r>
+        <w:rPr>
+          <w:rFonts w:ascii="Segoe UI" w:hAnsi="Segoe UI" w:cs="Segoe UI"/>
+          <w:strike/>
+          <w:color w:val="ECECF1"/>
+          <w:shd w:val="clear" w:color="auto" w:fill="343541"/>
+        </w:rPr>
+        <w:t>.</w:t>
+      </w:r>
+    </w:p>
+    <w:p>
+      <w:pPr>
+        <w:rPr>
+          <w:rFonts w:ascii="Segoe UI" w:hAnsi="Segoe UI" w:cs="Segoe UI"/>
+          <w:color w:val="ECECF1"/>
+          <w:shd w:val="clear" w:color="auto" w:fill="343541"/>
+        </w:rPr>
+      </w:pPr>
+      <w:r>
+        <w:rPr>
+          <w:rFonts w:ascii="Segoe UI" w:hAnsi="Segoe UI" w:cs="Segoe UI"/>
+          <w:color w:val="ECECF1"/>
+          <w:shd w:val="clear" w:color="auto" w:fill="343541"/>
+        </w:rPr>
+        <w:t xml:space="preserve">8 </w:t>
+      </w:r>
+      <w:proofErr w:type="gramStart"/>
+      <w:r>
+        <w:rPr>
+          <w:rFonts w:ascii="Segoe UI" w:hAnsi="Segoe UI" w:cs="Segoe UI"/>
+          <w:color w:val="ECECF1"/>
+          <w:shd w:val="clear" w:color="auto" w:fill="343541"/>
+        </w:rPr>
+        <w:t>Думать</w:t>
+      </w:r>
+      <w:proofErr w:type="gramEnd"/>
+      <w:r>
+        <w:rPr>
+          <w:rFonts w:ascii="Segoe UI" w:hAnsi="Segoe UI" w:cs="Segoe UI"/>
+          <w:color w:val="ECECF1"/>
+          <w:shd w:val="clear" w:color="auto" w:fill="343541"/>
+        </w:rPr>
+        <w:t xml:space="preserve"> как можно организовать рандомную генерацию мира, и начать работу над прототипом </w:t>
       </w:r>
       <w:proofErr w:type="spellStart"/>
       <w:r>
@@ -2832,7 +3256,47 @@
           <w:color w:val="ECECF1"/>
           <w:shd w:val="clear" w:color="auto" w:fill="343541"/>
         </w:rPr>
-        <w:t xml:space="preserve">1 Исправить систему хранилища игровых предметов. Основная проблема состоит в том что система хранилища была доработана для системы торговли после ее первого создания, что добавило баг. Суть проблемы в том что система торговли оперирует(помещает и извлекает предметы) с хранилищем на самом низком уровне, в то время как часть функционала который занимается обновлением UI инвентаря игрока находится на более высоком уровне, что привело к тому что инвентарь не обновляется после покупки продажи предметов. </w:t>
+        <w:t xml:space="preserve">1 Исправить систему хранилища игровых предметов. Основная проблема состоит в </w:t>
+      </w:r>
+      <w:proofErr w:type="gramStart"/>
+      <w:r>
+        <w:rPr>
+          <w:rFonts w:ascii="Segoe UI" w:hAnsi="Segoe UI" w:cs="Segoe UI"/>
+          <w:strike/>
+          <w:color w:val="ECECF1"/>
+          <w:shd w:val="clear" w:color="auto" w:fill="343541"/>
+        </w:rPr>
+        <w:t>том</w:t>
+      </w:r>
+      <w:proofErr w:type="gramEnd"/>
+      <w:r>
+        <w:rPr>
+          <w:rFonts w:ascii="Segoe UI" w:hAnsi="Segoe UI" w:cs="Segoe UI"/>
+          <w:strike/>
+          <w:color w:val="ECECF1"/>
+          <w:shd w:val="clear" w:color="auto" w:fill="343541"/>
+        </w:rPr>
+        <w:t xml:space="preserve"> что система хранилища была доработана для системы торговли после ее первого создания, что добавило баг. Суть проблемы в том что система торговли </w:t>
+      </w:r>
+      <w:proofErr w:type="gramStart"/>
+      <w:r>
+        <w:rPr>
+          <w:rFonts w:ascii="Segoe UI" w:hAnsi="Segoe UI" w:cs="Segoe UI"/>
+          <w:strike/>
+          <w:color w:val="ECECF1"/>
+          <w:shd w:val="clear" w:color="auto" w:fill="343541"/>
+        </w:rPr>
+        <w:t>оперирует(</w:t>
+      </w:r>
+      <w:proofErr w:type="gramEnd"/>
+      <w:r>
+        <w:rPr>
+          <w:rFonts w:ascii="Segoe UI" w:hAnsi="Segoe UI" w:cs="Segoe UI"/>
+          <w:strike/>
+          <w:color w:val="ECECF1"/>
+          <w:shd w:val="clear" w:color="auto" w:fill="343541"/>
+        </w:rPr>
+        <w:t xml:space="preserve">помещает и извлекает предметы) с хранилищем на самом низком уровне, в то время как часть функционала который занимается обновлением UI инвентаря игрока находится на более высоком уровне, что привело к тому что инвентарь не обновляется после покупки продажи предметов. </w:t>
       </w:r>
     </w:p>
     <w:p>
@@ -2854,6 +3318,7 @@
         <w:t xml:space="preserve">2 Следующая проблемы являются </w:t>
       </w:r>
       <w:proofErr w:type="spellStart"/>
+      <w:proofErr w:type="gramStart"/>
       <w:r>
         <w:rPr>
           <w:rFonts w:ascii="Segoe UI" w:hAnsi="Segoe UI" w:cs="Segoe UI"/>
@@ -2864,6 +3329,7 @@
         <w:t>комплекснимы</w:t>
       </w:r>
       <w:proofErr w:type="spellEnd"/>
+      <w:proofErr w:type="gramEnd"/>
       <w:r>
         <w:rPr>
           <w:rFonts w:ascii="Segoe UI" w:hAnsi="Segoe UI" w:cs="Segoe UI"/>
@@ -2891,7 +3357,27 @@
           <w:color w:val="ECECF1"/>
           <w:shd w:val="clear" w:color="auto" w:fill="343541"/>
         </w:rPr>
-        <w:t xml:space="preserve"> несколько различных подсистем в игру появляются некоторые сложности в управлении проекта из-за того что все </w:t>
+        <w:t xml:space="preserve"> несколько различных подсистем в игру появляются некоторые сложности в управлении проекта </w:t>
+      </w:r>
+      <w:proofErr w:type="gramStart"/>
+      <w:r>
+        <w:rPr>
+          <w:rFonts w:ascii="Segoe UI" w:hAnsi="Segoe UI" w:cs="Segoe UI"/>
+          <w:strike/>
+          <w:color w:val="ECECF1"/>
+          <w:shd w:val="clear" w:color="auto" w:fill="343541"/>
+        </w:rPr>
+        <w:t>из-за того что</w:t>
+      </w:r>
+      <w:proofErr w:type="gramEnd"/>
+      <w:r>
+        <w:rPr>
+          <w:rFonts w:ascii="Segoe UI" w:hAnsi="Segoe UI" w:cs="Segoe UI"/>
+          <w:strike/>
+          <w:color w:val="ECECF1"/>
+          <w:shd w:val="clear" w:color="auto" w:fill="343541"/>
+        </w:rPr>
+        <w:t xml:space="preserve"> все </w:t>
       </w:r>
       <w:proofErr w:type="spellStart"/>
       <w:r>
@@ -2951,7 +3437,27 @@
           <w:color w:val="ECECF1"/>
           <w:shd w:val="clear" w:color="auto" w:fill="343541"/>
         </w:rPr>
-        <w:t xml:space="preserve"> их порой приходится искать там где их не должно быть. </w:t>
+        <w:t xml:space="preserve"> их порой приходится искать </w:t>
+      </w:r>
+      <w:proofErr w:type="gramStart"/>
+      <w:r>
+        <w:rPr>
+          <w:rFonts w:ascii="Segoe UI" w:hAnsi="Segoe UI" w:cs="Segoe UI"/>
+          <w:strike/>
+          <w:color w:val="ECECF1"/>
+          <w:shd w:val="clear" w:color="auto" w:fill="343541"/>
+        </w:rPr>
+        <w:t>там где</w:t>
+      </w:r>
+      <w:proofErr w:type="gramEnd"/>
+      <w:r>
+        <w:rPr>
+          <w:rFonts w:ascii="Segoe UI" w:hAnsi="Segoe UI" w:cs="Segoe UI"/>
+          <w:strike/>
+          <w:color w:val="ECECF1"/>
+          <w:shd w:val="clear" w:color="auto" w:fill="343541"/>
+        </w:rPr>
+        <w:t xml:space="preserve"> их не должно быть. </w:t>
       </w:r>
     </w:p>
     <w:p>
@@ -3005,7 +3511,25 @@
           <w:color w:val="ECECF1"/>
           <w:shd w:val="clear" w:color="auto" w:fill="343541"/>
         </w:rPr>
-        <w:t xml:space="preserve"> хочу запустить в разработку прототип новой боевой системы, который позволит улучшить текущую, точного представления то как она должна выглядеть нету, во время </w:t>
+        <w:t xml:space="preserve"> хочу запустить в разработку прототип новой боевой системы, который позволит улучшить текущую, точного представления то как она должна выглядеть нету, </w:t>
+      </w:r>
+      <w:proofErr w:type="gramStart"/>
+      <w:r>
+        <w:rPr>
+          <w:rFonts w:ascii="Segoe UI" w:hAnsi="Segoe UI" w:cs="Segoe UI"/>
+          <w:color w:val="ECECF1"/>
+          <w:shd w:val="clear" w:color="auto" w:fill="343541"/>
+        </w:rPr>
+        <w:t>во время</w:t>
+      </w:r>
+      <w:proofErr w:type="gramEnd"/>
+      <w:r>
+        <w:rPr>
+          <w:rFonts w:ascii="Segoe UI" w:hAnsi="Segoe UI" w:cs="Segoe UI"/>
+          <w:color w:val="ECECF1"/>
+          <w:shd w:val="clear" w:color="auto" w:fill="343541"/>
+        </w:rPr>
+        <w:t xml:space="preserve"> </w:t>
       </w:r>
       <w:proofErr w:type="spellStart"/>
       <w:r>
@@ -3023,7 +3547,25 @@
           <w:color w:val="ECECF1"/>
           <w:shd w:val="clear" w:color="auto" w:fill="343541"/>
         </w:rPr>
-        <w:t xml:space="preserve"> надеюсь что найду хороший вариант. Зачем обновлять эту механику? Все просто если посмотреть на мой текущий проект то основная часть </w:t>
+        <w:t xml:space="preserve"> надеюсь что найду хороший вариант. Зачем обновлять эту механику? Все просто если посмотреть на мой текущий </w:t>
+      </w:r>
+      <w:proofErr w:type="gramStart"/>
+      <w:r>
+        <w:rPr>
+          <w:rFonts w:ascii="Segoe UI" w:hAnsi="Segoe UI" w:cs="Segoe UI"/>
+          <w:color w:val="ECECF1"/>
+          <w:shd w:val="clear" w:color="auto" w:fill="343541"/>
+        </w:rPr>
+        <w:t>проект</w:t>
+      </w:r>
+      <w:proofErr w:type="gramEnd"/>
+      <w:r>
+        <w:rPr>
+          <w:rFonts w:ascii="Segoe UI" w:hAnsi="Segoe UI" w:cs="Segoe UI"/>
+          <w:color w:val="ECECF1"/>
+          <w:shd w:val="clear" w:color="auto" w:fill="343541"/>
+        </w:rPr>
+        <w:t xml:space="preserve"> то основная часть </w:t>
       </w:r>
       <w:proofErr w:type="spellStart"/>
       <w:r>
@@ -3304,7 +3846,27 @@
           <w:color w:val="ECECF1"/>
           <w:shd w:val="clear" w:color="auto" w:fill="343541"/>
         </w:rPr>
-        <w:t xml:space="preserve">, а также связка от системы прокачки, которую используют враги. И проблема заключается в том что изначально все враги использовали первую систему, но позже была </w:t>
+        <w:t xml:space="preserve">, а также связка от системы прокачки, которую используют враги. И проблема заключается в </w:t>
+      </w:r>
+      <w:proofErr w:type="gramStart"/>
+      <w:r>
+        <w:rPr>
+          <w:rFonts w:ascii="Segoe UI" w:hAnsi="Segoe UI" w:cs="Segoe UI"/>
+          <w:strike/>
+          <w:color w:val="ECECF1"/>
+          <w:shd w:val="clear" w:color="auto" w:fill="343541"/>
+        </w:rPr>
+        <w:t>том</w:t>
+      </w:r>
+      <w:proofErr w:type="gramEnd"/>
+      <w:r>
+        <w:rPr>
+          <w:rFonts w:ascii="Segoe UI" w:hAnsi="Segoe UI" w:cs="Segoe UI"/>
+          <w:strike/>
+          <w:color w:val="ECECF1"/>
+          <w:shd w:val="clear" w:color="auto" w:fill="343541"/>
+        </w:rPr>
+        <w:t xml:space="preserve"> что изначально все враги использовали первую систему, но позже была </w:t>
       </w:r>
       <w:proofErr w:type="spellStart"/>
       <w:r>
@@ -3324,7 +3886,27 @@
           <w:color w:val="ECECF1"/>
           <w:shd w:val="clear" w:color="auto" w:fill="343541"/>
         </w:rPr>
-        <w:t xml:space="preserve"> вторая система, и сейчас очень сложно сказать какую, из систем используют враги, скорей всего это является это будет смесь из двух систем. Это нужно исправить. Нужно пересмотреть взаимодействие этих двух систем и выбрать лучшее решение которое позволит мне разрешить данную проблему.</w:t>
+        <w:t xml:space="preserve"> вторая система, и сейчас очень сложно сказать какую, из систем используют враги, скорей всего это является это будет смесь из двух систем. Это нужно исправить. Нужно пересмотреть взаимодействие этих двух систем и выбрать </w:t>
+      </w:r>
+      <w:proofErr w:type="gramStart"/>
+      <w:r>
+        <w:rPr>
+          <w:rFonts w:ascii="Segoe UI" w:hAnsi="Segoe UI" w:cs="Segoe UI"/>
+          <w:strike/>
+          <w:color w:val="ECECF1"/>
+          <w:shd w:val="clear" w:color="auto" w:fill="343541"/>
+        </w:rPr>
+        <w:t>лучшее решение</w:t>
+      </w:r>
+      <w:proofErr w:type="gramEnd"/>
+      <w:r>
+        <w:rPr>
+          <w:rFonts w:ascii="Segoe UI" w:hAnsi="Segoe UI" w:cs="Segoe UI"/>
+          <w:strike/>
+          <w:color w:val="ECECF1"/>
+          <w:shd w:val="clear" w:color="auto" w:fill="343541"/>
+        </w:rPr>
+        <w:t xml:space="preserve"> которое позволит мне разрешить данную проблему.</w:t>
       </w:r>
     </w:p>
     <w:p>
@@ -3445,6 +4027,7 @@
         <w:t xml:space="preserve"> из </w:t>
       </w:r>
       <w:proofErr w:type="spellStart"/>
+      <w:proofErr w:type="gramStart"/>
       <w:r>
         <w:rPr>
           <w:rFonts w:ascii="Segoe UI" w:hAnsi="Segoe UI" w:cs="Segoe UI"/>
@@ -3455,6 +4038,7 @@
         <w:t>SavaData</w:t>
       </w:r>
       <w:proofErr w:type="spellEnd"/>
+      <w:proofErr w:type="gramEnd"/>
       <w:r>
         <w:rPr>
           <w:rFonts w:ascii="Segoe UI" w:hAnsi="Segoe UI" w:cs="Segoe UI"/>
@@ -3517,7 +4101,25 @@
           <w:color w:val="ECECF1"/>
           <w:shd w:val="clear" w:color="auto" w:fill="343541"/>
         </w:rPr>
-        <w:t xml:space="preserve"> текста на русский и английский, но есть моменты где например используются перечисления, их также нужно перевести на английский и на русский. </w:t>
+        <w:t xml:space="preserve"> текста на русский и английский, но есть моменты </w:t>
+      </w:r>
+      <w:proofErr w:type="gramStart"/>
+      <w:r>
+        <w:rPr>
+          <w:rFonts w:ascii="Segoe UI" w:hAnsi="Segoe UI" w:cs="Segoe UI"/>
+          <w:color w:val="ECECF1"/>
+          <w:shd w:val="clear" w:color="auto" w:fill="343541"/>
+        </w:rPr>
+        <w:t>где например</w:t>
+      </w:r>
+      <w:proofErr w:type="gramEnd"/>
+      <w:r>
+        <w:rPr>
+          <w:rFonts w:ascii="Segoe UI" w:hAnsi="Segoe UI" w:cs="Segoe UI"/>
+          <w:color w:val="ECECF1"/>
+          <w:shd w:val="clear" w:color="auto" w:fill="343541"/>
+        </w:rPr>
+        <w:t xml:space="preserve"> используются перечисления, их также нужно перевести на английский и на русский. </w:t>
       </w:r>
     </w:p>
     <w:p>
@@ -3775,7 +4377,27 @@
           <w:szCs w:val="28"/>
           <w:shd w:val="clear" w:color="auto" w:fill="343541"/>
         </w:rPr>
-        <w:t xml:space="preserve">итерация (размышления. Главная задача этой итерации это подключить случайную генерацию уровней к игре. Но для этого придётся перекопать очень много кода. </w:t>
+        <w:t xml:space="preserve">итерация (размышления. </w:t>
+      </w:r>
+      <w:proofErr w:type="gramStart"/>
+      <w:r>
+        <w:rPr>
+          <w:rFonts w:ascii="Times New Roman" w:hAnsi="Times New Roman" w:cs="Times New Roman"/>
+          <w:sz w:val="28"/>
+          <w:szCs w:val="28"/>
+          <w:shd w:val="clear" w:color="auto" w:fill="343541"/>
+        </w:rPr>
+        <w:t>Главная задача этой итерации это</w:t>
+      </w:r>
+      <w:proofErr w:type="gramEnd"/>
+      <w:r>
+        <w:rPr>
+          <w:rFonts w:ascii="Times New Roman" w:hAnsi="Times New Roman" w:cs="Times New Roman"/>
+          <w:sz w:val="28"/>
+          <w:szCs w:val="28"/>
+          <w:shd w:val="clear" w:color="auto" w:fill="343541"/>
+        </w:rPr>
+        <w:t xml:space="preserve"> подключить случайную генерацию уровней к игре. Но для этого придётся перекопать очень много кода. </w:t>
       </w:r>
       <w:r>
         <w:rPr>
@@ -3820,7 +4442,27 @@
           <w:szCs w:val="28"/>
           <w:shd w:val="clear" w:color="auto" w:fill="343541"/>
         </w:rPr>
-        <w:t xml:space="preserve"> будет опциональным и использоваться только для генерации уровней, так как в первую очередь всегда необходимо сгенерировать уровень, а только потом генерировать персонажей и прочее. Также придётся расширить систему управление игровым процессом (это также понадобится и для оптимизации), так например я хочу сделать компонент который будет отвечать за поведение конкретного чанка. Компонент отвечающий за конкретный чанк в основном будет использовать точно так же как ранее использовался компонент </w:t>
+        <w:t xml:space="preserve"> будет опциональным и использоваться только для генерации уровней, так как в первую очередь всегда необходимо сгенерировать уровень, а только потом генерировать персонажей и прочее. Также придётся расширить систему управление игровым процессом (это также понадобится и для оптимизации), </w:t>
+      </w:r>
+      <w:proofErr w:type="gramStart"/>
+      <w:r>
+        <w:rPr>
+          <w:rFonts w:ascii="Times New Roman" w:hAnsi="Times New Roman" w:cs="Times New Roman"/>
+          <w:sz w:val="28"/>
+          <w:szCs w:val="28"/>
+          <w:shd w:val="clear" w:color="auto" w:fill="343541"/>
+        </w:rPr>
+        <w:t>так например</w:t>
+      </w:r>
+      <w:proofErr w:type="gramEnd"/>
+      <w:r>
+        <w:rPr>
+          <w:rFonts w:ascii="Times New Roman" w:hAnsi="Times New Roman" w:cs="Times New Roman"/>
+          <w:sz w:val="28"/>
+          <w:szCs w:val="28"/>
+          <w:shd w:val="clear" w:color="auto" w:fill="343541"/>
+        </w:rPr>
+        <w:t xml:space="preserve"> я хочу сделать компонент который будет отвечать за поведение конкретного чанка. Компонент отвечающий за конкретный чанк в основном будет использовать точно так же как ранее использовался компонент </w:t>
       </w:r>
       <w:r>
         <w:rPr>
@@ -3858,7 +4500,27 @@
           <w:szCs w:val="28"/>
           <w:shd w:val="clear" w:color="auto" w:fill="343541"/>
         </w:rPr>
-        <w:t xml:space="preserve">, с единственным отличием в том что управляющий компонентов чанка на карте будет уже равное количество количеству созданных чанков. К тому </w:t>
+        <w:t xml:space="preserve">, с единственным отличием в </w:t>
+      </w:r>
+      <w:proofErr w:type="gramStart"/>
+      <w:r>
+        <w:rPr>
+          <w:rFonts w:ascii="Times New Roman" w:hAnsi="Times New Roman" w:cs="Times New Roman"/>
+          <w:sz w:val="28"/>
+          <w:szCs w:val="28"/>
+          <w:shd w:val="clear" w:color="auto" w:fill="343541"/>
+        </w:rPr>
+        <w:t>том</w:t>
+      </w:r>
+      <w:proofErr w:type="gramEnd"/>
+      <w:r>
+        <w:rPr>
+          <w:rFonts w:ascii="Times New Roman" w:hAnsi="Times New Roman" w:cs="Times New Roman"/>
+          <w:sz w:val="28"/>
+          <w:szCs w:val="28"/>
+          <w:shd w:val="clear" w:color="auto" w:fill="343541"/>
+        </w:rPr>
+        <w:t xml:space="preserve"> что управляющий компонентов чанка на карте будет уже равное количество количеству созданных чанков. К тому </w:t>
       </w:r>
       <w:r>
         <w:rPr>
@@ -4144,6 +4806,7 @@
         </w:numPr>
         <w:rPr>
           <w:rFonts w:ascii="Times New Roman" w:hAnsi="Times New Roman" w:cs="Times New Roman"/>
+          <w:strike/>
           <w:sz w:val="28"/>
           <w:szCs w:val="28"/>
           <w:shd w:val="clear" w:color="auto" w:fill="343541"/>
@@ -4153,6 +4816,7 @@
       <w:r>
         <w:rPr>
           <w:rFonts w:ascii="Times New Roman" w:hAnsi="Times New Roman" w:cs="Times New Roman"/>
+          <w:strike/>
           <w:sz w:val="28"/>
           <w:szCs w:val="28"/>
           <w:shd w:val="clear" w:color="auto" w:fill="343541"/>
@@ -4162,6 +4826,7 @@
       <w:r>
         <w:rPr>
           <w:rFonts w:ascii="Times New Roman" w:hAnsi="Times New Roman" w:cs="Times New Roman"/>
+          <w:strike/>
           <w:sz w:val="28"/>
           <w:szCs w:val="28"/>
           <w:shd w:val="clear" w:color="auto" w:fill="343541"/>
@@ -4171,6 +4836,7 @@
       <w:r>
         <w:rPr>
           <w:rFonts w:ascii="Times New Roman" w:hAnsi="Times New Roman" w:cs="Times New Roman"/>
+          <w:strike/>
           <w:sz w:val="28"/>
           <w:szCs w:val="28"/>
           <w:shd w:val="clear" w:color="auto" w:fill="343541"/>
@@ -4178,7 +4844,6 @@
         <w:t xml:space="preserve"> препятствия по типу колы с пола и другое. Посмотреть, что есть в префабах.</w:t>
       </w:r>
     </w:p>
-    <w:bookmarkEnd w:id="0"/>
     <w:p>
       <w:pPr>
         <w:pStyle w:val="a3"/>
@@ -4188,14 +4853,16 @@
         </w:numPr>
         <w:rPr>
           <w:rFonts w:ascii="Times New Roman" w:hAnsi="Times New Roman" w:cs="Times New Roman"/>
-          <w:sz w:val="28"/>
-          <w:szCs w:val="28"/>
-          <w:shd w:val="clear" w:color="auto" w:fill="343541"/>
-        </w:rPr>
-      </w:pPr>
-      <w:r>
-        <w:rPr>
-          <w:rFonts w:ascii="Times New Roman" w:hAnsi="Times New Roman" w:cs="Times New Roman"/>
+          <w:strike/>
+          <w:sz w:val="28"/>
+          <w:szCs w:val="28"/>
+          <w:shd w:val="clear" w:color="auto" w:fill="343541"/>
+        </w:rPr>
+      </w:pPr>
+      <w:r>
+        <w:rPr>
+          <w:rFonts w:ascii="Times New Roman" w:hAnsi="Times New Roman" w:cs="Times New Roman"/>
+          <w:strike/>
           <w:sz w:val="28"/>
           <w:szCs w:val="28"/>
           <w:shd w:val="clear" w:color="auto" w:fill="343541"/>
@@ -4203,6 +4870,7 @@
         <w:t>Пересобрать чанки сделав их более интересными. Добавив всяческие препятствия это может быть, как колья из пола, так и какой-то хлам который не позволяет игроку легко перемещаться по уровню. Вплоть до того, что можно сделать всяческие лабиринты на чанках.</w:t>
       </w:r>
     </w:p>
+    <w:bookmarkEnd w:id="0"/>
     <w:p>
       <w:pPr>
         <w:pStyle w:val="a3"/>
@@ -4476,7 +5144,25 @@
           <w:color w:val="ECECF1"/>
           <w:shd w:val="clear" w:color="auto" w:fill="343541"/>
         </w:rPr>
-        <w:t xml:space="preserve">Пересмотреть работу системы спавна квестов. Мне не нравится то что фабрика квестов сама начинает спавнить как только она сама того пожелает, а что если измениться порядок работы </w:t>
+        <w:t xml:space="preserve">Пересмотреть работу системы спавна квестов. Мне не нравится то что фабрика квестов сама начинает </w:t>
+      </w:r>
+      <w:proofErr w:type="gramStart"/>
+      <w:r>
+        <w:rPr>
+          <w:rFonts w:ascii="Segoe UI" w:hAnsi="Segoe UI" w:cs="Segoe UI"/>
+          <w:color w:val="ECECF1"/>
+          <w:shd w:val="clear" w:color="auto" w:fill="343541"/>
+        </w:rPr>
+        <w:t>спавнить</w:t>
+      </w:r>
+      <w:proofErr w:type="gramEnd"/>
+      <w:r>
+        <w:rPr>
+          <w:rFonts w:ascii="Segoe UI" w:hAnsi="Segoe UI" w:cs="Segoe UI"/>
+          <w:color w:val="ECECF1"/>
+          <w:shd w:val="clear" w:color="auto" w:fill="343541"/>
+        </w:rPr>
+        <w:t xml:space="preserve"> как только она сама того пожелает, а что если измениться порядок работы </w:t>
       </w:r>
       <w:proofErr w:type="spellStart"/>
       <w:r>
@@ -5787,7 +6473,7 @@
 </file>
 
 <file path=customXml/itemProps1.xml><?xml version="1.0" encoding="utf-8"?>
-<ds:datastoreItem xmlns:ds="http://schemas.openxmlformats.org/officeDocument/2006/customXml" ds:itemID="{7818510A-FD33-4599-BBCD-F328AA98A1F0}">
+<ds:datastoreItem xmlns:ds="http://schemas.openxmlformats.org/officeDocument/2006/customXml" ds:itemID="{9B502584-0117-4EB9-8214-A36D62F2ACC0}">
   <ds:schemaRefs>
     <ds:schemaRef ds:uri="http://schemas.openxmlformats.org/officeDocument/2006/bibliography"/>
   </ds:schemaRefs>

</xml_diff>

<commit_message>
Commit structure new SettingsServiceSystem.
</commit_message>
<xml_diff>
--- a/Итерации.docx
+++ b/Итерации.docx
@@ -4812,7 +4812,6 @@
           <w:shd w:val="clear" w:color="auto" w:fill="343541"/>
         </w:rPr>
       </w:pPr>
-      <w:bookmarkStart w:id="0" w:name="_GoBack"/>
       <w:r>
         <w:rPr>
           <w:rFonts w:ascii="Times New Roman" w:hAnsi="Times New Roman" w:cs="Times New Roman"/>
@@ -4870,7 +4869,6 @@
         <w:t>Пересобрать чанки сделав их более интересными. Добавив всяческие препятствия это может быть, как колья из пола, так и какой-то хлам который не позволяет игроку легко перемещаться по уровню. Вплоть до того, что можно сделать всяческие лабиринты на чанках.</w:t>
       </w:r>
     </w:p>
-    <w:bookmarkEnd w:id="0"/>
     <w:p>
       <w:pPr>
         <w:pStyle w:val="a3"/>
@@ -4880,14 +4878,16 @@
         </w:numPr>
         <w:rPr>
           <w:rFonts w:ascii="Times New Roman" w:hAnsi="Times New Roman" w:cs="Times New Roman"/>
-          <w:sz w:val="28"/>
-          <w:szCs w:val="28"/>
-          <w:shd w:val="clear" w:color="auto" w:fill="343541"/>
-        </w:rPr>
-      </w:pPr>
-      <w:r>
-        <w:rPr>
-          <w:rFonts w:ascii="Times New Roman" w:hAnsi="Times New Roman" w:cs="Times New Roman"/>
+          <w:strike/>
+          <w:sz w:val="28"/>
+          <w:szCs w:val="28"/>
+          <w:shd w:val="clear" w:color="auto" w:fill="343541"/>
+        </w:rPr>
+      </w:pPr>
+      <w:r>
+        <w:rPr>
+          <w:rFonts w:ascii="Times New Roman" w:hAnsi="Times New Roman" w:cs="Times New Roman"/>
+          <w:strike/>
           <w:sz w:val="28"/>
           <w:szCs w:val="28"/>
           <w:shd w:val="clear" w:color="auto" w:fill="343541"/>
@@ -4897,6 +4897,7 @@
       <w:r>
         <w:rPr>
           <w:rFonts w:ascii="Times New Roman" w:hAnsi="Times New Roman" w:cs="Times New Roman"/>
+          <w:strike/>
           <w:sz w:val="28"/>
           <w:szCs w:val="28"/>
           <w:shd w:val="clear" w:color="auto" w:fill="343541"/>
@@ -4906,6 +4907,7 @@
       <w:r>
         <w:rPr>
           <w:rFonts w:ascii="Times New Roman" w:hAnsi="Times New Roman" w:cs="Times New Roman"/>
+          <w:strike/>
           <w:sz w:val="28"/>
           <w:szCs w:val="28"/>
           <w:shd w:val="clear" w:color="auto" w:fill="343541"/>
@@ -4927,30 +4929,8 @@
           <w:shd w:val="clear" w:color="auto" w:fill="343541"/>
         </w:rPr>
       </w:pPr>
-      <w:r>
-        <w:rPr>
-          <w:rFonts w:ascii="Times New Roman" w:hAnsi="Times New Roman" w:cs="Times New Roman"/>
-          <w:sz w:val="28"/>
-          <w:szCs w:val="28"/>
-          <w:shd w:val="clear" w:color="auto" w:fill="343541"/>
-        </w:rPr>
-        <w:t>Разработать путевые точки для врагов на чанках, для того чтобы разнообразить игровой процесс.</w:t>
-      </w:r>
-    </w:p>
-    <w:p>
-      <w:pPr>
-        <w:pStyle w:val="a3"/>
-        <w:numPr>
-          <w:ilvl w:val="0"/>
-          <w:numId w:val="4"/>
-        </w:numPr>
-        <w:rPr>
-          <w:rFonts w:ascii="Times New Roman" w:hAnsi="Times New Roman" w:cs="Times New Roman"/>
-          <w:sz w:val="28"/>
-          <w:szCs w:val="28"/>
-          <w:shd w:val="clear" w:color="auto" w:fill="343541"/>
-        </w:rPr>
-      </w:pPr>
+      <w:bookmarkStart w:id="0" w:name="_GoBack"/>
+      <w:bookmarkEnd w:id="0"/>
       <w:r>
         <w:rPr>
           <w:rFonts w:ascii="Times New Roman" w:hAnsi="Times New Roman" w:cs="Times New Roman"/>
@@ -6473,7 +6453,7 @@
 </file>
 
 <file path=customXml/itemProps1.xml><?xml version="1.0" encoding="utf-8"?>
-<ds:datastoreItem xmlns:ds="http://schemas.openxmlformats.org/officeDocument/2006/customXml" ds:itemID="{9B502584-0117-4EB9-8214-A36D62F2ACC0}">
+<ds:datastoreItem xmlns:ds="http://schemas.openxmlformats.org/officeDocument/2006/customXml" ds:itemID="{1B74CE9E-CD24-4AA6-8C07-DECDD2C7120C}">
   <ds:schemaRefs>
     <ds:schemaRef ds:uri="http://schemas.openxmlformats.org/officeDocument/2006/bibliography"/>
   </ds:schemaRefs>

</xml_diff>

<commit_message>
Fix SaveLoadSettings, and update folder structure.
</commit_message>
<xml_diff>
--- a/Итерации.docx
+++ b/Итерации.docx
@@ -4930,7 +4930,6 @@
         </w:rPr>
       </w:pPr>
       <w:bookmarkStart w:id="0" w:name="_GoBack"/>
-      <w:bookmarkEnd w:id="0"/>
       <w:r>
         <w:rPr>
           <w:rFonts w:ascii="Times New Roman" w:hAnsi="Times New Roman" w:cs="Times New Roman"/>
@@ -4960,6 +4959,7 @@
         <w:t>.</w:t>
       </w:r>
     </w:p>
+    <w:bookmarkEnd w:id="0"/>
     <w:p>
       <w:pPr>
         <w:pStyle w:val="a3"/>
@@ -6453,7 +6453,7 @@
 </file>
 
 <file path=customXml/itemProps1.xml><?xml version="1.0" encoding="utf-8"?>
-<ds:datastoreItem xmlns:ds="http://schemas.openxmlformats.org/officeDocument/2006/customXml" ds:itemID="{1B74CE9E-CD24-4AA6-8C07-DECDD2C7120C}">
+<ds:datastoreItem xmlns:ds="http://schemas.openxmlformats.org/officeDocument/2006/customXml" ds:itemID="{B6D1078E-001A-40B3-AA0C-06EDB0B867A6}">
   <ds:schemaRefs>
     <ds:schemaRef ds:uri="http://schemas.openxmlformats.org/officeDocument/2006/bibliography"/>
   </ds:schemaRefs>

</xml_diff>

<commit_message>
Make BackgroundAudioPlayer one an all project.
</commit_message>
<xml_diff>
--- a/Итерации.docx
+++ b/Итерации.docx
@@ -36,27 +36,7 @@
           <w:color w:val="ECECF1"/>
           <w:shd w:val="clear" w:color="auto" w:fill="343541"/>
         </w:rPr>
-        <w:t xml:space="preserve">1 разобраться </w:t>
-      </w:r>
-      <w:proofErr w:type="gramStart"/>
-      <w:r>
-        <w:rPr>
-          <w:rFonts w:ascii="Segoe UI" w:hAnsi="Segoe UI" w:cs="Segoe UI"/>
-          <w:strike/>
-          <w:color w:val="ECECF1"/>
-          <w:shd w:val="clear" w:color="auto" w:fill="343541"/>
-        </w:rPr>
-        <w:t>из структурой</w:t>
-      </w:r>
-      <w:proofErr w:type="gramEnd"/>
-      <w:r>
-        <w:rPr>
-          <w:rFonts w:ascii="Segoe UI" w:hAnsi="Segoe UI" w:cs="Segoe UI"/>
-          <w:strike/>
-          <w:color w:val="ECECF1"/>
-          <w:shd w:val="clear" w:color="auto" w:fill="343541"/>
-        </w:rPr>
-        <w:t xml:space="preserve"> данных которая будет использоваться для сохранения данных игры. Структура должна быть организована на </w:t>
+        <w:t xml:space="preserve">1 разобраться из структурой данных которая будет использоваться для сохранения данных игры. Структура должна быть организована на </w:t>
       </w:r>
       <w:proofErr w:type="spellStart"/>
       <w:r>
@@ -127,25 +107,7 @@
           <w:color w:val="ECECF1"/>
           <w:shd w:val="clear" w:color="auto" w:fill="343541"/>
         </w:rPr>
-        <w:t xml:space="preserve">4 Продумать кто и каким образом будет собирать </w:t>
-      </w:r>
-      <w:proofErr w:type="gramStart"/>
-      <w:r>
-        <w:rPr>
-          <w:rFonts w:ascii="Segoe UI" w:hAnsi="Segoe UI" w:cs="Segoe UI"/>
-          <w:color w:val="ECECF1"/>
-          <w:shd w:val="clear" w:color="auto" w:fill="343541"/>
-        </w:rPr>
-        <w:t>компоненты</w:t>
-      </w:r>
-      <w:proofErr w:type="gramEnd"/>
-      <w:r>
-        <w:rPr>
-          <w:rFonts w:ascii="Segoe UI" w:hAnsi="Segoe UI" w:cs="Segoe UI"/>
-          <w:color w:val="ECECF1"/>
-          <w:shd w:val="clear" w:color="auto" w:fill="343541"/>
-        </w:rPr>
-        <w:t xml:space="preserve"> которые реализовывают интерфейсы для сохранения и/или загрузки данных. Возможно это должна быть фабрика. </w:t>
+        <w:t xml:space="preserve">4 Продумать кто и каким образом будет собирать компоненты которые реализовывают интерфейсы для сохранения и/или загрузки данных. Возможно это должна быть фабрика. </w:t>
       </w:r>
     </w:p>
     <w:p>
@@ -388,27 +350,7 @@
           <w:color w:val="ECECF1"/>
           <w:shd w:val="clear" w:color="auto" w:fill="343541"/>
         </w:rPr>
-        <w:t xml:space="preserve">4 Продумать кто и каким образом будет собирать </w:t>
-      </w:r>
-      <w:proofErr w:type="gramStart"/>
-      <w:r>
-        <w:rPr>
-          <w:rFonts w:ascii="Segoe UI" w:hAnsi="Segoe UI" w:cs="Segoe UI"/>
-          <w:strike/>
-          <w:color w:val="ECECF1"/>
-          <w:shd w:val="clear" w:color="auto" w:fill="343541"/>
-        </w:rPr>
-        <w:t>компоненты</w:t>
-      </w:r>
-      <w:proofErr w:type="gramEnd"/>
-      <w:r>
-        <w:rPr>
-          <w:rFonts w:ascii="Segoe UI" w:hAnsi="Segoe UI" w:cs="Segoe UI"/>
-          <w:strike/>
-          <w:color w:val="ECECF1"/>
-          <w:shd w:val="clear" w:color="auto" w:fill="343541"/>
-        </w:rPr>
-        <w:t xml:space="preserve"> которые реализовывают интерфейсы для сохранения и/или загрузки данных. Возможно это должна быть фабрика.</w:t>
+        <w:t>4 Продумать кто и каким образом будет собирать компоненты которые реализовывают интерфейсы для сохранения и/или загрузки данных. Возможно это должна быть фабрика.</w:t>
       </w:r>
     </w:p>
     <w:p>
@@ -526,27 +468,7 @@
           <w:color w:val="ECECF1"/>
           <w:shd w:val="clear" w:color="auto" w:fill="343541"/>
         </w:rPr>
-        <w:t xml:space="preserve">3 Написать поведение </w:t>
-      </w:r>
-      <w:proofErr w:type="gramStart"/>
-      <w:r>
-        <w:rPr>
-          <w:rFonts w:ascii="Segoe UI" w:hAnsi="Segoe UI" w:cs="Segoe UI"/>
-          <w:strike/>
-          <w:color w:val="ECECF1"/>
-          <w:shd w:val="clear" w:color="auto" w:fill="343541"/>
-        </w:rPr>
-        <w:t>для врагов</w:t>
-      </w:r>
-      <w:proofErr w:type="gramEnd"/>
-      <w:r>
-        <w:rPr>
-          <w:rFonts w:ascii="Segoe UI" w:hAnsi="Segoe UI" w:cs="Segoe UI"/>
-          <w:strike/>
-          <w:color w:val="ECECF1"/>
-          <w:shd w:val="clear" w:color="auto" w:fill="343541"/>
-        </w:rPr>
-        <w:t xml:space="preserve"> которые включают сл</w:t>
+        <w:t>3 Написать поведение для врагов которые включают сл</w:t>
       </w:r>
       <w:r>
         <w:rPr>
@@ -591,27 +513,7 @@
           <w:color w:val="ECECF1"/>
           <w:shd w:val="clear" w:color="auto" w:fill="343541"/>
         </w:rPr>
-        <w:t xml:space="preserve">5 Создать </w:t>
-      </w:r>
-      <w:proofErr w:type="gramStart"/>
-      <w:r>
-        <w:rPr>
-          <w:rFonts w:ascii="Segoe UI" w:hAnsi="Segoe UI" w:cs="Segoe UI"/>
-          <w:strike/>
-          <w:color w:val="ECECF1"/>
-          <w:shd w:val="clear" w:color="auto" w:fill="343541"/>
-        </w:rPr>
-        <w:t>телепорт</w:t>
-      </w:r>
-      <w:proofErr w:type="gramEnd"/>
-      <w:r>
-        <w:rPr>
-          <w:rFonts w:ascii="Segoe UI" w:hAnsi="Segoe UI" w:cs="Segoe UI"/>
-          <w:strike/>
-          <w:color w:val="ECECF1"/>
-          <w:shd w:val="clear" w:color="auto" w:fill="343541"/>
-        </w:rPr>
-        <w:t xml:space="preserve"> который будет пересылать игро</w:t>
+        <w:t>5 Создать телепорт который будет пересылать игро</w:t>
       </w:r>
       <w:r>
         <w:rPr>
@@ -785,27 +687,7 @@
           <w:color w:val="ECECF1"/>
           <w:shd w:val="clear" w:color="auto" w:fill="343541"/>
         </w:rPr>
-        <w:t xml:space="preserve"> уже имеются </w:t>
-      </w:r>
-      <w:proofErr w:type="gramStart"/>
-      <w:r>
-        <w:rPr>
-          <w:rFonts w:ascii="Segoe UI" w:hAnsi="Segoe UI" w:cs="Segoe UI"/>
-          <w:strike/>
-          <w:color w:val="ECECF1"/>
-          <w:shd w:val="clear" w:color="auto" w:fill="343541"/>
-        </w:rPr>
-        <w:t>управляющие компоненты</w:t>
-      </w:r>
-      <w:proofErr w:type="gramEnd"/>
-      <w:r>
-        <w:rPr>
-          <w:rFonts w:ascii="Segoe UI" w:hAnsi="Segoe UI" w:cs="Segoe UI"/>
-          <w:strike/>
-          <w:color w:val="ECECF1"/>
-          <w:shd w:val="clear" w:color="auto" w:fill="343541"/>
-        </w:rPr>
-        <w:t xml:space="preserve"> которые позволяют ии и игроку управлять атакой нужна только логика боевой системы. </w:t>
+        <w:t xml:space="preserve"> уже имеются управляющие компоненты которые позволяют ии и игроку управлять атакой нужна только логика боевой системы. </w:t>
       </w:r>
     </w:p>
     <w:p>
@@ -1035,86 +917,26 @@
           <w:color w:val="ECECF1"/>
           <w:shd w:val="clear" w:color="auto" w:fill="343541"/>
         </w:rPr>
-        <w:t xml:space="preserve"> инвентаря, это нужно сделать чтобы список предметов, а точнее хилок и их количество сохранялось в </w:t>
-      </w:r>
-      <w:proofErr w:type="gramStart"/>
-      <w:r>
-        <w:rPr>
-          <w:rFonts w:ascii="Segoe UI" w:hAnsi="Segoe UI" w:cs="Segoe UI"/>
-          <w:strike/>
-          <w:color w:val="ECECF1"/>
-          <w:shd w:val="clear" w:color="auto" w:fill="343541"/>
-        </w:rPr>
-        <w:t>память</w:t>
-      </w:r>
-      <w:proofErr w:type="gramEnd"/>
-      <w:r>
-        <w:rPr>
-          <w:rFonts w:ascii="Segoe UI" w:hAnsi="Segoe UI" w:cs="Segoe UI"/>
-          <w:strike/>
-          <w:color w:val="ECECF1"/>
-          <w:shd w:val="clear" w:color="auto" w:fill="343541"/>
-        </w:rPr>
-        <w:t xml:space="preserve"> и чтобы его можно было загрузить при продолжении игры </w:t>
-      </w:r>
-    </w:p>
-    <w:p>
-      <w:pPr>
-        <w:rPr>
-          <w:rFonts w:ascii="Segoe UI" w:hAnsi="Segoe UI" w:cs="Segoe UI"/>
-          <w:strike/>
-          <w:color w:val="ECECF1"/>
-          <w:shd w:val="clear" w:color="auto" w:fill="343541"/>
-        </w:rPr>
-      </w:pPr>
-      <w:r>
-        <w:rPr>
-          <w:rFonts w:ascii="Segoe UI" w:hAnsi="Segoe UI" w:cs="Segoe UI"/>
-          <w:strike/>
-          <w:color w:val="ECECF1"/>
-          <w:shd w:val="clear" w:color="auto" w:fill="343541"/>
-        </w:rPr>
-        <w:t xml:space="preserve">2 искать </w:t>
-      </w:r>
-      <w:proofErr w:type="gramStart"/>
-      <w:r>
-        <w:rPr>
-          <w:rFonts w:ascii="Segoe UI" w:hAnsi="Segoe UI" w:cs="Segoe UI"/>
-          <w:strike/>
-          <w:color w:val="ECECF1"/>
-          <w:shd w:val="clear" w:color="auto" w:fill="343541"/>
-        </w:rPr>
-        <w:t>визуальные эффекты</w:t>
-      </w:r>
-      <w:proofErr w:type="gramEnd"/>
-      <w:r>
-        <w:rPr>
-          <w:rFonts w:ascii="Segoe UI" w:hAnsi="Segoe UI" w:cs="Segoe UI"/>
-          <w:strike/>
-          <w:color w:val="ECECF1"/>
-          <w:shd w:val="clear" w:color="auto" w:fill="343541"/>
-        </w:rPr>
-        <w:t xml:space="preserve"> которые отображают смерть игрока и нпс. Также нужно поискать </w:t>
-      </w:r>
-      <w:proofErr w:type="gramStart"/>
-      <w:r>
-        <w:rPr>
-          <w:rFonts w:ascii="Segoe UI" w:hAnsi="Segoe UI" w:cs="Segoe UI"/>
-          <w:strike/>
-          <w:color w:val="ECECF1"/>
-          <w:shd w:val="clear" w:color="auto" w:fill="343541"/>
-        </w:rPr>
-        <w:t>картинки</w:t>
-      </w:r>
-      <w:proofErr w:type="gramEnd"/>
-      <w:r>
-        <w:rPr>
-          <w:rFonts w:ascii="Segoe UI" w:hAnsi="Segoe UI" w:cs="Segoe UI"/>
-          <w:strike/>
-          <w:color w:val="ECECF1"/>
-          <w:shd w:val="clear" w:color="auto" w:fill="343541"/>
-        </w:rPr>
-        <w:t xml:space="preserve"> которые буду использовать в GUI для хилок и для полоски здоровья </w:t>
+        <w:t xml:space="preserve"> инвентаря, это нужно сделать чтобы список предметов, а точнее хилок и их количество сохранялось в память и чтобы его можно было загрузить при продолжении игры </w:t>
+      </w:r>
+    </w:p>
+    <w:p>
+      <w:pPr>
+        <w:rPr>
+          <w:rFonts w:ascii="Segoe UI" w:hAnsi="Segoe UI" w:cs="Segoe UI"/>
+          <w:strike/>
+          <w:color w:val="ECECF1"/>
+          <w:shd w:val="clear" w:color="auto" w:fill="343541"/>
+        </w:rPr>
+      </w:pPr>
+      <w:r>
+        <w:rPr>
+          <w:rFonts w:ascii="Segoe UI" w:hAnsi="Segoe UI" w:cs="Segoe UI"/>
+          <w:strike/>
+          <w:color w:val="ECECF1"/>
+          <w:shd w:val="clear" w:color="auto" w:fill="343541"/>
+        </w:rPr>
+        <w:t xml:space="preserve">2 искать визуальные эффекты которые отображают смерть игрока и нпс. Также нужно поискать картинки которые буду использовать в GUI для хилок и для полоски здоровья </w:t>
       </w:r>
     </w:p>
     <w:p>
@@ -1169,27 +991,7 @@
           <w:color w:val="ECECF1"/>
           <w:shd w:val="clear" w:color="auto" w:fill="343541"/>
         </w:rPr>
-        <w:t xml:space="preserve">5 Работа со светом. Просмотреть разные варианты. Но нужно </w:t>
-      </w:r>
-      <w:proofErr w:type="gramStart"/>
-      <w:r>
-        <w:rPr>
-          <w:rFonts w:ascii="Segoe UI" w:hAnsi="Segoe UI" w:cs="Segoe UI"/>
-          <w:strike/>
-          <w:color w:val="ECECF1"/>
-          <w:shd w:val="clear" w:color="auto" w:fill="343541"/>
-        </w:rPr>
-        <w:t>помнить</w:t>
-      </w:r>
-      <w:proofErr w:type="gramEnd"/>
-      <w:r>
-        <w:rPr>
-          <w:rFonts w:ascii="Segoe UI" w:hAnsi="Segoe UI" w:cs="Segoe UI"/>
-          <w:strike/>
-          <w:color w:val="ECECF1"/>
-          <w:shd w:val="clear" w:color="auto" w:fill="343541"/>
-        </w:rPr>
-        <w:t xml:space="preserve"> что </w:t>
+        <w:t xml:space="preserve">5 Работа со светом. Просмотреть разные варианты. Но нужно помнить что </w:t>
       </w:r>
       <w:proofErr w:type="spellStart"/>
       <w:r>
@@ -1305,27 +1107,7 @@
           <w:color w:val="ECECF1"/>
           <w:shd w:val="clear" w:color="auto" w:fill="343541"/>
         </w:rPr>
-        <w:t xml:space="preserve">8 Пересмотреть скрипты и </w:t>
-      </w:r>
-      <w:proofErr w:type="gramStart"/>
-      <w:r>
-        <w:rPr>
-          <w:rFonts w:ascii="Segoe UI" w:hAnsi="Segoe UI" w:cs="Segoe UI"/>
-          <w:strike/>
-          <w:color w:val="ECECF1"/>
-          <w:shd w:val="clear" w:color="auto" w:fill="343541"/>
-        </w:rPr>
-        <w:t>те</w:t>
-      </w:r>
-      <w:proofErr w:type="gramEnd"/>
-      <w:r>
-        <w:rPr>
-          <w:rFonts w:ascii="Segoe UI" w:hAnsi="Segoe UI" w:cs="Segoe UI"/>
-          <w:strike/>
-          <w:color w:val="ECECF1"/>
-          <w:shd w:val="clear" w:color="auto" w:fill="343541"/>
-        </w:rPr>
-        <w:t xml:space="preserve"> которые не используют статик дату, перевести на использование статик даты, а именно это относиться к </w:t>
+        <w:t xml:space="preserve">8 Пересмотреть скрипты и те которые не используют статик дату, перевести на использование статик даты, а именно это относиться к </w:t>
       </w:r>
       <w:proofErr w:type="spellStart"/>
       <w:r>
@@ -1442,25 +1224,7 @@
           <w:color w:val="ECECF1"/>
           <w:shd w:val="clear" w:color="auto" w:fill="343541"/>
         </w:rPr>
-        <w:t xml:space="preserve">Второй и третий пункт хоть и выглядят достаточно </w:t>
-      </w:r>
-      <w:proofErr w:type="gramStart"/>
-      <w:r>
-        <w:rPr>
-          <w:rFonts w:ascii="Segoe UI" w:hAnsi="Segoe UI" w:cs="Segoe UI"/>
-          <w:color w:val="ECECF1"/>
-          <w:shd w:val="clear" w:color="auto" w:fill="343541"/>
-        </w:rPr>
-        <w:t>просто</w:t>
-      </w:r>
-      <w:proofErr w:type="gramEnd"/>
-      <w:r>
-        <w:rPr>
-          <w:rFonts w:ascii="Segoe UI" w:hAnsi="Segoe UI" w:cs="Segoe UI"/>
-          <w:color w:val="ECECF1"/>
-          <w:shd w:val="clear" w:color="auto" w:fill="343541"/>
-        </w:rPr>
-        <w:t xml:space="preserve"> но на самом деле именно эти два пункта содержат колоссальную работу над проектом.</w:t>
+        <w:t>Второй и третий пункт хоть и выглядят достаточно просто но на самом деле именно эти два пункта содержат колоссальную работу над проектом.</w:t>
       </w:r>
     </w:p>
     <w:p>
@@ -1604,27 +1368,7 @@
           <w:color w:val="ECECF1"/>
           <w:shd w:val="clear" w:color="auto" w:fill="343541"/>
         </w:rPr>
-        <w:t xml:space="preserve">5 Начать погружаться в квестовую систему. Это достаточно крупный шаг и </w:t>
-      </w:r>
-      <w:proofErr w:type="gramStart"/>
-      <w:r>
-        <w:rPr>
-          <w:rFonts w:ascii="Segoe UI" w:hAnsi="Segoe UI" w:cs="Segoe UI"/>
-          <w:strike/>
-          <w:color w:val="ECECF1"/>
-          <w:shd w:val="clear" w:color="auto" w:fill="343541"/>
-        </w:rPr>
-        <w:t>по этому</w:t>
-      </w:r>
-      <w:proofErr w:type="gramEnd"/>
-      <w:r>
-        <w:rPr>
-          <w:rFonts w:ascii="Segoe UI" w:hAnsi="Segoe UI" w:cs="Segoe UI"/>
-          <w:strike/>
-          <w:color w:val="ECECF1"/>
-          <w:shd w:val="clear" w:color="auto" w:fill="343541"/>
-        </w:rPr>
-        <w:t xml:space="preserve"> он займет больше всего времени, хотя и на первый взгляд все написано просто.</w:t>
+        <w:t>5 Начать погружаться в квестовую систему. Это достаточно крупный шаг и по этому он займет больше всего времени, хотя и на первый взгляд все написано просто.</w:t>
       </w:r>
     </w:p>
     <w:p>
@@ -1767,25 +1511,7 @@
           <w:color w:val="ECECF1"/>
           <w:shd w:val="clear" w:color="auto" w:fill="343541"/>
         </w:rPr>
-        <w:t xml:space="preserve">2а </w:t>
-      </w:r>
-      <w:proofErr w:type="gramStart"/>
-      <w:r>
-        <w:rPr>
-          <w:rFonts w:ascii="Segoe UI" w:hAnsi="Segoe UI" w:cs="Segoe UI"/>
-          <w:color w:val="ECECF1"/>
-          <w:shd w:val="clear" w:color="auto" w:fill="343541"/>
-        </w:rPr>
-        <w:t>Завершить</w:t>
-      </w:r>
-      <w:proofErr w:type="gramEnd"/>
-      <w:r>
-        <w:rPr>
-          <w:rFonts w:ascii="Segoe UI" w:hAnsi="Segoe UI" w:cs="Segoe UI"/>
-          <w:color w:val="ECECF1"/>
-          <w:shd w:val="clear" w:color="auto" w:fill="343541"/>
-        </w:rPr>
-        <w:t xml:space="preserve"> прототип, получив работоспособную квестовую систему. </w:t>
+        <w:t xml:space="preserve">2а Завершить прототип, получив работоспособную квестовую систему. </w:t>
       </w:r>
     </w:p>
     <w:p>
@@ -1803,25 +1529,7 @@
           <w:color w:val="ECECF1"/>
           <w:shd w:val="clear" w:color="auto" w:fill="343541"/>
         </w:rPr>
-        <w:t xml:space="preserve">2б </w:t>
-      </w:r>
-      <w:proofErr w:type="gramStart"/>
-      <w:r>
-        <w:rPr>
-          <w:rFonts w:ascii="Segoe UI" w:hAnsi="Segoe UI" w:cs="Segoe UI"/>
-          <w:color w:val="ECECF1"/>
-          <w:shd w:val="clear" w:color="auto" w:fill="343541"/>
-        </w:rPr>
-        <w:t>Контролировать</w:t>
-      </w:r>
-      <w:proofErr w:type="gramEnd"/>
-      <w:r>
-        <w:rPr>
-          <w:rFonts w:ascii="Segoe UI" w:hAnsi="Segoe UI" w:cs="Segoe UI"/>
-          <w:color w:val="ECECF1"/>
-          <w:shd w:val="clear" w:color="auto" w:fill="343541"/>
-        </w:rPr>
-        <w:t xml:space="preserve"> состояние архитектуры при разработке доработке прототипа </w:t>
+        <w:t xml:space="preserve">2б Контролировать состояние архитектуры при разработке доработке прототипа </w:t>
       </w:r>
       <w:proofErr w:type="spellStart"/>
       <w:r>
@@ -1907,25 +1615,7 @@
           <w:color w:val="ECECF1"/>
           <w:shd w:val="clear" w:color="auto" w:fill="343541"/>
         </w:rPr>
-        <w:t xml:space="preserve">6 Готовиться к реализации системы торговли. </w:t>
-      </w:r>
-      <w:proofErr w:type="gramStart"/>
-      <w:r>
-        <w:rPr>
-          <w:rFonts w:ascii="Segoe UI" w:hAnsi="Segoe UI" w:cs="Segoe UI"/>
-          <w:color w:val="ECECF1"/>
-          <w:shd w:val="clear" w:color="auto" w:fill="343541"/>
-        </w:rPr>
-        <w:t>Также</w:t>
-      </w:r>
-      <w:proofErr w:type="gramEnd"/>
-      <w:r>
-        <w:rPr>
-          <w:rFonts w:ascii="Segoe UI" w:hAnsi="Segoe UI" w:cs="Segoe UI"/>
-          <w:color w:val="ECECF1"/>
-          <w:shd w:val="clear" w:color="auto" w:fill="343541"/>
-        </w:rPr>
-        <w:t xml:space="preserve"> как и второй этап достаточно длительный.</w:t>
+        <w:t>6 Готовиться к реализации системы торговли. Также как и второй этап достаточно длительный.</w:t>
       </w:r>
     </w:p>
     <w:p>
@@ -2026,25 +1716,7 @@
           <w:color w:val="ECECF1"/>
           <w:shd w:val="clear" w:color="auto" w:fill="343541"/>
         </w:rPr>
-        <w:t xml:space="preserve">4 Готовится </w:t>
-      </w:r>
-      <w:proofErr w:type="gramStart"/>
-      <w:r>
-        <w:rPr>
-          <w:rFonts w:ascii="Segoe UI" w:hAnsi="Segoe UI" w:cs="Segoe UI"/>
-          <w:color w:val="ECECF1"/>
-          <w:shd w:val="clear" w:color="auto" w:fill="343541"/>
-        </w:rPr>
-        <w:t>к разработки</w:t>
-      </w:r>
-      <w:proofErr w:type="gramEnd"/>
-      <w:r>
-        <w:rPr>
-          <w:rFonts w:ascii="Segoe UI" w:hAnsi="Segoe UI" w:cs="Segoe UI"/>
-          <w:color w:val="ECECF1"/>
-          <w:shd w:val="clear" w:color="auto" w:fill="343541"/>
-        </w:rPr>
-        <w:t xml:space="preserve"> системы торговли.</w:t>
+        <w:t>4 Готовится к разработки системы торговли.</w:t>
       </w:r>
     </w:p>
     <w:p>
@@ -2108,27 +1780,7 @@
           <w:color w:val="ECECF1"/>
           <w:shd w:val="clear" w:color="auto" w:fill="343541"/>
         </w:rPr>
-        <w:t xml:space="preserve">2 Нужно решить </w:t>
-      </w:r>
-      <w:proofErr w:type="gramStart"/>
-      <w:r>
-        <w:rPr>
-          <w:rFonts w:ascii="Segoe UI" w:hAnsi="Segoe UI" w:cs="Segoe UI"/>
-          <w:strike/>
-          <w:color w:val="ECECF1"/>
-          <w:shd w:val="clear" w:color="auto" w:fill="343541"/>
-        </w:rPr>
-        <w:t>проблему</w:t>
-      </w:r>
-      <w:proofErr w:type="gramEnd"/>
-      <w:r>
-        <w:rPr>
-          <w:rFonts w:ascii="Segoe UI" w:hAnsi="Segoe UI" w:cs="Segoe UI"/>
-          <w:strike/>
-          <w:color w:val="ECECF1"/>
-          <w:shd w:val="clear" w:color="auto" w:fill="343541"/>
-        </w:rPr>
-        <w:t xml:space="preserve"> связанную с отображением окна квест </w:t>
+        <w:t xml:space="preserve">2 Нужно решить проблему связанную с отображением окна квест </w:t>
       </w:r>
       <w:proofErr w:type="spellStart"/>
       <w:r>
@@ -2844,25 +2496,7 @@
           <w:color w:val="ECECF1"/>
           <w:shd w:val="clear" w:color="auto" w:fill="343541"/>
         </w:rPr>
-        <w:t xml:space="preserve">2 Создать </w:t>
-      </w:r>
-      <w:proofErr w:type="gramStart"/>
-      <w:r>
-        <w:rPr>
-          <w:rFonts w:ascii="Segoe UI" w:hAnsi="Segoe UI" w:cs="Segoe UI"/>
-          <w:color w:val="ECECF1"/>
-          <w:shd w:val="clear" w:color="auto" w:fill="343541"/>
-        </w:rPr>
-        <w:t>компонент</w:t>
-      </w:r>
-      <w:proofErr w:type="gramEnd"/>
-      <w:r>
-        <w:rPr>
-          <w:rFonts w:ascii="Segoe UI" w:hAnsi="Segoe UI" w:cs="Segoe UI"/>
-          <w:color w:val="ECECF1"/>
-          <w:shd w:val="clear" w:color="auto" w:fill="343541"/>
-        </w:rPr>
-        <w:t xml:space="preserve"> который расширит возможности для системы взаимодействия, и позволит игроку делать выбор какой именно тип взаимодействия желает получить игрок если таких типов взаимодействия </w:t>
+        <w:t xml:space="preserve">2 Создать компонент который расширит возможности для системы взаимодействия, и позволит игроку делать выбор какой именно тип взаимодействия желает получить игрок если таких типов взаимодействия </w:t>
       </w:r>
       <w:proofErr w:type="spellStart"/>
       <w:r>
@@ -3003,27 +2637,7 @@
           <w:color w:val="ECECF1"/>
           <w:shd w:val="clear" w:color="auto" w:fill="343541"/>
         </w:rPr>
-        <w:t xml:space="preserve">1 Добавить </w:t>
-      </w:r>
-      <w:proofErr w:type="gramStart"/>
-      <w:r>
-        <w:rPr>
-          <w:rFonts w:ascii="Segoe UI" w:hAnsi="Segoe UI" w:cs="Segoe UI"/>
-          <w:strike/>
-          <w:color w:val="ECECF1"/>
-          <w:shd w:val="clear" w:color="auto" w:fill="343541"/>
-        </w:rPr>
-        <w:t>функционал</w:t>
-      </w:r>
-      <w:proofErr w:type="gramEnd"/>
-      <w:r>
-        <w:rPr>
-          <w:rFonts w:ascii="Segoe UI" w:hAnsi="Segoe UI" w:cs="Segoe UI"/>
-          <w:strike/>
-          <w:color w:val="ECECF1"/>
-          <w:shd w:val="clear" w:color="auto" w:fill="343541"/>
-        </w:rPr>
-        <w:t xml:space="preserve"> который будет сохранять текущее количество денег игрока в файл сохранения.</w:t>
+        <w:t>1 Добавить функционал который будет сохранять текущее количество денег игрока в файл сохранения.</w:t>
       </w:r>
     </w:p>
     <w:p>
@@ -3138,62 +2752,24 @@
           <w:shd w:val="clear" w:color="auto" w:fill="343541"/>
         </w:rPr>
         <w:lastRenderedPageBreak/>
-        <w:t xml:space="preserve">7 Натянуть анимации </w:t>
-      </w:r>
-      <w:proofErr w:type="gramStart"/>
-      <w:r>
-        <w:rPr>
-          <w:rFonts w:ascii="Segoe UI" w:hAnsi="Segoe UI" w:cs="Segoe UI"/>
-          <w:strike/>
-          <w:color w:val="ECECF1"/>
-          <w:shd w:val="clear" w:color="auto" w:fill="343541"/>
-        </w:rPr>
-        <w:t>на мобов</w:t>
-      </w:r>
-      <w:proofErr w:type="gramEnd"/>
-      <w:r>
-        <w:rPr>
-          <w:rFonts w:ascii="Segoe UI" w:hAnsi="Segoe UI" w:cs="Segoe UI"/>
-          <w:strike/>
-          <w:color w:val="ECECF1"/>
-          <w:shd w:val="clear" w:color="auto" w:fill="343541"/>
-        </w:rPr>
-        <w:t>.</w:t>
-      </w:r>
-    </w:p>
-    <w:p>
-      <w:pPr>
-        <w:rPr>
-          <w:rFonts w:ascii="Segoe UI" w:hAnsi="Segoe UI" w:cs="Segoe UI"/>
-          <w:color w:val="ECECF1"/>
-          <w:shd w:val="clear" w:color="auto" w:fill="343541"/>
-        </w:rPr>
-      </w:pPr>
-      <w:r>
-        <w:rPr>
-          <w:rFonts w:ascii="Segoe UI" w:hAnsi="Segoe UI" w:cs="Segoe UI"/>
-          <w:color w:val="ECECF1"/>
-          <w:shd w:val="clear" w:color="auto" w:fill="343541"/>
-        </w:rPr>
-        <w:t xml:space="preserve">8 </w:t>
-      </w:r>
-      <w:proofErr w:type="gramStart"/>
-      <w:r>
-        <w:rPr>
-          <w:rFonts w:ascii="Segoe UI" w:hAnsi="Segoe UI" w:cs="Segoe UI"/>
-          <w:color w:val="ECECF1"/>
-          <w:shd w:val="clear" w:color="auto" w:fill="343541"/>
-        </w:rPr>
-        <w:t>Думать</w:t>
-      </w:r>
-      <w:proofErr w:type="gramEnd"/>
-      <w:r>
-        <w:rPr>
-          <w:rFonts w:ascii="Segoe UI" w:hAnsi="Segoe UI" w:cs="Segoe UI"/>
-          <w:color w:val="ECECF1"/>
-          <w:shd w:val="clear" w:color="auto" w:fill="343541"/>
-        </w:rPr>
-        <w:t xml:space="preserve"> как можно организовать рандомную генерацию мира, и начать работу над прототипом </w:t>
+        <w:t>7 Натянуть анимации на мобов.</w:t>
+      </w:r>
+    </w:p>
+    <w:p>
+      <w:pPr>
+        <w:rPr>
+          <w:rFonts w:ascii="Segoe UI" w:hAnsi="Segoe UI" w:cs="Segoe UI"/>
+          <w:color w:val="ECECF1"/>
+          <w:shd w:val="clear" w:color="auto" w:fill="343541"/>
+        </w:rPr>
+      </w:pPr>
+      <w:r>
+        <w:rPr>
+          <w:rFonts w:ascii="Segoe UI" w:hAnsi="Segoe UI" w:cs="Segoe UI"/>
+          <w:color w:val="ECECF1"/>
+          <w:shd w:val="clear" w:color="auto" w:fill="343541"/>
+        </w:rPr>
+        <w:t xml:space="preserve">8 Думать как можно организовать рандомную генерацию мира, и начать работу над прототипом </w:t>
       </w:r>
       <w:proofErr w:type="spellStart"/>
       <w:r>
@@ -3256,47 +2832,7 @@
           <w:color w:val="ECECF1"/>
           <w:shd w:val="clear" w:color="auto" w:fill="343541"/>
         </w:rPr>
-        <w:t xml:space="preserve">1 Исправить систему хранилища игровых предметов. Основная проблема состоит в </w:t>
-      </w:r>
-      <w:proofErr w:type="gramStart"/>
-      <w:r>
-        <w:rPr>
-          <w:rFonts w:ascii="Segoe UI" w:hAnsi="Segoe UI" w:cs="Segoe UI"/>
-          <w:strike/>
-          <w:color w:val="ECECF1"/>
-          <w:shd w:val="clear" w:color="auto" w:fill="343541"/>
-        </w:rPr>
-        <w:t>том</w:t>
-      </w:r>
-      <w:proofErr w:type="gramEnd"/>
-      <w:r>
-        <w:rPr>
-          <w:rFonts w:ascii="Segoe UI" w:hAnsi="Segoe UI" w:cs="Segoe UI"/>
-          <w:strike/>
-          <w:color w:val="ECECF1"/>
-          <w:shd w:val="clear" w:color="auto" w:fill="343541"/>
-        </w:rPr>
-        <w:t xml:space="preserve"> что система хранилища была доработана для системы торговли после ее первого создания, что добавило баг. Суть проблемы в том что система торговли </w:t>
-      </w:r>
-      <w:proofErr w:type="gramStart"/>
-      <w:r>
-        <w:rPr>
-          <w:rFonts w:ascii="Segoe UI" w:hAnsi="Segoe UI" w:cs="Segoe UI"/>
-          <w:strike/>
-          <w:color w:val="ECECF1"/>
-          <w:shd w:val="clear" w:color="auto" w:fill="343541"/>
-        </w:rPr>
-        <w:t>оперирует(</w:t>
-      </w:r>
-      <w:proofErr w:type="gramEnd"/>
-      <w:r>
-        <w:rPr>
-          <w:rFonts w:ascii="Segoe UI" w:hAnsi="Segoe UI" w:cs="Segoe UI"/>
-          <w:strike/>
-          <w:color w:val="ECECF1"/>
-          <w:shd w:val="clear" w:color="auto" w:fill="343541"/>
-        </w:rPr>
-        <w:t xml:space="preserve">помещает и извлекает предметы) с хранилищем на самом низком уровне, в то время как часть функционала который занимается обновлением UI инвентаря игрока находится на более высоком уровне, что привело к тому что инвентарь не обновляется после покупки продажи предметов. </w:t>
+        <w:t xml:space="preserve">1 Исправить систему хранилища игровых предметов. Основная проблема состоит в том что система хранилища была доработана для системы торговли после ее первого создания, что добавило баг. Суть проблемы в том что система торговли оперирует(помещает и извлекает предметы) с хранилищем на самом низком уровне, в то время как часть функционала который занимается обновлением UI инвентаря игрока находится на более высоком уровне, что привело к тому что инвентарь не обновляется после покупки продажи предметов. </w:t>
       </w:r>
     </w:p>
     <w:p>
@@ -3318,7 +2854,6 @@
         <w:t xml:space="preserve">2 Следующая проблемы являются </w:t>
       </w:r>
       <w:proofErr w:type="spellStart"/>
-      <w:proofErr w:type="gramStart"/>
       <w:r>
         <w:rPr>
           <w:rFonts w:ascii="Segoe UI" w:hAnsi="Segoe UI" w:cs="Segoe UI"/>
@@ -3329,7 +2864,6 @@
         <w:t>комплекснимы</w:t>
       </w:r>
       <w:proofErr w:type="spellEnd"/>
-      <w:proofErr w:type="gramEnd"/>
       <w:r>
         <w:rPr>
           <w:rFonts w:ascii="Segoe UI" w:hAnsi="Segoe UI" w:cs="Segoe UI"/>
@@ -3357,27 +2891,7 @@
           <w:color w:val="ECECF1"/>
           <w:shd w:val="clear" w:color="auto" w:fill="343541"/>
         </w:rPr>
-        <w:t xml:space="preserve"> несколько различных подсистем в игру появляются некоторые сложности в управлении проекта </w:t>
-      </w:r>
-      <w:proofErr w:type="gramStart"/>
-      <w:r>
-        <w:rPr>
-          <w:rFonts w:ascii="Segoe UI" w:hAnsi="Segoe UI" w:cs="Segoe UI"/>
-          <w:strike/>
-          <w:color w:val="ECECF1"/>
-          <w:shd w:val="clear" w:color="auto" w:fill="343541"/>
-        </w:rPr>
-        <w:t>из-за того что</w:t>
-      </w:r>
-      <w:proofErr w:type="gramEnd"/>
-      <w:r>
-        <w:rPr>
-          <w:rFonts w:ascii="Segoe UI" w:hAnsi="Segoe UI" w:cs="Segoe UI"/>
-          <w:strike/>
-          <w:color w:val="ECECF1"/>
-          <w:shd w:val="clear" w:color="auto" w:fill="343541"/>
-        </w:rPr>
-        <w:t xml:space="preserve"> все </w:t>
+        <w:t xml:space="preserve"> несколько различных подсистем в игру появляются некоторые сложности в управлении проекта из-за того что все </w:t>
       </w:r>
       <w:proofErr w:type="spellStart"/>
       <w:r>
@@ -3437,27 +2951,7 @@
           <w:color w:val="ECECF1"/>
           <w:shd w:val="clear" w:color="auto" w:fill="343541"/>
         </w:rPr>
-        <w:t xml:space="preserve"> их порой приходится искать </w:t>
-      </w:r>
-      <w:proofErr w:type="gramStart"/>
-      <w:r>
-        <w:rPr>
-          <w:rFonts w:ascii="Segoe UI" w:hAnsi="Segoe UI" w:cs="Segoe UI"/>
-          <w:strike/>
-          <w:color w:val="ECECF1"/>
-          <w:shd w:val="clear" w:color="auto" w:fill="343541"/>
-        </w:rPr>
-        <w:t>там где</w:t>
-      </w:r>
-      <w:proofErr w:type="gramEnd"/>
-      <w:r>
-        <w:rPr>
-          <w:rFonts w:ascii="Segoe UI" w:hAnsi="Segoe UI" w:cs="Segoe UI"/>
-          <w:strike/>
-          <w:color w:val="ECECF1"/>
-          <w:shd w:val="clear" w:color="auto" w:fill="343541"/>
-        </w:rPr>
-        <w:t xml:space="preserve"> их не должно быть. </w:t>
+        <w:t xml:space="preserve"> их порой приходится искать там где их не должно быть. </w:t>
       </w:r>
     </w:p>
     <w:p>
@@ -3511,25 +3005,7 @@
           <w:color w:val="ECECF1"/>
           <w:shd w:val="clear" w:color="auto" w:fill="343541"/>
         </w:rPr>
-        <w:t xml:space="preserve"> хочу запустить в разработку прототип новой боевой системы, который позволит улучшить текущую, точного представления то как она должна выглядеть нету, </w:t>
-      </w:r>
-      <w:proofErr w:type="gramStart"/>
-      <w:r>
-        <w:rPr>
-          <w:rFonts w:ascii="Segoe UI" w:hAnsi="Segoe UI" w:cs="Segoe UI"/>
-          <w:color w:val="ECECF1"/>
-          <w:shd w:val="clear" w:color="auto" w:fill="343541"/>
-        </w:rPr>
-        <w:t>во время</w:t>
-      </w:r>
-      <w:proofErr w:type="gramEnd"/>
-      <w:r>
-        <w:rPr>
-          <w:rFonts w:ascii="Segoe UI" w:hAnsi="Segoe UI" w:cs="Segoe UI"/>
-          <w:color w:val="ECECF1"/>
-          <w:shd w:val="clear" w:color="auto" w:fill="343541"/>
-        </w:rPr>
-        <w:t xml:space="preserve"> </w:t>
+        <w:t xml:space="preserve"> хочу запустить в разработку прототип новой боевой системы, который позволит улучшить текущую, точного представления то как она должна выглядеть нету, во время </w:t>
       </w:r>
       <w:proofErr w:type="spellStart"/>
       <w:r>
@@ -3547,25 +3023,7 @@
           <w:color w:val="ECECF1"/>
           <w:shd w:val="clear" w:color="auto" w:fill="343541"/>
         </w:rPr>
-        <w:t xml:space="preserve"> надеюсь что найду хороший вариант. Зачем обновлять эту механику? Все просто если посмотреть на мой текущий </w:t>
-      </w:r>
-      <w:proofErr w:type="gramStart"/>
-      <w:r>
-        <w:rPr>
-          <w:rFonts w:ascii="Segoe UI" w:hAnsi="Segoe UI" w:cs="Segoe UI"/>
-          <w:color w:val="ECECF1"/>
-          <w:shd w:val="clear" w:color="auto" w:fill="343541"/>
-        </w:rPr>
-        <w:t>проект</w:t>
-      </w:r>
-      <w:proofErr w:type="gramEnd"/>
-      <w:r>
-        <w:rPr>
-          <w:rFonts w:ascii="Segoe UI" w:hAnsi="Segoe UI" w:cs="Segoe UI"/>
-          <w:color w:val="ECECF1"/>
-          <w:shd w:val="clear" w:color="auto" w:fill="343541"/>
-        </w:rPr>
-        <w:t xml:space="preserve"> то основная часть </w:t>
+        <w:t xml:space="preserve"> надеюсь что найду хороший вариант. Зачем обновлять эту механику? Все просто если посмотреть на мой текущий проект то основная часть </w:t>
       </w:r>
       <w:proofErr w:type="spellStart"/>
       <w:r>
@@ -3846,27 +3304,7 @@
           <w:color w:val="ECECF1"/>
           <w:shd w:val="clear" w:color="auto" w:fill="343541"/>
         </w:rPr>
-        <w:t xml:space="preserve">, а также связка от системы прокачки, которую используют враги. И проблема заключается в </w:t>
-      </w:r>
-      <w:proofErr w:type="gramStart"/>
-      <w:r>
-        <w:rPr>
-          <w:rFonts w:ascii="Segoe UI" w:hAnsi="Segoe UI" w:cs="Segoe UI"/>
-          <w:strike/>
-          <w:color w:val="ECECF1"/>
-          <w:shd w:val="clear" w:color="auto" w:fill="343541"/>
-        </w:rPr>
-        <w:t>том</w:t>
-      </w:r>
-      <w:proofErr w:type="gramEnd"/>
-      <w:r>
-        <w:rPr>
-          <w:rFonts w:ascii="Segoe UI" w:hAnsi="Segoe UI" w:cs="Segoe UI"/>
-          <w:strike/>
-          <w:color w:val="ECECF1"/>
-          <w:shd w:val="clear" w:color="auto" w:fill="343541"/>
-        </w:rPr>
-        <w:t xml:space="preserve"> что изначально все враги использовали первую систему, но позже была </w:t>
+        <w:t xml:space="preserve">, а также связка от системы прокачки, которую используют враги. И проблема заключается в том что изначально все враги использовали первую систему, но позже была </w:t>
       </w:r>
       <w:proofErr w:type="spellStart"/>
       <w:r>
@@ -3886,27 +3324,7 @@
           <w:color w:val="ECECF1"/>
           <w:shd w:val="clear" w:color="auto" w:fill="343541"/>
         </w:rPr>
-        <w:t xml:space="preserve"> вторая система, и сейчас очень сложно сказать какую, из систем используют враги, скорей всего это является это будет смесь из двух систем. Это нужно исправить. Нужно пересмотреть взаимодействие этих двух систем и выбрать </w:t>
-      </w:r>
-      <w:proofErr w:type="gramStart"/>
-      <w:r>
-        <w:rPr>
-          <w:rFonts w:ascii="Segoe UI" w:hAnsi="Segoe UI" w:cs="Segoe UI"/>
-          <w:strike/>
-          <w:color w:val="ECECF1"/>
-          <w:shd w:val="clear" w:color="auto" w:fill="343541"/>
-        </w:rPr>
-        <w:t>лучшее решение</w:t>
-      </w:r>
-      <w:proofErr w:type="gramEnd"/>
-      <w:r>
-        <w:rPr>
-          <w:rFonts w:ascii="Segoe UI" w:hAnsi="Segoe UI" w:cs="Segoe UI"/>
-          <w:strike/>
-          <w:color w:val="ECECF1"/>
-          <w:shd w:val="clear" w:color="auto" w:fill="343541"/>
-        </w:rPr>
-        <w:t xml:space="preserve"> которое позволит мне разрешить данную проблему.</w:t>
+        <w:t xml:space="preserve"> вторая система, и сейчас очень сложно сказать какую, из систем используют враги, скорей всего это является это будет смесь из двух систем. Это нужно исправить. Нужно пересмотреть взаимодействие этих двух систем и выбрать лучшее решение которое позволит мне разрешить данную проблему.</w:t>
       </w:r>
     </w:p>
     <w:p>
@@ -4027,7 +3445,6 @@
         <w:t xml:space="preserve"> из </w:t>
       </w:r>
       <w:proofErr w:type="spellStart"/>
-      <w:proofErr w:type="gramStart"/>
       <w:r>
         <w:rPr>
           <w:rFonts w:ascii="Segoe UI" w:hAnsi="Segoe UI" w:cs="Segoe UI"/>
@@ -4038,7 +3455,6 @@
         <w:t>SavaData</w:t>
       </w:r>
       <w:proofErr w:type="spellEnd"/>
-      <w:proofErr w:type="gramEnd"/>
       <w:r>
         <w:rPr>
           <w:rFonts w:ascii="Segoe UI" w:hAnsi="Segoe UI" w:cs="Segoe UI"/>
@@ -4101,25 +3517,7 @@
           <w:color w:val="ECECF1"/>
           <w:shd w:val="clear" w:color="auto" w:fill="343541"/>
         </w:rPr>
-        <w:t xml:space="preserve"> текста на русский и английский, но есть моменты </w:t>
-      </w:r>
-      <w:proofErr w:type="gramStart"/>
-      <w:r>
-        <w:rPr>
-          <w:rFonts w:ascii="Segoe UI" w:hAnsi="Segoe UI" w:cs="Segoe UI"/>
-          <w:color w:val="ECECF1"/>
-          <w:shd w:val="clear" w:color="auto" w:fill="343541"/>
-        </w:rPr>
-        <w:t>где например</w:t>
-      </w:r>
-      <w:proofErr w:type="gramEnd"/>
-      <w:r>
-        <w:rPr>
-          <w:rFonts w:ascii="Segoe UI" w:hAnsi="Segoe UI" w:cs="Segoe UI"/>
-          <w:color w:val="ECECF1"/>
-          <w:shd w:val="clear" w:color="auto" w:fill="343541"/>
-        </w:rPr>
-        <w:t xml:space="preserve"> используются перечисления, их также нужно перевести на английский и на русский. </w:t>
+        <w:t xml:space="preserve"> текста на русский и английский, но есть моменты где например используются перечисления, их также нужно перевести на английский и на русский. </w:t>
       </w:r>
     </w:p>
     <w:p>
@@ -4377,27 +3775,7 @@
           <w:szCs w:val="28"/>
           <w:shd w:val="clear" w:color="auto" w:fill="343541"/>
         </w:rPr>
-        <w:t xml:space="preserve">итерация (размышления. </w:t>
-      </w:r>
-      <w:proofErr w:type="gramStart"/>
-      <w:r>
-        <w:rPr>
-          <w:rFonts w:ascii="Times New Roman" w:hAnsi="Times New Roman" w:cs="Times New Roman"/>
-          <w:sz w:val="28"/>
-          <w:szCs w:val="28"/>
-          <w:shd w:val="clear" w:color="auto" w:fill="343541"/>
-        </w:rPr>
-        <w:t>Главная задача этой итерации это</w:t>
-      </w:r>
-      <w:proofErr w:type="gramEnd"/>
-      <w:r>
-        <w:rPr>
-          <w:rFonts w:ascii="Times New Roman" w:hAnsi="Times New Roman" w:cs="Times New Roman"/>
-          <w:sz w:val="28"/>
-          <w:szCs w:val="28"/>
-          <w:shd w:val="clear" w:color="auto" w:fill="343541"/>
-        </w:rPr>
-        <w:t xml:space="preserve"> подключить случайную генерацию уровней к игре. Но для этого придётся перекопать очень много кода. </w:t>
+        <w:t xml:space="preserve">итерация (размышления. Главная задача этой итерации это подключить случайную генерацию уровней к игре. Но для этого придётся перекопать очень много кода. </w:t>
       </w:r>
       <w:r>
         <w:rPr>
@@ -4442,27 +3820,7 @@
           <w:szCs w:val="28"/>
           <w:shd w:val="clear" w:color="auto" w:fill="343541"/>
         </w:rPr>
-        <w:t xml:space="preserve"> будет опциональным и использоваться только для генерации уровней, так как в первую очередь всегда необходимо сгенерировать уровень, а только потом генерировать персонажей и прочее. Также придётся расширить систему управление игровым процессом (это также понадобится и для оптимизации), </w:t>
-      </w:r>
-      <w:proofErr w:type="gramStart"/>
-      <w:r>
-        <w:rPr>
-          <w:rFonts w:ascii="Times New Roman" w:hAnsi="Times New Roman" w:cs="Times New Roman"/>
-          <w:sz w:val="28"/>
-          <w:szCs w:val="28"/>
-          <w:shd w:val="clear" w:color="auto" w:fill="343541"/>
-        </w:rPr>
-        <w:t>так например</w:t>
-      </w:r>
-      <w:proofErr w:type="gramEnd"/>
-      <w:r>
-        <w:rPr>
-          <w:rFonts w:ascii="Times New Roman" w:hAnsi="Times New Roman" w:cs="Times New Roman"/>
-          <w:sz w:val="28"/>
-          <w:szCs w:val="28"/>
-          <w:shd w:val="clear" w:color="auto" w:fill="343541"/>
-        </w:rPr>
-        <w:t xml:space="preserve"> я хочу сделать компонент который будет отвечать за поведение конкретного чанка. Компонент отвечающий за конкретный чанк в основном будет использовать точно так же как ранее использовался компонент </w:t>
+        <w:t xml:space="preserve"> будет опциональным и использоваться только для генерации уровней, так как в первую очередь всегда необходимо сгенерировать уровень, а только потом генерировать персонажей и прочее. Также придётся расширить систему управление игровым процессом (это также понадобится и для оптимизации), так например я хочу сделать компонент который будет отвечать за поведение конкретного чанка. Компонент отвечающий за конкретный чанк в основном будет использовать точно так же как ранее использовался компонент </w:t>
       </w:r>
       <w:r>
         <w:rPr>
@@ -4500,27 +3858,7 @@
           <w:szCs w:val="28"/>
           <w:shd w:val="clear" w:color="auto" w:fill="343541"/>
         </w:rPr>
-        <w:t xml:space="preserve">, с единственным отличием в </w:t>
-      </w:r>
-      <w:proofErr w:type="gramStart"/>
-      <w:r>
-        <w:rPr>
-          <w:rFonts w:ascii="Times New Roman" w:hAnsi="Times New Roman" w:cs="Times New Roman"/>
-          <w:sz w:val="28"/>
-          <w:szCs w:val="28"/>
-          <w:shd w:val="clear" w:color="auto" w:fill="343541"/>
-        </w:rPr>
-        <w:t>том</w:t>
-      </w:r>
-      <w:proofErr w:type="gramEnd"/>
-      <w:r>
-        <w:rPr>
-          <w:rFonts w:ascii="Times New Roman" w:hAnsi="Times New Roman" w:cs="Times New Roman"/>
-          <w:sz w:val="28"/>
-          <w:szCs w:val="28"/>
-          <w:shd w:val="clear" w:color="auto" w:fill="343541"/>
-        </w:rPr>
-        <w:t xml:space="preserve"> что управляющий компонентов чанка на карте будет уже равное количество количеству созданных чанков. К тому </w:t>
+        <w:t xml:space="preserve">, с единственным отличием в том что управляющий компонентов чанка на карте будет уже равное количество количеству созданных чанков. К тому </w:t>
       </w:r>
       <w:r>
         <w:rPr>
@@ -4924,15 +4262,16 @@
         </w:numPr>
         <w:rPr>
           <w:rFonts w:ascii="Times New Roman" w:hAnsi="Times New Roman" w:cs="Times New Roman"/>
-          <w:sz w:val="28"/>
-          <w:szCs w:val="28"/>
-          <w:shd w:val="clear" w:color="auto" w:fill="343541"/>
-        </w:rPr>
-      </w:pPr>
-      <w:bookmarkStart w:id="0" w:name="_GoBack"/>
-      <w:r>
-        <w:rPr>
-          <w:rFonts w:ascii="Times New Roman" w:hAnsi="Times New Roman" w:cs="Times New Roman"/>
+          <w:strike/>
+          <w:sz w:val="28"/>
+          <w:szCs w:val="28"/>
+          <w:shd w:val="clear" w:color="auto" w:fill="343541"/>
+        </w:rPr>
+      </w:pPr>
+      <w:r>
+        <w:rPr>
+          <w:rFonts w:ascii="Times New Roman" w:hAnsi="Times New Roman" w:cs="Times New Roman"/>
+          <w:strike/>
           <w:sz w:val="28"/>
           <w:szCs w:val="28"/>
           <w:shd w:val="clear" w:color="auto" w:fill="343541"/>
@@ -4942,6 +4281,7 @@
       <w:r>
         <w:rPr>
           <w:rFonts w:ascii="Times New Roman" w:hAnsi="Times New Roman" w:cs="Times New Roman"/>
+          <w:strike/>
           <w:sz w:val="28"/>
           <w:szCs w:val="28"/>
           <w:shd w:val="clear" w:color="auto" w:fill="343541"/>
@@ -4952,6 +4292,7 @@
       <w:r>
         <w:rPr>
           <w:rFonts w:ascii="Times New Roman" w:hAnsi="Times New Roman" w:cs="Times New Roman"/>
+          <w:strike/>
           <w:sz w:val="28"/>
           <w:szCs w:val="28"/>
           <w:shd w:val="clear" w:color="auto" w:fill="343541"/>
@@ -4959,7 +4300,6 @@
         <w:t>.</w:t>
       </w:r>
     </w:p>
-    <w:bookmarkEnd w:id="0"/>
     <w:p>
       <w:pPr>
         <w:pStyle w:val="a3"/>
@@ -4969,19 +4309,33 @@
         </w:numPr>
         <w:rPr>
           <w:rFonts w:ascii="Times New Roman" w:hAnsi="Times New Roman" w:cs="Times New Roman"/>
-          <w:sz w:val="28"/>
-          <w:szCs w:val="28"/>
-          <w:shd w:val="clear" w:color="auto" w:fill="343541"/>
-        </w:rPr>
-      </w:pPr>
-      <w:r>
-        <w:rPr>
-          <w:rFonts w:ascii="Times New Roman" w:hAnsi="Times New Roman" w:cs="Times New Roman"/>
-          <w:sz w:val="28"/>
-          <w:szCs w:val="28"/>
-          <w:shd w:val="clear" w:color="auto" w:fill="343541"/>
-        </w:rPr>
-        <w:t>Музыка, которая проигрывается во время игрового процесса должна проигрываться на протяжении всей игры. То есть если игрок находится в игровых сценах музыка не должна прерываться, а должна проигрываться на протяжении всего времени даже если происходит смена игровых сцен.</w:t>
+          <w:strike/>
+          <w:sz w:val="28"/>
+          <w:szCs w:val="28"/>
+          <w:shd w:val="clear" w:color="auto" w:fill="343541"/>
+        </w:rPr>
+      </w:pPr>
+      <w:r>
+        <w:rPr>
+          <w:rFonts w:ascii="Times New Roman" w:hAnsi="Times New Roman" w:cs="Times New Roman"/>
+          <w:strike/>
+          <w:sz w:val="28"/>
+          <w:szCs w:val="28"/>
+          <w:shd w:val="clear" w:color="auto" w:fill="343541"/>
+        </w:rPr>
+        <w:t>Музыка, которая проигрывается во время игрового процесса должна проигрываться на протяжении всей игры. То есть если игрок находится в игровых сценах музыка не должна прерываться, а должна проигрываться на протяжении всего времени даже если происходит смена игровых</w:t>
+      </w:r>
+      <w:bookmarkStart w:id="0" w:name="_GoBack"/>
+      <w:bookmarkEnd w:id="0"/>
+      <w:r>
+        <w:rPr>
+          <w:rFonts w:ascii="Times New Roman" w:hAnsi="Times New Roman" w:cs="Times New Roman"/>
+          <w:strike/>
+          <w:sz w:val="28"/>
+          <w:szCs w:val="28"/>
+          <w:shd w:val="clear" w:color="auto" w:fill="343541"/>
+        </w:rPr>
+        <w:t xml:space="preserve"> сцен.</w:t>
       </w:r>
     </w:p>
     <w:p>
@@ -5124,25 +4478,7 @@
           <w:color w:val="ECECF1"/>
           <w:shd w:val="clear" w:color="auto" w:fill="343541"/>
         </w:rPr>
-        <w:t xml:space="preserve">Пересмотреть работу системы спавна квестов. Мне не нравится то что фабрика квестов сама начинает </w:t>
-      </w:r>
-      <w:proofErr w:type="gramStart"/>
-      <w:r>
-        <w:rPr>
-          <w:rFonts w:ascii="Segoe UI" w:hAnsi="Segoe UI" w:cs="Segoe UI"/>
-          <w:color w:val="ECECF1"/>
-          <w:shd w:val="clear" w:color="auto" w:fill="343541"/>
-        </w:rPr>
-        <w:t>спавнить</w:t>
-      </w:r>
-      <w:proofErr w:type="gramEnd"/>
-      <w:r>
-        <w:rPr>
-          <w:rFonts w:ascii="Segoe UI" w:hAnsi="Segoe UI" w:cs="Segoe UI"/>
-          <w:color w:val="ECECF1"/>
-          <w:shd w:val="clear" w:color="auto" w:fill="343541"/>
-        </w:rPr>
-        <w:t xml:space="preserve"> как только она сама того пожелает, а что если измениться порядок работы </w:t>
+        <w:t xml:space="preserve">Пересмотреть работу системы спавна квестов. Мне не нравится то что фабрика квестов сама начинает спавнить как только она сама того пожелает, а что если измениться порядок работы </w:t>
       </w:r>
       <w:proofErr w:type="spellStart"/>
       <w:r>
@@ -6453,7 +5789,7 @@
 </file>
 
 <file path=customXml/itemProps1.xml><?xml version="1.0" encoding="utf-8"?>
-<ds:datastoreItem xmlns:ds="http://schemas.openxmlformats.org/officeDocument/2006/customXml" ds:itemID="{B6D1078E-001A-40B3-AA0C-06EDB0B867A6}">
+<ds:datastoreItem xmlns:ds="http://schemas.openxmlformats.org/officeDocument/2006/customXml" ds:itemID="{E0015689-A159-4C9B-8376-A622C0726AA9}">
   <ds:schemaRefs>
     <ds:schemaRef ds:uri="http://schemas.openxmlformats.org/officeDocument/2006/bibliography"/>
   </ds:schemaRefs>

</xml_diff>

<commit_message>
Project ready to build.
</commit_message>
<xml_diff>
--- a/Итерации.docx
+++ b/Итерации.docx
@@ -4323,19 +4323,7 @@
           <w:szCs w:val="28"/>
           <w:shd w:val="clear" w:color="auto" w:fill="343541"/>
         </w:rPr>
-        <w:t>Музыка, которая проигрывается во время игрового процесса должна проигрываться на протяжении всей игры. То есть если игрок находится в игровых сценах музыка не должна прерываться, а должна проигрываться на протяжении всего времени даже если происходит смена игровых</w:t>
-      </w:r>
-      <w:bookmarkStart w:id="0" w:name="_GoBack"/>
-      <w:bookmarkEnd w:id="0"/>
-      <w:r>
-        <w:rPr>
-          <w:rFonts w:ascii="Times New Roman" w:hAnsi="Times New Roman" w:cs="Times New Roman"/>
-          <w:strike/>
-          <w:sz w:val="28"/>
-          <w:szCs w:val="28"/>
-          <w:shd w:val="clear" w:color="auto" w:fill="343541"/>
-        </w:rPr>
-        <w:t xml:space="preserve"> сцен.</w:t>
+        <w:t>Музыка, которая проигрывается во время игрового процесса должна проигрываться на протяжении всей игры. То есть если игрок находится в игровых сценах музыка не должна прерываться, а должна проигрываться на протяжении всего времени даже если происходит смена игровых сцен.</w:t>
       </w:r>
     </w:p>
     <w:p>
@@ -4347,14 +4335,17 @@
         </w:numPr>
         <w:rPr>
           <w:rFonts w:ascii="Times New Roman" w:hAnsi="Times New Roman" w:cs="Times New Roman"/>
-          <w:sz w:val="28"/>
-          <w:szCs w:val="28"/>
-          <w:shd w:val="clear" w:color="auto" w:fill="343541"/>
-        </w:rPr>
-      </w:pPr>
-      <w:r>
-        <w:rPr>
-          <w:rFonts w:ascii="Times New Roman" w:hAnsi="Times New Roman" w:cs="Times New Roman"/>
+          <w:strike/>
+          <w:sz w:val="28"/>
+          <w:szCs w:val="28"/>
+          <w:shd w:val="clear" w:color="auto" w:fill="343541"/>
+        </w:rPr>
+      </w:pPr>
+      <w:bookmarkStart w:id="0" w:name="_GoBack"/>
+      <w:r>
+        <w:rPr>
+          <w:rFonts w:ascii="Times New Roman" w:hAnsi="Times New Roman" w:cs="Times New Roman"/>
+          <w:strike/>
           <w:sz w:val="28"/>
           <w:szCs w:val="28"/>
           <w:shd w:val="clear" w:color="auto" w:fill="343541"/>
@@ -4362,6 +4353,7 @@
         <w:t>Сборка билда и тест.</w:t>
       </w:r>
     </w:p>
+    <w:bookmarkEnd w:id="0"/>
     <w:p>
       <w:pPr>
         <w:rPr>
@@ -5789,7 +5781,7 @@
 </file>
 
 <file path=customXml/itemProps1.xml><?xml version="1.0" encoding="utf-8"?>
-<ds:datastoreItem xmlns:ds="http://schemas.openxmlformats.org/officeDocument/2006/customXml" ds:itemID="{E0015689-A159-4C9B-8376-A622C0726AA9}">
+<ds:datastoreItem xmlns:ds="http://schemas.openxmlformats.org/officeDocument/2006/customXml" ds:itemID="{AA445CB5-EA53-4B1B-933D-49DDABA15BA6}">
   <ds:schemaRefs>
     <ds:schemaRef ds:uri="http://schemas.openxmlformats.org/officeDocument/2006/bibliography"/>
   </ds:schemaRefs>

</xml_diff>

<commit_message>
Starr implemented InputBlockerService. Need fix.
</commit_message>
<xml_diff>
--- a/Итерации.docx
+++ b/Итерации.docx
@@ -36,7 +36,27 @@
           <w:color w:val="ECECF1"/>
           <w:shd w:val="clear" w:color="auto" w:fill="343541"/>
         </w:rPr>
-        <w:t xml:space="preserve">1 разобраться из структурой данных которая будет использоваться для сохранения данных игры. Структура должна быть организована на </w:t>
+        <w:t xml:space="preserve">1 разобраться </w:t>
+      </w:r>
+      <w:proofErr w:type="gramStart"/>
+      <w:r>
+        <w:rPr>
+          <w:rFonts w:ascii="Segoe UI" w:hAnsi="Segoe UI" w:cs="Segoe UI"/>
+          <w:strike/>
+          <w:color w:val="ECECF1"/>
+          <w:shd w:val="clear" w:color="auto" w:fill="343541"/>
+        </w:rPr>
+        <w:t>из структурой</w:t>
+      </w:r>
+      <w:proofErr w:type="gramEnd"/>
+      <w:r>
+        <w:rPr>
+          <w:rFonts w:ascii="Segoe UI" w:hAnsi="Segoe UI" w:cs="Segoe UI"/>
+          <w:strike/>
+          <w:color w:val="ECECF1"/>
+          <w:shd w:val="clear" w:color="auto" w:fill="343541"/>
+        </w:rPr>
+        <w:t xml:space="preserve"> данных которая будет использоваться для сохранения данных игры. Структура должна быть организована на </w:t>
       </w:r>
       <w:proofErr w:type="spellStart"/>
       <w:r>
@@ -107,7 +127,25 @@
           <w:color w:val="ECECF1"/>
           <w:shd w:val="clear" w:color="auto" w:fill="343541"/>
         </w:rPr>
-        <w:t xml:space="preserve">4 Продумать кто и каким образом будет собирать компоненты которые реализовывают интерфейсы для сохранения и/или загрузки данных. Возможно это должна быть фабрика. </w:t>
+        <w:t xml:space="preserve">4 Продумать кто и каким образом будет собирать </w:t>
+      </w:r>
+      <w:proofErr w:type="gramStart"/>
+      <w:r>
+        <w:rPr>
+          <w:rFonts w:ascii="Segoe UI" w:hAnsi="Segoe UI" w:cs="Segoe UI"/>
+          <w:color w:val="ECECF1"/>
+          <w:shd w:val="clear" w:color="auto" w:fill="343541"/>
+        </w:rPr>
+        <w:t>компоненты</w:t>
+      </w:r>
+      <w:proofErr w:type="gramEnd"/>
+      <w:r>
+        <w:rPr>
+          <w:rFonts w:ascii="Segoe UI" w:hAnsi="Segoe UI" w:cs="Segoe UI"/>
+          <w:color w:val="ECECF1"/>
+          <w:shd w:val="clear" w:color="auto" w:fill="343541"/>
+        </w:rPr>
+        <w:t xml:space="preserve"> которые реализовывают интерфейсы для сохранения и/или загрузки данных. Возможно это должна быть фабрика. </w:t>
       </w:r>
     </w:p>
     <w:p>
@@ -350,7 +388,27 @@
           <w:color w:val="ECECF1"/>
           <w:shd w:val="clear" w:color="auto" w:fill="343541"/>
         </w:rPr>
-        <w:t>4 Продумать кто и каким образом будет собирать компоненты которые реализовывают интерфейсы для сохранения и/или загрузки данных. Возможно это должна быть фабрика.</w:t>
+        <w:t xml:space="preserve">4 Продумать кто и каким образом будет собирать </w:t>
+      </w:r>
+      <w:proofErr w:type="gramStart"/>
+      <w:r>
+        <w:rPr>
+          <w:rFonts w:ascii="Segoe UI" w:hAnsi="Segoe UI" w:cs="Segoe UI"/>
+          <w:strike/>
+          <w:color w:val="ECECF1"/>
+          <w:shd w:val="clear" w:color="auto" w:fill="343541"/>
+        </w:rPr>
+        <w:t>компоненты</w:t>
+      </w:r>
+      <w:proofErr w:type="gramEnd"/>
+      <w:r>
+        <w:rPr>
+          <w:rFonts w:ascii="Segoe UI" w:hAnsi="Segoe UI" w:cs="Segoe UI"/>
+          <w:strike/>
+          <w:color w:val="ECECF1"/>
+          <w:shd w:val="clear" w:color="auto" w:fill="343541"/>
+        </w:rPr>
+        <w:t xml:space="preserve"> которые реализовывают интерфейсы для сохранения и/или загрузки данных. Возможно это должна быть фабрика.</w:t>
       </w:r>
     </w:p>
     <w:p>
@@ -468,7 +526,27 @@
           <w:color w:val="ECECF1"/>
           <w:shd w:val="clear" w:color="auto" w:fill="343541"/>
         </w:rPr>
-        <w:t>3 Написать поведение для врагов которые включают сл</w:t>
+        <w:t xml:space="preserve">3 Написать поведение </w:t>
+      </w:r>
+      <w:proofErr w:type="gramStart"/>
+      <w:r>
+        <w:rPr>
+          <w:rFonts w:ascii="Segoe UI" w:hAnsi="Segoe UI" w:cs="Segoe UI"/>
+          <w:strike/>
+          <w:color w:val="ECECF1"/>
+          <w:shd w:val="clear" w:color="auto" w:fill="343541"/>
+        </w:rPr>
+        <w:t>для врагов</w:t>
+      </w:r>
+      <w:proofErr w:type="gramEnd"/>
+      <w:r>
+        <w:rPr>
+          <w:rFonts w:ascii="Segoe UI" w:hAnsi="Segoe UI" w:cs="Segoe UI"/>
+          <w:strike/>
+          <w:color w:val="ECECF1"/>
+          <w:shd w:val="clear" w:color="auto" w:fill="343541"/>
+        </w:rPr>
+        <w:t xml:space="preserve"> которые включают сл</w:t>
       </w:r>
       <w:r>
         <w:rPr>
@@ -513,7 +591,27 @@
           <w:color w:val="ECECF1"/>
           <w:shd w:val="clear" w:color="auto" w:fill="343541"/>
         </w:rPr>
-        <w:t>5 Создать телепорт который будет пересылать игро</w:t>
+        <w:t xml:space="preserve">5 Создать </w:t>
+      </w:r>
+      <w:proofErr w:type="gramStart"/>
+      <w:r>
+        <w:rPr>
+          <w:rFonts w:ascii="Segoe UI" w:hAnsi="Segoe UI" w:cs="Segoe UI"/>
+          <w:strike/>
+          <w:color w:val="ECECF1"/>
+          <w:shd w:val="clear" w:color="auto" w:fill="343541"/>
+        </w:rPr>
+        <w:t>телепорт</w:t>
+      </w:r>
+      <w:proofErr w:type="gramEnd"/>
+      <w:r>
+        <w:rPr>
+          <w:rFonts w:ascii="Segoe UI" w:hAnsi="Segoe UI" w:cs="Segoe UI"/>
+          <w:strike/>
+          <w:color w:val="ECECF1"/>
+          <w:shd w:val="clear" w:color="auto" w:fill="343541"/>
+        </w:rPr>
+        <w:t xml:space="preserve"> который будет пересылать игро</w:t>
       </w:r>
       <w:r>
         <w:rPr>
@@ -687,7 +785,27 @@
           <w:color w:val="ECECF1"/>
           <w:shd w:val="clear" w:color="auto" w:fill="343541"/>
         </w:rPr>
-        <w:t xml:space="preserve"> уже имеются управляющие компоненты которые позволяют ии и игроку управлять атакой нужна только логика боевой системы. </w:t>
+        <w:t xml:space="preserve"> уже имеются </w:t>
+      </w:r>
+      <w:proofErr w:type="gramStart"/>
+      <w:r>
+        <w:rPr>
+          <w:rFonts w:ascii="Segoe UI" w:hAnsi="Segoe UI" w:cs="Segoe UI"/>
+          <w:strike/>
+          <w:color w:val="ECECF1"/>
+          <w:shd w:val="clear" w:color="auto" w:fill="343541"/>
+        </w:rPr>
+        <w:t>управляющие компоненты</w:t>
+      </w:r>
+      <w:proofErr w:type="gramEnd"/>
+      <w:r>
+        <w:rPr>
+          <w:rFonts w:ascii="Segoe UI" w:hAnsi="Segoe UI" w:cs="Segoe UI"/>
+          <w:strike/>
+          <w:color w:val="ECECF1"/>
+          <w:shd w:val="clear" w:color="auto" w:fill="343541"/>
+        </w:rPr>
+        <w:t xml:space="preserve"> которые позволяют ии и игроку управлять атакой нужна только логика боевой системы. </w:t>
       </w:r>
     </w:p>
     <w:p>
@@ -917,26 +1035,86 @@
           <w:color w:val="ECECF1"/>
           <w:shd w:val="clear" w:color="auto" w:fill="343541"/>
         </w:rPr>
-        <w:t xml:space="preserve"> инвентаря, это нужно сделать чтобы список предметов, а точнее хилок и их количество сохранялось в память и чтобы его можно было загрузить при продолжении игры </w:t>
-      </w:r>
-    </w:p>
-    <w:p>
-      <w:pPr>
-        <w:rPr>
-          <w:rFonts w:ascii="Segoe UI" w:hAnsi="Segoe UI" w:cs="Segoe UI"/>
-          <w:strike/>
-          <w:color w:val="ECECF1"/>
-          <w:shd w:val="clear" w:color="auto" w:fill="343541"/>
-        </w:rPr>
-      </w:pPr>
-      <w:r>
-        <w:rPr>
-          <w:rFonts w:ascii="Segoe UI" w:hAnsi="Segoe UI" w:cs="Segoe UI"/>
-          <w:strike/>
-          <w:color w:val="ECECF1"/>
-          <w:shd w:val="clear" w:color="auto" w:fill="343541"/>
-        </w:rPr>
-        <w:t xml:space="preserve">2 искать визуальные эффекты которые отображают смерть игрока и нпс. Также нужно поискать картинки которые буду использовать в GUI для хилок и для полоски здоровья </w:t>
+        <w:t xml:space="preserve"> инвентаря, это нужно сделать чтобы список предметов, а точнее хилок и их количество сохранялось в </w:t>
+      </w:r>
+      <w:proofErr w:type="gramStart"/>
+      <w:r>
+        <w:rPr>
+          <w:rFonts w:ascii="Segoe UI" w:hAnsi="Segoe UI" w:cs="Segoe UI"/>
+          <w:strike/>
+          <w:color w:val="ECECF1"/>
+          <w:shd w:val="clear" w:color="auto" w:fill="343541"/>
+        </w:rPr>
+        <w:t>память</w:t>
+      </w:r>
+      <w:proofErr w:type="gramEnd"/>
+      <w:r>
+        <w:rPr>
+          <w:rFonts w:ascii="Segoe UI" w:hAnsi="Segoe UI" w:cs="Segoe UI"/>
+          <w:strike/>
+          <w:color w:val="ECECF1"/>
+          <w:shd w:val="clear" w:color="auto" w:fill="343541"/>
+        </w:rPr>
+        <w:t xml:space="preserve"> и чтобы его можно было загрузить при продолжении игры </w:t>
+      </w:r>
+    </w:p>
+    <w:p>
+      <w:pPr>
+        <w:rPr>
+          <w:rFonts w:ascii="Segoe UI" w:hAnsi="Segoe UI" w:cs="Segoe UI"/>
+          <w:strike/>
+          <w:color w:val="ECECF1"/>
+          <w:shd w:val="clear" w:color="auto" w:fill="343541"/>
+        </w:rPr>
+      </w:pPr>
+      <w:r>
+        <w:rPr>
+          <w:rFonts w:ascii="Segoe UI" w:hAnsi="Segoe UI" w:cs="Segoe UI"/>
+          <w:strike/>
+          <w:color w:val="ECECF1"/>
+          <w:shd w:val="clear" w:color="auto" w:fill="343541"/>
+        </w:rPr>
+        <w:t xml:space="preserve">2 искать </w:t>
+      </w:r>
+      <w:proofErr w:type="gramStart"/>
+      <w:r>
+        <w:rPr>
+          <w:rFonts w:ascii="Segoe UI" w:hAnsi="Segoe UI" w:cs="Segoe UI"/>
+          <w:strike/>
+          <w:color w:val="ECECF1"/>
+          <w:shd w:val="clear" w:color="auto" w:fill="343541"/>
+        </w:rPr>
+        <w:t>визуальные эффекты</w:t>
+      </w:r>
+      <w:proofErr w:type="gramEnd"/>
+      <w:r>
+        <w:rPr>
+          <w:rFonts w:ascii="Segoe UI" w:hAnsi="Segoe UI" w:cs="Segoe UI"/>
+          <w:strike/>
+          <w:color w:val="ECECF1"/>
+          <w:shd w:val="clear" w:color="auto" w:fill="343541"/>
+        </w:rPr>
+        <w:t xml:space="preserve"> которые отображают смерть игрока и нпс. Также нужно поискать </w:t>
+      </w:r>
+      <w:proofErr w:type="gramStart"/>
+      <w:r>
+        <w:rPr>
+          <w:rFonts w:ascii="Segoe UI" w:hAnsi="Segoe UI" w:cs="Segoe UI"/>
+          <w:strike/>
+          <w:color w:val="ECECF1"/>
+          <w:shd w:val="clear" w:color="auto" w:fill="343541"/>
+        </w:rPr>
+        <w:t>картинки</w:t>
+      </w:r>
+      <w:proofErr w:type="gramEnd"/>
+      <w:r>
+        <w:rPr>
+          <w:rFonts w:ascii="Segoe UI" w:hAnsi="Segoe UI" w:cs="Segoe UI"/>
+          <w:strike/>
+          <w:color w:val="ECECF1"/>
+          <w:shd w:val="clear" w:color="auto" w:fill="343541"/>
+        </w:rPr>
+        <w:t xml:space="preserve"> которые буду использовать в GUI для хилок и для полоски здоровья </w:t>
       </w:r>
     </w:p>
     <w:p>
@@ -991,7 +1169,27 @@
           <w:color w:val="ECECF1"/>
           <w:shd w:val="clear" w:color="auto" w:fill="343541"/>
         </w:rPr>
-        <w:t xml:space="preserve">5 Работа со светом. Просмотреть разные варианты. Но нужно помнить что </w:t>
+        <w:t xml:space="preserve">5 Работа со светом. Просмотреть разные варианты. Но нужно </w:t>
+      </w:r>
+      <w:proofErr w:type="gramStart"/>
+      <w:r>
+        <w:rPr>
+          <w:rFonts w:ascii="Segoe UI" w:hAnsi="Segoe UI" w:cs="Segoe UI"/>
+          <w:strike/>
+          <w:color w:val="ECECF1"/>
+          <w:shd w:val="clear" w:color="auto" w:fill="343541"/>
+        </w:rPr>
+        <w:t>помнить</w:t>
+      </w:r>
+      <w:proofErr w:type="gramEnd"/>
+      <w:r>
+        <w:rPr>
+          <w:rFonts w:ascii="Segoe UI" w:hAnsi="Segoe UI" w:cs="Segoe UI"/>
+          <w:strike/>
+          <w:color w:val="ECECF1"/>
+          <w:shd w:val="clear" w:color="auto" w:fill="343541"/>
+        </w:rPr>
+        <w:t xml:space="preserve"> что </w:t>
       </w:r>
       <w:proofErr w:type="spellStart"/>
       <w:r>
@@ -1107,7 +1305,27 @@
           <w:color w:val="ECECF1"/>
           <w:shd w:val="clear" w:color="auto" w:fill="343541"/>
         </w:rPr>
-        <w:t xml:space="preserve">8 Пересмотреть скрипты и те которые не используют статик дату, перевести на использование статик даты, а именно это относиться к </w:t>
+        <w:t xml:space="preserve">8 Пересмотреть скрипты и </w:t>
+      </w:r>
+      <w:proofErr w:type="gramStart"/>
+      <w:r>
+        <w:rPr>
+          <w:rFonts w:ascii="Segoe UI" w:hAnsi="Segoe UI" w:cs="Segoe UI"/>
+          <w:strike/>
+          <w:color w:val="ECECF1"/>
+          <w:shd w:val="clear" w:color="auto" w:fill="343541"/>
+        </w:rPr>
+        <w:t>те</w:t>
+      </w:r>
+      <w:proofErr w:type="gramEnd"/>
+      <w:r>
+        <w:rPr>
+          <w:rFonts w:ascii="Segoe UI" w:hAnsi="Segoe UI" w:cs="Segoe UI"/>
+          <w:strike/>
+          <w:color w:val="ECECF1"/>
+          <w:shd w:val="clear" w:color="auto" w:fill="343541"/>
+        </w:rPr>
+        <w:t xml:space="preserve"> которые не используют статик дату, перевести на использование статик даты, а именно это относиться к </w:t>
       </w:r>
       <w:proofErr w:type="spellStart"/>
       <w:r>
@@ -1224,7 +1442,25 @@
           <w:color w:val="ECECF1"/>
           <w:shd w:val="clear" w:color="auto" w:fill="343541"/>
         </w:rPr>
-        <w:t>Второй и третий пункт хоть и выглядят достаточно просто но на самом деле именно эти два пункта содержат колоссальную работу над проектом.</w:t>
+        <w:t xml:space="preserve">Второй и третий пункт хоть и выглядят достаточно </w:t>
+      </w:r>
+      <w:proofErr w:type="gramStart"/>
+      <w:r>
+        <w:rPr>
+          <w:rFonts w:ascii="Segoe UI" w:hAnsi="Segoe UI" w:cs="Segoe UI"/>
+          <w:color w:val="ECECF1"/>
+          <w:shd w:val="clear" w:color="auto" w:fill="343541"/>
+        </w:rPr>
+        <w:t>просто</w:t>
+      </w:r>
+      <w:proofErr w:type="gramEnd"/>
+      <w:r>
+        <w:rPr>
+          <w:rFonts w:ascii="Segoe UI" w:hAnsi="Segoe UI" w:cs="Segoe UI"/>
+          <w:color w:val="ECECF1"/>
+          <w:shd w:val="clear" w:color="auto" w:fill="343541"/>
+        </w:rPr>
+        <w:t xml:space="preserve"> но на самом деле именно эти два пункта содержат колоссальную работу над проектом.</w:t>
       </w:r>
     </w:p>
     <w:p>
@@ -1368,7 +1604,27 @@
           <w:color w:val="ECECF1"/>
           <w:shd w:val="clear" w:color="auto" w:fill="343541"/>
         </w:rPr>
-        <w:t>5 Начать погружаться в квестовую систему. Это достаточно крупный шаг и по этому он займет больше всего времени, хотя и на первый взгляд все написано просто.</w:t>
+        <w:t xml:space="preserve">5 Начать погружаться в квестовую систему. Это достаточно крупный шаг и </w:t>
+      </w:r>
+      <w:proofErr w:type="gramStart"/>
+      <w:r>
+        <w:rPr>
+          <w:rFonts w:ascii="Segoe UI" w:hAnsi="Segoe UI" w:cs="Segoe UI"/>
+          <w:strike/>
+          <w:color w:val="ECECF1"/>
+          <w:shd w:val="clear" w:color="auto" w:fill="343541"/>
+        </w:rPr>
+        <w:t>по этому</w:t>
+      </w:r>
+      <w:proofErr w:type="gramEnd"/>
+      <w:r>
+        <w:rPr>
+          <w:rFonts w:ascii="Segoe UI" w:hAnsi="Segoe UI" w:cs="Segoe UI"/>
+          <w:strike/>
+          <w:color w:val="ECECF1"/>
+          <w:shd w:val="clear" w:color="auto" w:fill="343541"/>
+        </w:rPr>
+        <w:t xml:space="preserve"> он займет больше всего времени, хотя и на первый взгляд все написано просто.</w:t>
       </w:r>
     </w:p>
     <w:p>
@@ -1511,7 +1767,25 @@
           <w:color w:val="ECECF1"/>
           <w:shd w:val="clear" w:color="auto" w:fill="343541"/>
         </w:rPr>
-        <w:t xml:space="preserve">2а Завершить прототип, получив работоспособную квестовую систему. </w:t>
+        <w:t xml:space="preserve">2а </w:t>
+      </w:r>
+      <w:proofErr w:type="gramStart"/>
+      <w:r>
+        <w:rPr>
+          <w:rFonts w:ascii="Segoe UI" w:hAnsi="Segoe UI" w:cs="Segoe UI"/>
+          <w:color w:val="ECECF1"/>
+          <w:shd w:val="clear" w:color="auto" w:fill="343541"/>
+        </w:rPr>
+        <w:t>Завершить</w:t>
+      </w:r>
+      <w:proofErr w:type="gramEnd"/>
+      <w:r>
+        <w:rPr>
+          <w:rFonts w:ascii="Segoe UI" w:hAnsi="Segoe UI" w:cs="Segoe UI"/>
+          <w:color w:val="ECECF1"/>
+          <w:shd w:val="clear" w:color="auto" w:fill="343541"/>
+        </w:rPr>
+        <w:t xml:space="preserve"> прототип, получив работоспособную квестовую систему. </w:t>
       </w:r>
     </w:p>
     <w:p>
@@ -1529,7 +1803,25 @@
           <w:color w:val="ECECF1"/>
           <w:shd w:val="clear" w:color="auto" w:fill="343541"/>
         </w:rPr>
-        <w:t xml:space="preserve">2б Контролировать состояние архитектуры при разработке доработке прототипа </w:t>
+        <w:t xml:space="preserve">2б </w:t>
+      </w:r>
+      <w:proofErr w:type="gramStart"/>
+      <w:r>
+        <w:rPr>
+          <w:rFonts w:ascii="Segoe UI" w:hAnsi="Segoe UI" w:cs="Segoe UI"/>
+          <w:color w:val="ECECF1"/>
+          <w:shd w:val="clear" w:color="auto" w:fill="343541"/>
+        </w:rPr>
+        <w:t>Контролировать</w:t>
+      </w:r>
+      <w:proofErr w:type="gramEnd"/>
+      <w:r>
+        <w:rPr>
+          <w:rFonts w:ascii="Segoe UI" w:hAnsi="Segoe UI" w:cs="Segoe UI"/>
+          <w:color w:val="ECECF1"/>
+          <w:shd w:val="clear" w:color="auto" w:fill="343541"/>
+        </w:rPr>
+        <w:t xml:space="preserve"> состояние архитектуры при разработке доработке прототипа </w:t>
       </w:r>
       <w:proofErr w:type="spellStart"/>
       <w:r>
@@ -1615,7 +1907,25 @@
           <w:color w:val="ECECF1"/>
           <w:shd w:val="clear" w:color="auto" w:fill="343541"/>
         </w:rPr>
-        <w:t>6 Готовиться к реализации системы торговли. Также как и второй этап достаточно длительный.</w:t>
+        <w:t xml:space="preserve">6 Готовиться к реализации системы торговли. </w:t>
+      </w:r>
+      <w:proofErr w:type="gramStart"/>
+      <w:r>
+        <w:rPr>
+          <w:rFonts w:ascii="Segoe UI" w:hAnsi="Segoe UI" w:cs="Segoe UI"/>
+          <w:color w:val="ECECF1"/>
+          <w:shd w:val="clear" w:color="auto" w:fill="343541"/>
+        </w:rPr>
+        <w:t>Также</w:t>
+      </w:r>
+      <w:proofErr w:type="gramEnd"/>
+      <w:r>
+        <w:rPr>
+          <w:rFonts w:ascii="Segoe UI" w:hAnsi="Segoe UI" w:cs="Segoe UI"/>
+          <w:color w:val="ECECF1"/>
+          <w:shd w:val="clear" w:color="auto" w:fill="343541"/>
+        </w:rPr>
+        <w:t xml:space="preserve"> как и второй этап достаточно длительный.</w:t>
       </w:r>
     </w:p>
     <w:p>
@@ -1716,7 +2026,25 @@
           <w:color w:val="ECECF1"/>
           <w:shd w:val="clear" w:color="auto" w:fill="343541"/>
         </w:rPr>
-        <w:t>4 Готовится к разработки системы торговли.</w:t>
+        <w:t xml:space="preserve">4 Готовится </w:t>
+      </w:r>
+      <w:proofErr w:type="gramStart"/>
+      <w:r>
+        <w:rPr>
+          <w:rFonts w:ascii="Segoe UI" w:hAnsi="Segoe UI" w:cs="Segoe UI"/>
+          <w:color w:val="ECECF1"/>
+          <w:shd w:val="clear" w:color="auto" w:fill="343541"/>
+        </w:rPr>
+        <w:t>к разработки</w:t>
+      </w:r>
+      <w:proofErr w:type="gramEnd"/>
+      <w:r>
+        <w:rPr>
+          <w:rFonts w:ascii="Segoe UI" w:hAnsi="Segoe UI" w:cs="Segoe UI"/>
+          <w:color w:val="ECECF1"/>
+          <w:shd w:val="clear" w:color="auto" w:fill="343541"/>
+        </w:rPr>
+        <w:t xml:space="preserve"> системы торговли.</w:t>
       </w:r>
     </w:p>
     <w:p>
@@ -1780,7 +2108,27 @@
           <w:color w:val="ECECF1"/>
           <w:shd w:val="clear" w:color="auto" w:fill="343541"/>
         </w:rPr>
-        <w:t xml:space="preserve">2 Нужно решить проблему связанную с отображением окна квест </w:t>
+        <w:t xml:space="preserve">2 Нужно решить </w:t>
+      </w:r>
+      <w:proofErr w:type="gramStart"/>
+      <w:r>
+        <w:rPr>
+          <w:rFonts w:ascii="Segoe UI" w:hAnsi="Segoe UI" w:cs="Segoe UI"/>
+          <w:strike/>
+          <w:color w:val="ECECF1"/>
+          <w:shd w:val="clear" w:color="auto" w:fill="343541"/>
+        </w:rPr>
+        <w:t>проблему</w:t>
+      </w:r>
+      <w:proofErr w:type="gramEnd"/>
+      <w:r>
+        <w:rPr>
+          <w:rFonts w:ascii="Segoe UI" w:hAnsi="Segoe UI" w:cs="Segoe UI"/>
+          <w:strike/>
+          <w:color w:val="ECECF1"/>
+          <w:shd w:val="clear" w:color="auto" w:fill="343541"/>
+        </w:rPr>
+        <w:t xml:space="preserve"> связанную с отображением окна квест </w:t>
       </w:r>
       <w:proofErr w:type="spellStart"/>
       <w:r>
@@ -2496,7 +2844,25 @@
           <w:color w:val="ECECF1"/>
           <w:shd w:val="clear" w:color="auto" w:fill="343541"/>
         </w:rPr>
-        <w:t xml:space="preserve">2 Создать компонент который расширит возможности для системы взаимодействия, и позволит игроку делать выбор какой именно тип взаимодействия желает получить игрок если таких типов взаимодействия </w:t>
+        <w:t xml:space="preserve">2 Создать </w:t>
+      </w:r>
+      <w:proofErr w:type="gramStart"/>
+      <w:r>
+        <w:rPr>
+          <w:rFonts w:ascii="Segoe UI" w:hAnsi="Segoe UI" w:cs="Segoe UI"/>
+          <w:color w:val="ECECF1"/>
+          <w:shd w:val="clear" w:color="auto" w:fill="343541"/>
+        </w:rPr>
+        <w:t>компонент</w:t>
+      </w:r>
+      <w:proofErr w:type="gramEnd"/>
+      <w:r>
+        <w:rPr>
+          <w:rFonts w:ascii="Segoe UI" w:hAnsi="Segoe UI" w:cs="Segoe UI"/>
+          <w:color w:val="ECECF1"/>
+          <w:shd w:val="clear" w:color="auto" w:fill="343541"/>
+        </w:rPr>
+        <w:t xml:space="preserve"> который расширит возможности для системы взаимодействия, и позволит игроку делать выбор какой именно тип взаимодействия желает получить игрок если таких типов взаимодействия </w:t>
       </w:r>
       <w:proofErr w:type="spellStart"/>
       <w:r>
@@ -2637,7 +3003,27 @@
           <w:color w:val="ECECF1"/>
           <w:shd w:val="clear" w:color="auto" w:fill="343541"/>
         </w:rPr>
-        <w:t>1 Добавить функционал который будет сохранять текущее количество денег игрока в файл сохранения.</w:t>
+        <w:t xml:space="preserve">1 Добавить </w:t>
+      </w:r>
+      <w:proofErr w:type="gramStart"/>
+      <w:r>
+        <w:rPr>
+          <w:rFonts w:ascii="Segoe UI" w:hAnsi="Segoe UI" w:cs="Segoe UI"/>
+          <w:strike/>
+          <w:color w:val="ECECF1"/>
+          <w:shd w:val="clear" w:color="auto" w:fill="343541"/>
+        </w:rPr>
+        <w:t>функционал</w:t>
+      </w:r>
+      <w:proofErr w:type="gramEnd"/>
+      <w:r>
+        <w:rPr>
+          <w:rFonts w:ascii="Segoe UI" w:hAnsi="Segoe UI" w:cs="Segoe UI"/>
+          <w:strike/>
+          <w:color w:val="ECECF1"/>
+          <w:shd w:val="clear" w:color="auto" w:fill="343541"/>
+        </w:rPr>
+        <w:t xml:space="preserve"> который будет сохранять текущее количество денег игрока в файл сохранения.</w:t>
       </w:r>
     </w:p>
     <w:p>
@@ -2752,24 +3138,62 @@
           <w:shd w:val="clear" w:color="auto" w:fill="343541"/>
         </w:rPr>
         <w:lastRenderedPageBreak/>
-        <w:t>7 Натянуть анимации на мобов.</w:t>
-      </w:r>
-    </w:p>
-    <w:p>
-      <w:pPr>
-        <w:rPr>
-          <w:rFonts w:ascii="Segoe UI" w:hAnsi="Segoe UI" w:cs="Segoe UI"/>
-          <w:color w:val="ECECF1"/>
-          <w:shd w:val="clear" w:color="auto" w:fill="343541"/>
-        </w:rPr>
-      </w:pPr>
-      <w:r>
-        <w:rPr>
-          <w:rFonts w:ascii="Segoe UI" w:hAnsi="Segoe UI" w:cs="Segoe UI"/>
-          <w:color w:val="ECECF1"/>
-          <w:shd w:val="clear" w:color="auto" w:fill="343541"/>
-        </w:rPr>
-        <w:t xml:space="preserve">8 Думать как можно организовать рандомную генерацию мира, и начать работу над прототипом </w:t>
+        <w:t xml:space="preserve">7 Натянуть анимации </w:t>
+      </w:r>
+      <w:proofErr w:type="gramStart"/>
+      <w:r>
+        <w:rPr>
+          <w:rFonts w:ascii="Segoe UI" w:hAnsi="Segoe UI" w:cs="Segoe UI"/>
+          <w:strike/>
+          <w:color w:val="ECECF1"/>
+          <w:shd w:val="clear" w:color="auto" w:fill="343541"/>
+        </w:rPr>
+        <w:t>на мобов</w:t>
+      </w:r>
+      <w:proofErr w:type="gramEnd"/>
+      <w:r>
+        <w:rPr>
+          <w:rFonts w:ascii="Segoe UI" w:hAnsi="Segoe UI" w:cs="Segoe UI"/>
+          <w:strike/>
+          <w:color w:val="ECECF1"/>
+          <w:shd w:val="clear" w:color="auto" w:fill="343541"/>
+        </w:rPr>
+        <w:t>.</w:t>
+      </w:r>
+    </w:p>
+    <w:p>
+      <w:pPr>
+        <w:rPr>
+          <w:rFonts w:ascii="Segoe UI" w:hAnsi="Segoe UI" w:cs="Segoe UI"/>
+          <w:color w:val="ECECF1"/>
+          <w:shd w:val="clear" w:color="auto" w:fill="343541"/>
+        </w:rPr>
+      </w:pPr>
+      <w:r>
+        <w:rPr>
+          <w:rFonts w:ascii="Segoe UI" w:hAnsi="Segoe UI" w:cs="Segoe UI"/>
+          <w:color w:val="ECECF1"/>
+          <w:shd w:val="clear" w:color="auto" w:fill="343541"/>
+        </w:rPr>
+        <w:t xml:space="preserve">8 </w:t>
+      </w:r>
+      <w:proofErr w:type="gramStart"/>
+      <w:r>
+        <w:rPr>
+          <w:rFonts w:ascii="Segoe UI" w:hAnsi="Segoe UI" w:cs="Segoe UI"/>
+          <w:color w:val="ECECF1"/>
+          <w:shd w:val="clear" w:color="auto" w:fill="343541"/>
+        </w:rPr>
+        <w:t>Думать</w:t>
+      </w:r>
+      <w:proofErr w:type="gramEnd"/>
+      <w:r>
+        <w:rPr>
+          <w:rFonts w:ascii="Segoe UI" w:hAnsi="Segoe UI" w:cs="Segoe UI"/>
+          <w:color w:val="ECECF1"/>
+          <w:shd w:val="clear" w:color="auto" w:fill="343541"/>
+        </w:rPr>
+        <w:t xml:space="preserve"> как можно организовать рандомную генерацию мира, и начать работу над прототипом </w:t>
       </w:r>
       <w:proofErr w:type="spellStart"/>
       <w:r>
@@ -2832,7 +3256,47 @@
           <w:color w:val="ECECF1"/>
           <w:shd w:val="clear" w:color="auto" w:fill="343541"/>
         </w:rPr>
-        <w:t xml:space="preserve">1 Исправить систему хранилища игровых предметов. Основная проблема состоит в том что система хранилища была доработана для системы торговли после ее первого создания, что добавило баг. Суть проблемы в том что система торговли оперирует(помещает и извлекает предметы) с хранилищем на самом низком уровне, в то время как часть функционала который занимается обновлением UI инвентаря игрока находится на более высоком уровне, что привело к тому что инвентарь не обновляется после покупки продажи предметов. </w:t>
+        <w:t xml:space="preserve">1 Исправить систему хранилища игровых предметов. Основная проблема состоит в </w:t>
+      </w:r>
+      <w:proofErr w:type="gramStart"/>
+      <w:r>
+        <w:rPr>
+          <w:rFonts w:ascii="Segoe UI" w:hAnsi="Segoe UI" w:cs="Segoe UI"/>
+          <w:strike/>
+          <w:color w:val="ECECF1"/>
+          <w:shd w:val="clear" w:color="auto" w:fill="343541"/>
+        </w:rPr>
+        <w:t>том</w:t>
+      </w:r>
+      <w:proofErr w:type="gramEnd"/>
+      <w:r>
+        <w:rPr>
+          <w:rFonts w:ascii="Segoe UI" w:hAnsi="Segoe UI" w:cs="Segoe UI"/>
+          <w:strike/>
+          <w:color w:val="ECECF1"/>
+          <w:shd w:val="clear" w:color="auto" w:fill="343541"/>
+        </w:rPr>
+        <w:t xml:space="preserve"> что система хранилища была доработана для системы торговли после ее первого создания, что добавило баг. Суть проблемы в том что система торговли </w:t>
+      </w:r>
+      <w:proofErr w:type="gramStart"/>
+      <w:r>
+        <w:rPr>
+          <w:rFonts w:ascii="Segoe UI" w:hAnsi="Segoe UI" w:cs="Segoe UI"/>
+          <w:strike/>
+          <w:color w:val="ECECF1"/>
+          <w:shd w:val="clear" w:color="auto" w:fill="343541"/>
+        </w:rPr>
+        <w:t>оперирует(</w:t>
+      </w:r>
+      <w:proofErr w:type="gramEnd"/>
+      <w:r>
+        <w:rPr>
+          <w:rFonts w:ascii="Segoe UI" w:hAnsi="Segoe UI" w:cs="Segoe UI"/>
+          <w:strike/>
+          <w:color w:val="ECECF1"/>
+          <w:shd w:val="clear" w:color="auto" w:fill="343541"/>
+        </w:rPr>
+        <w:t xml:space="preserve">помещает и извлекает предметы) с хранилищем на самом низком уровне, в то время как часть функционала который занимается обновлением UI инвентаря игрока находится на более высоком уровне, что привело к тому что инвентарь не обновляется после покупки продажи предметов. </w:t>
       </w:r>
     </w:p>
     <w:p>
@@ -2854,6 +3318,7 @@
         <w:t xml:space="preserve">2 Следующая проблемы являются </w:t>
       </w:r>
       <w:proofErr w:type="spellStart"/>
+      <w:proofErr w:type="gramStart"/>
       <w:r>
         <w:rPr>
           <w:rFonts w:ascii="Segoe UI" w:hAnsi="Segoe UI" w:cs="Segoe UI"/>
@@ -2864,6 +3329,7 @@
         <w:t>комплекснимы</w:t>
       </w:r>
       <w:proofErr w:type="spellEnd"/>
+      <w:proofErr w:type="gramEnd"/>
       <w:r>
         <w:rPr>
           <w:rFonts w:ascii="Segoe UI" w:hAnsi="Segoe UI" w:cs="Segoe UI"/>
@@ -2891,7 +3357,27 @@
           <w:color w:val="ECECF1"/>
           <w:shd w:val="clear" w:color="auto" w:fill="343541"/>
         </w:rPr>
-        <w:t xml:space="preserve"> несколько различных подсистем в игру появляются некоторые сложности в управлении проекта из-за того что все </w:t>
+        <w:t xml:space="preserve"> несколько различных подсистем в игру появляются некоторые сложности в управлении проекта </w:t>
+      </w:r>
+      <w:proofErr w:type="gramStart"/>
+      <w:r>
+        <w:rPr>
+          <w:rFonts w:ascii="Segoe UI" w:hAnsi="Segoe UI" w:cs="Segoe UI"/>
+          <w:strike/>
+          <w:color w:val="ECECF1"/>
+          <w:shd w:val="clear" w:color="auto" w:fill="343541"/>
+        </w:rPr>
+        <w:t>из-за того что</w:t>
+      </w:r>
+      <w:proofErr w:type="gramEnd"/>
+      <w:r>
+        <w:rPr>
+          <w:rFonts w:ascii="Segoe UI" w:hAnsi="Segoe UI" w:cs="Segoe UI"/>
+          <w:strike/>
+          <w:color w:val="ECECF1"/>
+          <w:shd w:val="clear" w:color="auto" w:fill="343541"/>
+        </w:rPr>
+        <w:t xml:space="preserve"> все </w:t>
       </w:r>
       <w:proofErr w:type="spellStart"/>
       <w:r>
@@ -2951,7 +3437,27 @@
           <w:color w:val="ECECF1"/>
           <w:shd w:val="clear" w:color="auto" w:fill="343541"/>
         </w:rPr>
-        <w:t xml:space="preserve"> их порой приходится искать там где их не должно быть. </w:t>
+        <w:t xml:space="preserve"> их порой приходится искать </w:t>
+      </w:r>
+      <w:proofErr w:type="gramStart"/>
+      <w:r>
+        <w:rPr>
+          <w:rFonts w:ascii="Segoe UI" w:hAnsi="Segoe UI" w:cs="Segoe UI"/>
+          <w:strike/>
+          <w:color w:val="ECECF1"/>
+          <w:shd w:val="clear" w:color="auto" w:fill="343541"/>
+        </w:rPr>
+        <w:t>там где</w:t>
+      </w:r>
+      <w:proofErr w:type="gramEnd"/>
+      <w:r>
+        <w:rPr>
+          <w:rFonts w:ascii="Segoe UI" w:hAnsi="Segoe UI" w:cs="Segoe UI"/>
+          <w:strike/>
+          <w:color w:val="ECECF1"/>
+          <w:shd w:val="clear" w:color="auto" w:fill="343541"/>
+        </w:rPr>
+        <w:t xml:space="preserve"> их не должно быть. </w:t>
       </w:r>
     </w:p>
     <w:p>
@@ -3005,7 +3511,25 @@
           <w:color w:val="ECECF1"/>
           <w:shd w:val="clear" w:color="auto" w:fill="343541"/>
         </w:rPr>
-        <w:t xml:space="preserve"> хочу запустить в разработку прототип новой боевой системы, который позволит улучшить текущую, точного представления то как она должна выглядеть нету, во время </w:t>
+        <w:t xml:space="preserve"> хочу запустить в разработку прототип новой боевой системы, который позволит улучшить текущую, точного представления то как она должна выглядеть нету, </w:t>
+      </w:r>
+      <w:proofErr w:type="gramStart"/>
+      <w:r>
+        <w:rPr>
+          <w:rFonts w:ascii="Segoe UI" w:hAnsi="Segoe UI" w:cs="Segoe UI"/>
+          <w:color w:val="ECECF1"/>
+          <w:shd w:val="clear" w:color="auto" w:fill="343541"/>
+        </w:rPr>
+        <w:t>во время</w:t>
+      </w:r>
+      <w:proofErr w:type="gramEnd"/>
+      <w:r>
+        <w:rPr>
+          <w:rFonts w:ascii="Segoe UI" w:hAnsi="Segoe UI" w:cs="Segoe UI"/>
+          <w:color w:val="ECECF1"/>
+          <w:shd w:val="clear" w:color="auto" w:fill="343541"/>
+        </w:rPr>
+        <w:t xml:space="preserve"> </w:t>
       </w:r>
       <w:proofErr w:type="spellStart"/>
       <w:r>
@@ -3023,7 +3547,25 @@
           <w:color w:val="ECECF1"/>
           <w:shd w:val="clear" w:color="auto" w:fill="343541"/>
         </w:rPr>
-        <w:t xml:space="preserve"> надеюсь что найду хороший вариант. Зачем обновлять эту механику? Все просто если посмотреть на мой текущий проект то основная часть </w:t>
+        <w:t xml:space="preserve"> надеюсь что найду хороший вариант. Зачем обновлять эту механику? Все просто если посмотреть на мой текущий </w:t>
+      </w:r>
+      <w:proofErr w:type="gramStart"/>
+      <w:r>
+        <w:rPr>
+          <w:rFonts w:ascii="Segoe UI" w:hAnsi="Segoe UI" w:cs="Segoe UI"/>
+          <w:color w:val="ECECF1"/>
+          <w:shd w:val="clear" w:color="auto" w:fill="343541"/>
+        </w:rPr>
+        <w:t>проект</w:t>
+      </w:r>
+      <w:proofErr w:type="gramEnd"/>
+      <w:r>
+        <w:rPr>
+          <w:rFonts w:ascii="Segoe UI" w:hAnsi="Segoe UI" w:cs="Segoe UI"/>
+          <w:color w:val="ECECF1"/>
+          <w:shd w:val="clear" w:color="auto" w:fill="343541"/>
+        </w:rPr>
+        <w:t xml:space="preserve"> то основная часть </w:t>
       </w:r>
       <w:proofErr w:type="spellStart"/>
       <w:r>
@@ -3304,7 +3846,27 @@
           <w:color w:val="ECECF1"/>
           <w:shd w:val="clear" w:color="auto" w:fill="343541"/>
         </w:rPr>
-        <w:t xml:space="preserve">, а также связка от системы прокачки, которую используют враги. И проблема заключается в том что изначально все враги использовали первую систему, но позже была </w:t>
+        <w:t xml:space="preserve">, а также связка от системы прокачки, которую используют враги. И проблема заключается в </w:t>
+      </w:r>
+      <w:proofErr w:type="gramStart"/>
+      <w:r>
+        <w:rPr>
+          <w:rFonts w:ascii="Segoe UI" w:hAnsi="Segoe UI" w:cs="Segoe UI"/>
+          <w:strike/>
+          <w:color w:val="ECECF1"/>
+          <w:shd w:val="clear" w:color="auto" w:fill="343541"/>
+        </w:rPr>
+        <w:t>том</w:t>
+      </w:r>
+      <w:proofErr w:type="gramEnd"/>
+      <w:r>
+        <w:rPr>
+          <w:rFonts w:ascii="Segoe UI" w:hAnsi="Segoe UI" w:cs="Segoe UI"/>
+          <w:strike/>
+          <w:color w:val="ECECF1"/>
+          <w:shd w:val="clear" w:color="auto" w:fill="343541"/>
+        </w:rPr>
+        <w:t xml:space="preserve"> что изначально все враги использовали первую систему, но позже была </w:t>
       </w:r>
       <w:proofErr w:type="spellStart"/>
       <w:r>
@@ -3324,7 +3886,27 @@
           <w:color w:val="ECECF1"/>
           <w:shd w:val="clear" w:color="auto" w:fill="343541"/>
         </w:rPr>
-        <w:t xml:space="preserve"> вторая система, и сейчас очень сложно сказать какую, из систем используют враги, скорей всего это является это будет смесь из двух систем. Это нужно исправить. Нужно пересмотреть взаимодействие этих двух систем и выбрать лучшее решение которое позволит мне разрешить данную проблему.</w:t>
+        <w:t xml:space="preserve"> вторая система, и сейчас очень сложно сказать какую, из систем используют враги, скорей всего это является это будет смесь из двух систем. Это нужно исправить. Нужно пересмотреть взаимодействие этих двух систем и выбрать </w:t>
+      </w:r>
+      <w:proofErr w:type="gramStart"/>
+      <w:r>
+        <w:rPr>
+          <w:rFonts w:ascii="Segoe UI" w:hAnsi="Segoe UI" w:cs="Segoe UI"/>
+          <w:strike/>
+          <w:color w:val="ECECF1"/>
+          <w:shd w:val="clear" w:color="auto" w:fill="343541"/>
+        </w:rPr>
+        <w:t>лучшее решение</w:t>
+      </w:r>
+      <w:proofErr w:type="gramEnd"/>
+      <w:r>
+        <w:rPr>
+          <w:rFonts w:ascii="Segoe UI" w:hAnsi="Segoe UI" w:cs="Segoe UI"/>
+          <w:strike/>
+          <w:color w:val="ECECF1"/>
+          <w:shd w:val="clear" w:color="auto" w:fill="343541"/>
+        </w:rPr>
+        <w:t xml:space="preserve"> которое позволит мне разрешить данную проблему.</w:t>
       </w:r>
     </w:p>
     <w:p>
@@ -3445,6 +4027,7 @@
         <w:t xml:space="preserve"> из </w:t>
       </w:r>
       <w:proofErr w:type="spellStart"/>
+      <w:proofErr w:type="gramStart"/>
       <w:r>
         <w:rPr>
           <w:rFonts w:ascii="Segoe UI" w:hAnsi="Segoe UI" w:cs="Segoe UI"/>
@@ -3455,6 +4038,7 @@
         <w:t>SavaData</w:t>
       </w:r>
       <w:proofErr w:type="spellEnd"/>
+      <w:proofErr w:type="gramEnd"/>
       <w:r>
         <w:rPr>
           <w:rFonts w:ascii="Segoe UI" w:hAnsi="Segoe UI" w:cs="Segoe UI"/>
@@ -3517,7 +4101,25 @@
           <w:color w:val="ECECF1"/>
           <w:shd w:val="clear" w:color="auto" w:fill="343541"/>
         </w:rPr>
-        <w:t xml:space="preserve"> текста на русский и английский, но есть моменты где например используются перечисления, их также нужно перевести на английский и на русский. </w:t>
+        <w:t xml:space="preserve"> текста на русский и английский, но есть моменты </w:t>
+      </w:r>
+      <w:proofErr w:type="gramStart"/>
+      <w:r>
+        <w:rPr>
+          <w:rFonts w:ascii="Segoe UI" w:hAnsi="Segoe UI" w:cs="Segoe UI"/>
+          <w:color w:val="ECECF1"/>
+          <w:shd w:val="clear" w:color="auto" w:fill="343541"/>
+        </w:rPr>
+        <w:t>где например</w:t>
+      </w:r>
+      <w:proofErr w:type="gramEnd"/>
+      <w:r>
+        <w:rPr>
+          <w:rFonts w:ascii="Segoe UI" w:hAnsi="Segoe UI" w:cs="Segoe UI"/>
+          <w:color w:val="ECECF1"/>
+          <w:shd w:val="clear" w:color="auto" w:fill="343541"/>
+        </w:rPr>
+        <w:t xml:space="preserve"> используются перечисления, их также нужно перевести на английский и на русский. </w:t>
       </w:r>
     </w:p>
     <w:p>
@@ -3775,7 +4377,27 @@
           <w:szCs w:val="28"/>
           <w:shd w:val="clear" w:color="auto" w:fill="343541"/>
         </w:rPr>
-        <w:t xml:space="preserve">итерация (размышления. Главная задача этой итерации это подключить случайную генерацию уровней к игре. Но для этого придётся перекопать очень много кода. </w:t>
+        <w:t xml:space="preserve">итерация (размышления. </w:t>
+      </w:r>
+      <w:proofErr w:type="gramStart"/>
+      <w:r>
+        <w:rPr>
+          <w:rFonts w:ascii="Times New Roman" w:hAnsi="Times New Roman" w:cs="Times New Roman"/>
+          <w:sz w:val="28"/>
+          <w:szCs w:val="28"/>
+          <w:shd w:val="clear" w:color="auto" w:fill="343541"/>
+        </w:rPr>
+        <w:t>Главная задача этой итерации это</w:t>
+      </w:r>
+      <w:proofErr w:type="gramEnd"/>
+      <w:r>
+        <w:rPr>
+          <w:rFonts w:ascii="Times New Roman" w:hAnsi="Times New Roman" w:cs="Times New Roman"/>
+          <w:sz w:val="28"/>
+          <w:szCs w:val="28"/>
+          <w:shd w:val="clear" w:color="auto" w:fill="343541"/>
+        </w:rPr>
+        <w:t xml:space="preserve"> подключить случайную генерацию уровней к игре. Но для этого придётся перекопать очень много кода. </w:t>
       </w:r>
       <w:r>
         <w:rPr>
@@ -3820,7 +4442,27 @@
           <w:szCs w:val="28"/>
           <w:shd w:val="clear" w:color="auto" w:fill="343541"/>
         </w:rPr>
-        <w:t xml:space="preserve"> будет опциональным и использоваться только для генерации уровней, так как в первую очередь всегда необходимо сгенерировать уровень, а только потом генерировать персонажей и прочее. Также придётся расширить систему управление игровым процессом (это также понадобится и для оптимизации), так например я хочу сделать компонент который будет отвечать за поведение конкретного чанка. Компонент отвечающий за конкретный чанк в основном будет использовать точно так же как ранее использовался компонент </w:t>
+        <w:t xml:space="preserve"> будет опциональным и использоваться только для генерации уровней, так как в первую очередь всегда необходимо сгенерировать уровень, а только потом генерировать персонажей и прочее. Также придётся расширить систему управление игровым процессом (это также понадобится и для оптимизации), </w:t>
+      </w:r>
+      <w:proofErr w:type="gramStart"/>
+      <w:r>
+        <w:rPr>
+          <w:rFonts w:ascii="Times New Roman" w:hAnsi="Times New Roman" w:cs="Times New Roman"/>
+          <w:sz w:val="28"/>
+          <w:szCs w:val="28"/>
+          <w:shd w:val="clear" w:color="auto" w:fill="343541"/>
+        </w:rPr>
+        <w:t>так например</w:t>
+      </w:r>
+      <w:proofErr w:type="gramEnd"/>
+      <w:r>
+        <w:rPr>
+          <w:rFonts w:ascii="Times New Roman" w:hAnsi="Times New Roman" w:cs="Times New Roman"/>
+          <w:sz w:val="28"/>
+          <w:szCs w:val="28"/>
+          <w:shd w:val="clear" w:color="auto" w:fill="343541"/>
+        </w:rPr>
+        <w:t xml:space="preserve"> я хочу сделать компонент который будет отвечать за поведение конкретного чанка. Компонент отвечающий за конкретный чанк в основном будет использовать точно так же как ранее использовался компонент </w:t>
       </w:r>
       <w:r>
         <w:rPr>
@@ -3858,7 +4500,27 @@
           <w:szCs w:val="28"/>
           <w:shd w:val="clear" w:color="auto" w:fill="343541"/>
         </w:rPr>
-        <w:t xml:space="preserve">, с единственным отличием в том что управляющий компонентов чанка на карте будет уже равное количество количеству созданных чанков. К тому </w:t>
+        <w:t xml:space="preserve">, с единственным отличием в </w:t>
+      </w:r>
+      <w:proofErr w:type="gramStart"/>
+      <w:r>
+        <w:rPr>
+          <w:rFonts w:ascii="Times New Roman" w:hAnsi="Times New Roman" w:cs="Times New Roman"/>
+          <w:sz w:val="28"/>
+          <w:szCs w:val="28"/>
+          <w:shd w:val="clear" w:color="auto" w:fill="343541"/>
+        </w:rPr>
+        <w:t>том</w:t>
+      </w:r>
+      <w:proofErr w:type="gramEnd"/>
+      <w:r>
+        <w:rPr>
+          <w:rFonts w:ascii="Times New Roman" w:hAnsi="Times New Roman" w:cs="Times New Roman"/>
+          <w:sz w:val="28"/>
+          <w:szCs w:val="28"/>
+          <w:shd w:val="clear" w:color="auto" w:fill="343541"/>
+        </w:rPr>
+        <w:t xml:space="preserve"> что управляющий компонентов чанка на карте будет уже равное количество количеству созданных чанков. К тому </w:t>
       </w:r>
       <w:r>
         <w:rPr>
@@ -4341,19 +5003,239 @@
           <w:shd w:val="clear" w:color="auto" w:fill="343541"/>
         </w:rPr>
       </w:pPr>
+      <w:r>
+        <w:rPr>
+          <w:rFonts w:ascii="Times New Roman" w:hAnsi="Times New Roman" w:cs="Times New Roman"/>
+          <w:strike/>
+          <w:sz w:val="28"/>
+          <w:szCs w:val="28"/>
+          <w:shd w:val="clear" w:color="auto" w:fill="343541"/>
+        </w:rPr>
+        <w:t>Сборка билда и тест.</w:t>
+      </w:r>
+    </w:p>
+    <w:p>
+      <w:pPr>
+        <w:ind w:left="720"/>
+        <w:rPr>
+          <w:rFonts w:ascii="Times New Roman" w:hAnsi="Times New Roman" w:cs="Times New Roman"/>
+          <w:sz w:val="28"/>
+          <w:szCs w:val="28"/>
+          <w:shd w:val="clear" w:color="auto" w:fill="343541"/>
+        </w:rPr>
+      </w:pPr>
+      <w:r>
+        <w:rPr>
+          <w:rFonts w:ascii="Times New Roman" w:hAnsi="Times New Roman" w:cs="Times New Roman"/>
+          <w:sz w:val="28"/>
+          <w:szCs w:val="28"/>
+          <w:shd w:val="clear" w:color="auto" w:fill="343541"/>
+          <w:lang w:val="en-US"/>
+        </w:rPr>
+        <w:t xml:space="preserve">20 </w:t>
+      </w:r>
+      <w:r>
+        <w:rPr>
+          <w:rFonts w:ascii="Times New Roman" w:hAnsi="Times New Roman" w:cs="Times New Roman"/>
+          <w:sz w:val="28"/>
+          <w:szCs w:val="28"/>
+          <w:shd w:val="clear" w:color="auto" w:fill="343541"/>
+        </w:rPr>
+        <w:t>итерация:</w:t>
+      </w:r>
+    </w:p>
+    <w:p>
+      <w:pPr>
+        <w:pStyle w:val="a3"/>
+        <w:numPr>
+          <w:ilvl w:val="0"/>
+          <w:numId w:val="5"/>
+        </w:numPr>
+        <w:rPr>
+          <w:rFonts w:ascii="Times New Roman" w:hAnsi="Times New Roman" w:cs="Times New Roman"/>
+          <w:sz w:val="28"/>
+          <w:szCs w:val="28"/>
+          <w:shd w:val="clear" w:color="auto" w:fill="343541"/>
+        </w:rPr>
+      </w:pPr>
+      <w:r>
+        <w:rPr>
+          <w:rFonts w:ascii="Times New Roman" w:hAnsi="Times New Roman" w:cs="Times New Roman"/>
+          <w:sz w:val="28"/>
+          <w:szCs w:val="28"/>
+          <w:shd w:val="clear" w:color="auto" w:fill="343541"/>
+        </w:rPr>
+        <w:t xml:space="preserve">Написать </w:t>
+      </w:r>
+      <w:r>
+        <w:rPr>
+          <w:rFonts w:ascii="Times New Roman" w:hAnsi="Times New Roman" w:cs="Times New Roman"/>
+          <w:sz w:val="28"/>
+          <w:szCs w:val="28"/>
+          <w:shd w:val="clear" w:color="auto" w:fill="343541"/>
+        </w:rPr>
+        <w:t>компонент,</w:t>
+      </w:r>
+      <w:r>
+        <w:rPr>
+          <w:rFonts w:ascii="Times New Roman" w:hAnsi="Times New Roman" w:cs="Times New Roman"/>
+          <w:sz w:val="28"/>
+          <w:szCs w:val="28"/>
+          <w:shd w:val="clear" w:color="auto" w:fill="343541"/>
+        </w:rPr>
+        <w:t xml:space="preserve"> который будет блокировать возможность </w:t>
+      </w:r>
+      <w:r>
+        <w:rPr>
+          <w:rFonts w:ascii="Times New Roman" w:hAnsi="Times New Roman" w:cs="Times New Roman"/>
+          <w:sz w:val="28"/>
+          <w:szCs w:val="28"/>
+          <w:shd w:val="clear" w:color="auto" w:fill="343541"/>
+        </w:rPr>
+        <w:t>управления,</w:t>
+      </w:r>
+      <w:r>
+        <w:rPr>
+          <w:rFonts w:ascii="Times New Roman" w:hAnsi="Times New Roman" w:cs="Times New Roman"/>
+          <w:sz w:val="28"/>
+          <w:szCs w:val="28"/>
+          <w:shd w:val="clear" w:color="auto" w:fill="343541"/>
+        </w:rPr>
+        <w:t xml:space="preserve"> когда пользователь открыл панель статистики, или какую-то другую панель.</w:t>
+      </w:r>
       <w:bookmarkStart w:id="0" w:name="_GoBack"/>
-      <w:r>
-        <w:rPr>
-          <w:rFonts w:ascii="Times New Roman" w:hAnsi="Times New Roman" w:cs="Times New Roman"/>
-          <w:strike/>
-          <w:sz w:val="28"/>
-          <w:szCs w:val="28"/>
-          <w:shd w:val="clear" w:color="auto" w:fill="343541"/>
-        </w:rPr>
-        <w:t>Сборка билда и тест.</w:t>
-      </w:r>
-    </w:p>
-    <w:bookmarkEnd w:id="0"/>
+      <w:bookmarkEnd w:id="0"/>
+    </w:p>
+    <w:p>
+      <w:pPr>
+        <w:pStyle w:val="a3"/>
+        <w:numPr>
+          <w:ilvl w:val="0"/>
+          <w:numId w:val="5"/>
+        </w:numPr>
+        <w:rPr>
+          <w:rFonts w:ascii="Times New Roman" w:hAnsi="Times New Roman" w:cs="Times New Roman"/>
+          <w:sz w:val="28"/>
+          <w:szCs w:val="28"/>
+          <w:shd w:val="clear" w:color="auto" w:fill="343541"/>
+        </w:rPr>
+      </w:pPr>
+      <w:r>
+        <w:rPr>
+          <w:rFonts w:ascii="Times New Roman" w:hAnsi="Times New Roman" w:cs="Times New Roman"/>
+          <w:sz w:val="28"/>
+          <w:szCs w:val="28"/>
+          <w:shd w:val="clear" w:color="auto" w:fill="343541"/>
+        </w:rPr>
+        <w:t>Реализовать возможность возвращение ГГ на стартовую локацию в деревню, для возможности взаимодействия в виде торговли взять дополнительные задания и т.д.</w:t>
+      </w:r>
+    </w:p>
+    <w:p>
+      <w:pPr>
+        <w:pStyle w:val="a3"/>
+        <w:numPr>
+          <w:ilvl w:val="0"/>
+          <w:numId w:val="5"/>
+        </w:numPr>
+        <w:rPr>
+          <w:rFonts w:ascii="Times New Roman" w:hAnsi="Times New Roman" w:cs="Times New Roman"/>
+          <w:sz w:val="28"/>
+          <w:szCs w:val="28"/>
+          <w:shd w:val="clear" w:color="auto" w:fill="343541"/>
+        </w:rPr>
+      </w:pPr>
+      <w:r>
+        <w:rPr>
+          <w:rFonts w:ascii="Times New Roman" w:hAnsi="Times New Roman" w:cs="Times New Roman"/>
+          <w:sz w:val="28"/>
+          <w:szCs w:val="28"/>
+          <w:shd w:val="clear" w:color="auto" w:fill="343541"/>
+        </w:rPr>
+        <w:t>Пересмотреть получаемую награду за убийство мобов. На данный момент за убийство мобов игрок получает только опыт, нужно еще чтобы игрок мог получать золото, и возможно какие-то предметы.</w:t>
+      </w:r>
+    </w:p>
+    <w:p>
+      <w:pPr>
+        <w:pStyle w:val="a3"/>
+        <w:numPr>
+          <w:ilvl w:val="0"/>
+          <w:numId w:val="5"/>
+        </w:numPr>
+        <w:rPr>
+          <w:rFonts w:ascii="Times New Roman" w:hAnsi="Times New Roman" w:cs="Times New Roman"/>
+          <w:sz w:val="28"/>
+          <w:szCs w:val="28"/>
+          <w:shd w:val="clear" w:color="auto" w:fill="343541"/>
+        </w:rPr>
+      </w:pPr>
+      <w:r>
+        <w:rPr>
+          <w:rFonts w:ascii="Times New Roman" w:hAnsi="Times New Roman" w:cs="Times New Roman"/>
+          <w:sz w:val="28"/>
+          <w:szCs w:val="28"/>
+          <w:shd w:val="clear" w:color="auto" w:fill="343541"/>
+        </w:rPr>
+        <w:t>Оптимизировать локацию деревня.</w:t>
+      </w:r>
+    </w:p>
+    <w:p>
+      <w:pPr>
+        <w:pStyle w:val="a3"/>
+        <w:numPr>
+          <w:ilvl w:val="0"/>
+          <w:numId w:val="5"/>
+        </w:numPr>
+        <w:rPr>
+          <w:rFonts w:ascii="Times New Roman" w:hAnsi="Times New Roman" w:cs="Times New Roman"/>
+          <w:sz w:val="28"/>
+          <w:szCs w:val="28"/>
+          <w:shd w:val="clear" w:color="auto" w:fill="343541"/>
+        </w:rPr>
+      </w:pPr>
+      <w:r>
+        <w:rPr>
+          <w:rFonts w:ascii="Times New Roman" w:hAnsi="Times New Roman" w:cs="Times New Roman"/>
+          <w:sz w:val="28"/>
+          <w:szCs w:val="28"/>
+          <w:shd w:val="clear" w:color="auto" w:fill="343541"/>
+        </w:rPr>
+        <w:t xml:space="preserve">Разработать новый прототип боевой системы. Возможно сделать как пошаговый бой. При этом можно сделать так чтобы в команде как игрока участвовали одновременно несколько персонажей которыми будет управлять игрок по очереди. Можно </w:t>
+      </w:r>
+      <w:r>
+        <w:rPr>
+          <w:rFonts w:ascii="Times New Roman" w:hAnsi="Times New Roman" w:cs="Times New Roman"/>
+          <w:sz w:val="28"/>
+          <w:szCs w:val="28"/>
+          <w:shd w:val="clear" w:color="auto" w:fill="343541"/>
+        </w:rPr>
+        <w:lastRenderedPageBreak/>
+        <w:t>добавить, чтобы у мобов была возможность делать призыв союзников, и чтобы он призывал всех мобов из текущего чанка.</w:t>
+      </w:r>
+    </w:p>
+    <w:p>
+      <w:pPr>
+        <w:pStyle w:val="a3"/>
+        <w:numPr>
+          <w:ilvl w:val="0"/>
+          <w:numId w:val="5"/>
+        </w:numPr>
+        <w:rPr>
+          <w:rFonts w:ascii="Times New Roman" w:hAnsi="Times New Roman" w:cs="Times New Roman"/>
+          <w:sz w:val="28"/>
+          <w:szCs w:val="28"/>
+          <w:shd w:val="clear" w:color="auto" w:fill="343541"/>
+        </w:rPr>
+      </w:pPr>
+      <w:r>
+        <w:rPr>
+          <w:rFonts w:ascii="Times New Roman" w:hAnsi="Times New Roman" w:cs="Times New Roman"/>
+          <w:sz w:val="28"/>
+          <w:szCs w:val="28"/>
+          <w:shd w:val="clear" w:color="auto" w:fill="343541"/>
+        </w:rPr>
+        <w:t>Тестирования, сборка билда и публикация.</w:t>
+      </w:r>
+    </w:p>
     <w:p>
       <w:pPr>
         <w:rPr>
@@ -4470,7 +5352,25 @@
           <w:color w:val="ECECF1"/>
           <w:shd w:val="clear" w:color="auto" w:fill="343541"/>
         </w:rPr>
-        <w:t xml:space="preserve">Пересмотреть работу системы спавна квестов. Мне не нравится то что фабрика квестов сама начинает спавнить как только она сама того пожелает, а что если измениться порядок работы </w:t>
+        <w:t xml:space="preserve">Пересмотреть работу системы спавна квестов. Мне не нравится то что фабрика квестов сама начинает </w:t>
+      </w:r>
+      <w:proofErr w:type="gramStart"/>
+      <w:r>
+        <w:rPr>
+          <w:rFonts w:ascii="Segoe UI" w:hAnsi="Segoe UI" w:cs="Segoe UI"/>
+          <w:color w:val="ECECF1"/>
+          <w:shd w:val="clear" w:color="auto" w:fill="343541"/>
+        </w:rPr>
+        <w:t>спавнить</w:t>
+      </w:r>
+      <w:proofErr w:type="gramEnd"/>
+      <w:r>
+        <w:rPr>
+          <w:rFonts w:ascii="Segoe UI" w:hAnsi="Segoe UI" w:cs="Segoe UI"/>
+          <w:color w:val="ECECF1"/>
+          <w:shd w:val="clear" w:color="auto" w:fill="343541"/>
+        </w:rPr>
+        <w:t xml:space="preserve"> как только она сама того пожелает, а что если измениться порядок работы </w:t>
       </w:r>
       <w:proofErr w:type="spellStart"/>
       <w:r>
@@ -4695,6 +5595,92 @@
 <file path=word/numbering.xml><?xml version="1.0" encoding="utf-8"?>
 <w:numbering xmlns:wpc="http://schemas.microsoft.com/office/word/2010/wordprocessingCanvas" xmlns:cx="http://schemas.microsoft.com/office/drawing/2014/chartex" xmlns:mc="http://schemas.openxmlformats.org/markup-compatibility/2006" xmlns:o="urn:schemas-microsoft-com:office:office" xmlns:r="http://schemas.openxmlformats.org/officeDocument/2006/relationships" xmlns:m="http://schemas.openxmlformats.org/officeDocument/2006/math" xmlns:v="urn:schemas-microsoft-com:vml" xmlns:wp14="http://schemas.microsoft.com/office/word/2010/wordprocessingDrawing" xmlns:wp="http://schemas.openxmlformats.org/drawingml/2006/wordprocessingDrawing" xmlns:w10="urn:schemas-microsoft-com:office:word" xmlns:w="http://schemas.openxmlformats.org/wordprocessingml/2006/main" xmlns:w14="http://schemas.microsoft.com/office/word/2010/wordml" xmlns:w15="http://schemas.microsoft.com/office/word/2012/wordml" xmlns:w16se="http://schemas.microsoft.com/office/word/2015/wordml/symex" xmlns:wpg="http://schemas.microsoft.com/office/word/2010/wordprocessingGroup" xmlns:wpi="http://schemas.microsoft.com/office/word/2010/wordprocessingInk" xmlns:wne="http://schemas.microsoft.com/office/word/2006/wordml" xmlns:wps="http://schemas.microsoft.com/office/word/2010/wordprocessingShape" mc:Ignorable="w14 w15 w16se wp14">
   <w:abstractNum w:abstractNumId="0" w15:restartNumberingAfterBreak="0">
+    <w:nsid w:val="05C46C34"/>
+    <w:multiLevelType w:val="hybridMultilevel"/>
+    <w:tmpl w:val="BA422354"/>
+    <w:lvl w:ilvl="0" w:tplc="0419000F">
+      <w:start w:val="1"/>
+      <w:numFmt w:val="decimal"/>
+      <w:lvlText w:val="%1."/>
+      <w:lvlJc w:val="left"/>
+      <w:pPr>
+        <w:ind w:left="1440" w:hanging="360"/>
+      </w:pPr>
+    </w:lvl>
+    <w:lvl w:ilvl="1" w:tplc="04190019" w:tentative="1">
+      <w:start w:val="1"/>
+      <w:numFmt w:val="lowerLetter"/>
+      <w:lvlText w:val="%2."/>
+      <w:lvlJc w:val="left"/>
+      <w:pPr>
+        <w:ind w:left="2160" w:hanging="360"/>
+      </w:pPr>
+    </w:lvl>
+    <w:lvl w:ilvl="2" w:tplc="0419001B" w:tentative="1">
+      <w:start w:val="1"/>
+      <w:numFmt w:val="lowerRoman"/>
+      <w:lvlText w:val="%3."/>
+      <w:lvlJc w:val="right"/>
+      <w:pPr>
+        <w:ind w:left="2880" w:hanging="180"/>
+      </w:pPr>
+    </w:lvl>
+    <w:lvl w:ilvl="3" w:tplc="0419000F" w:tentative="1">
+      <w:start w:val="1"/>
+      <w:numFmt w:val="decimal"/>
+      <w:lvlText w:val="%4."/>
+      <w:lvlJc w:val="left"/>
+      <w:pPr>
+        <w:ind w:left="3600" w:hanging="360"/>
+      </w:pPr>
+    </w:lvl>
+    <w:lvl w:ilvl="4" w:tplc="04190019" w:tentative="1">
+      <w:start w:val="1"/>
+      <w:numFmt w:val="lowerLetter"/>
+      <w:lvlText w:val="%5."/>
+      <w:lvlJc w:val="left"/>
+      <w:pPr>
+        <w:ind w:left="4320" w:hanging="360"/>
+      </w:pPr>
+    </w:lvl>
+    <w:lvl w:ilvl="5" w:tplc="0419001B" w:tentative="1">
+      <w:start w:val="1"/>
+      <w:numFmt w:val="lowerRoman"/>
+      <w:lvlText w:val="%6."/>
+      <w:lvlJc w:val="right"/>
+      <w:pPr>
+        <w:ind w:left="5040" w:hanging="180"/>
+      </w:pPr>
+    </w:lvl>
+    <w:lvl w:ilvl="6" w:tplc="0419000F" w:tentative="1">
+      <w:start w:val="1"/>
+      <w:numFmt w:val="decimal"/>
+      <w:lvlText w:val="%7."/>
+      <w:lvlJc w:val="left"/>
+      <w:pPr>
+        <w:ind w:left="5760" w:hanging="360"/>
+      </w:pPr>
+    </w:lvl>
+    <w:lvl w:ilvl="7" w:tplc="04190019" w:tentative="1">
+      <w:start w:val="1"/>
+      <w:numFmt w:val="lowerLetter"/>
+      <w:lvlText w:val="%8."/>
+      <w:lvlJc w:val="left"/>
+      <w:pPr>
+        <w:ind w:left="6480" w:hanging="360"/>
+      </w:pPr>
+    </w:lvl>
+    <w:lvl w:ilvl="8" w:tplc="0419001B" w:tentative="1">
+      <w:start w:val="1"/>
+      <w:numFmt w:val="lowerRoman"/>
+      <w:lvlText w:val="%9."/>
+      <w:lvlJc w:val="right"/>
+      <w:pPr>
+        <w:ind w:left="7200" w:hanging="180"/>
+      </w:pPr>
+    </w:lvl>
+  </w:abstractNum>
+  <w:abstractNum w:abstractNumId="1" w15:restartNumberingAfterBreak="0">
     <w:nsid w:val="3C526801"/>
     <w:multiLevelType w:val="hybridMultilevel"/>
     <w:tmpl w:val="7C900E4C"/>
@@ -4780,7 +5766,7 @@
       </w:pPr>
     </w:lvl>
   </w:abstractNum>
-  <w:abstractNum w:abstractNumId="1" w15:restartNumberingAfterBreak="0">
+  <w:abstractNum w:abstractNumId="2" w15:restartNumberingAfterBreak="0">
     <w:nsid w:val="50CA099D"/>
     <w:multiLevelType w:val="hybridMultilevel"/>
     <w:tmpl w:val="1070D6F2"/>
@@ -4866,7 +5852,7 @@
       </w:pPr>
     </w:lvl>
   </w:abstractNum>
-  <w:abstractNum w:abstractNumId="2" w15:restartNumberingAfterBreak="0">
+  <w:abstractNum w:abstractNumId="3" w15:restartNumberingAfterBreak="0">
     <w:nsid w:val="6A1A2950"/>
     <w:multiLevelType w:val="hybridMultilevel"/>
     <w:tmpl w:val="5DB442B2"/>
@@ -4952,7 +5938,7 @@
       </w:pPr>
     </w:lvl>
   </w:abstractNum>
-  <w:abstractNum w:abstractNumId="3" w15:restartNumberingAfterBreak="0">
+  <w:abstractNum w:abstractNumId="4" w15:restartNumberingAfterBreak="0">
     <w:nsid w:val="7F9D7074"/>
     <w:multiLevelType w:val="hybridMultilevel"/>
     <w:tmpl w:val="CEFC2538"/>
@@ -5039,15 +6025,18 @@
     </w:lvl>
   </w:abstractNum>
   <w:num w:numId="1">
+    <w:abstractNumId w:val="4"/>
+  </w:num>
+  <w:num w:numId="2">
     <w:abstractNumId w:val="3"/>
   </w:num>
-  <w:num w:numId="2">
+  <w:num w:numId="3">
     <w:abstractNumId w:val="2"/>
   </w:num>
-  <w:num w:numId="3">
+  <w:num w:numId="4">
     <w:abstractNumId w:val="1"/>
   </w:num>
-  <w:num w:numId="4">
+  <w:num w:numId="5">
     <w:abstractNumId w:val="0"/>
   </w:num>
 </w:numbering>
@@ -5781,7 +6770,7 @@
 </file>
 
 <file path=customXml/itemProps1.xml><?xml version="1.0" encoding="utf-8"?>
-<ds:datastoreItem xmlns:ds="http://schemas.openxmlformats.org/officeDocument/2006/customXml" ds:itemID="{AA445CB5-EA53-4B1B-933D-49DDABA15BA6}">
+<ds:datastoreItem xmlns:ds="http://schemas.openxmlformats.org/officeDocument/2006/customXml" ds:itemID="{D11FBB4D-C809-41F9-8C52-CABCC63C8E00}">
   <ds:schemaRefs>
     <ds:schemaRef ds:uri="http://schemas.openxmlformats.org/officeDocument/2006/bibliography"/>
   </ds:schemaRefs>

</xml_diff>

<commit_message>
Implemented return to Village. In dev.
</commit_message>
<xml_diff>
--- a/Итерации.docx
+++ b/Итерации.docx
@@ -5053,14 +5053,16 @@
         </w:numPr>
         <w:rPr>
           <w:rFonts w:ascii="Times New Roman" w:hAnsi="Times New Roman" w:cs="Times New Roman"/>
-          <w:sz w:val="28"/>
-          <w:szCs w:val="28"/>
-          <w:shd w:val="clear" w:color="auto" w:fill="343541"/>
-        </w:rPr>
-      </w:pPr>
-      <w:r>
-        <w:rPr>
-          <w:rFonts w:ascii="Times New Roman" w:hAnsi="Times New Roman" w:cs="Times New Roman"/>
+          <w:strike/>
+          <w:sz w:val="28"/>
+          <w:szCs w:val="28"/>
+          <w:shd w:val="clear" w:color="auto" w:fill="343541"/>
+        </w:rPr>
+      </w:pPr>
+      <w:r>
+        <w:rPr>
+          <w:rFonts w:ascii="Times New Roman" w:hAnsi="Times New Roman" w:cs="Times New Roman"/>
+          <w:strike/>
           <w:sz w:val="28"/>
           <w:szCs w:val="28"/>
           <w:shd w:val="clear" w:color="auto" w:fill="343541"/>
@@ -5070,6 +5072,7 @@
       <w:r>
         <w:rPr>
           <w:rFonts w:ascii="Times New Roman" w:hAnsi="Times New Roman" w:cs="Times New Roman"/>
+          <w:strike/>
           <w:sz w:val="28"/>
           <w:szCs w:val="28"/>
           <w:shd w:val="clear" w:color="auto" w:fill="343541"/>
@@ -5079,6 +5082,7 @@
       <w:r>
         <w:rPr>
           <w:rFonts w:ascii="Times New Roman" w:hAnsi="Times New Roman" w:cs="Times New Roman"/>
+          <w:strike/>
           <w:sz w:val="28"/>
           <w:szCs w:val="28"/>
           <w:shd w:val="clear" w:color="auto" w:fill="343541"/>
@@ -5088,6 +5092,7 @@
       <w:r>
         <w:rPr>
           <w:rFonts w:ascii="Times New Roman" w:hAnsi="Times New Roman" w:cs="Times New Roman"/>
+          <w:strike/>
           <w:sz w:val="28"/>
           <w:szCs w:val="28"/>
           <w:shd w:val="clear" w:color="auto" w:fill="343541"/>
@@ -5097,14 +5102,13 @@
       <w:r>
         <w:rPr>
           <w:rFonts w:ascii="Times New Roman" w:hAnsi="Times New Roman" w:cs="Times New Roman"/>
+          <w:strike/>
           <w:sz w:val="28"/>
           <w:szCs w:val="28"/>
           <w:shd w:val="clear" w:color="auto" w:fill="343541"/>
         </w:rPr>
         <w:t xml:space="preserve"> когда пользователь открыл панель статистики, или какую-то другую панель.</w:t>
       </w:r>
-      <w:bookmarkStart w:id="0" w:name="_GoBack"/>
-      <w:bookmarkEnd w:id="0"/>
     </w:p>
     <w:p>
       <w:pPr>
@@ -5129,6 +5133,15 @@
         </w:rPr>
         <w:t>Реализовать возможность возвращение ГГ на стартовую локацию в деревню, для возможности взаимодействия в виде торговли взять дополнительные задания и т.д.</w:t>
       </w:r>
+      <w:r>
+        <w:rPr>
+          <w:rFonts w:ascii="Times New Roman" w:hAnsi="Times New Roman" w:cs="Times New Roman"/>
+          <w:sz w:val="28"/>
+          <w:szCs w:val="28"/>
+          <w:shd w:val="clear" w:color="auto" w:fill="343541"/>
+        </w:rPr>
+        <w:t xml:space="preserve"> Для этого можно создать дополнительную панель, которая будет появляться перед игроком, когда он достиг телепорта, данная панель берет на себя ответственность определить куда необходимо отправить игрока, в деревню чтобы предоставить игроку возможность закупить хилки, или же на следующий уровень данжа. Также эта панель может дополнительно отображать информацию о том какого прогресса игрок достиг за прохождение текущего подземелья (имеется ввиду разницы между тем что у него было на старте, и то что у него имеется сейчас, когда он уже прошел подземелье. В перечень может входить: опыт, уровень, количество золота и т.д.</w:t>
+      </w:r>
     </w:p>
     <w:p>
       <w:pPr>
@@ -5151,7 +5164,19 @@
           <w:szCs w:val="28"/>
           <w:shd w:val="clear" w:color="auto" w:fill="343541"/>
         </w:rPr>
-        <w:t>Пересмотреть получаемую награду за убийство мобов. На данный момент за убийство мобов игрок получает только опыт, нужно еще чтобы игрок мог получать золото, и возможно какие-то предметы.</w:t>
+        <w:lastRenderedPageBreak/>
+        <w:t>Рассмотреть механизм, который будет отвечать за постепенно</w:t>
+      </w:r>
+      <w:bookmarkStart w:id="0" w:name="_GoBack"/>
+      <w:bookmarkEnd w:id="0"/>
+      <w:r>
+        <w:rPr>
+          <w:rFonts w:ascii="Times New Roman" w:hAnsi="Times New Roman" w:cs="Times New Roman"/>
+          <w:sz w:val="28"/>
+          <w:szCs w:val="28"/>
+          <w:shd w:val="clear" w:color="auto" w:fill="343541"/>
+        </w:rPr>
+        <w:t>е увеличение количество чанков доступных на генерацию.</w:t>
       </w:r>
     </w:p>
     <w:p>
@@ -5175,7 +5200,7 @@
           <w:szCs w:val="28"/>
           <w:shd w:val="clear" w:color="auto" w:fill="343541"/>
         </w:rPr>
-        <w:t>Оптимизировать локацию деревня.</w:t>
+        <w:t>Пересмотреть получаемую награду за убийство мобов. На данный момент за убийство мобов игрок получает только опыт, нужно еще чтобы игрок мог получать золото, и возможно какие-то предметы.</w:t>
       </w:r>
     </w:p>
     <w:p>
@@ -5199,17 +5224,31 @@
           <w:szCs w:val="28"/>
           <w:shd w:val="clear" w:color="auto" w:fill="343541"/>
         </w:rPr>
-        <w:t xml:space="preserve">Разработать новый прототип боевой системы. Возможно сделать как пошаговый бой. При этом можно сделать так чтобы в команде как игрока участвовали одновременно несколько персонажей которыми будет управлять игрок по очереди. Можно </w:t>
-      </w:r>
-      <w:r>
-        <w:rPr>
-          <w:rFonts w:ascii="Times New Roman" w:hAnsi="Times New Roman" w:cs="Times New Roman"/>
-          <w:sz w:val="28"/>
-          <w:szCs w:val="28"/>
-          <w:shd w:val="clear" w:color="auto" w:fill="343541"/>
-        </w:rPr>
-        <w:lastRenderedPageBreak/>
-        <w:t>добавить, чтобы у мобов была возможность делать призыв союзников, и чтобы он призывал всех мобов из текущего чанка.</w:t>
+        <w:t>Оптимизировать локацию деревня.</w:t>
+      </w:r>
+    </w:p>
+    <w:p>
+      <w:pPr>
+        <w:pStyle w:val="a3"/>
+        <w:numPr>
+          <w:ilvl w:val="0"/>
+          <w:numId w:val="5"/>
+        </w:numPr>
+        <w:rPr>
+          <w:rFonts w:ascii="Times New Roman" w:hAnsi="Times New Roman" w:cs="Times New Roman"/>
+          <w:sz w:val="28"/>
+          <w:szCs w:val="28"/>
+          <w:shd w:val="clear" w:color="auto" w:fill="343541"/>
+        </w:rPr>
+      </w:pPr>
+      <w:r>
+        <w:rPr>
+          <w:rFonts w:ascii="Times New Roman" w:hAnsi="Times New Roman" w:cs="Times New Roman"/>
+          <w:sz w:val="28"/>
+          <w:szCs w:val="28"/>
+          <w:shd w:val="clear" w:color="auto" w:fill="343541"/>
+        </w:rPr>
+        <w:t>Разработать новый прототип боевой системы. Возможно сделать как пошаговый бой. При этом можно сделать так чтобы в команде как игрока участвовали одновременно несколько персонажей которыми будет управлять игрок по очереди. Можно добавить, чтобы у мобов была возможность делать призыв союзников, и чтобы он призывал всех мобов из текущего чанка.</w:t>
       </w:r>
     </w:p>
     <w:p>
@@ -6440,7 +6479,6 @@
   <w:style w:type="character" w:default="1" w:styleId="a0">
     <w:name w:val="Default Paragraph Font"/>
     <w:uiPriority w:val="1"/>
-    <w:semiHidden/>
     <w:unhideWhenUsed/>
   </w:style>
   <w:style w:type="table" w:default="1" w:styleId="a1">
@@ -6770,7 +6808,7 @@
 </file>
 
 <file path=customXml/itemProps1.xml><?xml version="1.0" encoding="utf-8"?>
-<ds:datastoreItem xmlns:ds="http://schemas.openxmlformats.org/officeDocument/2006/customXml" ds:itemID="{D11FBB4D-C809-41F9-8C52-CABCC63C8E00}">
+<ds:datastoreItem xmlns:ds="http://schemas.openxmlformats.org/officeDocument/2006/customXml" ds:itemID="{342B72E5-17D9-40AE-9DEB-BB20F4F0628F}">
   <ds:schemaRefs>
     <ds:schemaRef ds:uri="http://schemas.openxmlformats.org/officeDocument/2006/bibliography"/>
   </ds:schemaRefs>

</xml_diff>

<commit_message>
Commit before implemented last update after freeze.
</commit_message>
<xml_diff>
--- a/Итерации.docx
+++ b/Итерации.docx
@@ -5165,18 +5165,7 @@
           <w:shd w:val="clear" w:color="auto" w:fill="343541"/>
         </w:rPr>
         <w:lastRenderedPageBreak/>
-        <w:t>Рассмотреть механизм, который будет отвечать за постепенно</w:t>
-      </w:r>
-      <w:bookmarkStart w:id="0" w:name="_GoBack"/>
-      <w:bookmarkEnd w:id="0"/>
-      <w:r>
-        <w:rPr>
-          <w:rFonts w:ascii="Times New Roman" w:hAnsi="Times New Roman" w:cs="Times New Roman"/>
-          <w:sz w:val="28"/>
-          <w:szCs w:val="28"/>
-          <w:shd w:val="clear" w:color="auto" w:fill="343541"/>
-        </w:rPr>
-        <w:t>е увеличение количество чанков доступных на генерацию.</w:t>
+        <w:t>Рассмотреть механизм, который будет отвечать за постепенное увеличение количество чанков доступных на генерацию.</w:t>
       </w:r>
     </w:p>
     <w:p>
@@ -5217,54 +5206,8 @@
           <w:shd w:val="clear" w:color="auto" w:fill="343541"/>
         </w:rPr>
       </w:pPr>
-      <w:r>
-        <w:rPr>
-          <w:rFonts w:ascii="Times New Roman" w:hAnsi="Times New Roman" w:cs="Times New Roman"/>
-          <w:sz w:val="28"/>
-          <w:szCs w:val="28"/>
-          <w:shd w:val="clear" w:color="auto" w:fill="343541"/>
-        </w:rPr>
-        <w:t>Оптимизировать локацию деревня.</w:t>
-      </w:r>
-    </w:p>
-    <w:p>
-      <w:pPr>
-        <w:pStyle w:val="a3"/>
-        <w:numPr>
-          <w:ilvl w:val="0"/>
-          <w:numId w:val="5"/>
-        </w:numPr>
-        <w:rPr>
-          <w:rFonts w:ascii="Times New Roman" w:hAnsi="Times New Roman" w:cs="Times New Roman"/>
-          <w:sz w:val="28"/>
-          <w:szCs w:val="28"/>
-          <w:shd w:val="clear" w:color="auto" w:fill="343541"/>
-        </w:rPr>
-      </w:pPr>
-      <w:r>
-        <w:rPr>
-          <w:rFonts w:ascii="Times New Roman" w:hAnsi="Times New Roman" w:cs="Times New Roman"/>
-          <w:sz w:val="28"/>
-          <w:szCs w:val="28"/>
-          <w:shd w:val="clear" w:color="auto" w:fill="343541"/>
-        </w:rPr>
-        <w:t>Разработать новый прототип боевой системы. Возможно сделать как пошаговый бой. При этом можно сделать так чтобы в команде как игрока участвовали одновременно несколько персонажей которыми будет управлять игрок по очереди. Можно добавить, чтобы у мобов была возможность делать призыв союзников, и чтобы он призывал всех мобов из текущего чанка.</w:t>
-      </w:r>
-    </w:p>
-    <w:p>
-      <w:pPr>
-        <w:pStyle w:val="a3"/>
-        <w:numPr>
-          <w:ilvl w:val="0"/>
-          <w:numId w:val="5"/>
-        </w:numPr>
-        <w:rPr>
-          <w:rFonts w:ascii="Times New Roman" w:hAnsi="Times New Roman" w:cs="Times New Roman"/>
-          <w:sz w:val="28"/>
-          <w:szCs w:val="28"/>
-          <w:shd w:val="clear" w:color="auto" w:fill="343541"/>
-        </w:rPr>
-      </w:pPr>
+      <w:bookmarkStart w:id="0" w:name="_GoBack"/>
+      <w:bookmarkEnd w:id="0"/>
       <w:r>
         <w:rPr>
           <w:rFonts w:ascii="Times New Roman" w:hAnsi="Times New Roman" w:cs="Times New Roman"/>
@@ -6479,6 +6422,7 @@
   <w:style w:type="character" w:default="1" w:styleId="a0">
     <w:name w:val="Default Paragraph Font"/>
     <w:uiPriority w:val="1"/>
+    <w:semiHidden/>
     <w:unhideWhenUsed/>
   </w:style>
   <w:style w:type="table" w:default="1" w:styleId="a1">
@@ -6808,7 +6752,7 @@
 </file>
 
 <file path=customXml/itemProps1.xml><?xml version="1.0" encoding="utf-8"?>
-<ds:datastoreItem xmlns:ds="http://schemas.openxmlformats.org/officeDocument/2006/customXml" ds:itemID="{342B72E5-17D9-40AE-9DEB-BB20F4F0628F}">
+<ds:datastoreItem xmlns:ds="http://schemas.openxmlformats.org/officeDocument/2006/customXml" ds:itemID="{3A1A3C13-B663-4DE7-8DAD-A907F3245FFF}">
   <ds:schemaRefs>
     <ds:schemaRef ds:uri="http://schemas.openxmlformats.org/officeDocument/2006/bibliography"/>
   </ds:schemaRefs>

</xml_diff>